<commit_message>
record conversation open/close cycles and derive them from history
A conversation reopens whenever the customer writes after closure, so a
single thread accumulates many cycles. Nothing recorded those boundaries:
sessionCount was written once at creation and never incremented, and the
conversation activity log had no writer at all.

Four call sites now record a session event, including the customer's own
incoming message reviving a closed thread. deriveSessions() treats recorded
events as authoritative and falls back to silence-gap inference for history
that predates tracking, flagging those boundaries as inferred.

Data layer only; the index rail is not built yet.

Co-Authored-By: Claude Opus 5 <noreply@anthropic.com>
Claude-Session: https://claude.ai/code/session_01JGHUnSrtQwLX2BGbB3j6wk
</commit_message>
<xml_diff>
--- a/docs/سجل التعديلات الاخيرة.docx
+++ b/docs/سجل التعديلات الاخيرة.docx
@@ -354,7 +354,7 @@
                 <w:szCs w:val="19"/>
                 <w:rtl/>
               </w:rPr>
-              <w:t xml:space="preserve">3</w:t>
+              <w:t xml:space="preserve">4</w:t>
             </w:r>
           </w:p>
         </w:tc>
@@ -414,7 +414,7 @@
                 <w:szCs w:val="19"/>
                 <w:rtl/>
               </w:rPr>
-              <w:t xml:space="preserve">إزالة كارت نسبة الاستجابة من صفحة تقييمات العملاء</w:t>
+              <w:t xml:space="preserve">تسجيل دورات المحادثة واشتقاقها — أساس شريط فهرسة الثريد</w:t>
             </w:r>
           </w:p>
         </w:tc>
@@ -444,7 +444,7 @@
                 <w:szCs w:val="19"/>
                 <w:rtl/>
               </w:rPr>
-              <w:t xml:space="preserve">تقييمات العملاء</w:t>
+              <w:t xml:space="preserve">صندوق الوارد (طبقة البيانات)</w:t>
             </w:r>
           </w:p>
         </w:tc>
@@ -508,7 +508,7 @@
                 <w:szCs w:val="19"/>
                 <w:rtl/>
               </w:rPr>
-              <w:t xml:space="preserve">2</w:t>
+              <w:t xml:space="preserve">3</w:t>
             </w:r>
           </w:p>
         </w:tc>
@@ -539,7 +539,7 @@
                 <w:szCs w:val="19"/>
                 <w:rtl/>
               </w:rPr>
-              <w:t xml:space="preserve">9 سبتمبر 2026</w:t>
+              <w:t xml:space="preserve">10 سبتمبر 2026</w:t>
             </w:r>
           </w:p>
         </w:tc>
@@ -570,7 +570,7 @@
                 <w:szCs w:val="19"/>
                 <w:rtl/>
               </w:rPr>
-              <w:t xml:space="preserve">تغيير تسمية زر الترقية في صفحة الفوترة</w:t>
+              <w:t xml:space="preserve">إزالة كارت نسبة الاستجابة من صفحة تقييمات العملاء</w:t>
             </w:r>
           </w:p>
         </w:tc>
@@ -601,38 +601,38 @@
                 <w:szCs w:val="19"/>
                 <w:rtl/>
               </w:rPr>
-              <w:t xml:space="preserve">الفوترة</w:t>
+              <w:t xml:space="preserve">تقييمات العملاء</w:t>
             </w:r>
           </w:p>
         </w:tc>
         <w:tc>
           <w:tcPr>
             <w:tcW w:type="dxa" w:w="1800"/>
-            <w:shd w:fill="ECFDF5" w:color="auto" w:val="clear"/>
-            <w:tcMar>
-              <w:top w:type="dxa" w:w="90"/>
-              <w:left w:type="dxa" w:w="110"/>
-              <w:bottom w:type="dxa" w:w="90"/>
-              <w:right w:type="dxa" w:w="110"/>
-            </w:tcMar>
-          </w:tcPr>
-          <w:p>
-            <w:pPr>
-              <w:bidi/>
-              <w:spacing w:after="0" w:line="280"/>
-              <w:jc w:val="right"/>
-            </w:pPr>
-            <w:r>
-              <w:rPr>
-                <w:rFonts w:ascii="Arial" w:cs="Arial" w:eastAsia="Arial" w:hAnsi="Arial"/>
-                <w:b/>
-                <w:bCs/>
-                <w:color w:val="15803D"/>
-                <w:sz w:val="19"/>
-                <w:szCs w:val="19"/>
-                <w:rtl/>
-              </w:rPr>
-              <w:t xml:space="preserve">منشور على الإنتاج</w:t>
+            <w:shd w:fill="FFFBEB" w:color="auto" w:val="clear"/>
+            <w:tcMar>
+              <w:top w:type="dxa" w:w="90"/>
+              <w:left w:type="dxa" w:w="110"/>
+              <w:bottom w:type="dxa" w:w="90"/>
+              <w:right w:type="dxa" w:w="110"/>
+            </w:tcMar>
+          </w:tcPr>
+          <w:p>
+            <w:pPr>
+              <w:bidi/>
+              <w:spacing w:after="0" w:line="280"/>
+              <w:jc w:val="right"/>
+            </w:pPr>
+            <w:r>
+              <w:rPr>
+                <w:rFonts w:ascii="Arial" w:cs="Arial" w:eastAsia="Arial" w:hAnsi="Arial"/>
+                <w:b/>
+                <w:bCs/>
+                <w:color w:val="B45309"/>
+                <w:sz w:val="19"/>
+                <w:szCs w:val="19"/>
+                <w:rtl/>
+              </w:rPr>
+              <w:t xml:space="preserve">مرفوع — غير منشور</w:t>
             </w:r>
           </w:p>
         </w:tc>
@@ -664,7 +664,7 @@
                 <w:szCs w:val="19"/>
                 <w:rtl/>
               </w:rPr>
-              <w:t xml:space="preserve">1</w:t>
+              <w:t xml:space="preserve">2</w:t>
             </w:r>
           </w:p>
         </w:tc>
@@ -724,6 +724,162 @@
                 <w:szCs w:val="19"/>
                 <w:rtl/>
               </w:rPr>
+              <w:t xml:space="preserve">تغيير تسمية زر الترقية في صفحة الفوترة</w:t>
+            </w:r>
+          </w:p>
+        </w:tc>
+        <w:tc>
+          <w:tcPr>
+            <w:tcW w:type="dxa" w:w="1500"/>
+            <w:tcMar>
+              <w:top w:type="dxa" w:w="90"/>
+              <w:left w:type="dxa" w:w="110"/>
+              <w:bottom w:type="dxa" w:w="90"/>
+              <w:right w:type="dxa" w:w="110"/>
+            </w:tcMar>
+          </w:tcPr>
+          <w:p>
+            <w:pPr>
+              <w:bidi/>
+              <w:spacing w:after="0" w:line="280"/>
+              <w:jc w:val="right"/>
+            </w:pPr>
+            <w:r>
+              <w:rPr>
+                <w:rFonts w:ascii="Arial" w:cs="Arial" w:eastAsia="Arial" w:hAnsi="Arial"/>
+                <w:b w:val="false"/>
+                <w:bCs w:val="false"/>
+                <w:color w:val="1E293B"/>
+                <w:sz w:val="19"/>
+                <w:szCs w:val="19"/>
+                <w:rtl/>
+              </w:rPr>
+              <w:t xml:space="preserve">الفوترة</w:t>
+            </w:r>
+          </w:p>
+        </w:tc>
+        <w:tc>
+          <w:tcPr>
+            <w:tcW w:type="dxa" w:w="1800"/>
+            <w:shd w:fill="ECFDF5" w:color="auto" w:val="clear"/>
+            <w:tcMar>
+              <w:top w:type="dxa" w:w="90"/>
+              <w:left w:type="dxa" w:w="110"/>
+              <w:bottom w:type="dxa" w:w="90"/>
+              <w:right w:type="dxa" w:w="110"/>
+            </w:tcMar>
+          </w:tcPr>
+          <w:p>
+            <w:pPr>
+              <w:bidi/>
+              <w:spacing w:after="0" w:line="280"/>
+              <w:jc w:val="right"/>
+            </w:pPr>
+            <w:r>
+              <w:rPr>
+                <w:rFonts w:ascii="Arial" w:cs="Arial" w:eastAsia="Arial" w:hAnsi="Arial"/>
+                <w:b/>
+                <w:bCs/>
+                <w:color w:val="15803D"/>
+                <w:sz w:val="19"/>
+                <w:szCs w:val="19"/>
+                <w:rtl/>
+              </w:rPr>
+              <w:t xml:space="preserve">منشور على الإنتاج</w:t>
+            </w:r>
+          </w:p>
+        </w:tc>
+      </w:tr>
+      <w:tr>
+        <w:tc>
+          <w:tcPr>
+            <w:tcW w:type="dxa" w:w="600"/>
+            <w:shd w:fill="F1F5F9" w:color="auto" w:val="clear"/>
+            <w:tcMar>
+              <w:top w:type="dxa" w:w="90"/>
+              <w:left w:type="dxa" w:w="110"/>
+              <w:bottom w:type="dxa" w:w="90"/>
+              <w:right w:type="dxa" w:w="110"/>
+            </w:tcMar>
+          </w:tcPr>
+          <w:p>
+            <w:pPr>
+              <w:bidi/>
+              <w:spacing w:after="0" w:line="280"/>
+              <w:jc w:val="right"/>
+            </w:pPr>
+            <w:r>
+              <w:rPr>
+                <w:rFonts w:ascii="Arial" w:cs="Arial" w:eastAsia="Arial" w:hAnsi="Arial"/>
+                <w:b/>
+                <w:bCs/>
+                <w:color w:val="2563EB"/>
+                <w:sz w:val="19"/>
+                <w:szCs w:val="19"/>
+                <w:rtl/>
+              </w:rPr>
+              <w:t xml:space="preserve">1</w:t>
+            </w:r>
+          </w:p>
+        </w:tc>
+        <w:tc>
+          <w:tcPr>
+            <w:tcW w:type="dxa" w:w="1500"/>
+            <w:shd w:fill="F1F5F9" w:color="auto" w:val="clear"/>
+            <w:tcMar>
+              <w:top w:type="dxa" w:w="90"/>
+              <w:left w:type="dxa" w:w="110"/>
+              <w:bottom w:type="dxa" w:w="90"/>
+              <w:right w:type="dxa" w:w="110"/>
+            </w:tcMar>
+          </w:tcPr>
+          <w:p>
+            <w:pPr>
+              <w:bidi/>
+              <w:spacing w:after="0" w:line="280"/>
+              <w:jc w:val="right"/>
+            </w:pPr>
+            <w:r>
+              <w:rPr>
+                <w:rFonts w:ascii="Arial" w:cs="Arial" w:eastAsia="Arial" w:hAnsi="Arial"/>
+                <w:b w:val="false"/>
+                <w:bCs w:val="false"/>
+                <w:color w:val="1E293B"/>
+                <w:sz w:val="19"/>
+                <w:szCs w:val="19"/>
+                <w:rtl/>
+              </w:rPr>
+              <w:t xml:space="preserve">9 سبتمبر 2026</w:t>
+            </w:r>
+          </w:p>
+        </w:tc>
+        <w:tc>
+          <w:tcPr>
+            <w:tcW w:type="dxa" w:w="3600"/>
+            <w:shd w:fill="F1F5F9" w:color="auto" w:val="clear"/>
+            <w:tcMar>
+              <w:top w:type="dxa" w:w="90"/>
+              <w:left w:type="dxa" w:w="110"/>
+              <w:bottom w:type="dxa" w:w="90"/>
+              <w:right w:type="dxa" w:w="110"/>
+            </w:tcMar>
+          </w:tcPr>
+          <w:p>
+            <w:pPr>
+              <w:bidi/>
+              <w:spacing w:after="0" w:line="280"/>
+              <w:jc w:val="right"/>
+            </w:pPr>
+            <w:r>
+              <w:rPr>
+                <w:rFonts w:ascii="Arial" w:cs="Arial" w:eastAsia="Arial" w:hAnsi="Arial"/>
+                <w:b w:val="false"/>
+                <w:bCs w:val="false"/>
+                <w:color w:val="1E293B"/>
+                <w:sz w:val="19"/>
+                <w:szCs w:val="19"/>
+                <w:rtl/>
+              </w:rPr>
               <w:t xml:space="preserve">ميزة تغيير الباقة — US-131</w:t>
             </w:r>
           </w:p>
@@ -731,6 +887,7 @@
         <w:tc>
           <w:tcPr>
             <w:tcW w:type="dxa" w:w="1500"/>
+            <w:shd w:fill="F1F5F9" w:color="auto" w:val="clear"/>
             <w:tcMar>
               <w:top w:type="dxa" w:w="90"/>
               <w:left w:type="dxa" w:w="110"/>
@@ -1174,7 +1331,7 @@
                 <w:szCs w:val="20"/>
                 <w:rtl/>
               </w:rPr>
-              <w:t xml:space="preserve">يوجد 1 تعديل مرفوع على الفرع ولم يُنشر بعد — مبيّن في الجدول أعلاه.</w:t>
+              <w:t xml:space="preserve">يوجد 2 تعديل مرفوع على الفرع ولم يُنشر بعد — مبيّن في الجدول أعلاه.</w:t>
             </w:r>
           </w:p>
           <w:p>
@@ -1242,7 +1399,7 @@
           <w:szCs w:val="24"/>
           <w:rtl/>
         </w:rPr>
-        <w:t xml:space="preserve">تعديل رقم 3 — إزالة كارت نسبة الاستجابة من صفحة تقييمات العملاء</w:t>
+        <w:t xml:space="preserve">تعديل رقم 4 — تسجيل دورات المحادثة واشتقاقها — أساس شريط فهرسة الثريد</w:t>
       </w:r>
     </w:p>
     <w:p>
@@ -1519,7 +1676,7 @@
                 <w:szCs w:val="19"/>
                 <w:rtl/>
               </w:rPr>
-              <w:t xml:space="preserve">تقييمات العملاء</w:t>
+              <w:t xml:space="preserve">صندوق الوارد (طبقة البيانات)</w:t>
             </w:r>
           </w:p>
         </w:tc>
@@ -1549,7 +1706,7 @@
                 <w:szCs w:val="19"/>
                 <w:rtl/>
               </w:rPr>
-              <w:t xml:space="preserve">/rating</w:t>
+              <w:t xml:space="preserve">/inbox</w:t>
             </w:r>
           </w:p>
         </w:tc>
@@ -1579,7 +1736,7 @@
                 <w:szCs w:val="19"/>
                 <w:rtl/>
               </w:rPr>
-              <w:t xml:space="preserve">src/pages/CustomerRatings.tsx</w:t>
+              <w:t xml:space="preserve">src/utils/sessions.ts · src/store/useDataStore.ts · src/types/index.ts</w:t>
             </w:r>
           </w:p>
         </w:tc>
@@ -1609,7 +1766,7 @@
                 <w:szCs w:val="19"/>
                 <w:rtl/>
               </w:rPr>
-              <w:t xml:space="preserve">cc8bd4f</w:t>
+              <w:t xml:space="preserve">—</w:t>
             </w:r>
           </w:p>
         </w:tc>
@@ -1670,7 +1827,7 @@
           <w:szCs w:val="21"/>
           <w:rtl/>
         </w:rPr>
-        <w:t xml:space="preserve">حُذف كارت «نسبة الاستجابة» بالكامل من شريط الإحصائيات — صارت 3 كروت بدل 4.</w:t>
+        <w:t xml:space="preserve">المشكلة: المحادثة الواحدة تُعاد فتحها كلما راسل العميل بعد الإغلاق، فيصير الثريد بلا نهاية. ولرسم شريط فهرسة يقسّمه إلى دورات، لزم معرفة توقيت كل فتح وإغلاق — وهي بيانات لم تكن تُسجَّل إطلاقاً.</w:t>
       </w:r>
     </w:p>
     <w:p>
@@ -1692,7 +1849,7 @@
           <w:szCs w:val="21"/>
           <w:rtl/>
         </w:rPr>
-        <w:t xml:space="preserve">حُذف معه حساب responseRate لأنه لم يعد له مستهلك في الصفحة.</w:t>
+        <w:t xml:space="preserve">كان الحقل sessionCount يُكتب مرة واحدة عند الإنشاء ولا يزيده أي سطر في المشروع، وقيمه في البيانات التجريبية مكتوبة يدوياً. كذلك activityLog على المحادثة كان مُعرَّفاً في الأنواع لكن لا دالة تكتب فيه وقت التشغيل.</w:t>
       </w:r>
     </w:p>
     <w:p>
@@ -1714,7 +1871,7 @@
           <w:szCs w:val="21"/>
           <w:rtl/>
         </w:rPr>
-        <w:t xml:space="preserve">حُذف استيراد أيقونة TrendingUp لأنها كانت مستخدمة في هذا الكارت وحده.</w:t>
+        <w:t xml:space="preserve">أُضيف النوع SessionEvent لتسجيل حدث فتح أو إغلاق بتوقيته وصاحبه، والنوع ConversationSession يمثّل الدورة المشتقّة.</w:t>
       </w:r>
     </w:p>
     <w:p>
@@ -1736,7 +1893,7 @@
           <w:szCs w:val="21"/>
           <w:rtl/>
         </w:rPr>
-        <w:t xml:space="preserve">عُدّلت شبكة العرض من grid-cols-2 lg:grid-cols-4 إلى grid-cols-1 sm:grid-cols-3، حتى لا يبقى كارت يتيم في سطر منفصل على الشاشات الصغيرة.</w:t>
+        <w:t xml:space="preserve">صارت أربعة مواضع تسجّل الحدث فعلياً: setConversationStatus عند الإغلاق أو إعادة الفتح، reopenConversation، ورسالة العميل الواردة نصية أو صوتية حين تُحيي محادثة مغلقة — وهذا آخرها كان يمرّ بلا أي أثر رغم أنه أكثرها تكراراً.</w:t>
       </w:r>
     </w:p>
     <w:p>
@@ -1758,7 +1915,95 @@
           <w:szCs w:val="21"/>
           <w:rtl/>
         </w:rPr>
-        <w:t xml:space="preserve">الكروت الباقية: متوسط تقييم المحادثة، متوسط تقييم الموظفين، إجمالي الروابط.</w:t>
+        <w:t xml:space="preserve">أُضيفت الدالة deriveSessions التي تقسّم الثريد إلى دورات: الأحداث المسجّلة مرجع قاطع، وما سبقها من تاريخ قديم تُستنتج حدوده من فجوات الصمت (24 ساعة افتراضاً) وتُعلَّم inferred حتى يظل الفرق بين المؤكَّد والمقدَّر ظاهراً.</w:t>
+      </w:r>
+    </w:p>
+    <w:p>
+      <w:pPr>
+        <w:pStyle w:val="ListParagraph"/>
+        <w:numPr>
+          <w:ilvl w:val="0"/>
+          <w:numId w:val="2"/>
+        </w:numPr>
+        <w:bidi/>
+        <w:spacing w:after="70" w:line="290"/>
+        <w:jc w:val="right"/>
+      </w:pPr>
+      <w:r>
+        <w:rPr>
+          <w:rFonts w:ascii="Arial" w:cs="Arial" w:eastAsia="Arial" w:hAnsi="Arial"/>
+          <w:color w:val="1E293B"/>
+          <w:sz w:val="21"/>
+          <w:szCs w:val="21"/>
+          <w:rtl/>
+        </w:rPr>
+        <w:t xml:space="preserve">الدالة تتعامل مع الحالة المختلطة: ثريد فيه تاريخ قديم مُستنتج ودورات جديدة مسجّلة في آن واحد.</w:t>
+      </w:r>
+    </w:p>
+    <w:p>
+      <w:pPr>
+        <w:pStyle w:val="ListParagraph"/>
+        <w:numPr>
+          <w:ilvl w:val="0"/>
+          <w:numId w:val="2"/>
+        </w:numPr>
+        <w:bidi/>
+        <w:spacing w:after="70" w:line="290"/>
+        <w:jc w:val="right"/>
+      </w:pPr>
+      <w:r>
+        <w:rPr>
+          <w:rFonts w:ascii="Arial" w:cs="Arial" w:eastAsia="Arial" w:hAnsi="Arial"/>
+          <w:color w:val="1E293B"/>
+          <w:sz w:val="21"/>
+          <w:szCs w:val="21"/>
+          <w:rtl/>
+        </w:rPr>
+        <w:t xml:space="preserve">اختُبر المنطق على ثماني حالات شملت الثريد الفارغ والرسالة الواحدة والفجوات المتعددة والأحداث المسجّلة والحالة المختلطة والمدخلات غير المرتّبة زمنياً — جميعها نجحت.</w:t>
+      </w:r>
+    </w:p>
+    <w:p>
+      <w:pPr>
+        <w:pStyle w:val="ListParagraph"/>
+        <w:numPr>
+          <w:ilvl w:val="0"/>
+          <w:numId w:val="2"/>
+        </w:numPr>
+        <w:bidi/>
+        <w:spacing w:after="70" w:line="290"/>
+        <w:jc w:val="right"/>
+      </w:pPr>
+      <w:r>
+        <w:rPr>
+          <w:rFonts w:ascii="Arial" w:cs="Arial" w:eastAsia="Arial" w:hAnsi="Arial"/>
+          <w:color w:val="1E293B"/>
+          <w:sz w:val="21"/>
+          <w:szCs w:val="21"/>
+          <w:rtl/>
+        </w:rPr>
+        <w:t xml:space="preserve">ملاحظة على البيانات الحالية: كل المحادثات التجريبية تُنتج دورة واحدة لأن رسائلها متقاربة بدقائق ولا فجوات فيها. الشريط لن يُظهر تقسيماً حقيقياً قبل توفّر بيانات متباعدة زمنياً.</w:t>
+      </w:r>
+    </w:p>
+    <w:p>
+      <w:pPr>
+        <w:pStyle w:val="ListParagraph"/>
+        <w:numPr>
+          <w:ilvl w:val="0"/>
+          <w:numId w:val="2"/>
+        </w:numPr>
+        <w:bidi/>
+        <w:spacing w:after="70" w:line="290"/>
+        <w:jc w:val="right"/>
+      </w:pPr>
+      <w:r>
+        <w:rPr>
+          <w:rFonts w:ascii="Arial" w:cs="Arial" w:eastAsia="Arial" w:hAnsi="Arial"/>
+          <w:color w:val="1E293B"/>
+          <w:sz w:val="21"/>
+          <w:szCs w:val="21"/>
+          <w:rtl/>
+        </w:rPr>
+        <w:t xml:space="preserve">لم تُبنَ واجهة الشريط بعد — هذا التعديل يغطّي طبقة البيانات وحدها.</w:t>
       </w:r>
     </w:p>
     <w:p>
@@ -1783,7 +2028,7 @@
           <w:szCs w:val="24"/>
           <w:rtl/>
         </w:rPr>
-        <w:t xml:space="preserve">تعديل رقم 2 — تغيير تسمية زر الترقية في صفحة الفوترة</w:t>
+        <w:t xml:space="preserve">تعديل رقم 3 — إزالة كارت نسبة الاستجابة من صفحة تقييمات العملاء</w:t>
       </w:r>
     </w:p>
     <w:p>
@@ -2030,7 +2275,7 @@
                 <w:szCs w:val="19"/>
                 <w:rtl/>
               </w:rPr>
-              <w:t xml:space="preserve">9 سبتمبر 2026</w:t>
+              <w:t xml:space="preserve">10 سبتمبر 2026</w:t>
             </w:r>
           </w:p>
         </w:tc>
@@ -2060,7 +2305,7 @@
                 <w:szCs w:val="19"/>
                 <w:rtl/>
               </w:rPr>
-              <w:t xml:space="preserve">الفوترة</w:t>
+              <w:t xml:space="preserve">تقييمات العملاء</w:t>
             </w:r>
           </w:p>
         </w:tc>
@@ -2090,7 +2335,7 @@
                 <w:szCs w:val="19"/>
                 <w:rtl/>
               </w:rPr>
-              <w:t xml:space="preserve">/billing</w:t>
+              <w:t xml:space="preserve">/rating</w:t>
             </w:r>
           </w:p>
         </w:tc>
@@ -2120,7 +2365,7 @@
                 <w:szCs w:val="19"/>
                 <w:rtl/>
               </w:rPr>
-              <w:t xml:space="preserve">src/pages/Billing.tsx</w:t>
+              <w:t xml:space="preserve">src/pages/CustomerRatings.tsx</w:t>
             </w:r>
           </w:p>
         </w:tc>
@@ -2150,38 +2395,38 @@
                 <w:szCs w:val="19"/>
                 <w:rtl/>
               </w:rPr>
-              <w:t xml:space="preserve">be5b3c0</w:t>
+              <w:t xml:space="preserve">cc8bd4f</w:t>
             </w:r>
           </w:p>
         </w:tc>
         <w:tc>
           <w:tcPr>
             <w:tcW w:type="dxa" w:w="1500"/>
-            <w:shd w:fill="ECFDF5" w:color="auto" w:val="clear"/>
-            <w:tcMar>
-              <w:top w:type="dxa" w:w="90"/>
-              <w:left w:type="dxa" w:w="110"/>
-              <w:bottom w:type="dxa" w:w="90"/>
-              <w:right w:type="dxa" w:w="110"/>
-            </w:tcMar>
-          </w:tcPr>
-          <w:p>
-            <w:pPr>
-              <w:bidi/>
-              <w:spacing w:after="0" w:line="280"/>
-              <w:jc w:val="right"/>
-            </w:pPr>
-            <w:r>
-              <w:rPr>
-                <w:rFonts w:ascii="Arial" w:cs="Arial" w:eastAsia="Arial" w:hAnsi="Arial"/>
-                <w:b/>
-                <w:bCs/>
-                <w:color w:val="15803D"/>
-                <w:sz w:val="19"/>
-                <w:szCs w:val="19"/>
-                <w:rtl/>
-              </w:rPr>
-              <w:t xml:space="preserve">منشور على الإنتاج</w:t>
+            <w:shd w:fill="FFFBEB" w:color="auto" w:val="clear"/>
+            <w:tcMar>
+              <w:top w:type="dxa" w:w="90"/>
+              <w:left w:type="dxa" w:w="110"/>
+              <w:bottom w:type="dxa" w:w="90"/>
+              <w:right w:type="dxa" w:w="110"/>
+            </w:tcMar>
+          </w:tcPr>
+          <w:p>
+            <w:pPr>
+              <w:bidi/>
+              <w:spacing w:after="0" w:line="280"/>
+              <w:jc w:val="right"/>
+            </w:pPr>
+            <w:r>
+              <w:rPr>
+                <w:rFonts w:ascii="Arial" w:cs="Arial" w:eastAsia="Arial" w:hAnsi="Arial"/>
+                <w:b/>
+                <w:bCs/>
+                <w:color w:val="B45309"/>
+                <w:sz w:val="19"/>
+                <w:szCs w:val="19"/>
+                <w:rtl/>
+              </w:rPr>
+              <w:t xml:space="preserve">مرفوع — غير منشور</w:t>
             </w:r>
           </w:p>
         </w:tc>
@@ -2211,7 +2456,7 @@
           <w:szCs w:val="21"/>
           <w:rtl/>
         </w:rPr>
-        <w:t xml:space="preserve">زر «ترقية» أصبح «تغيير الباقة».</w:t>
+        <w:t xml:space="preserve">حُذف كارت «نسبة الاستجابة» بالكامل من شريط الإحصائيات — صارت 3 كروت بدل 4.</w:t>
       </w:r>
     </w:p>
     <w:p>
@@ -2233,7 +2478,73 @@
           <w:szCs w:val="21"/>
           <w:rtl/>
         </w:rPr>
-        <w:t xml:space="preserve">سبب التغيير: الزر يوصّل إلى مسار يشمل الترقية والتخفيض معاً، فالتسمية القديمة كانت تصف نصف وظيفته.</w:t>
+        <w:t xml:space="preserve">حُذف معه حساب responseRate لأنه لم يعد له مستهلك في الصفحة.</w:t>
+      </w:r>
+    </w:p>
+    <w:p>
+      <w:pPr>
+        <w:pStyle w:val="ListParagraph"/>
+        <w:numPr>
+          <w:ilvl w:val="0"/>
+          <w:numId w:val="2"/>
+        </w:numPr>
+        <w:bidi/>
+        <w:spacing w:after="70" w:line="290"/>
+        <w:jc w:val="right"/>
+      </w:pPr>
+      <w:r>
+        <w:rPr>
+          <w:rFonts w:ascii="Arial" w:cs="Arial" w:eastAsia="Arial" w:hAnsi="Arial"/>
+          <w:color w:val="1E293B"/>
+          <w:sz w:val="21"/>
+          <w:szCs w:val="21"/>
+          <w:rtl/>
+        </w:rPr>
+        <w:t xml:space="preserve">حُذف استيراد أيقونة TrendingUp لأنها كانت مستخدمة في هذا الكارت وحده.</w:t>
+      </w:r>
+    </w:p>
+    <w:p>
+      <w:pPr>
+        <w:pStyle w:val="ListParagraph"/>
+        <w:numPr>
+          <w:ilvl w:val="0"/>
+          <w:numId w:val="2"/>
+        </w:numPr>
+        <w:bidi/>
+        <w:spacing w:after="70" w:line="290"/>
+        <w:jc w:val="right"/>
+      </w:pPr>
+      <w:r>
+        <w:rPr>
+          <w:rFonts w:ascii="Arial" w:cs="Arial" w:eastAsia="Arial" w:hAnsi="Arial"/>
+          <w:color w:val="1E293B"/>
+          <w:sz w:val="21"/>
+          <w:szCs w:val="21"/>
+          <w:rtl/>
+        </w:rPr>
+        <w:t xml:space="preserve">عُدّلت شبكة العرض من grid-cols-2 lg:grid-cols-4 إلى grid-cols-1 sm:grid-cols-3، حتى لا يبقى كارت يتيم في سطر منفصل على الشاشات الصغيرة.</w:t>
+      </w:r>
+    </w:p>
+    <w:p>
+      <w:pPr>
+        <w:pStyle w:val="ListParagraph"/>
+        <w:numPr>
+          <w:ilvl w:val="0"/>
+          <w:numId w:val="2"/>
+        </w:numPr>
+        <w:bidi/>
+        <w:spacing w:after="70" w:line="290"/>
+        <w:jc w:val="right"/>
+      </w:pPr>
+      <w:r>
+        <w:rPr>
+          <w:rFonts w:ascii="Arial" w:cs="Arial" w:eastAsia="Arial" w:hAnsi="Arial"/>
+          <w:color w:val="1E293B"/>
+          <w:sz w:val="21"/>
+          <w:szCs w:val="21"/>
+          <w:rtl/>
+        </w:rPr>
+        <w:t xml:space="preserve">الكروت الباقية: متوسط تقييم المحادثة، متوسط تقييم الموظفين، إجمالي الروابط.</w:t>
       </w:r>
     </w:p>
     <w:p>
@@ -2258,7 +2569,7 @@
           <w:szCs w:val="24"/>
           <w:rtl/>
         </w:rPr>
-        <w:t xml:space="preserve">تعديل رقم 1 — ميزة تغيير الباقة — US-131</w:t>
+        <w:t xml:space="preserve">تعديل رقم 2 — تغيير تسمية زر الترقية في صفحة الفوترة</w:t>
       </w:r>
     </w:p>
     <w:p>
@@ -2535,7 +2846,7 @@
                 <w:szCs w:val="19"/>
                 <w:rtl/>
               </w:rPr>
-              <w:t xml:space="preserve">الاشتراك</w:t>
+              <w:t xml:space="preserve">الفوترة</w:t>
             </w:r>
           </w:p>
         </w:tc>
@@ -2565,7 +2876,7 @@
                 <w:szCs w:val="19"/>
                 <w:rtl/>
               </w:rPr>
-              <w:t xml:space="preserve">/subscribe</w:t>
+              <w:t xml:space="preserve">/billing</w:t>
             </w:r>
           </w:p>
         </w:tc>
@@ -2595,7 +2906,7 @@
                 <w:szCs w:val="19"/>
                 <w:rtl/>
               </w:rPr>
-              <w:t xml:space="preserve">src/pages/Subscribe.tsx</w:t>
+              <w:t xml:space="preserve">src/pages/Billing.tsx</w:t>
             </w:r>
           </w:p>
         </w:tc>
@@ -2625,7 +2936,7 @@
                 <w:szCs w:val="19"/>
                 <w:rtl/>
               </w:rPr>
-              <w:t xml:space="preserve">be5b3c0 · c49b797</w:t>
+              <w:t xml:space="preserve">be5b3c0</w:t>
             </w:r>
           </w:p>
         </w:tc>
@@ -2686,7 +2997,7 @@
           <w:szCs w:val="21"/>
           <w:rtl/>
         </w:rPr>
-        <w:t xml:space="preserve">إعادة بناء شبه كاملة للصفحة — 715 سطراً متغيّراً.</w:t>
+        <w:t xml:space="preserve">زر «ترقية» أصبح «تغيير الباقة».</w:t>
       </w:r>
     </w:p>
     <w:p>
@@ -2708,8 +3019,439 @@
           <w:szCs w:val="21"/>
           <w:rtl/>
         </w:rPr>
-        <w:t xml:space="preserve">اختيار الباقة صار بشريط تمرير (slider) حسب عدد المحادثات الشهرية بدل شبكة الكروت. كل باقة نقطة توقف على الشريط، وباقة المؤسسات هي النقطة الأخيرة بعنوان «غير محدود».</w:t>
-      </w:r>
+        <w:t xml:space="preserve">سبب التغيير: الزر يوصّل إلى مسار يشمل الترقية والتخفيض معاً، فالتسمية القديمة كانت تصف نصف وظيفته.</w:t>
+      </w:r>
+    </w:p>
+    <w:p>
+      <w:pPr>
+        <w:spacing w:after="160"/>
+      </w:pPr>
+    </w:p>
+    <w:p>
+      <w:pPr>
+        <w:pStyle w:val="Heading2"/>
+        <w:bidi/>
+        <w:spacing w:after="120" w:before="300"/>
+        <w:jc w:val="right"/>
+      </w:pPr>
+      <w:r>
+        <w:rPr>
+          <w:rFonts w:ascii="Arial" w:cs="Arial" w:eastAsia="Arial" w:hAnsi="Arial"/>
+          <w:b/>
+          <w:bCs/>
+          <w:color w:val="1E293B"/>
+          <w:sz w:val="24"/>
+          <w:szCs w:val="24"/>
+          <w:rtl/>
+        </w:rPr>
+        <w:t xml:space="preserve">تعديل رقم 1 — ميزة تغيير الباقة — US-131</w:t>
+      </w:r>
+    </w:p>
+    <w:p>
+      <w:pPr>
+        <w:spacing w:after="50"/>
+      </w:pPr>
+    </w:p>
+    <w:tbl>
+      <w:tblPr>
+        <w:bidiVisual/>
+        <w:tblW w:type="dxa" w:w="9000"/>
+        <w:tblBorders>
+          <w:top w:val="single" w:color="CBD5E1" w:sz="4"/>
+          <w:left w:val="single" w:color="CBD5E1" w:sz="4"/>
+          <w:bottom w:val="single" w:color="CBD5E1" w:sz="4"/>
+          <w:right w:val="single" w:color="CBD5E1" w:sz="4"/>
+          <w:insideH w:val="single" w:color="CBD5E1" w:sz="4"/>
+          <w:insideV w:val="single" w:color="CBD5E1" w:sz="4"/>
+        </w:tblBorders>
+      </w:tblPr>
+      <w:tblGrid>
+        <w:gridCol w:w="1250"/>
+        <w:gridCol w:w="1250"/>
+        <w:gridCol w:w="1150"/>
+        <w:gridCol w:w="2500"/>
+        <w:gridCol w:w="1350"/>
+        <w:gridCol w:w="1500"/>
+      </w:tblGrid>
+      <w:tr>
+        <w:trPr>
+          <w:tblHeader/>
+        </w:trPr>
+        <w:tc>
+          <w:tcPr>
+            <w:tcW w:type="dxa" w:w="1250"/>
+            <w:shd w:fill="2563EB" w:color="auto" w:val="clear"/>
+            <w:tcMar>
+              <w:top w:type="dxa" w:w="90"/>
+              <w:left w:type="dxa" w:w="110"/>
+              <w:bottom w:type="dxa" w:w="90"/>
+              <w:right w:type="dxa" w:w="110"/>
+            </w:tcMar>
+          </w:tcPr>
+          <w:p>
+            <w:pPr>
+              <w:bidi/>
+              <w:spacing w:after="0" w:line="280"/>
+              <w:jc w:val="right"/>
+            </w:pPr>
+            <w:r>
+              <w:rPr>
+                <w:rFonts w:ascii="Arial" w:cs="Arial" w:eastAsia="Arial" w:hAnsi="Arial"/>
+                <w:b/>
+                <w:bCs/>
+                <w:color w:val="FFFFFF"/>
+                <w:sz w:val="19"/>
+                <w:szCs w:val="19"/>
+                <w:rtl/>
+              </w:rPr>
+              <w:t xml:space="preserve">التاريخ</w:t>
+            </w:r>
+          </w:p>
+        </w:tc>
+        <w:tc>
+          <w:tcPr>
+            <w:tcW w:type="dxa" w:w="1250"/>
+            <w:shd w:fill="2563EB" w:color="auto" w:val="clear"/>
+            <w:tcMar>
+              <w:top w:type="dxa" w:w="90"/>
+              <w:left w:type="dxa" w:w="110"/>
+              <w:bottom w:type="dxa" w:w="90"/>
+              <w:right w:type="dxa" w:w="110"/>
+            </w:tcMar>
+          </w:tcPr>
+          <w:p>
+            <w:pPr>
+              <w:bidi/>
+              <w:spacing w:after="0" w:line="280"/>
+              <w:jc w:val="right"/>
+            </w:pPr>
+            <w:r>
+              <w:rPr>
+                <w:rFonts w:ascii="Arial" w:cs="Arial" w:eastAsia="Arial" w:hAnsi="Arial"/>
+                <w:b/>
+                <w:bCs/>
+                <w:color w:val="FFFFFF"/>
+                <w:sz w:val="19"/>
+                <w:szCs w:val="19"/>
+                <w:rtl/>
+              </w:rPr>
+              <w:t xml:space="preserve">الصفحة</w:t>
+            </w:r>
+          </w:p>
+        </w:tc>
+        <w:tc>
+          <w:tcPr>
+            <w:tcW w:type="dxa" w:w="1150"/>
+            <w:shd w:fill="2563EB" w:color="auto" w:val="clear"/>
+            <w:tcMar>
+              <w:top w:type="dxa" w:w="90"/>
+              <w:left w:type="dxa" w:w="110"/>
+              <w:bottom w:type="dxa" w:w="90"/>
+              <w:right w:type="dxa" w:w="110"/>
+            </w:tcMar>
+          </w:tcPr>
+          <w:p>
+            <w:pPr>
+              <w:bidi/>
+              <w:spacing w:after="0" w:line="280"/>
+              <w:jc w:val="right"/>
+            </w:pPr>
+            <w:r>
+              <w:rPr>
+                <w:rFonts w:ascii="Arial" w:cs="Arial" w:eastAsia="Arial" w:hAnsi="Arial"/>
+                <w:b/>
+                <w:bCs/>
+                <w:color w:val="FFFFFF"/>
+                <w:sz w:val="19"/>
+                <w:szCs w:val="19"/>
+                <w:rtl/>
+              </w:rPr>
+              <w:t xml:space="preserve">المسار</w:t>
+            </w:r>
+          </w:p>
+        </w:tc>
+        <w:tc>
+          <w:tcPr>
+            <w:tcW w:type="dxa" w:w="2500"/>
+            <w:shd w:fill="2563EB" w:color="auto" w:val="clear"/>
+            <w:tcMar>
+              <w:top w:type="dxa" w:w="90"/>
+              <w:left w:type="dxa" w:w="110"/>
+              <w:bottom w:type="dxa" w:w="90"/>
+              <w:right w:type="dxa" w:w="110"/>
+            </w:tcMar>
+          </w:tcPr>
+          <w:p>
+            <w:pPr>
+              <w:bidi/>
+              <w:spacing w:after="0" w:line="280"/>
+              <w:jc w:val="right"/>
+            </w:pPr>
+            <w:r>
+              <w:rPr>
+                <w:rFonts w:ascii="Arial" w:cs="Arial" w:eastAsia="Arial" w:hAnsi="Arial"/>
+                <w:b/>
+                <w:bCs/>
+                <w:color w:val="FFFFFF"/>
+                <w:sz w:val="19"/>
+                <w:szCs w:val="19"/>
+                <w:rtl/>
+              </w:rPr>
+              <w:t xml:space="preserve">الملف</w:t>
+            </w:r>
+          </w:p>
+        </w:tc>
+        <w:tc>
+          <w:tcPr>
+            <w:tcW w:type="dxa" w:w="1350"/>
+            <w:shd w:fill="2563EB" w:color="auto" w:val="clear"/>
+            <w:tcMar>
+              <w:top w:type="dxa" w:w="90"/>
+              <w:left w:type="dxa" w:w="110"/>
+              <w:bottom w:type="dxa" w:w="90"/>
+              <w:right w:type="dxa" w:w="110"/>
+            </w:tcMar>
+          </w:tcPr>
+          <w:p>
+            <w:pPr>
+              <w:bidi/>
+              <w:spacing w:after="0" w:line="280"/>
+              <w:jc w:val="right"/>
+            </w:pPr>
+            <w:r>
+              <w:rPr>
+                <w:rFonts w:ascii="Arial" w:cs="Arial" w:eastAsia="Arial" w:hAnsi="Arial"/>
+                <w:b/>
+                <w:bCs/>
+                <w:color w:val="FFFFFF"/>
+                <w:sz w:val="19"/>
+                <w:szCs w:val="19"/>
+                <w:rtl/>
+              </w:rPr>
+              <w:t xml:space="preserve">الكوميت</w:t>
+            </w:r>
+          </w:p>
+        </w:tc>
+        <w:tc>
+          <w:tcPr>
+            <w:tcW w:type="dxa" w:w="1500"/>
+            <w:shd w:fill="2563EB" w:color="auto" w:val="clear"/>
+            <w:tcMar>
+              <w:top w:type="dxa" w:w="90"/>
+              <w:left w:type="dxa" w:w="110"/>
+              <w:bottom w:type="dxa" w:w="90"/>
+              <w:right w:type="dxa" w:w="110"/>
+            </w:tcMar>
+          </w:tcPr>
+          <w:p>
+            <w:pPr>
+              <w:bidi/>
+              <w:spacing w:after="0" w:line="280"/>
+              <w:jc w:val="right"/>
+            </w:pPr>
+            <w:r>
+              <w:rPr>
+                <w:rFonts w:ascii="Arial" w:cs="Arial" w:eastAsia="Arial" w:hAnsi="Arial"/>
+                <w:b/>
+                <w:bCs/>
+                <w:color w:val="FFFFFF"/>
+                <w:sz w:val="19"/>
+                <w:szCs w:val="19"/>
+                <w:rtl/>
+              </w:rPr>
+              <w:t xml:space="preserve">الحالة</w:t>
+            </w:r>
+          </w:p>
+        </w:tc>
+      </w:tr>
+      <w:tr>
+        <w:tc>
+          <w:tcPr>
+            <w:tcW w:type="dxa" w:w="1250"/>
+            <w:tcMar>
+              <w:top w:type="dxa" w:w="90"/>
+              <w:left w:type="dxa" w:w="110"/>
+              <w:bottom w:type="dxa" w:w="90"/>
+              <w:right w:type="dxa" w:w="110"/>
+            </w:tcMar>
+          </w:tcPr>
+          <w:p>
+            <w:pPr>
+              <w:bidi/>
+              <w:spacing w:after="0" w:line="280"/>
+              <w:jc w:val="right"/>
+            </w:pPr>
+            <w:r>
+              <w:rPr>
+                <w:rFonts w:ascii="Arial" w:cs="Arial" w:eastAsia="Arial" w:hAnsi="Arial"/>
+                <w:b w:val="false"/>
+                <w:bCs w:val="false"/>
+                <w:color w:val="1E293B"/>
+                <w:sz w:val="19"/>
+                <w:szCs w:val="19"/>
+                <w:rtl/>
+              </w:rPr>
+              <w:t xml:space="preserve">9 سبتمبر 2026</w:t>
+            </w:r>
+          </w:p>
+        </w:tc>
+        <w:tc>
+          <w:tcPr>
+            <w:tcW w:type="dxa" w:w="1250"/>
+            <w:tcMar>
+              <w:top w:type="dxa" w:w="90"/>
+              <w:left w:type="dxa" w:w="110"/>
+              <w:bottom w:type="dxa" w:w="90"/>
+              <w:right w:type="dxa" w:w="110"/>
+            </w:tcMar>
+          </w:tcPr>
+          <w:p>
+            <w:pPr>
+              <w:bidi/>
+              <w:spacing w:after="0" w:line="280"/>
+              <w:jc w:val="right"/>
+            </w:pPr>
+            <w:r>
+              <w:rPr>
+                <w:rFonts w:ascii="Arial" w:cs="Arial" w:eastAsia="Arial" w:hAnsi="Arial"/>
+                <w:b w:val="false"/>
+                <w:bCs w:val="false"/>
+                <w:color w:val="1E293B"/>
+                <w:sz w:val="19"/>
+                <w:szCs w:val="19"/>
+                <w:rtl/>
+              </w:rPr>
+              <w:t xml:space="preserve">الاشتراك</w:t>
+            </w:r>
+          </w:p>
+        </w:tc>
+        <w:tc>
+          <w:tcPr>
+            <w:tcW w:type="dxa" w:w="1150"/>
+            <w:tcMar>
+              <w:top w:type="dxa" w:w="90"/>
+              <w:left w:type="dxa" w:w="110"/>
+              <w:bottom w:type="dxa" w:w="90"/>
+              <w:right w:type="dxa" w:w="110"/>
+            </w:tcMar>
+          </w:tcPr>
+          <w:p>
+            <w:pPr>
+              <w:bidi/>
+              <w:spacing w:after="0" w:line="280"/>
+              <w:jc w:val="right"/>
+            </w:pPr>
+            <w:r>
+              <w:rPr>
+                <w:rFonts w:ascii="Arial" w:cs="Arial" w:eastAsia="Arial" w:hAnsi="Arial"/>
+                <w:b w:val="false"/>
+                <w:bCs w:val="false"/>
+                <w:color w:val="1E293B"/>
+                <w:sz w:val="19"/>
+                <w:szCs w:val="19"/>
+                <w:rtl/>
+              </w:rPr>
+              <w:t xml:space="preserve">/subscribe</w:t>
+            </w:r>
+          </w:p>
+        </w:tc>
+        <w:tc>
+          <w:tcPr>
+            <w:tcW w:type="dxa" w:w="2500"/>
+            <w:tcMar>
+              <w:top w:type="dxa" w:w="90"/>
+              <w:left w:type="dxa" w:w="110"/>
+              <w:bottom w:type="dxa" w:w="90"/>
+              <w:right w:type="dxa" w:w="110"/>
+            </w:tcMar>
+          </w:tcPr>
+          <w:p>
+            <w:pPr>
+              <w:bidi/>
+              <w:spacing w:after="0" w:line="280"/>
+              <w:jc w:val="right"/>
+            </w:pPr>
+            <w:r>
+              <w:rPr>
+                <w:rFonts w:ascii="Arial" w:cs="Arial" w:eastAsia="Arial" w:hAnsi="Arial"/>
+                <w:b w:val="false"/>
+                <w:bCs w:val="false"/>
+                <w:color w:val="1E293B"/>
+                <w:sz w:val="19"/>
+                <w:szCs w:val="19"/>
+                <w:rtl/>
+              </w:rPr>
+              <w:t xml:space="preserve">src/pages/Subscribe.tsx</w:t>
+            </w:r>
+          </w:p>
+        </w:tc>
+        <w:tc>
+          <w:tcPr>
+            <w:tcW w:type="dxa" w:w="1350"/>
+            <w:tcMar>
+              <w:top w:type="dxa" w:w="90"/>
+              <w:left w:type="dxa" w:w="110"/>
+              <w:bottom w:type="dxa" w:w="90"/>
+              <w:right w:type="dxa" w:w="110"/>
+            </w:tcMar>
+          </w:tcPr>
+          <w:p>
+            <w:pPr>
+              <w:bidi/>
+              <w:spacing w:after="0" w:line="280"/>
+              <w:jc w:val="right"/>
+            </w:pPr>
+            <w:r>
+              <w:rPr>
+                <w:rFonts w:ascii="Arial" w:cs="Arial" w:eastAsia="Arial" w:hAnsi="Arial"/>
+                <w:b w:val="false"/>
+                <w:bCs w:val="false"/>
+                <w:color w:val="1E293B"/>
+                <w:sz w:val="19"/>
+                <w:szCs w:val="19"/>
+                <w:rtl/>
+              </w:rPr>
+              <w:t xml:space="preserve">be5b3c0 · c49b797</w:t>
+            </w:r>
+          </w:p>
+        </w:tc>
+        <w:tc>
+          <w:tcPr>
+            <w:tcW w:type="dxa" w:w="1500"/>
+            <w:shd w:fill="ECFDF5" w:color="auto" w:val="clear"/>
+            <w:tcMar>
+              <w:top w:type="dxa" w:w="90"/>
+              <w:left w:type="dxa" w:w="110"/>
+              <w:bottom w:type="dxa" w:w="90"/>
+              <w:right w:type="dxa" w:w="110"/>
+            </w:tcMar>
+          </w:tcPr>
+          <w:p>
+            <w:pPr>
+              <w:bidi/>
+              <w:spacing w:after="0" w:line="280"/>
+              <w:jc w:val="right"/>
+            </w:pPr>
+            <w:r>
+              <w:rPr>
+                <w:rFonts w:ascii="Arial" w:cs="Arial" w:eastAsia="Arial" w:hAnsi="Arial"/>
+                <w:b/>
+                <w:bCs/>
+                <w:color w:val="15803D"/>
+                <w:sz w:val="19"/>
+                <w:szCs w:val="19"/>
+                <w:rtl/>
+              </w:rPr>
+              <w:t xml:space="preserve">منشور على الإنتاج</w:t>
+            </w:r>
+          </w:p>
+        </w:tc>
+      </w:tr>
+    </w:tbl>
+    <w:p>
+      <w:pPr>
+        <w:spacing w:after="90"/>
+      </w:pPr>
     </w:p>
     <w:p>
       <w:pPr>
@@ -2730,7 +3472,7 @@
           <w:szCs w:val="21"/>
           <w:rtl/>
         </w:rPr>
-        <w:t xml:space="preserve">مسار من ست خطوات: اختيار الباقة، ثم تأكيد التخفيض، ثم الدفع، ثم المعالجة، ثم النجاح أو الفشل.</w:t>
+        <w:t xml:space="preserve">إعادة بناء شبه كاملة للصفحة — 715 سطراً متغيّراً.</w:t>
       </w:r>
     </w:p>
     <w:p>
@@ -2752,7 +3494,7 @@
           <w:szCs w:val="21"/>
           <w:rtl/>
         </w:rPr>
-        <w:t xml:space="preserve">احتساب تناسبي للترقية: يُحصَّل فرق السعر عن الأيام المتبقية من الدورة الحالية فقط، ويظهر المبلغ مفصّلاً في ملخص الدفع.</w:t>
+        <w:t xml:space="preserve">اختيار الباقة صار بشريط تمرير (slider) حسب عدد المحادثات الشهرية بدل شبكة الكروت. كل باقة نقطة توقف على الشريط، وباقة المؤسسات هي النقطة الأخيرة بعنوان «غير محدود».</w:t>
       </w:r>
     </w:p>
     <w:p>
@@ -2774,7 +3516,7 @@
           <w:szCs w:val="21"/>
           <w:rtl/>
         </w:rPr>
-        <w:t xml:space="preserve">التخفيض له شاشة تأكيد مستقلة ولا يذهب مباشرة إلى الدفع.</w:t>
+        <w:t xml:space="preserve">مسار من ست خطوات: اختيار الباقة، ثم تأكيد التخفيض، ثم الدفع، ثم المعالجة، ثم النجاح أو الفشل.</w:t>
       </w:r>
     </w:p>
     <w:p>
@@ -2796,7 +3538,7 @@
           <w:szCs w:val="21"/>
           <w:rtl/>
         </w:rPr>
-        <w:t xml:space="preserve">دورة الفوترة تُقرأ من اشتراك العميل الحالي بدل أن تبدأ بقيمة ثابتة.</w:t>
+        <w:t xml:space="preserve">احتساب تناسبي للترقية: يُحصَّل فرق السعر عن الأيام المتبقية من الدورة الحالية فقط، ويظهر المبلغ مفصّلاً في ملخص الدفع.</w:t>
       </w:r>
     </w:p>
     <w:p>
@@ -2818,6 +3560,50 @@
           <w:szCs w:val="21"/>
           <w:rtl/>
         </w:rPr>
+        <w:t xml:space="preserve">التخفيض له شاشة تأكيد مستقلة ولا يذهب مباشرة إلى الدفع.</w:t>
+      </w:r>
+    </w:p>
+    <w:p>
+      <w:pPr>
+        <w:pStyle w:val="ListParagraph"/>
+        <w:numPr>
+          <w:ilvl w:val="0"/>
+          <w:numId w:val="2"/>
+        </w:numPr>
+        <w:bidi/>
+        <w:spacing w:after="70" w:line="290"/>
+        <w:jc w:val="right"/>
+      </w:pPr>
+      <w:r>
+        <w:rPr>
+          <w:rFonts w:ascii="Arial" w:cs="Arial" w:eastAsia="Arial" w:hAnsi="Arial"/>
+          <w:color w:val="1E293B"/>
+          <w:sz w:val="21"/>
+          <w:szCs w:val="21"/>
+          <w:rtl/>
+        </w:rPr>
+        <w:t xml:space="preserve">دورة الفوترة تُقرأ من اشتراك العميل الحالي بدل أن تبدأ بقيمة ثابتة.</w:t>
+      </w:r>
+    </w:p>
+    <w:p>
+      <w:pPr>
+        <w:pStyle w:val="ListParagraph"/>
+        <w:numPr>
+          <w:ilvl w:val="0"/>
+          <w:numId w:val="2"/>
+        </w:numPr>
+        <w:bidi/>
+        <w:spacing w:after="70" w:line="290"/>
+        <w:jc w:val="right"/>
+      </w:pPr>
+      <w:r>
+        <w:rPr>
+          <w:rFonts w:ascii="Arial" w:cs="Arial" w:eastAsia="Arial" w:hAnsi="Arial"/>
+          <w:color w:val="1E293B"/>
+          <w:sz w:val="21"/>
+          <w:szCs w:val="21"/>
+          <w:rtl/>
+        </w:rPr>
         <w:t xml:space="preserve">أُصلحت علامات تعارض الدمج (merge conflict markers) التي كانت باقية في الملف — كوميت c49b797.</w:t>
       </w:r>
     </w:p>
@@ -3004,7 +3790,7 @@
           <w:szCs w:val="20"/>
           <w:rtl/>
         </w:rPr>
-        <w:t xml:space="preserve">عدد التعديلات المسجّلة: 3</w:t>
+        <w:t xml:space="preserve">عدد التعديلات المسجّلة: 4</w:t>
       </w:r>
     </w:p>
     <w:sectPr>

</xml_diff>

<commit_message>
add session index rail to the conversation thread
A thread reopens on every customer message after closure, so it grows
without bound. The rail splits it by open/close cycle: segment height
tracks message count, hover shows the day and date, and clicking jumps to
that cycle's first message. The segment matching the current reading
position highlights as you scroll.

Cycles whose boundary was inferred from a silence gap are drawn dashed and
labelled as approximate, so a guess never passes for a recorded fact. The
rail hides entirely on single-cycle threads.

conv1's demo timestamps now span three cycles over three months so the
feature is reviewable; its sessionCount finally matches reality.

Co-Authored-By: Claude Opus 5 <noreply@anthropic.com>
Claude-Session: https://claude.ai/code/session_01JGHUnSrtQwLX2BGbB3j6wk
</commit_message>
<xml_diff>
--- a/docs/سجل التعديلات الاخيرة.docx
+++ b/docs/سجل التعديلات الاخيرة.docx
@@ -354,7 +354,7 @@
                 <w:szCs w:val="19"/>
                 <w:rtl/>
               </w:rPr>
-              <w:t xml:space="preserve">4</w:t>
+              <w:t xml:space="preserve">5</w:t>
             </w:r>
           </w:p>
         </w:tc>
@@ -414,7 +414,7 @@
                 <w:szCs w:val="19"/>
                 <w:rtl/>
               </w:rPr>
-              <w:t xml:space="preserve">تسجيل دورات المحادثة واشتقاقها — أساس شريط فهرسة الثريد</w:t>
+              <w:t xml:space="preserve">شريط فهرسة دورات المحادثة داخل الثريد</w:t>
             </w:r>
           </w:p>
         </w:tc>
@@ -444,7 +444,7 @@
                 <w:szCs w:val="19"/>
                 <w:rtl/>
               </w:rPr>
-              <w:t xml:space="preserve">صندوق الوارد (طبقة البيانات)</w:t>
+              <w:t xml:space="preserve">صندوق الوارد</w:t>
             </w:r>
           </w:p>
         </w:tc>
@@ -508,7 +508,7 @@
                 <w:szCs w:val="19"/>
                 <w:rtl/>
               </w:rPr>
-              <w:t xml:space="preserve">3</w:t>
+              <w:t xml:space="preserve">4</w:t>
             </w:r>
           </w:p>
         </w:tc>
@@ -570,7 +570,7 @@
                 <w:szCs w:val="19"/>
                 <w:rtl/>
               </w:rPr>
-              <w:t xml:space="preserve">إزالة كارت نسبة الاستجابة من صفحة تقييمات العملاء</w:t>
+              <w:t xml:space="preserve">تسجيل دورات المحادثة واشتقاقها — أساس شريط فهرسة الثريد</w:t>
             </w:r>
           </w:p>
         </w:tc>
@@ -601,7 +601,7 @@
                 <w:szCs w:val="19"/>
                 <w:rtl/>
               </w:rPr>
-              <w:t xml:space="preserve">تقييمات العملاء</w:t>
+              <w:t xml:space="preserve">صندوق الوارد (طبقة البيانات)</w:t>
             </w:r>
           </w:p>
         </w:tc>
@@ -664,7 +664,7 @@
                 <w:szCs w:val="19"/>
                 <w:rtl/>
               </w:rPr>
-              <w:t xml:space="preserve">2</w:t>
+              <w:t xml:space="preserve">3</w:t>
             </w:r>
           </w:p>
         </w:tc>
@@ -694,7 +694,7 @@
                 <w:szCs w:val="19"/>
                 <w:rtl/>
               </w:rPr>
-              <w:t xml:space="preserve">9 سبتمبر 2026</w:t>
+              <w:t xml:space="preserve">10 سبتمبر 2026</w:t>
             </w:r>
           </w:p>
         </w:tc>
@@ -724,7 +724,7 @@
                 <w:szCs w:val="19"/>
                 <w:rtl/>
               </w:rPr>
-              <w:t xml:space="preserve">تغيير تسمية زر الترقية في صفحة الفوترة</w:t>
+              <w:t xml:space="preserve">إزالة كارت نسبة الاستجابة من صفحة تقييمات العملاء</w:t>
             </w:r>
           </w:p>
         </w:tc>
@@ -754,38 +754,38 @@
                 <w:szCs w:val="19"/>
                 <w:rtl/>
               </w:rPr>
-              <w:t xml:space="preserve">الفوترة</w:t>
+              <w:t xml:space="preserve">تقييمات العملاء</w:t>
             </w:r>
           </w:p>
         </w:tc>
         <w:tc>
           <w:tcPr>
             <w:tcW w:type="dxa" w:w="1800"/>
-            <w:shd w:fill="ECFDF5" w:color="auto" w:val="clear"/>
-            <w:tcMar>
-              <w:top w:type="dxa" w:w="90"/>
-              <w:left w:type="dxa" w:w="110"/>
-              <w:bottom w:type="dxa" w:w="90"/>
-              <w:right w:type="dxa" w:w="110"/>
-            </w:tcMar>
-          </w:tcPr>
-          <w:p>
-            <w:pPr>
-              <w:bidi/>
-              <w:spacing w:after="0" w:line="280"/>
-              <w:jc w:val="right"/>
-            </w:pPr>
-            <w:r>
-              <w:rPr>
-                <w:rFonts w:ascii="Arial" w:cs="Arial" w:eastAsia="Arial" w:hAnsi="Arial"/>
-                <w:b/>
-                <w:bCs/>
-                <w:color w:val="15803D"/>
-                <w:sz w:val="19"/>
-                <w:szCs w:val="19"/>
-                <w:rtl/>
-              </w:rPr>
-              <w:t xml:space="preserve">منشور على الإنتاج</w:t>
+            <w:shd w:fill="FFFBEB" w:color="auto" w:val="clear"/>
+            <w:tcMar>
+              <w:top w:type="dxa" w:w="90"/>
+              <w:left w:type="dxa" w:w="110"/>
+              <w:bottom w:type="dxa" w:w="90"/>
+              <w:right w:type="dxa" w:w="110"/>
+            </w:tcMar>
+          </w:tcPr>
+          <w:p>
+            <w:pPr>
+              <w:bidi/>
+              <w:spacing w:after="0" w:line="280"/>
+              <w:jc w:val="right"/>
+            </w:pPr>
+            <w:r>
+              <w:rPr>
+                <w:rFonts w:ascii="Arial" w:cs="Arial" w:eastAsia="Arial" w:hAnsi="Arial"/>
+                <w:b/>
+                <w:bCs/>
+                <w:color w:val="B45309"/>
+                <w:sz w:val="19"/>
+                <w:szCs w:val="19"/>
+                <w:rtl/>
+              </w:rPr>
+              <w:t xml:space="preserve">مرفوع — غير منشور</w:t>
             </w:r>
           </w:p>
         </w:tc>
@@ -818,7 +818,7 @@
                 <w:szCs w:val="19"/>
                 <w:rtl/>
               </w:rPr>
-              <w:t xml:space="preserve">1</w:t>
+              <w:t xml:space="preserve">2</w:t>
             </w:r>
           </w:p>
         </w:tc>
@@ -880,7 +880,7 @@
                 <w:szCs w:val="19"/>
                 <w:rtl/>
               </w:rPr>
-              <w:t xml:space="preserve">ميزة تغيير الباقة — US-131</w:t>
+              <w:t xml:space="preserve">تغيير تسمية زر الترقية في صفحة الفوترة</w:t>
             </w:r>
           </w:p>
         </w:tc>
@@ -888,6 +888,159 @@
           <w:tcPr>
             <w:tcW w:type="dxa" w:w="1500"/>
             <w:shd w:fill="F1F5F9" w:color="auto" w:val="clear"/>
+            <w:tcMar>
+              <w:top w:type="dxa" w:w="90"/>
+              <w:left w:type="dxa" w:w="110"/>
+              <w:bottom w:type="dxa" w:w="90"/>
+              <w:right w:type="dxa" w:w="110"/>
+            </w:tcMar>
+          </w:tcPr>
+          <w:p>
+            <w:pPr>
+              <w:bidi/>
+              <w:spacing w:after="0" w:line="280"/>
+              <w:jc w:val="right"/>
+            </w:pPr>
+            <w:r>
+              <w:rPr>
+                <w:rFonts w:ascii="Arial" w:cs="Arial" w:eastAsia="Arial" w:hAnsi="Arial"/>
+                <w:b w:val="false"/>
+                <w:bCs w:val="false"/>
+                <w:color w:val="1E293B"/>
+                <w:sz w:val="19"/>
+                <w:szCs w:val="19"/>
+                <w:rtl/>
+              </w:rPr>
+              <w:t xml:space="preserve">الفوترة</w:t>
+            </w:r>
+          </w:p>
+        </w:tc>
+        <w:tc>
+          <w:tcPr>
+            <w:tcW w:type="dxa" w:w="1800"/>
+            <w:shd w:fill="ECFDF5" w:color="auto" w:val="clear"/>
+            <w:tcMar>
+              <w:top w:type="dxa" w:w="90"/>
+              <w:left w:type="dxa" w:w="110"/>
+              <w:bottom w:type="dxa" w:w="90"/>
+              <w:right w:type="dxa" w:w="110"/>
+            </w:tcMar>
+          </w:tcPr>
+          <w:p>
+            <w:pPr>
+              <w:bidi/>
+              <w:spacing w:after="0" w:line="280"/>
+              <w:jc w:val="right"/>
+            </w:pPr>
+            <w:r>
+              <w:rPr>
+                <w:rFonts w:ascii="Arial" w:cs="Arial" w:eastAsia="Arial" w:hAnsi="Arial"/>
+                <w:b/>
+                <w:bCs/>
+                <w:color w:val="15803D"/>
+                <w:sz w:val="19"/>
+                <w:szCs w:val="19"/>
+                <w:rtl/>
+              </w:rPr>
+              <w:t xml:space="preserve">منشور على الإنتاج</w:t>
+            </w:r>
+          </w:p>
+        </w:tc>
+      </w:tr>
+      <w:tr>
+        <w:tc>
+          <w:tcPr>
+            <w:tcW w:type="dxa" w:w="600"/>
+            <w:tcMar>
+              <w:top w:type="dxa" w:w="90"/>
+              <w:left w:type="dxa" w:w="110"/>
+              <w:bottom w:type="dxa" w:w="90"/>
+              <w:right w:type="dxa" w:w="110"/>
+            </w:tcMar>
+          </w:tcPr>
+          <w:p>
+            <w:pPr>
+              <w:bidi/>
+              <w:spacing w:after="0" w:line="280"/>
+              <w:jc w:val="right"/>
+            </w:pPr>
+            <w:r>
+              <w:rPr>
+                <w:rFonts w:ascii="Arial" w:cs="Arial" w:eastAsia="Arial" w:hAnsi="Arial"/>
+                <w:b/>
+                <w:bCs/>
+                <w:color w:val="2563EB"/>
+                <w:sz w:val="19"/>
+                <w:szCs w:val="19"/>
+                <w:rtl/>
+              </w:rPr>
+              <w:t xml:space="preserve">1</w:t>
+            </w:r>
+          </w:p>
+        </w:tc>
+        <w:tc>
+          <w:tcPr>
+            <w:tcW w:type="dxa" w:w="1500"/>
+            <w:tcMar>
+              <w:top w:type="dxa" w:w="90"/>
+              <w:left w:type="dxa" w:w="110"/>
+              <w:bottom w:type="dxa" w:w="90"/>
+              <w:right w:type="dxa" w:w="110"/>
+            </w:tcMar>
+          </w:tcPr>
+          <w:p>
+            <w:pPr>
+              <w:bidi/>
+              <w:spacing w:after="0" w:line="280"/>
+              <w:jc w:val="right"/>
+            </w:pPr>
+            <w:r>
+              <w:rPr>
+                <w:rFonts w:ascii="Arial" w:cs="Arial" w:eastAsia="Arial" w:hAnsi="Arial"/>
+                <w:b w:val="false"/>
+                <w:bCs w:val="false"/>
+                <w:color w:val="1E293B"/>
+                <w:sz w:val="19"/>
+                <w:szCs w:val="19"/>
+                <w:rtl/>
+              </w:rPr>
+              <w:t xml:space="preserve">9 سبتمبر 2026</w:t>
+            </w:r>
+          </w:p>
+        </w:tc>
+        <w:tc>
+          <w:tcPr>
+            <w:tcW w:type="dxa" w:w="3600"/>
+            <w:tcMar>
+              <w:top w:type="dxa" w:w="90"/>
+              <w:left w:type="dxa" w:w="110"/>
+              <w:bottom w:type="dxa" w:w="90"/>
+              <w:right w:type="dxa" w:w="110"/>
+            </w:tcMar>
+          </w:tcPr>
+          <w:p>
+            <w:pPr>
+              <w:bidi/>
+              <w:spacing w:after="0" w:line="280"/>
+              <w:jc w:val="right"/>
+            </w:pPr>
+            <w:r>
+              <w:rPr>
+                <w:rFonts w:ascii="Arial" w:cs="Arial" w:eastAsia="Arial" w:hAnsi="Arial"/>
+                <w:b w:val="false"/>
+                <w:bCs w:val="false"/>
+                <w:color w:val="1E293B"/>
+                <w:sz w:val="19"/>
+                <w:szCs w:val="19"/>
+                <w:rtl/>
+              </w:rPr>
+              <w:t xml:space="preserve">ميزة تغيير الباقة — US-131</w:t>
+            </w:r>
+          </w:p>
+        </w:tc>
+        <w:tc>
+          <w:tcPr>
+            <w:tcW w:type="dxa" w:w="1500"/>
             <w:tcMar>
               <w:top w:type="dxa" w:w="90"/>
               <w:left w:type="dxa" w:w="110"/>
@@ -1331,7 +1484,7 @@
                 <w:szCs w:val="20"/>
                 <w:rtl/>
               </w:rPr>
-              <w:t xml:space="preserve">يوجد 2 تعديل مرفوع على الفرع ولم يُنشر بعد — مبيّن في الجدول أعلاه.</w:t>
+              <w:t xml:space="preserve">يوجد 3 تعديل مرفوع على الفرع ولم يُنشر بعد — مبيّن في الجدول أعلاه.</w:t>
             </w:r>
           </w:p>
           <w:p>
@@ -1399,7 +1552,7 @@
           <w:szCs w:val="24"/>
           <w:rtl/>
         </w:rPr>
-        <w:t xml:space="preserve">تعديل رقم 4 — تسجيل دورات المحادثة واشتقاقها — أساس شريط فهرسة الثريد</w:t>
+        <w:t xml:space="preserve">تعديل رقم 5 — شريط فهرسة دورات المحادثة داخل الثريد</w:t>
       </w:r>
     </w:p>
     <w:p>
@@ -1676,7 +1829,7 @@
                 <w:szCs w:val="19"/>
                 <w:rtl/>
               </w:rPr>
-              <w:t xml:space="preserve">صندوق الوارد (طبقة البيانات)</w:t>
+              <w:t xml:space="preserve">صندوق الوارد</w:t>
             </w:r>
           </w:p>
         </w:tc>
@@ -1736,7 +1889,7 @@
                 <w:szCs w:val="19"/>
                 <w:rtl/>
               </w:rPr>
-              <w:t xml:space="preserve">src/utils/sessions.ts · src/store/useDataStore.ts · src/types/index.ts</w:t>
+              <w:t xml:space="preserve">src/components/inbox/SessionRail.tsx · src/pages/Inbox.tsx · src/store/mockData.ts</w:t>
             </w:r>
           </w:p>
         </w:tc>
@@ -1827,7 +1980,7 @@
           <w:szCs w:val="21"/>
           <w:rtl/>
         </w:rPr>
-        <w:t xml:space="preserve">المشكلة: المحادثة الواحدة تُعاد فتحها كلما راسل العميل بعد الإغلاق، فيصير الثريد بلا نهاية. ولرسم شريط فهرسة يقسّمه إلى دورات، لزم معرفة توقيت كل فتح وإغلاق — وهي بيانات لم تكن تُسجَّل إطلاقاً.</w:t>
+        <w:t xml:space="preserve">شريط رأسي على حافة الثريد يقسّمه إلى دورات فتح وإغلاق، ليصل الموظف إلى بداية أي دورة في المحادثات الطويلة التي تُعاد فتحها مراراً.</w:t>
       </w:r>
     </w:p>
     <w:p>
@@ -1849,7 +2002,7 @@
           <w:szCs w:val="21"/>
           <w:rtl/>
         </w:rPr>
-        <w:t xml:space="preserve">كان الحقل sessionCount يُكتب مرة واحدة عند الإنشاء ولا يزيده أي سطر في المشروع، وقيمه في البيانات التجريبية مكتوبة يدوياً. كذلك activityLog على المحادثة كان مُعرَّفاً في الأنواع لكن لا دالة تكتب فيه وقت التشغيل.</w:t>
+        <w:t xml:space="preserve">ارتفاع كل مقطع يتناسب مع عدد رسائله، فيعطي إحساساً بحجم كل دورة قبل الدخول إليها.</w:t>
       </w:r>
     </w:p>
     <w:p>
@@ -1871,7 +2024,7 @@
           <w:szCs w:val="21"/>
           <w:rtl/>
         </w:rPr>
-        <w:t xml:space="preserve">أُضيف النوع SessionEvent لتسجيل حدث فتح أو إغلاق بتوقيته وصاحبه، والنوع ConversationSession يمثّل الدورة المشتقّة.</w:t>
+        <w:t xml:space="preserve">المرور على المقطع يُظهر اليوم والتاريخ وعدد الرسائل — «اليوم» و«أمس» لما قرُب، واسم اليوم لما بعُد.</w:t>
       </w:r>
     </w:p>
     <w:p>
@@ -1893,7 +2046,7 @@
           <w:szCs w:val="21"/>
           <w:rtl/>
         </w:rPr>
-        <w:t xml:space="preserve">صارت أربعة مواضع تسجّل الحدث فعلياً: setConversationStatus عند الإغلاق أو إعادة الفتح، reopenConversation، ورسالة العميل الواردة نصية أو صوتية حين تُحيي محادثة مغلقة — وهذا آخرها كان يمرّ بلا أي أثر رغم أنه أكثرها تكراراً.</w:t>
+        <w:t xml:space="preserve">الضغط ينقل إلى أول رسالة في الدورة، والمقطع الذي يقابل موضع القراءة الحالي يُبرَز تلقائياً أثناء التمرير.</w:t>
       </w:r>
     </w:p>
     <w:p>
@@ -1915,7 +2068,7 @@
           <w:szCs w:val="21"/>
           <w:rtl/>
         </w:rPr>
-        <w:t xml:space="preserve">أُضيفت الدالة deriveSessions التي تقسّم الثريد إلى دورات: الأحداث المسجّلة مرجع قاطع، وما سبقها من تاريخ قديم تُستنتج حدوده من فجوات الصمت (24 ساعة افتراضاً) وتُعلَّم inferred حتى يظل الفرق بين المؤكَّد والمقدَّر ظاهراً.</w:t>
+        <w:t xml:space="preserve">المقاطع ذات البداية المستنتجة تُعرض بحدّ متقطّع ويذكر التلميح «بداية تقديرية»، فيبقى الفرق بين المؤكَّد والمقدَّر ظاهراً للموظف لا مخفياً عنه.</w:t>
       </w:r>
     </w:p>
     <w:p>
@@ -1937,7 +2090,7 @@
           <w:szCs w:val="21"/>
           <w:rtl/>
         </w:rPr>
-        <w:t xml:space="preserve">الدالة تتعامل مع الحالة المختلطة: ثريد فيه تاريخ قديم مُستنتج ودورات جديدة مسجّلة في آن واحد.</w:t>
+        <w:t xml:space="preserve">الشريط يختفي كلياً حين تكون المحادثة دورة واحدة، فلا معنى لفهرس لا يفهرس شيئاً.</w:t>
       </w:r>
     </w:p>
     <w:p>
@@ -1959,7 +2112,7 @@
           <w:szCs w:val="21"/>
           <w:rtl/>
         </w:rPr>
-        <w:t xml:space="preserve">اختُبر المنطق على ثماني حالات شملت الثريد الفارغ والرسالة الواحدة والفجوات المتعددة والأحداث المسجّلة والحالة المختلطة والمدخلات غير المرتّبة زمنياً — جميعها نجحت.</w:t>
+        <w:t xml:space="preserve">الدورات الخالية من الرسائل مستبعدة من الشريط بقرار مقصود — لا شيء يمكن الانتقال إليه فيها.</w:t>
       </w:r>
     </w:p>
     <w:p>
@@ -1981,7 +2134,7 @@
           <w:szCs w:val="21"/>
           <w:rtl/>
         </w:rPr>
-        <w:t xml:space="preserve">ملاحظة على البيانات الحالية: كل المحادثات التجريبية تُنتج دورة واحدة لأن رسائلها متقاربة بدقائق ولا فجوات فيها. الشريط لن يُظهر تقسيماً حقيقياً قبل توفّر بيانات متباعدة زمنياً.</w:t>
+        <w:t xml:space="preserve">وُزّعت رسائل محادثة أحمد الشعيلي التجريبية على ثلاث دورات عبر ثلاثة أشهر لتصير الميزة قابلة للمعاينة، وصار sessionCount فيها مطابقاً للواقع بعد أن كان رقماً مكتوباً بلا سند. آخر دورة مسجّلة بحدث حقيقي وما قبلها مستنتج، ليظهر الشكلان معاً.</w:t>
       </w:r>
     </w:p>
     <w:p>
@@ -2003,7 +2156,7 @@
           <w:szCs w:val="21"/>
           <w:rtl/>
         </w:rPr>
-        <w:t xml:space="preserve">لم تُبنَ واجهة الشريط بعد — هذا التعديل يغطّي طبقة البيانات وحدها.</w:t>
+        <w:t xml:space="preserve">عوينت النتيجة في المتصفح: الشريط والتلميح والانتقال والإبراز تعمل في الوضعين الفاتح والليلي، والمحادثات أحادية الدورة سليمة بلا شريط.</w:t>
       </w:r>
     </w:p>
     <w:p>
@@ -2028,7 +2181,7 @@
           <w:szCs w:val="24"/>
           <w:rtl/>
         </w:rPr>
-        <w:t xml:space="preserve">تعديل رقم 3 — إزالة كارت نسبة الاستجابة من صفحة تقييمات العملاء</w:t>
+        <w:t xml:space="preserve">تعديل رقم 4 — تسجيل دورات المحادثة واشتقاقها — أساس شريط فهرسة الثريد</w:t>
       </w:r>
     </w:p>
     <w:p>
@@ -2305,7 +2458,7 @@
                 <w:szCs w:val="19"/>
                 <w:rtl/>
               </w:rPr>
-              <w:t xml:space="preserve">تقييمات العملاء</w:t>
+              <w:t xml:space="preserve">صندوق الوارد (طبقة البيانات)</w:t>
             </w:r>
           </w:p>
         </w:tc>
@@ -2335,7 +2488,7 @@
                 <w:szCs w:val="19"/>
                 <w:rtl/>
               </w:rPr>
-              <w:t xml:space="preserve">/rating</w:t>
+              <w:t xml:space="preserve">/inbox</w:t>
             </w:r>
           </w:p>
         </w:tc>
@@ -2365,7 +2518,7 @@
                 <w:szCs w:val="19"/>
                 <w:rtl/>
               </w:rPr>
-              <w:t xml:space="preserve">src/pages/CustomerRatings.tsx</w:t>
+              <w:t xml:space="preserve">src/utils/sessions.ts · src/store/useDataStore.ts · src/types/index.ts</w:t>
             </w:r>
           </w:p>
         </w:tc>
@@ -2395,7 +2548,7 @@
                 <w:szCs w:val="19"/>
                 <w:rtl/>
               </w:rPr>
-              <w:t xml:space="preserve">cc8bd4f</w:t>
+              <w:t xml:space="preserve">—</w:t>
             </w:r>
           </w:p>
         </w:tc>
@@ -2456,7 +2609,7 @@
           <w:szCs w:val="21"/>
           <w:rtl/>
         </w:rPr>
-        <w:t xml:space="preserve">حُذف كارت «نسبة الاستجابة» بالكامل من شريط الإحصائيات — صارت 3 كروت بدل 4.</w:t>
+        <w:t xml:space="preserve">المشكلة: المحادثة الواحدة تُعاد فتحها كلما راسل العميل بعد الإغلاق، فيصير الثريد بلا نهاية. ولرسم شريط فهرسة يقسّمه إلى دورات، لزم معرفة توقيت كل فتح وإغلاق — وهي بيانات لم تكن تُسجَّل إطلاقاً.</w:t>
       </w:r>
     </w:p>
     <w:p>
@@ -2478,7 +2631,7 @@
           <w:szCs w:val="21"/>
           <w:rtl/>
         </w:rPr>
-        <w:t xml:space="preserve">حُذف معه حساب responseRate لأنه لم يعد له مستهلك في الصفحة.</w:t>
+        <w:t xml:space="preserve">كان الحقل sessionCount يُكتب مرة واحدة عند الإنشاء ولا يزيده أي سطر في المشروع، وقيمه في البيانات التجريبية مكتوبة يدوياً. كذلك activityLog على المحادثة كان مُعرَّفاً في الأنواع لكن لا دالة تكتب فيه وقت التشغيل.</w:t>
       </w:r>
     </w:p>
     <w:p>
@@ -2500,7 +2653,7 @@
           <w:szCs w:val="21"/>
           <w:rtl/>
         </w:rPr>
-        <w:t xml:space="preserve">حُذف استيراد أيقونة TrendingUp لأنها كانت مستخدمة في هذا الكارت وحده.</w:t>
+        <w:t xml:space="preserve">أُضيف النوع SessionEvent لتسجيل حدث فتح أو إغلاق بتوقيته وصاحبه، والنوع ConversationSession يمثّل الدورة المشتقّة.</w:t>
       </w:r>
     </w:p>
     <w:p>
@@ -2522,7 +2675,7 @@
           <w:szCs w:val="21"/>
           <w:rtl/>
         </w:rPr>
-        <w:t xml:space="preserve">عُدّلت شبكة العرض من grid-cols-2 lg:grid-cols-4 إلى grid-cols-1 sm:grid-cols-3، حتى لا يبقى كارت يتيم في سطر منفصل على الشاشات الصغيرة.</w:t>
+        <w:t xml:space="preserve">صارت أربعة مواضع تسجّل الحدث فعلياً: setConversationStatus عند الإغلاق أو إعادة الفتح، reopenConversation، ورسالة العميل الواردة نصية أو صوتية حين تُحيي محادثة مغلقة — وهذا آخرها كان يمرّ بلا أي أثر رغم أنه أكثرها تكراراً.</w:t>
       </w:r>
     </w:p>
     <w:p>
@@ -2544,7 +2697,95 @@
           <w:szCs w:val="21"/>
           <w:rtl/>
         </w:rPr>
-        <w:t xml:space="preserve">الكروت الباقية: متوسط تقييم المحادثة، متوسط تقييم الموظفين، إجمالي الروابط.</w:t>
+        <w:t xml:space="preserve">أُضيفت الدالة deriveSessions التي تقسّم الثريد إلى دورات: الأحداث المسجّلة مرجع قاطع، وما سبقها من تاريخ قديم تُستنتج حدوده من فجوات الصمت (24 ساعة افتراضاً) وتُعلَّم inferred حتى يظل الفرق بين المؤكَّد والمقدَّر ظاهراً.</w:t>
+      </w:r>
+    </w:p>
+    <w:p>
+      <w:pPr>
+        <w:pStyle w:val="ListParagraph"/>
+        <w:numPr>
+          <w:ilvl w:val="0"/>
+          <w:numId w:val="2"/>
+        </w:numPr>
+        <w:bidi/>
+        <w:spacing w:after="70" w:line="290"/>
+        <w:jc w:val="right"/>
+      </w:pPr>
+      <w:r>
+        <w:rPr>
+          <w:rFonts w:ascii="Arial" w:cs="Arial" w:eastAsia="Arial" w:hAnsi="Arial"/>
+          <w:color w:val="1E293B"/>
+          <w:sz w:val="21"/>
+          <w:szCs w:val="21"/>
+          <w:rtl/>
+        </w:rPr>
+        <w:t xml:space="preserve">الدالة تتعامل مع الحالة المختلطة: ثريد فيه تاريخ قديم مُستنتج ودورات جديدة مسجّلة في آن واحد.</w:t>
+      </w:r>
+    </w:p>
+    <w:p>
+      <w:pPr>
+        <w:pStyle w:val="ListParagraph"/>
+        <w:numPr>
+          <w:ilvl w:val="0"/>
+          <w:numId w:val="2"/>
+        </w:numPr>
+        <w:bidi/>
+        <w:spacing w:after="70" w:line="290"/>
+        <w:jc w:val="right"/>
+      </w:pPr>
+      <w:r>
+        <w:rPr>
+          <w:rFonts w:ascii="Arial" w:cs="Arial" w:eastAsia="Arial" w:hAnsi="Arial"/>
+          <w:color w:val="1E293B"/>
+          <w:sz w:val="21"/>
+          <w:szCs w:val="21"/>
+          <w:rtl/>
+        </w:rPr>
+        <w:t xml:space="preserve">اختُبر المنطق على ثماني حالات شملت الثريد الفارغ والرسالة الواحدة والفجوات المتعددة والأحداث المسجّلة والحالة المختلطة والمدخلات غير المرتّبة زمنياً — جميعها نجحت.</w:t>
+      </w:r>
+    </w:p>
+    <w:p>
+      <w:pPr>
+        <w:pStyle w:val="ListParagraph"/>
+        <w:numPr>
+          <w:ilvl w:val="0"/>
+          <w:numId w:val="2"/>
+        </w:numPr>
+        <w:bidi/>
+        <w:spacing w:after="70" w:line="290"/>
+        <w:jc w:val="right"/>
+      </w:pPr>
+      <w:r>
+        <w:rPr>
+          <w:rFonts w:ascii="Arial" w:cs="Arial" w:eastAsia="Arial" w:hAnsi="Arial"/>
+          <w:color w:val="1E293B"/>
+          <w:sz w:val="21"/>
+          <w:szCs w:val="21"/>
+          <w:rtl/>
+        </w:rPr>
+        <w:t xml:space="preserve">ملاحظة على البيانات الحالية: كل المحادثات التجريبية تُنتج دورة واحدة لأن رسائلها متقاربة بدقائق ولا فجوات فيها. الشريط لن يُظهر تقسيماً حقيقياً قبل توفّر بيانات متباعدة زمنياً.</w:t>
+      </w:r>
+    </w:p>
+    <w:p>
+      <w:pPr>
+        <w:pStyle w:val="ListParagraph"/>
+        <w:numPr>
+          <w:ilvl w:val="0"/>
+          <w:numId w:val="2"/>
+        </w:numPr>
+        <w:bidi/>
+        <w:spacing w:after="70" w:line="290"/>
+        <w:jc w:val="right"/>
+      </w:pPr>
+      <w:r>
+        <w:rPr>
+          <w:rFonts w:ascii="Arial" w:cs="Arial" w:eastAsia="Arial" w:hAnsi="Arial"/>
+          <w:color w:val="1E293B"/>
+          <w:sz w:val="21"/>
+          <w:szCs w:val="21"/>
+          <w:rtl/>
+        </w:rPr>
+        <w:t xml:space="preserve">لم تُبنَ واجهة الشريط بعد — هذا التعديل يغطّي طبقة البيانات وحدها.</w:t>
       </w:r>
     </w:p>
     <w:p>
@@ -2569,7 +2810,7 @@
           <w:szCs w:val="24"/>
           <w:rtl/>
         </w:rPr>
-        <w:t xml:space="preserve">تعديل رقم 2 — تغيير تسمية زر الترقية في صفحة الفوترة</w:t>
+        <w:t xml:space="preserve">تعديل رقم 3 — إزالة كارت نسبة الاستجابة من صفحة تقييمات العملاء</w:t>
       </w:r>
     </w:p>
     <w:p>
@@ -2816,7 +3057,7 @@
                 <w:szCs w:val="19"/>
                 <w:rtl/>
               </w:rPr>
-              <w:t xml:space="preserve">9 سبتمبر 2026</w:t>
+              <w:t xml:space="preserve">10 سبتمبر 2026</w:t>
             </w:r>
           </w:p>
         </w:tc>
@@ -2846,7 +3087,7 @@
                 <w:szCs w:val="19"/>
                 <w:rtl/>
               </w:rPr>
-              <w:t xml:space="preserve">الفوترة</w:t>
+              <w:t xml:space="preserve">تقييمات العملاء</w:t>
             </w:r>
           </w:p>
         </w:tc>
@@ -2876,7 +3117,7 @@
                 <w:szCs w:val="19"/>
                 <w:rtl/>
               </w:rPr>
-              <w:t xml:space="preserve">/billing</w:t>
+              <w:t xml:space="preserve">/rating</w:t>
             </w:r>
           </w:p>
         </w:tc>
@@ -2906,7 +3147,7 @@
                 <w:szCs w:val="19"/>
                 <w:rtl/>
               </w:rPr>
-              <w:t xml:space="preserve">src/pages/Billing.tsx</w:t>
+              <w:t xml:space="preserve">src/pages/CustomerRatings.tsx</w:t>
             </w:r>
           </w:p>
         </w:tc>
@@ -2936,38 +3177,38 @@
                 <w:szCs w:val="19"/>
                 <w:rtl/>
               </w:rPr>
-              <w:t xml:space="preserve">be5b3c0</w:t>
+              <w:t xml:space="preserve">cc8bd4f</w:t>
             </w:r>
           </w:p>
         </w:tc>
         <w:tc>
           <w:tcPr>
             <w:tcW w:type="dxa" w:w="1500"/>
-            <w:shd w:fill="ECFDF5" w:color="auto" w:val="clear"/>
-            <w:tcMar>
-              <w:top w:type="dxa" w:w="90"/>
-              <w:left w:type="dxa" w:w="110"/>
-              <w:bottom w:type="dxa" w:w="90"/>
-              <w:right w:type="dxa" w:w="110"/>
-            </w:tcMar>
-          </w:tcPr>
-          <w:p>
-            <w:pPr>
-              <w:bidi/>
-              <w:spacing w:after="0" w:line="280"/>
-              <w:jc w:val="right"/>
-            </w:pPr>
-            <w:r>
-              <w:rPr>
-                <w:rFonts w:ascii="Arial" w:cs="Arial" w:eastAsia="Arial" w:hAnsi="Arial"/>
-                <w:b/>
-                <w:bCs/>
-                <w:color w:val="15803D"/>
-                <w:sz w:val="19"/>
-                <w:szCs w:val="19"/>
-                <w:rtl/>
-              </w:rPr>
-              <w:t xml:space="preserve">منشور على الإنتاج</w:t>
+            <w:shd w:fill="FFFBEB" w:color="auto" w:val="clear"/>
+            <w:tcMar>
+              <w:top w:type="dxa" w:w="90"/>
+              <w:left w:type="dxa" w:w="110"/>
+              <w:bottom w:type="dxa" w:w="90"/>
+              <w:right w:type="dxa" w:w="110"/>
+            </w:tcMar>
+          </w:tcPr>
+          <w:p>
+            <w:pPr>
+              <w:bidi/>
+              <w:spacing w:after="0" w:line="280"/>
+              <w:jc w:val="right"/>
+            </w:pPr>
+            <w:r>
+              <w:rPr>
+                <w:rFonts w:ascii="Arial" w:cs="Arial" w:eastAsia="Arial" w:hAnsi="Arial"/>
+                <w:b/>
+                <w:bCs/>
+                <w:color w:val="B45309"/>
+                <w:sz w:val="19"/>
+                <w:szCs w:val="19"/>
+                <w:rtl/>
+              </w:rPr>
+              <w:t xml:space="preserve">مرفوع — غير منشور</w:t>
             </w:r>
           </w:p>
         </w:tc>
@@ -2997,7 +3238,7 @@
           <w:szCs w:val="21"/>
           <w:rtl/>
         </w:rPr>
-        <w:t xml:space="preserve">زر «ترقية» أصبح «تغيير الباقة».</w:t>
+        <w:t xml:space="preserve">حُذف كارت «نسبة الاستجابة» بالكامل من شريط الإحصائيات — صارت 3 كروت بدل 4.</w:t>
       </w:r>
     </w:p>
     <w:p>
@@ -3019,7 +3260,73 @@
           <w:szCs w:val="21"/>
           <w:rtl/>
         </w:rPr>
-        <w:t xml:space="preserve">سبب التغيير: الزر يوصّل إلى مسار يشمل الترقية والتخفيض معاً، فالتسمية القديمة كانت تصف نصف وظيفته.</w:t>
+        <w:t xml:space="preserve">حُذف معه حساب responseRate لأنه لم يعد له مستهلك في الصفحة.</w:t>
+      </w:r>
+    </w:p>
+    <w:p>
+      <w:pPr>
+        <w:pStyle w:val="ListParagraph"/>
+        <w:numPr>
+          <w:ilvl w:val="0"/>
+          <w:numId w:val="2"/>
+        </w:numPr>
+        <w:bidi/>
+        <w:spacing w:after="70" w:line="290"/>
+        <w:jc w:val="right"/>
+      </w:pPr>
+      <w:r>
+        <w:rPr>
+          <w:rFonts w:ascii="Arial" w:cs="Arial" w:eastAsia="Arial" w:hAnsi="Arial"/>
+          <w:color w:val="1E293B"/>
+          <w:sz w:val="21"/>
+          <w:szCs w:val="21"/>
+          <w:rtl/>
+        </w:rPr>
+        <w:t xml:space="preserve">حُذف استيراد أيقونة TrendingUp لأنها كانت مستخدمة في هذا الكارت وحده.</w:t>
+      </w:r>
+    </w:p>
+    <w:p>
+      <w:pPr>
+        <w:pStyle w:val="ListParagraph"/>
+        <w:numPr>
+          <w:ilvl w:val="0"/>
+          <w:numId w:val="2"/>
+        </w:numPr>
+        <w:bidi/>
+        <w:spacing w:after="70" w:line="290"/>
+        <w:jc w:val="right"/>
+      </w:pPr>
+      <w:r>
+        <w:rPr>
+          <w:rFonts w:ascii="Arial" w:cs="Arial" w:eastAsia="Arial" w:hAnsi="Arial"/>
+          <w:color w:val="1E293B"/>
+          <w:sz w:val="21"/>
+          <w:szCs w:val="21"/>
+          <w:rtl/>
+        </w:rPr>
+        <w:t xml:space="preserve">عُدّلت شبكة العرض من grid-cols-2 lg:grid-cols-4 إلى grid-cols-1 sm:grid-cols-3، حتى لا يبقى كارت يتيم في سطر منفصل على الشاشات الصغيرة.</w:t>
+      </w:r>
+    </w:p>
+    <w:p>
+      <w:pPr>
+        <w:pStyle w:val="ListParagraph"/>
+        <w:numPr>
+          <w:ilvl w:val="0"/>
+          <w:numId w:val="2"/>
+        </w:numPr>
+        <w:bidi/>
+        <w:spacing w:after="70" w:line="290"/>
+        <w:jc w:val="right"/>
+      </w:pPr>
+      <w:r>
+        <w:rPr>
+          <w:rFonts w:ascii="Arial" w:cs="Arial" w:eastAsia="Arial" w:hAnsi="Arial"/>
+          <w:color w:val="1E293B"/>
+          <w:sz w:val="21"/>
+          <w:szCs w:val="21"/>
+          <w:rtl/>
+        </w:rPr>
+        <w:t xml:space="preserve">الكروت الباقية: متوسط تقييم المحادثة، متوسط تقييم الموظفين، إجمالي الروابط.</w:t>
       </w:r>
     </w:p>
     <w:p>
@@ -3044,7 +3351,7 @@
           <w:szCs w:val="24"/>
           <w:rtl/>
         </w:rPr>
-        <w:t xml:space="preserve">تعديل رقم 1 — ميزة تغيير الباقة — US-131</w:t>
+        <w:t xml:space="preserve">تعديل رقم 2 — تغيير تسمية زر الترقية في صفحة الفوترة</w:t>
       </w:r>
     </w:p>
     <w:p>
@@ -3321,7 +3628,7 @@
                 <w:szCs w:val="19"/>
                 <w:rtl/>
               </w:rPr>
-              <w:t xml:space="preserve">الاشتراك</w:t>
+              <w:t xml:space="preserve">الفوترة</w:t>
             </w:r>
           </w:p>
         </w:tc>
@@ -3351,7 +3658,7 @@
                 <w:szCs w:val="19"/>
                 <w:rtl/>
               </w:rPr>
-              <w:t xml:space="preserve">/subscribe</w:t>
+              <w:t xml:space="preserve">/billing</w:t>
             </w:r>
           </w:p>
         </w:tc>
@@ -3381,7 +3688,7 @@
                 <w:szCs w:val="19"/>
                 <w:rtl/>
               </w:rPr>
-              <w:t xml:space="preserve">src/pages/Subscribe.tsx</w:t>
+              <w:t xml:space="preserve">src/pages/Billing.tsx</w:t>
             </w:r>
           </w:p>
         </w:tc>
@@ -3411,7 +3718,7 @@
                 <w:szCs w:val="19"/>
                 <w:rtl/>
               </w:rPr>
-              <w:t xml:space="preserve">be5b3c0 · c49b797</w:t>
+              <w:t xml:space="preserve">be5b3c0</w:t>
             </w:r>
           </w:p>
         </w:tc>
@@ -3472,7 +3779,7 @@
           <w:szCs w:val="21"/>
           <w:rtl/>
         </w:rPr>
-        <w:t xml:space="preserve">إعادة بناء شبه كاملة للصفحة — 715 سطراً متغيّراً.</w:t>
+        <w:t xml:space="preserve">زر «ترقية» أصبح «تغيير الباقة».</w:t>
       </w:r>
     </w:p>
     <w:p>
@@ -3494,8 +3801,439 @@
           <w:szCs w:val="21"/>
           <w:rtl/>
         </w:rPr>
-        <w:t xml:space="preserve">اختيار الباقة صار بشريط تمرير (slider) حسب عدد المحادثات الشهرية بدل شبكة الكروت. كل باقة نقطة توقف على الشريط، وباقة المؤسسات هي النقطة الأخيرة بعنوان «غير محدود».</w:t>
-      </w:r>
+        <w:t xml:space="preserve">سبب التغيير: الزر يوصّل إلى مسار يشمل الترقية والتخفيض معاً، فالتسمية القديمة كانت تصف نصف وظيفته.</w:t>
+      </w:r>
+    </w:p>
+    <w:p>
+      <w:pPr>
+        <w:spacing w:after="160"/>
+      </w:pPr>
+    </w:p>
+    <w:p>
+      <w:pPr>
+        <w:pStyle w:val="Heading2"/>
+        <w:bidi/>
+        <w:spacing w:after="120" w:before="300"/>
+        <w:jc w:val="right"/>
+      </w:pPr>
+      <w:r>
+        <w:rPr>
+          <w:rFonts w:ascii="Arial" w:cs="Arial" w:eastAsia="Arial" w:hAnsi="Arial"/>
+          <w:b/>
+          <w:bCs/>
+          <w:color w:val="1E293B"/>
+          <w:sz w:val="24"/>
+          <w:szCs w:val="24"/>
+          <w:rtl/>
+        </w:rPr>
+        <w:t xml:space="preserve">تعديل رقم 1 — ميزة تغيير الباقة — US-131</w:t>
+      </w:r>
+    </w:p>
+    <w:p>
+      <w:pPr>
+        <w:spacing w:after="50"/>
+      </w:pPr>
+    </w:p>
+    <w:tbl>
+      <w:tblPr>
+        <w:bidiVisual/>
+        <w:tblW w:type="dxa" w:w="9000"/>
+        <w:tblBorders>
+          <w:top w:val="single" w:color="CBD5E1" w:sz="4"/>
+          <w:left w:val="single" w:color="CBD5E1" w:sz="4"/>
+          <w:bottom w:val="single" w:color="CBD5E1" w:sz="4"/>
+          <w:right w:val="single" w:color="CBD5E1" w:sz="4"/>
+          <w:insideH w:val="single" w:color="CBD5E1" w:sz="4"/>
+          <w:insideV w:val="single" w:color="CBD5E1" w:sz="4"/>
+        </w:tblBorders>
+      </w:tblPr>
+      <w:tblGrid>
+        <w:gridCol w:w="1250"/>
+        <w:gridCol w:w="1250"/>
+        <w:gridCol w:w="1150"/>
+        <w:gridCol w:w="2500"/>
+        <w:gridCol w:w="1350"/>
+        <w:gridCol w:w="1500"/>
+      </w:tblGrid>
+      <w:tr>
+        <w:trPr>
+          <w:tblHeader/>
+        </w:trPr>
+        <w:tc>
+          <w:tcPr>
+            <w:tcW w:type="dxa" w:w="1250"/>
+            <w:shd w:fill="2563EB" w:color="auto" w:val="clear"/>
+            <w:tcMar>
+              <w:top w:type="dxa" w:w="90"/>
+              <w:left w:type="dxa" w:w="110"/>
+              <w:bottom w:type="dxa" w:w="90"/>
+              <w:right w:type="dxa" w:w="110"/>
+            </w:tcMar>
+          </w:tcPr>
+          <w:p>
+            <w:pPr>
+              <w:bidi/>
+              <w:spacing w:after="0" w:line="280"/>
+              <w:jc w:val="right"/>
+            </w:pPr>
+            <w:r>
+              <w:rPr>
+                <w:rFonts w:ascii="Arial" w:cs="Arial" w:eastAsia="Arial" w:hAnsi="Arial"/>
+                <w:b/>
+                <w:bCs/>
+                <w:color w:val="FFFFFF"/>
+                <w:sz w:val="19"/>
+                <w:szCs w:val="19"/>
+                <w:rtl/>
+              </w:rPr>
+              <w:t xml:space="preserve">التاريخ</w:t>
+            </w:r>
+          </w:p>
+        </w:tc>
+        <w:tc>
+          <w:tcPr>
+            <w:tcW w:type="dxa" w:w="1250"/>
+            <w:shd w:fill="2563EB" w:color="auto" w:val="clear"/>
+            <w:tcMar>
+              <w:top w:type="dxa" w:w="90"/>
+              <w:left w:type="dxa" w:w="110"/>
+              <w:bottom w:type="dxa" w:w="90"/>
+              <w:right w:type="dxa" w:w="110"/>
+            </w:tcMar>
+          </w:tcPr>
+          <w:p>
+            <w:pPr>
+              <w:bidi/>
+              <w:spacing w:after="0" w:line="280"/>
+              <w:jc w:val="right"/>
+            </w:pPr>
+            <w:r>
+              <w:rPr>
+                <w:rFonts w:ascii="Arial" w:cs="Arial" w:eastAsia="Arial" w:hAnsi="Arial"/>
+                <w:b/>
+                <w:bCs/>
+                <w:color w:val="FFFFFF"/>
+                <w:sz w:val="19"/>
+                <w:szCs w:val="19"/>
+                <w:rtl/>
+              </w:rPr>
+              <w:t xml:space="preserve">الصفحة</w:t>
+            </w:r>
+          </w:p>
+        </w:tc>
+        <w:tc>
+          <w:tcPr>
+            <w:tcW w:type="dxa" w:w="1150"/>
+            <w:shd w:fill="2563EB" w:color="auto" w:val="clear"/>
+            <w:tcMar>
+              <w:top w:type="dxa" w:w="90"/>
+              <w:left w:type="dxa" w:w="110"/>
+              <w:bottom w:type="dxa" w:w="90"/>
+              <w:right w:type="dxa" w:w="110"/>
+            </w:tcMar>
+          </w:tcPr>
+          <w:p>
+            <w:pPr>
+              <w:bidi/>
+              <w:spacing w:after="0" w:line="280"/>
+              <w:jc w:val="right"/>
+            </w:pPr>
+            <w:r>
+              <w:rPr>
+                <w:rFonts w:ascii="Arial" w:cs="Arial" w:eastAsia="Arial" w:hAnsi="Arial"/>
+                <w:b/>
+                <w:bCs/>
+                <w:color w:val="FFFFFF"/>
+                <w:sz w:val="19"/>
+                <w:szCs w:val="19"/>
+                <w:rtl/>
+              </w:rPr>
+              <w:t xml:space="preserve">المسار</w:t>
+            </w:r>
+          </w:p>
+        </w:tc>
+        <w:tc>
+          <w:tcPr>
+            <w:tcW w:type="dxa" w:w="2500"/>
+            <w:shd w:fill="2563EB" w:color="auto" w:val="clear"/>
+            <w:tcMar>
+              <w:top w:type="dxa" w:w="90"/>
+              <w:left w:type="dxa" w:w="110"/>
+              <w:bottom w:type="dxa" w:w="90"/>
+              <w:right w:type="dxa" w:w="110"/>
+            </w:tcMar>
+          </w:tcPr>
+          <w:p>
+            <w:pPr>
+              <w:bidi/>
+              <w:spacing w:after="0" w:line="280"/>
+              <w:jc w:val="right"/>
+            </w:pPr>
+            <w:r>
+              <w:rPr>
+                <w:rFonts w:ascii="Arial" w:cs="Arial" w:eastAsia="Arial" w:hAnsi="Arial"/>
+                <w:b/>
+                <w:bCs/>
+                <w:color w:val="FFFFFF"/>
+                <w:sz w:val="19"/>
+                <w:szCs w:val="19"/>
+                <w:rtl/>
+              </w:rPr>
+              <w:t xml:space="preserve">الملف</w:t>
+            </w:r>
+          </w:p>
+        </w:tc>
+        <w:tc>
+          <w:tcPr>
+            <w:tcW w:type="dxa" w:w="1350"/>
+            <w:shd w:fill="2563EB" w:color="auto" w:val="clear"/>
+            <w:tcMar>
+              <w:top w:type="dxa" w:w="90"/>
+              <w:left w:type="dxa" w:w="110"/>
+              <w:bottom w:type="dxa" w:w="90"/>
+              <w:right w:type="dxa" w:w="110"/>
+            </w:tcMar>
+          </w:tcPr>
+          <w:p>
+            <w:pPr>
+              <w:bidi/>
+              <w:spacing w:after="0" w:line="280"/>
+              <w:jc w:val="right"/>
+            </w:pPr>
+            <w:r>
+              <w:rPr>
+                <w:rFonts w:ascii="Arial" w:cs="Arial" w:eastAsia="Arial" w:hAnsi="Arial"/>
+                <w:b/>
+                <w:bCs/>
+                <w:color w:val="FFFFFF"/>
+                <w:sz w:val="19"/>
+                <w:szCs w:val="19"/>
+                <w:rtl/>
+              </w:rPr>
+              <w:t xml:space="preserve">الكوميت</w:t>
+            </w:r>
+          </w:p>
+        </w:tc>
+        <w:tc>
+          <w:tcPr>
+            <w:tcW w:type="dxa" w:w="1500"/>
+            <w:shd w:fill="2563EB" w:color="auto" w:val="clear"/>
+            <w:tcMar>
+              <w:top w:type="dxa" w:w="90"/>
+              <w:left w:type="dxa" w:w="110"/>
+              <w:bottom w:type="dxa" w:w="90"/>
+              <w:right w:type="dxa" w:w="110"/>
+            </w:tcMar>
+          </w:tcPr>
+          <w:p>
+            <w:pPr>
+              <w:bidi/>
+              <w:spacing w:after="0" w:line="280"/>
+              <w:jc w:val="right"/>
+            </w:pPr>
+            <w:r>
+              <w:rPr>
+                <w:rFonts w:ascii="Arial" w:cs="Arial" w:eastAsia="Arial" w:hAnsi="Arial"/>
+                <w:b/>
+                <w:bCs/>
+                <w:color w:val="FFFFFF"/>
+                <w:sz w:val="19"/>
+                <w:szCs w:val="19"/>
+                <w:rtl/>
+              </w:rPr>
+              <w:t xml:space="preserve">الحالة</w:t>
+            </w:r>
+          </w:p>
+        </w:tc>
+      </w:tr>
+      <w:tr>
+        <w:tc>
+          <w:tcPr>
+            <w:tcW w:type="dxa" w:w="1250"/>
+            <w:tcMar>
+              <w:top w:type="dxa" w:w="90"/>
+              <w:left w:type="dxa" w:w="110"/>
+              <w:bottom w:type="dxa" w:w="90"/>
+              <w:right w:type="dxa" w:w="110"/>
+            </w:tcMar>
+          </w:tcPr>
+          <w:p>
+            <w:pPr>
+              <w:bidi/>
+              <w:spacing w:after="0" w:line="280"/>
+              <w:jc w:val="right"/>
+            </w:pPr>
+            <w:r>
+              <w:rPr>
+                <w:rFonts w:ascii="Arial" w:cs="Arial" w:eastAsia="Arial" w:hAnsi="Arial"/>
+                <w:b w:val="false"/>
+                <w:bCs w:val="false"/>
+                <w:color w:val="1E293B"/>
+                <w:sz w:val="19"/>
+                <w:szCs w:val="19"/>
+                <w:rtl/>
+              </w:rPr>
+              <w:t xml:space="preserve">9 سبتمبر 2026</w:t>
+            </w:r>
+          </w:p>
+        </w:tc>
+        <w:tc>
+          <w:tcPr>
+            <w:tcW w:type="dxa" w:w="1250"/>
+            <w:tcMar>
+              <w:top w:type="dxa" w:w="90"/>
+              <w:left w:type="dxa" w:w="110"/>
+              <w:bottom w:type="dxa" w:w="90"/>
+              <w:right w:type="dxa" w:w="110"/>
+            </w:tcMar>
+          </w:tcPr>
+          <w:p>
+            <w:pPr>
+              <w:bidi/>
+              <w:spacing w:after="0" w:line="280"/>
+              <w:jc w:val="right"/>
+            </w:pPr>
+            <w:r>
+              <w:rPr>
+                <w:rFonts w:ascii="Arial" w:cs="Arial" w:eastAsia="Arial" w:hAnsi="Arial"/>
+                <w:b w:val="false"/>
+                <w:bCs w:val="false"/>
+                <w:color w:val="1E293B"/>
+                <w:sz w:val="19"/>
+                <w:szCs w:val="19"/>
+                <w:rtl/>
+              </w:rPr>
+              <w:t xml:space="preserve">الاشتراك</w:t>
+            </w:r>
+          </w:p>
+        </w:tc>
+        <w:tc>
+          <w:tcPr>
+            <w:tcW w:type="dxa" w:w="1150"/>
+            <w:tcMar>
+              <w:top w:type="dxa" w:w="90"/>
+              <w:left w:type="dxa" w:w="110"/>
+              <w:bottom w:type="dxa" w:w="90"/>
+              <w:right w:type="dxa" w:w="110"/>
+            </w:tcMar>
+          </w:tcPr>
+          <w:p>
+            <w:pPr>
+              <w:bidi/>
+              <w:spacing w:after="0" w:line="280"/>
+              <w:jc w:val="right"/>
+            </w:pPr>
+            <w:r>
+              <w:rPr>
+                <w:rFonts w:ascii="Arial" w:cs="Arial" w:eastAsia="Arial" w:hAnsi="Arial"/>
+                <w:b w:val="false"/>
+                <w:bCs w:val="false"/>
+                <w:color w:val="1E293B"/>
+                <w:sz w:val="19"/>
+                <w:szCs w:val="19"/>
+                <w:rtl/>
+              </w:rPr>
+              <w:t xml:space="preserve">/subscribe</w:t>
+            </w:r>
+          </w:p>
+        </w:tc>
+        <w:tc>
+          <w:tcPr>
+            <w:tcW w:type="dxa" w:w="2500"/>
+            <w:tcMar>
+              <w:top w:type="dxa" w:w="90"/>
+              <w:left w:type="dxa" w:w="110"/>
+              <w:bottom w:type="dxa" w:w="90"/>
+              <w:right w:type="dxa" w:w="110"/>
+            </w:tcMar>
+          </w:tcPr>
+          <w:p>
+            <w:pPr>
+              <w:bidi/>
+              <w:spacing w:after="0" w:line="280"/>
+              <w:jc w:val="right"/>
+            </w:pPr>
+            <w:r>
+              <w:rPr>
+                <w:rFonts w:ascii="Arial" w:cs="Arial" w:eastAsia="Arial" w:hAnsi="Arial"/>
+                <w:b w:val="false"/>
+                <w:bCs w:val="false"/>
+                <w:color w:val="1E293B"/>
+                <w:sz w:val="19"/>
+                <w:szCs w:val="19"/>
+                <w:rtl/>
+              </w:rPr>
+              <w:t xml:space="preserve">src/pages/Subscribe.tsx</w:t>
+            </w:r>
+          </w:p>
+        </w:tc>
+        <w:tc>
+          <w:tcPr>
+            <w:tcW w:type="dxa" w:w="1350"/>
+            <w:tcMar>
+              <w:top w:type="dxa" w:w="90"/>
+              <w:left w:type="dxa" w:w="110"/>
+              <w:bottom w:type="dxa" w:w="90"/>
+              <w:right w:type="dxa" w:w="110"/>
+            </w:tcMar>
+          </w:tcPr>
+          <w:p>
+            <w:pPr>
+              <w:bidi/>
+              <w:spacing w:after="0" w:line="280"/>
+              <w:jc w:val="right"/>
+            </w:pPr>
+            <w:r>
+              <w:rPr>
+                <w:rFonts w:ascii="Arial" w:cs="Arial" w:eastAsia="Arial" w:hAnsi="Arial"/>
+                <w:b w:val="false"/>
+                <w:bCs w:val="false"/>
+                <w:color w:val="1E293B"/>
+                <w:sz w:val="19"/>
+                <w:szCs w:val="19"/>
+                <w:rtl/>
+              </w:rPr>
+              <w:t xml:space="preserve">be5b3c0 · c49b797</w:t>
+            </w:r>
+          </w:p>
+        </w:tc>
+        <w:tc>
+          <w:tcPr>
+            <w:tcW w:type="dxa" w:w="1500"/>
+            <w:shd w:fill="ECFDF5" w:color="auto" w:val="clear"/>
+            <w:tcMar>
+              <w:top w:type="dxa" w:w="90"/>
+              <w:left w:type="dxa" w:w="110"/>
+              <w:bottom w:type="dxa" w:w="90"/>
+              <w:right w:type="dxa" w:w="110"/>
+            </w:tcMar>
+          </w:tcPr>
+          <w:p>
+            <w:pPr>
+              <w:bidi/>
+              <w:spacing w:after="0" w:line="280"/>
+              <w:jc w:val="right"/>
+            </w:pPr>
+            <w:r>
+              <w:rPr>
+                <w:rFonts w:ascii="Arial" w:cs="Arial" w:eastAsia="Arial" w:hAnsi="Arial"/>
+                <w:b/>
+                <w:bCs/>
+                <w:color w:val="15803D"/>
+                <w:sz w:val="19"/>
+                <w:szCs w:val="19"/>
+                <w:rtl/>
+              </w:rPr>
+              <w:t xml:space="preserve">منشور على الإنتاج</w:t>
+            </w:r>
+          </w:p>
+        </w:tc>
+      </w:tr>
+    </w:tbl>
+    <w:p>
+      <w:pPr>
+        <w:spacing w:after="90"/>
+      </w:pPr>
     </w:p>
     <w:p>
       <w:pPr>
@@ -3516,7 +4254,7 @@
           <w:szCs w:val="21"/>
           <w:rtl/>
         </w:rPr>
-        <w:t xml:space="preserve">مسار من ست خطوات: اختيار الباقة، ثم تأكيد التخفيض، ثم الدفع، ثم المعالجة، ثم النجاح أو الفشل.</w:t>
+        <w:t xml:space="preserve">إعادة بناء شبه كاملة للصفحة — 715 سطراً متغيّراً.</w:t>
       </w:r>
     </w:p>
     <w:p>
@@ -3538,7 +4276,7 @@
           <w:szCs w:val="21"/>
           <w:rtl/>
         </w:rPr>
-        <w:t xml:space="preserve">احتساب تناسبي للترقية: يُحصَّل فرق السعر عن الأيام المتبقية من الدورة الحالية فقط، ويظهر المبلغ مفصّلاً في ملخص الدفع.</w:t>
+        <w:t xml:space="preserve">اختيار الباقة صار بشريط تمرير (slider) حسب عدد المحادثات الشهرية بدل شبكة الكروت. كل باقة نقطة توقف على الشريط، وباقة المؤسسات هي النقطة الأخيرة بعنوان «غير محدود».</w:t>
       </w:r>
     </w:p>
     <w:p>
@@ -3560,7 +4298,7 @@
           <w:szCs w:val="21"/>
           <w:rtl/>
         </w:rPr>
-        <w:t xml:space="preserve">التخفيض له شاشة تأكيد مستقلة ولا يذهب مباشرة إلى الدفع.</w:t>
+        <w:t xml:space="preserve">مسار من ست خطوات: اختيار الباقة، ثم تأكيد التخفيض، ثم الدفع، ثم المعالجة، ثم النجاح أو الفشل.</w:t>
       </w:r>
     </w:p>
     <w:p>
@@ -3582,7 +4320,7 @@
           <w:szCs w:val="21"/>
           <w:rtl/>
         </w:rPr>
-        <w:t xml:space="preserve">دورة الفوترة تُقرأ من اشتراك العميل الحالي بدل أن تبدأ بقيمة ثابتة.</w:t>
+        <w:t xml:space="preserve">احتساب تناسبي للترقية: يُحصَّل فرق السعر عن الأيام المتبقية من الدورة الحالية فقط، ويظهر المبلغ مفصّلاً في ملخص الدفع.</w:t>
       </w:r>
     </w:p>
     <w:p>
@@ -3604,6 +4342,50 @@
           <w:szCs w:val="21"/>
           <w:rtl/>
         </w:rPr>
+        <w:t xml:space="preserve">التخفيض له شاشة تأكيد مستقلة ولا يذهب مباشرة إلى الدفع.</w:t>
+      </w:r>
+    </w:p>
+    <w:p>
+      <w:pPr>
+        <w:pStyle w:val="ListParagraph"/>
+        <w:numPr>
+          <w:ilvl w:val="0"/>
+          <w:numId w:val="2"/>
+        </w:numPr>
+        <w:bidi/>
+        <w:spacing w:after="70" w:line="290"/>
+        <w:jc w:val="right"/>
+      </w:pPr>
+      <w:r>
+        <w:rPr>
+          <w:rFonts w:ascii="Arial" w:cs="Arial" w:eastAsia="Arial" w:hAnsi="Arial"/>
+          <w:color w:val="1E293B"/>
+          <w:sz w:val="21"/>
+          <w:szCs w:val="21"/>
+          <w:rtl/>
+        </w:rPr>
+        <w:t xml:space="preserve">دورة الفوترة تُقرأ من اشتراك العميل الحالي بدل أن تبدأ بقيمة ثابتة.</w:t>
+      </w:r>
+    </w:p>
+    <w:p>
+      <w:pPr>
+        <w:pStyle w:val="ListParagraph"/>
+        <w:numPr>
+          <w:ilvl w:val="0"/>
+          <w:numId w:val="2"/>
+        </w:numPr>
+        <w:bidi/>
+        <w:spacing w:after="70" w:line="290"/>
+        <w:jc w:val="right"/>
+      </w:pPr>
+      <w:r>
+        <w:rPr>
+          <w:rFonts w:ascii="Arial" w:cs="Arial" w:eastAsia="Arial" w:hAnsi="Arial"/>
+          <w:color w:val="1E293B"/>
+          <w:sz w:val="21"/>
+          <w:szCs w:val="21"/>
+          <w:rtl/>
+        </w:rPr>
         <w:t xml:space="preserve">أُصلحت علامات تعارض الدمج (merge conflict markers) التي كانت باقية في الملف — كوميت c49b797.</w:t>
       </w:r>
     </w:p>
@@ -3790,7 +4572,7 @@
           <w:szCs w:val="20"/>
           <w:rtl/>
         </w:rPr>
-        <w:t xml:space="preserve">عدد التعديلات المسجّلة: 4</w:t>
+        <w:t xml:space="preserve">عدد التعديلات المسجّلة: 5</w:t>
       </w:r>
     </w:p>
     <w:sectPr>

</xml_diff>

<commit_message>
deploy build 06e4f0fa to production
Publishes the customer-ratings card removal, session tracking, and the
thread index rail. Changelog entries move to live and the tracked dist
artifacts match what is now served.

Co-Authored-By: Claude Opus 5 <noreply@anthropic.com>
Claude-Session: https://claude.ai/code/session_01JGHUnSrtQwLX2BGbB3j6wk
</commit_message>
<xml_diff>
--- a/docs/سجل التعديلات الاخيرة.docx
+++ b/docs/سجل التعديلات الاخيرة.docx
@@ -451,31 +451,31 @@
         <w:tc>
           <w:tcPr>
             <w:tcW w:type="dxa" w:w="1800"/>
-            <w:shd w:fill="FFFBEB" w:color="auto" w:val="clear"/>
-            <w:tcMar>
-              <w:top w:type="dxa" w:w="90"/>
-              <w:left w:type="dxa" w:w="110"/>
-              <w:bottom w:type="dxa" w:w="90"/>
-              <w:right w:type="dxa" w:w="110"/>
-            </w:tcMar>
-          </w:tcPr>
-          <w:p>
-            <w:pPr>
-              <w:bidi/>
-              <w:spacing w:after="0" w:line="280"/>
-              <w:jc w:val="right"/>
-            </w:pPr>
-            <w:r>
-              <w:rPr>
-                <w:rFonts w:ascii="Arial" w:cs="Arial" w:eastAsia="Arial" w:hAnsi="Arial"/>
-                <w:b/>
-                <w:bCs/>
-                <w:color w:val="B45309"/>
-                <w:sz w:val="19"/>
-                <w:szCs w:val="19"/>
-                <w:rtl/>
-              </w:rPr>
-              <w:t xml:space="preserve">مرفوع — غير منشور</w:t>
+            <w:shd w:fill="ECFDF5" w:color="auto" w:val="clear"/>
+            <w:tcMar>
+              <w:top w:type="dxa" w:w="90"/>
+              <w:left w:type="dxa" w:w="110"/>
+              <w:bottom w:type="dxa" w:w="90"/>
+              <w:right w:type="dxa" w:w="110"/>
+            </w:tcMar>
+          </w:tcPr>
+          <w:p>
+            <w:pPr>
+              <w:bidi/>
+              <w:spacing w:after="0" w:line="280"/>
+              <w:jc w:val="right"/>
+            </w:pPr>
+            <w:r>
+              <w:rPr>
+                <w:rFonts w:ascii="Arial" w:cs="Arial" w:eastAsia="Arial" w:hAnsi="Arial"/>
+                <w:b/>
+                <w:bCs/>
+                <w:color w:val="15803D"/>
+                <w:sz w:val="19"/>
+                <w:szCs w:val="19"/>
+                <w:rtl/>
+              </w:rPr>
+              <w:t xml:space="preserve">منشور على الإنتاج</w:t>
             </w:r>
           </w:p>
         </w:tc>
@@ -608,31 +608,31 @@
         <w:tc>
           <w:tcPr>
             <w:tcW w:type="dxa" w:w="1800"/>
-            <w:shd w:fill="FFFBEB" w:color="auto" w:val="clear"/>
-            <w:tcMar>
-              <w:top w:type="dxa" w:w="90"/>
-              <w:left w:type="dxa" w:w="110"/>
-              <w:bottom w:type="dxa" w:w="90"/>
-              <w:right w:type="dxa" w:w="110"/>
-            </w:tcMar>
-          </w:tcPr>
-          <w:p>
-            <w:pPr>
-              <w:bidi/>
-              <w:spacing w:after="0" w:line="280"/>
-              <w:jc w:val="right"/>
-            </w:pPr>
-            <w:r>
-              <w:rPr>
-                <w:rFonts w:ascii="Arial" w:cs="Arial" w:eastAsia="Arial" w:hAnsi="Arial"/>
-                <w:b/>
-                <w:bCs/>
-                <w:color w:val="B45309"/>
-                <w:sz w:val="19"/>
-                <w:szCs w:val="19"/>
-                <w:rtl/>
-              </w:rPr>
-              <w:t xml:space="preserve">مرفوع — غير منشور</w:t>
+            <w:shd w:fill="ECFDF5" w:color="auto" w:val="clear"/>
+            <w:tcMar>
+              <w:top w:type="dxa" w:w="90"/>
+              <w:left w:type="dxa" w:w="110"/>
+              <w:bottom w:type="dxa" w:w="90"/>
+              <w:right w:type="dxa" w:w="110"/>
+            </w:tcMar>
+          </w:tcPr>
+          <w:p>
+            <w:pPr>
+              <w:bidi/>
+              <w:spacing w:after="0" w:line="280"/>
+              <w:jc w:val="right"/>
+            </w:pPr>
+            <w:r>
+              <w:rPr>
+                <w:rFonts w:ascii="Arial" w:cs="Arial" w:eastAsia="Arial" w:hAnsi="Arial"/>
+                <w:b/>
+                <w:bCs/>
+                <w:color w:val="15803D"/>
+                <w:sz w:val="19"/>
+                <w:szCs w:val="19"/>
+                <w:rtl/>
+              </w:rPr>
+              <w:t xml:space="preserve">منشور على الإنتاج</w:t>
             </w:r>
           </w:p>
         </w:tc>
@@ -761,31 +761,31 @@
         <w:tc>
           <w:tcPr>
             <w:tcW w:type="dxa" w:w="1800"/>
-            <w:shd w:fill="FFFBEB" w:color="auto" w:val="clear"/>
-            <w:tcMar>
-              <w:top w:type="dxa" w:w="90"/>
-              <w:left w:type="dxa" w:w="110"/>
-              <w:bottom w:type="dxa" w:w="90"/>
-              <w:right w:type="dxa" w:w="110"/>
-            </w:tcMar>
-          </w:tcPr>
-          <w:p>
-            <w:pPr>
-              <w:bidi/>
-              <w:spacing w:after="0" w:line="280"/>
-              <w:jc w:val="right"/>
-            </w:pPr>
-            <w:r>
-              <w:rPr>
-                <w:rFonts w:ascii="Arial" w:cs="Arial" w:eastAsia="Arial" w:hAnsi="Arial"/>
-                <w:b/>
-                <w:bCs/>
-                <w:color w:val="B45309"/>
-                <w:sz w:val="19"/>
-                <w:szCs w:val="19"/>
-                <w:rtl/>
-              </w:rPr>
-              <w:t xml:space="preserve">مرفوع — غير منشور</w:t>
+            <w:shd w:fill="ECFDF5" w:color="auto" w:val="clear"/>
+            <w:tcMar>
+              <w:top w:type="dxa" w:w="90"/>
+              <w:left w:type="dxa" w:w="110"/>
+              <w:bottom w:type="dxa" w:w="90"/>
+              <w:right w:type="dxa" w:w="110"/>
+            </w:tcMar>
+          </w:tcPr>
+          <w:p>
+            <w:pPr>
+              <w:bidi/>
+              <w:spacing w:after="0" w:line="280"/>
+              <w:jc w:val="right"/>
+            </w:pPr>
+            <w:r>
+              <w:rPr>
+                <w:rFonts w:ascii="Arial" w:cs="Arial" w:eastAsia="Arial" w:hAnsi="Arial"/>
+                <w:b/>
+                <w:bCs/>
+                <w:color w:val="15803D"/>
+                <w:sz w:val="19"/>
+                <w:szCs w:val="19"/>
+                <w:rtl/>
+              </w:rPr>
+              <w:t xml:space="preserve">منشور على الإنتاج</w:t>
             </w:r>
           </w:p>
         </w:tc>
@@ -1467,7 +1467,7 @@
                 <w:szCs w:val="20"/>
                 <w:rtl/>
               </w:rPr>
-              <w:t xml:space="preserve">البناء المنشور على الإنتاج: 2b5d5cb7-ae3d-4d19-88e3-dc3bc0218602</w:t>
+              <w:t xml:space="preserve">البناء المنشور على الإنتاج: 06e4f0fa-ddab-4ae4-8ad8-f853c3466c95</w:t>
             </w:r>
           </w:p>
           <w:p>
@@ -1484,7 +1484,7 @@
                 <w:szCs w:val="20"/>
                 <w:rtl/>
               </w:rPr>
-              <w:t xml:space="preserve">يوجد 3 تعديل مرفوع على الفرع ولم يُنشر بعد — مبيّن في الجدول أعلاه.</w:t>
+              <w:t xml:space="preserve">كل التعديلات المرفوعة منشورة على الإنتاج.</w:t>
             </w:r>
           </w:p>
           <w:p>
@@ -1919,38 +1919,38 @@
                 <w:szCs w:val="19"/>
                 <w:rtl/>
               </w:rPr>
-              <w:t xml:space="preserve">—</w:t>
+              <w:t xml:space="preserve">e05e715</w:t>
             </w:r>
           </w:p>
         </w:tc>
         <w:tc>
           <w:tcPr>
             <w:tcW w:type="dxa" w:w="1500"/>
-            <w:shd w:fill="FFFBEB" w:color="auto" w:val="clear"/>
-            <w:tcMar>
-              <w:top w:type="dxa" w:w="90"/>
-              <w:left w:type="dxa" w:w="110"/>
-              <w:bottom w:type="dxa" w:w="90"/>
-              <w:right w:type="dxa" w:w="110"/>
-            </w:tcMar>
-          </w:tcPr>
-          <w:p>
-            <w:pPr>
-              <w:bidi/>
-              <w:spacing w:after="0" w:line="280"/>
-              <w:jc w:val="right"/>
-            </w:pPr>
-            <w:r>
-              <w:rPr>
-                <w:rFonts w:ascii="Arial" w:cs="Arial" w:eastAsia="Arial" w:hAnsi="Arial"/>
-                <w:b/>
-                <w:bCs/>
-                <w:color w:val="B45309"/>
-                <w:sz w:val="19"/>
-                <w:szCs w:val="19"/>
-                <w:rtl/>
-              </w:rPr>
-              <w:t xml:space="preserve">مرفوع — غير منشور</w:t>
+            <w:shd w:fill="ECFDF5" w:color="auto" w:val="clear"/>
+            <w:tcMar>
+              <w:top w:type="dxa" w:w="90"/>
+              <w:left w:type="dxa" w:w="110"/>
+              <w:bottom w:type="dxa" w:w="90"/>
+              <w:right w:type="dxa" w:w="110"/>
+            </w:tcMar>
+          </w:tcPr>
+          <w:p>
+            <w:pPr>
+              <w:bidi/>
+              <w:spacing w:after="0" w:line="280"/>
+              <w:jc w:val="right"/>
+            </w:pPr>
+            <w:r>
+              <w:rPr>
+                <w:rFonts w:ascii="Arial" w:cs="Arial" w:eastAsia="Arial" w:hAnsi="Arial"/>
+                <w:b/>
+                <w:bCs/>
+                <w:color w:val="15803D"/>
+                <w:sz w:val="19"/>
+                <w:szCs w:val="19"/>
+                <w:rtl/>
+              </w:rPr>
+              <w:t xml:space="preserve">منشور على الإنتاج</w:t>
             </w:r>
           </w:p>
         </w:tc>
@@ -2548,38 +2548,38 @@
                 <w:szCs w:val="19"/>
                 <w:rtl/>
               </w:rPr>
-              <w:t xml:space="preserve">—</w:t>
+              <w:t xml:space="preserve">5cf29e1</w:t>
             </w:r>
           </w:p>
         </w:tc>
         <w:tc>
           <w:tcPr>
             <w:tcW w:type="dxa" w:w="1500"/>
-            <w:shd w:fill="FFFBEB" w:color="auto" w:val="clear"/>
-            <w:tcMar>
-              <w:top w:type="dxa" w:w="90"/>
-              <w:left w:type="dxa" w:w="110"/>
-              <w:bottom w:type="dxa" w:w="90"/>
-              <w:right w:type="dxa" w:w="110"/>
-            </w:tcMar>
-          </w:tcPr>
-          <w:p>
-            <w:pPr>
-              <w:bidi/>
-              <w:spacing w:after="0" w:line="280"/>
-              <w:jc w:val="right"/>
-            </w:pPr>
-            <w:r>
-              <w:rPr>
-                <w:rFonts w:ascii="Arial" w:cs="Arial" w:eastAsia="Arial" w:hAnsi="Arial"/>
-                <w:b/>
-                <w:bCs/>
-                <w:color w:val="B45309"/>
-                <w:sz w:val="19"/>
-                <w:szCs w:val="19"/>
-                <w:rtl/>
-              </w:rPr>
-              <w:t xml:space="preserve">مرفوع — غير منشور</w:t>
+            <w:shd w:fill="ECFDF5" w:color="auto" w:val="clear"/>
+            <w:tcMar>
+              <w:top w:type="dxa" w:w="90"/>
+              <w:left w:type="dxa" w:w="110"/>
+              <w:bottom w:type="dxa" w:w="90"/>
+              <w:right w:type="dxa" w:w="110"/>
+            </w:tcMar>
+          </w:tcPr>
+          <w:p>
+            <w:pPr>
+              <w:bidi/>
+              <w:spacing w:after="0" w:line="280"/>
+              <w:jc w:val="right"/>
+            </w:pPr>
+            <w:r>
+              <w:rPr>
+                <w:rFonts w:ascii="Arial" w:cs="Arial" w:eastAsia="Arial" w:hAnsi="Arial"/>
+                <w:b/>
+                <w:bCs/>
+                <w:color w:val="15803D"/>
+                <w:sz w:val="19"/>
+                <w:szCs w:val="19"/>
+                <w:rtl/>
+              </w:rPr>
+              <w:t xml:space="preserve">منشور على الإنتاج</w:t>
             </w:r>
           </w:p>
         </w:tc>
@@ -3184,31 +3184,31 @@
         <w:tc>
           <w:tcPr>
             <w:tcW w:type="dxa" w:w="1500"/>
-            <w:shd w:fill="FFFBEB" w:color="auto" w:val="clear"/>
-            <w:tcMar>
-              <w:top w:type="dxa" w:w="90"/>
-              <w:left w:type="dxa" w:w="110"/>
-              <w:bottom w:type="dxa" w:w="90"/>
-              <w:right w:type="dxa" w:w="110"/>
-            </w:tcMar>
-          </w:tcPr>
-          <w:p>
-            <w:pPr>
-              <w:bidi/>
-              <w:spacing w:after="0" w:line="280"/>
-              <w:jc w:val="right"/>
-            </w:pPr>
-            <w:r>
-              <w:rPr>
-                <w:rFonts w:ascii="Arial" w:cs="Arial" w:eastAsia="Arial" w:hAnsi="Arial"/>
-                <w:b/>
-                <w:bCs/>
-                <w:color w:val="B45309"/>
-                <w:sz w:val="19"/>
-                <w:szCs w:val="19"/>
-                <w:rtl/>
-              </w:rPr>
-              <w:t xml:space="preserve">مرفوع — غير منشور</w:t>
+            <w:shd w:fill="ECFDF5" w:color="auto" w:val="clear"/>
+            <w:tcMar>
+              <w:top w:type="dxa" w:w="90"/>
+              <w:left w:type="dxa" w:w="110"/>
+              <w:bottom w:type="dxa" w:w="90"/>
+              <w:right w:type="dxa" w:w="110"/>
+            </w:tcMar>
+          </w:tcPr>
+          <w:p>
+            <w:pPr>
+              <w:bidi/>
+              <w:spacing w:after="0" w:line="280"/>
+              <w:jc w:val="right"/>
+            </w:pPr>
+            <w:r>
+              <w:rPr>
+                <w:rFonts w:ascii="Arial" w:cs="Arial" w:eastAsia="Arial" w:hAnsi="Arial"/>
+                <w:b/>
+                <w:bCs/>
+                <w:color w:val="15803D"/>
+                <w:sz w:val="19"/>
+                <w:szCs w:val="19"/>
+                <w:rtl/>
+              </w:rPr>
+              <w:t xml:space="preserve">منشور على الإنتاج</w:t>
             </w:r>
           </w:p>
         </w:tc>

</xml_diff>

<commit_message>
redesign the session rail as a hover-revealed ruler
The block segments read as a broken progress bar rather than a navigation
instrument. It is now a hairline spine with thin ticks, and each tick sits
at the session's real fraction of the scroll height (measured from its
first message), so the rail maps the thread instead of merely listing it.
Measurements refresh on thread change and via ResizeObserver.

The ruler stays faint and resolves on approach, keeping a permanent trace
rather than hiding entirely — an affordance nobody can see is one nobody
uses. It also became an overlay, returning width to the messages, and sits
clear of the scrollbar.

Tick length no longer conveys session size; that moved to the tooltip.

Co-Authored-By: Claude Opus 5 <noreply@anthropic.com>
Claude-Session: https://claude.ai/code/session_01JGHUnSrtQwLX2BGbB3j6wk
</commit_message>
<xml_diff>
--- a/docs/سجل التعديلات الاخيرة.docx
+++ b/docs/سجل التعديلات الاخيرة.docx
@@ -354,7 +354,7 @@
                 <w:szCs w:val="19"/>
                 <w:rtl/>
               </w:rPr>
-              <w:t xml:space="preserve">5</w:t>
+              <w:t xml:space="preserve">6</w:t>
             </w:r>
           </w:p>
         </w:tc>
@@ -414,7 +414,7 @@
                 <w:szCs w:val="19"/>
                 <w:rtl/>
               </w:rPr>
-              <w:t xml:space="preserve">شريط فهرسة دورات المحادثة داخل الثريد</w:t>
+              <w:t xml:space="preserve">إعادة تصميم شريط الفهرسة على هيئة مسطرة تظهر عند الاقتراب</w:t>
             </w:r>
           </w:p>
         </w:tc>
@@ -451,31 +451,31 @@
         <w:tc>
           <w:tcPr>
             <w:tcW w:type="dxa" w:w="1800"/>
-            <w:shd w:fill="ECFDF5" w:color="auto" w:val="clear"/>
-            <w:tcMar>
-              <w:top w:type="dxa" w:w="90"/>
-              <w:left w:type="dxa" w:w="110"/>
-              <w:bottom w:type="dxa" w:w="90"/>
-              <w:right w:type="dxa" w:w="110"/>
-            </w:tcMar>
-          </w:tcPr>
-          <w:p>
-            <w:pPr>
-              <w:bidi/>
-              <w:spacing w:after="0" w:line="280"/>
-              <w:jc w:val="right"/>
-            </w:pPr>
-            <w:r>
-              <w:rPr>
-                <w:rFonts w:ascii="Arial" w:cs="Arial" w:eastAsia="Arial" w:hAnsi="Arial"/>
-                <w:b/>
-                <w:bCs/>
-                <w:color w:val="15803D"/>
-                <w:sz w:val="19"/>
-                <w:szCs w:val="19"/>
-                <w:rtl/>
-              </w:rPr>
-              <w:t xml:space="preserve">منشور على الإنتاج</w:t>
+            <w:shd w:fill="FFFBEB" w:color="auto" w:val="clear"/>
+            <w:tcMar>
+              <w:top w:type="dxa" w:w="90"/>
+              <w:left w:type="dxa" w:w="110"/>
+              <w:bottom w:type="dxa" w:w="90"/>
+              <w:right w:type="dxa" w:w="110"/>
+            </w:tcMar>
+          </w:tcPr>
+          <w:p>
+            <w:pPr>
+              <w:bidi/>
+              <w:spacing w:after="0" w:line="280"/>
+              <w:jc w:val="right"/>
+            </w:pPr>
+            <w:r>
+              <w:rPr>
+                <w:rFonts w:ascii="Arial" w:cs="Arial" w:eastAsia="Arial" w:hAnsi="Arial"/>
+                <w:b/>
+                <w:bCs/>
+                <w:color w:val="B45309"/>
+                <w:sz w:val="19"/>
+                <w:szCs w:val="19"/>
+                <w:rtl/>
+              </w:rPr>
+              <w:t xml:space="preserve">مرفوع — غير منشور</w:t>
             </w:r>
           </w:p>
         </w:tc>
@@ -508,7 +508,7 @@
                 <w:szCs w:val="19"/>
                 <w:rtl/>
               </w:rPr>
-              <w:t xml:space="preserve">4</w:t>
+              <w:t xml:space="preserve">5</w:t>
             </w:r>
           </w:p>
         </w:tc>
@@ -570,7 +570,7 @@
                 <w:szCs w:val="19"/>
                 <w:rtl/>
               </w:rPr>
-              <w:t xml:space="preserve">تسجيل دورات المحادثة واشتقاقها — أساس شريط فهرسة الثريد</w:t>
+              <w:t xml:space="preserve">شريط فهرسة دورات المحادثة داخل الثريد</w:t>
             </w:r>
           </w:p>
         </w:tc>
@@ -601,7 +601,7 @@
                 <w:szCs w:val="19"/>
                 <w:rtl/>
               </w:rPr>
-              <w:t xml:space="preserve">صندوق الوارد (طبقة البيانات)</w:t>
+              <w:t xml:space="preserve">صندوق الوارد</w:t>
             </w:r>
           </w:p>
         </w:tc>
@@ -664,7 +664,7 @@
                 <w:szCs w:val="19"/>
                 <w:rtl/>
               </w:rPr>
-              <w:t xml:space="preserve">3</w:t>
+              <w:t xml:space="preserve">4</w:t>
             </w:r>
           </w:p>
         </w:tc>
@@ -724,7 +724,7 @@
                 <w:szCs w:val="19"/>
                 <w:rtl/>
               </w:rPr>
-              <w:t xml:space="preserve">إزالة كارت نسبة الاستجابة من صفحة تقييمات العملاء</w:t>
+              <w:t xml:space="preserve">تسجيل دورات المحادثة واشتقاقها — أساس شريط فهرسة الثريد</w:t>
             </w:r>
           </w:p>
         </w:tc>
@@ -754,7 +754,7 @@
                 <w:szCs w:val="19"/>
                 <w:rtl/>
               </w:rPr>
-              <w:t xml:space="preserve">تقييمات العملاء</w:t>
+              <w:t xml:space="preserve">صندوق الوارد (طبقة البيانات)</w:t>
             </w:r>
           </w:p>
         </w:tc>
@@ -818,7 +818,7 @@
                 <w:szCs w:val="19"/>
                 <w:rtl/>
               </w:rPr>
-              <w:t xml:space="preserve">2</w:t>
+              <w:t xml:space="preserve">3</w:t>
             </w:r>
           </w:p>
         </w:tc>
@@ -849,7 +849,7 @@
                 <w:szCs w:val="19"/>
                 <w:rtl/>
               </w:rPr>
-              <w:t xml:space="preserve">9 سبتمبر 2026</w:t>
+              <w:t xml:space="preserve">10 سبتمبر 2026</w:t>
             </w:r>
           </w:p>
         </w:tc>
@@ -880,7 +880,7 @@
                 <w:szCs w:val="19"/>
                 <w:rtl/>
               </w:rPr>
-              <w:t xml:space="preserve">تغيير تسمية زر الترقية في صفحة الفوترة</w:t>
+              <w:t xml:space="preserve">إزالة كارت نسبة الاستجابة من صفحة تقييمات العملاء</w:t>
             </w:r>
           </w:p>
         </w:tc>
@@ -911,7 +911,7 @@
                 <w:szCs w:val="19"/>
                 <w:rtl/>
               </w:rPr>
-              <w:t xml:space="preserve">الفوترة</w:t>
+              <w:t xml:space="preserve">تقييمات العملاء</w:t>
             </w:r>
           </w:p>
         </w:tc>
@@ -974,7 +974,7 @@
                 <w:szCs w:val="19"/>
                 <w:rtl/>
               </w:rPr>
-              <w:t xml:space="preserve">1</w:t>
+              <w:t xml:space="preserve">2</w:t>
             </w:r>
           </w:p>
         </w:tc>
@@ -1034,6 +1034,162 @@
                 <w:szCs w:val="19"/>
                 <w:rtl/>
               </w:rPr>
+              <w:t xml:space="preserve">تغيير تسمية زر الترقية في صفحة الفوترة</w:t>
+            </w:r>
+          </w:p>
+        </w:tc>
+        <w:tc>
+          <w:tcPr>
+            <w:tcW w:type="dxa" w:w="1500"/>
+            <w:tcMar>
+              <w:top w:type="dxa" w:w="90"/>
+              <w:left w:type="dxa" w:w="110"/>
+              <w:bottom w:type="dxa" w:w="90"/>
+              <w:right w:type="dxa" w:w="110"/>
+            </w:tcMar>
+          </w:tcPr>
+          <w:p>
+            <w:pPr>
+              <w:bidi/>
+              <w:spacing w:after="0" w:line="280"/>
+              <w:jc w:val="right"/>
+            </w:pPr>
+            <w:r>
+              <w:rPr>
+                <w:rFonts w:ascii="Arial" w:cs="Arial" w:eastAsia="Arial" w:hAnsi="Arial"/>
+                <w:b w:val="false"/>
+                <w:bCs w:val="false"/>
+                <w:color w:val="1E293B"/>
+                <w:sz w:val="19"/>
+                <w:szCs w:val="19"/>
+                <w:rtl/>
+              </w:rPr>
+              <w:t xml:space="preserve">الفوترة</w:t>
+            </w:r>
+          </w:p>
+        </w:tc>
+        <w:tc>
+          <w:tcPr>
+            <w:tcW w:type="dxa" w:w="1800"/>
+            <w:shd w:fill="ECFDF5" w:color="auto" w:val="clear"/>
+            <w:tcMar>
+              <w:top w:type="dxa" w:w="90"/>
+              <w:left w:type="dxa" w:w="110"/>
+              <w:bottom w:type="dxa" w:w="90"/>
+              <w:right w:type="dxa" w:w="110"/>
+            </w:tcMar>
+          </w:tcPr>
+          <w:p>
+            <w:pPr>
+              <w:bidi/>
+              <w:spacing w:after="0" w:line="280"/>
+              <w:jc w:val="right"/>
+            </w:pPr>
+            <w:r>
+              <w:rPr>
+                <w:rFonts w:ascii="Arial" w:cs="Arial" w:eastAsia="Arial" w:hAnsi="Arial"/>
+                <w:b/>
+                <w:bCs/>
+                <w:color w:val="15803D"/>
+                <w:sz w:val="19"/>
+                <w:szCs w:val="19"/>
+                <w:rtl/>
+              </w:rPr>
+              <w:t xml:space="preserve">منشور على الإنتاج</w:t>
+            </w:r>
+          </w:p>
+        </w:tc>
+      </w:tr>
+      <w:tr>
+        <w:tc>
+          <w:tcPr>
+            <w:tcW w:type="dxa" w:w="600"/>
+            <w:shd w:fill="F1F5F9" w:color="auto" w:val="clear"/>
+            <w:tcMar>
+              <w:top w:type="dxa" w:w="90"/>
+              <w:left w:type="dxa" w:w="110"/>
+              <w:bottom w:type="dxa" w:w="90"/>
+              <w:right w:type="dxa" w:w="110"/>
+            </w:tcMar>
+          </w:tcPr>
+          <w:p>
+            <w:pPr>
+              <w:bidi/>
+              <w:spacing w:after="0" w:line="280"/>
+              <w:jc w:val="right"/>
+            </w:pPr>
+            <w:r>
+              <w:rPr>
+                <w:rFonts w:ascii="Arial" w:cs="Arial" w:eastAsia="Arial" w:hAnsi="Arial"/>
+                <w:b/>
+                <w:bCs/>
+                <w:color w:val="2563EB"/>
+                <w:sz w:val="19"/>
+                <w:szCs w:val="19"/>
+                <w:rtl/>
+              </w:rPr>
+              <w:t xml:space="preserve">1</w:t>
+            </w:r>
+          </w:p>
+        </w:tc>
+        <w:tc>
+          <w:tcPr>
+            <w:tcW w:type="dxa" w:w="1500"/>
+            <w:shd w:fill="F1F5F9" w:color="auto" w:val="clear"/>
+            <w:tcMar>
+              <w:top w:type="dxa" w:w="90"/>
+              <w:left w:type="dxa" w:w="110"/>
+              <w:bottom w:type="dxa" w:w="90"/>
+              <w:right w:type="dxa" w:w="110"/>
+            </w:tcMar>
+          </w:tcPr>
+          <w:p>
+            <w:pPr>
+              <w:bidi/>
+              <w:spacing w:after="0" w:line="280"/>
+              <w:jc w:val="right"/>
+            </w:pPr>
+            <w:r>
+              <w:rPr>
+                <w:rFonts w:ascii="Arial" w:cs="Arial" w:eastAsia="Arial" w:hAnsi="Arial"/>
+                <w:b w:val="false"/>
+                <w:bCs w:val="false"/>
+                <w:color w:val="1E293B"/>
+                <w:sz w:val="19"/>
+                <w:szCs w:val="19"/>
+                <w:rtl/>
+              </w:rPr>
+              <w:t xml:space="preserve">9 سبتمبر 2026</w:t>
+            </w:r>
+          </w:p>
+        </w:tc>
+        <w:tc>
+          <w:tcPr>
+            <w:tcW w:type="dxa" w:w="3600"/>
+            <w:shd w:fill="F1F5F9" w:color="auto" w:val="clear"/>
+            <w:tcMar>
+              <w:top w:type="dxa" w:w="90"/>
+              <w:left w:type="dxa" w:w="110"/>
+              <w:bottom w:type="dxa" w:w="90"/>
+              <w:right w:type="dxa" w:w="110"/>
+            </w:tcMar>
+          </w:tcPr>
+          <w:p>
+            <w:pPr>
+              <w:bidi/>
+              <w:spacing w:after="0" w:line="280"/>
+              <w:jc w:val="right"/>
+            </w:pPr>
+            <w:r>
+              <w:rPr>
+                <w:rFonts w:ascii="Arial" w:cs="Arial" w:eastAsia="Arial" w:hAnsi="Arial"/>
+                <w:b w:val="false"/>
+                <w:bCs w:val="false"/>
+                <w:color w:val="1E293B"/>
+                <w:sz w:val="19"/>
+                <w:szCs w:val="19"/>
+                <w:rtl/>
+              </w:rPr>
               <w:t xml:space="preserve">ميزة تغيير الباقة — US-131</w:t>
             </w:r>
           </w:p>
@@ -1041,6 +1197,7 @@
         <w:tc>
           <w:tcPr>
             <w:tcW w:type="dxa" w:w="1500"/>
+            <w:shd w:fill="F1F5F9" w:color="auto" w:val="clear"/>
             <w:tcMar>
               <w:top w:type="dxa" w:w="90"/>
               <w:left w:type="dxa" w:w="110"/>
@@ -1484,7 +1641,7 @@
                 <w:szCs w:val="20"/>
                 <w:rtl/>
               </w:rPr>
-              <w:t xml:space="preserve">كل التعديلات المرفوعة منشورة على الإنتاج.</w:t>
+              <w:t xml:space="preserve">يوجد 1 تعديل مرفوع على الفرع ولم يُنشر بعد — مبيّن في الجدول أعلاه.</w:t>
             </w:r>
           </w:p>
           <w:p>
@@ -1552,7 +1709,7 @@
           <w:szCs w:val="24"/>
           <w:rtl/>
         </w:rPr>
-        <w:t xml:space="preserve">تعديل رقم 5 — شريط فهرسة دورات المحادثة داخل الثريد</w:t>
+        <w:t xml:space="preserve">تعديل رقم 6 — إعادة تصميم شريط الفهرسة على هيئة مسطرة تظهر عند الاقتراب</w:t>
       </w:r>
     </w:p>
     <w:p>
@@ -1889,7 +2046,7 @@
                 <w:szCs w:val="19"/>
                 <w:rtl/>
               </w:rPr>
-              <w:t xml:space="preserve">src/components/inbox/SessionRail.tsx · src/pages/Inbox.tsx · src/store/mockData.ts</w:t>
+              <w:t xml:space="preserve">src/components/inbox/SessionRail.tsx · src/pages/Inbox.tsx</w:t>
             </w:r>
           </w:p>
         </w:tc>
@@ -1919,38 +2076,38 @@
                 <w:szCs w:val="19"/>
                 <w:rtl/>
               </w:rPr>
-              <w:t xml:space="preserve">e05e715</w:t>
+              <w:t xml:space="preserve">—</w:t>
             </w:r>
           </w:p>
         </w:tc>
         <w:tc>
           <w:tcPr>
             <w:tcW w:type="dxa" w:w="1500"/>
-            <w:shd w:fill="ECFDF5" w:color="auto" w:val="clear"/>
-            <w:tcMar>
-              <w:top w:type="dxa" w:w="90"/>
-              <w:left w:type="dxa" w:w="110"/>
-              <w:bottom w:type="dxa" w:w="90"/>
-              <w:right w:type="dxa" w:w="110"/>
-            </w:tcMar>
-          </w:tcPr>
-          <w:p>
-            <w:pPr>
-              <w:bidi/>
-              <w:spacing w:after="0" w:line="280"/>
-              <w:jc w:val="right"/>
-            </w:pPr>
-            <w:r>
-              <w:rPr>
-                <w:rFonts w:ascii="Arial" w:cs="Arial" w:eastAsia="Arial" w:hAnsi="Arial"/>
-                <w:b/>
-                <w:bCs/>
-                <w:color w:val="15803D"/>
-                <w:sz w:val="19"/>
-                <w:szCs w:val="19"/>
-                <w:rtl/>
-              </w:rPr>
-              <w:t xml:space="preserve">منشور على الإنتاج</w:t>
+            <w:shd w:fill="FFFBEB" w:color="auto" w:val="clear"/>
+            <w:tcMar>
+              <w:top w:type="dxa" w:w="90"/>
+              <w:left w:type="dxa" w:w="110"/>
+              <w:bottom w:type="dxa" w:w="90"/>
+              <w:right w:type="dxa" w:w="110"/>
+            </w:tcMar>
+          </w:tcPr>
+          <w:p>
+            <w:pPr>
+              <w:bidi/>
+              <w:spacing w:after="0" w:line="280"/>
+              <w:jc w:val="right"/>
+            </w:pPr>
+            <w:r>
+              <w:rPr>
+                <w:rFonts w:ascii="Arial" w:cs="Arial" w:eastAsia="Arial" w:hAnsi="Arial"/>
+                <w:b/>
+                <w:bCs/>
+                <w:color w:val="B45309"/>
+                <w:sz w:val="19"/>
+                <w:szCs w:val="19"/>
+                <w:rtl/>
+              </w:rPr>
+              <w:t xml:space="preserve">مرفوع — غير منشور</w:t>
             </w:r>
           </w:p>
         </w:tc>
@@ -1980,7 +2137,7 @@
           <w:szCs w:val="21"/>
           <w:rtl/>
         </w:rPr>
-        <w:t xml:space="preserve">شريط رأسي على حافة الثريد يقسّمه إلى دورات فتح وإغلاق، ليصل الموظف إلى بداية أي دورة في المحادثات الطويلة التي تُعاد فتحها مراراً.</w:t>
+        <w:t xml:space="preserve">الشكل السابق كان كتلاً سميكة بينها فجوات، فكان يُقرأ كشريط تقدّم مكسور لا كأداة تنقّل. صار الآن مسطرة: خطّ شعري على حافة الثريد وعليه علامات رفيعة عند بدايات الدورات.</w:t>
       </w:r>
     </w:p>
     <w:p>
@@ -2002,7 +2159,7 @@
           <w:szCs w:val="21"/>
           <w:rtl/>
         </w:rPr>
-        <w:t xml:space="preserve">ارتفاع كل مقطع يتناسب مع عدد رسائله، فيعطي إحساساً بحجم كل دورة قبل الدخول إليها.</w:t>
+        <w:t xml:space="preserve">العلامة صارت تقع في موضعها النسبي الحقيقي من ارتفاع التمرير — تُقاس من موضع أول رسالة في الدورة داخل الثريد — فصار الشريط خريطة فعلية للمحادثة لا مجرد قائمة مرتّبة.</w:t>
       </w:r>
     </w:p>
     <w:p>
@@ -2024,7 +2181,7 @@
           <w:szCs w:val="21"/>
           <w:rtl/>
         </w:rPr>
-        <w:t xml:space="preserve">المرور على المقطع يُظهر اليوم والتاريخ وعدد الرسائل — «اليوم» و«أمس» لما قرُب، واسم اليوم لما بعُد.</w:t>
+        <w:t xml:space="preserve">القياس يُعاد عند تغيير المحادثة أو وصول رسالة، ويُراقَب تغيّر حجم اللوحة بـ ResizeObserver حتى لا تصير المواضع قديمة عند طيّ لوحة التفاصيل أو تغيير حجم النافذة.</w:t>
       </w:r>
     </w:p>
     <w:p>
@@ -2046,7 +2203,7 @@
           <w:szCs w:val="21"/>
           <w:rtl/>
         </w:rPr>
-        <w:t xml:space="preserve">الضغط ينقل إلى أول رسالة في الدورة، والمقطع الذي يقابل موضع القراءة الحالي يُبرَز تلقائياً أثناء التمرير.</w:t>
+        <w:t xml:space="preserve">المسطرة باهتة في الوضع العادي وتتوضّح بالكامل عند اقتراب المؤشر من الحافة أو عند وصول لوحة المفاتيح إليها.</w:t>
       </w:r>
     </w:p>
     <w:p>
@@ -2068,7 +2225,7 @@
           <w:szCs w:val="21"/>
           <w:rtl/>
         </w:rPr>
-        <w:t xml:space="preserve">المقاطع ذات البداية المستنتجة تُعرض بحدّ متقطّع ويذكر التلميح «بداية تقديرية»، فيبقى الفرق بين المؤكَّد والمقدَّر ظاهراً للموظف لا مخفياً عنه.</w:t>
+        <w:t xml:space="preserve">أُبقي أثر خافت دائم بدل الإخفاء التام: ميزة لا يدل عليها شيء لا يعرفها أحد، والإخفاء الكامل كان سيجعلها غير قابلة للاكتشاف.</w:t>
       </w:r>
     </w:p>
     <w:p>
@@ -2090,7 +2247,7 @@
           <w:szCs w:val="21"/>
           <w:rtl/>
         </w:rPr>
-        <w:t xml:space="preserve">الشريط يختفي كلياً حين تكون المحادثة دورة واحدة، فلا معنى لفهرس لا يفهرس شيئاً.</w:t>
+        <w:t xml:space="preserve">صارت طبقة عائمة (overlay) بدل عمود يحجز عرضاً ثابتاً، فرجع نحو 36 بكسل لمساحة الرسائل.</w:t>
       </w:r>
     </w:p>
     <w:p>
@@ -2112,7 +2269,7 @@
           <w:szCs w:val="21"/>
           <w:rtl/>
         </w:rPr>
-        <w:t xml:space="preserve">الدورات الخالية من الرسائل مستبعدة من الشريط بقرار مقصود — لا شيء يمكن الانتقال إليه فيها.</w:t>
+        <w:t xml:space="preserve">وُضعت بعد شريط التمرير بمقدار 8 بكسل حتى لا تحجب سحبه.</w:t>
       </w:r>
     </w:p>
     <w:p>
@@ -2134,7 +2291,7 @@
           <w:szCs w:val="21"/>
           <w:rtl/>
         </w:rPr>
-        <w:t xml:space="preserve">وُزّعت رسائل محادثة أحمد الشعيلي التجريبية على ثلاث دورات عبر ثلاثة أشهر لتصير الميزة قابلة للمعاينة، وصار sessionCount فيها مطابقاً للواقع بعد أن كان رقماً مكتوباً بلا سند. آخر دورة مسجّلة بحدث حقيقي وما قبلها مستنتج، ليظهر الشكلان معاً.</w:t>
+        <w:t xml:space="preserve">التمييز بين المؤكَّد والمقدَّر بقي قائماً بصرياً: علامة متصلة للدورة المسجّلة، ومتقطّعة للمستنتَجة، مع بقاء «بداية تقديرية» في التلميح.</w:t>
       </w:r>
     </w:p>
     <w:p>
@@ -2156,7 +2313,29 @@
           <w:szCs w:val="21"/>
           <w:rtl/>
         </w:rPr>
-        <w:t xml:space="preserve">عوينت النتيجة في المتصفح: الشريط والتلميح والانتقال والإبراز تعمل في الوضعين الفاتح والليلي، والمحادثات أحادية الدورة سليمة بلا شريط.</w:t>
+        <w:t xml:space="preserve">تنازل مقصود: الشكل السابق كان يعبّر عن حجم كل دورة بارتفاعها، والمسطرة لا تفعل. حجم الدورة انتقل إلى التلميح، لأن المطلوب الأساسي هو موضع بداية الدورة لا حجمها.</w:t>
+      </w:r>
+    </w:p>
+    <w:p>
+      <w:pPr>
+        <w:pStyle w:val="ListParagraph"/>
+        <w:numPr>
+          <w:ilvl w:val="0"/>
+          <w:numId w:val="2"/>
+        </w:numPr>
+        <w:bidi/>
+        <w:spacing w:after="70" w:line="290"/>
+        <w:jc w:val="right"/>
+      </w:pPr>
+      <w:r>
+        <w:rPr>
+          <w:rFonts w:ascii="Arial" w:cs="Arial" w:eastAsia="Arial" w:hAnsi="Arial"/>
+          <w:color w:val="1E293B"/>
+          <w:sz w:val="21"/>
+          <w:szCs w:val="21"/>
+          <w:rtl/>
+        </w:rPr>
+        <w:t xml:space="preserve">عوينت النتيجة في المتصفح: العلامات الثلاث ظهرت في مواضع غير متساوية تطابق مواضع التمرير الفعلية، والتوضّح بالاقتراب والتلميح والانتقال تعمل.</w:t>
       </w:r>
     </w:p>
     <w:p>
@@ -2181,7 +2360,7 @@
           <w:szCs w:val="24"/>
           <w:rtl/>
         </w:rPr>
-        <w:t xml:space="preserve">تعديل رقم 4 — تسجيل دورات المحادثة واشتقاقها — أساس شريط فهرسة الثريد</w:t>
+        <w:t xml:space="preserve">تعديل رقم 5 — شريط فهرسة دورات المحادثة داخل الثريد</w:t>
       </w:r>
     </w:p>
     <w:p>
@@ -2458,7 +2637,7 @@
                 <w:szCs w:val="19"/>
                 <w:rtl/>
               </w:rPr>
-              <w:t xml:space="preserve">صندوق الوارد (طبقة البيانات)</w:t>
+              <w:t xml:space="preserve">صندوق الوارد</w:t>
             </w:r>
           </w:p>
         </w:tc>
@@ -2518,7 +2697,7 @@
                 <w:szCs w:val="19"/>
                 <w:rtl/>
               </w:rPr>
-              <w:t xml:space="preserve">src/utils/sessions.ts · src/store/useDataStore.ts · src/types/index.ts</w:t>
+              <w:t xml:space="preserve">src/components/inbox/SessionRail.tsx · src/pages/Inbox.tsx · src/store/mockData.ts</w:t>
             </w:r>
           </w:p>
         </w:tc>
@@ -2548,7 +2727,7 @@
                 <w:szCs w:val="19"/>
                 <w:rtl/>
               </w:rPr>
-              <w:t xml:space="preserve">5cf29e1</w:t>
+              <w:t xml:space="preserve">e05e715</w:t>
             </w:r>
           </w:p>
         </w:tc>
@@ -2609,7 +2788,7 @@
           <w:szCs w:val="21"/>
           <w:rtl/>
         </w:rPr>
-        <w:t xml:space="preserve">المشكلة: المحادثة الواحدة تُعاد فتحها كلما راسل العميل بعد الإغلاق، فيصير الثريد بلا نهاية. ولرسم شريط فهرسة يقسّمه إلى دورات، لزم معرفة توقيت كل فتح وإغلاق — وهي بيانات لم تكن تُسجَّل إطلاقاً.</w:t>
+        <w:t xml:space="preserve">شريط رأسي على حافة الثريد يقسّمه إلى دورات فتح وإغلاق، ليصل الموظف إلى بداية أي دورة في المحادثات الطويلة التي تُعاد فتحها مراراً.</w:t>
       </w:r>
     </w:p>
     <w:p>
@@ -2631,7 +2810,7 @@
           <w:szCs w:val="21"/>
           <w:rtl/>
         </w:rPr>
-        <w:t xml:space="preserve">كان الحقل sessionCount يُكتب مرة واحدة عند الإنشاء ولا يزيده أي سطر في المشروع، وقيمه في البيانات التجريبية مكتوبة يدوياً. كذلك activityLog على المحادثة كان مُعرَّفاً في الأنواع لكن لا دالة تكتب فيه وقت التشغيل.</w:t>
+        <w:t xml:space="preserve">ارتفاع كل مقطع يتناسب مع عدد رسائله، فيعطي إحساساً بحجم كل دورة قبل الدخول إليها.</w:t>
       </w:r>
     </w:p>
     <w:p>
@@ -2653,7 +2832,7 @@
           <w:szCs w:val="21"/>
           <w:rtl/>
         </w:rPr>
-        <w:t xml:space="preserve">أُضيف النوع SessionEvent لتسجيل حدث فتح أو إغلاق بتوقيته وصاحبه، والنوع ConversationSession يمثّل الدورة المشتقّة.</w:t>
+        <w:t xml:space="preserve">المرور على المقطع يُظهر اليوم والتاريخ وعدد الرسائل — «اليوم» و«أمس» لما قرُب، واسم اليوم لما بعُد.</w:t>
       </w:r>
     </w:p>
     <w:p>
@@ -2675,7 +2854,7 @@
           <w:szCs w:val="21"/>
           <w:rtl/>
         </w:rPr>
-        <w:t xml:space="preserve">صارت أربعة مواضع تسجّل الحدث فعلياً: setConversationStatus عند الإغلاق أو إعادة الفتح، reopenConversation، ورسالة العميل الواردة نصية أو صوتية حين تُحيي محادثة مغلقة — وهذا آخرها كان يمرّ بلا أي أثر رغم أنه أكثرها تكراراً.</w:t>
+        <w:t xml:space="preserve">الضغط ينقل إلى أول رسالة في الدورة، والمقطع الذي يقابل موضع القراءة الحالي يُبرَز تلقائياً أثناء التمرير.</w:t>
       </w:r>
     </w:p>
     <w:p>
@@ -2697,7 +2876,7 @@
           <w:szCs w:val="21"/>
           <w:rtl/>
         </w:rPr>
-        <w:t xml:space="preserve">أُضيفت الدالة deriveSessions التي تقسّم الثريد إلى دورات: الأحداث المسجّلة مرجع قاطع، وما سبقها من تاريخ قديم تُستنتج حدوده من فجوات الصمت (24 ساعة افتراضاً) وتُعلَّم inferred حتى يظل الفرق بين المؤكَّد والمقدَّر ظاهراً.</w:t>
+        <w:t xml:space="preserve">المقاطع ذات البداية المستنتجة تُعرض بحدّ متقطّع ويذكر التلميح «بداية تقديرية»، فيبقى الفرق بين المؤكَّد والمقدَّر ظاهراً للموظف لا مخفياً عنه.</w:t>
       </w:r>
     </w:p>
     <w:p>
@@ -2719,7 +2898,7 @@
           <w:szCs w:val="21"/>
           <w:rtl/>
         </w:rPr>
-        <w:t xml:space="preserve">الدالة تتعامل مع الحالة المختلطة: ثريد فيه تاريخ قديم مُستنتج ودورات جديدة مسجّلة في آن واحد.</w:t>
+        <w:t xml:space="preserve">الشريط يختفي كلياً حين تكون المحادثة دورة واحدة، فلا معنى لفهرس لا يفهرس شيئاً.</w:t>
       </w:r>
     </w:p>
     <w:p>
@@ -2741,7 +2920,7 @@
           <w:szCs w:val="21"/>
           <w:rtl/>
         </w:rPr>
-        <w:t xml:space="preserve">اختُبر المنطق على ثماني حالات شملت الثريد الفارغ والرسالة الواحدة والفجوات المتعددة والأحداث المسجّلة والحالة المختلطة والمدخلات غير المرتّبة زمنياً — جميعها نجحت.</w:t>
+        <w:t xml:space="preserve">الدورات الخالية من الرسائل مستبعدة من الشريط بقرار مقصود — لا شيء يمكن الانتقال إليه فيها.</w:t>
       </w:r>
     </w:p>
     <w:p>
@@ -2763,7 +2942,7 @@
           <w:szCs w:val="21"/>
           <w:rtl/>
         </w:rPr>
-        <w:t xml:space="preserve">ملاحظة على البيانات الحالية: كل المحادثات التجريبية تُنتج دورة واحدة لأن رسائلها متقاربة بدقائق ولا فجوات فيها. الشريط لن يُظهر تقسيماً حقيقياً قبل توفّر بيانات متباعدة زمنياً.</w:t>
+        <w:t xml:space="preserve">وُزّعت رسائل محادثة أحمد الشعيلي التجريبية على ثلاث دورات عبر ثلاثة أشهر لتصير الميزة قابلة للمعاينة، وصار sessionCount فيها مطابقاً للواقع بعد أن كان رقماً مكتوباً بلا سند. آخر دورة مسجّلة بحدث حقيقي وما قبلها مستنتج، ليظهر الشكلان معاً.</w:t>
       </w:r>
     </w:p>
     <w:p>
@@ -2785,7 +2964,7 @@
           <w:szCs w:val="21"/>
           <w:rtl/>
         </w:rPr>
-        <w:t xml:space="preserve">لم تُبنَ واجهة الشريط بعد — هذا التعديل يغطّي طبقة البيانات وحدها.</w:t>
+        <w:t xml:space="preserve">عوينت النتيجة في المتصفح: الشريط والتلميح والانتقال والإبراز تعمل في الوضعين الفاتح والليلي، والمحادثات أحادية الدورة سليمة بلا شريط.</w:t>
       </w:r>
     </w:p>
     <w:p>
@@ -2810,7 +2989,7 @@
           <w:szCs w:val="24"/>
           <w:rtl/>
         </w:rPr>
-        <w:t xml:space="preserve">تعديل رقم 3 — إزالة كارت نسبة الاستجابة من صفحة تقييمات العملاء</w:t>
+        <w:t xml:space="preserve">تعديل رقم 4 — تسجيل دورات المحادثة واشتقاقها — أساس شريط فهرسة الثريد</w:t>
       </w:r>
     </w:p>
     <w:p>
@@ -3087,7 +3266,7 @@
                 <w:szCs w:val="19"/>
                 <w:rtl/>
               </w:rPr>
-              <w:t xml:space="preserve">تقييمات العملاء</w:t>
+              <w:t xml:space="preserve">صندوق الوارد (طبقة البيانات)</w:t>
             </w:r>
           </w:p>
         </w:tc>
@@ -3117,7 +3296,7 @@
                 <w:szCs w:val="19"/>
                 <w:rtl/>
               </w:rPr>
-              <w:t xml:space="preserve">/rating</w:t>
+              <w:t xml:space="preserve">/inbox</w:t>
             </w:r>
           </w:p>
         </w:tc>
@@ -3147,7 +3326,7 @@
                 <w:szCs w:val="19"/>
                 <w:rtl/>
               </w:rPr>
-              <w:t xml:space="preserve">src/pages/CustomerRatings.tsx</w:t>
+              <w:t xml:space="preserve">src/utils/sessions.ts · src/store/useDataStore.ts · src/types/index.ts</w:t>
             </w:r>
           </w:p>
         </w:tc>
@@ -3177,7 +3356,7 @@
                 <w:szCs w:val="19"/>
                 <w:rtl/>
               </w:rPr>
-              <w:t xml:space="preserve">cc8bd4f</w:t>
+              <w:t xml:space="preserve">5cf29e1</w:t>
             </w:r>
           </w:p>
         </w:tc>
@@ -3238,7 +3417,7 @@
           <w:szCs w:val="21"/>
           <w:rtl/>
         </w:rPr>
-        <w:t xml:space="preserve">حُذف كارت «نسبة الاستجابة» بالكامل من شريط الإحصائيات — صارت 3 كروت بدل 4.</w:t>
+        <w:t xml:space="preserve">المشكلة: المحادثة الواحدة تُعاد فتحها كلما راسل العميل بعد الإغلاق، فيصير الثريد بلا نهاية. ولرسم شريط فهرسة يقسّمه إلى دورات، لزم معرفة توقيت كل فتح وإغلاق — وهي بيانات لم تكن تُسجَّل إطلاقاً.</w:t>
       </w:r>
     </w:p>
     <w:p>
@@ -3260,7 +3439,7 @@
           <w:szCs w:val="21"/>
           <w:rtl/>
         </w:rPr>
-        <w:t xml:space="preserve">حُذف معه حساب responseRate لأنه لم يعد له مستهلك في الصفحة.</w:t>
+        <w:t xml:space="preserve">كان الحقل sessionCount يُكتب مرة واحدة عند الإنشاء ولا يزيده أي سطر في المشروع، وقيمه في البيانات التجريبية مكتوبة يدوياً. كذلك activityLog على المحادثة كان مُعرَّفاً في الأنواع لكن لا دالة تكتب فيه وقت التشغيل.</w:t>
       </w:r>
     </w:p>
     <w:p>
@@ -3282,7 +3461,7 @@
           <w:szCs w:val="21"/>
           <w:rtl/>
         </w:rPr>
-        <w:t xml:space="preserve">حُذف استيراد أيقونة TrendingUp لأنها كانت مستخدمة في هذا الكارت وحده.</w:t>
+        <w:t xml:space="preserve">أُضيف النوع SessionEvent لتسجيل حدث فتح أو إغلاق بتوقيته وصاحبه، والنوع ConversationSession يمثّل الدورة المشتقّة.</w:t>
       </w:r>
     </w:p>
     <w:p>
@@ -3304,7 +3483,7 @@
           <w:szCs w:val="21"/>
           <w:rtl/>
         </w:rPr>
-        <w:t xml:space="preserve">عُدّلت شبكة العرض من grid-cols-2 lg:grid-cols-4 إلى grid-cols-1 sm:grid-cols-3، حتى لا يبقى كارت يتيم في سطر منفصل على الشاشات الصغيرة.</w:t>
+        <w:t xml:space="preserve">صارت أربعة مواضع تسجّل الحدث فعلياً: setConversationStatus عند الإغلاق أو إعادة الفتح، reopenConversation، ورسالة العميل الواردة نصية أو صوتية حين تُحيي محادثة مغلقة — وهذا آخرها كان يمرّ بلا أي أثر رغم أنه أكثرها تكراراً.</w:t>
       </w:r>
     </w:p>
     <w:p>
@@ -3326,7 +3505,95 @@
           <w:szCs w:val="21"/>
           <w:rtl/>
         </w:rPr>
-        <w:t xml:space="preserve">الكروت الباقية: متوسط تقييم المحادثة، متوسط تقييم الموظفين، إجمالي الروابط.</w:t>
+        <w:t xml:space="preserve">أُضيفت الدالة deriveSessions التي تقسّم الثريد إلى دورات: الأحداث المسجّلة مرجع قاطع، وما سبقها من تاريخ قديم تُستنتج حدوده من فجوات الصمت (24 ساعة افتراضاً) وتُعلَّم inferred حتى يظل الفرق بين المؤكَّد والمقدَّر ظاهراً.</w:t>
+      </w:r>
+    </w:p>
+    <w:p>
+      <w:pPr>
+        <w:pStyle w:val="ListParagraph"/>
+        <w:numPr>
+          <w:ilvl w:val="0"/>
+          <w:numId w:val="2"/>
+        </w:numPr>
+        <w:bidi/>
+        <w:spacing w:after="70" w:line="290"/>
+        <w:jc w:val="right"/>
+      </w:pPr>
+      <w:r>
+        <w:rPr>
+          <w:rFonts w:ascii="Arial" w:cs="Arial" w:eastAsia="Arial" w:hAnsi="Arial"/>
+          <w:color w:val="1E293B"/>
+          <w:sz w:val="21"/>
+          <w:szCs w:val="21"/>
+          <w:rtl/>
+        </w:rPr>
+        <w:t xml:space="preserve">الدالة تتعامل مع الحالة المختلطة: ثريد فيه تاريخ قديم مُستنتج ودورات جديدة مسجّلة في آن واحد.</w:t>
+      </w:r>
+    </w:p>
+    <w:p>
+      <w:pPr>
+        <w:pStyle w:val="ListParagraph"/>
+        <w:numPr>
+          <w:ilvl w:val="0"/>
+          <w:numId w:val="2"/>
+        </w:numPr>
+        <w:bidi/>
+        <w:spacing w:after="70" w:line="290"/>
+        <w:jc w:val="right"/>
+      </w:pPr>
+      <w:r>
+        <w:rPr>
+          <w:rFonts w:ascii="Arial" w:cs="Arial" w:eastAsia="Arial" w:hAnsi="Arial"/>
+          <w:color w:val="1E293B"/>
+          <w:sz w:val="21"/>
+          <w:szCs w:val="21"/>
+          <w:rtl/>
+        </w:rPr>
+        <w:t xml:space="preserve">اختُبر المنطق على ثماني حالات شملت الثريد الفارغ والرسالة الواحدة والفجوات المتعددة والأحداث المسجّلة والحالة المختلطة والمدخلات غير المرتّبة زمنياً — جميعها نجحت.</w:t>
+      </w:r>
+    </w:p>
+    <w:p>
+      <w:pPr>
+        <w:pStyle w:val="ListParagraph"/>
+        <w:numPr>
+          <w:ilvl w:val="0"/>
+          <w:numId w:val="2"/>
+        </w:numPr>
+        <w:bidi/>
+        <w:spacing w:after="70" w:line="290"/>
+        <w:jc w:val="right"/>
+      </w:pPr>
+      <w:r>
+        <w:rPr>
+          <w:rFonts w:ascii="Arial" w:cs="Arial" w:eastAsia="Arial" w:hAnsi="Arial"/>
+          <w:color w:val="1E293B"/>
+          <w:sz w:val="21"/>
+          <w:szCs w:val="21"/>
+          <w:rtl/>
+        </w:rPr>
+        <w:t xml:space="preserve">ملاحظة على البيانات الحالية: كل المحادثات التجريبية تُنتج دورة واحدة لأن رسائلها متقاربة بدقائق ولا فجوات فيها. الشريط لن يُظهر تقسيماً حقيقياً قبل توفّر بيانات متباعدة زمنياً.</w:t>
+      </w:r>
+    </w:p>
+    <w:p>
+      <w:pPr>
+        <w:pStyle w:val="ListParagraph"/>
+        <w:numPr>
+          <w:ilvl w:val="0"/>
+          <w:numId w:val="2"/>
+        </w:numPr>
+        <w:bidi/>
+        <w:spacing w:after="70" w:line="290"/>
+        <w:jc w:val="right"/>
+      </w:pPr>
+      <w:r>
+        <w:rPr>
+          <w:rFonts w:ascii="Arial" w:cs="Arial" w:eastAsia="Arial" w:hAnsi="Arial"/>
+          <w:color w:val="1E293B"/>
+          <w:sz w:val="21"/>
+          <w:szCs w:val="21"/>
+          <w:rtl/>
+        </w:rPr>
+        <w:t xml:space="preserve">لم تُبنَ واجهة الشريط بعد — هذا التعديل يغطّي طبقة البيانات وحدها.</w:t>
       </w:r>
     </w:p>
     <w:p>
@@ -3351,7 +3618,7 @@
           <w:szCs w:val="24"/>
           <w:rtl/>
         </w:rPr>
-        <w:t xml:space="preserve">تعديل رقم 2 — تغيير تسمية زر الترقية في صفحة الفوترة</w:t>
+        <w:t xml:space="preserve">تعديل رقم 3 — إزالة كارت نسبة الاستجابة من صفحة تقييمات العملاء</w:t>
       </w:r>
     </w:p>
     <w:p>
@@ -3598,7 +3865,7 @@
                 <w:szCs w:val="19"/>
                 <w:rtl/>
               </w:rPr>
-              <w:t xml:space="preserve">9 سبتمبر 2026</w:t>
+              <w:t xml:space="preserve">10 سبتمبر 2026</w:t>
             </w:r>
           </w:p>
         </w:tc>
@@ -3628,7 +3895,7 @@
                 <w:szCs w:val="19"/>
                 <w:rtl/>
               </w:rPr>
-              <w:t xml:space="preserve">الفوترة</w:t>
+              <w:t xml:space="preserve">تقييمات العملاء</w:t>
             </w:r>
           </w:p>
         </w:tc>
@@ -3658,7 +3925,7 @@
                 <w:szCs w:val="19"/>
                 <w:rtl/>
               </w:rPr>
-              <w:t xml:space="preserve">/billing</w:t>
+              <w:t xml:space="preserve">/rating</w:t>
             </w:r>
           </w:p>
         </w:tc>
@@ -3688,7 +3955,7 @@
                 <w:szCs w:val="19"/>
                 <w:rtl/>
               </w:rPr>
-              <w:t xml:space="preserve">src/pages/Billing.tsx</w:t>
+              <w:t xml:space="preserve">src/pages/CustomerRatings.tsx</w:t>
             </w:r>
           </w:p>
         </w:tc>
@@ -3718,7 +3985,7 @@
                 <w:szCs w:val="19"/>
                 <w:rtl/>
               </w:rPr>
-              <w:t xml:space="preserve">be5b3c0</w:t>
+              <w:t xml:space="preserve">cc8bd4f</w:t>
             </w:r>
           </w:p>
         </w:tc>
@@ -3779,7 +4046,7 @@
           <w:szCs w:val="21"/>
           <w:rtl/>
         </w:rPr>
-        <w:t xml:space="preserve">زر «ترقية» أصبح «تغيير الباقة».</w:t>
+        <w:t xml:space="preserve">حُذف كارت «نسبة الاستجابة» بالكامل من شريط الإحصائيات — صارت 3 كروت بدل 4.</w:t>
       </w:r>
     </w:p>
     <w:p>
@@ -3801,7 +4068,73 @@
           <w:szCs w:val="21"/>
           <w:rtl/>
         </w:rPr>
-        <w:t xml:space="preserve">سبب التغيير: الزر يوصّل إلى مسار يشمل الترقية والتخفيض معاً، فالتسمية القديمة كانت تصف نصف وظيفته.</w:t>
+        <w:t xml:space="preserve">حُذف معه حساب responseRate لأنه لم يعد له مستهلك في الصفحة.</w:t>
+      </w:r>
+    </w:p>
+    <w:p>
+      <w:pPr>
+        <w:pStyle w:val="ListParagraph"/>
+        <w:numPr>
+          <w:ilvl w:val="0"/>
+          <w:numId w:val="2"/>
+        </w:numPr>
+        <w:bidi/>
+        <w:spacing w:after="70" w:line="290"/>
+        <w:jc w:val="right"/>
+      </w:pPr>
+      <w:r>
+        <w:rPr>
+          <w:rFonts w:ascii="Arial" w:cs="Arial" w:eastAsia="Arial" w:hAnsi="Arial"/>
+          <w:color w:val="1E293B"/>
+          <w:sz w:val="21"/>
+          <w:szCs w:val="21"/>
+          <w:rtl/>
+        </w:rPr>
+        <w:t xml:space="preserve">حُذف استيراد أيقونة TrendingUp لأنها كانت مستخدمة في هذا الكارت وحده.</w:t>
+      </w:r>
+    </w:p>
+    <w:p>
+      <w:pPr>
+        <w:pStyle w:val="ListParagraph"/>
+        <w:numPr>
+          <w:ilvl w:val="0"/>
+          <w:numId w:val="2"/>
+        </w:numPr>
+        <w:bidi/>
+        <w:spacing w:after="70" w:line="290"/>
+        <w:jc w:val="right"/>
+      </w:pPr>
+      <w:r>
+        <w:rPr>
+          <w:rFonts w:ascii="Arial" w:cs="Arial" w:eastAsia="Arial" w:hAnsi="Arial"/>
+          <w:color w:val="1E293B"/>
+          <w:sz w:val="21"/>
+          <w:szCs w:val="21"/>
+          <w:rtl/>
+        </w:rPr>
+        <w:t xml:space="preserve">عُدّلت شبكة العرض من grid-cols-2 lg:grid-cols-4 إلى grid-cols-1 sm:grid-cols-3، حتى لا يبقى كارت يتيم في سطر منفصل على الشاشات الصغيرة.</w:t>
+      </w:r>
+    </w:p>
+    <w:p>
+      <w:pPr>
+        <w:pStyle w:val="ListParagraph"/>
+        <w:numPr>
+          <w:ilvl w:val="0"/>
+          <w:numId w:val="2"/>
+        </w:numPr>
+        <w:bidi/>
+        <w:spacing w:after="70" w:line="290"/>
+        <w:jc w:val="right"/>
+      </w:pPr>
+      <w:r>
+        <w:rPr>
+          <w:rFonts w:ascii="Arial" w:cs="Arial" w:eastAsia="Arial" w:hAnsi="Arial"/>
+          <w:color w:val="1E293B"/>
+          <w:sz w:val="21"/>
+          <w:szCs w:val="21"/>
+          <w:rtl/>
+        </w:rPr>
+        <w:t xml:space="preserve">الكروت الباقية: متوسط تقييم المحادثة، متوسط تقييم الموظفين، إجمالي الروابط.</w:t>
       </w:r>
     </w:p>
     <w:p>
@@ -3826,7 +4159,7 @@
           <w:szCs w:val="24"/>
           <w:rtl/>
         </w:rPr>
-        <w:t xml:space="preserve">تعديل رقم 1 — ميزة تغيير الباقة — US-131</w:t>
+        <w:t xml:space="preserve">تعديل رقم 2 — تغيير تسمية زر الترقية في صفحة الفوترة</w:t>
       </w:r>
     </w:p>
     <w:p>
@@ -4103,7 +4436,7 @@
                 <w:szCs w:val="19"/>
                 <w:rtl/>
               </w:rPr>
-              <w:t xml:space="preserve">الاشتراك</w:t>
+              <w:t xml:space="preserve">الفوترة</w:t>
             </w:r>
           </w:p>
         </w:tc>
@@ -4133,7 +4466,7 @@
                 <w:szCs w:val="19"/>
                 <w:rtl/>
               </w:rPr>
-              <w:t xml:space="preserve">/subscribe</w:t>
+              <w:t xml:space="preserve">/billing</w:t>
             </w:r>
           </w:p>
         </w:tc>
@@ -4163,7 +4496,7 @@
                 <w:szCs w:val="19"/>
                 <w:rtl/>
               </w:rPr>
-              <w:t xml:space="preserve">src/pages/Subscribe.tsx</w:t>
+              <w:t xml:space="preserve">src/pages/Billing.tsx</w:t>
             </w:r>
           </w:p>
         </w:tc>
@@ -4193,7 +4526,7 @@
                 <w:szCs w:val="19"/>
                 <w:rtl/>
               </w:rPr>
-              <w:t xml:space="preserve">be5b3c0 · c49b797</w:t>
+              <w:t xml:space="preserve">be5b3c0</w:t>
             </w:r>
           </w:p>
         </w:tc>
@@ -4254,7 +4587,7 @@
           <w:szCs w:val="21"/>
           <w:rtl/>
         </w:rPr>
-        <w:t xml:space="preserve">إعادة بناء شبه كاملة للصفحة — 715 سطراً متغيّراً.</w:t>
+        <w:t xml:space="preserve">زر «ترقية» أصبح «تغيير الباقة».</w:t>
       </w:r>
     </w:p>
     <w:p>
@@ -4276,8 +4609,439 @@
           <w:szCs w:val="21"/>
           <w:rtl/>
         </w:rPr>
-        <w:t xml:space="preserve">اختيار الباقة صار بشريط تمرير (slider) حسب عدد المحادثات الشهرية بدل شبكة الكروت. كل باقة نقطة توقف على الشريط، وباقة المؤسسات هي النقطة الأخيرة بعنوان «غير محدود».</w:t>
-      </w:r>
+        <w:t xml:space="preserve">سبب التغيير: الزر يوصّل إلى مسار يشمل الترقية والتخفيض معاً، فالتسمية القديمة كانت تصف نصف وظيفته.</w:t>
+      </w:r>
+    </w:p>
+    <w:p>
+      <w:pPr>
+        <w:spacing w:after="160"/>
+      </w:pPr>
+    </w:p>
+    <w:p>
+      <w:pPr>
+        <w:pStyle w:val="Heading2"/>
+        <w:bidi/>
+        <w:spacing w:after="120" w:before="300"/>
+        <w:jc w:val="right"/>
+      </w:pPr>
+      <w:r>
+        <w:rPr>
+          <w:rFonts w:ascii="Arial" w:cs="Arial" w:eastAsia="Arial" w:hAnsi="Arial"/>
+          <w:b/>
+          <w:bCs/>
+          <w:color w:val="1E293B"/>
+          <w:sz w:val="24"/>
+          <w:szCs w:val="24"/>
+          <w:rtl/>
+        </w:rPr>
+        <w:t xml:space="preserve">تعديل رقم 1 — ميزة تغيير الباقة — US-131</w:t>
+      </w:r>
+    </w:p>
+    <w:p>
+      <w:pPr>
+        <w:spacing w:after="50"/>
+      </w:pPr>
+    </w:p>
+    <w:tbl>
+      <w:tblPr>
+        <w:bidiVisual/>
+        <w:tblW w:type="dxa" w:w="9000"/>
+        <w:tblBorders>
+          <w:top w:val="single" w:color="CBD5E1" w:sz="4"/>
+          <w:left w:val="single" w:color="CBD5E1" w:sz="4"/>
+          <w:bottom w:val="single" w:color="CBD5E1" w:sz="4"/>
+          <w:right w:val="single" w:color="CBD5E1" w:sz="4"/>
+          <w:insideH w:val="single" w:color="CBD5E1" w:sz="4"/>
+          <w:insideV w:val="single" w:color="CBD5E1" w:sz="4"/>
+        </w:tblBorders>
+      </w:tblPr>
+      <w:tblGrid>
+        <w:gridCol w:w="1250"/>
+        <w:gridCol w:w="1250"/>
+        <w:gridCol w:w="1150"/>
+        <w:gridCol w:w="2500"/>
+        <w:gridCol w:w="1350"/>
+        <w:gridCol w:w="1500"/>
+      </w:tblGrid>
+      <w:tr>
+        <w:trPr>
+          <w:tblHeader/>
+        </w:trPr>
+        <w:tc>
+          <w:tcPr>
+            <w:tcW w:type="dxa" w:w="1250"/>
+            <w:shd w:fill="2563EB" w:color="auto" w:val="clear"/>
+            <w:tcMar>
+              <w:top w:type="dxa" w:w="90"/>
+              <w:left w:type="dxa" w:w="110"/>
+              <w:bottom w:type="dxa" w:w="90"/>
+              <w:right w:type="dxa" w:w="110"/>
+            </w:tcMar>
+          </w:tcPr>
+          <w:p>
+            <w:pPr>
+              <w:bidi/>
+              <w:spacing w:after="0" w:line="280"/>
+              <w:jc w:val="right"/>
+            </w:pPr>
+            <w:r>
+              <w:rPr>
+                <w:rFonts w:ascii="Arial" w:cs="Arial" w:eastAsia="Arial" w:hAnsi="Arial"/>
+                <w:b/>
+                <w:bCs/>
+                <w:color w:val="FFFFFF"/>
+                <w:sz w:val="19"/>
+                <w:szCs w:val="19"/>
+                <w:rtl/>
+              </w:rPr>
+              <w:t xml:space="preserve">التاريخ</w:t>
+            </w:r>
+          </w:p>
+        </w:tc>
+        <w:tc>
+          <w:tcPr>
+            <w:tcW w:type="dxa" w:w="1250"/>
+            <w:shd w:fill="2563EB" w:color="auto" w:val="clear"/>
+            <w:tcMar>
+              <w:top w:type="dxa" w:w="90"/>
+              <w:left w:type="dxa" w:w="110"/>
+              <w:bottom w:type="dxa" w:w="90"/>
+              <w:right w:type="dxa" w:w="110"/>
+            </w:tcMar>
+          </w:tcPr>
+          <w:p>
+            <w:pPr>
+              <w:bidi/>
+              <w:spacing w:after="0" w:line="280"/>
+              <w:jc w:val="right"/>
+            </w:pPr>
+            <w:r>
+              <w:rPr>
+                <w:rFonts w:ascii="Arial" w:cs="Arial" w:eastAsia="Arial" w:hAnsi="Arial"/>
+                <w:b/>
+                <w:bCs/>
+                <w:color w:val="FFFFFF"/>
+                <w:sz w:val="19"/>
+                <w:szCs w:val="19"/>
+                <w:rtl/>
+              </w:rPr>
+              <w:t xml:space="preserve">الصفحة</w:t>
+            </w:r>
+          </w:p>
+        </w:tc>
+        <w:tc>
+          <w:tcPr>
+            <w:tcW w:type="dxa" w:w="1150"/>
+            <w:shd w:fill="2563EB" w:color="auto" w:val="clear"/>
+            <w:tcMar>
+              <w:top w:type="dxa" w:w="90"/>
+              <w:left w:type="dxa" w:w="110"/>
+              <w:bottom w:type="dxa" w:w="90"/>
+              <w:right w:type="dxa" w:w="110"/>
+            </w:tcMar>
+          </w:tcPr>
+          <w:p>
+            <w:pPr>
+              <w:bidi/>
+              <w:spacing w:after="0" w:line="280"/>
+              <w:jc w:val="right"/>
+            </w:pPr>
+            <w:r>
+              <w:rPr>
+                <w:rFonts w:ascii="Arial" w:cs="Arial" w:eastAsia="Arial" w:hAnsi="Arial"/>
+                <w:b/>
+                <w:bCs/>
+                <w:color w:val="FFFFFF"/>
+                <w:sz w:val="19"/>
+                <w:szCs w:val="19"/>
+                <w:rtl/>
+              </w:rPr>
+              <w:t xml:space="preserve">المسار</w:t>
+            </w:r>
+          </w:p>
+        </w:tc>
+        <w:tc>
+          <w:tcPr>
+            <w:tcW w:type="dxa" w:w="2500"/>
+            <w:shd w:fill="2563EB" w:color="auto" w:val="clear"/>
+            <w:tcMar>
+              <w:top w:type="dxa" w:w="90"/>
+              <w:left w:type="dxa" w:w="110"/>
+              <w:bottom w:type="dxa" w:w="90"/>
+              <w:right w:type="dxa" w:w="110"/>
+            </w:tcMar>
+          </w:tcPr>
+          <w:p>
+            <w:pPr>
+              <w:bidi/>
+              <w:spacing w:after="0" w:line="280"/>
+              <w:jc w:val="right"/>
+            </w:pPr>
+            <w:r>
+              <w:rPr>
+                <w:rFonts w:ascii="Arial" w:cs="Arial" w:eastAsia="Arial" w:hAnsi="Arial"/>
+                <w:b/>
+                <w:bCs/>
+                <w:color w:val="FFFFFF"/>
+                <w:sz w:val="19"/>
+                <w:szCs w:val="19"/>
+                <w:rtl/>
+              </w:rPr>
+              <w:t xml:space="preserve">الملف</w:t>
+            </w:r>
+          </w:p>
+        </w:tc>
+        <w:tc>
+          <w:tcPr>
+            <w:tcW w:type="dxa" w:w="1350"/>
+            <w:shd w:fill="2563EB" w:color="auto" w:val="clear"/>
+            <w:tcMar>
+              <w:top w:type="dxa" w:w="90"/>
+              <w:left w:type="dxa" w:w="110"/>
+              <w:bottom w:type="dxa" w:w="90"/>
+              <w:right w:type="dxa" w:w="110"/>
+            </w:tcMar>
+          </w:tcPr>
+          <w:p>
+            <w:pPr>
+              <w:bidi/>
+              <w:spacing w:after="0" w:line="280"/>
+              <w:jc w:val="right"/>
+            </w:pPr>
+            <w:r>
+              <w:rPr>
+                <w:rFonts w:ascii="Arial" w:cs="Arial" w:eastAsia="Arial" w:hAnsi="Arial"/>
+                <w:b/>
+                <w:bCs/>
+                <w:color w:val="FFFFFF"/>
+                <w:sz w:val="19"/>
+                <w:szCs w:val="19"/>
+                <w:rtl/>
+              </w:rPr>
+              <w:t xml:space="preserve">الكوميت</w:t>
+            </w:r>
+          </w:p>
+        </w:tc>
+        <w:tc>
+          <w:tcPr>
+            <w:tcW w:type="dxa" w:w="1500"/>
+            <w:shd w:fill="2563EB" w:color="auto" w:val="clear"/>
+            <w:tcMar>
+              <w:top w:type="dxa" w:w="90"/>
+              <w:left w:type="dxa" w:w="110"/>
+              <w:bottom w:type="dxa" w:w="90"/>
+              <w:right w:type="dxa" w:w="110"/>
+            </w:tcMar>
+          </w:tcPr>
+          <w:p>
+            <w:pPr>
+              <w:bidi/>
+              <w:spacing w:after="0" w:line="280"/>
+              <w:jc w:val="right"/>
+            </w:pPr>
+            <w:r>
+              <w:rPr>
+                <w:rFonts w:ascii="Arial" w:cs="Arial" w:eastAsia="Arial" w:hAnsi="Arial"/>
+                <w:b/>
+                <w:bCs/>
+                <w:color w:val="FFFFFF"/>
+                <w:sz w:val="19"/>
+                <w:szCs w:val="19"/>
+                <w:rtl/>
+              </w:rPr>
+              <w:t xml:space="preserve">الحالة</w:t>
+            </w:r>
+          </w:p>
+        </w:tc>
+      </w:tr>
+      <w:tr>
+        <w:tc>
+          <w:tcPr>
+            <w:tcW w:type="dxa" w:w="1250"/>
+            <w:tcMar>
+              <w:top w:type="dxa" w:w="90"/>
+              <w:left w:type="dxa" w:w="110"/>
+              <w:bottom w:type="dxa" w:w="90"/>
+              <w:right w:type="dxa" w:w="110"/>
+            </w:tcMar>
+          </w:tcPr>
+          <w:p>
+            <w:pPr>
+              <w:bidi/>
+              <w:spacing w:after="0" w:line="280"/>
+              <w:jc w:val="right"/>
+            </w:pPr>
+            <w:r>
+              <w:rPr>
+                <w:rFonts w:ascii="Arial" w:cs="Arial" w:eastAsia="Arial" w:hAnsi="Arial"/>
+                <w:b w:val="false"/>
+                <w:bCs w:val="false"/>
+                <w:color w:val="1E293B"/>
+                <w:sz w:val="19"/>
+                <w:szCs w:val="19"/>
+                <w:rtl/>
+              </w:rPr>
+              <w:t xml:space="preserve">9 سبتمبر 2026</w:t>
+            </w:r>
+          </w:p>
+        </w:tc>
+        <w:tc>
+          <w:tcPr>
+            <w:tcW w:type="dxa" w:w="1250"/>
+            <w:tcMar>
+              <w:top w:type="dxa" w:w="90"/>
+              <w:left w:type="dxa" w:w="110"/>
+              <w:bottom w:type="dxa" w:w="90"/>
+              <w:right w:type="dxa" w:w="110"/>
+            </w:tcMar>
+          </w:tcPr>
+          <w:p>
+            <w:pPr>
+              <w:bidi/>
+              <w:spacing w:after="0" w:line="280"/>
+              <w:jc w:val="right"/>
+            </w:pPr>
+            <w:r>
+              <w:rPr>
+                <w:rFonts w:ascii="Arial" w:cs="Arial" w:eastAsia="Arial" w:hAnsi="Arial"/>
+                <w:b w:val="false"/>
+                <w:bCs w:val="false"/>
+                <w:color w:val="1E293B"/>
+                <w:sz w:val="19"/>
+                <w:szCs w:val="19"/>
+                <w:rtl/>
+              </w:rPr>
+              <w:t xml:space="preserve">الاشتراك</w:t>
+            </w:r>
+          </w:p>
+        </w:tc>
+        <w:tc>
+          <w:tcPr>
+            <w:tcW w:type="dxa" w:w="1150"/>
+            <w:tcMar>
+              <w:top w:type="dxa" w:w="90"/>
+              <w:left w:type="dxa" w:w="110"/>
+              <w:bottom w:type="dxa" w:w="90"/>
+              <w:right w:type="dxa" w:w="110"/>
+            </w:tcMar>
+          </w:tcPr>
+          <w:p>
+            <w:pPr>
+              <w:bidi/>
+              <w:spacing w:after="0" w:line="280"/>
+              <w:jc w:val="right"/>
+            </w:pPr>
+            <w:r>
+              <w:rPr>
+                <w:rFonts w:ascii="Arial" w:cs="Arial" w:eastAsia="Arial" w:hAnsi="Arial"/>
+                <w:b w:val="false"/>
+                <w:bCs w:val="false"/>
+                <w:color w:val="1E293B"/>
+                <w:sz w:val="19"/>
+                <w:szCs w:val="19"/>
+                <w:rtl/>
+              </w:rPr>
+              <w:t xml:space="preserve">/subscribe</w:t>
+            </w:r>
+          </w:p>
+        </w:tc>
+        <w:tc>
+          <w:tcPr>
+            <w:tcW w:type="dxa" w:w="2500"/>
+            <w:tcMar>
+              <w:top w:type="dxa" w:w="90"/>
+              <w:left w:type="dxa" w:w="110"/>
+              <w:bottom w:type="dxa" w:w="90"/>
+              <w:right w:type="dxa" w:w="110"/>
+            </w:tcMar>
+          </w:tcPr>
+          <w:p>
+            <w:pPr>
+              <w:bidi/>
+              <w:spacing w:after="0" w:line="280"/>
+              <w:jc w:val="right"/>
+            </w:pPr>
+            <w:r>
+              <w:rPr>
+                <w:rFonts w:ascii="Arial" w:cs="Arial" w:eastAsia="Arial" w:hAnsi="Arial"/>
+                <w:b w:val="false"/>
+                <w:bCs w:val="false"/>
+                <w:color w:val="1E293B"/>
+                <w:sz w:val="19"/>
+                <w:szCs w:val="19"/>
+                <w:rtl/>
+              </w:rPr>
+              <w:t xml:space="preserve">src/pages/Subscribe.tsx</w:t>
+            </w:r>
+          </w:p>
+        </w:tc>
+        <w:tc>
+          <w:tcPr>
+            <w:tcW w:type="dxa" w:w="1350"/>
+            <w:tcMar>
+              <w:top w:type="dxa" w:w="90"/>
+              <w:left w:type="dxa" w:w="110"/>
+              <w:bottom w:type="dxa" w:w="90"/>
+              <w:right w:type="dxa" w:w="110"/>
+            </w:tcMar>
+          </w:tcPr>
+          <w:p>
+            <w:pPr>
+              <w:bidi/>
+              <w:spacing w:after="0" w:line="280"/>
+              <w:jc w:val="right"/>
+            </w:pPr>
+            <w:r>
+              <w:rPr>
+                <w:rFonts w:ascii="Arial" w:cs="Arial" w:eastAsia="Arial" w:hAnsi="Arial"/>
+                <w:b w:val="false"/>
+                <w:bCs w:val="false"/>
+                <w:color w:val="1E293B"/>
+                <w:sz w:val="19"/>
+                <w:szCs w:val="19"/>
+                <w:rtl/>
+              </w:rPr>
+              <w:t xml:space="preserve">be5b3c0 · c49b797</w:t>
+            </w:r>
+          </w:p>
+        </w:tc>
+        <w:tc>
+          <w:tcPr>
+            <w:tcW w:type="dxa" w:w="1500"/>
+            <w:shd w:fill="ECFDF5" w:color="auto" w:val="clear"/>
+            <w:tcMar>
+              <w:top w:type="dxa" w:w="90"/>
+              <w:left w:type="dxa" w:w="110"/>
+              <w:bottom w:type="dxa" w:w="90"/>
+              <w:right w:type="dxa" w:w="110"/>
+            </w:tcMar>
+          </w:tcPr>
+          <w:p>
+            <w:pPr>
+              <w:bidi/>
+              <w:spacing w:after="0" w:line="280"/>
+              <w:jc w:val="right"/>
+            </w:pPr>
+            <w:r>
+              <w:rPr>
+                <w:rFonts w:ascii="Arial" w:cs="Arial" w:eastAsia="Arial" w:hAnsi="Arial"/>
+                <w:b/>
+                <w:bCs/>
+                <w:color w:val="15803D"/>
+                <w:sz w:val="19"/>
+                <w:szCs w:val="19"/>
+                <w:rtl/>
+              </w:rPr>
+              <w:t xml:space="preserve">منشور على الإنتاج</w:t>
+            </w:r>
+          </w:p>
+        </w:tc>
+      </w:tr>
+    </w:tbl>
+    <w:p>
+      <w:pPr>
+        <w:spacing w:after="90"/>
+      </w:pPr>
     </w:p>
     <w:p>
       <w:pPr>
@@ -4298,7 +5062,7 @@
           <w:szCs w:val="21"/>
           <w:rtl/>
         </w:rPr>
-        <w:t xml:space="preserve">مسار من ست خطوات: اختيار الباقة، ثم تأكيد التخفيض، ثم الدفع، ثم المعالجة، ثم النجاح أو الفشل.</w:t>
+        <w:t xml:space="preserve">إعادة بناء شبه كاملة للصفحة — 715 سطراً متغيّراً.</w:t>
       </w:r>
     </w:p>
     <w:p>
@@ -4320,7 +5084,7 @@
           <w:szCs w:val="21"/>
           <w:rtl/>
         </w:rPr>
-        <w:t xml:space="preserve">احتساب تناسبي للترقية: يُحصَّل فرق السعر عن الأيام المتبقية من الدورة الحالية فقط، ويظهر المبلغ مفصّلاً في ملخص الدفع.</w:t>
+        <w:t xml:space="preserve">اختيار الباقة صار بشريط تمرير (slider) حسب عدد المحادثات الشهرية بدل شبكة الكروت. كل باقة نقطة توقف على الشريط، وباقة المؤسسات هي النقطة الأخيرة بعنوان «غير محدود».</w:t>
       </w:r>
     </w:p>
     <w:p>
@@ -4342,7 +5106,7 @@
           <w:szCs w:val="21"/>
           <w:rtl/>
         </w:rPr>
-        <w:t xml:space="preserve">التخفيض له شاشة تأكيد مستقلة ولا يذهب مباشرة إلى الدفع.</w:t>
+        <w:t xml:space="preserve">مسار من ست خطوات: اختيار الباقة، ثم تأكيد التخفيض، ثم الدفع، ثم المعالجة، ثم النجاح أو الفشل.</w:t>
       </w:r>
     </w:p>
     <w:p>
@@ -4364,7 +5128,7 @@
           <w:szCs w:val="21"/>
           <w:rtl/>
         </w:rPr>
-        <w:t xml:space="preserve">دورة الفوترة تُقرأ من اشتراك العميل الحالي بدل أن تبدأ بقيمة ثابتة.</w:t>
+        <w:t xml:space="preserve">احتساب تناسبي للترقية: يُحصَّل فرق السعر عن الأيام المتبقية من الدورة الحالية فقط، ويظهر المبلغ مفصّلاً في ملخص الدفع.</w:t>
       </w:r>
     </w:p>
     <w:p>
@@ -4386,6 +5150,50 @@
           <w:szCs w:val="21"/>
           <w:rtl/>
         </w:rPr>
+        <w:t xml:space="preserve">التخفيض له شاشة تأكيد مستقلة ولا يذهب مباشرة إلى الدفع.</w:t>
+      </w:r>
+    </w:p>
+    <w:p>
+      <w:pPr>
+        <w:pStyle w:val="ListParagraph"/>
+        <w:numPr>
+          <w:ilvl w:val="0"/>
+          <w:numId w:val="2"/>
+        </w:numPr>
+        <w:bidi/>
+        <w:spacing w:after="70" w:line="290"/>
+        <w:jc w:val="right"/>
+      </w:pPr>
+      <w:r>
+        <w:rPr>
+          <w:rFonts w:ascii="Arial" w:cs="Arial" w:eastAsia="Arial" w:hAnsi="Arial"/>
+          <w:color w:val="1E293B"/>
+          <w:sz w:val="21"/>
+          <w:szCs w:val="21"/>
+          <w:rtl/>
+        </w:rPr>
+        <w:t xml:space="preserve">دورة الفوترة تُقرأ من اشتراك العميل الحالي بدل أن تبدأ بقيمة ثابتة.</w:t>
+      </w:r>
+    </w:p>
+    <w:p>
+      <w:pPr>
+        <w:pStyle w:val="ListParagraph"/>
+        <w:numPr>
+          <w:ilvl w:val="0"/>
+          <w:numId w:val="2"/>
+        </w:numPr>
+        <w:bidi/>
+        <w:spacing w:after="70" w:line="290"/>
+        <w:jc w:val="right"/>
+      </w:pPr>
+      <w:r>
+        <w:rPr>
+          <w:rFonts w:ascii="Arial" w:cs="Arial" w:eastAsia="Arial" w:hAnsi="Arial"/>
+          <w:color w:val="1E293B"/>
+          <w:sz w:val="21"/>
+          <w:szCs w:val="21"/>
+          <w:rtl/>
+        </w:rPr>
         <w:t xml:space="preserve">أُصلحت علامات تعارض الدمج (merge conflict markers) التي كانت باقية في الملف — كوميت c49b797.</w:t>
       </w:r>
     </w:p>
@@ -4572,7 +5380,7 @@
           <w:szCs w:val="20"/>
           <w:rtl/>
         </w:rPr>
-        <w:t xml:space="preserve">عدد التعديلات المسجّلة: 5</w:t>
+        <w:t xml:space="preserve">عدد التعديلات المسجّلة: 6</w:t>
       </w:r>
     </w:p>
     <w:sectPr>

</xml_diff>

<commit_message>
cluster the session ticks at the centre of the rail
Preferred look over positional meaning: the ticks now sit as one tidy
group in the middle of the edge rather than spread across the full height.
The offset measurement and ResizeObserver that placed them proportionally
are removed, since nothing reads them any more.

The group scrolls when a thread has many cycles, which clips overflow, so
the tooltip moved outside it and is aligned to the hovered tick by
measurement instead.

Co-Authored-By: Claude Opus 5 <noreply@anthropic.com>
Claude-Session: https://claude.ai/code/session_01JGHUnSrtQwLX2BGbB3j6wk
</commit_message>
<xml_diff>
--- a/docs/سجل التعديلات الاخيرة.docx
+++ b/docs/سجل التعديلات الاخيرة.docx
@@ -2159,7 +2159,7 @@
           <w:szCs w:val="21"/>
           <w:rtl/>
         </w:rPr>
-        <w:t xml:space="preserve">العلامة صارت تقع في موضعها النسبي الحقيقي من ارتفاع التمرير — تُقاس من موضع أول رسالة في الدورة داخل الثريد — فصار الشريط خريطة فعلية للمحادثة لا مجرد قائمة مرتّبة.</w:t>
+        <w:t xml:space="preserve">العلامات مجمّعة في منتصف ارتفاع الحافة كمجموعة واحدة مرتّبة، لا موزّعة على كامل الطول.</w:t>
       </w:r>
     </w:p>
     <w:p>
@@ -2181,7 +2181,7 @@
           <w:szCs w:val="21"/>
           <w:rtl/>
         </w:rPr>
-        <w:t xml:space="preserve">القياس يُعاد عند تغيير المحادثة أو وصول رسالة، ويُراقَب تغيّر حجم اللوحة بـ ResizeObserver حتى لا تصير المواضع قديمة عند طيّ لوحة التفاصيل أو تغيير حجم النافذة.</w:t>
+        <w:t xml:space="preserve">جُرّب توزيعها على مواضعها النسبية من ارتفاع التمرير أولاً، ثم استُبدل بالتجميع في المنتصف بقرار من الإدارة: الشكل المرتّب فُضّل على دلالة الموضع. أُزيل معه كود القياس ومراقب تغيّر الحجم لأنه لم يعد له عمل.</w:t>
       </w:r>
     </w:p>
     <w:p>
@@ -2313,7 +2313,7 @@
           <w:szCs w:val="21"/>
           <w:rtl/>
         </w:rPr>
-        <w:t xml:space="preserve">تنازل مقصود: الشكل السابق كان يعبّر عن حجم كل دورة بارتفاعها، والمسطرة لا تفعل. حجم الدورة انتقل إلى التلميح، لأن المطلوب الأساسي هو موضع بداية الدورة لا حجمها.</w:t>
+        <w:t xml:space="preserve">تنازل مقصود: الشكل السابق كان يعبّر عن حجم كل دورة بارتفاعها، والمسطرة لا تفعل. حجم الدورة انتقل إلى التلميح.</w:t>
       </w:r>
     </w:p>
     <w:p>
@@ -2335,7 +2335,29 @@
           <w:szCs w:val="21"/>
           <w:rtl/>
         </w:rPr>
-        <w:t xml:space="preserve">عوينت النتيجة في المتصفح: العلامات الثلاث ظهرت في مواضع غير متساوية تطابق مواضع التمرير الفعلية، والتوضّح بالاقتراب والتلميح والانتقال تعمل.</w:t>
+        <w:t xml:space="preserve">مجموعة العلامات تقبل التمرير داخلها إن كثرت الدورات حتى لا تتجاوز ارتفاع اللوحة. ولأن ذلك يقصّ التلميح، رُفع التلميح خارج المجموعة ويُحاذى رأسياً بالعلامة المؤشَّر عليها بالقياس.</w:t>
+      </w:r>
+    </w:p>
+    <w:p>
+      <w:pPr>
+        <w:pStyle w:val="ListParagraph"/>
+        <w:numPr>
+          <w:ilvl w:val="0"/>
+          <w:numId w:val="2"/>
+        </w:numPr>
+        <w:bidi/>
+        <w:spacing w:after="70" w:line="290"/>
+        <w:jc w:val="right"/>
+      </w:pPr>
+      <w:r>
+        <w:rPr>
+          <w:rFonts w:ascii="Arial" w:cs="Arial" w:eastAsia="Arial" w:hAnsi="Arial"/>
+          <w:color w:val="1E293B"/>
+          <w:sz w:val="21"/>
+          <w:szCs w:val="21"/>
+          <w:rtl/>
+        </w:rPr>
+        <w:t xml:space="preserve">عوينت النتيجة في المتصفح: العلامات الثلاث متجمّعة في المنتصف، والتوضّح بالاقتراب والتلميح والانتقال تعمل.</w:t>
       </w:r>
     </w:p>
     <w:p>

</xml_diff>

<commit_message>
deploy build 8bb2487f to production
Publishes the centred ruler redesign of the thread session index. All six
changelog entries are now live and the tracked dist artifacts match what
is served.

Co-Authored-By: Claude Opus 5 <noreply@anthropic.com>
Claude-Session: https://claude.ai/code/session_01JGHUnSrtQwLX2BGbB3j6wk
</commit_message>
<xml_diff>
--- a/docs/سجل التعديلات الاخيرة.docx
+++ b/docs/سجل التعديلات الاخيرة.docx
@@ -451,31 +451,31 @@
         <w:tc>
           <w:tcPr>
             <w:tcW w:type="dxa" w:w="1800"/>
-            <w:shd w:fill="FFFBEB" w:color="auto" w:val="clear"/>
-            <w:tcMar>
-              <w:top w:type="dxa" w:w="90"/>
-              <w:left w:type="dxa" w:w="110"/>
-              <w:bottom w:type="dxa" w:w="90"/>
-              <w:right w:type="dxa" w:w="110"/>
-            </w:tcMar>
-          </w:tcPr>
-          <w:p>
-            <w:pPr>
-              <w:bidi/>
-              <w:spacing w:after="0" w:line="280"/>
-              <w:jc w:val="right"/>
-            </w:pPr>
-            <w:r>
-              <w:rPr>
-                <w:rFonts w:ascii="Arial" w:cs="Arial" w:eastAsia="Arial" w:hAnsi="Arial"/>
-                <w:b/>
-                <w:bCs/>
-                <w:color w:val="B45309"/>
-                <w:sz w:val="19"/>
-                <w:szCs w:val="19"/>
-                <w:rtl/>
-              </w:rPr>
-              <w:t xml:space="preserve">مرفوع — غير منشور</w:t>
+            <w:shd w:fill="ECFDF5" w:color="auto" w:val="clear"/>
+            <w:tcMar>
+              <w:top w:type="dxa" w:w="90"/>
+              <w:left w:type="dxa" w:w="110"/>
+              <w:bottom w:type="dxa" w:w="90"/>
+              <w:right w:type="dxa" w:w="110"/>
+            </w:tcMar>
+          </w:tcPr>
+          <w:p>
+            <w:pPr>
+              <w:bidi/>
+              <w:spacing w:after="0" w:line="280"/>
+              <w:jc w:val="right"/>
+            </w:pPr>
+            <w:r>
+              <w:rPr>
+                <w:rFonts w:ascii="Arial" w:cs="Arial" w:eastAsia="Arial" w:hAnsi="Arial"/>
+                <w:b/>
+                <w:bCs/>
+                <w:color w:val="15803D"/>
+                <w:sz w:val="19"/>
+                <w:szCs w:val="19"/>
+                <w:rtl/>
+              </w:rPr>
+              <w:t xml:space="preserve">منشور على الإنتاج</w:t>
             </w:r>
           </w:p>
         </w:tc>
@@ -1624,7 +1624,7 @@
                 <w:szCs w:val="20"/>
                 <w:rtl/>
               </w:rPr>
-              <w:t xml:space="preserve">البناء المنشور على الإنتاج: 06e4f0fa-ddab-4ae4-8ad8-f853c3466c95</w:t>
+              <w:t xml:space="preserve">البناء المنشور على الإنتاج: 8bb2487f-c80a-4577-a876-61061b147ecc</w:t>
             </w:r>
           </w:p>
           <w:p>
@@ -1641,7 +1641,7 @@
                 <w:szCs w:val="20"/>
                 <w:rtl/>
               </w:rPr>
-              <w:t xml:space="preserve">يوجد 1 تعديل مرفوع على الفرع ولم يُنشر بعد — مبيّن في الجدول أعلاه.</w:t>
+              <w:t xml:space="preserve">كل التعديلات المرفوعة منشورة على الإنتاج.</w:t>
             </w:r>
           </w:p>
           <w:p>
@@ -2076,38 +2076,38 @@
                 <w:szCs w:val="19"/>
                 <w:rtl/>
               </w:rPr>
-              <w:t xml:space="preserve">—</w:t>
+              <w:t xml:space="preserve">4163939</w:t>
             </w:r>
           </w:p>
         </w:tc>
         <w:tc>
           <w:tcPr>
             <w:tcW w:type="dxa" w:w="1500"/>
-            <w:shd w:fill="FFFBEB" w:color="auto" w:val="clear"/>
-            <w:tcMar>
-              <w:top w:type="dxa" w:w="90"/>
-              <w:left w:type="dxa" w:w="110"/>
-              <w:bottom w:type="dxa" w:w="90"/>
-              <w:right w:type="dxa" w:w="110"/>
-            </w:tcMar>
-          </w:tcPr>
-          <w:p>
-            <w:pPr>
-              <w:bidi/>
-              <w:spacing w:after="0" w:line="280"/>
-              <w:jc w:val="right"/>
-            </w:pPr>
-            <w:r>
-              <w:rPr>
-                <w:rFonts w:ascii="Arial" w:cs="Arial" w:eastAsia="Arial" w:hAnsi="Arial"/>
-                <w:b/>
-                <w:bCs/>
-                <w:color w:val="B45309"/>
-                <w:sz w:val="19"/>
-                <w:szCs w:val="19"/>
-                <w:rtl/>
-              </w:rPr>
-              <w:t xml:space="preserve">مرفوع — غير منشور</w:t>
+            <w:shd w:fill="ECFDF5" w:color="auto" w:val="clear"/>
+            <w:tcMar>
+              <w:top w:type="dxa" w:w="90"/>
+              <w:left w:type="dxa" w:w="110"/>
+              <w:bottom w:type="dxa" w:w="90"/>
+              <w:right w:type="dxa" w:w="110"/>
+            </w:tcMar>
+          </w:tcPr>
+          <w:p>
+            <w:pPr>
+              <w:bidi/>
+              <w:spacing w:after="0" w:line="280"/>
+              <w:jc w:val="right"/>
+            </w:pPr>
+            <w:r>
+              <w:rPr>
+                <w:rFonts w:ascii="Arial" w:cs="Arial" w:eastAsia="Arial" w:hAnsi="Arial"/>
+                <w:b/>
+                <w:bCs/>
+                <w:color w:val="15803D"/>
+                <w:sz w:val="19"/>
+                <w:szCs w:val="19"/>
+                <w:rtl/>
+              </w:rPr>
+              <w:t xml:space="preserve">منشور على الإنتاج</w:t>
             </w:r>
           </w:p>
         </w:tc>

</xml_diff>

<commit_message>
surface the scheduled-downgrade state in the client portal
A subscription carrying a downgrade dated for later now reads as مجدولة to
the client, not only to admins. Adds Subscription.scheduledChange and a
'scheduled' invoice status, shows the target plan and effective date on the
plan card, and reflects the state in the invoice table, filters and preview.

The invoice state is derived from the subscription rather than stored, so
cancelling the schedule clears it everywhere at once. It replaces only
unsettled statuses — a paid, refunded, cancelled, failed or overdue invoice
keeps its own, since overdue is a payment problem that must stay visible.

Cancel Schedule is an admin action per the spec, so the client portal shows
the state without controlling it.

Co-Authored-By: Claude Opus 5 <noreply@anthropic.com>
Claude-Session: https://claude.ai/code/session_01JGHUnSrtQwLX2BGbB3j6wk
</commit_message>
<xml_diff>
--- a/docs/سجل التعديلات الاخيرة.docx
+++ b/docs/سجل التعديلات الاخيرة.docx
@@ -354,7 +354,7 @@
                 <w:szCs w:val="19"/>
                 <w:rtl/>
               </w:rPr>
-              <w:t xml:space="preserve">6</w:t>
+              <w:t xml:space="preserve">7</w:t>
             </w:r>
           </w:p>
         </w:tc>
@@ -414,7 +414,7 @@
                 <w:szCs w:val="19"/>
                 <w:rtl/>
               </w:rPr>
-              <w:t xml:space="preserve">إعادة تصميم شريط الفهرسة على هيئة مسطرة تظهر عند الاقتراب</w:t>
+              <w:t xml:space="preserve">انعكاس حالة «مجدولة» للتخفيض المؤجّل في بورتال العميل</w:t>
             </w:r>
           </w:p>
         </w:tc>
@@ -444,38 +444,38 @@
                 <w:szCs w:val="19"/>
                 <w:rtl/>
               </w:rPr>
-              <w:t xml:space="preserve">صندوق الوارد</w:t>
+              <w:t xml:space="preserve">الباقات والاشتراك</w:t>
             </w:r>
           </w:p>
         </w:tc>
         <w:tc>
           <w:tcPr>
             <w:tcW w:type="dxa" w:w="1800"/>
-            <w:shd w:fill="ECFDF5" w:color="auto" w:val="clear"/>
-            <w:tcMar>
-              <w:top w:type="dxa" w:w="90"/>
-              <w:left w:type="dxa" w:w="110"/>
-              <w:bottom w:type="dxa" w:w="90"/>
-              <w:right w:type="dxa" w:w="110"/>
-            </w:tcMar>
-          </w:tcPr>
-          <w:p>
-            <w:pPr>
-              <w:bidi/>
-              <w:spacing w:after="0" w:line="280"/>
-              <w:jc w:val="right"/>
-            </w:pPr>
-            <w:r>
-              <w:rPr>
-                <w:rFonts w:ascii="Arial" w:cs="Arial" w:eastAsia="Arial" w:hAnsi="Arial"/>
-                <w:b/>
-                <w:bCs/>
-                <w:color w:val="15803D"/>
-                <w:sz w:val="19"/>
-                <w:szCs w:val="19"/>
-                <w:rtl/>
-              </w:rPr>
-              <w:t xml:space="preserve">منشور على الإنتاج</w:t>
+            <w:shd w:fill="FFFBEB" w:color="auto" w:val="clear"/>
+            <w:tcMar>
+              <w:top w:type="dxa" w:w="90"/>
+              <w:left w:type="dxa" w:w="110"/>
+              <w:bottom w:type="dxa" w:w="90"/>
+              <w:right w:type="dxa" w:w="110"/>
+            </w:tcMar>
+          </w:tcPr>
+          <w:p>
+            <w:pPr>
+              <w:bidi/>
+              <w:spacing w:after="0" w:line="280"/>
+              <w:jc w:val="right"/>
+            </w:pPr>
+            <w:r>
+              <w:rPr>
+                <w:rFonts w:ascii="Arial" w:cs="Arial" w:eastAsia="Arial" w:hAnsi="Arial"/>
+                <w:b/>
+                <w:bCs/>
+                <w:color w:val="B45309"/>
+                <w:sz w:val="19"/>
+                <w:szCs w:val="19"/>
+                <w:rtl/>
+              </w:rPr>
+              <w:t xml:space="preserve">مرفوع — غير منشور</w:t>
             </w:r>
           </w:p>
         </w:tc>
@@ -508,7 +508,7 @@
                 <w:szCs w:val="19"/>
                 <w:rtl/>
               </w:rPr>
-              <w:t xml:space="preserve">5</w:t>
+              <w:t xml:space="preserve">6</w:t>
             </w:r>
           </w:p>
         </w:tc>
@@ -570,7 +570,7 @@
                 <w:szCs w:val="19"/>
                 <w:rtl/>
               </w:rPr>
-              <w:t xml:space="preserve">شريط فهرسة دورات المحادثة داخل الثريد</w:t>
+              <w:t xml:space="preserve">إعادة تصميم شريط الفهرسة على هيئة مسطرة تظهر عند الاقتراب</w:t>
             </w:r>
           </w:p>
         </w:tc>
@@ -664,7 +664,7 @@
                 <w:szCs w:val="19"/>
                 <w:rtl/>
               </w:rPr>
-              <w:t xml:space="preserve">4</w:t>
+              <w:t xml:space="preserve">5</w:t>
             </w:r>
           </w:p>
         </w:tc>
@@ -724,7 +724,7 @@
                 <w:szCs w:val="19"/>
                 <w:rtl/>
               </w:rPr>
-              <w:t xml:space="preserve">تسجيل دورات المحادثة واشتقاقها — أساس شريط فهرسة الثريد</w:t>
+              <w:t xml:space="preserve">شريط فهرسة دورات المحادثة داخل الثريد</w:t>
             </w:r>
           </w:p>
         </w:tc>
@@ -754,7 +754,7 @@
                 <w:szCs w:val="19"/>
                 <w:rtl/>
               </w:rPr>
-              <w:t xml:space="preserve">صندوق الوارد (طبقة البيانات)</w:t>
+              <w:t xml:space="preserve">صندوق الوارد</w:t>
             </w:r>
           </w:p>
         </w:tc>
@@ -818,7 +818,7 @@
                 <w:szCs w:val="19"/>
                 <w:rtl/>
               </w:rPr>
-              <w:t xml:space="preserve">3</w:t>
+              <w:t xml:space="preserve">4</w:t>
             </w:r>
           </w:p>
         </w:tc>
@@ -880,7 +880,7 @@
                 <w:szCs w:val="19"/>
                 <w:rtl/>
               </w:rPr>
-              <w:t xml:space="preserve">إزالة كارت نسبة الاستجابة من صفحة تقييمات العملاء</w:t>
+              <w:t xml:space="preserve">تسجيل دورات المحادثة واشتقاقها — أساس شريط فهرسة الثريد</w:t>
             </w:r>
           </w:p>
         </w:tc>
@@ -911,7 +911,7 @@
                 <w:szCs w:val="19"/>
                 <w:rtl/>
               </w:rPr>
-              <w:t xml:space="preserve">تقييمات العملاء</w:t>
+              <w:t xml:space="preserve">صندوق الوارد (طبقة البيانات)</w:t>
             </w:r>
           </w:p>
         </w:tc>
@@ -974,7 +974,7 @@
                 <w:szCs w:val="19"/>
                 <w:rtl/>
               </w:rPr>
-              <w:t xml:space="preserve">2</w:t>
+              <w:t xml:space="preserve">3</w:t>
             </w:r>
           </w:p>
         </w:tc>
@@ -1004,7 +1004,7 @@
                 <w:szCs w:val="19"/>
                 <w:rtl/>
               </w:rPr>
-              <w:t xml:space="preserve">9 سبتمبر 2026</w:t>
+              <w:t xml:space="preserve">10 سبتمبر 2026</w:t>
             </w:r>
           </w:p>
         </w:tc>
@@ -1034,7 +1034,7 @@
                 <w:szCs w:val="19"/>
                 <w:rtl/>
               </w:rPr>
-              <w:t xml:space="preserve">تغيير تسمية زر الترقية في صفحة الفوترة</w:t>
+              <w:t xml:space="preserve">إزالة كارت نسبة الاستجابة من صفحة تقييمات العملاء</w:t>
             </w:r>
           </w:p>
         </w:tc>
@@ -1064,7 +1064,7 @@
                 <w:szCs w:val="19"/>
                 <w:rtl/>
               </w:rPr>
-              <w:t xml:space="preserve">الفوترة</w:t>
+              <w:t xml:space="preserve">تقييمات العملاء</w:t>
             </w:r>
           </w:p>
         </w:tc>
@@ -1128,7 +1128,7 @@
                 <w:szCs w:val="19"/>
                 <w:rtl/>
               </w:rPr>
-              <w:t xml:space="preserve">1</w:t>
+              <w:t xml:space="preserve">2</w:t>
             </w:r>
           </w:p>
         </w:tc>
@@ -1190,7 +1190,7 @@
                 <w:szCs w:val="19"/>
                 <w:rtl/>
               </w:rPr>
-              <w:t xml:space="preserve">ميزة تغيير الباقة — US-131</w:t>
+              <w:t xml:space="preserve">تغيير تسمية زر الترقية في صفحة الفوترة</w:t>
             </w:r>
           </w:p>
         </w:tc>
@@ -1198,6 +1198,159 @@
           <w:tcPr>
             <w:tcW w:type="dxa" w:w="1500"/>
             <w:shd w:fill="F1F5F9" w:color="auto" w:val="clear"/>
+            <w:tcMar>
+              <w:top w:type="dxa" w:w="90"/>
+              <w:left w:type="dxa" w:w="110"/>
+              <w:bottom w:type="dxa" w:w="90"/>
+              <w:right w:type="dxa" w:w="110"/>
+            </w:tcMar>
+          </w:tcPr>
+          <w:p>
+            <w:pPr>
+              <w:bidi/>
+              <w:spacing w:after="0" w:line="280"/>
+              <w:jc w:val="right"/>
+            </w:pPr>
+            <w:r>
+              <w:rPr>
+                <w:rFonts w:ascii="Arial" w:cs="Arial" w:eastAsia="Arial" w:hAnsi="Arial"/>
+                <w:b w:val="false"/>
+                <w:bCs w:val="false"/>
+                <w:color w:val="1E293B"/>
+                <w:sz w:val="19"/>
+                <w:szCs w:val="19"/>
+                <w:rtl/>
+              </w:rPr>
+              <w:t xml:space="preserve">الفوترة</w:t>
+            </w:r>
+          </w:p>
+        </w:tc>
+        <w:tc>
+          <w:tcPr>
+            <w:tcW w:type="dxa" w:w="1800"/>
+            <w:shd w:fill="ECFDF5" w:color="auto" w:val="clear"/>
+            <w:tcMar>
+              <w:top w:type="dxa" w:w="90"/>
+              <w:left w:type="dxa" w:w="110"/>
+              <w:bottom w:type="dxa" w:w="90"/>
+              <w:right w:type="dxa" w:w="110"/>
+            </w:tcMar>
+          </w:tcPr>
+          <w:p>
+            <w:pPr>
+              <w:bidi/>
+              <w:spacing w:after="0" w:line="280"/>
+              <w:jc w:val="right"/>
+            </w:pPr>
+            <w:r>
+              <w:rPr>
+                <w:rFonts w:ascii="Arial" w:cs="Arial" w:eastAsia="Arial" w:hAnsi="Arial"/>
+                <w:b/>
+                <w:bCs/>
+                <w:color w:val="15803D"/>
+                <w:sz w:val="19"/>
+                <w:szCs w:val="19"/>
+                <w:rtl/>
+              </w:rPr>
+              <w:t xml:space="preserve">منشور على الإنتاج</w:t>
+            </w:r>
+          </w:p>
+        </w:tc>
+      </w:tr>
+      <w:tr>
+        <w:tc>
+          <w:tcPr>
+            <w:tcW w:type="dxa" w:w="600"/>
+            <w:tcMar>
+              <w:top w:type="dxa" w:w="90"/>
+              <w:left w:type="dxa" w:w="110"/>
+              <w:bottom w:type="dxa" w:w="90"/>
+              <w:right w:type="dxa" w:w="110"/>
+            </w:tcMar>
+          </w:tcPr>
+          <w:p>
+            <w:pPr>
+              <w:bidi/>
+              <w:spacing w:after="0" w:line="280"/>
+              <w:jc w:val="right"/>
+            </w:pPr>
+            <w:r>
+              <w:rPr>
+                <w:rFonts w:ascii="Arial" w:cs="Arial" w:eastAsia="Arial" w:hAnsi="Arial"/>
+                <w:b/>
+                <w:bCs/>
+                <w:color w:val="2563EB"/>
+                <w:sz w:val="19"/>
+                <w:szCs w:val="19"/>
+                <w:rtl/>
+              </w:rPr>
+              <w:t xml:space="preserve">1</w:t>
+            </w:r>
+          </w:p>
+        </w:tc>
+        <w:tc>
+          <w:tcPr>
+            <w:tcW w:type="dxa" w:w="1500"/>
+            <w:tcMar>
+              <w:top w:type="dxa" w:w="90"/>
+              <w:left w:type="dxa" w:w="110"/>
+              <w:bottom w:type="dxa" w:w="90"/>
+              <w:right w:type="dxa" w:w="110"/>
+            </w:tcMar>
+          </w:tcPr>
+          <w:p>
+            <w:pPr>
+              <w:bidi/>
+              <w:spacing w:after="0" w:line="280"/>
+              <w:jc w:val="right"/>
+            </w:pPr>
+            <w:r>
+              <w:rPr>
+                <w:rFonts w:ascii="Arial" w:cs="Arial" w:eastAsia="Arial" w:hAnsi="Arial"/>
+                <w:b w:val="false"/>
+                <w:bCs w:val="false"/>
+                <w:color w:val="1E293B"/>
+                <w:sz w:val="19"/>
+                <w:szCs w:val="19"/>
+                <w:rtl/>
+              </w:rPr>
+              <w:t xml:space="preserve">9 سبتمبر 2026</w:t>
+            </w:r>
+          </w:p>
+        </w:tc>
+        <w:tc>
+          <w:tcPr>
+            <w:tcW w:type="dxa" w:w="3600"/>
+            <w:tcMar>
+              <w:top w:type="dxa" w:w="90"/>
+              <w:left w:type="dxa" w:w="110"/>
+              <w:bottom w:type="dxa" w:w="90"/>
+              <w:right w:type="dxa" w:w="110"/>
+            </w:tcMar>
+          </w:tcPr>
+          <w:p>
+            <w:pPr>
+              <w:bidi/>
+              <w:spacing w:after="0" w:line="280"/>
+              <w:jc w:val="right"/>
+            </w:pPr>
+            <w:r>
+              <w:rPr>
+                <w:rFonts w:ascii="Arial" w:cs="Arial" w:eastAsia="Arial" w:hAnsi="Arial"/>
+                <w:b w:val="false"/>
+                <w:bCs w:val="false"/>
+                <w:color w:val="1E293B"/>
+                <w:sz w:val="19"/>
+                <w:szCs w:val="19"/>
+                <w:rtl/>
+              </w:rPr>
+              <w:t xml:space="preserve">ميزة تغيير الباقة — US-131</w:t>
+            </w:r>
+          </w:p>
+        </w:tc>
+        <w:tc>
+          <w:tcPr>
+            <w:tcW w:type="dxa" w:w="1500"/>
             <w:tcMar>
               <w:top w:type="dxa" w:w="90"/>
               <w:left w:type="dxa" w:w="110"/>
@@ -1641,7 +1794,7 @@
                 <w:szCs w:val="20"/>
                 <w:rtl/>
               </w:rPr>
-              <w:t xml:space="preserve">كل التعديلات المرفوعة منشورة على الإنتاج.</w:t>
+              <w:t xml:space="preserve">يوجد 1 تعديل مرفوع على الفرع ولم يُنشر بعد — مبيّن في الجدول أعلاه.</w:t>
             </w:r>
           </w:p>
           <w:p>
@@ -1709,7 +1862,7 @@
           <w:szCs w:val="24"/>
           <w:rtl/>
         </w:rPr>
-        <w:t xml:space="preserve">تعديل رقم 6 — إعادة تصميم شريط الفهرسة على هيئة مسطرة تظهر عند الاقتراب</w:t>
+        <w:t xml:space="preserve">تعديل رقم 7 — انعكاس حالة «مجدولة» للتخفيض المؤجّل في بورتال العميل</w:t>
       </w:r>
     </w:p>
     <w:p>
@@ -1986,7 +2139,7 @@
                 <w:szCs w:val="19"/>
                 <w:rtl/>
               </w:rPr>
-              <w:t xml:space="preserve">صندوق الوارد</w:t>
+              <w:t xml:space="preserve">الباقات والاشتراك</w:t>
             </w:r>
           </w:p>
         </w:tc>
@@ -2016,7 +2169,7 @@
                 <w:szCs w:val="19"/>
                 <w:rtl/>
               </w:rPr>
-              <w:t xml:space="preserve">/inbox</w:t>
+              <w:t xml:space="preserve">/billing</w:t>
             </w:r>
           </w:p>
         </w:tc>
@@ -2046,7 +2199,7 @@
                 <w:szCs w:val="19"/>
                 <w:rtl/>
               </w:rPr>
-              <w:t xml:space="preserve">src/components/inbox/SessionRail.tsx · src/pages/Inbox.tsx</w:t>
+              <w:t xml:space="preserve">src/types/index.ts · src/pages/Billing.tsx · src/store/adminMockData.ts</w:t>
             </w:r>
           </w:p>
         </w:tc>
@@ -2076,38 +2229,38 @@
                 <w:szCs w:val="19"/>
                 <w:rtl/>
               </w:rPr>
-              <w:t xml:space="preserve">4163939</w:t>
+              <w:t xml:space="preserve">—</w:t>
             </w:r>
           </w:p>
         </w:tc>
         <w:tc>
           <w:tcPr>
             <w:tcW w:type="dxa" w:w="1500"/>
-            <w:shd w:fill="ECFDF5" w:color="auto" w:val="clear"/>
-            <w:tcMar>
-              <w:top w:type="dxa" w:w="90"/>
-              <w:left w:type="dxa" w:w="110"/>
-              <w:bottom w:type="dxa" w:w="90"/>
-              <w:right w:type="dxa" w:w="110"/>
-            </w:tcMar>
-          </w:tcPr>
-          <w:p>
-            <w:pPr>
-              <w:bidi/>
-              <w:spacing w:after="0" w:line="280"/>
-              <w:jc w:val="right"/>
-            </w:pPr>
-            <w:r>
-              <w:rPr>
-                <w:rFonts w:ascii="Arial" w:cs="Arial" w:eastAsia="Arial" w:hAnsi="Arial"/>
-                <w:b/>
-                <w:bCs/>
-                <w:color w:val="15803D"/>
-                <w:sz w:val="19"/>
-                <w:szCs w:val="19"/>
-                <w:rtl/>
-              </w:rPr>
-              <w:t xml:space="preserve">منشور على الإنتاج</w:t>
+            <w:shd w:fill="FFFBEB" w:color="auto" w:val="clear"/>
+            <w:tcMar>
+              <w:top w:type="dxa" w:w="90"/>
+              <w:left w:type="dxa" w:w="110"/>
+              <w:bottom w:type="dxa" w:w="90"/>
+              <w:right w:type="dxa" w:w="110"/>
+            </w:tcMar>
+          </w:tcPr>
+          <w:p>
+            <w:pPr>
+              <w:bidi/>
+              <w:spacing w:after="0" w:line="280"/>
+              <w:jc w:val="right"/>
+            </w:pPr>
+            <w:r>
+              <w:rPr>
+                <w:rFonts w:ascii="Arial" w:cs="Arial" w:eastAsia="Arial" w:hAnsi="Arial"/>
+                <w:b/>
+                <w:bCs/>
+                <w:color w:val="B45309"/>
+                <w:sz w:val="19"/>
+                <w:szCs w:val="19"/>
+                <w:rtl/>
+              </w:rPr>
+              <w:t xml:space="preserve">مرفوع — غير منشور</w:t>
             </w:r>
           </w:p>
         </w:tc>
@@ -2137,7 +2290,7 @@
           <w:szCs w:val="21"/>
           <w:rtl/>
         </w:rPr>
-        <w:t xml:space="preserve">الشكل السابق كان كتلاً سميكة بينها فجوات، فكان يُقرأ كشريط تقدّم مكسور لا كأداة تنقّل. صار الآن مسطرة: خطّ شعري على حافة الثريد وعليه علامات رفيعة عند بدايات الدورات.</w:t>
+        <w:t xml:space="preserve">الاشتراك الذي عليه تخفيض مؤجّل إلى تاريخ لاحق صارت حالته «مجدولة» ظاهرة للعميل، لا في بورتال الإدارة وحده.</w:t>
       </w:r>
     </w:p>
     <w:p>
@@ -2159,7 +2312,7 @@
           <w:szCs w:val="21"/>
           <w:rtl/>
         </w:rPr>
-        <w:t xml:space="preserve">العلامات مجمّعة في منتصف ارتفاع الحافة كمجموعة واحدة مرتّبة، لا موزّعة على كامل الطول.</w:t>
+        <w:t xml:space="preserve">أُضيف الحقل scheduledChange إلى الاشتراك ويحمل الباقة المستهدفة ودورة الفوترة وتاريخ السريان، وأُضيفت «مجدولة» إلى حالات الفاتورة.</w:t>
       </w:r>
     </w:p>
     <w:p>
@@ -2181,7 +2334,7 @@
           <w:szCs w:val="21"/>
           <w:rtl/>
         </w:rPr>
-        <w:t xml:space="preserve">جُرّب توزيعها على مواضعها النسبية من ارتفاع التمرير أولاً، ثم استُبدل بالتجميع في المنتصف بقرار من الإدارة: الشكل المرتّب فُضّل على دلالة الموضع. أُزيل معه كود القياس ومراقب تغيّر الحجم لأنه لم يعد له عمل.</w:t>
+        <w:t xml:space="preserve">بطاقة الاشتراك تعرض شارة «مجدولة» وجملة صريحة تذكر اسم الباقة المستهدفة وتاريخ التحويل، وتؤكّد أن الباقة الحالية ومزاياها مستمرة حتى ذلك التاريخ — فلا يظن العميل أن باقته انخفضت الآن.</w:t>
       </w:r>
     </w:p>
     <w:p>
@@ -2203,7 +2356,7 @@
           <w:szCs w:val="21"/>
           <w:rtl/>
         </w:rPr>
-        <w:t xml:space="preserve">المسطرة باهتة في الوضع العادي وتتوضّح بالكامل عند اقتراب المؤشر من الحافة أو عند وصول لوحة المفاتيح إليها.</w:t>
+        <w:t xml:space="preserve">جدول الفواتير وفلاترها ونافذة معاينة الفاتورة تعرض الحالة نفسها.</w:t>
       </w:r>
     </w:p>
     <w:p>
@@ -2225,7 +2378,7 @@
           <w:szCs w:val="21"/>
           <w:rtl/>
         </w:rPr>
-        <w:t xml:space="preserve">أُبقي أثر خافت دائم بدل الإخفاء التام: ميزة لا يدل عليها شيء لا يعرفها أحد، والإخفاء الكامل كان سيجعلها غير قابلة للاكتشاف.</w:t>
+        <w:t xml:space="preserve">الحالة مشتقّة من الاشتراك لا مخزّنة على الفاتورة: إلغاء الجدولة يُزيلها من كل المواضع في آن واحد، بدل أن تبقى فاتورة تحمل حالة قديمة.</w:t>
       </w:r>
     </w:p>
     <w:p>
@@ -2247,7 +2400,7 @@
           <w:szCs w:val="21"/>
           <w:rtl/>
         </w:rPr>
-        <w:t xml:space="preserve">صارت طبقة عائمة (overlay) بدل عمود يحجز عرضاً ثابتاً، فرجع نحو 36 بكسل لمساحة الرسائل.</w:t>
+        <w:t xml:space="preserve">قرار مقصود: الاشتقاق يطال الفواتير غير المسدّدة فقط (معلّقة ومسودة). الفاتورة المدفوعة أو المستردة أو الملغاة أو الفاشلة تحتفظ بحالتها، وكذلك المتأخرة لأن التأخّر مشكلة سداد لا يصح حجبها خلف حالة الجدولة.</w:t>
       </w:r>
     </w:p>
     <w:p>
@@ -2269,7 +2422,7 @@
           <w:szCs w:val="21"/>
           <w:rtl/>
         </w:rPr>
-        <w:t xml:space="preserve">وُضعت بعد شريط التمرير بمقدار 8 بكسل حتى لا تحجب سحبه.</w:t>
+        <w:t xml:space="preserve">زر «إلغاء الجدولة» إجراء إداري بحسب المواصفة، فبورتال العميل يعرض الحالة دون التحكم فيها.</w:t>
       </w:r>
     </w:p>
     <w:p>
@@ -2291,7 +2444,7 @@
           <w:szCs w:val="21"/>
           <w:rtl/>
         </w:rPr>
-        <w:t xml:space="preserve">التمييز بين المؤكَّد والمقدَّر بقي قائماً بصرياً: علامة متصلة للدورة المسجّلة، ومتقطّعة للمستنتَجة، مع بقاء «بداية تقديرية» في التلميح.</w:t>
+        <w:t xml:space="preserve">أُضيفت جدولة تجريبية لعميل العرض (تحويل من الأعمال إلى الاحترافي بعد 15 يوماً) لتصير الحالة قابلة للمعاينة.</w:t>
       </w:r>
     </w:p>
     <w:p>
@@ -2313,51 +2466,7 @@
           <w:szCs w:val="21"/>
           <w:rtl/>
         </w:rPr>
-        <w:t xml:space="preserve">تنازل مقصود: الشكل السابق كان يعبّر عن حجم كل دورة بارتفاعها، والمسطرة لا تفعل. حجم الدورة انتقل إلى التلميح.</w:t>
-      </w:r>
-    </w:p>
-    <w:p>
-      <w:pPr>
-        <w:pStyle w:val="ListParagraph"/>
-        <w:numPr>
-          <w:ilvl w:val="0"/>
-          <w:numId w:val="2"/>
-        </w:numPr>
-        <w:bidi/>
-        <w:spacing w:after="70" w:line="290"/>
-        <w:jc w:val="right"/>
-      </w:pPr>
-      <w:r>
-        <w:rPr>
-          <w:rFonts w:ascii="Arial" w:cs="Arial" w:eastAsia="Arial" w:hAnsi="Arial"/>
-          <w:color w:val="1E293B"/>
-          <w:sz w:val="21"/>
-          <w:szCs w:val="21"/>
-          <w:rtl/>
-        </w:rPr>
-        <w:t xml:space="preserve">مجموعة العلامات تقبل التمرير داخلها إن كثرت الدورات حتى لا تتجاوز ارتفاع اللوحة. ولأن ذلك يقصّ التلميح، رُفع التلميح خارج المجموعة ويُحاذى رأسياً بالعلامة المؤشَّر عليها بالقياس.</w:t>
-      </w:r>
-    </w:p>
-    <w:p>
-      <w:pPr>
-        <w:pStyle w:val="ListParagraph"/>
-        <w:numPr>
-          <w:ilvl w:val="0"/>
-          <w:numId w:val="2"/>
-        </w:numPr>
-        <w:bidi/>
-        <w:spacing w:after="70" w:line="290"/>
-        <w:jc w:val="right"/>
-      </w:pPr>
-      <w:r>
-        <w:rPr>
-          <w:rFonts w:ascii="Arial" w:cs="Arial" w:eastAsia="Arial" w:hAnsi="Arial"/>
-          <w:color w:val="1E293B"/>
-          <w:sz w:val="21"/>
-          <w:szCs w:val="21"/>
-          <w:rtl/>
-        </w:rPr>
-        <w:t xml:space="preserve">عوينت النتيجة في المتصفح: العلامات الثلاث متجمّعة في المنتصف، والتوضّح بالاقتراب والتلميح والانتقال تعمل.</w:t>
+        <w:t xml:space="preserve">عوينت النتيجة في المتصفح: الشارة والجملة والفلتر وحالتا الفاتورتين غير المسدّدتين ظهرت، والفاتورتان المدفوعتان بقيتا «مدفوعة».</w:t>
       </w:r>
     </w:p>
     <w:p>
@@ -2382,7 +2491,7 @@
           <w:szCs w:val="24"/>
           <w:rtl/>
         </w:rPr>
-        <w:t xml:space="preserve">تعديل رقم 5 — شريط فهرسة دورات المحادثة داخل الثريد</w:t>
+        <w:t xml:space="preserve">تعديل رقم 6 — إعادة تصميم شريط الفهرسة على هيئة مسطرة تظهر عند الاقتراب</w:t>
       </w:r>
     </w:p>
     <w:p>
@@ -2719,7 +2828,7 @@
                 <w:szCs w:val="19"/>
                 <w:rtl/>
               </w:rPr>
-              <w:t xml:space="preserve">src/components/inbox/SessionRail.tsx · src/pages/Inbox.tsx · src/store/mockData.ts</w:t>
+              <w:t xml:space="preserve">src/components/inbox/SessionRail.tsx · src/pages/Inbox.tsx</w:t>
             </w:r>
           </w:p>
         </w:tc>
@@ -2749,7 +2858,7 @@
                 <w:szCs w:val="19"/>
                 <w:rtl/>
               </w:rPr>
-              <w:t xml:space="preserve">e05e715</w:t>
+              <w:t xml:space="preserve">4163939</w:t>
             </w:r>
           </w:p>
         </w:tc>
@@ -2810,7 +2919,7 @@
           <w:szCs w:val="21"/>
           <w:rtl/>
         </w:rPr>
-        <w:t xml:space="preserve">شريط رأسي على حافة الثريد يقسّمه إلى دورات فتح وإغلاق، ليصل الموظف إلى بداية أي دورة في المحادثات الطويلة التي تُعاد فتحها مراراً.</w:t>
+        <w:t xml:space="preserve">الشكل السابق كان كتلاً سميكة بينها فجوات، فكان يُقرأ كشريط تقدّم مكسور لا كأداة تنقّل. صار الآن مسطرة: خطّ شعري على حافة الثريد وعليه علامات رفيعة عند بدايات الدورات.</w:t>
       </w:r>
     </w:p>
     <w:p>
@@ -2832,7 +2941,7 @@
           <w:szCs w:val="21"/>
           <w:rtl/>
         </w:rPr>
-        <w:t xml:space="preserve">ارتفاع كل مقطع يتناسب مع عدد رسائله، فيعطي إحساساً بحجم كل دورة قبل الدخول إليها.</w:t>
+        <w:t xml:space="preserve">العلامات مجمّعة في منتصف ارتفاع الحافة كمجموعة واحدة مرتّبة، لا موزّعة على كامل الطول.</w:t>
       </w:r>
     </w:p>
     <w:p>
@@ -2854,7 +2963,7 @@
           <w:szCs w:val="21"/>
           <w:rtl/>
         </w:rPr>
-        <w:t xml:space="preserve">المرور على المقطع يُظهر اليوم والتاريخ وعدد الرسائل — «اليوم» و«أمس» لما قرُب، واسم اليوم لما بعُد.</w:t>
+        <w:t xml:space="preserve">جُرّب توزيعها على مواضعها النسبية من ارتفاع التمرير أولاً، ثم استُبدل بالتجميع في المنتصف بقرار من الإدارة: الشكل المرتّب فُضّل على دلالة الموضع. أُزيل معه كود القياس ومراقب تغيّر الحجم لأنه لم يعد له عمل.</w:t>
       </w:r>
     </w:p>
     <w:p>
@@ -2876,7 +2985,7 @@
           <w:szCs w:val="21"/>
           <w:rtl/>
         </w:rPr>
-        <w:t xml:space="preserve">الضغط ينقل إلى أول رسالة في الدورة، والمقطع الذي يقابل موضع القراءة الحالي يُبرَز تلقائياً أثناء التمرير.</w:t>
+        <w:t xml:space="preserve">المسطرة باهتة في الوضع العادي وتتوضّح بالكامل عند اقتراب المؤشر من الحافة أو عند وصول لوحة المفاتيح إليها.</w:t>
       </w:r>
     </w:p>
     <w:p>
@@ -2898,7 +3007,7 @@
           <w:szCs w:val="21"/>
           <w:rtl/>
         </w:rPr>
-        <w:t xml:space="preserve">المقاطع ذات البداية المستنتجة تُعرض بحدّ متقطّع ويذكر التلميح «بداية تقديرية»، فيبقى الفرق بين المؤكَّد والمقدَّر ظاهراً للموظف لا مخفياً عنه.</w:t>
+        <w:t xml:space="preserve">أُبقي أثر خافت دائم بدل الإخفاء التام: ميزة لا يدل عليها شيء لا يعرفها أحد، والإخفاء الكامل كان سيجعلها غير قابلة للاكتشاف.</w:t>
       </w:r>
     </w:p>
     <w:p>
@@ -2920,7 +3029,7 @@
           <w:szCs w:val="21"/>
           <w:rtl/>
         </w:rPr>
-        <w:t xml:space="preserve">الشريط يختفي كلياً حين تكون المحادثة دورة واحدة، فلا معنى لفهرس لا يفهرس شيئاً.</w:t>
+        <w:t xml:space="preserve">صارت طبقة عائمة (overlay) بدل عمود يحجز عرضاً ثابتاً، فرجع نحو 36 بكسل لمساحة الرسائل.</w:t>
       </w:r>
     </w:p>
     <w:p>
@@ -2942,7 +3051,7 @@
           <w:szCs w:val="21"/>
           <w:rtl/>
         </w:rPr>
-        <w:t xml:space="preserve">الدورات الخالية من الرسائل مستبعدة من الشريط بقرار مقصود — لا شيء يمكن الانتقال إليه فيها.</w:t>
+        <w:t xml:space="preserve">وُضعت بعد شريط التمرير بمقدار 8 بكسل حتى لا تحجب سحبه.</w:t>
       </w:r>
     </w:p>
     <w:p>
@@ -2964,7 +3073,7 @@
           <w:szCs w:val="21"/>
           <w:rtl/>
         </w:rPr>
-        <w:t xml:space="preserve">وُزّعت رسائل محادثة أحمد الشعيلي التجريبية على ثلاث دورات عبر ثلاثة أشهر لتصير الميزة قابلة للمعاينة، وصار sessionCount فيها مطابقاً للواقع بعد أن كان رقماً مكتوباً بلا سند. آخر دورة مسجّلة بحدث حقيقي وما قبلها مستنتج، ليظهر الشكلان معاً.</w:t>
+        <w:t xml:space="preserve">التمييز بين المؤكَّد والمقدَّر بقي قائماً بصرياً: علامة متصلة للدورة المسجّلة، ومتقطّعة للمستنتَجة، مع بقاء «بداية تقديرية» في التلميح.</w:t>
       </w:r>
     </w:p>
     <w:p>
@@ -2986,7 +3095,51 @@
           <w:szCs w:val="21"/>
           <w:rtl/>
         </w:rPr>
-        <w:t xml:space="preserve">عوينت النتيجة في المتصفح: الشريط والتلميح والانتقال والإبراز تعمل في الوضعين الفاتح والليلي، والمحادثات أحادية الدورة سليمة بلا شريط.</w:t>
+        <w:t xml:space="preserve">تنازل مقصود: الشكل السابق كان يعبّر عن حجم كل دورة بارتفاعها، والمسطرة لا تفعل. حجم الدورة انتقل إلى التلميح.</w:t>
+      </w:r>
+    </w:p>
+    <w:p>
+      <w:pPr>
+        <w:pStyle w:val="ListParagraph"/>
+        <w:numPr>
+          <w:ilvl w:val="0"/>
+          <w:numId w:val="2"/>
+        </w:numPr>
+        <w:bidi/>
+        <w:spacing w:after="70" w:line="290"/>
+        <w:jc w:val="right"/>
+      </w:pPr>
+      <w:r>
+        <w:rPr>
+          <w:rFonts w:ascii="Arial" w:cs="Arial" w:eastAsia="Arial" w:hAnsi="Arial"/>
+          <w:color w:val="1E293B"/>
+          <w:sz w:val="21"/>
+          <w:szCs w:val="21"/>
+          <w:rtl/>
+        </w:rPr>
+        <w:t xml:space="preserve">مجموعة العلامات تقبل التمرير داخلها إن كثرت الدورات حتى لا تتجاوز ارتفاع اللوحة. ولأن ذلك يقصّ التلميح، رُفع التلميح خارج المجموعة ويُحاذى رأسياً بالعلامة المؤشَّر عليها بالقياس.</w:t>
+      </w:r>
+    </w:p>
+    <w:p>
+      <w:pPr>
+        <w:pStyle w:val="ListParagraph"/>
+        <w:numPr>
+          <w:ilvl w:val="0"/>
+          <w:numId w:val="2"/>
+        </w:numPr>
+        <w:bidi/>
+        <w:spacing w:after="70" w:line="290"/>
+        <w:jc w:val="right"/>
+      </w:pPr>
+      <w:r>
+        <w:rPr>
+          <w:rFonts w:ascii="Arial" w:cs="Arial" w:eastAsia="Arial" w:hAnsi="Arial"/>
+          <w:color w:val="1E293B"/>
+          <w:sz w:val="21"/>
+          <w:szCs w:val="21"/>
+          <w:rtl/>
+        </w:rPr>
+        <w:t xml:space="preserve">عوينت النتيجة في المتصفح: العلامات الثلاث متجمّعة في المنتصف، والتوضّح بالاقتراب والتلميح والانتقال تعمل.</w:t>
       </w:r>
     </w:p>
     <w:p>
@@ -3011,7 +3164,7 @@
           <w:szCs w:val="24"/>
           <w:rtl/>
         </w:rPr>
-        <w:t xml:space="preserve">تعديل رقم 4 — تسجيل دورات المحادثة واشتقاقها — أساس شريط فهرسة الثريد</w:t>
+        <w:t xml:space="preserve">تعديل رقم 5 — شريط فهرسة دورات المحادثة داخل الثريد</w:t>
       </w:r>
     </w:p>
     <w:p>
@@ -3288,7 +3441,7 @@
                 <w:szCs w:val="19"/>
                 <w:rtl/>
               </w:rPr>
-              <w:t xml:space="preserve">صندوق الوارد (طبقة البيانات)</w:t>
+              <w:t xml:space="preserve">صندوق الوارد</w:t>
             </w:r>
           </w:p>
         </w:tc>
@@ -3348,7 +3501,7 @@
                 <w:szCs w:val="19"/>
                 <w:rtl/>
               </w:rPr>
-              <w:t xml:space="preserve">src/utils/sessions.ts · src/store/useDataStore.ts · src/types/index.ts</w:t>
+              <w:t xml:space="preserve">src/components/inbox/SessionRail.tsx · src/pages/Inbox.tsx · src/store/mockData.ts</w:t>
             </w:r>
           </w:p>
         </w:tc>
@@ -3378,7 +3531,7 @@
                 <w:szCs w:val="19"/>
                 <w:rtl/>
               </w:rPr>
-              <w:t xml:space="preserve">5cf29e1</w:t>
+              <w:t xml:space="preserve">e05e715</w:t>
             </w:r>
           </w:p>
         </w:tc>
@@ -3439,7 +3592,7 @@
           <w:szCs w:val="21"/>
           <w:rtl/>
         </w:rPr>
-        <w:t xml:space="preserve">المشكلة: المحادثة الواحدة تُعاد فتحها كلما راسل العميل بعد الإغلاق، فيصير الثريد بلا نهاية. ولرسم شريط فهرسة يقسّمه إلى دورات، لزم معرفة توقيت كل فتح وإغلاق — وهي بيانات لم تكن تُسجَّل إطلاقاً.</w:t>
+        <w:t xml:space="preserve">شريط رأسي على حافة الثريد يقسّمه إلى دورات فتح وإغلاق، ليصل الموظف إلى بداية أي دورة في المحادثات الطويلة التي تُعاد فتحها مراراً.</w:t>
       </w:r>
     </w:p>
     <w:p>
@@ -3461,7 +3614,7 @@
           <w:szCs w:val="21"/>
           <w:rtl/>
         </w:rPr>
-        <w:t xml:space="preserve">كان الحقل sessionCount يُكتب مرة واحدة عند الإنشاء ولا يزيده أي سطر في المشروع، وقيمه في البيانات التجريبية مكتوبة يدوياً. كذلك activityLog على المحادثة كان مُعرَّفاً في الأنواع لكن لا دالة تكتب فيه وقت التشغيل.</w:t>
+        <w:t xml:space="preserve">ارتفاع كل مقطع يتناسب مع عدد رسائله، فيعطي إحساساً بحجم كل دورة قبل الدخول إليها.</w:t>
       </w:r>
     </w:p>
     <w:p>
@@ -3483,7 +3636,7 @@
           <w:szCs w:val="21"/>
           <w:rtl/>
         </w:rPr>
-        <w:t xml:space="preserve">أُضيف النوع SessionEvent لتسجيل حدث فتح أو إغلاق بتوقيته وصاحبه، والنوع ConversationSession يمثّل الدورة المشتقّة.</w:t>
+        <w:t xml:space="preserve">المرور على المقطع يُظهر اليوم والتاريخ وعدد الرسائل — «اليوم» و«أمس» لما قرُب، واسم اليوم لما بعُد.</w:t>
       </w:r>
     </w:p>
     <w:p>
@@ -3505,7 +3658,7 @@
           <w:szCs w:val="21"/>
           <w:rtl/>
         </w:rPr>
-        <w:t xml:space="preserve">صارت أربعة مواضع تسجّل الحدث فعلياً: setConversationStatus عند الإغلاق أو إعادة الفتح، reopenConversation، ورسالة العميل الواردة نصية أو صوتية حين تُحيي محادثة مغلقة — وهذا آخرها كان يمرّ بلا أي أثر رغم أنه أكثرها تكراراً.</w:t>
+        <w:t xml:space="preserve">الضغط ينقل إلى أول رسالة في الدورة، والمقطع الذي يقابل موضع القراءة الحالي يُبرَز تلقائياً أثناء التمرير.</w:t>
       </w:r>
     </w:p>
     <w:p>
@@ -3527,7 +3680,7 @@
           <w:szCs w:val="21"/>
           <w:rtl/>
         </w:rPr>
-        <w:t xml:space="preserve">أُضيفت الدالة deriveSessions التي تقسّم الثريد إلى دورات: الأحداث المسجّلة مرجع قاطع، وما سبقها من تاريخ قديم تُستنتج حدوده من فجوات الصمت (24 ساعة افتراضاً) وتُعلَّم inferred حتى يظل الفرق بين المؤكَّد والمقدَّر ظاهراً.</w:t>
+        <w:t xml:space="preserve">المقاطع ذات البداية المستنتجة تُعرض بحدّ متقطّع ويذكر التلميح «بداية تقديرية»، فيبقى الفرق بين المؤكَّد والمقدَّر ظاهراً للموظف لا مخفياً عنه.</w:t>
       </w:r>
     </w:p>
     <w:p>
@@ -3549,7 +3702,7 @@
           <w:szCs w:val="21"/>
           <w:rtl/>
         </w:rPr>
-        <w:t xml:space="preserve">الدالة تتعامل مع الحالة المختلطة: ثريد فيه تاريخ قديم مُستنتج ودورات جديدة مسجّلة في آن واحد.</w:t>
+        <w:t xml:space="preserve">الشريط يختفي كلياً حين تكون المحادثة دورة واحدة، فلا معنى لفهرس لا يفهرس شيئاً.</w:t>
       </w:r>
     </w:p>
     <w:p>
@@ -3571,7 +3724,7 @@
           <w:szCs w:val="21"/>
           <w:rtl/>
         </w:rPr>
-        <w:t xml:space="preserve">اختُبر المنطق على ثماني حالات شملت الثريد الفارغ والرسالة الواحدة والفجوات المتعددة والأحداث المسجّلة والحالة المختلطة والمدخلات غير المرتّبة زمنياً — جميعها نجحت.</w:t>
+        <w:t xml:space="preserve">الدورات الخالية من الرسائل مستبعدة من الشريط بقرار مقصود — لا شيء يمكن الانتقال إليه فيها.</w:t>
       </w:r>
     </w:p>
     <w:p>
@@ -3593,7 +3746,7 @@
           <w:szCs w:val="21"/>
           <w:rtl/>
         </w:rPr>
-        <w:t xml:space="preserve">ملاحظة على البيانات الحالية: كل المحادثات التجريبية تُنتج دورة واحدة لأن رسائلها متقاربة بدقائق ولا فجوات فيها. الشريط لن يُظهر تقسيماً حقيقياً قبل توفّر بيانات متباعدة زمنياً.</w:t>
+        <w:t xml:space="preserve">وُزّعت رسائل محادثة أحمد الشعيلي التجريبية على ثلاث دورات عبر ثلاثة أشهر لتصير الميزة قابلة للمعاينة، وصار sessionCount فيها مطابقاً للواقع بعد أن كان رقماً مكتوباً بلا سند. آخر دورة مسجّلة بحدث حقيقي وما قبلها مستنتج، ليظهر الشكلان معاً.</w:t>
       </w:r>
     </w:p>
     <w:p>
@@ -3615,7 +3768,7 @@
           <w:szCs w:val="21"/>
           <w:rtl/>
         </w:rPr>
-        <w:t xml:space="preserve">لم تُبنَ واجهة الشريط بعد — هذا التعديل يغطّي طبقة البيانات وحدها.</w:t>
+        <w:t xml:space="preserve">عوينت النتيجة في المتصفح: الشريط والتلميح والانتقال والإبراز تعمل في الوضعين الفاتح والليلي، والمحادثات أحادية الدورة سليمة بلا شريط.</w:t>
       </w:r>
     </w:p>
     <w:p>
@@ -3640,7 +3793,7 @@
           <w:szCs w:val="24"/>
           <w:rtl/>
         </w:rPr>
-        <w:t xml:space="preserve">تعديل رقم 3 — إزالة كارت نسبة الاستجابة من صفحة تقييمات العملاء</w:t>
+        <w:t xml:space="preserve">تعديل رقم 4 — تسجيل دورات المحادثة واشتقاقها — أساس شريط فهرسة الثريد</w:t>
       </w:r>
     </w:p>
     <w:p>
@@ -3917,7 +4070,7 @@
                 <w:szCs w:val="19"/>
                 <w:rtl/>
               </w:rPr>
-              <w:t xml:space="preserve">تقييمات العملاء</w:t>
+              <w:t xml:space="preserve">صندوق الوارد (طبقة البيانات)</w:t>
             </w:r>
           </w:p>
         </w:tc>
@@ -3947,7 +4100,7 @@
                 <w:szCs w:val="19"/>
                 <w:rtl/>
               </w:rPr>
-              <w:t xml:space="preserve">/rating</w:t>
+              <w:t xml:space="preserve">/inbox</w:t>
             </w:r>
           </w:p>
         </w:tc>
@@ -3977,7 +4130,7 @@
                 <w:szCs w:val="19"/>
                 <w:rtl/>
               </w:rPr>
-              <w:t xml:space="preserve">src/pages/CustomerRatings.tsx</w:t>
+              <w:t xml:space="preserve">src/utils/sessions.ts · src/store/useDataStore.ts · src/types/index.ts</w:t>
             </w:r>
           </w:p>
         </w:tc>
@@ -4007,7 +4160,7 @@
                 <w:szCs w:val="19"/>
                 <w:rtl/>
               </w:rPr>
-              <w:t xml:space="preserve">cc8bd4f</w:t>
+              <w:t xml:space="preserve">5cf29e1</w:t>
             </w:r>
           </w:p>
         </w:tc>
@@ -4068,7 +4221,7 @@
           <w:szCs w:val="21"/>
           <w:rtl/>
         </w:rPr>
-        <w:t xml:space="preserve">حُذف كارت «نسبة الاستجابة» بالكامل من شريط الإحصائيات — صارت 3 كروت بدل 4.</w:t>
+        <w:t xml:space="preserve">المشكلة: المحادثة الواحدة تُعاد فتحها كلما راسل العميل بعد الإغلاق، فيصير الثريد بلا نهاية. ولرسم شريط فهرسة يقسّمه إلى دورات، لزم معرفة توقيت كل فتح وإغلاق — وهي بيانات لم تكن تُسجَّل إطلاقاً.</w:t>
       </w:r>
     </w:p>
     <w:p>
@@ -4090,7 +4243,7 @@
           <w:szCs w:val="21"/>
           <w:rtl/>
         </w:rPr>
-        <w:t xml:space="preserve">حُذف معه حساب responseRate لأنه لم يعد له مستهلك في الصفحة.</w:t>
+        <w:t xml:space="preserve">كان الحقل sessionCount يُكتب مرة واحدة عند الإنشاء ولا يزيده أي سطر في المشروع، وقيمه في البيانات التجريبية مكتوبة يدوياً. كذلك activityLog على المحادثة كان مُعرَّفاً في الأنواع لكن لا دالة تكتب فيه وقت التشغيل.</w:t>
       </w:r>
     </w:p>
     <w:p>
@@ -4112,7 +4265,7 @@
           <w:szCs w:val="21"/>
           <w:rtl/>
         </w:rPr>
-        <w:t xml:space="preserve">حُذف استيراد أيقونة TrendingUp لأنها كانت مستخدمة في هذا الكارت وحده.</w:t>
+        <w:t xml:space="preserve">أُضيف النوع SessionEvent لتسجيل حدث فتح أو إغلاق بتوقيته وصاحبه، والنوع ConversationSession يمثّل الدورة المشتقّة.</w:t>
       </w:r>
     </w:p>
     <w:p>
@@ -4134,7 +4287,7 @@
           <w:szCs w:val="21"/>
           <w:rtl/>
         </w:rPr>
-        <w:t xml:space="preserve">عُدّلت شبكة العرض من grid-cols-2 lg:grid-cols-4 إلى grid-cols-1 sm:grid-cols-3، حتى لا يبقى كارت يتيم في سطر منفصل على الشاشات الصغيرة.</w:t>
+        <w:t xml:space="preserve">صارت أربعة مواضع تسجّل الحدث فعلياً: setConversationStatus عند الإغلاق أو إعادة الفتح، reopenConversation، ورسالة العميل الواردة نصية أو صوتية حين تُحيي محادثة مغلقة — وهذا آخرها كان يمرّ بلا أي أثر رغم أنه أكثرها تكراراً.</w:t>
       </w:r>
     </w:p>
     <w:p>
@@ -4156,7 +4309,95 @@
           <w:szCs w:val="21"/>
           <w:rtl/>
         </w:rPr>
-        <w:t xml:space="preserve">الكروت الباقية: متوسط تقييم المحادثة، متوسط تقييم الموظفين، إجمالي الروابط.</w:t>
+        <w:t xml:space="preserve">أُضيفت الدالة deriveSessions التي تقسّم الثريد إلى دورات: الأحداث المسجّلة مرجع قاطع، وما سبقها من تاريخ قديم تُستنتج حدوده من فجوات الصمت (24 ساعة افتراضاً) وتُعلَّم inferred حتى يظل الفرق بين المؤكَّد والمقدَّر ظاهراً.</w:t>
+      </w:r>
+    </w:p>
+    <w:p>
+      <w:pPr>
+        <w:pStyle w:val="ListParagraph"/>
+        <w:numPr>
+          <w:ilvl w:val="0"/>
+          <w:numId w:val="2"/>
+        </w:numPr>
+        <w:bidi/>
+        <w:spacing w:after="70" w:line="290"/>
+        <w:jc w:val="right"/>
+      </w:pPr>
+      <w:r>
+        <w:rPr>
+          <w:rFonts w:ascii="Arial" w:cs="Arial" w:eastAsia="Arial" w:hAnsi="Arial"/>
+          <w:color w:val="1E293B"/>
+          <w:sz w:val="21"/>
+          <w:szCs w:val="21"/>
+          <w:rtl/>
+        </w:rPr>
+        <w:t xml:space="preserve">الدالة تتعامل مع الحالة المختلطة: ثريد فيه تاريخ قديم مُستنتج ودورات جديدة مسجّلة في آن واحد.</w:t>
+      </w:r>
+    </w:p>
+    <w:p>
+      <w:pPr>
+        <w:pStyle w:val="ListParagraph"/>
+        <w:numPr>
+          <w:ilvl w:val="0"/>
+          <w:numId w:val="2"/>
+        </w:numPr>
+        <w:bidi/>
+        <w:spacing w:after="70" w:line="290"/>
+        <w:jc w:val="right"/>
+      </w:pPr>
+      <w:r>
+        <w:rPr>
+          <w:rFonts w:ascii="Arial" w:cs="Arial" w:eastAsia="Arial" w:hAnsi="Arial"/>
+          <w:color w:val="1E293B"/>
+          <w:sz w:val="21"/>
+          <w:szCs w:val="21"/>
+          <w:rtl/>
+        </w:rPr>
+        <w:t xml:space="preserve">اختُبر المنطق على ثماني حالات شملت الثريد الفارغ والرسالة الواحدة والفجوات المتعددة والأحداث المسجّلة والحالة المختلطة والمدخلات غير المرتّبة زمنياً — جميعها نجحت.</w:t>
+      </w:r>
+    </w:p>
+    <w:p>
+      <w:pPr>
+        <w:pStyle w:val="ListParagraph"/>
+        <w:numPr>
+          <w:ilvl w:val="0"/>
+          <w:numId w:val="2"/>
+        </w:numPr>
+        <w:bidi/>
+        <w:spacing w:after="70" w:line="290"/>
+        <w:jc w:val="right"/>
+      </w:pPr>
+      <w:r>
+        <w:rPr>
+          <w:rFonts w:ascii="Arial" w:cs="Arial" w:eastAsia="Arial" w:hAnsi="Arial"/>
+          <w:color w:val="1E293B"/>
+          <w:sz w:val="21"/>
+          <w:szCs w:val="21"/>
+          <w:rtl/>
+        </w:rPr>
+        <w:t xml:space="preserve">ملاحظة على البيانات الحالية: كل المحادثات التجريبية تُنتج دورة واحدة لأن رسائلها متقاربة بدقائق ولا فجوات فيها. الشريط لن يُظهر تقسيماً حقيقياً قبل توفّر بيانات متباعدة زمنياً.</w:t>
+      </w:r>
+    </w:p>
+    <w:p>
+      <w:pPr>
+        <w:pStyle w:val="ListParagraph"/>
+        <w:numPr>
+          <w:ilvl w:val="0"/>
+          <w:numId w:val="2"/>
+        </w:numPr>
+        <w:bidi/>
+        <w:spacing w:after="70" w:line="290"/>
+        <w:jc w:val="right"/>
+      </w:pPr>
+      <w:r>
+        <w:rPr>
+          <w:rFonts w:ascii="Arial" w:cs="Arial" w:eastAsia="Arial" w:hAnsi="Arial"/>
+          <w:color w:val="1E293B"/>
+          <w:sz w:val="21"/>
+          <w:szCs w:val="21"/>
+          <w:rtl/>
+        </w:rPr>
+        <w:t xml:space="preserve">لم تُبنَ واجهة الشريط بعد — هذا التعديل يغطّي طبقة البيانات وحدها.</w:t>
       </w:r>
     </w:p>
     <w:p>
@@ -4181,7 +4422,7 @@
           <w:szCs w:val="24"/>
           <w:rtl/>
         </w:rPr>
-        <w:t xml:space="preserve">تعديل رقم 2 — تغيير تسمية زر الترقية في صفحة الفوترة</w:t>
+        <w:t xml:space="preserve">تعديل رقم 3 — إزالة كارت نسبة الاستجابة من صفحة تقييمات العملاء</w:t>
       </w:r>
     </w:p>
     <w:p>
@@ -4428,7 +4669,7 @@
                 <w:szCs w:val="19"/>
                 <w:rtl/>
               </w:rPr>
-              <w:t xml:space="preserve">9 سبتمبر 2026</w:t>
+              <w:t xml:space="preserve">10 سبتمبر 2026</w:t>
             </w:r>
           </w:p>
         </w:tc>
@@ -4458,7 +4699,7 @@
                 <w:szCs w:val="19"/>
                 <w:rtl/>
               </w:rPr>
-              <w:t xml:space="preserve">الفوترة</w:t>
+              <w:t xml:space="preserve">تقييمات العملاء</w:t>
             </w:r>
           </w:p>
         </w:tc>
@@ -4488,7 +4729,7 @@
                 <w:szCs w:val="19"/>
                 <w:rtl/>
               </w:rPr>
-              <w:t xml:space="preserve">/billing</w:t>
+              <w:t xml:space="preserve">/rating</w:t>
             </w:r>
           </w:p>
         </w:tc>
@@ -4518,7 +4759,7 @@
                 <w:szCs w:val="19"/>
                 <w:rtl/>
               </w:rPr>
-              <w:t xml:space="preserve">src/pages/Billing.tsx</w:t>
+              <w:t xml:space="preserve">src/pages/CustomerRatings.tsx</w:t>
             </w:r>
           </w:p>
         </w:tc>
@@ -4548,7 +4789,7 @@
                 <w:szCs w:val="19"/>
                 <w:rtl/>
               </w:rPr>
-              <w:t xml:space="preserve">be5b3c0</w:t>
+              <w:t xml:space="preserve">cc8bd4f</w:t>
             </w:r>
           </w:p>
         </w:tc>
@@ -4609,7 +4850,7 @@
           <w:szCs w:val="21"/>
           <w:rtl/>
         </w:rPr>
-        <w:t xml:space="preserve">زر «ترقية» أصبح «تغيير الباقة».</w:t>
+        <w:t xml:space="preserve">حُذف كارت «نسبة الاستجابة» بالكامل من شريط الإحصائيات — صارت 3 كروت بدل 4.</w:t>
       </w:r>
     </w:p>
     <w:p>
@@ -4631,7 +4872,73 @@
           <w:szCs w:val="21"/>
           <w:rtl/>
         </w:rPr>
-        <w:t xml:space="preserve">سبب التغيير: الزر يوصّل إلى مسار يشمل الترقية والتخفيض معاً، فالتسمية القديمة كانت تصف نصف وظيفته.</w:t>
+        <w:t xml:space="preserve">حُذف معه حساب responseRate لأنه لم يعد له مستهلك في الصفحة.</w:t>
+      </w:r>
+    </w:p>
+    <w:p>
+      <w:pPr>
+        <w:pStyle w:val="ListParagraph"/>
+        <w:numPr>
+          <w:ilvl w:val="0"/>
+          <w:numId w:val="2"/>
+        </w:numPr>
+        <w:bidi/>
+        <w:spacing w:after="70" w:line="290"/>
+        <w:jc w:val="right"/>
+      </w:pPr>
+      <w:r>
+        <w:rPr>
+          <w:rFonts w:ascii="Arial" w:cs="Arial" w:eastAsia="Arial" w:hAnsi="Arial"/>
+          <w:color w:val="1E293B"/>
+          <w:sz w:val="21"/>
+          <w:szCs w:val="21"/>
+          <w:rtl/>
+        </w:rPr>
+        <w:t xml:space="preserve">حُذف استيراد أيقونة TrendingUp لأنها كانت مستخدمة في هذا الكارت وحده.</w:t>
+      </w:r>
+    </w:p>
+    <w:p>
+      <w:pPr>
+        <w:pStyle w:val="ListParagraph"/>
+        <w:numPr>
+          <w:ilvl w:val="0"/>
+          <w:numId w:val="2"/>
+        </w:numPr>
+        <w:bidi/>
+        <w:spacing w:after="70" w:line="290"/>
+        <w:jc w:val="right"/>
+      </w:pPr>
+      <w:r>
+        <w:rPr>
+          <w:rFonts w:ascii="Arial" w:cs="Arial" w:eastAsia="Arial" w:hAnsi="Arial"/>
+          <w:color w:val="1E293B"/>
+          <w:sz w:val="21"/>
+          <w:szCs w:val="21"/>
+          <w:rtl/>
+        </w:rPr>
+        <w:t xml:space="preserve">عُدّلت شبكة العرض من grid-cols-2 lg:grid-cols-4 إلى grid-cols-1 sm:grid-cols-3، حتى لا يبقى كارت يتيم في سطر منفصل على الشاشات الصغيرة.</w:t>
+      </w:r>
+    </w:p>
+    <w:p>
+      <w:pPr>
+        <w:pStyle w:val="ListParagraph"/>
+        <w:numPr>
+          <w:ilvl w:val="0"/>
+          <w:numId w:val="2"/>
+        </w:numPr>
+        <w:bidi/>
+        <w:spacing w:after="70" w:line="290"/>
+        <w:jc w:val="right"/>
+      </w:pPr>
+      <w:r>
+        <w:rPr>
+          <w:rFonts w:ascii="Arial" w:cs="Arial" w:eastAsia="Arial" w:hAnsi="Arial"/>
+          <w:color w:val="1E293B"/>
+          <w:sz w:val="21"/>
+          <w:szCs w:val="21"/>
+          <w:rtl/>
+        </w:rPr>
+        <w:t xml:space="preserve">الكروت الباقية: متوسط تقييم المحادثة، متوسط تقييم الموظفين، إجمالي الروابط.</w:t>
       </w:r>
     </w:p>
     <w:p>
@@ -4656,7 +4963,7 @@
           <w:szCs w:val="24"/>
           <w:rtl/>
         </w:rPr>
-        <w:t xml:space="preserve">تعديل رقم 1 — ميزة تغيير الباقة — US-131</w:t>
+        <w:t xml:space="preserve">تعديل رقم 2 — تغيير تسمية زر الترقية في صفحة الفوترة</w:t>
       </w:r>
     </w:p>
     <w:p>
@@ -4933,7 +5240,7 @@
                 <w:szCs w:val="19"/>
                 <w:rtl/>
               </w:rPr>
-              <w:t xml:space="preserve">الاشتراك</w:t>
+              <w:t xml:space="preserve">الفوترة</w:t>
             </w:r>
           </w:p>
         </w:tc>
@@ -4963,7 +5270,7 @@
                 <w:szCs w:val="19"/>
                 <w:rtl/>
               </w:rPr>
-              <w:t xml:space="preserve">/subscribe</w:t>
+              <w:t xml:space="preserve">/billing</w:t>
             </w:r>
           </w:p>
         </w:tc>
@@ -4993,7 +5300,7 @@
                 <w:szCs w:val="19"/>
                 <w:rtl/>
               </w:rPr>
-              <w:t xml:space="preserve">src/pages/Subscribe.tsx</w:t>
+              <w:t xml:space="preserve">src/pages/Billing.tsx</w:t>
             </w:r>
           </w:p>
         </w:tc>
@@ -5023,7 +5330,7 @@
                 <w:szCs w:val="19"/>
                 <w:rtl/>
               </w:rPr>
-              <w:t xml:space="preserve">be5b3c0 · c49b797</w:t>
+              <w:t xml:space="preserve">be5b3c0</w:t>
             </w:r>
           </w:p>
         </w:tc>
@@ -5084,7 +5391,7 @@
           <w:szCs w:val="21"/>
           <w:rtl/>
         </w:rPr>
-        <w:t xml:space="preserve">إعادة بناء شبه كاملة للصفحة — 715 سطراً متغيّراً.</w:t>
+        <w:t xml:space="preserve">زر «ترقية» أصبح «تغيير الباقة».</w:t>
       </w:r>
     </w:p>
     <w:p>
@@ -5106,8 +5413,439 @@
           <w:szCs w:val="21"/>
           <w:rtl/>
         </w:rPr>
-        <w:t xml:space="preserve">اختيار الباقة صار بشريط تمرير (slider) حسب عدد المحادثات الشهرية بدل شبكة الكروت. كل باقة نقطة توقف على الشريط، وباقة المؤسسات هي النقطة الأخيرة بعنوان «غير محدود».</w:t>
-      </w:r>
+        <w:t xml:space="preserve">سبب التغيير: الزر يوصّل إلى مسار يشمل الترقية والتخفيض معاً، فالتسمية القديمة كانت تصف نصف وظيفته.</w:t>
+      </w:r>
+    </w:p>
+    <w:p>
+      <w:pPr>
+        <w:spacing w:after="160"/>
+      </w:pPr>
+    </w:p>
+    <w:p>
+      <w:pPr>
+        <w:pStyle w:val="Heading2"/>
+        <w:bidi/>
+        <w:spacing w:after="120" w:before="300"/>
+        <w:jc w:val="right"/>
+      </w:pPr>
+      <w:r>
+        <w:rPr>
+          <w:rFonts w:ascii="Arial" w:cs="Arial" w:eastAsia="Arial" w:hAnsi="Arial"/>
+          <w:b/>
+          <w:bCs/>
+          <w:color w:val="1E293B"/>
+          <w:sz w:val="24"/>
+          <w:szCs w:val="24"/>
+          <w:rtl/>
+        </w:rPr>
+        <w:t xml:space="preserve">تعديل رقم 1 — ميزة تغيير الباقة — US-131</w:t>
+      </w:r>
+    </w:p>
+    <w:p>
+      <w:pPr>
+        <w:spacing w:after="50"/>
+      </w:pPr>
+    </w:p>
+    <w:tbl>
+      <w:tblPr>
+        <w:bidiVisual/>
+        <w:tblW w:type="dxa" w:w="9000"/>
+        <w:tblBorders>
+          <w:top w:val="single" w:color="CBD5E1" w:sz="4"/>
+          <w:left w:val="single" w:color="CBD5E1" w:sz="4"/>
+          <w:bottom w:val="single" w:color="CBD5E1" w:sz="4"/>
+          <w:right w:val="single" w:color="CBD5E1" w:sz="4"/>
+          <w:insideH w:val="single" w:color="CBD5E1" w:sz="4"/>
+          <w:insideV w:val="single" w:color="CBD5E1" w:sz="4"/>
+        </w:tblBorders>
+      </w:tblPr>
+      <w:tblGrid>
+        <w:gridCol w:w="1250"/>
+        <w:gridCol w:w="1250"/>
+        <w:gridCol w:w="1150"/>
+        <w:gridCol w:w="2500"/>
+        <w:gridCol w:w="1350"/>
+        <w:gridCol w:w="1500"/>
+      </w:tblGrid>
+      <w:tr>
+        <w:trPr>
+          <w:tblHeader/>
+        </w:trPr>
+        <w:tc>
+          <w:tcPr>
+            <w:tcW w:type="dxa" w:w="1250"/>
+            <w:shd w:fill="2563EB" w:color="auto" w:val="clear"/>
+            <w:tcMar>
+              <w:top w:type="dxa" w:w="90"/>
+              <w:left w:type="dxa" w:w="110"/>
+              <w:bottom w:type="dxa" w:w="90"/>
+              <w:right w:type="dxa" w:w="110"/>
+            </w:tcMar>
+          </w:tcPr>
+          <w:p>
+            <w:pPr>
+              <w:bidi/>
+              <w:spacing w:after="0" w:line="280"/>
+              <w:jc w:val="right"/>
+            </w:pPr>
+            <w:r>
+              <w:rPr>
+                <w:rFonts w:ascii="Arial" w:cs="Arial" w:eastAsia="Arial" w:hAnsi="Arial"/>
+                <w:b/>
+                <w:bCs/>
+                <w:color w:val="FFFFFF"/>
+                <w:sz w:val="19"/>
+                <w:szCs w:val="19"/>
+                <w:rtl/>
+              </w:rPr>
+              <w:t xml:space="preserve">التاريخ</w:t>
+            </w:r>
+          </w:p>
+        </w:tc>
+        <w:tc>
+          <w:tcPr>
+            <w:tcW w:type="dxa" w:w="1250"/>
+            <w:shd w:fill="2563EB" w:color="auto" w:val="clear"/>
+            <w:tcMar>
+              <w:top w:type="dxa" w:w="90"/>
+              <w:left w:type="dxa" w:w="110"/>
+              <w:bottom w:type="dxa" w:w="90"/>
+              <w:right w:type="dxa" w:w="110"/>
+            </w:tcMar>
+          </w:tcPr>
+          <w:p>
+            <w:pPr>
+              <w:bidi/>
+              <w:spacing w:after="0" w:line="280"/>
+              <w:jc w:val="right"/>
+            </w:pPr>
+            <w:r>
+              <w:rPr>
+                <w:rFonts w:ascii="Arial" w:cs="Arial" w:eastAsia="Arial" w:hAnsi="Arial"/>
+                <w:b/>
+                <w:bCs/>
+                <w:color w:val="FFFFFF"/>
+                <w:sz w:val="19"/>
+                <w:szCs w:val="19"/>
+                <w:rtl/>
+              </w:rPr>
+              <w:t xml:space="preserve">الصفحة</w:t>
+            </w:r>
+          </w:p>
+        </w:tc>
+        <w:tc>
+          <w:tcPr>
+            <w:tcW w:type="dxa" w:w="1150"/>
+            <w:shd w:fill="2563EB" w:color="auto" w:val="clear"/>
+            <w:tcMar>
+              <w:top w:type="dxa" w:w="90"/>
+              <w:left w:type="dxa" w:w="110"/>
+              <w:bottom w:type="dxa" w:w="90"/>
+              <w:right w:type="dxa" w:w="110"/>
+            </w:tcMar>
+          </w:tcPr>
+          <w:p>
+            <w:pPr>
+              <w:bidi/>
+              <w:spacing w:after="0" w:line="280"/>
+              <w:jc w:val="right"/>
+            </w:pPr>
+            <w:r>
+              <w:rPr>
+                <w:rFonts w:ascii="Arial" w:cs="Arial" w:eastAsia="Arial" w:hAnsi="Arial"/>
+                <w:b/>
+                <w:bCs/>
+                <w:color w:val="FFFFFF"/>
+                <w:sz w:val="19"/>
+                <w:szCs w:val="19"/>
+                <w:rtl/>
+              </w:rPr>
+              <w:t xml:space="preserve">المسار</w:t>
+            </w:r>
+          </w:p>
+        </w:tc>
+        <w:tc>
+          <w:tcPr>
+            <w:tcW w:type="dxa" w:w="2500"/>
+            <w:shd w:fill="2563EB" w:color="auto" w:val="clear"/>
+            <w:tcMar>
+              <w:top w:type="dxa" w:w="90"/>
+              <w:left w:type="dxa" w:w="110"/>
+              <w:bottom w:type="dxa" w:w="90"/>
+              <w:right w:type="dxa" w:w="110"/>
+            </w:tcMar>
+          </w:tcPr>
+          <w:p>
+            <w:pPr>
+              <w:bidi/>
+              <w:spacing w:after="0" w:line="280"/>
+              <w:jc w:val="right"/>
+            </w:pPr>
+            <w:r>
+              <w:rPr>
+                <w:rFonts w:ascii="Arial" w:cs="Arial" w:eastAsia="Arial" w:hAnsi="Arial"/>
+                <w:b/>
+                <w:bCs/>
+                <w:color w:val="FFFFFF"/>
+                <w:sz w:val="19"/>
+                <w:szCs w:val="19"/>
+                <w:rtl/>
+              </w:rPr>
+              <w:t xml:space="preserve">الملف</w:t>
+            </w:r>
+          </w:p>
+        </w:tc>
+        <w:tc>
+          <w:tcPr>
+            <w:tcW w:type="dxa" w:w="1350"/>
+            <w:shd w:fill="2563EB" w:color="auto" w:val="clear"/>
+            <w:tcMar>
+              <w:top w:type="dxa" w:w="90"/>
+              <w:left w:type="dxa" w:w="110"/>
+              <w:bottom w:type="dxa" w:w="90"/>
+              <w:right w:type="dxa" w:w="110"/>
+            </w:tcMar>
+          </w:tcPr>
+          <w:p>
+            <w:pPr>
+              <w:bidi/>
+              <w:spacing w:after="0" w:line="280"/>
+              <w:jc w:val="right"/>
+            </w:pPr>
+            <w:r>
+              <w:rPr>
+                <w:rFonts w:ascii="Arial" w:cs="Arial" w:eastAsia="Arial" w:hAnsi="Arial"/>
+                <w:b/>
+                <w:bCs/>
+                <w:color w:val="FFFFFF"/>
+                <w:sz w:val="19"/>
+                <w:szCs w:val="19"/>
+                <w:rtl/>
+              </w:rPr>
+              <w:t xml:space="preserve">الكوميت</w:t>
+            </w:r>
+          </w:p>
+        </w:tc>
+        <w:tc>
+          <w:tcPr>
+            <w:tcW w:type="dxa" w:w="1500"/>
+            <w:shd w:fill="2563EB" w:color="auto" w:val="clear"/>
+            <w:tcMar>
+              <w:top w:type="dxa" w:w="90"/>
+              <w:left w:type="dxa" w:w="110"/>
+              <w:bottom w:type="dxa" w:w="90"/>
+              <w:right w:type="dxa" w:w="110"/>
+            </w:tcMar>
+          </w:tcPr>
+          <w:p>
+            <w:pPr>
+              <w:bidi/>
+              <w:spacing w:after="0" w:line="280"/>
+              <w:jc w:val="right"/>
+            </w:pPr>
+            <w:r>
+              <w:rPr>
+                <w:rFonts w:ascii="Arial" w:cs="Arial" w:eastAsia="Arial" w:hAnsi="Arial"/>
+                <w:b/>
+                <w:bCs/>
+                <w:color w:val="FFFFFF"/>
+                <w:sz w:val="19"/>
+                <w:szCs w:val="19"/>
+                <w:rtl/>
+              </w:rPr>
+              <w:t xml:space="preserve">الحالة</w:t>
+            </w:r>
+          </w:p>
+        </w:tc>
+      </w:tr>
+      <w:tr>
+        <w:tc>
+          <w:tcPr>
+            <w:tcW w:type="dxa" w:w="1250"/>
+            <w:tcMar>
+              <w:top w:type="dxa" w:w="90"/>
+              <w:left w:type="dxa" w:w="110"/>
+              <w:bottom w:type="dxa" w:w="90"/>
+              <w:right w:type="dxa" w:w="110"/>
+            </w:tcMar>
+          </w:tcPr>
+          <w:p>
+            <w:pPr>
+              <w:bidi/>
+              <w:spacing w:after="0" w:line="280"/>
+              <w:jc w:val="right"/>
+            </w:pPr>
+            <w:r>
+              <w:rPr>
+                <w:rFonts w:ascii="Arial" w:cs="Arial" w:eastAsia="Arial" w:hAnsi="Arial"/>
+                <w:b w:val="false"/>
+                <w:bCs w:val="false"/>
+                <w:color w:val="1E293B"/>
+                <w:sz w:val="19"/>
+                <w:szCs w:val="19"/>
+                <w:rtl/>
+              </w:rPr>
+              <w:t xml:space="preserve">9 سبتمبر 2026</w:t>
+            </w:r>
+          </w:p>
+        </w:tc>
+        <w:tc>
+          <w:tcPr>
+            <w:tcW w:type="dxa" w:w="1250"/>
+            <w:tcMar>
+              <w:top w:type="dxa" w:w="90"/>
+              <w:left w:type="dxa" w:w="110"/>
+              <w:bottom w:type="dxa" w:w="90"/>
+              <w:right w:type="dxa" w:w="110"/>
+            </w:tcMar>
+          </w:tcPr>
+          <w:p>
+            <w:pPr>
+              <w:bidi/>
+              <w:spacing w:after="0" w:line="280"/>
+              <w:jc w:val="right"/>
+            </w:pPr>
+            <w:r>
+              <w:rPr>
+                <w:rFonts w:ascii="Arial" w:cs="Arial" w:eastAsia="Arial" w:hAnsi="Arial"/>
+                <w:b w:val="false"/>
+                <w:bCs w:val="false"/>
+                <w:color w:val="1E293B"/>
+                <w:sz w:val="19"/>
+                <w:szCs w:val="19"/>
+                <w:rtl/>
+              </w:rPr>
+              <w:t xml:space="preserve">الاشتراك</w:t>
+            </w:r>
+          </w:p>
+        </w:tc>
+        <w:tc>
+          <w:tcPr>
+            <w:tcW w:type="dxa" w:w="1150"/>
+            <w:tcMar>
+              <w:top w:type="dxa" w:w="90"/>
+              <w:left w:type="dxa" w:w="110"/>
+              <w:bottom w:type="dxa" w:w="90"/>
+              <w:right w:type="dxa" w:w="110"/>
+            </w:tcMar>
+          </w:tcPr>
+          <w:p>
+            <w:pPr>
+              <w:bidi/>
+              <w:spacing w:after="0" w:line="280"/>
+              <w:jc w:val="right"/>
+            </w:pPr>
+            <w:r>
+              <w:rPr>
+                <w:rFonts w:ascii="Arial" w:cs="Arial" w:eastAsia="Arial" w:hAnsi="Arial"/>
+                <w:b w:val="false"/>
+                <w:bCs w:val="false"/>
+                <w:color w:val="1E293B"/>
+                <w:sz w:val="19"/>
+                <w:szCs w:val="19"/>
+                <w:rtl/>
+              </w:rPr>
+              <w:t xml:space="preserve">/subscribe</w:t>
+            </w:r>
+          </w:p>
+        </w:tc>
+        <w:tc>
+          <w:tcPr>
+            <w:tcW w:type="dxa" w:w="2500"/>
+            <w:tcMar>
+              <w:top w:type="dxa" w:w="90"/>
+              <w:left w:type="dxa" w:w="110"/>
+              <w:bottom w:type="dxa" w:w="90"/>
+              <w:right w:type="dxa" w:w="110"/>
+            </w:tcMar>
+          </w:tcPr>
+          <w:p>
+            <w:pPr>
+              <w:bidi/>
+              <w:spacing w:after="0" w:line="280"/>
+              <w:jc w:val="right"/>
+            </w:pPr>
+            <w:r>
+              <w:rPr>
+                <w:rFonts w:ascii="Arial" w:cs="Arial" w:eastAsia="Arial" w:hAnsi="Arial"/>
+                <w:b w:val="false"/>
+                <w:bCs w:val="false"/>
+                <w:color w:val="1E293B"/>
+                <w:sz w:val="19"/>
+                <w:szCs w:val="19"/>
+                <w:rtl/>
+              </w:rPr>
+              <w:t xml:space="preserve">src/pages/Subscribe.tsx</w:t>
+            </w:r>
+          </w:p>
+        </w:tc>
+        <w:tc>
+          <w:tcPr>
+            <w:tcW w:type="dxa" w:w="1350"/>
+            <w:tcMar>
+              <w:top w:type="dxa" w:w="90"/>
+              <w:left w:type="dxa" w:w="110"/>
+              <w:bottom w:type="dxa" w:w="90"/>
+              <w:right w:type="dxa" w:w="110"/>
+            </w:tcMar>
+          </w:tcPr>
+          <w:p>
+            <w:pPr>
+              <w:bidi/>
+              <w:spacing w:after="0" w:line="280"/>
+              <w:jc w:val="right"/>
+            </w:pPr>
+            <w:r>
+              <w:rPr>
+                <w:rFonts w:ascii="Arial" w:cs="Arial" w:eastAsia="Arial" w:hAnsi="Arial"/>
+                <w:b w:val="false"/>
+                <w:bCs w:val="false"/>
+                <w:color w:val="1E293B"/>
+                <w:sz w:val="19"/>
+                <w:szCs w:val="19"/>
+                <w:rtl/>
+              </w:rPr>
+              <w:t xml:space="preserve">be5b3c0 · c49b797</w:t>
+            </w:r>
+          </w:p>
+        </w:tc>
+        <w:tc>
+          <w:tcPr>
+            <w:tcW w:type="dxa" w:w="1500"/>
+            <w:shd w:fill="ECFDF5" w:color="auto" w:val="clear"/>
+            <w:tcMar>
+              <w:top w:type="dxa" w:w="90"/>
+              <w:left w:type="dxa" w:w="110"/>
+              <w:bottom w:type="dxa" w:w="90"/>
+              <w:right w:type="dxa" w:w="110"/>
+            </w:tcMar>
+          </w:tcPr>
+          <w:p>
+            <w:pPr>
+              <w:bidi/>
+              <w:spacing w:after="0" w:line="280"/>
+              <w:jc w:val="right"/>
+            </w:pPr>
+            <w:r>
+              <w:rPr>
+                <w:rFonts w:ascii="Arial" w:cs="Arial" w:eastAsia="Arial" w:hAnsi="Arial"/>
+                <w:b/>
+                <w:bCs/>
+                <w:color w:val="15803D"/>
+                <w:sz w:val="19"/>
+                <w:szCs w:val="19"/>
+                <w:rtl/>
+              </w:rPr>
+              <w:t xml:space="preserve">منشور على الإنتاج</w:t>
+            </w:r>
+          </w:p>
+        </w:tc>
+      </w:tr>
+    </w:tbl>
+    <w:p>
+      <w:pPr>
+        <w:spacing w:after="90"/>
+      </w:pPr>
     </w:p>
     <w:p>
       <w:pPr>
@@ -5128,7 +5866,7 @@
           <w:szCs w:val="21"/>
           <w:rtl/>
         </w:rPr>
-        <w:t xml:space="preserve">مسار من ست خطوات: اختيار الباقة، ثم تأكيد التخفيض، ثم الدفع، ثم المعالجة، ثم النجاح أو الفشل.</w:t>
+        <w:t xml:space="preserve">إعادة بناء شبه كاملة للصفحة — 715 سطراً متغيّراً.</w:t>
       </w:r>
     </w:p>
     <w:p>
@@ -5150,7 +5888,7 @@
           <w:szCs w:val="21"/>
           <w:rtl/>
         </w:rPr>
-        <w:t xml:space="preserve">احتساب تناسبي للترقية: يُحصَّل فرق السعر عن الأيام المتبقية من الدورة الحالية فقط، ويظهر المبلغ مفصّلاً في ملخص الدفع.</w:t>
+        <w:t xml:space="preserve">اختيار الباقة صار بشريط تمرير (slider) حسب عدد المحادثات الشهرية بدل شبكة الكروت. كل باقة نقطة توقف على الشريط، وباقة المؤسسات هي النقطة الأخيرة بعنوان «غير محدود».</w:t>
       </w:r>
     </w:p>
     <w:p>
@@ -5172,7 +5910,7 @@
           <w:szCs w:val="21"/>
           <w:rtl/>
         </w:rPr>
-        <w:t xml:space="preserve">التخفيض له شاشة تأكيد مستقلة ولا يذهب مباشرة إلى الدفع.</w:t>
+        <w:t xml:space="preserve">مسار من ست خطوات: اختيار الباقة، ثم تأكيد التخفيض، ثم الدفع، ثم المعالجة، ثم النجاح أو الفشل.</w:t>
       </w:r>
     </w:p>
     <w:p>
@@ -5194,7 +5932,7 @@
           <w:szCs w:val="21"/>
           <w:rtl/>
         </w:rPr>
-        <w:t xml:space="preserve">دورة الفوترة تُقرأ من اشتراك العميل الحالي بدل أن تبدأ بقيمة ثابتة.</w:t>
+        <w:t xml:space="preserve">احتساب تناسبي للترقية: يُحصَّل فرق السعر عن الأيام المتبقية من الدورة الحالية فقط، ويظهر المبلغ مفصّلاً في ملخص الدفع.</w:t>
       </w:r>
     </w:p>
     <w:p>
@@ -5216,6 +5954,50 @@
           <w:szCs w:val="21"/>
           <w:rtl/>
         </w:rPr>
+        <w:t xml:space="preserve">التخفيض له شاشة تأكيد مستقلة ولا يذهب مباشرة إلى الدفع.</w:t>
+      </w:r>
+    </w:p>
+    <w:p>
+      <w:pPr>
+        <w:pStyle w:val="ListParagraph"/>
+        <w:numPr>
+          <w:ilvl w:val="0"/>
+          <w:numId w:val="2"/>
+        </w:numPr>
+        <w:bidi/>
+        <w:spacing w:after="70" w:line="290"/>
+        <w:jc w:val="right"/>
+      </w:pPr>
+      <w:r>
+        <w:rPr>
+          <w:rFonts w:ascii="Arial" w:cs="Arial" w:eastAsia="Arial" w:hAnsi="Arial"/>
+          <w:color w:val="1E293B"/>
+          <w:sz w:val="21"/>
+          <w:szCs w:val="21"/>
+          <w:rtl/>
+        </w:rPr>
+        <w:t xml:space="preserve">دورة الفوترة تُقرأ من اشتراك العميل الحالي بدل أن تبدأ بقيمة ثابتة.</w:t>
+      </w:r>
+    </w:p>
+    <w:p>
+      <w:pPr>
+        <w:pStyle w:val="ListParagraph"/>
+        <w:numPr>
+          <w:ilvl w:val="0"/>
+          <w:numId w:val="2"/>
+        </w:numPr>
+        <w:bidi/>
+        <w:spacing w:after="70" w:line="290"/>
+        <w:jc w:val="right"/>
+      </w:pPr>
+      <w:r>
+        <w:rPr>
+          <w:rFonts w:ascii="Arial" w:cs="Arial" w:eastAsia="Arial" w:hAnsi="Arial"/>
+          <w:color w:val="1E293B"/>
+          <w:sz w:val="21"/>
+          <w:szCs w:val="21"/>
+          <w:rtl/>
+        </w:rPr>
         <w:t xml:space="preserve">أُصلحت علامات تعارض الدمج (merge conflict markers) التي كانت باقية في الملف — كوميت c49b797.</w:t>
       </w:r>
     </w:p>
@@ -5402,7 +6184,7 @@
           <w:szCs w:val="20"/>
           <w:rtl/>
         </w:rPr>
-        <w:t xml:space="preserve">عدد التعديلات المسجّلة: 6</w:t>
+        <w:t xml:space="preserve">عدد التعديلات المسجّلة: 7</w:t>
       </w:r>
     </w:p>
     <w:sectPr>

</xml_diff>

<commit_message>
divide the thread at each reopen with a numbered marker
A long thread gave no in-place sign of where one cycle ended and the next
began — only the edge rail said so. Each later cycle now opens with a
branded divider carrying its number, "إعادة فتح" and the date.

It replaces the plain date chip at that point rather than stacking with it,
never appears before the first cycle, and marks an inferred boundary as
تقديري to match the rail's dashed tick.

Numbering follows the cycle number rather than the reopen count, so the
divider, the rail tooltip and sessionCount all agree.

Co-Authored-By: Claude Opus 5 <noreply@anthropic.com>
Claude-Session: https://claude.ai/code/session_01JGHUnSrtQwLX2BGbB3j6wk
</commit_message>
<xml_diff>
--- a/docs/سجل التعديلات الاخيرة.docx
+++ b/docs/سجل التعديلات الاخيرة.docx
@@ -354,7 +354,7 @@
                 <w:szCs w:val="19"/>
                 <w:rtl/>
               </w:rPr>
-              <w:t xml:space="preserve">7</w:t>
+              <w:t xml:space="preserve">8</w:t>
             </w:r>
           </w:p>
         </w:tc>
@@ -414,7 +414,7 @@
                 <w:szCs w:val="19"/>
                 <w:rtl/>
               </w:rPr>
-              <w:t xml:space="preserve">انعكاس حالة «مجدولة» للتخفيض المؤجّل في بورتال العميل</w:t>
+              <w:t xml:space="preserve">فاصل مرقّم بين دورات المحادثة داخل الثريد</w:t>
             </w:r>
           </w:p>
         </w:tc>
@@ -444,7 +444,7 @@
                 <w:szCs w:val="19"/>
                 <w:rtl/>
               </w:rPr>
-              <w:t xml:space="preserve">الباقات والاشتراك</w:t>
+              <w:t xml:space="preserve">صندوق الوارد</w:t>
             </w:r>
           </w:p>
         </w:tc>
@@ -508,7 +508,7 @@
                 <w:szCs w:val="19"/>
                 <w:rtl/>
               </w:rPr>
-              <w:t xml:space="preserve">6</w:t>
+              <w:t xml:space="preserve">7</w:t>
             </w:r>
           </w:p>
         </w:tc>
@@ -570,7 +570,7 @@
                 <w:szCs w:val="19"/>
                 <w:rtl/>
               </w:rPr>
-              <w:t xml:space="preserve">إعادة تصميم شريط الفهرسة على هيئة مسطرة تظهر عند الاقتراب</w:t>
+              <w:t xml:space="preserve">انعكاس حالة «مجدولة» للتخفيض المؤجّل في بورتال العميل</w:t>
             </w:r>
           </w:p>
         </w:tc>
@@ -601,38 +601,38 @@
                 <w:szCs w:val="19"/>
                 <w:rtl/>
               </w:rPr>
-              <w:t xml:space="preserve">صندوق الوارد</w:t>
+              <w:t xml:space="preserve">الباقات والاشتراك</w:t>
             </w:r>
           </w:p>
         </w:tc>
         <w:tc>
           <w:tcPr>
             <w:tcW w:type="dxa" w:w="1800"/>
-            <w:shd w:fill="ECFDF5" w:color="auto" w:val="clear"/>
-            <w:tcMar>
-              <w:top w:type="dxa" w:w="90"/>
-              <w:left w:type="dxa" w:w="110"/>
-              <w:bottom w:type="dxa" w:w="90"/>
-              <w:right w:type="dxa" w:w="110"/>
-            </w:tcMar>
-          </w:tcPr>
-          <w:p>
-            <w:pPr>
-              <w:bidi/>
-              <w:spacing w:after="0" w:line="280"/>
-              <w:jc w:val="right"/>
-            </w:pPr>
-            <w:r>
-              <w:rPr>
-                <w:rFonts w:ascii="Arial" w:cs="Arial" w:eastAsia="Arial" w:hAnsi="Arial"/>
-                <w:b/>
-                <w:bCs/>
-                <w:color w:val="15803D"/>
-                <w:sz w:val="19"/>
-                <w:szCs w:val="19"/>
-                <w:rtl/>
-              </w:rPr>
-              <w:t xml:space="preserve">منشور على الإنتاج</w:t>
+            <w:shd w:fill="FFFBEB" w:color="auto" w:val="clear"/>
+            <w:tcMar>
+              <w:top w:type="dxa" w:w="90"/>
+              <w:left w:type="dxa" w:w="110"/>
+              <w:bottom w:type="dxa" w:w="90"/>
+              <w:right w:type="dxa" w:w="110"/>
+            </w:tcMar>
+          </w:tcPr>
+          <w:p>
+            <w:pPr>
+              <w:bidi/>
+              <w:spacing w:after="0" w:line="280"/>
+              <w:jc w:val="right"/>
+            </w:pPr>
+            <w:r>
+              <w:rPr>
+                <w:rFonts w:ascii="Arial" w:cs="Arial" w:eastAsia="Arial" w:hAnsi="Arial"/>
+                <w:b/>
+                <w:bCs/>
+                <w:color w:val="B45309"/>
+                <w:sz w:val="19"/>
+                <w:szCs w:val="19"/>
+                <w:rtl/>
+              </w:rPr>
+              <w:t xml:space="preserve">مرفوع — غير منشور</w:t>
             </w:r>
           </w:p>
         </w:tc>
@@ -664,7 +664,7 @@
                 <w:szCs w:val="19"/>
                 <w:rtl/>
               </w:rPr>
-              <w:t xml:space="preserve">5</w:t>
+              <w:t xml:space="preserve">6</w:t>
             </w:r>
           </w:p>
         </w:tc>
@@ -724,7 +724,7 @@
                 <w:szCs w:val="19"/>
                 <w:rtl/>
               </w:rPr>
-              <w:t xml:space="preserve">شريط فهرسة دورات المحادثة داخل الثريد</w:t>
+              <w:t xml:space="preserve">إعادة تصميم شريط الفهرسة على هيئة مسطرة تظهر عند الاقتراب</w:t>
             </w:r>
           </w:p>
         </w:tc>
@@ -818,7 +818,7 @@
                 <w:szCs w:val="19"/>
                 <w:rtl/>
               </w:rPr>
-              <w:t xml:space="preserve">4</w:t>
+              <w:t xml:space="preserve">5</w:t>
             </w:r>
           </w:p>
         </w:tc>
@@ -880,7 +880,7 @@
                 <w:szCs w:val="19"/>
                 <w:rtl/>
               </w:rPr>
-              <w:t xml:space="preserve">تسجيل دورات المحادثة واشتقاقها — أساس شريط فهرسة الثريد</w:t>
+              <w:t xml:space="preserve">شريط فهرسة دورات المحادثة داخل الثريد</w:t>
             </w:r>
           </w:p>
         </w:tc>
@@ -911,7 +911,7 @@
                 <w:szCs w:val="19"/>
                 <w:rtl/>
               </w:rPr>
-              <w:t xml:space="preserve">صندوق الوارد (طبقة البيانات)</w:t>
+              <w:t xml:space="preserve">صندوق الوارد</w:t>
             </w:r>
           </w:p>
         </w:tc>
@@ -974,7 +974,7 @@
                 <w:szCs w:val="19"/>
                 <w:rtl/>
               </w:rPr>
-              <w:t xml:space="preserve">3</w:t>
+              <w:t xml:space="preserve">4</w:t>
             </w:r>
           </w:p>
         </w:tc>
@@ -1034,7 +1034,7 @@
                 <w:szCs w:val="19"/>
                 <w:rtl/>
               </w:rPr>
-              <w:t xml:space="preserve">إزالة كارت نسبة الاستجابة من صفحة تقييمات العملاء</w:t>
+              <w:t xml:space="preserve">تسجيل دورات المحادثة واشتقاقها — أساس شريط فهرسة الثريد</w:t>
             </w:r>
           </w:p>
         </w:tc>
@@ -1064,7 +1064,7 @@
                 <w:szCs w:val="19"/>
                 <w:rtl/>
               </w:rPr>
-              <w:t xml:space="preserve">تقييمات العملاء</w:t>
+              <w:t xml:space="preserve">صندوق الوارد (طبقة البيانات)</w:t>
             </w:r>
           </w:p>
         </w:tc>
@@ -1128,7 +1128,7 @@
                 <w:szCs w:val="19"/>
                 <w:rtl/>
               </w:rPr>
-              <w:t xml:space="preserve">2</w:t>
+              <w:t xml:space="preserve">3</w:t>
             </w:r>
           </w:p>
         </w:tc>
@@ -1159,7 +1159,7 @@
                 <w:szCs w:val="19"/>
                 <w:rtl/>
               </w:rPr>
-              <w:t xml:space="preserve">9 سبتمبر 2026</w:t>
+              <w:t xml:space="preserve">10 سبتمبر 2026</w:t>
             </w:r>
           </w:p>
         </w:tc>
@@ -1190,7 +1190,7 @@
                 <w:szCs w:val="19"/>
                 <w:rtl/>
               </w:rPr>
-              <w:t xml:space="preserve">تغيير تسمية زر الترقية في صفحة الفوترة</w:t>
+              <w:t xml:space="preserve">إزالة كارت نسبة الاستجابة من صفحة تقييمات العملاء</w:t>
             </w:r>
           </w:p>
         </w:tc>
@@ -1221,7 +1221,7 @@
                 <w:szCs w:val="19"/>
                 <w:rtl/>
               </w:rPr>
-              <w:t xml:space="preserve">الفوترة</w:t>
+              <w:t xml:space="preserve">تقييمات العملاء</w:t>
             </w:r>
           </w:p>
         </w:tc>
@@ -1284,7 +1284,7 @@
                 <w:szCs w:val="19"/>
                 <w:rtl/>
               </w:rPr>
-              <w:t xml:space="preserve">1</w:t>
+              <w:t xml:space="preserve">2</w:t>
             </w:r>
           </w:p>
         </w:tc>
@@ -1344,6 +1344,162 @@
                 <w:szCs w:val="19"/>
                 <w:rtl/>
               </w:rPr>
+              <w:t xml:space="preserve">تغيير تسمية زر الترقية في صفحة الفوترة</w:t>
+            </w:r>
+          </w:p>
+        </w:tc>
+        <w:tc>
+          <w:tcPr>
+            <w:tcW w:type="dxa" w:w="1500"/>
+            <w:tcMar>
+              <w:top w:type="dxa" w:w="90"/>
+              <w:left w:type="dxa" w:w="110"/>
+              <w:bottom w:type="dxa" w:w="90"/>
+              <w:right w:type="dxa" w:w="110"/>
+            </w:tcMar>
+          </w:tcPr>
+          <w:p>
+            <w:pPr>
+              <w:bidi/>
+              <w:spacing w:after="0" w:line="280"/>
+              <w:jc w:val="right"/>
+            </w:pPr>
+            <w:r>
+              <w:rPr>
+                <w:rFonts w:ascii="Arial" w:cs="Arial" w:eastAsia="Arial" w:hAnsi="Arial"/>
+                <w:b w:val="false"/>
+                <w:bCs w:val="false"/>
+                <w:color w:val="1E293B"/>
+                <w:sz w:val="19"/>
+                <w:szCs w:val="19"/>
+                <w:rtl/>
+              </w:rPr>
+              <w:t xml:space="preserve">الفوترة</w:t>
+            </w:r>
+          </w:p>
+        </w:tc>
+        <w:tc>
+          <w:tcPr>
+            <w:tcW w:type="dxa" w:w="1800"/>
+            <w:shd w:fill="ECFDF5" w:color="auto" w:val="clear"/>
+            <w:tcMar>
+              <w:top w:type="dxa" w:w="90"/>
+              <w:left w:type="dxa" w:w="110"/>
+              <w:bottom w:type="dxa" w:w="90"/>
+              <w:right w:type="dxa" w:w="110"/>
+            </w:tcMar>
+          </w:tcPr>
+          <w:p>
+            <w:pPr>
+              <w:bidi/>
+              <w:spacing w:after="0" w:line="280"/>
+              <w:jc w:val="right"/>
+            </w:pPr>
+            <w:r>
+              <w:rPr>
+                <w:rFonts w:ascii="Arial" w:cs="Arial" w:eastAsia="Arial" w:hAnsi="Arial"/>
+                <w:b/>
+                <w:bCs/>
+                <w:color w:val="15803D"/>
+                <w:sz w:val="19"/>
+                <w:szCs w:val="19"/>
+                <w:rtl/>
+              </w:rPr>
+              <w:t xml:space="preserve">منشور على الإنتاج</w:t>
+            </w:r>
+          </w:p>
+        </w:tc>
+      </w:tr>
+      <w:tr>
+        <w:tc>
+          <w:tcPr>
+            <w:tcW w:type="dxa" w:w="600"/>
+            <w:shd w:fill="F1F5F9" w:color="auto" w:val="clear"/>
+            <w:tcMar>
+              <w:top w:type="dxa" w:w="90"/>
+              <w:left w:type="dxa" w:w="110"/>
+              <w:bottom w:type="dxa" w:w="90"/>
+              <w:right w:type="dxa" w:w="110"/>
+            </w:tcMar>
+          </w:tcPr>
+          <w:p>
+            <w:pPr>
+              <w:bidi/>
+              <w:spacing w:after="0" w:line="280"/>
+              <w:jc w:val="right"/>
+            </w:pPr>
+            <w:r>
+              <w:rPr>
+                <w:rFonts w:ascii="Arial" w:cs="Arial" w:eastAsia="Arial" w:hAnsi="Arial"/>
+                <w:b/>
+                <w:bCs/>
+                <w:color w:val="2563EB"/>
+                <w:sz w:val="19"/>
+                <w:szCs w:val="19"/>
+                <w:rtl/>
+              </w:rPr>
+              <w:t xml:space="preserve">1</w:t>
+            </w:r>
+          </w:p>
+        </w:tc>
+        <w:tc>
+          <w:tcPr>
+            <w:tcW w:type="dxa" w:w="1500"/>
+            <w:shd w:fill="F1F5F9" w:color="auto" w:val="clear"/>
+            <w:tcMar>
+              <w:top w:type="dxa" w:w="90"/>
+              <w:left w:type="dxa" w:w="110"/>
+              <w:bottom w:type="dxa" w:w="90"/>
+              <w:right w:type="dxa" w:w="110"/>
+            </w:tcMar>
+          </w:tcPr>
+          <w:p>
+            <w:pPr>
+              <w:bidi/>
+              <w:spacing w:after="0" w:line="280"/>
+              <w:jc w:val="right"/>
+            </w:pPr>
+            <w:r>
+              <w:rPr>
+                <w:rFonts w:ascii="Arial" w:cs="Arial" w:eastAsia="Arial" w:hAnsi="Arial"/>
+                <w:b w:val="false"/>
+                <w:bCs w:val="false"/>
+                <w:color w:val="1E293B"/>
+                <w:sz w:val="19"/>
+                <w:szCs w:val="19"/>
+                <w:rtl/>
+              </w:rPr>
+              <w:t xml:space="preserve">9 سبتمبر 2026</w:t>
+            </w:r>
+          </w:p>
+        </w:tc>
+        <w:tc>
+          <w:tcPr>
+            <w:tcW w:type="dxa" w:w="3600"/>
+            <w:shd w:fill="F1F5F9" w:color="auto" w:val="clear"/>
+            <w:tcMar>
+              <w:top w:type="dxa" w:w="90"/>
+              <w:left w:type="dxa" w:w="110"/>
+              <w:bottom w:type="dxa" w:w="90"/>
+              <w:right w:type="dxa" w:w="110"/>
+            </w:tcMar>
+          </w:tcPr>
+          <w:p>
+            <w:pPr>
+              <w:bidi/>
+              <w:spacing w:after="0" w:line="280"/>
+              <w:jc w:val="right"/>
+            </w:pPr>
+            <w:r>
+              <w:rPr>
+                <w:rFonts w:ascii="Arial" w:cs="Arial" w:eastAsia="Arial" w:hAnsi="Arial"/>
+                <w:b w:val="false"/>
+                <w:bCs w:val="false"/>
+                <w:color w:val="1E293B"/>
+                <w:sz w:val="19"/>
+                <w:szCs w:val="19"/>
+                <w:rtl/>
+              </w:rPr>
               <w:t xml:space="preserve">ميزة تغيير الباقة — US-131</w:t>
             </w:r>
           </w:p>
@@ -1351,6 +1507,7 @@
         <w:tc>
           <w:tcPr>
             <w:tcW w:type="dxa" w:w="1500"/>
+            <w:shd w:fill="F1F5F9" w:color="auto" w:val="clear"/>
             <w:tcMar>
               <w:top w:type="dxa" w:w="90"/>
               <w:left w:type="dxa" w:w="110"/>
@@ -1794,7 +1951,7 @@
                 <w:szCs w:val="20"/>
                 <w:rtl/>
               </w:rPr>
-              <w:t xml:space="preserve">يوجد 1 تعديل مرفوع على الفرع ولم يُنشر بعد — مبيّن في الجدول أعلاه.</w:t>
+              <w:t xml:space="preserve">يوجد 2 تعديل مرفوع على الفرع ولم يُنشر بعد — مبيّن في الجدول أعلاه.</w:t>
             </w:r>
           </w:p>
           <w:p>
@@ -1862,7 +2019,7 @@
           <w:szCs w:val="24"/>
           <w:rtl/>
         </w:rPr>
-        <w:t xml:space="preserve">تعديل رقم 7 — انعكاس حالة «مجدولة» للتخفيض المؤجّل في بورتال العميل</w:t>
+        <w:t xml:space="preserve">تعديل رقم 8 — فاصل مرقّم بين دورات المحادثة داخل الثريد</w:t>
       </w:r>
     </w:p>
     <w:p>
@@ -2139,7 +2296,7 @@
                 <w:szCs w:val="19"/>
                 <w:rtl/>
               </w:rPr>
-              <w:t xml:space="preserve">الباقات والاشتراك</w:t>
+              <w:t xml:space="preserve">صندوق الوارد</w:t>
             </w:r>
           </w:p>
         </w:tc>
@@ -2169,7 +2326,7 @@
                 <w:szCs w:val="19"/>
                 <w:rtl/>
               </w:rPr>
-              <w:t xml:space="preserve">/billing</w:t>
+              <w:t xml:space="preserve">/inbox</w:t>
             </w:r>
           </w:p>
         </w:tc>
@@ -2199,7 +2356,7 @@
                 <w:szCs w:val="19"/>
                 <w:rtl/>
               </w:rPr>
-              <w:t xml:space="preserve">src/types/index.ts · src/pages/Billing.tsx · src/store/adminMockData.ts</w:t>
+              <w:t xml:space="preserve">src/pages/Inbox.tsx</w:t>
             </w:r>
           </w:p>
         </w:tc>
@@ -2290,7 +2447,7 @@
           <w:szCs w:val="21"/>
           <w:rtl/>
         </w:rPr>
-        <w:t xml:space="preserve">الاشتراك الذي عليه تخفيض مؤجّل إلى تاريخ لاحق صارت حالته «مجدولة» ظاهرة للعميل، لا في بورتال الإدارة وحده.</w:t>
+        <w:t xml:space="preserve">كل دورة جديدة صار يسبقها فاصل أفقي ظاهر داخل الثريد، فيُعرف أين انتهت دورة وبدأت التي تليها من غير رجوع إلى شريط الفهرسة.</w:t>
       </w:r>
     </w:p>
     <w:p>
@@ -2312,7 +2469,7 @@
           <w:szCs w:val="21"/>
           <w:rtl/>
         </w:rPr>
-        <w:t xml:space="preserve">أُضيف الحقل scheduledChange إلى الاشتراك ويحمل الباقة المستهدفة ودورة الفوترة وتاريخ السريان، وأُضيفت «مجدولة» إلى حالات الفاتورة.</w:t>
+        <w:t xml:space="preserve">الفاصل يحمل رقم الدورة وكلمة «إعادة فتح» والتاريخ، فيجيب عن ثلاثة أسئلة في سطر: أي دورة، وماذا جرى، ومتى.</w:t>
       </w:r>
     </w:p>
     <w:p>
@@ -2334,7 +2491,7 @@
           <w:szCs w:val="21"/>
           <w:rtl/>
         </w:rPr>
-        <w:t xml:space="preserve">بطاقة الاشتراك تعرض شارة «مجدولة» وجملة صريحة تذكر اسم الباقة المستهدفة وتاريخ التحويل، وتؤكّد أن الباقة الحالية ومزاياها مستمرة حتى ذلك التاريخ — فلا يظن العميل أن باقته انخفضت الآن.</w:t>
+        <w:t xml:space="preserve">صيغته بلون العلامة التجارية بخطّين وشارة بارزة، لأن المطلوب أن يُلاحَظ لا أن يمرّ مرور الكرام.</w:t>
       </w:r>
     </w:p>
     <w:p>
@@ -2356,7 +2513,7 @@
           <w:szCs w:val="21"/>
           <w:rtl/>
         </w:rPr>
-        <w:t xml:space="preserve">جدول الفواتير وفلاترها ونافذة معاينة الفاتورة تعرض الحالة نفسها.</w:t>
+        <w:t xml:space="preserve">الفاصل يحلّ محلّ شريحة التاريخ العادية في ذلك الموضع لأنه يحمل التاريخ أصلاً، فلا يجتمع فاصلان متتاليان.</w:t>
       </w:r>
     </w:p>
     <w:p>
@@ -2378,7 +2535,7 @@
           <w:szCs w:val="21"/>
           <w:rtl/>
         </w:rPr>
-        <w:t xml:space="preserve">الحالة مشتقّة من الاشتراك لا مخزّنة على الفاتورة: إلغاء الجدولة يُزيلها من كل المواضع في آن واحد، بدل أن تبقى فاتورة تحمل حالة قديمة.</w:t>
+        <w:t xml:space="preserve">لا يظهر قبل الدورة الأولى لأنها بداية المحادثة لا إعادة فتح لها.</w:t>
       </w:r>
     </w:p>
     <w:p>
@@ -2400,7 +2557,7 @@
           <w:szCs w:val="21"/>
           <w:rtl/>
         </w:rPr>
-        <w:t xml:space="preserve">قرار مقصود: الاشتقاق يطال الفواتير غير المسدّدة فقط (معلّقة ومسودة). الفاتورة المدفوعة أو المستردة أو الملغاة أو الفاشلة تحتفظ بحالتها، وكذلك المتأخرة لأن التأخّر مشكلة سداد لا يصح حجبها خلف حالة الجدولة.</w:t>
+        <w:t xml:space="preserve">الدورة ذات البداية المستنتجة تُوسم «(تقديري)» في الفاصل نفسه، اتساقاً مع العلامة المتقطّعة في شريط الفهرسة.</w:t>
       </w:r>
     </w:p>
     <w:p>
@@ -2422,7 +2579,7 @@
           <w:szCs w:val="21"/>
           <w:rtl/>
         </w:rPr>
-        <w:t xml:space="preserve">زر «إلغاء الجدولة» إجراء إداري بحسب المواصفة، فبورتال العميل يعرض الحالة دون التحكم فيها.</w:t>
+        <w:t xml:space="preserve">الترقيم يتبع رقم الدورة (الدورة 2، الدورة 3) لا رقم إعادة الفتح، ليطابق ما يعرضه شريط الفهرسة وحقل sessionCount ولا يتضارب معهما.</w:t>
       </w:r>
     </w:p>
     <w:p>
@@ -2444,29 +2601,7 @@
           <w:szCs w:val="21"/>
           <w:rtl/>
         </w:rPr>
-        <w:t xml:space="preserve">أُضيفت جدولة تجريبية لعميل العرض (تحويل من الأعمال إلى الاحترافي بعد 15 يوماً) لتصير الحالة قابلة للمعاينة.</w:t>
-      </w:r>
-    </w:p>
-    <w:p>
-      <w:pPr>
-        <w:pStyle w:val="ListParagraph"/>
-        <w:numPr>
-          <w:ilvl w:val="0"/>
-          <w:numId w:val="2"/>
-        </w:numPr>
-        <w:bidi/>
-        <w:spacing w:after="70" w:line="290"/>
-        <w:jc w:val="right"/>
-      </w:pPr>
-      <w:r>
-        <w:rPr>
-          <w:rFonts w:ascii="Arial" w:cs="Arial" w:eastAsia="Arial" w:hAnsi="Arial"/>
-          <w:color w:val="1E293B"/>
-          <w:sz w:val="21"/>
-          <w:szCs w:val="21"/>
-          <w:rtl/>
-        </w:rPr>
-        <w:t xml:space="preserve">عوينت النتيجة في المتصفح: الشارة والجملة والفلتر وحالتا الفاتورتين غير المسدّدتين ظهرت، والفاتورتان المدفوعتان بقيتا «مدفوعة».</w:t>
+        <w:t xml:space="preserve">عوينت النتيجة في المتصفح: فاصلان بالرقمين الصحيحين، وشريحة التاريخ المكرّرة اختفت من موضعيهما.</w:t>
       </w:r>
     </w:p>
     <w:p>
@@ -2491,7 +2626,7 @@
           <w:szCs w:val="24"/>
           <w:rtl/>
         </w:rPr>
-        <w:t xml:space="preserve">تعديل رقم 6 — إعادة تصميم شريط الفهرسة على هيئة مسطرة تظهر عند الاقتراب</w:t>
+        <w:t xml:space="preserve">تعديل رقم 7 — انعكاس حالة «مجدولة» للتخفيض المؤجّل في بورتال العميل</w:t>
       </w:r>
     </w:p>
     <w:p>
@@ -2768,7 +2903,7 @@
                 <w:szCs w:val="19"/>
                 <w:rtl/>
               </w:rPr>
-              <w:t xml:space="preserve">صندوق الوارد</w:t>
+              <w:t xml:space="preserve">الباقات والاشتراك</w:t>
             </w:r>
           </w:p>
         </w:tc>
@@ -2798,7 +2933,7 @@
                 <w:szCs w:val="19"/>
                 <w:rtl/>
               </w:rPr>
-              <w:t xml:space="preserve">/inbox</w:t>
+              <w:t xml:space="preserve">/billing</w:t>
             </w:r>
           </w:p>
         </w:tc>
@@ -2828,7 +2963,7 @@
                 <w:szCs w:val="19"/>
                 <w:rtl/>
               </w:rPr>
-              <w:t xml:space="preserve">src/components/inbox/SessionRail.tsx · src/pages/Inbox.tsx</w:t>
+              <w:t xml:space="preserve">src/types/index.ts · src/pages/Billing.tsx · src/store/adminMockData.ts</w:t>
             </w:r>
           </w:p>
         </w:tc>
@@ -2858,38 +2993,38 @@
                 <w:szCs w:val="19"/>
                 <w:rtl/>
               </w:rPr>
-              <w:t xml:space="preserve">4163939</w:t>
+              <w:t xml:space="preserve">—</w:t>
             </w:r>
           </w:p>
         </w:tc>
         <w:tc>
           <w:tcPr>
             <w:tcW w:type="dxa" w:w="1500"/>
-            <w:shd w:fill="ECFDF5" w:color="auto" w:val="clear"/>
-            <w:tcMar>
-              <w:top w:type="dxa" w:w="90"/>
-              <w:left w:type="dxa" w:w="110"/>
-              <w:bottom w:type="dxa" w:w="90"/>
-              <w:right w:type="dxa" w:w="110"/>
-            </w:tcMar>
-          </w:tcPr>
-          <w:p>
-            <w:pPr>
-              <w:bidi/>
-              <w:spacing w:after="0" w:line="280"/>
-              <w:jc w:val="right"/>
-            </w:pPr>
-            <w:r>
-              <w:rPr>
-                <w:rFonts w:ascii="Arial" w:cs="Arial" w:eastAsia="Arial" w:hAnsi="Arial"/>
-                <w:b/>
-                <w:bCs/>
-                <w:color w:val="15803D"/>
-                <w:sz w:val="19"/>
-                <w:szCs w:val="19"/>
-                <w:rtl/>
-              </w:rPr>
-              <w:t xml:space="preserve">منشور على الإنتاج</w:t>
+            <w:shd w:fill="FFFBEB" w:color="auto" w:val="clear"/>
+            <w:tcMar>
+              <w:top w:type="dxa" w:w="90"/>
+              <w:left w:type="dxa" w:w="110"/>
+              <w:bottom w:type="dxa" w:w="90"/>
+              <w:right w:type="dxa" w:w="110"/>
+            </w:tcMar>
+          </w:tcPr>
+          <w:p>
+            <w:pPr>
+              <w:bidi/>
+              <w:spacing w:after="0" w:line="280"/>
+              <w:jc w:val="right"/>
+            </w:pPr>
+            <w:r>
+              <w:rPr>
+                <w:rFonts w:ascii="Arial" w:cs="Arial" w:eastAsia="Arial" w:hAnsi="Arial"/>
+                <w:b/>
+                <w:bCs/>
+                <w:color w:val="B45309"/>
+                <w:sz w:val="19"/>
+                <w:szCs w:val="19"/>
+                <w:rtl/>
+              </w:rPr>
+              <w:t xml:space="preserve">مرفوع — غير منشور</w:t>
             </w:r>
           </w:p>
         </w:tc>
@@ -2919,7 +3054,7 @@
           <w:szCs w:val="21"/>
           <w:rtl/>
         </w:rPr>
-        <w:t xml:space="preserve">الشكل السابق كان كتلاً سميكة بينها فجوات، فكان يُقرأ كشريط تقدّم مكسور لا كأداة تنقّل. صار الآن مسطرة: خطّ شعري على حافة الثريد وعليه علامات رفيعة عند بدايات الدورات.</w:t>
+        <w:t xml:space="preserve">الاشتراك الذي عليه تخفيض مؤجّل إلى تاريخ لاحق صارت حالته «مجدولة» ظاهرة للعميل، لا في بورتال الإدارة وحده.</w:t>
       </w:r>
     </w:p>
     <w:p>
@@ -2941,7 +3076,7 @@
           <w:szCs w:val="21"/>
           <w:rtl/>
         </w:rPr>
-        <w:t xml:space="preserve">العلامات مجمّعة في منتصف ارتفاع الحافة كمجموعة واحدة مرتّبة، لا موزّعة على كامل الطول.</w:t>
+        <w:t xml:space="preserve">أُضيف الحقل scheduledChange إلى الاشتراك ويحمل الباقة المستهدفة ودورة الفوترة وتاريخ السريان، وأُضيفت «مجدولة» إلى حالات الفاتورة.</w:t>
       </w:r>
     </w:p>
     <w:p>
@@ -2963,7 +3098,7 @@
           <w:szCs w:val="21"/>
           <w:rtl/>
         </w:rPr>
-        <w:t xml:space="preserve">جُرّب توزيعها على مواضعها النسبية من ارتفاع التمرير أولاً، ثم استُبدل بالتجميع في المنتصف بقرار من الإدارة: الشكل المرتّب فُضّل على دلالة الموضع. أُزيل معه كود القياس ومراقب تغيّر الحجم لأنه لم يعد له عمل.</w:t>
+        <w:t xml:space="preserve">بطاقة الاشتراك تعرض شارة «مجدولة» وجملة صريحة تذكر اسم الباقة المستهدفة وتاريخ التحويل، وتؤكّد أن الباقة الحالية ومزاياها مستمرة حتى ذلك التاريخ — فلا يظن العميل أن باقته انخفضت الآن.</w:t>
       </w:r>
     </w:p>
     <w:p>
@@ -2985,7 +3120,7 @@
           <w:szCs w:val="21"/>
           <w:rtl/>
         </w:rPr>
-        <w:t xml:space="preserve">المسطرة باهتة في الوضع العادي وتتوضّح بالكامل عند اقتراب المؤشر من الحافة أو عند وصول لوحة المفاتيح إليها.</w:t>
+        <w:t xml:space="preserve">جدول الفواتير وفلاترها ونافذة معاينة الفاتورة تعرض الحالة نفسها.</w:t>
       </w:r>
     </w:p>
     <w:p>
@@ -3007,7 +3142,7 @@
           <w:szCs w:val="21"/>
           <w:rtl/>
         </w:rPr>
-        <w:t xml:space="preserve">أُبقي أثر خافت دائم بدل الإخفاء التام: ميزة لا يدل عليها شيء لا يعرفها أحد، والإخفاء الكامل كان سيجعلها غير قابلة للاكتشاف.</w:t>
+        <w:t xml:space="preserve">الحالة مشتقّة من الاشتراك لا مخزّنة على الفاتورة: إلغاء الجدولة يُزيلها من كل المواضع في آن واحد، بدل أن تبقى فاتورة تحمل حالة قديمة.</w:t>
       </w:r>
     </w:p>
     <w:p>
@@ -3029,7 +3164,7 @@
           <w:szCs w:val="21"/>
           <w:rtl/>
         </w:rPr>
-        <w:t xml:space="preserve">صارت طبقة عائمة (overlay) بدل عمود يحجز عرضاً ثابتاً، فرجع نحو 36 بكسل لمساحة الرسائل.</w:t>
+        <w:t xml:space="preserve">قرار مقصود: الاشتقاق يطال الفواتير غير المسدّدة فقط (معلّقة ومسودة). الفاتورة المدفوعة أو المستردة أو الملغاة أو الفاشلة تحتفظ بحالتها، وكذلك المتأخرة لأن التأخّر مشكلة سداد لا يصح حجبها خلف حالة الجدولة.</w:t>
       </w:r>
     </w:p>
     <w:p>
@@ -3051,7 +3186,7 @@
           <w:szCs w:val="21"/>
           <w:rtl/>
         </w:rPr>
-        <w:t xml:space="preserve">وُضعت بعد شريط التمرير بمقدار 8 بكسل حتى لا تحجب سحبه.</w:t>
+        <w:t xml:space="preserve">زر «إلغاء الجدولة» إجراء إداري بحسب المواصفة، فبورتال العميل يعرض الحالة دون التحكم فيها.</w:t>
       </w:r>
     </w:p>
     <w:p>
@@ -3073,7 +3208,7 @@
           <w:szCs w:val="21"/>
           <w:rtl/>
         </w:rPr>
-        <w:t xml:space="preserve">التمييز بين المؤكَّد والمقدَّر بقي قائماً بصرياً: علامة متصلة للدورة المسجّلة، ومتقطّعة للمستنتَجة، مع بقاء «بداية تقديرية» في التلميح.</w:t>
+        <w:t xml:space="preserve">أُضيفت جدولة تجريبية لعميل العرض (تحويل من الأعمال إلى الاحترافي بعد 15 يوماً) لتصير الحالة قابلة للمعاينة.</w:t>
       </w:r>
     </w:p>
     <w:p>
@@ -3095,51 +3230,7 @@
           <w:szCs w:val="21"/>
           <w:rtl/>
         </w:rPr>
-        <w:t xml:space="preserve">تنازل مقصود: الشكل السابق كان يعبّر عن حجم كل دورة بارتفاعها، والمسطرة لا تفعل. حجم الدورة انتقل إلى التلميح.</w:t>
-      </w:r>
-    </w:p>
-    <w:p>
-      <w:pPr>
-        <w:pStyle w:val="ListParagraph"/>
-        <w:numPr>
-          <w:ilvl w:val="0"/>
-          <w:numId w:val="2"/>
-        </w:numPr>
-        <w:bidi/>
-        <w:spacing w:after="70" w:line="290"/>
-        <w:jc w:val="right"/>
-      </w:pPr>
-      <w:r>
-        <w:rPr>
-          <w:rFonts w:ascii="Arial" w:cs="Arial" w:eastAsia="Arial" w:hAnsi="Arial"/>
-          <w:color w:val="1E293B"/>
-          <w:sz w:val="21"/>
-          <w:szCs w:val="21"/>
-          <w:rtl/>
-        </w:rPr>
-        <w:t xml:space="preserve">مجموعة العلامات تقبل التمرير داخلها إن كثرت الدورات حتى لا تتجاوز ارتفاع اللوحة. ولأن ذلك يقصّ التلميح، رُفع التلميح خارج المجموعة ويُحاذى رأسياً بالعلامة المؤشَّر عليها بالقياس.</w:t>
-      </w:r>
-    </w:p>
-    <w:p>
-      <w:pPr>
-        <w:pStyle w:val="ListParagraph"/>
-        <w:numPr>
-          <w:ilvl w:val="0"/>
-          <w:numId w:val="2"/>
-        </w:numPr>
-        <w:bidi/>
-        <w:spacing w:after="70" w:line="290"/>
-        <w:jc w:val="right"/>
-      </w:pPr>
-      <w:r>
-        <w:rPr>
-          <w:rFonts w:ascii="Arial" w:cs="Arial" w:eastAsia="Arial" w:hAnsi="Arial"/>
-          <w:color w:val="1E293B"/>
-          <w:sz w:val="21"/>
-          <w:szCs w:val="21"/>
-          <w:rtl/>
-        </w:rPr>
-        <w:t xml:space="preserve">عوينت النتيجة في المتصفح: العلامات الثلاث متجمّعة في المنتصف، والتوضّح بالاقتراب والتلميح والانتقال تعمل.</w:t>
+        <w:t xml:space="preserve">عوينت النتيجة في المتصفح: الشارة والجملة والفلتر وحالتا الفاتورتين غير المسدّدتين ظهرت، والفاتورتان المدفوعتان بقيتا «مدفوعة».</w:t>
       </w:r>
     </w:p>
     <w:p>
@@ -3164,7 +3255,7 @@
           <w:szCs w:val="24"/>
           <w:rtl/>
         </w:rPr>
-        <w:t xml:space="preserve">تعديل رقم 5 — شريط فهرسة دورات المحادثة داخل الثريد</w:t>
+        <w:t xml:space="preserve">تعديل رقم 6 — إعادة تصميم شريط الفهرسة على هيئة مسطرة تظهر عند الاقتراب</w:t>
       </w:r>
     </w:p>
     <w:p>
@@ -3501,7 +3592,7 @@
                 <w:szCs w:val="19"/>
                 <w:rtl/>
               </w:rPr>
-              <w:t xml:space="preserve">src/components/inbox/SessionRail.tsx · src/pages/Inbox.tsx · src/store/mockData.ts</w:t>
+              <w:t xml:space="preserve">src/components/inbox/SessionRail.tsx · src/pages/Inbox.tsx</w:t>
             </w:r>
           </w:p>
         </w:tc>
@@ -3531,7 +3622,7 @@
                 <w:szCs w:val="19"/>
                 <w:rtl/>
               </w:rPr>
-              <w:t xml:space="preserve">e05e715</w:t>
+              <w:t xml:space="preserve">4163939</w:t>
             </w:r>
           </w:p>
         </w:tc>
@@ -3592,7 +3683,7 @@
           <w:szCs w:val="21"/>
           <w:rtl/>
         </w:rPr>
-        <w:t xml:space="preserve">شريط رأسي على حافة الثريد يقسّمه إلى دورات فتح وإغلاق، ليصل الموظف إلى بداية أي دورة في المحادثات الطويلة التي تُعاد فتحها مراراً.</w:t>
+        <w:t xml:space="preserve">الشكل السابق كان كتلاً سميكة بينها فجوات، فكان يُقرأ كشريط تقدّم مكسور لا كأداة تنقّل. صار الآن مسطرة: خطّ شعري على حافة الثريد وعليه علامات رفيعة عند بدايات الدورات.</w:t>
       </w:r>
     </w:p>
     <w:p>
@@ -3614,7 +3705,7 @@
           <w:szCs w:val="21"/>
           <w:rtl/>
         </w:rPr>
-        <w:t xml:space="preserve">ارتفاع كل مقطع يتناسب مع عدد رسائله، فيعطي إحساساً بحجم كل دورة قبل الدخول إليها.</w:t>
+        <w:t xml:space="preserve">العلامات مجمّعة في منتصف ارتفاع الحافة كمجموعة واحدة مرتّبة، لا موزّعة على كامل الطول.</w:t>
       </w:r>
     </w:p>
     <w:p>
@@ -3636,7 +3727,7 @@
           <w:szCs w:val="21"/>
           <w:rtl/>
         </w:rPr>
-        <w:t xml:space="preserve">المرور على المقطع يُظهر اليوم والتاريخ وعدد الرسائل — «اليوم» و«أمس» لما قرُب، واسم اليوم لما بعُد.</w:t>
+        <w:t xml:space="preserve">جُرّب توزيعها على مواضعها النسبية من ارتفاع التمرير أولاً، ثم استُبدل بالتجميع في المنتصف بقرار من الإدارة: الشكل المرتّب فُضّل على دلالة الموضع. أُزيل معه كود القياس ومراقب تغيّر الحجم لأنه لم يعد له عمل.</w:t>
       </w:r>
     </w:p>
     <w:p>
@@ -3658,7 +3749,7 @@
           <w:szCs w:val="21"/>
           <w:rtl/>
         </w:rPr>
-        <w:t xml:space="preserve">الضغط ينقل إلى أول رسالة في الدورة، والمقطع الذي يقابل موضع القراءة الحالي يُبرَز تلقائياً أثناء التمرير.</w:t>
+        <w:t xml:space="preserve">المسطرة باهتة في الوضع العادي وتتوضّح بالكامل عند اقتراب المؤشر من الحافة أو عند وصول لوحة المفاتيح إليها.</w:t>
       </w:r>
     </w:p>
     <w:p>
@@ -3680,7 +3771,7 @@
           <w:szCs w:val="21"/>
           <w:rtl/>
         </w:rPr>
-        <w:t xml:space="preserve">المقاطع ذات البداية المستنتجة تُعرض بحدّ متقطّع ويذكر التلميح «بداية تقديرية»، فيبقى الفرق بين المؤكَّد والمقدَّر ظاهراً للموظف لا مخفياً عنه.</w:t>
+        <w:t xml:space="preserve">أُبقي أثر خافت دائم بدل الإخفاء التام: ميزة لا يدل عليها شيء لا يعرفها أحد، والإخفاء الكامل كان سيجعلها غير قابلة للاكتشاف.</w:t>
       </w:r>
     </w:p>
     <w:p>
@@ -3702,7 +3793,7 @@
           <w:szCs w:val="21"/>
           <w:rtl/>
         </w:rPr>
-        <w:t xml:space="preserve">الشريط يختفي كلياً حين تكون المحادثة دورة واحدة، فلا معنى لفهرس لا يفهرس شيئاً.</w:t>
+        <w:t xml:space="preserve">صارت طبقة عائمة (overlay) بدل عمود يحجز عرضاً ثابتاً، فرجع نحو 36 بكسل لمساحة الرسائل.</w:t>
       </w:r>
     </w:p>
     <w:p>
@@ -3724,7 +3815,7 @@
           <w:szCs w:val="21"/>
           <w:rtl/>
         </w:rPr>
-        <w:t xml:space="preserve">الدورات الخالية من الرسائل مستبعدة من الشريط بقرار مقصود — لا شيء يمكن الانتقال إليه فيها.</w:t>
+        <w:t xml:space="preserve">وُضعت بعد شريط التمرير بمقدار 8 بكسل حتى لا تحجب سحبه.</w:t>
       </w:r>
     </w:p>
     <w:p>
@@ -3746,7 +3837,7 @@
           <w:szCs w:val="21"/>
           <w:rtl/>
         </w:rPr>
-        <w:t xml:space="preserve">وُزّعت رسائل محادثة أحمد الشعيلي التجريبية على ثلاث دورات عبر ثلاثة أشهر لتصير الميزة قابلة للمعاينة، وصار sessionCount فيها مطابقاً للواقع بعد أن كان رقماً مكتوباً بلا سند. آخر دورة مسجّلة بحدث حقيقي وما قبلها مستنتج، ليظهر الشكلان معاً.</w:t>
+        <w:t xml:space="preserve">التمييز بين المؤكَّد والمقدَّر بقي قائماً بصرياً: علامة متصلة للدورة المسجّلة، ومتقطّعة للمستنتَجة، مع بقاء «بداية تقديرية» في التلميح.</w:t>
       </w:r>
     </w:p>
     <w:p>
@@ -3768,7 +3859,51 @@
           <w:szCs w:val="21"/>
           <w:rtl/>
         </w:rPr>
-        <w:t xml:space="preserve">عوينت النتيجة في المتصفح: الشريط والتلميح والانتقال والإبراز تعمل في الوضعين الفاتح والليلي، والمحادثات أحادية الدورة سليمة بلا شريط.</w:t>
+        <w:t xml:space="preserve">تنازل مقصود: الشكل السابق كان يعبّر عن حجم كل دورة بارتفاعها، والمسطرة لا تفعل. حجم الدورة انتقل إلى التلميح.</w:t>
+      </w:r>
+    </w:p>
+    <w:p>
+      <w:pPr>
+        <w:pStyle w:val="ListParagraph"/>
+        <w:numPr>
+          <w:ilvl w:val="0"/>
+          <w:numId w:val="2"/>
+        </w:numPr>
+        <w:bidi/>
+        <w:spacing w:after="70" w:line="290"/>
+        <w:jc w:val="right"/>
+      </w:pPr>
+      <w:r>
+        <w:rPr>
+          <w:rFonts w:ascii="Arial" w:cs="Arial" w:eastAsia="Arial" w:hAnsi="Arial"/>
+          <w:color w:val="1E293B"/>
+          <w:sz w:val="21"/>
+          <w:szCs w:val="21"/>
+          <w:rtl/>
+        </w:rPr>
+        <w:t xml:space="preserve">مجموعة العلامات تقبل التمرير داخلها إن كثرت الدورات حتى لا تتجاوز ارتفاع اللوحة. ولأن ذلك يقصّ التلميح، رُفع التلميح خارج المجموعة ويُحاذى رأسياً بالعلامة المؤشَّر عليها بالقياس.</w:t>
+      </w:r>
+    </w:p>
+    <w:p>
+      <w:pPr>
+        <w:pStyle w:val="ListParagraph"/>
+        <w:numPr>
+          <w:ilvl w:val="0"/>
+          <w:numId w:val="2"/>
+        </w:numPr>
+        <w:bidi/>
+        <w:spacing w:after="70" w:line="290"/>
+        <w:jc w:val="right"/>
+      </w:pPr>
+      <w:r>
+        <w:rPr>
+          <w:rFonts w:ascii="Arial" w:cs="Arial" w:eastAsia="Arial" w:hAnsi="Arial"/>
+          <w:color w:val="1E293B"/>
+          <w:sz w:val="21"/>
+          <w:szCs w:val="21"/>
+          <w:rtl/>
+        </w:rPr>
+        <w:t xml:space="preserve">عوينت النتيجة في المتصفح: العلامات الثلاث متجمّعة في المنتصف، والتوضّح بالاقتراب والتلميح والانتقال تعمل.</w:t>
       </w:r>
     </w:p>
     <w:p>
@@ -3793,7 +3928,7 @@
           <w:szCs w:val="24"/>
           <w:rtl/>
         </w:rPr>
-        <w:t xml:space="preserve">تعديل رقم 4 — تسجيل دورات المحادثة واشتقاقها — أساس شريط فهرسة الثريد</w:t>
+        <w:t xml:space="preserve">تعديل رقم 5 — شريط فهرسة دورات المحادثة داخل الثريد</w:t>
       </w:r>
     </w:p>
     <w:p>
@@ -4070,7 +4205,7 @@
                 <w:szCs w:val="19"/>
                 <w:rtl/>
               </w:rPr>
-              <w:t xml:space="preserve">صندوق الوارد (طبقة البيانات)</w:t>
+              <w:t xml:space="preserve">صندوق الوارد</w:t>
             </w:r>
           </w:p>
         </w:tc>
@@ -4130,7 +4265,7 @@
                 <w:szCs w:val="19"/>
                 <w:rtl/>
               </w:rPr>
-              <w:t xml:space="preserve">src/utils/sessions.ts · src/store/useDataStore.ts · src/types/index.ts</w:t>
+              <w:t xml:space="preserve">src/components/inbox/SessionRail.tsx · src/pages/Inbox.tsx · src/store/mockData.ts</w:t>
             </w:r>
           </w:p>
         </w:tc>
@@ -4160,7 +4295,7 @@
                 <w:szCs w:val="19"/>
                 <w:rtl/>
               </w:rPr>
-              <w:t xml:space="preserve">5cf29e1</w:t>
+              <w:t xml:space="preserve">e05e715</w:t>
             </w:r>
           </w:p>
         </w:tc>
@@ -4221,7 +4356,7 @@
           <w:szCs w:val="21"/>
           <w:rtl/>
         </w:rPr>
-        <w:t xml:space="preserve">المشكلة: المحادثة الواحدة تُعاد فتحها كلما راسل العميل بعد الإغلاق، فيصير الثريد بلا نهاية. ولرسم شريط فهرسة يقسّمه إلى دورات، لزم معرفة توقيت كل فتح وإغلاق — وهي بيانات لم تكن تُسجَّل إطلاقاً.</w:t>
+        <w:t xml:space="preserve">شريط رأسي على حافة الثريد يقسّمه إلى دورات فتح وإغلاق، ليصل الموظف إلى بداية أي دورة في المحادثات الطويلة التي تُعاد فتحها مراراً.</w:t>
       </w:r>
     </w:p>
     <w:p>
@@ -4243,7 +4378,7 @@
           <w:szCs w:val="21"/>
           <w:rtl/>
         </w:rPr>
-        <w:t xml:space="preserve">كان الحقل sessionCount يُكتب مرة واحدة عند الإنشاء ولا يزيده أي سطر في المشروع، وقيمه في البيانات التجريبية مكتوبة يدوياً. كذلك activityLog على المحادثة كان مُعرَّفاً في الأنواع لكن لا دالة تكتب فيه وقت التشغيل.</w:t>
+        <w:t xml:space="preserve">ارتفاع كل مقطع يتناسب مع عدد رسائله، فيعطي إحساساً بحجم كل دورة قبل الدخول إليها.</w:t>
       </w:r>
     </w:p>
     <w:p>
@@ -4265,7 +4400,7 @@
           <w:szCs w:val="21"/>
           <w:rtl/>
         </w:rPr>
-        <w:t xml:space="preserve">أُضيف النوع SessionEvent لتسجيل حدث فتح أو إغلاق بتوقيته وصاحبه، والنوع ConversationSession يمثّل الدورة المشتقّة.</w:t>
+        <w:t xml:space="preserve">المرور على المقطع يُظهر اليوم والتاريخ وعدد الرسائل — «اليوم» و«أمس» لما قرُب، واسم اليوم لما بعُد.</w:t>
       </w:r>
     </w:p>
     <w:p>
@@ -4287,7 +4422,7 @@
           <w:szCs w:val="21"/>
           <w:rtl/>
         </w:rPr>
-        <w:t xml:space="preserve">صارت أربعة مواضع تسجّل الحدث فعلياً: setConversationStatus عند الإغلاق أو إعادة الفتح، reopenConversation، ورسالة العميل الواردة نصية أو صوتية حين تُحيي محادثة مغلقة — وهذا آخرها كان يمرّ بلا أي أثر رغم أنه أكثرها تكراراً.</w:t>
+        <w:t xml:space="preserve">الضغط ينقل إلى أول رسالة في الدورة، والمقطع الذي يقابل موضع القراءة الحالي يُبرَز تلقائياً أثناء التمرير.</w:t>
       </w:r>
     </w:p>
     <w:p>
@@ -4309,7 +4444,7 @@
           <w:szCs w:val="21"/>
           <w:rtl/>
         </w:rPr>
-        <w:t xml:space="preserve">أُضيفت الدالة deriveSessions التي تقسّم الثريد إلى دورات: الأحداث المسجّلة مرجع قاطع، وما سبقها من تاريخ قديم تُستنتج حدوده من فجوات الصمت (24 ساعة افتراضاً) وتُعلَّم inferred حتى يظل الفرق بين المؤكَّد والمقدَّر ظاهراً.</w:t>
+        <w:t xml:space="preserve">المقاطع ذات البداية المستنتجة تُعرض بحدّ متقطّع ويذكر التلميح «بداية تقديرية»، فيبقى الفرق بين المؤكَّد والمقدَّر ظاهراً للموظف لا مخفياً عنه.</w:t>
       </w:r>
     </w:p>
     <w:p>
@@ -4331,7 +4466,7 @@
           <w:szCs w:val="21"/>
           <w:rtl/>
         </w:rPr>
-        <w:t xml:space="preserve">الدالة تتعامل مع الحالة المختلطة: ثريد فيه تاريخ قديم مُستنتج ودورات جديدة مسجّلة في آن واحد.</w:t>
+        <w:t xml:space="preserve">الشريط يختفي كلياً حين تكون المحادثة دورة واحدة، فلا معنى لفهرس لا يفهرس شيئاً.</w:t>
       </w:r>
     </w:p>
     <w:p>
@@ -4353,7 +4488,7 @@
           <w:szCs w:val="21"/>
           <w:rtl/>
         </w:rPr>
-        <w:t xml:space="preserve">اختُبر المنطق على ثماني حالات شملت الثريد الفارغ والرسالة الواحدة والفجوات المتعددة والأحداث المسجّلة والحالة المختلطة والمدخلات غير المرتّبة زمنياً — جميعها نجحت.</w:t>
+        <w:t xml:space="preserve">الدورات الخالية من الرسائل مستبعدة من الشريط بقرار مقصود — لا شيء يمكن الانتقال إليه فيها.</w:t>
       </w:r>
     </w:p>
     <w:p>
@@ -4375,7 +4510,7 @@
           <w:szCs w:val="21"/>
           <w:rtl/>
         </w:rPr>
-        <w:t xml:space="preserve">ملاحظة على البيانات الحالية: كل المحادثات التجريبية تُنتج دورة واحدة لأن رسائلها متقاربة بدقائق ولا فجوات فيها. الشريط لن يُظهر تقسيماً حقيقياً قبل توفّر بيانات متباعدة زمنياً.</w:t>
+        <w:t xml:space="preserve">وُزّعت رسائل محادثة أحمد الشعيلي التجريبية على ثلاث دورات عبر ثلاثة أشهر لتصير الميزة قابلة للمعاينة، وصار sessionCount فيها مطابقاً للواقع بعد أن كان رقماً مكتوباً بلا سند. آخر دورة مسجّلة بحدث حقيقي وما قبلها مستنتج، ليظهر الشكلان معاً.</w:t>
       </w:r>
     </w:p>
     <w:p>
@@ -4397,7 +4532,7 @@
           <w:szCs w:val="21"/>
           <w:rtl/>
         </w:rPr>
-        <w:t xml:space="preserve">لم تُبنَ واجهة الشريط بعد — هذا التعديل يغطّي طبقة البيانات وحدها.</w:t>
+        <w:t xml:space="preserve">عوينت النتيجة في المتصفح: الشريط والتلميح والانتقال والإبراز تعمل في الوضعين الفاتح والليلي، والمحادثات أحادية الدورة سليمة بلا شريط.</w:t>
       </w:r>
     </w:p>
     <w:p>
@@ -4422,7 +4557,7 @@
           <w:szCs w:val="24"/>
           <w:rtl/>
         </w:rPr>
-        <w:t xml:space="preserve">تعديل رقم 3 — إزالة كارت نسبة الاستجابة من صفحة تقييمات العملاء</w:t>
+        <w:t xml:space="preserve">تعديل رقم 4 — تسجيل دورات المحادثة واشتقاقها — أساس شريط فهرسة الثريد</w:t>
       </w:r>
     </w:p>
     <w:p>
@@ -4699,7 +4834,7 @@
                 <w:szCs w:val="19"/>
                 <w:rtl/>
               </w:rPr>
-              <w:t xml:space="preserve">تقييمات العملاء</w:t>
+              <w:t xml:space="preserve">صندوق الوارد (طبقة البيانات)</w:t>
             </w:r>
           </w:p>
         </w:tc>
@@ -4729,7 +4864,7 @@
                 <w:szCs w:val="19"/>
                 <w:rtl/>
               </w:rPr>
-              <w:t xml:space="preserve">/rating</w:t>
+              <w:t xml:space="preserve">/inbox</w:t>
             </w:r>
           </w:p>
         </w:tc>
@@ -4759,7 +4894,7 @@
                 <w:szCs w:val="19"/>
                 <w:rtl/>
               </w:rPr>
-              <w:t xml:space="preserve">src/pages/CustomerRatings.tsx</w:t>
+              <w:t xml:space="preserve">src/utils/sessions.ts · src/store/useDataStore.ts · src/types/index.ts</w:t>
             </w:r>
           </w:p>
         </w:tc>
@@ -4789,7 +4924,7 @@
                 <w:szCs w:val="19"/>
                 <w:rtl/>
               </w:rPr>
-              <w:t xml:space="preserve">cc8bd4f</w:t>
+              <w:t xml:space="preserve">5cf29e1</w:t>
             </w:r>
           </w:p>
         </w:tc>
@@ -4850,7 +4985,7 @@
           <w:szCs w:val="21"/>
           <w:rtl/>
         </w:rPr>
-        <w:t xml:space="preserve">حُذف كارت «نسبة الاستجابة» بالكامل من شريط الإحصائيات — صارت 3 كروت بدل 4.</w:t>
+        <w:t xml:space="preserve">المشكلة: المحادثة الواحدة تُعاد فتحها كلما راسل العميل بعد الإغلاق، فيصير الثريد بلا نهاية. ولرسم شريط فهرسة يقسّمه إلى دورات، لزم معرفة توقيت كل فتح وإغلاق — وهي بيانات لم تكن تُسجَّل إطلاقاً.</w:t>
       </w:r>
     </w:p>
     <w:p>
@@ -4872,7 +5007,7 @@
           <w:szCs w:val="21"/>
           <w:rtl/>
         </w:rPr>
-        <w:t xml:space="preserve">حُذف معه حساب responseRate لأنه لم يعد له مستهلك في الصفحة.</w:t>
+        <w:t xml:space="preserve">كان الحقل sessionCount يُكتب مرة واحدة عند الإنشاء ولا يزيده أي سطر في المشروع، وقيمه في البيانات التجريبية مكتوبة يدوياً. كذلك activityLog على المحادثة كان مُعرَّفاً في الأنواع لكن لا دالة تكتب فيه وقت التشغيل.</w:t>
       </w:r>
     </w:p>
     <w:p>
@@ -4894,7 +5029,7 @@
           <w:szCs w:val="21"/>
           <w:rtl/>
         </w:rPr>
-        <w:t xml:space="preserve">حُذف استيراد أيقونة TrendingUp لأنها كانت مستخدمة في هذا الكارت وحده.</w:t>
+        <w:t xml:space="preserve">أُضيف النوع SessionEvent لتسجيل حدث فتح أو إغلاق بتوقيته وصاحبه، والنوع ConversationSession يمثّل الدورة المشتقّة.</w:t>
       </w:r>
     </w:p>
     <w:p>
@@ -4916,7 +5051,7 @@
           <w:szCs w:val="21"/>
           <w:rtl/>
         </w:rPr>
-        <w:t xml:space="preserve">عُدّلت شبكة العرض من grid-cols-2 lg:grid-cols-4 إلى grid-cols-1 sm:grid-cols-3، حتى لا يبقى كارت يتيم في سطر منفصل على الشاشات الصغيرة.</w:t>
+        <w:t xml:space="preserve">صارت أربعة مواضع تسجّل الحدث فعلياً: setConversationStatus عند الإغلاق أو إعادة الفتح، reopenConversation، ورسالة العميل الواردة نصية أو صوتية حين تُحيي محادثة مغلقة — وهذا آخرها كان يمرّ بلا أي أثر رغم أنه أكثرها تكراراً.</w:t>
       </w:r>
     </w:p>
     <w:p>
@@ -4938,7 +5073,95 @@
           <w:szCs w:val="21"/>
           <w:rtl/>
         </w:rPr>
-        <w:t xml:space="preserve">الكروت الباقية: متوسط تقييم المحادثة، متوسط تقييم الموظفين، إجمالي الروابط.</w:t>
+        <w:t xml:space="preserve">أُضيفت الدالة deriveSessions التي تقسّم الثريد إلى دورات: الأحداث المسجّلة مرجع قاطع، وما سبقها من تاريخ قديم تُستنتج حدوده من فجوات الصمت (24 ساعة افتراضاً) وتُعلَّم inferred حتى يظل الفرق بين المؤكَّد والمقدَّر ظاهراً.</w:t>
+      </w:r>
+    </w:p>
+    <w:p>
+      <w:pPr>
+        <w:pStyle w:val="ListParagraph"/>
+        <w:numPr>
+          <w:ilvl w:val="0"/>
+          <w:numId w:val="2"/>
+        </w:numPr>
+        <w:bidi/>
+        <w:spacing w:after="70" w:line="290"/>
+        <w:jc w:val="right"/>
+      </w:pPr>
+      <w:r>
+        <w:rPr>
+          <w:rFonts w:ascii="Arial" w:cs="Arial" w:eastAsia="Arial" w:hAnsi="Arial"/>
+          <w:color w:val="1E293B"/>
+          <w:sz w:val="21"/>
+          <w:szCs w:val="21"/>
+          <w:rtl/>
+        </w:rPr>
+        <w:t xml:space="preserve">الدالة تتعامل مع الحالة المختلطة: ثريد فيه تاريخ قديم مُستنتج ودورات جديدة مسجّلة في آن واحد.</w:t>
+      </w:r>
+    </w:p>
+    <w:p>
+      <w:pPr>
+        <w:pStyle w:val="ListParagraph"/>
+        <w:numPr>
+          <w:ilvl w:val="0"/>
+          <w:numId w:val="2"/>
+        </w:numPr>
+        <w:bidi/>
+        <w:spacing w:after="70" w:line="290"/>
+        <w:jc w:val="right"/>
+      </w:pPr>
+      <w:r>
+        <w:rPr>
+          <w:rFonts w:ascii="Arial" w:cs="Arial" w:eastAsia="Arial" w:hAnsi="Arial"/>
+          <w:color w:val="1E293B"/>
+          <w:sz w:val="21"/>
+          <w:szCs w:val="21"/>
+          <w:rtl/>
+        </w:rPr>
+        <w:t xml:space="preserve">اختُبر المنطق على ثماني حالات شملت الثريد الفارغ والرسالة الواحدة والفجوات المتعددة والأحداث المسجّلة والحالة المختلطة والمدخلات غير المرتّبة زمنياً — جميعها نجحت.</w:t>
+      </w:r>
+    </w:p>
+    <w:p>
+      <w:pPr>
+        <w:pStyle w:val="ListParagraph"/>
+        <w:numPr>
+          <w:ilvl w:val="0"/>
+          <w:numId w:val="2"/>
+        </w:numPr>
+        <w:bidi/>
+        <w:spacing w:after="70" w:line="290"/>
+        <w:jc w:val="right"/>
+      </w:pPr>
+      <w:r>
+        <w:rPr>
+          <w:rFonts w:ascii="Arial" w:cs="Arial" w:eastAsia="Arial" w:hAnsi="Arial"/>
+          <w:color w:val="1E293B"/>
+          <w:sz w:val="21"/>
+          <w:szCs w:val="21"/>
+          <w:rtl/>
+        </w:rPr>
+        <w:t xml:space="preserve">ملاحظة على البيانات الحالية: كل المحادثات التجريبية تُنتج دورة واحدة لأن رسائلها متقاربة بدقائق ولا فجوات فيها. الشريط لن يُظهر تقسيماً حقيقياً قبل توفّر بيانات متباعدة زمنياً.</w:t>
+      </w:r>
+    </w:p>
+    <w:p>
+      <w:pPr>
+        <w:pStyle w:val="ListParagraph"/>
+        <w:numPr>
+          <w:ilvl w:val="0"/>
+          <w:numId w:val="2"/>
+        </w:numPr>
+        <w:bidi/>
+        <w:spacing w:after="70" w:line="290"/>
+        <w:jc w:val="right"/>
+      </w:pPr>
+      <w:r>
+        <w:rPr>
+          <w:rFonts w:ascii="Arial" w:cs="Arial" w:eastAsia="Arial" w:hAnsi="Arial"/>
+          <w:color w:val="1E293B"/>
+          <w:sz w:val="21"/>
+          <w:szCs w:val="21"/>
+          <w:rtl/>
+        </w:rPr>
+        <w:t xml:space="preserve">لم تُبنَ واجهة الشريط بعد — هذا التعديل يغطّي طبقة البيانات وحدها.</w:t>
       </w:r>
     </w:p>
     <w:p>
@@ -4963,7 +5186,7 @@
           <w:szCs w:val="24"/>
           <w:rtl/>
         </w:rPr>
-        <w:t xml:space="preserve">تعديل رقم 2 — تغيير تسمية زر الترقية في صفحة الفوترة</w:t>
+        <w:t xml:space="preserve">تعديل رقم 3 — إزالة كارت نسبة الاستجابة من صفحة تقييمات العملاء</w:t>
       </w:r>
     </w:p>
     <w:p>
@@ -5210,7 +5433,7 @@
                 <w:szCs w:val="19"/>
                 <w:rtl/>
               </w:rPr>
-              <w:t xml:space="preserve">9 سبتمبر 2026</w:t>
+              <w:t xml:space="preserve">10 سبتمبر 2026</w:t>
             </w:r>
           </w:p>
         </w:tc>
@@ -5240,7 +5463,7 @@
                 <w:szCs w:val="19"/>
                 <w:rtl/>
               </w:rPr>
-              <w:t xml:space="preserve">الفوترة</w:t>
+              <w:t xml:space="preserve">تقييمات العملاء</w:t>
             </w:r>
           </w:p>
         </w:tc>
@@ -5270,7 +5493,7 @@
                 <w:szCs w:val="19"/>
                 <w:rtl/>
               </w:rPr>
-              <w:t xml:space="preserve">/billing</w:t>
+              <w:t xml:space="preserve">/rating</w:t>
             </w:r>
           </w:p>
         </w:tc>
@@ -5300,7 +5523,7 @@
                 <w:szCs w:val="19"/>
                 <w:rtl/>
               </w:rPr>
-              <w:t xml:space="preserve">src/pages/Billing.tsx</w:t>
+              <w:t xml:space="preserve">src/pages/CustomerRatings.tsx</w:t>
             </w:r>
           </w:p>
         </w:tc>
@@ -5330,7 +5553,7 @@
                 <w:szCs w:val="19"/>
                 <w:rtl/>
               </w:rPr>
-              <w:t xml:space="preserve">be5b3c0</w:t>
+              <w:t xml:space="preserve">cc8bd4f</w:t>
             </w:r>
           </w:p>
         </w:tc>
@@ -5391,7 +5614,7 @@
           <w:szCs w:val="21"/>
           <w:rtl/>
         </w:rPr>
-        <w:t xml:space="preserve">زر «ترقية» أصبح «تغيير الباقة».</w:t>
+        <w:t xml:space="preserve">حُذف كارت «نسبة الاستجابة» بالكامل من شريط الإحصائيات — صارت 3 كروت بدل 4.</w:t>
       </w:r>
     </w:p>
     <w:p>
@@ -5413,7 +5636,73 @@
           <w:szCs w:val="21"/>
           <w:rtl/>
         </w:rPr>
-        <w:t xml:space="preserve">سبب التغيير: الزر يوصّل إلى مسار يشمل الترقية والتخفيض معاً، فالتسمية القديمة كانت تصف نصف وظيفته.</w:t>
+        <w:t xml:space="preserve">حُذف معه حساب responseRate لأنه لم يعد له مستهلك في الصفحة.</w:t>
+      </w:r>
+    </w:p>
+    <w:p>
+      <w:pPr>
+        <w:pStyle w:val="ListParagraph"/>
+        <w:numPr>
+          <w:ilvl w:val="0"/>
+          <w:numId w:val="2"/>
+        </w:numPr>
+        <w:bidi/>
+        <w:spacing w:after="70" w:line="290"/>
+        <w:jc w:val="right"/>
+      </w:pPr>
+      <w:r>
+        <w:rPr>
+          <w:rFonts w:ascii="Arial" w:cs="Arial" w:eastAsia="Arial" w:hAnsi="Arial"/>
+          <w:color w:val="1E293B"/>
+          <w:sz w:val="21"/>
+          <w:szCs w:val="21"/>
+          <w:rtl/>
+        </w:rPr>
+        <w:t xml:space="preserve">حُذف استيراد أيقونة TrendingUp لأنها كانت مستخدمة في هذا الكارت وحده.</w:t>
+      </w:r>
+    </w:p>
+    <w:p>
+      <w:pPr>
+        <w:pStyle w:val="ListParagraph"/>
+        <w:numPr>
+          <w:ilvl w:val="0"/>
+          <w:numId w:val="2"/>
+        </w:numPr>
+        <w:bidi/>
+        <w:spacing w:after="70" w:line="290"/>
+        <w:jc w:val="right"/>
+      </w:pPr>
+      <w:r>
+        <w:rPr>
+          <w:rFonts w:ascii="Arial" w:cs="Arial" w:eastAsia="Arial" w:hAnsi="Arial"/>
+          <w:color w:val="1E293B"/>
+          <w:sz w:val="21"/>
+          <w:szCs w:val="21"/>
+          <w:rtl/>
+        </w:rPr>
+        <w:t xml:space="preserve">عُدّلت شبكة العرض من grid-cols-2 lg:grid-cols-4 إلى grid-cols-1 sm:grid-cols-3، حتى لا يبقى كارت يتيم في سطر منفصل على الشاشات الصغيرة.</w:t>
+      </w:r>
+    </w:p>
+    <w:p>
+      <w:pPr>
+        <w:pStyle w:val="ListParagraph"/>
+        <w:numPr>
+          <w:ilvl w:val="0"/>
+          <w:numId w:val="2"/>
+        </w:numPr>
+        <w:bidi/>
+        <w:spacing w:after="70" w:line="290"/>
+        <w:jc w:val="right"/>
+      </w:pPr>
+      <w:r>
+        <w:rPr>
+          <w:rFonts w:ascii="Arial" w:cs="Arial" w:eastAsia="Arial" w:hAnsi="Arial"/>
+          <w:color w:val="1E293B"/>
+          <w:sz w:val="21"/>
+          <w:szCs w:val="21"/>
+          <w:rtl/>
+        </w:rPr>
+        <w:t xml:space="preserve">الكروت الباقية: متوسط تقييم المحادثة، متوسط تقييم الموظفين، إجمالي الروابط.</w:t>
       </w:r>
     </w:p>
     <w:p>
@@ -5438,7 +5727,7 @@
           <w:szCs w:val="24"/>
           <w:rtl/>
         </w:rPr>
-        <w:t xml:space="preserve">تعديل رقم 1 — ميزة تغيير الباقة — US-131</w:t>
+        <w:t xml:space="preserve">تعديل رقم 2 — تغيير تسمية زر الترقية في صفحة الفوترة</w:t>
       </w:r>
     </w:p>
     <w:p>
@@ -5715,7 +6004,7 @@
                 <w:szCs w:val="19"/>
                 <w:rtl/>
               </w:rPr>
-              <w:t xml:space="preserve">الاشتراك</w:t>
+              <w:t xml:space="preserve">الفوترة</w:t>
             </w:r>
           </w:p>
         </w:tc>
@@ -5745,7 +6034,7 @@
                 <w:szCs w:val="19"/>
                 <w:rtl/>
               </w:rPr>
-              <w:t xml:space="preserve">/subscribe</w:t>
+              <w:t xml:space="preserve">/billing</w:t>
             </w:r>
           </w:p>
         </w:tc>
@@ -5775,7 +6064,7 @@
                 <w:szCs w:val="19"/>
                 <w:rtl/>
               </w:rPr>
-              <w:t xml:space="preserve">src/pages/Subscribe.tsx</w:t>
+              <w:t xml:space="preserve">src/pages/Billing.tsx</w:t>
             </w:r>
           </w:p>
         </w:tc>
@@ -5805,7 +6094,7 @@
                 <w:szCs w:val="19"/>
                 <w:rtl/>
               </w:rPr>
-              <w:t xml:space="preserve">be5b3c0 · c49b797</w:t>
+              <w:t xml:space="preserve">be5b3c0</w:t>
             </w:r>
           </w:p>
         </w:tc>
@@ -5866,7 +6155,7 @@
           <w:szCs w:val="21"/>
           <w:rtl/>
         </w:rPr>
-        <w:t xml:space="preserve">إعادة بناء شبه كاملة للصفحة — 715 سطراً متغيّراً.</w:t>
+        <w:t xml:space="preserve">زر «ترقية» أصبح «تغيير الباقة».</w:t>
       </w:r>
     </w:p>
     <w:p>
@@ -5888,8 +6177,439 @@
           <w:szCs w:val="21"/>
           <w:rtl/>
         </w:rPr>
-        <w:t xml:space="preserve">اختيار الباقة صار بشريط تمرير (slider) حسب عدد المحادثات الشهرية بدل شبكة الكروت. كل باقة نقطة توقف على الشريط، وباقة المؤسسات هي النقطة الأخيرة بعنوان «غير محدود».</w:t>
-      </w:r>
+        <w:t xml:space="preserve">سبب التغيير: الزر يوصّل إلى مسار يشمل الترقية والتخفيض معاً، فالتسمية القديمة كانت تصف نصف وظيفته.</w:t>
+      </w:r>
+    </w:p>
+    <w:p>
+      <w:pPr>
+        <w:spacing w:after="160"/>
+      </w:pPr>
+    </w:p>
+    <w:p>
+      <w:pPr>
+        <w:pStyle w:val="Heading2"/>
+        <w:bidi/>
+        <w:spacing w:after="120" w:before="300"/>
+        <w:jc w:val="right"/>
+      </w:pPr>
+      <w:r>
+        <w:rPr>
+          <w:rFonts w:ascii="Arial" w:cs="Arial" w:eastAsia="Arial" w:hAnsi="Arial"/>
+          <w:b/>
+          <w:bCs/>
+          <w:color w:val="1E293B"/>
+          <w:sz w:val="24"/>
+          <w:szCs w:val="24"/>
+          <w:rtl/>
+        </w:rPr>
+        <w:t xml:space="preserve">تعديل رقم 1 — ميزة تغيير الباقة — US-131</w:t>
+      </w:r>
+    </w:p>
+    <w:p>
+      <w:pPr>
+        <w:spacing w:after="50"/>
+      </w:pPr>
+    </w:p>
+    <w:tbl>
+      <w:tblPr>
+        <w:bidiVisual/>
+        <w:tblW w:type="dxa" w:w="9000"/>
+        <w:tblBorders>
+          <w:top w:val="single" w:color="CBD5E1" w:sz="4"/>
+          <w:left w:val="single" w:color="CBD5E1" w:sz="4"/>
+          <w:bottom w:val="single" w:color="CBD5E1" w:sz="4"/>
+          <w:right w:val="single" w:color="CBD5E1" w:sz="4"/>
+          <w:insideH w:val="single" w:color="CBD5E1" w:sz="4"/>
+          <w:insideV w:val="single" w:color="CBD5E1" w:sz="4"/>
+        </w:tblBorders>
+      </w:tblPr>
+      <w:tblGrid>
+        <w:gridCol w:w="1250"/>
+        <w:gridCol w:w="1250"/>
+        <w:gridCol w:w="1150"/>
+        <w:gridCol w:w="2500"/>
+        <w:gridCol w:w="1350"/>
+        <w:gridCol w:w="1500"/>
+      </w:tblGrid>
+      <w:tr>
+        <w:trPr>
+          <w:tblHeader/>
+        </w:trPr>
+        <w:tc>
+          <w:tcPr>
+            <w:tcW w:type="dxa" w:w="1250"/>
+            <w:shd w:fill="2563EB" w:color="auto" w:val="clear"/>
+            <w:tcMar>
+              <w:top w:type="dxa" w:w="90"/>
+              <w:left w:type="dxa" w:w="110"/>
+              <w:bottom w:type="dxa" w:w="90"/>
+              <w:right w:type="dxa" w:w="110"/>
+            </w:tcMar>
+          </w:tcPr>
+          <w:p>
+            <w:pPr>
+              <w:bidi/>
+              <w:spacing w:after="0" w:line="280"/>
+              <w:jc w:val="right"/>
+            </w:pPr>
+            <w:r>
+              <w:rPr>
+                <w:rFonts w:ascii="Arial" w:cs="Arial" w:eastAsia="Arial" w:hAnsi="Arial"/>
+                <w:b/>
+                <w:bCs/>
+                <w:color w:val="FFFFFF"/>
+                <w:sz w:val="19"/>
+                <w:szCs w:val="19"/>
+                <w:rtl/>
+              </w:rPr>
+              <w:t xml:space="preserve">التاريخ</w:t>
+            </w:r>
+          </w:p>
+        </w:tc>
+        <w:tc>
+          <w:tcPr>
+            <w:tcW w:type="dxa" w:w="1250"/>
+            <w:shd w:fill="2563EB" w:color="auto" w:val="clear"/>
+            <w:tcMar>
+              <w:top w:type="dxa" w:w="90"/>
+              <w:left w:type="dxa" w:w="110"/>
+              <w:bottom w:type="dxa" w:w="90"/>
+              <w:right w:type="dxa" w:w="110"/>
+            </w:tcMar>
+          </w:tcPr>
+          <w:p>
+            <w:pPr>
+              <w:bidi/>
+              <w:spacing w:after="0" w:line="280"/>
+              <w:jc w:val="right"/>
+            </w:pPr>
+            <w:r>
+              <w:rPr>
+                <w:rFonts w:ascii="Arial" w:cs="Arial" w:eastAsia="Arial" w:hAnsi="Arial"/>
+                <w:b/>
+                <w:bCs/>
+                <w:color w:val="FFFFFF"/>
+                <w:sz w:val="19"/>
+                <w:szCs w:val="19"/>
+                <w:rtl/>
+              </w:rPr>
+              <w:t xml:space="preserve">الصفحة</w:t>
+            </w:r>
+          </w:p>
+        </w:tc>
+        <w:tc>
+          <w:tcPr>
+            <w:tcW w:type="dxa" w:w="1150"/>
+            <w:shd w:fill="2563EB" w:color="auto" w:val="clear"/>
+            <w:tcMar>
+              <w:top w:type="dxa" w:w="90"/>
+              <w:left w:type="dxa" w:w="110"/>
+              <w:bottom w:type="dxa" w:w="90"/>
+              <w:right w:type="dxa" w:w="110"/>
+            </w:tcMar>
+          </w:tcPr>
+          <w:p>
+            <w:pPr>
+              <w:bidi/>
+              <w:spacing w:after="0" w:line="280"/>
+              <w:jc w:val="right"/>
+            </w:pPr>
+            <w:r>
+              <w:rPr>
+                <w:rFonts w:ascii="Arial" w:cs="Arial" w:eastAsia="Arial" w:hAnsi="Arial"/>
+                <w:b/>
+                <w:bCs/>
+                <w:color w:val="FFFFFF"/>
+                <w:sz w:val="19"/>
+                <w:szCs w:val="19"/>
+                <w:rtl/>
+              </w:rPr>
+              <w:t xml:space="preserve">المسار</w:t>
+            </w:r>
+          </w:p>
+        </w:tc>
+        <w:tc>
+          <w:tcPr>
+            <w:tcW w:type="dxa" w:w="2500"/>
+            <w:shd w:fill="2563EB" w:color="auto" w:val="clear"/>
+            <w:tcMar>
+              <w:top w:type="dxa" w:w="90"/>
+              <w:left w:type="dxa" w:w="110"/>
+              <w:bottom w:type="dxa" w:w="90"/>
+              <w:right w:type="dxa" w:w="110"/>
+            </w:tcMar>
+          </w:tcPr>
+          <w:p>
+            <w:pPr>
+              <w:bidi/>
+              <w:spacing w:after="0" w:line="280"/>
+              <w:jc w:val="right"/>
+            </w:pPr>
+            <w:r>
+              <w:rPr>
+                <w:rFonts w:ascii="Arial" w:cs="Arial" w:eastAsia="Arial" w:hAnsi="Arial"/>
+                <w:b/>
+                <w:bCs/>
+                <w:color w:val="FFFFFF"/>
+                <w:sz w:val="19"/>
+                <w:szCs w:val="19"/>
+                <w:rtl/>
+              </w:rPr>
+              <w:t xml:space="preserve">الملف</w:t>
+            </w:r>
+          </w:p>
+        </w:tc>
+        <w:tc>
+          <w:tcPr>
+            <w:tcW w:type="dxa" w:w="1350"/>
+            <w:shd w:fill="2563EB" w:color="auto" w:val="clear"/>
+            <w:tcMar>
+              <w:top w:type="dxa" w:w="90"/>
+              <w:left w:type="dxa" w:w="110"/>
+              <w:bottom w:type="dxa" w:w="90"/>
+              <w:right w:type="dxa" w:w="110"/>
+            </w:tcMar>
+          </w:tcPr>
+          <w:p>
+            <w:pPr>
+              <w:bidi/>
+              <w:spacing w:after="0" w:line="280"/>
+              <w:jc w:val="right"/>
+            </w:pPr>
+            <w:r>
+              <w:rPr>
+                <w:rFonts w:ascii="Arial" w:cs="Arial" w:eastAsia="Arial" w:hAnsi="Arial"/>
+                <w:b/>
+                <w:bCs/>
+                <w:color w:val="FFFFFF"/>
+                <w:sz w:val="19"/>
+                <w:szCs w:val="19"/>
+                <w:rtl/>
+              </w:rPr>
+              <w:t xml:space="preserve">الكوميت</w:t>
+            </w:r>
+          </w:p>
+        </w:tc>
+        <w:tc>
+          <w:tcPr>
+            <w:tcW w:type="dxa" w:w="1500"/>
+            <w:shd w:fill="2563EB" w:color="auto" w:val="clear"/>
+            <w:tcMar>
+              <w:top w:type="dxa" w:w="90"/>
+              <w:left w:type="dxa" w:w="110"/>
+              <w:bottom w:type="dxa" w:w="90"/>
+              <w:right w:type="dxa" w:w="110"/>
+            </w:tcMar>
+          </w:tcPr>
+          <w:p>
+            <w:pPr>
+              <w:bidi/>
+              <w:spacing w:after="0" w:line="280"/>
+              <w:jc w:val="right"/>
+            </w:pPr>
+            <w:r>
+              <w:rPr>
+                <w:rFonts w:ascii="Arial" w:cs="Arial" w:eastAsia="Arial" w:hAnsi="Arial"/>
+                <w:b/>
+                <w:bCs/>
+                <w:color w:val="FFFFFF"/>
+                <w:sz w:val="19"/>
+                <w:szCs w:val="19"/>
+                <w:rtl/>
+              </w:rPr>
+              <w:t xml:space="preserve">الحالة</w:t>
+            </w:r>
+          </w:p>
+        </w:tc>
+      </w:tr>
+      <w:tr>
+        <w:tc>
+          <w:tcPr>
+            <w:tcW w:type="dxa" w:w="1250"/>
+            <w:tcMar>
+              <w:top w:type="dxa" w:w="90"/>
+              <w:left w:type="dxa" w:w="110"/>
+              <w:bottom w:type="dxa" w:w="90"/>
+              <w:right w:type="dxa" w:w="110"/>
+            </w:tcMar>
+          </w:tcPr>
+          <w:p>
+            <w:pPr>
+              <w:bidi/>
+              <w:spacing w:after="0" w:line="280"/>
+              <w:jc w:val="right"/>
+            </w:pPr>
+            <w:r>
+              <w:rPr>
+                <w:rFonts w:ascii="Arial" w:cs="Arial" w:eastAsia="Arial" w:hAnsi="Arial"/>
+                <w:b w:val="false"/>
+                <w:bCs w:val="false"/>
+                <w:color w:val="1E293B"/>
+                <w:sz w:val="19"/>
+                <w:szCs w:val="19"/>
+                <w:rtl/>
+              </w:rPr>
+              <w:t xml:space="preserve">9 سبتمبر 2026</w:t>
+            </w:r>
+          </w:p>
+        </w:tc>
+        <w:tc>
+          <w:tcPr>
+            <w:tcW w:type="dxa" w:w="1250"/>
+            <w:tcMar>
+              <w:top w:type="dxa" w:w="90"/>
+              <w:left w:type="dxa" w:w="110"/>
+              <w:bottom w:type="dxa" w:w="90"/>
+              <w:right w:type="dxa" w:w="110"/>
+            </w:tcMar>
+          </w:tcPr>
+          <w:p>
+            <w:pPr>
+              <w:bidi/>
+              <w:spacing w:after="0" w:line="280"/>
+              <w:jc w:val="right"/>
+            </w:pPr>
+            <w:r>
+              <w:rPr>
+                <w:rFonts w:ascii="Arial" w:cs="Arial" w:eastAsia="Arial" w:hAnsi="Arial"/>
+                <w:b w:val="false"/>
+                <w:bCs w:val="false"/>
+                <w:color w:val="1E293B"/>
+                <w:sz w:val="19"/>
+                <w:szCs w:val="19"/>
+                <w:rtl/>
+              </w:rPr>
+              <w:t xml:space="preserve">الاشتراك</w:t>
+            </w:r>
+          </w:p>
+        </w:tc>
+        <w:tc>
+          <w:tcPr>
+            <w:tcW w:type="dxa" w:w="1150"/>
+            <w:tcMar>
+              <w:top w:type="dxa" w:w="90"/>
+              <w:left w:type="dxa" w:w="110"/>
+              <w:bottom w:type="dxa" w:w="90"/>
+              <w:right w:type="dxa" w:w="110"/>
+            </w:tcMar>
+          </w:tcPr>
+          <w:p>
+            <w:pPr>
+              <w:bidi/>
+              <w:spacing w:after="0" w:line="280"/>
+              <w:jc w:val="right"/>
+            </w:pPr>
+            <w:r>
+              <w:rPr>
+                <w:rFonts w:ascii="Arial" w:cs="Arial" w:eastAsia="Arial" w:hAnsi="Arial"/>
+                <w:b w:val="false"/>
+                <w:bCs w:val="false"/>
+                <w:color w:val="1E293B"/>
+                <w:sz w:val="19"/>
+                <w:szCs w:val="19"/>
+                <w:rtl/>
+              </w:rPr>
+              <w:t xml:space="preserve">/subscribe</w:t>
+            </w:r>
+          </w:p>
+        </w:tc>
+        <w:tc>
+          <w:tcPr>
+            <w:tcW w:type="dxa" w:w="2500"/>
+            <w:tcMar>
+              <w:top w:type="dxa" w:w="90"/>
+              <w:left w:type="dxa" w:w="110"/>
+              <w:bottom w:type="dxa" w:w="90"/>
+              <w:right w:type="dxa" w:w="110"/>
+            </w:tcMar>
+          </w:tcPr>
+          <w:p>
+            <w:pPr>
+              <w:bidi/>
+              <w:spacing w:after="0" w:line="280"/>
+              <w:jc w:val="right"/>
+            </w:pPr>
+            <w:r>
+              <w:rPr>
+                <w:rFonts w:ascii="Arial" w:cs="Arial" w:eastAsia="Arial" w:hAnsi="Arial"/>
+                <w:b w:val="false"/>
+                <w:bCs w:val="false"/>
+                <w:color w:val="1E293B"/>
+                <w:sz w:val="19"/>
+                <w:szCs w:val="19"/>
+                <w:rtl/>
+              </w:rPr>
+              <w:t xml:space="preserve">src/pages/Subscribe.tsx</w:t>
+            </w:r>
+          </w:p>
+        </w:tc>
+        <w:tc>
+          <w:tcPr>
+            <w:tcW w:type="dxa" w:w="1350"/>
+            <w:tcMar>
+              <w:top w:type="dxa" w:w="90"/>
+              <w:left w:type="dxa" w:w="110"/>
+              <w:bottom w:type="dxa" w:w="90"/>
+              <w:right w:type="dxa" w:w="110"/>
+            </w:tcMar>
+          </w:tcPr>
+          <w:p>
+            <w:pPr>
+              <w:bidi/>
+              <w:spacing w:after="0" w:line="280"/>
+              <w:jc w:val="right"/>
+            </w:pPr>
+            <w:r>
+              <w:rPr>
+                <w:rFonts w:ascii="Arial" w:cs="Arial" w:eastAsia="Arial" w:hAnsi="Arial"/>
+                <w:b w:val="false"/>
+                <w:bCs w:val="false"/>
+                <w:color w:val="1E293B"/>
+                <w:sz w:val="19"/>
+                <w:szCs w:val="19"/>
+                <w:rtl/>
+              </w:rPr>
+              <w:t xml:space="preserve">be5b3c0 · c49b797</w:t>
+            </w:r>
+          </w:p>
+        </w:tc>
+        <w:tc>
+          <w:tcPr>
+            <w:tcW w:type="dxa" w:w="1500"/>
+            <w:shd w:fill="ECFDF5" w:color="auto" w:val="clear"/>
+            <w:tcMar>
+              <w:top w:type="dxa" w:w="90"/>
+              <w:left w:type="dxa" w:w="110"/>
+              <w:bottom w:type="dxa" w:w="90"/>
+              <w:right w:type="dxa" w:w="110"/>
+            </w:tcMar>
+          </w:tcPr>
+          <w:p>
+            <w:pPr>
+              <w:bidi/>
+              <w:spacing w:after="0" w:line="280"/>
+              <w:jc w:val="right"/>
+            </w:pPr>
+            <w:r>
+              <w:rPr>
+                <w:rFonts w:ascii="Arial" w:cs="Arial" w:eastAsia="Arial" w:hAnsi="Arial"/>
+                <w:b/>
+                <w:bCs/>
+                <w:color w:val="15803D"/>
+                <w:sz w:val="19"/>
+                <w:szCs w:val="19"/>
+                <w:rtl/>
+              </w:rPr>
+              <w:t xml:space="preserve">منشور على الإنتاج</w:t>
+            </w:r>
+          </w:p>
+        </w:tc>
+      </w:tr>
+    </w:tbl>
+    <w:p>
+      <w:pPr>
+        <w:spacing w:after="90"/>
+      </w:pPr>
     </w:p>
     <w:p>
       <w:pPr>
@@ -5910,7 +6630,7 @@
           <w:szCs w:val="21"/>
           <w:rtl/>
         </w:rPr>
-        <w:t xml:space="preserve">مسار من ست خطوات: اختيار الباقة، ثم تأكيد التخفيض، ثم الدفع، ثم المعالجة، ثم النجاح أو الفشل.</w:t>
+        <w:t xml:space="preserve">إعادة بناء شبه كاملة للصفحة — 715 سطراً متغيّراً.</w:t>
       </w:r>
     </w:p>
     <w:p>
@@ -5932,7 +6652,7 @@
           <w:szCs w:val="21"/>
           <w:rtl/>
         </w:rPr>
-        <w:t xml:space="preserve">احتساب تناسبي للترقية: يُحصَّل فرق السعر عن الأيام المتبقية من الدورة الحالية فقط، ويظهر المبلغ مفصّلاً في ملخص الدفع.</w:t>
+        <w:t xml:space="preserve">اختيار الباقة صار بشريط تمرير (slider) حسب عدد المحادثات الشهرية بدل شبكة الكروت. كل باقة نقطة توقف على الشريط، وباقة المؤسسات هي النقطة الأخيرة بعنوان «غير محدود».</w:t>
       </w:r>
     </w:p>
     <w:p>
@@ -5954,7 +6674,7 @@
           <w:szCs w:val="21"/>
           <w:rtl/>
         </w:rPr>
-        <w:t xml:space="preserve">التخفيض له شاشة تأكيد مستقلة ولا يذهب مباشرة إلى الدفع.</w:t>
+        <w:t xml:space="preserve">مسار من ست خطوات: اختيار الباقة، ثم تأكيد التخفيض، ثم الدفع، ثم المعالجة، ثم النجاح أو الفشل.</w:t>
       </w:r>
     </w:p>
     <w:p>
@@ -5976,7 +6696,7 @@
           <w:szCs w:val="21"/>
           <w:rtl/>
         </w:rPr>
-        <w:t xml:space="preserve">دورة الفوترة تُقرأ من اشتراك العميل الحالي بدل أن تبدأ بقيمة ثابتة.</w:t>
+        <w:t xml:space="preserve">احتساب تناسبي للترقية: يُحصَّل فرق السعر عن الأيام المتبقية من الدورة الحالية فقط، ويظهر المبلغ مفصّلاً في ملخص الدفع.</w:t>
       </w:r>
     </w:p>
     <w:p>
@@ -5998,6 +6718,50 @@
           <w:szCs w:val="21"/>
           <w:rtl/>
         </w:rPr>
+        <w:t xml:space="preserve">التخفيض له شاشة تأكيد مستقلة ولا يذهب مباشرة إلى الدفع.</w:t>
+      </w:r>
+    </w:p>
+    <w:p>
+      <w:pPr>
+        <w:pStyle w:val="ListParagraph"/>
+        <w:numPr>
+          <w:ilvl w:val="0"/>
+          <w:numId w:val="2"/>
+        </w:numPr>
+        <w:bidi/>
+        <w:spacing w:after="70" w:line="290"/>
+        <w:jc w:val="right"/>
+      </w:pPr>
+      <w:r>
+        <w:rPr>
+          <w:rFonts w:ascii="Arial" w:cs="Arial" w:eastAsia="Arial" w:hAnsi="Arial"/>
+          <w:color w:val="1E293B"/>
+          <w:sz w:val="21"/>
+          <w:szCs w:val="21"/>
+          <w:rtl/>
+        </w:rPr>
+        <w:t xml:space="preserve">دورة الفوترة تُقرأ من اشتراك العميل الحالي بدل أن تبدأ بقيمة ثابتة.</w:t>
+      </w:r>
+    </w:p>
+    <w:p>
+      <w:pPr>
+        <w:pStyle w:val="ListParagraph"/>
+        <w:numPr>
+          <w:ilvl w:val="0"/>
+          <w:numId w:val="2"/>
+        </w:numPr>
+        <w:bidi/>
+        <w:spacing w:after="70" w:line="290"/>
+        <w:jc w:val="right"/>
+      </w:pPr>
+      <w:r>
+        <w:rPr>
+          <w:rFonts w:ascii="Arial" w:cs="Arial" w:eastAsia="Arial" w:hAnsi="Arial"/>
+          <w:color w:val="1E293B"/>
+          <w:sz w:val="21"/>
+          <w:szCs w:val="21"/>
+          <w:rtl/>
+        </w:rPr>
         <w:t xml:space="preserve">أُصلحت علامات تعارض الدمج (merge conflict markers) التي كانت باقية في الملف — كوميت c49b797.</w:t>
       </w:r>
     </w:p>
@@ -6184,7 +6948,7 @@
           <w:szCs w:val="20"/>
           <w:rtl/>
         </w:rPr>
-        <w:t xml:space="preserve">عدد التعديلات المسجّلة: 7</w:t>
+        <w:t xml:space="preserve">عدد التعديلات المسجّلة: 8</w:t>
       </w:r>
     </w:p>
     <w:sectPr>

</xml_diff>

<commit_message>
add an optional phone number to the staff invite form
The form had no phone field at all. It is now there, marked (اختياري) in
the same style as departments and without the red asterisk the required
fields carry, and an invite with it left blank goes through untouched.

Reuses PhoneField so the country picker comes with it. The number is only
stored when actually typed, so a blank field leaves no dangling dial code.
Editing splits a saved number back by longest matching dial code rather
than a greedy pattern, which would have read +96891234567 as +9689.

Shown in the agent detail drawer when present.

Co-Authored-By: Claude Opus 5 <noreply@anthropic.com>
Claude-Session: https://claude.ai/code/session_01JGHUnSrtQwLX2BGbB3j6wk
</commit_message>
<xml_diff>
--- a/docs/سجل التعديلات الاخيرة.docx
+++ b/docs/سجل التعديلات الاخيرة.docx
@@ -354,7 +354,7 @@
                 <w:szCs w:val="19"/>
                 <w:rtl/>
               </w:rPr>
-              <w:t xml:space="preserve">8</w:t>
+              <w:t xml:space="preserve">9</w:t>
             </w:r>
           </w:p>
         </w:tc>
@@ -414,7 +414,7 @@
                 <w:szCs w:val="19"/>
                 <w:rtl/>
               </w:rPr>
-              <w:t xml:space="preserve">فاصل مرقّم بين دورات المحادثة داخل الثريد</w:t>
+              <w:t xml:space="preserve">رقم هاتف اختياري عند دعوة الموظف</w:t>
             </w:r>
           </w:p>
         </w:tc>
@@ -444,7 +444,7 @@
                 <w:szCs w:val="19"/>
                 <w:rtl/>
               </w:rPr>
-              <w:t xml:space="preserve">صندوق الوارد</w:t>
+              <w:t xml:space="preserve">فريق العمل</w:t>
             </w:r>
           </w:p>
         </w:tc>
@@ -508,7 +508,7 @@
                 <w:szCs w:val="19"/>
                 <w:rtl/>
               </w:rPr>
-              <w:t xml:space="preserve">7</w:t>
+              <w:t xml:space="preserve">8</w:t>
             </w:r>
           </w:p>
         </w:tc>
@@ -570,7 +570,7 @@
                 <w:szCs w:val="19"/>
                 <w:rtl/>
               </w:rPr>
-              <w:t xml:space="preserve">انعكاس حالة «مجدولة» للتخفيض المؤجّل في بورتال العميل</w:t>
+              <w:t xml:space="preserve">فاصل مرقّم بين دورات المحادثة داخل الثريد</w:t>
             </w:r>
           </w:p>
         </w:tc>
@@ -601,7 +601,7 @@
                 <w:szCs w:val="19"/>
                 <w:rtl/>
               </w:rPr>
-              <w:t xml:space="preserve">الباقات والاشتراك</w:t>
+              <w:t xml:space="preserve">صندوق الوارد</w:t>
             </w:r>
           </w:p>
         </w:tc>
@@ -664,7 +664,7 @@
                 <w:szCs w:val="19"/>
                 <w:rtl/>
               </w:rPr>
-              <w:t xml:space="preserve">6</w:t>
+              <w:t xml:space="preserve">7</w:t>
             </w:r>
           </w:p>
         </w:tc>
@@ -724,7 +724,7 @@
                 <w:szCs w:val="19"/>
                 <w:rtl/>
               </w:rPr>
-              <w:t xml:space="preserve">إعادة تصميم شريط الفهرسة على هيئة مسطرة تظهر عند الاقتراب</w:t>
+              <w:t xml:space="preserve">انعكاس حالة «مجدولة» للتخفيض المؤجّل في بورتال العميل</w:t>
             </w:r>
           </w:p>
         </w:tc>
@@ -754,38 +754,38 @@
                 <w:szCs w:val="19"/>
                 <w:rtl/>
               </w:rPr>
-              <w:t xml:space="preserve">صندوق الوارد</w:t>
+              <w:t xml:space="preserve">الباقات والاشتراك</w:t>
             </w:r>
           </w:p>
         </w:tc>
         <w:tc>
           <w:tcPr>
             <w:tcW w:type="dxa" w:w="1800"/>
-            <w:shd w:fill="ECFDF5" w:color="auto" w:val="clear"/>
-            <w:tcMar>
-              <w:top w:type="dxa" w:w="90"/>
-              <w:left w:type="dxa" w:w="110"/>
-              <w:bottom w:type="dxa" w:w="90"/>
-              <w:right w:type="dxa" w:w="110"/>
-            </w:tcMar>
-          </w:tcPr>
-          <w:p>
-            <w:pPr>
-              <w:bidi/>
-              <w:spacing w:after="0" w:line="280"/>
-              <w:jc w:val="right"/>
-            </w:pPr>
-            <w:r>
-              <w:rPr>
-                <w:rFonts w:ascii="Arial" w:cs="Arial" w:eastAsia="Arial" w:hAnsi="Arial"/>
-                <w:b/>
-                <w:bCs/>
-                <w:color w:val="15803D"/>
-                <w:sz w:val="19"/>
-                <w:szCs w:val="19"/>
-                <w:rtl/>
-              </w:rPr>
-              <w:t xml:space="preserve">منشور على الإنتاج</w:t>
+            <w:shd w:fill="FFFBEB" w:color="auto" w:val="clear"/>
+            <w:tcMar>
+              <w:top w:type="dxa" w:w="90"/>
+              <w:left w:type="dxa" w:w="110"/>
+              <w:bottom w:type="dxa" w:w="90"/>
+              <w:right w:type="dxa" w:w="110"/>
+            </w:tcMar>
+          </w:tcPr>
+          <w:p>
+            <w:pPr>
+              <w:bidi/>
+              <w:spacing w:after="0" w:line="280"/>
+              <w:jc w:val="right"/>
+            </w:pPr>
+            <w:r>
+              <w:rPr>
+                <w:rFonts w:ascii="Arial" w:cs="Arial" w:eastAsia="Arial" w:hAnsi="Arial"/>
+                <w:b/>
+                <w:bCs/>
+                <w:color w:val="B45309"/>
+                <w:sz w:val="19"/>
+                <w:szCs w:val="19"/>
+                <w:rtl/>
+              </w:rPr>
+              <w:t xml:space="preserve">مرفوع — غير منشور</w:t>
             </w:r>
           </w:p>
         </w:tc>
@@ -818,7 +818,7 @@
                 <w:szCs w:val="19"/>
                 <w:rtl/>
               </w:rPr>
-              <w:t xml:space="preserve">5</w:t>
+              <w:t xml:space="preserve">6</w:t>
             </w:r>
           </w:p>
         </w:tc>
@@ -880,7 +880,7 @@
                 <w:szCs w:val="19"/>
                 <w:rtl/>
               </w:rPr>
-              <w:t xml:space="preserve">شريط فهرسة دورات المحادثة داخل الثريد</w:t>
+              <w:t xml:space="preserve">إعادة تصميم شريط الفهرسة على هيئة مسطرة تظهر عند الاقتراب</w:t>
             </w:r>
           </w:p>
         </w:tc>
@@ -974,7 +974,7 @@
                 <w:szCs w:val="19"/>
                 <w:rtl/>
               </w:rPr>
-              <w:t xml:space="preserve">4</w:t>
+              <w:t xml:space="preserve">5</w:t>
             </w:r>
           </w:p>
         </w:tc>
@@ -1034,7 +1034,7 @@
                 <w:szCs w:val="19"/>
                 <w:rtl/>
               </w:rPr>
-              <w:t xml:space="preserve">تسجيل دورات المحادثة واشتقاقها — أساس شريط فهرسة الثريد</w:t>
+              <w:t xml:space="preserve">شريط فهرسة دورات المحادثة داخل الثريد</w:t>
             </w:r>
           </w:p>
         </w:tc>
@@ -1064,7 +1064,7 @@
                 <w:szCs w:val="19"/>
                 <w:rtl/>
               </w:rPr>
-              <w:t xml:space="preserve">صندوق الوارد (طبقة البيانات)</w:t>
+              <w:t xml:space="preserve">صندوق الوارد</w:t>
             </w:r>
           </w:p>
         </w:tc>
@@ -1128,7 +1128,7 @@
                 <w:szCs w:val="19"/>
                 <w:rtl/>
               </w:rPr>
-              <w:t xml:space="preserve">3</w:t>
+              <w:t xml:space="preserve">4</w:t>
             </w:r>
           </w:p>
         </w:tc>
@@ -1190,7 +1190,7 @@
                 <w:szCs w:val="19"/>
                 <w:rtl/>
               </w:rPr>
-              <w:t xml:space="preserve">إزالة كارت نسبة الاستجابة من صفحة تقييمات العملاء</w:t>
+              <w:t xml:space="preserve">تسجيل دورات المحادثة واشتقاقها — أساس شريط فهرسة الثريد</w:t>
             </w:r>
           </w:p>
         </w:tc>
@@ -1221,7 +1221,7 @@
                 <w:szCs w:val="19"/>
                 <w:rtl/>
               </w:rPr>
-              <w:t xml:space="preserve">تقييمات العملاء</w:t>
+              <w:t xml:space="preserve">صندوق الوارد (طبقة البيانات)</w:t>
             </w:r>
           </w:p>
         </w:tc>
@@ -1284,7 +1284,7 @@
                 <w:szCs w:val="19"/>
                 <w:rtl/>
               </w:rPr>
-              <w:t xml:space="preserve">2</w:t>
+              <w:t xml:space="preserve">3</w:t>
             </w:r>
           </w:p>
         </w:tc>
@@ -1314,7 +1314,7 @@
                 <w:szCs w:val="19"/>
                 <w:rtl/>
               </w:rPr>
-              <w:t xml:space="preserve">9 سبتمبر 2026</w:t>
+              <w:t xml:space="preserve">10 سبتمبر 2026</w:t>
             </w:r>
           </w:p>
         </w:tc>
@@ -1344,7 +1344,7 @@
                 <w:szCs w:val="19"/>
                 <w:rtl/>
               </w:rPr>
-              <w:t xml:space="preserve">تغيير تسمية زر الترقية في صفحة الفوترة</w:t>
+              <w:t xml:space="preserve">إزالة كارت نسبة الاستجابة من صفحة تقييمات العملاء</w:t>
             </w:r>
           </w:p>
         </w:tc>
@@ -1374,7 +1374,7 @@
                 <w:szCs w:val="19"/>
                 <w:rtl/>
               </w:rPr>
-              <w:t xml:space="preserve">الفوترة</w:t>
+              <w:t xml:space="preserve">تقييمات العملاء</w:t>
             </w:r>
           </w:p>
         </w:tc>
@@ -1438,7 +1438,7 @@
                 <w:szCs w:val="19"/>
                 <w:rtl/>
               </w:rPr>
-              <w:t xml:space="preserve">1</w:t>
+              <w:t xml:space="preserve">2</w:t>
             </w:r>
           </w:p>
         </w:tc>
@@ -1500,7 +1500,7 @@
                 <w:szCs w:val="19"/>
                 <w:rtl/>
               </w:rPr>
-              <w:t xml:space="preserve">ميزة تغيير الباقة — US-131</w:t>
+              <w:t xml:space="preserve">تغيير تسمية زر الترقية في صفحة الفوترة</w:t>
             </w:r>
           </w:p>
         </w:tc>
@@ -1508,6 +1508,159 @@
           <w:tcPr>
             <w:tcW w:type="dxa" w:w="1500"/>
             <w:shd w:fill="F1F5F9" w:color="auto" w:val="clear"/>
+            <w:tcMar>
+              <w:top w:type="dxa" w:w="90"/>
+              <w:left w:type="dxa" w:w="110"/>
+              <w:bottom w:type="dxa" w:w="90"/>
+              <w:right w:type="dxa" w:w="110"/>
+            </w:tcMar>
+          </w:tcPr>
+          <w:p>
+            <w:pPr>
+              <w:bidi/>
+              <w:spacing w:after="0" w:line="280"/>
+              <w:jc w:val="right"/>
+            </w:pPr>
+            <w:r>
+              <w:rPr>
+                <w:rFonts w:ascii="Arial" w:cs="Arial" w:eastAsia="Arial" w:hAnsi="Arial"/>
+                <w:b w:val="false"/>
+                <w:bCs w:val="false"/>
+                <w:color w:val="1E293B"/>
+                <w:sz w:val="19"/>
+                <w:szCs w:val="19"/>
+                <w:rtl/>
+              </w:rPr>
+              <w:t xml:space="preserve">الفوترة</w:t>
+            </w:r>
+          </w:p>
+        </w:tc>
+        <w:tc>
+          <w:tcPr>
+            <w:tcW w:type="dxa" w:w="1800"/>
+            <w:shd w:fill="ECFDF5" w:color="auto" w:val="clear"/>
+            <w:tcMar>
+              <w:top w:type="dxa" w:w="90"/>
+              <w:left w:type="dxa" w:w="110"/>
+              <w:bottom w:type="dxa" w:w="90"/>
+              <w:right w:type="dxa" w:w="110"/>
+            </w:tcMar>
+          </w:tcPr>
+          <w:p>
+            <w:pPr>
+              <w:bidi/>
+              <w:spacing w:after="0" w:line="280"/>
+              <w:jc w:val="right"/>
+            </w:pPr>
+            <w:r>
+              <w:rPr>
+                <w:rFonts w:ascii="Arial" w:cs="Arial" w:eastAsia="Arial" w:hAnsi="Arial"/>
+                <w:b/>
+                <w:bCs/>
+                <w:color w:val="15803D"/>
+                <w:sz w:val="19"/>
+                <w:szCs w:val="19"/>
+                <w:rtl/>
+              </w:rPr>
+              <w:t xml:space="preserve">منشور على الإنتاج</w:t>
+            </w:r>
+          </w:p>
+        </w:tc>
+      </w:tr>
+      <w:tr>
+        <w:tc>
+          <w:tcPr>
+            <w:tcW w:type="dxa" w:w="600"/>
+            <w:tcMar>
+              <w:top w:type="dxa" w:w="90"/>
+              <w:left w:type="dxa" w:w="110"/>
+              <w:bottom w:type="dxa" w:w="90"/>
+              <w:right w:type="dxa" w:w="110"/>
+            </w:tcMar>
+          </w:tcPr>
+          <w:p>
+            <w:pPr>
+              <w:bidi/>
+              <w:spacing w:after="0" w:line="280"/>
+              <w:jc w:val="right"/>
+            </w:pPr>
+            <w:r>
+              <w:rPr>
+                <w:rFonts w:ascii="Arial" w:cs="Arial" w:eastAsia="Arial" w:hAnsi="Arial"/>
+                <w:b/>
+                <w:bCs/>
+                <w:color w:val="2563EB"/>
+                <w:sz w:val="19"/>
+                <w:szCs w:val="19"/>
+                <w:rtl/>
+              </w:rPr>
+              <w:t xml:space="preserve">1</w:t>
+            </w:r>
+          </w:p>
+        </w:tc>
+        <w:tc>
+          <w:tcPr>
+            <w:tcW w:type="dxa" w:w="1500"/>
+            <w:tcMar>
+              <w:top w:type="dxa" w:w="90"/>
+              <w:left w:type="dxa" w:w="110"/>
+              <w:bottom w:type="dxa" w:w="90"/>
+              <w:right w:type="dxa" w:w="110"/>
+            </w:tcMar>
+          </w:tcPr>
+          <w:p>
+            <w:pPr>
+              <w:bidi/>
+              <w:spacing w:after="0" w:line="280"/>
+              <w:jc w:val="right"/>
+            </w:pPr>
+            <w:r>
+              <w:rPr>
+                <w:rFonts w:ascii="Arial" w:cs="Arial" w:eastAsia="Arial" w:hAnsi="Arial"/>
+                <w:b w:val="false"/>
+                <w:bCs w:val="false"/>
+                <w:color w:val="1E293B"/>
+                <w:sz w:val="19"/>
+                <w:szCs w:val="19"/>
+                <w:rtl/>
+              </w:rPr>
+              <w:t xml:space="preserve">9 سبتمبر 2026</w:t>
+            </w:r>
+          </w:p>
+        </w:tc>
+        <w:tc>
+          <w:tcPr>
+            <w:tcW w:type="dxa" w:w="3600"/>
+            <w:tcMar>
+              <w:top w:type="dxa" w:w="90"/>
+              <w:left w:type="dxa" w:w="110"/>
+              <w:bottom w:type="dxa" w:w="90"/>
+              <w:right w:type="dxa" w:w="110"/>
+            </w:tcMar>
+          </w:tcPr>
+          <w:p>
+            <w:pPr>
+              <w:bidi/>
+              <w:spacing w:after="0" w:line="280"/>
+              <w:jc w:val="right"/>
+            </w:pPr>
+            <w:r>
+              <w:rPr>
+                <w:rFonts w:ascii="Arial" w:cs="Arial" w:eastAsia="Arial" w:hAnsi="Arial"/>
+                <w:b w:val="false"/>
+                <w:bCs w:val="false"/>
+                <w:color w:val="1E293B"/>
+                <w:sz w:val="19"/>
+                <w:szCs w:val="19"/>
+                <w:rtl/>
+              </w:rPr>
+              <w:t xml:space="preserve">ميزة تغيير الباقة — US-131</w:t>
+            </w:r>
+          </w:p>
+        </w:tc>
+        <w:tc>
+          <w:tcPr>
+            <w:tcW w:type="dxa" w:w="1500"/>
             <w:tcMar>
               <w:top w:type="dxa" w:w="90"/>
               <w:left w:type="dxa" w:w="110"/>
@@ -1951,7 +2104,7 @@
                 <w:szCs w:val="20"/>
                 <w:rtl/>
               </w:rPr>
-              <w:t xml:space="preserve">يوجد 2 تعديل مرفوع على الفرع ولم يُنشر بعد — مبيّن في الجدول أعلاه.</w:t>
+              <w:t xml:space="preserve">يوجد 3 تعديل مرفوع على الفرع ولم يُنشر بعد — مبيّن في الجدول أعلاه.</w:t>
             </w:r>
           </w:p>
           <w:p>
@@ -2019,7 +2172,7 @@
           <w:szCs w:val="24"/>
           <w:rtl/>
         </w:rPr>
-        <w:t xml:space="preserve">تعديل رقم 8 — فاصل مرقّم بين دورات المحادثة داخل الثريد</w:t>
+        <w:t xml:space="preserve">تعديل رقم 9 — رقم هاتف اختياري عند دعوة الموظف</w:t>
       </w:r>
     </w:p>
     <w:p>
@@ -2296,7 +2449,7 @@
                 <w:szCs w:val="19"/>
                 <w:rtl/>
               </w:rPr>
-              <w:t xml:space="preserve">صندوق الوارد</w:t>
+              <w:t xml:space="preserve">فريق العمل</w:t>
             </w:r>
           </w:p>
         </w:tc>
@@ -2326,7 +2479,7 @@
                 <w:szCs w:val="19"/>
                 <w:rtl/>
               </w:rPr>
-              <w:t xml:space="preserve">/inbox</w:t>
+              <w:t xml:space="preserve">/team</w:t>
             </w:r>
           </w:p>
         </w:tc>
@@ -2356,7 +2509,7 @@
                 <w:szCs w:val="19"/>
                 <w:rtl/>
               </w:rPr>
-              <w:t xml:space="preserve">src/pages/Inbox.tsx</w:t>
+              <w:t xml:space="preserve">src/pages/Team.tsx · src/types/index.ts · src/store/useDataStore.ts</w:t>
             </w:r>
           </w:p>
         </w:tc>
@@ -2447,7 +2600,7 @@
           <w:szCs w:val="21"/>
           <w:rtl/>
         </w:rPr>
-        <w:t xml:space="preserve">كل دورة جديدة صار يسبقها فاصل أفقي ظاهر داخل الثريد، فيُعرف أين انتهت دورة وبدأت التي تليها من غير رجوع إلى شريط الفهرسة.</w:t>
+        <w:t xml:space="preserve">أُضيف حقل رقم الهاتف إلى نموذج دعوة الموظف وتعديله — لم يكن موجوداً من قبل أصلاً.</w:t>
       </w:r>
     </w:p>
     <w:p>
@@ -2469,7 +2622,7 @@
           <w:szCs w:val="21"/>
           <w:rtl/>
         </w:rPr>
-        <w:t xml:space="preserve">الفاصل يحمل رقم الدورة وكلمة «إعادة فتح» والتاريخ، فيجيب عن ثلاثة أسئلة في سطر: أي دورة، وماذا جرى، ومتى.</w:t>
+        <w:t xml:space="preserve">الحقل اختياري: يحمل وسم «(اختياري)» بنفس أسلوب حقل الأقسام، وبلا النجمة الحمراء التي تعلّم الاسم والبريد والدور. إرسال الدعوة بدونه يمرّ دون اعتراض.</w:t>
       </w:r>
     </w:p>
     <w:p>
@@ -2491,7 +2644,7 @@
           <w:szCs w:val="21"/>
           <w:rtl/>
         </w:rPr>
-        <w:t xml:space="preserve">صيغته بلون العلامة التجارية بخطّين وشارة بارزة، لأن المطلوب أن يُلاحَظ لا أن يمرّ مرور الكرام.</w:t>
+        <w:t xml:space="preserve">استُخدم مكوّن PhoneField نفسه المستعمل في جهات الاتصال والتسجيل، فيأتي معه منتقي الدولة ورمز الاتصال بدل حقل نصّي حرّ.</w:t>
       </w:r>
     </w:p>
     <w:p>
@@ -2513,7 +2666,7 @@
           <w:szCs w:val="21"/>
           <w:rtl/>
         </w:rPr>
-        <w:t xml:space="preserve">الفاصل يحلّ محلّ شريحة التاريخ العادية في ذلك الموضع لأنه يحمل التاريخ أصلاً، فلا يجتمع فاصلان متتاليان.</w:t>
+        <w:t xml:space="preserve">الرقم لا يُخزَّن إلا إذا كُتب فعلاً، حتى لا يبقى رمز دولة معلّقاً بلا رقم في بيانات موظف تركه فارغاً.</w:t>
       </w:r>
     </w:p>
     <w:p>
@@ -2535,7 +2688,7 @@
           <w:szCs w:val="21"/>
           <w:rtl/>
         </w:rPr>
-        <w:t xml:space="preserve">لا يظهر قبل الدورة الأولى لأنها بداية المحادثة لا إعادة فتح لها.</w:t>
+        <w:t xml:space="preserve">عند فتح موظف للتعديل يُفصل الرقم المحفوظ إلى رمز دولة ورقم محلي بمطابقة أطول رمز مطابق من قائمة الدول — لا بتعبير نمطي جشع، لأن ذلك كان سيقرأ ‎+96891234567 على أنه ‎+9689 ثم يشوّه الرقم.</w:t>
       </w:r>
     </w:p>
     <w:p>
@@ -2557,7 +2710,7 @@
           <w:szCs w:val="21"/>
           <w:rtl/>
         </w:rPr>
-        <w:t xml:space="preserve">الدورة ذات البداية المستنتجة تُوسم «(تقديري)» في الفاصل نفسه، اتساقاً مع العلامة المتقطّعة في شريط الفهرسة.</w:t>
+        <w:t xml:space="preserve">الرقم يظهر في لوحة تفاصيل الموظف حين يكون موجوداً، فلا تُجمع بيانات لا تُعرض في أي مكان.</w:t>
       </w:r>
     </w:p>
     <w:p>
@@ -2579,7 +2732,7 @@
           <w:szCs w:val="21"/>
           <w:rtl/>
         </w:rPr>
-        <w:t xml:space="preserve">الترقيم يتبع رقم الدورة (الدورة 2، الدورة 3) لا رقم إعادة الفتح، ليطابق ما يعرضه شريط الفهرسة وحقل sessionCount ولا يتضارب معهما.</w:t>
+        <w:t xml:space="preserve">وُسّع توقيع inviteAgent ليقبل الحقل الجديد.</w:t>
       </w:r>
     </w:p>
     <w:p>
@@ -2601,7 +2754,7 @@
           <w:szCs w:val="21"/>
           <w:rtl/>
         </w:rPr>
-        <w:t xml:space="preserve">عوينت النتيجة في المتصفح: فاصلان بالرقمين الصحيحين، وشريحة التاريخ المكرّرة اختفت من موضعيهما.</w:t>
+        <w:t xml:space="preserve">عوينت النتيجة في المتصفح: الحقل ووسم الاختياري ظاهران، ودعوة موظف بلا رقم هاتف نجحت.</w:t>
       </w:r>
     </w:p>
     <w:p>
@@ -2626,7 +2779,7 @@
           <w:szCs w:val="24"/>
           <w:rtl/>
         </w:rPr>
-        <w:t xml:space="preserve">تعديل رقم 7 — انعكاس حالة «مجدولة» للتخفيض المؤجّل في بورتال العميل</w:t>
+        <w:t xml:space="preserve">تعديل رقم 8 — فاصل مرقّم بين دورات المحادثة داخل الثريد</w:t>
       </w:r>
     </w:p>
     <w:p>
@@ -2903,7 +3056,7 @@
                 <w:szCs w:val="19"/>
                 <w:rtl/>
               </w:rPr>
-              <w:t xml:space="preserve">الباقات والاشتراك</w:t>
+              <w:t xml:space="preserve">صندوق الوارد</w:t>
             </w:r>
           </w:p>
         </w:tc>
@@ -2933,7 +3086,7 @@
                 <w:szCs w:val="19"/>
                 <w:rtl/>
               </w:rPr>
-              <w:t xml:space="preserve">/billing</w:t>
+              <w:t xml:space="preserve">/inbox</w:t>
             </w:r>
           </w:p>
         </w:tc>
@@ -2963,7 +3116,7 @@
                 <w:szCs w:val="19"/>
                 <w:rtl/>
               </w:rPr>
-              <w:t xml:space="preserve">src/types/index.ts · src/pages/Billing.tsx · src/store/adminMockData.ts</w:t>
+              <w:t xml:space="preserve">src/pages/Inbox.tsx</w:t>
             </w:r>
           </w:p>
         </w:tc>
@@ -3054,7 +3207,7 @@
           <w:szCs w:val="21"/>
           <w:rtl/>
         </w:rPr>
-        <w:t xml:space="preserve">الاشتراك الذي عليه تخفيض مؤجّل إلى تاريخ لاحق صارت حالته «مجدولة» ظاهرة للعميل، لا في بورتال الإدارة وحده.</w:t>
+        <w:t xml:space="preserve">كل دورة جديدة صار يسبقها فاصل أفقي ظاهر داخل الثريد، فيُعرف أين انتهت دورة وبدأت التي تليها من غير رجوع إلى شريط الفهرسة.</w:t>
       </w:r>
     </w:p>
     <w:p>
@@ -3076,7 +3229,7 @@
           <w:szCs w:val="21"/>
           <w:rtl/>
         </w:rPr>
-        <w:t xml:space="preserve">أُضيف الحقل scheduledChange إلى الاشتراك ويحمل الباقة المستهدفة ودورة الفوترة وتاريخ السريان، وأُضيفت «مجدولة» إلى حالات الفاتورة.</w:t>
+        <w:t xml:space="preserve">الفاصل يحمل رقم الدورة وكلمة «إعادة فتح» والتاريخ، فيجيب عن ثلاثة أسئلة في سطر: أي دورة، وماذا جرى، ومتى.</w:t>
       </w:r>
     </w:p>
     <w:p>
@@ -3098,7 +3251,7 @@
           <w:szCs w:val="21"/>
           <w:rtl/>
         </w:rPr>
-        <w:t xml:space="preserve">بطاقة الاشتراك تعرض شارة «مجدولة» وجملة صريحة تذكر اسم الباقة المستهدفة وتاريخ التحويل، وتؤكّد أن الباقة الحالية ومزاياها مستمرة حتى ذلك التاريخ — فلا يظن العميل أن باقته انخفضت الآن.</w:t>
+        <w:t xml:space="preserve">صيغته بلون العلامة التجارية بخطّين وشارة بارزة، لأن المطلوب أن يُلاحَظ لا أن يمرّ مرور الكرام.</w:t>
       </w:r>
     </w:p>
     <w:p>
@@ -3120,7 +3273,7 @@
           <w:szCs w:val="21"/>
           <w:rtl/>
         </w:rPr>
-        <w:t xml:space="preserve">جدول الفواتير وفلاترها ونافذة معاينة الفاتورة تعرض الحالة نفسها.</w:t>
+        <w:t xml:space="preserve">الفاصل يحلّ محلّ شريحة التاريخ العادية في ذلك الموضع لأنه يحمل التاريخ أصلاً، فلا يجتمع فاصلان متتاليان.</w:t>
       </w:r>
     </w:p>
     <w:p>
@@ -3142,7 +3295,7 @@
           <w:szCs w:val="21"/>
           <w:rtl/>
         </w:rPr>
-        <w:t xml:space="preserve">الحالة مشتقّة من الاشتراك لا مخزّنة على الفاتورة: إلغاء الجدولة يُزيلها من كل المواضع في آن واحد، بدل أن تبقى فاتورة تحمل حالة قديمة.</w:t>
+        <w:t xml:space="preserve">لا يظهر قبل الدورة الأولى لأنها بداية المحادثة لا إعادة فتح لها.</w:t>
       </w:r>
     </w:p>
     <w:p>
@@ -3164,7 +3317,7 @@
           <w:szCs w:val="21"/>
           <w:rtl/>
         </w:rPr>
-        <w:t xml:space="preserve">قرار مقصود: الاشتقاق يطال الفواتير غير المسدّدة فقط (معلّقة ومسودة). الفاتورة المدفوعة أو المستردة أو الملغاة أو الفاشلة تحتفظ بحالتها، وكذلك المتأخرة لأن التأخّر مشكلة سداد لا يصح حجبها خلف حالة الجدولة.</w:t>
+        <w:t xml:space="preserve">الدورة ذات البداية المستنتجة تُوسم «(تقديري)» في الفاصل نفسه، اتساقاً مع العلامة المتقطّعة في شريط الفهرسة.</w:t>
       </w:r>
     </w:p>
     <w:p>
@@ -3186,7 +3339,7 @@
           <w:szCs w:val="21"/>
           <w:rtl/>
         </w:rPr>
-        <w:t xml:space="preserve">زر «إلغاء الجدولة» إجراء إداري بحسب المواصفة، فبورتال العميل يعرض الحالة دون التحكم فيها.</w:t>
+        <w:t xml:space="preserve">الترقيم يتبع رقم الدورة (الدورة 2، الدورة 3) لا رقم إعادة الفتح، ليطابق ما يعرضه شريط الفهرسة وحقل sessionCount ولا يتضارب معهما.</w:t>
       </w:r>
     </w:p>
     <w:p>
@@ -3208,29 +3361,7 @@
           <w:szCs w:val="21"/>
           <w:rtl/>
         </w:rPr>
-        <w:t xml:space="preserve">أُضيفت جدولة تجريبية لعميل العرض (تحويل من الأعمال إلى الاحترافي بعد 15 يوماً) لتصير الحالة قابلة للمعاينة.</w:t>
-      </w:r>
-    </w:p>
-    <w:p>
-      <w:pPr>
-        <w:pStyle w:val="ListParagraph"/>
-        <w:numPr>
-          <w:ilvl w:val="0"/>
-          <w:numId w:val="2"/>
-        </w:numPr>
-        <w:bidi/>
-        <w:spacing w:after="70" w:line="290"/>
-        <w:jc w:val="right"/>
-      </w:pPr>
-      <w:r>
-        <w:rPr>
-          <w:rFonts w:ascii="Arial" w:cs="Arial" w:eastAsia="Arial" w:hAnsi="Arial"/>
-          <w:color w:val="1E293B"/>
-          <w:sz w:val="21"/>
-          <w:szCs w:val="21"/>
-          <w:rtl/>
-        </w:rPr>
-        <w:t xml:space="preserve">عوينت النتيجة في المتصفح: الشارة والجملة والفلتر وحالتا الفاتورتين غير المسدّدتين ظهرت، والفاتورتان المدفوعتان بقيتا «مدفوعة».</w:t>
+        <w:t xml:space="preserve">عوينت النتيجة في المتصفح: فاصلان بالرقمين الصحيحين، وشريحة التاريخ المكرّرة اختفت من موضعيهما.</w:t>
       </w:r>
     </w:p>
     <w:p>
@@ -3255,7 +3386,7 @@
           <w:szCs w:val="24"/>
           <w:rtl/>
         </w:rPr>
-        <w:t xml:space="preserve">تعديل رقم 6 — إعادة تصميم شريط الفهرسة على هيئة مسطرة تظهر عند الاقتراب</w:t>
+        <w:t xml:space="preserve">تعديل رقم 7 — انعكاس حالة «مجدولة» للتخفيض المؤجّل في بورتال العميل</w:t>
       </w:r>
     </w:p>
     <w:p>
@@ -3532,7 +3663,7 @@
                 <w:szCs w:val="19"/>
                 <w:rtl/>
               </w:rPr>
-              <w:t xml:space="preserve">صندوق الوارد</w:t>
+              <w:t xml:space="preserve">الباقات والاشتراك</w:t>
             </w:r>
           </w:p>
         </w:tc>
@@ -3562,7 +3693,7 @@
                 <w:szCs w:val="19"/>
                 <w:rtl/>
               </w:rPr>
-              <w:t xml:space="preserve">/inbox</w:t>
+              <w:t xml:space="preserve">/billing</w:t>
             </w:r>
           </w:p>
         </w:tc>
@@ -3592,7 +3723,7 @@
                 <w:szCs w:val="19"/>
                 <w:rtl/>
               </w:rPr>
-              <w:t xml:space="preserve">src/components/inbox/SessionRail.tsx · src/pages/Inbox.tsx</w:t>
+              <w:t xml:space="preserve">src/types/index.ts · src/pages/Billing.tsx · src/store/adminMockData.ts</w:t>
             </w:r>
           </w:p>
         </w:tc>
@@ -3622,38 +3753,38 @@
                 <w:szCs w:val="19"/>
                 <w:rtl/>
               </w:rPr>
-              <w:t xml:space="preserve">4163939</w:t>
+              <w:t xml:space="preserve">—</w:t>
             </w:r>
           </w:p>
         </w:tc>
         <w:tc>
           <w:tcPr>
             <w:tcW w:type="dxa" w:w="1500"/>
-            <w:shd w:fill="ECFDF5" w:color="auto" w:val="clear"/>
-            <w:tcMar>
-              <w:top w:type="dxa" w:w="90"/>
-              <w:left w:type="dxa" w:w="110"/>
-              <w:bottom w:type="dxa" w:w="90"/>
-              <w:right w:type="dxa" w:w="110"/>
-            </w:tcMar>
-          </w:tcPr>
-          <w:p>
-            <w:pPr>
-              <w:bidi/>
-              <w:spacing w:after="0" w:line="280"/>
-              <w:jc w:val="right"/>
-            </w:pPr>
-            <w:r>
-              <w:rPr>
-                <w:rFonts w:ascii="Arial" w:cs="Arial" w:eastAsia="Arial" w:hAnsi="Arial"/>
-                <w:b/>
-                <w:bCs/>
-                <w:color w:val="15803D"/>
-                <w:sz w:val="19"/>
-                <w:szCs w:val="19"/>
-                <w:rtl/>
-              </w:rPr>
-              <w:t xml:space="preserve">منشور على الإنتاج</w:t>
+            <w:shd w:fill="FFFBEB" w:color="auto" w:val="clear"/>
+            <w:tcMar>
+              <w:top w:type="dxa" w:w="90"/>
+              <w:left w:type="dxa" w:w="110"/>
+              <w:bottom w:type="dxa" w:w="90"/>
+              <w:right w:type="dxa" w:w="110"/>
+            </w:tcMar>
+          </w:tcPr>
+          <w:p>
+            <w:pPr>
+              <w:bidi/>
+              <w:spacing w:after="0" w:line="280"/>
+              <w:jc w:val="right"/>
+            </w:pPr>
+            <w:r>
+              <w:rPr>
+                <w:rFonts w:ascii="Arial" w:cs="Arial" w:eastAsia="Arial" w:hAnsi="Arial"/>
+                <w:b/>
+                <w:bCs/>
+                <w:color w:val="B45309"/>
+                <w:sz w:val="19"/>
+                <w:szCs w:val="19"/>
+                <w:rtl/>
+              </w:rPr>
+              <w:t xml:space="preserve">مرفوع — غير منشور</w:t>
             </w:r>
           </w:p>
         </w:tc>
@@ -3683,7 +3814,7 @@
           <w:szCs w:val="21"/>
           <w:rtl/>
         </w:rPr>
-        <w:t xml:space="preserve">الشكل السابق كان كتلاً سميكة بينها فجوات، فكان يُقرأ كشريط تقدّم مكسور لا كأداة تنقّل. صار الآن مسطرة: خطّ شعري على حافة الثريد وعليه علامات رفيعة عند بدايات الدورات.</w:t>
+        <w:t xml:space="preserve">الاشتراك الذي عليه تخفيض مؤجّل إلى تاريخ لاحق صارت حالته «مجدولة» ظاهرة للعميل، لا في بورتال الإدارة وحده.</w:t>
       </w:r>
     </w:p>
     <w:p>
@@ -3705,7 +3836,7 @@
           <w:szCs w:val="21"/>
           <w:rtl/>
         </w:rPr>
-        <w:t xml:space="preserve">العلامات مجمّعة في منتصف ارتفاع الحافة كمجموعة واحدة مرتّبة، لا موزّعة على كامل الطول.</w:t>
+        <w:t xml:space="preserve">أُضيف الحقل scheduledChange إلى الاشتراك ويحمل الباقة المستهدفة ودورة الفوترة وتاريخ السريان، وأُضيفت «مجدولة» إلى حالات الفاتورة.</w:t>
       </w:r>
     </w:p>
     <w:p>
@@ -3727,7 +3858,7 @@
           <w:szCs w:val="21"/>
           <w:rtl/>
         </w:rPr>
-        <w:t xml:space="preserve">جُرّب توزيعها على مواضعها النسبية من ارتفاع التمرير أولاً، ثم استُبدل بالتجميع في المنتصف بقرار من الإدارة: الشكل المرتّب فُضّل على دلالة الموضع. أُزيل معه كود القياس ومراقب تغيّر الحجم لأنه لم يعد له عمل.</w:t>
+        <w:t xml:space="preserve">بطاقة الاشتراك تعرض شارة «مجدولة» وجملة صريحة تذكر اسم الباقة المستهدفة وتاريخ التحويل، وتؤكّد أن الباقة الحالية ومزاياها مستمرة حتى ذلك التاريخ — فلا يظن العميل أن باقته انخفضت الآن.</w:t>
       </w:r>
     </w:p>
     <w:p>
@@ -3749,7 +3880,7 @@
           <w:szCs w:val="21"/>
           <w:rtl/>
         </w:rPr>
-        <w:t xml:space="preserve">المسطرة باهتة في الوضع العادي وتتوضّح بالكامل عند اقتراب المؤشر من الحافة أو عند وصول لوحة المفاتيح إليها.</w:t>
+        <w:t xml:space="preserve">جدول الفواتير وفلاترها ونافذة معاينة الفاتورة تعرض الحالة نفسها.</w:t>
       </w:r>
     </w:p>
     <w:p>
@@ -3771,7 +3902,7 @@
           <w:szCs w:val="21"/>
           <w:rtl/>
         </w:rPr>
-        <w:t xml:space="preserve">أُبقي أثر خافت دائم بدل الإخفاء التام: ميزة لا يدل عليها شيء لا يعرفها أحد، والإخفاء الكامل كان سيجعلها غير قابلة للاكتشاف.</w:t>
+        <w:t xml:space="preserve">الحالة مشتقّة من الاشتراك لا مخزّنة على الفاتورة: إلغاء الجدولة يُزيلها من كل المواضع في آن واحد، بدل أن تبقى فاتورة تحمل حالة قديمة.</w:t>
       </w:r>
     </w:p>
     <w:p>
@@ -3793,7 +3924,7 @@
           <w:szCs w:val="21"/>
           <w:rtl/>
         </w:rPr>
-        <w:t xml:space="preserve">صارت طبقة عائمة (overlay) بدل عمود يحجز عرضاً ثابتاً، فرجع نحو 36 بكسل لمساحة الرسائل.</w:t>
+        <w:t xml:space="preserve">قرار مقصود: الاشتقاق يطال الفواتير غير المسدّدة فقط (معلّقة ومسودة). الفاتورة المدفوعة أو المستردة أو الملغاة أو الفاشلة تحتفظ بحالتها، وكذلك المتأخرة لأن التأخّر مشكلة سداد لا يصح حجبها خلف حالة الجدولة.</w:t>
       </w:r>
     </w:p>
     <w:p>
@@ -3815,7 +3946,7 @@
           <w:szCs w:val="21"/>
           <w:rtl/>
         </w:rPr>
-        <w:t xml:space="preserve">وُضعت بعد شريط التمرير بمقدار 8 بكسل حتى لا تحجب سحبه.</w:t>
+        <w:t xml:space="preserve">زر «إلغاء الجدولة» إجراء إداري بحسب المواصفة، فبورتال العميل يعرض الحالة دون التحكم فيها.</w:t>
       </w:r>
     </w:p>
     <w:p>
@@ -3837,7 +3968,7 @@
           <w:szCs w:val="21"/>
           <w:rtl/>
         </w:rPr>
-        <w:t xml:space="preserve">التمييز بين المؤكَّد والمقدَّر بقي قائماً بصرياً: علامة متصلة للدورة المسجّلة، ومتقطّعة للمستنتَجة، مع بقاء «بداية تقديرية» في التلميح.</w:t>
+        <w:t xml:space="preserve">أُضيفت جدولة تجريبية لعميل العرض (تحويل من الأعمال إلى الاحترافي بعد 15 يوماً) لتصير الحالة قابلة للمعاينة.</w:t>
       </w:r>
     </w:p>
     <w:p>
@@ -3859,51 +3990,7 @@
           <w:szCs w:val="21"/>
           <w:rtl/>
         </w:rPr>
-        <w:t xml:space="preserve">تنازل مقصود: الشكل السابق كان يعبّر عن حجم كل دورة بارتفاعها، والمسطرة لا تفعل. حجم الدورة انتقل إلى التلميح.</w:t>
-      </w:r>
-    </w:p>
-    <w:p>
-      <w:pPr>
-        <w:pStyle w:val="ListParagraph"/>
-        <w:numPr>
-          <w:ilvl w:val="0"/>
-          <w:numId w:val="2"/>
-        </w:numPr>
-        <w:bidi/>
-        <w:spacing w:after="70" w:line="290"/>
-        <w:jc w:val="right"/>
-      </w:pPr>
-      <w:r>
-        <w:rPr>
-          <w:rFonts w:ascii="Arial" w:cs="Arial" w:eastAsia="Arial" w:hAnsi="Arial"/>
-          <w:color w:val="1E293B"/>
-          <w:sz w:val="21"/>
-          <w:szCs w:val="21"/>
-          <w:rtl/>
-        </w:rPr>
-        <w:t xml:space="preserve">مجموعة العلامات تقبل التمرير داخلها إن كثرت الدورات حتى لا تتجاوز ارتفاع اللوحة. ولأن ذلك يقصّ التلميح، رُفع التلميح خارج المجموعة ويُحاذى رأسياً بالعلامة المؤشَّر عليها بالقياس.</w:t>
-      </w:r>
-    </w:p>
-    <w:p>
-      <w:pPr>
-        <w:pStyle w:val="ListParagraph"/>
-        <w:numPr>
-          <w:ilvl w:val="0"/>
-          <w:numId w:val="2"/>
-        </w:numPr>
-        <w:bidi/>
-        <w:spacing w:after="70" w:line="290"/>
-        <w:jc w:val="right"/>
-      </w:pPr>
-      <w:r>
-        <w:rPr>
-          <w:rFonts w:ascii="Arial" w:cs="Arial" w:eastAsia="Arial" w:hAnsi="Arial"/>
-          <w:color w:val="1E293B"/>
-          <w:sz w:val="21"/>
-          <w:szCs w:val="21"/>
-          <w:rtl/>
-        </w:rPr>
-        <w:t xml:space="preserve">عوينت النتيجة في المتصفح: العلامات الثلاث متجمّعة في المنتصف، والتوضّح بالاقتراب والتلميح والانتقال تعمل.</w:t>
+        <w:t xml:space="preserve">عوينت النتيجة في المتصفح: الشارة والجملة والفلتر وحالتا الفاتورتين غير المسدّدتين ظهرت، والفاتورتان المدفوعتان بقيتا «مدفوعة».</w:t>
       </w:r>
     </w:p>
     <w:p>
@@ -3928,7 +4015,7 @@
           <w:szCs w:val="24"/>
           <w:rtl/>
         </w:rPr>
-        <w:t xml:space="preserve">تعديل رقم 5 — شريط فهرسة دورات المحادثة داخل الثريد</w:t>
+        <w:t xml:space="preserve">تعديل رقم 6 — إعادة تصميم شريط الفهرسة على هيئة مسطرة تظهر عند الاقتراب</w:t>
       </w:r>
     </w:p>
     <w:p>
@@ -4265,7 +4352,7 @@
                 <w:szCs w:val="19"/>
                 <w:rtl/>
               </w:rPr>
-              <w:t xml:space="preserve">src/components/inbox/SessionRail.tsx · src/pages/Inbox.tsx · src/store/mockData.ts</w:t>
+              <w:t xml:space="preserve">src/components/inbox/SessionRail.tsx · src/pages/Inbox.tsx</w:t>
             </w:r>
           </w:p>
         </w:tc>
@@ -4295,7 +4382,7 @@
                 <w:szCs w:val="19"/>
                 <w:rtl/>
               </w:rPr>
-              <w:t xml:space="preserve">e05e715</w:t>
+              <w:t xml:space="preserve">4163939</w:t>
             </w:r>
           </w:p>
         </w:tc>
@@ -4356,7 +4443,7 @@
           <w:szCs w:val="21"/>
           <w:rtl/>
         </w:rPr>
-        <w:t xml:space="preserve">شريط رأسي على حافة الثريد يقسّمه إلى دورات فتح وإغلاق، ليصل الموظف إلى بداية أي دورة في المحادثات الطويلة التي تُعاد فتحها مراراً.</w:t>
+        <w:t xml:space="preserve">الشكل السابق كان كتلاً سميكة بينها فجوات، فكان يُقرأ كشريط تقدّم مكسور لا كأداة تنقّل. صار الآن مسطرة: خطّ شعري على حافة الثريد وعليه علامات رفيعة عند بدايات الدورات.</w:t>
       </w:r>
     </w:p>
     <w:p>
@@ -4378,7 +4465,7 @@
           <w:szCs w:val="21"/>
           <w:rtl/>
         </w:rPr>
-        <w:t xml:space="preserve">ارتفاع كل مقطع يتناسب مع عدد رسائله، فيعطي إحساساً بحجم كل دورة قبل الدخول إليها.</w:t>
+        <w:t xml:space="preserve">العلامات مجمّعة في منتصف ارتفاع الحافة كمجموعة واحدة مرتّبة، لا موزّعة على كامل الطول.</w:t>
       </w:r>
     </w:p>
     <w:p>
@@ -4400,7 +4487,7 @@
           <w:szCs w:val="21"/>
           <w:rtl/>
         </w:rPr>
-        <w:t xml:space="preserve">المرور على المقطع يُظهر اليوم والتاريخ وعدد الرسائل — «اليوم» و«أمس» لما قرُب، واسم اليوم لما بعُد.</w:t>
+        <w:t xml:space="preserve">جُرّب توزيعها على مواضعها النسبية من ارتفاع التمرير أولاً، ثم استُبدل بالتجميع في المنتصف بقرار من الإدارة: الشكل المرتّب فُضّل على دلالة الموضع. أُزيل معه كود القياس ومراقب تغيّر الحجم لأنه لم يعد له عمل.</w:t>
       </w:r>
     </w:p>
     <w:p>
@@ -4422,7 +4509,7 @@
           <w:szCs w:val="21"/>
           <w:rtl/>
         </w:rPr>
-        <w:t xml:space="preserve">الضغط ينقل إلى أول رسالة في الدورة، والمقطع الذي يقابل موضع القراءة الحالي يُبرَز تلقائياً أثناء التمرير.</w:t>
+        <w:t xml:space="preserve">المسطرة باهتة في الوضع العادي وتتوضّح بالكامل عند اقتراب المؤشر من الحافة أو عند وصول لوحة المفاتيح إليها.</w:t>
       </w:r>
     </w:p>
     <w:p>
@@ -4444,7 +4531,7 @@
           <w:szCs w:val="21"/>
           <w:rtl/>
         </w:rPr>
-        <w:t xml:space="preserve">المقاطع ذات البداية المستنتجة تُعرض بحدّ متقطّع ويذكر التلميح «بداية تقديرية»، فيبقى الفرق بين المؤكَّد والمقدَّر ظاهراً للموظف لا مخفياً عنه.</w:t>
+        <w:t xml:space="preserve">أُبقي أثر خافت دائم بدل الإخفاء التام: ميزة لا يدل عليها شيء لا يعرفها أحد، والإخفاء الكامل كان سيجعلها غير قابلة للاكتشاف.</w:t>
       </w:r>
     </w:p>
     <w:p>
@@ -4466,7 +4553,7 @@
           <w:szCs w:val="21"/>
           <w:rtl/>
         </w:rPr>
-        <w:t xml:space="preserve">الشريط يختفي كلياً حين تكون المحادثة دورة واحدة، فلا معنى لفهرس لا يفهرس شيئاً.</w:t>
+        <w:t xml:space="preserve">صارت طبقة عائمة (overlay) بدل عمود يحجز عرضاً ثابتاً، فرجع نحو 36 بكسل لمساحة الرسائل.</w:t>
       </w:r>
     </w:p>
     <w:p>
@@ -4488,7 +4575,7 @@
           <w:szCs w:val="21"/>
           <w:rtl/>
         </w:rPr>
-        <w:t xml:space="preserve">الدورات الخالية من الرسائل مستبعدة من الشريط بقرار مقصود — لا شيء يمكن الانتقال إليه فيها.</w:t>
+        <w:t xml:space="preserve">وُضعت بعد شريط التمرير بمقدار 8 بكسل حتى لا تحجب سحبه.</w:t>
       </w:r>
     </w:p>
     <w:p>
@@ -4510,7 +4597,7 @@
           <w:szCs w:val="21"/>
           <w:rtl/>
         </w:rPr>
-        <w:t xml:space="preserve">وُزّعت رسائل محادثة أحمد الشعيلي التجريبية على ثلاث دورات عبر ثلاثة أشهر لتصير الميزة قابلة للمعاينة، وصار sessionCount فيها مطابقاً للواقع بعد أن كان رقماً مكتوباً بلا سند. آخر دورة مسجّلة بحدث حقيقي وما قبلها مستنتج، ليظهر الشكلان معاً.</w:t>
+        <w:t xml:space="preserve">التمييز بين المؤكَّد والمقدَّر بقي قائماً بصرياً: علامة متصلة للدورة المسجّلة، ومتقطّعة للمستنتَجة، مع بقاء «بداية تقديرية» في التلميح.</w:t>
       </w:r>
     </w:p>
     <w:p>
@@ -4532,7 +4619,51 @@
           <w:szCs w:val="21"/>
           <w:rtl/>
         </w:rPr>
-        <w:t xml:space="preserve">عوينت النتيجة في المتصفح: الشريط والتلميح والانتقال والإبراز تعمل في الوضعين الفاتح والليلي، والمحادثات أحادية الدورة سليمة بلا شريط.</w:t>
+        <w:t xml:space="preserve">تنازل مقصود: الشكل السابق كان يعبّر عن حجم كل دورة بارتفاعها، والمسطرة لا تفعل. حجم الدورة انتقل إلى التلميح.</w:t>
+      </w:r>
+    </w:p>
+    <w:p>
+      <w:pPr>
+        <w:pStyle w:val="ListParagraph"/>
+        <w:numPr>
+          <w:ilvl w:val="0"/>
+          <w:numId w:val="2"/>
+        </w:numPr>
+        <w:bidi/>
+        <w:spacing w:after="70" w:line="290"/>
+        <w:jc w:val="right"/>
+      </w:pPr>
+      <w:r>
+        <w:rPr>
+          <w:rFonts w:ascii="Arial" w:cs="Arial" w:eastAsia="Arial" w:hAnsi="Arial"/>
+          <w:color w:val="1E293B"/>
+          <w:sz w:val="21"/>
+          <w:szCs w:val="21"/>
+          <w:rtl/>
+        </w:rPr>
+        <w:t xml:space="preserve">مجموعة العلامات تقبل التمرير داخلها إن كثرت الدورات حتى لا تتجاوز ارتفاع اللوحة. ولأن ذلك يقصّ التلميح، رُفع التلميح خارج المجموعة ويُحاذى رأسياً بالعلامة المؤشَّر عليها بالقياس.</w:t>
+      </w:r>
+    </w:p>
+    <w:p>
+      <w:pPr>
+        <w:pStyle w:val="ListParagraph"/>
+        <w:numPr>
+          <w:ilvl w:val="0"/>
+          <w:numId w:val="2"/>
+        </w:numPr>
+        <w:bidi/>
+        <w:spacing w:after="70" w:line="290"/>
+        <w:jc w:val="right"/>
+      </w:pPr>
+      <w:r>
+        <w:rPr>
+          <w:rFonts w:ascii="Arial" w:cs="Arial" w:eastAsia="Arial" w:hAnsi="Arial"/>
+          <w:color w:val="1E293B"/>
+          <w:sz w:val="21"/>
+          <w:szCs w:val="21"/>
+          <w:rtl/>
+        </w:rPr>
+        <w:t xml:space="preserve">عوينت النتيجة في المتصفح: العلامات الثلاث متجمّعة في المنتصف، والتوضّح بالاقتراب والتلميح والانتقال تعمل.</w:t>
       </w:r>
     </w:p>
     <w:p>
@@ -4557,7 +4688,7 @@
           <w:szCs w:val="24"/>
           <w:rtl/>
         </w:rPr>
-        <w:t xml:space="preserve">تعديل رقم 4 — تسجيل دورات المحادثة واشتقاقها — أساس شريط فهرسة الثريد</w:t>
+        <w:t xml:space="preserve">تعديل رقم 5 — شريط فهرسة دورات المحادثة داخل الثريد</w:t>
       </w:r>
     </w:p>
     <w:p>
@@ -4834,7 +4965,7 @@
                 <w:szCs w:val="19"/>
                 <w:rtl/>
               </w:rPr>
-              <w:t xml:space="preserve">صندوق الوارد (طبقة البيانات)</w:t>
+              <w:t xml:space="preserve">صندوق الوارد</w:t>
             </w:r>
           </w:p>
         </w:tc>
@@ -4894,7 +5025,7 @@
                 <w:szCs w:val="19"/>
                 <w:rtl/>
               </w:rPr>
-              <w:t xml:space="preserve">src/utils/sessions.ts · src/store/useDataStore.ts · src/types/index.ts</w:t>
+              <w:t xml:space="preserve">src/components/inbox/SessionRail.tsx · src/pages/Inbox.tsx · src/store/mockData.ts</w:t>
             </w:r>
           </w:p>
         </w:tc>
@@ -4924,7 +5055,7 @@
                 <w:szCs w:val="19"/>
                 <w:rtl/>
               </w:rPr>
-              <w:t xml:space="preserve">5cf29e1</w:t>
+              <w:t xml:space="preserve">e05e715</w:t>
             </w:r>
           </w:p>
         </w:tc>
@@ -4985,7 +5116,7 @@
           <w:szCs w:val="21"/>
           <w:rtl/>
         </w:rPr>
-        <w:t xml:space="preserve">المشكلة: المحادثة الواحدة تُعاد فتحها كلما راسل العميل بعد الإغلاق، فيصير الثريد بلا نهاية. ولرسم شريط فهرسة يقسّمه إلى دورات، لزم معرفة توقيت كل فتح وإغلاق — وهي بيانات لم تكن تُسجَّل إطلاقاً.</w:t>
+        <w:t xml:space="preserve">شريط رأسي على حافة الثريد يقسّمه إلى دورات فتح وإغلاق، ليصل الموظف إلى بداية أي دورة في المحادثات الطويلة التي تُعاد فتحها مراراً.</w:t>
       </w:r>
     </w:p>
     <w:p>
@@ -5007,7 +5138,7 @@
           <w:szCs w:val="21"/>
           <w:rtl/>
         </w:rPr>
-        <w:t xml:space="preserve">كان الحقل sessionCount يُكتب مرة واحدة عند الإنشاء ولا يزيده أي سطر في المشروع، وقيمه في البيانات التجريبية مكتوبة يدوياً. كذلك activityLog على المحادثة كان مُعرَّفاً في الأنواع لكن لا دالة تكتب فيه وقت التشغيل.</w:t>
+        <w:t xml:space="preserve">ارتفاع كل مقطع يتناسب مع عدد رسائله، فيعطي إحساساً بحجم كل دورة قبل الدخول إليها.</w:t>
       </w:r>
     </w:p>
     <w:p>
@@ -5029,7 +5160,7 @@
           <w:szCs w:val="21"/>
           <w:rtl/>
         </w:rPr>
-        <w:t xml:space="preserve">أُضيف النوع SessionEvent لتسجيل حدث فتح أو إغلاق بتوقيته وصاحبه، والنوع ConversationSession يمثّل الدورة المشتقّة.</w:t>
+        <w:t xml:space="preserve">المرور على المقطع يُظهر اليوم والتاريخ وعدد الرسائل — «اليوم» و«أمس» لما قرُب، واسم اليوم لما بعُد.</w:t>
       </w:r>
     </w:p>
     <w:p>
@@ -5051,7 +5182,7 @@
           <w:szCs w:val="21"/>
           <w:rtl/>
         </w:rPr>
-        <w:t xml:space="preserve">صارت أربعة مواضع تسجّل الحدث فعلياً: setConversationStatus عند الإغلاق أو إعادة الفتح، reopenConversation، ورسالة العميل الواردة نصية أو صوتية حين تُحيي محادثة مغلقة — وهذا آخرها كان يمرّ بلا أي أثر رغم أنه أكثرها تكراراً.</w:t>
+        <w:t xml:space="preserve">الضغط ينقل إلى أول رسالة في الدورة، والمقطع الذي يقابل موضع القراءة الحالي يُبرَز تلقائياً أثناء التمرير.</w:t>
       </w:r>
     </w:p>
     <w:p>
@@ -5073,7 +5204,7 @@
           <w:szCs w:val="21"/>
           <w:rtl/>
         </w:rPr>
-        <w:t xml:space="preserve">أُضيفت الدالة deriveSessions التي تقسّم الثريد إلى دورات: الأحداث المسجّلة مرجع قاطع، وما سبقها من تاريخ قديم تُستنتج حدوده من فجوات الصمت (24 ساعة افتراضاً) وتُعلَّم inferred حتى يظل الفرق بين المؤكَّد والمقدَّر ظاهراً.</w:t>
+        <w:t xml:space="preserve">المقاطع ذات البداية المستنتجة تُعرض بحدّ متقطّع ويذكر التلميح «بداية تقديرية»، فيبقى الفرق بين المؤكَّد والمقدَّر ظاهراً للموظف لا مخفياً عنه.</w:t>
       </w:r>
     </w:p>
     <w:p>
@@ -5095,7 +5226,7 @@
           <w:szCs w:val="21"/>
           <w:rtl/>
         </w:rPr>
-        <w:t xml:space="preserve">الدالة تتعامل مع الحالة المختلطة: ثريد فيه تاريخ قديم مُستنتج ودورات جديدة مسجّلة في آن واحد.</w:t>
+        <w:t xml:space="preserve">الشريط يختفي كلياً حين تكون المحادثة دورة واحدة، فلا معنى لفهرس لا يفهرس شيئاً.</w:t>
       </w:r>
     </w:p>
     <w:p>
@@ -5117,7 +5248,7 @@
           <w:szCs w:val="21"/>
           <w:rtl/>
         </w:rPr>
-        <w:t xml:space="preserve">اختُبر المنطق على ثماني حالات شملت الثريد الفارغ والرسالة الواحدة والفجوات المتعددة والأحداث المسجّلة والحالة المختلطة والمدخلات غير المرتّبة زمنياً — جميعها نجحت.</w:t>
+        <w:t xml:space="preserve">الدورات الخالية من الرسائل مستبعدة من الشريط بقرار مقصود — لا شيء يمكن الانتقال إليه فيها.</w:t>
       </w:r>
     </w:p>
     <w:p>
@@ -5139,7 +5270,7 @@
           <w:szCs w:val="21"/>
           <w:rtl/>
         </w:rPr>
-        <w:t xml:space="preserve">ملاحظة على البيانات الحالية: كل المحادثات التجريبية تُنتج دورة واحدة لأن رسائلها متقاربة بدقائق ولا فجوات فيها. الشريط لن يُظهر تقسيماً حقيقياً قبل توفّر بيانات متباعدة زمنياً.</w:t>
+        <w:t xml:space="preserve">وُزّعت رسائل محادثة أحمد الشعيلي التجريبية على ثلاث دورات عبر ثلاثة أشهر لتصير الميزة قابلة للمعاينة، وصار sessionCount فيها مطابقاً للواقع بعد أن كان رقماً مكتوباً بلا سند. آخر دورة مسجّلة بحدث حقيقي وما قبلها مستنتج، ليظهر الشكلان معاً.</w:t>
       </w:r>
     </w:p>
     <w:p>
@@ -5161,7 +5292,7 @@
           <w:szCs w:val="21"/>
           <w:rtl/>
         </w:rPr>
-        <w:t xml:space="preserve">لم تُبنَ واجهة الشريط بعد — هذا التعديل يغطّي طبقة البيانات وحدها.</w:t>
+        <w:t xml:space="preserve">عوينت النتيجة في المتصفح: الشريط والتلميح والانتقال والإبراز تعمل في الوضعين الفاتح والليلي، والمحادثات أحادية الدورة سليمة بلا شريط.</w:t>
       </w:r>
     </w:p>
     <w:p>
@@ -5186,7 +5317,7 @@
           <w:szCs w:val="24"/>
           <w:rtl/>
         </w:rPr>
-        <w:t xml:space="preserve">تعديل رقم 3 — إزالة كارت نسبة الاستجابة من صفحة تقييمات العملاء</w:t>
+        <w:t xml:space="preserve">تعديل رقم 4 — تسجيل دورات المحادثة واشتقاقها — أساس شريط فهرسة الثريد</w:t>
       </w:r>
     </w:p>
     <w:p>
@@ -5463,7 +5594,7 @@
                 <w:szCs w:val="19"/>
                 <w:rtl/>
               </w:rPr>
-              <w:t xml:space="preserve">تقييمات العملاء</w:t>
+              <w:t xml:space="preserve">صندوق الوارد (طبقة البيانات)</w:t>
             </w:r>
           </w:p>
         </w:tc>
@@ -5493,7 +5624,7 @@
                 <w:szCs w:val="19"/>
                 <w:rtl/>
               </w:rPr>
-              <w:t xml:space="preserve">/rating</w:t>
+              <w:t xml:space="preserve">/inbox</w:t>
             </w:r>
           </w:p>
         </w:tc>
@@ -5523,7 +5654,7 @@
                 <w:szCs w:val="19"/>
                 <w:rtl/>
               </w:rPr>
-              <w:t xml:space="preserve">src/pages/CustomerRatings.tsx</w:t>
+              <w:t xml:space="preserve">src/utils/sessions.ts · src/store/useDataStore.ts · src/types/index.ts</w:t>
             </w:r>
           </w:p>
         </w:tc>
@@ -5553,7 +5684,7 @@
                 <w:szCs w:val="19"/>
                 <w:rtl/>
               </w:rPr>
-              <w:t xml:space="preserve">cc8bd4f</w:t>
+              <w:t xml:space="preserve">5cf29e1</w:t>
             </w:r>
           </w:p>
         </w:tc>
@@ -5614,7 +5745,7 @@
           <w:szCs w:val="21"/>
           <w:rtl/>
         </w:rPr>
-        <w:t xml:space="preserve">حُذف كارت «نسبة الاستجابة» بالكامل من شريط الإحصائيات — صارت 3 كروت بدل 4.</w:t>
+        <w:t xml:space="preserve">المشكلة: المحادثة الواحدة تُعاد فتحها كلما راسل العميل بعد الإغلاق، فيصير الثريد بلا نهاية. ولرسم شريط فهرسة يقسّمه إلى دورات، لزم معرفة توقيت كل فتح وإغلاق — وهي بيانات لم تكن تُسجَّل إطلاقاً.</w:t>
       </w:r>
     </w:p>
     <w:p>
@@ -5636,7 +5767,7 @@
           <w:szCs w:val="21"/>
           <w:rtl/>
         </w:rPr>
-        <w:t xml:space="preserve">حُذف معه حساب responseRate لأنه لم يعد له مستهلك في الصفحة.</w:t>
+        <w:t xml:space="preserve">كان الحقل sessionCount يُكتب مرة واحدة عند الإنشاء ولا يزيده أي سطر في المشروع، وقيمه في البيانات التجريبية مكتوبة يدوياً. كذلك activityLog على المحادثة كان مُعرَّفاً في الأنواع لكن لا دالة تكتب فيه وقت التشغيل.</w:t>
       </w:r>
     </w:p>
     <w:p>
@@ -5658,7 +5789,7 @@
           <w:szCs w:val="21"/>
           <w:rtl/>
         </w:rPr>
-        <w:t xml:space="preserve">حُذف استيراد أيقونة TrendingUp لأنها كانت مستخدمة في هذا الكارت وحده.</w:t>
+        <w:t xml:space="preserve">أُضيف النوع SessionEvent لتسجيل حدث فتح أو إغلاق بتوقيته وصاحبه، والنوع ConversationSession يمثّل الدورة المشتقّة.</w:t>
       </w:r>
     </w:p>
     <w:p>
@@ -5680,7 +5811,7 @@
           <w:szCs w:val="21"/>
           <w:rtl/>
         </w:rPr>
-        <w:t xml:space="preserve">عُدّلت شبكة العرض من grid-cols-2 lg:grid-cols-4 إلى grid-cols-1 sm:grid-cols-3، حتى لا يبقى كارت يتيم في سطر منفصل على الشاشات الصغيرة.</w:t>
+        <w:t xml:space="preserve">صارت أربعة مواضع تسجّل الحدث فعلياً: setConversationStatus عند الإغلاق أو إعادة الفتح، reopenConversation، ورسالة العميل الواردة نصية أو صوتية حين تُحيي محادثة مغلقة — وهذا آخرها كان يمرّ بلا أي أثر رغم أنه أكثرها تكراراً.</w:t>
       </w:r>
     </w:p>
     <w:p>
@@ -5702,7 +5833,95 @@
           <w:szCs w:val="21"/>
           <w:rtl/>
         </w:rPr>
-        <w:t xml:space="preserve">الكروت الباقية: متوسط تقييم المحادثة، متوسط تقييم الموظفين، إجمالي الروابط.</w:t>
+        <w:t xml:space="preserve">أُضيفت الدالة deriveSessions التي تقسّم الثريد إلى دورات: الأحداث المسجّلة مرجع قاطع، وما سبقها من تاريخ قديم تُستنتج حدوده من فجوات الصمت (24 ساعة افتراضاً) وتُعلَّم inferred حتى يظل الفرق بين المؤكَّد والمقدَّر ظاهراً.</w:t>
+      </w:r>
+    </w:p>
+    <w:p>
+      <w:pPr>
+        <w:pStyle w:val="ListParagraph"/>
+        <w:numPr>
+          <w:ilvl w:val="0"/>
+          <w:numId w:val="2"/>
+        </w:numPr>
+        <w:bidi/>
+        <w:spacing w:after="70" w:line="290"/>
+        <w:jc w:val="right"/>
+      </w:pPr>
+      <w:r>
+        <w:rPr>
+          <w:rFonts w:ascii="Arial" w:cs="Arial" w:eastAsia="Arial" w:hAnsi="Arial"/>
+          <w:color w:val="1E293B"/>
+          <w:sz w:val="21"/>
+          <w:szCs w:val="21"/>
+          <w:rtl/>
+        </w:rPr>
+        <w:t xml:space="preserve">الدالة تتعامل مع الحالة المختلطة: ثريد فيه تاريخ قديم مُستنتج ودورات جديدة مسجّلة في آن واحد.</w:t>
+      </w:r>
+    </w:p>
+    <w:p>
+      <w:pPr>
+        <w:pStyle w:val="ListParagraph"/>
+        <w:numPr>
+          <w:ilvl w:val="0"/>
+          <w:numId w:val="2"/>
+        </w:numPr>
+        <w:bidi/>
+        <w:spacing w:after="70" w:line="290"/>
+        <w:jc w:val="right"/>
+      </w:pPr>
+      <w:r>
+        <w:rPr>
+          <w:rFonts w:ascii="Arial" w:cs="Arial" w:eastAsia="Arial" w:hAnsi="Arial"/>
+          <w:color w:val="1E293B"/>
+          <w:sz w:val="21"/>
+          <w:szCs w:val="21"/>
+          <w:rtl/>
+        </w:rPr>
+        <w:t xml:space="preserve">اختُبر المنطق على ثماني حالات شملت الثريد الفارغ والرسالة الواحدة والفجوات المتعددة والأحداث المسجّلة والحالة المختلطة والمدخلات غير المرتّبة زمنياً — جميعها نجحت.</w:t>
+      </w:r>
+    </w:p>
+    <w:p>
+      <w:pPr>
+        <w:pStyle w:val="ListParagraph"/>
+        <w:numPr>
+          <w:ilvl w:val="0"/>
+          <w:numId w:val="2"/>
+        </w:numPr>
+        <w:bidi/>
+        <w:spacing w:after="70" w:line="290"/>
+        <w:jc w:val="right"/>
+      </w:pPr>
+      <w:r>
+        <w:rPr>
+          <w:rFonts w:ascii="Arial" w:cs="Arial" w:eastAsia="Arial" w:hAnsi="Arial"/>
+          <w:color w:val="1E293B"/>
+          <w:sz w:val="21"/>
+          <w:szCs w:val="21"/>
+          <w:rtl/>
+        </w:rPr>
+        <w:t xml:space="preserve">ملاحظة على البيانات الحالية: كل المحادثات التجريبية تُنتج دورة واحدة لأن رسائلها متقاربة بدقائق ولا فجوات فيها. الشريط لن يُظهر تقسيماً حقيقياً قبل توفّر بيانات متباعدة زمنياً.</w:t>
+      </w:r>
+    </w:p>
+    <w:p>
+      <w:pPr>
+        <w:pStyle w:val="ListParagraph"/>
+        <w:numPr>
+          <w:ilvl w:val="0"/>
+          <w:numId w:val="2"/>
+        </w:numPr>
+        <w:bidi/>
+        <w:spacing w:after="70" w:line="290"/>
+        <w:jc w:val="right"/>
+      </w:pPr>
+      <w:r>
+        <w:rPr>
+          <w:rFonts w:ascii="Arial" w:cs="Arial" w:eastAsia="Arial" w:hAnsi="Arial"/>
+          <w:color w:val="1E293B"/>
+          <w:sz w:val="21"/>
+          <w:szCs w:val="21"/>
+          <w:rtl/>
+        </w:rPr>
+        <w:t xml:space="preserve">لم تُبنَ واجهة الشريط بعد — هذا التعديل يغطّي طبقة البيانات وحدها.</w:t>
       </w:r>
     </w:p>
     <w:p>
@@ -5727,7 +5946,7 @@
           <w:szCs w:val="24"/>
           <w:rtl/>
         </w:rPr>
-        <w:t xml:space="preserve">تعديل رقم 2 — تغيير تسمية زر الترقية في صفحة الفوترة</w:t>
+        <w:t xml:space="preserve">تعديل رقم 3 — إزالة كارت نسبة الاستجابة من صفحة تقييمات العملاء</w:t>
       </w:r>
     </w:p>
     <w:p>
@@ -5974,7 +6193,7 @@
                 <w:szCs w:val="19"/>
                 <w:rtl/>
               </w:rPr>
-              <w:t xml:space="preserve">9 سبتمبر 2026</w:t>
+              <w:t xml:space="preserve">10 سبتمبر 2026</w:t>
             </w:r>
           </w:p>
         </w:tc>
@@ -6004,7 +6223,7 @@
                 <w:szCs w:val="19"/>
                 <w:rtl/>
               </w:rPr>
-              <w:t xml:space="preserve">الفوترة</w:t>
+              <w:t xml:space="preserve">تقييمات العملاء</w:t>
             </w:r>
           </w:p>
         </w:tc>
@@ -6034,7 +6253,7 @@
                 <w:szCs w:val="19"/>
                 <w:rtl/>
               </w:rPr>
-              <w:t xml:space="preserve">/billing</w:t>
+              <w:t xml:space="preserve">/rating</w:t>
             </w:r>
           </w:p>
         </w:tc>
@@ -6064,7 +6283,7 @@
                 <w:szCs w:val="19"/>
                 <w:rtl/>
               </w:rPr>
-              <w:t xml:space="preserve">src/pages/Billing.tsx</w:t>
+              <w:t xml:space="preserve">src/pages/CustomerRatings.tsx</w:t>
             </w:r>
           </w:p>
         </w:tc>
@@ -6094,7 +6313,7 @@
                 <w:szCs w:val="19"/>
                 <w:rtl/>
               </w:rPr>
-              <w:t xml:space="preserve">be5b3c0</w:t>
+              <w:t xml:space="preserve">cc8bd4f</w:t>
             </w:r>
           </w:p>
         </w:tc>
@@ -6155,7 +6374,7 @@
           <w:szCs w:val="21"/>
           <w:rtl/>
         </w:rPr>
-        <w:t xml:space="preserve">زر «ترقية» أصبح «تغيير الباقة».</w:t>
+        <w:t xml:space="preserve">حُذف كارت «نسبة الاستجابة» بالكامل من شريط الإحصائيات — صارت 3 كروت بدل 4.</w:t>
       </w:r>
     </w:p>
     <w:p>
@@ -6177,7 +6396,73 @@
           <w:szCs w:val="21"/>
           <w:rtl/>
         </w:rPr>
-        <w:t xml:space="preserve">سبب التغيير: الزر يوصّل إلى مسار يشمل الترقية والتخفيض معاً، فالتسمية القديمة كانت تصف نصف وظيفته.</w:t>
+        <w:t xml:space="preserve">حُذف معه حساب responseRate لأنه لم يعد له مستهلك في الصفحة.</w:t>
+      </w:r>
+    </w:p>
+    <w:p>
+      <w:pPr>
+        <w:pStyle w:val="ListParagraph"/>
+        <w:numPr>
+          <w:ilvl w:val="0"/>
+          <w:numId w:val="2"/>
+        </w:numPr>
+        <w:bidi/>
+        <w:spacing w:after="70" w:line="290"/>
+        <w:jc w:val="right"/>
+      </w:pPr>
+      <w:r>
+        <w:rPr>
+          <w:rFonts w:ascii="Arial" w:cs="Arial" w:eastAsia="Arial" w:hAnsi="Arial"/>
+          <w:color w:val="1E293B"/>
+          <w:sz w:val="21"/>
+          <w:szCs w:val="21"/>
+          <w:rtl/>
+        </w:rPr>
+        <w:t xml:space="preserve">حُذف استيراد أيقونة TrendingUp لأنها كانت مستخدمة في هذا الكارت وحده.</w:t>
+      </w:r>
+    </w:p>
+    <w:p>
+      <w:pPr>
+        <w:pStyle w:val="ListParagraph"/>
+        <w:numPr>
+          <w:ilvl w:val="0"/>
+          <w:numId w:val="2"/>
+        </w:numPr>
+        <w:bidi/>
+        <w:spacing w:after="70" w:line="290"/>
+        <w:jc w:val="right"/>
+      </w:pPr>
+      <w:r>
+        <w:rPr>
+          <w:rFonts w:ascii="Arial" w:cs="Arial" w:eastAsia="Arial" w:hAnsi="Arial"/>
+          <w:color w:val="1E293B"/>
+          <w:sz w:val="21"/>
+          <w:szCs w:val="21"/>
+          <w:rtl/>
+        </w:rPr>
+        <w:t xml:space="preserve">عُدّلت شبكة العرض من grid-cols-2 lg:grid-cols-4 إلى grid-cols-1 sm:grid-cols-3، حتى لا يبقى كارت يتيم في سطر منفصل على الشاشات الصغيرة.</w:t>
+      </w:r>
+    </w:p>
+    <w:p>
+      <w:pPr>
+        <w:pStyle w:val="ListParagraph"/>
+        <w:numPr>
+          <w:ilvl w:val="0"/>
+          <w:numId w:val="2"/>
+        </w:numPr>
+        <w:bidi/>
+        <w:spacing w:after="70" w:line="290"/>
+        <w:jc w:val="right"/>
+      </w:pPr>
+      <w:r>
+        <w:rPr>
+          <w:rFonts w:ascii="Arial" w:cs="Arial" w:eastAsia="Arial" w:hAnsi="Arial"/>
+          <w:color w:val="1E293B"/>
+          <w:sz w:val="21"/>
+          <w:szCs w:val="21"/>
+          <w:rtl/>
+        </w:rPr>
+        <w:t xml:space="preserve">الكروت الباقية: متوسط تقييم المحادثة، متوسط تقييم الموظفين، إجمالي الروابط.</w:t>
       </w:r>
     </w:p>
     <w:p>
@@ -6202,7 +6487,7 @@
           <w:szCs w:val="24"/>
           <w:rtl/>
         </w:rPr>
-        <w:t xml:space="preserve">تعديل رقم 1 — ميزة تغيير الباقة — US-131</w:t>
+        <w:t xml:space="preserve">تعديل رقم 2 — تغيير تسمية زر الترقية في صفحة الفوترة</w:t>
       </w:r>
     </w:p>
     <w:p>
@@ -6479,7 +6764,7 @@
                 <w:szCs w:val="19"/>
                 <w:rtl/>
               </w:rPr>
-              <w:t xml:space="preserve">الاشتراك</w:t>
+              <w:t xml:space="preserve">الفوترة</w:t>
             </w:r>
           </w:p>
         </w:tc>
@@ -6509,7 +6794,7 @@
                 <w:szCs w:val="19"/>
                 <w:rtl/>
               </w:rPr>
-              <w:t xml:space="preserve">/subscribe</w:t>
+              <w:t xml:space="preserve">/billing</w:t>
             </w:r>
           </w:p>
         </w:tc>
@@ -6539,7 +6824,7 @@
                 <w:szCs w:val="19"/>
                 <w:rtl/>
               </w:rPr>
-              <w:t xml:space="preserve">src/pages/Subscribe.tsx</w:t>
+              <w:t xml:space="preserve">src/pages/Billing.tsx</w:t>
             </w:r>
           </w:p>
         </w:tc>
@@ -6569,7 +6854,7 @@
                 <w:szCs w:val="19"/>
                 <w:rtl/>
               </w:rPr>
-              <w:t xml:space="preserve">be5b3c0 · c49b797</w:t>
+              <w:t xml:space="preserve">be5b3c0</w:t>
             </w:r>
           </w:p>
         </w:tc>
@@ -6630,7 +6915,7 @@
           <w:szCs w:val="21"/>
           <w:rtl/>
         </w:rPr>
-        <w:t xml:space="preserve">إعادة بناء شبه كاملة للصفحة — 715 سطراً متغيّراً.</w:t>
+        <w:t xml:space="preserve">زر «ترقية» أصبح «تغيير الباقة».</w:t>
       </w:r>
     </w:p>
     <w:p>
@@ -6652,8 +6937,439 @@
           <w:szCs w:val="21"/>
           <w:rtl/>
         </w:rPr>
-        <w:t xml:space="preserve">اختيار الباقة صار بشريط تمرير (slider) حسب عدد المحادثات الشهرية بدل شبكة الكروت. كل باقة نقطة توقف على الشريط، وباقة المؤسسات هي النقطة الأخيرة بعنوان «غير محدود».</w:t>
-      </w:r>
+        <w:t xml:space="preserve">سبب التغيير: الزر يوصّل إلى مسار يشمل الترقية والتخفيض معاً، فالتسمية القديمة كانت تصف نصف وظيفته.</w:t>
+      </w:r>
+    </w:p>
+    <w:p>
+      <w:pPr>
+        <w:spacing w:after="160"/>
+      </w:pPr>
+    </w:p>
+    <w:p>
+      <w:pPr>
+        <w:pStyle w:val="Heading2"/>
+        <w:bidi/>
+        <w:spacing w:after="120" w:before="300"/>
+        <w:jc w:val="right"/>
+      </w:pPr>
+      <w:r>
+        <w:rPr>
+          <w:rFonts w:ascii="Arial" w:cs="Arial" w:eastAsia="Arial" w:hAnsi="Arial"/>
+          <w:b/>
+          <w:bCs/>
+          <w:color w:val="1E293B"/>
+          <w:sz w:val="24"/>
+          <w:szCs w:val="24"/>
+          <w:rtl/>
+        </w:rPr>
+        <w:t xml:space="preserve">تعديل رقم 1 — ميزة تغيير الباقة — US-131</w:t>
+      </w:r>
+    </w:p>
+    <w:p>
+      <w:pPr>
+        <w:spacing w:after="50"/>
+      </w:pPr>
+    </w:p>
+    <w:tbl>
+      <w:tblPr>
+        <w:bidiVisual/>
+        <w:tblW w:type="dxa" w:w="9000"/>
+        <w:tblBorders>
+          <w:top w:val="single" w:color="CBD5E1" w:sz="4"/>
+          <w:left w:val="single" w:color="CBD5E1" w:sz="4"/>
+          <w:bottom w:val="single" w:color="CBD5E1" w:sz="4"/>
+          <w:right w:val="single" w:color="CBD5E1" w:sz="4"/>
+          <w:insideH w:val="single" w:color="CBD5E1" w:sz="4"/>
+          <w:insideV w:val="single" w:color="CBD5E1" w:sz="4"/>
+        </w:tblBorders>
+      </w:tblPr>
+      <w:tblGrid>
+        <w:gridCol w:w="1250"/>
+        <w:gridCol w:w="1250"/>
+        <w:gridCol w:w="1150"/>
+        <w:gridCol w:w="2500"/>
+        <w:gridCol w:w="1350"/>
+        <w:gridCol w:w="1500"/>
+      </w:tblGrid>
+      <w:tr>
+        <w:trPr>
+          <w:tblHeader/>
+        </w:trPr>
+        <w:tc>
+          <w:tcPr>
+            <w:tcW w:type="dxa" w:w="1250"/>
+            <w:shd w:fill="2563EB" w:color="auto" w:val="clear"/>
+            <w:tcMar>
+              <w:top w:type="dxa" w:w="90"/>
+              <w:left w:type="dxa" w:w="110"/>
+              <w:bottom w:type="dxa" w:w="90"/>
+              <w:right w:type="dxa" w:w="110"/>
+            </w:tcMar>
+          </w:tcPr>
+          <w:p>
+            <w:pPr>
+              <w:bidi/>
+              <w:spacing w:after="0" w:line="280"/>
+              <w:jc w:val="right"/>
+            </w:pPr>
+            <w:r>
+              <w:rPr>
+                <w:rFonts w:ascii="Arial" w:cs="Arial" w:eastAsia="Arial" w:hAnsi="Arial"/>
+                <w:b/>
+                <w:bCs/>
+                <w:color w:val="FFFFFF"/>
+                <w:sz w:val="19"/>
+                <w:szCs w:val="19"/>
+                <w:rtl/>
+              </w:rPr>
+              <w:t xml:space="preserve">التاريخ</w:t>
+            </w:r>
+          </w:p>
+        </w:tc>
+        <w:tc>
+          <w:tcPr>
+            <w:tcW w:type="dxa" w:w="1250"/>
+            <w:shd w:fill="2563EB" w:color="auto" w:val="clear"/>
+            <w:tcMar>
+              <w:top w:type="dxa" w:w="90"/>
+              <w:left w:type="dxa" w:w="110"/>
+              <w:bottom w:type="dxa" w:w="90"/>
+              <w:right w:type="dxa" w:w="110"/>
+            </w:tcMar>
+          </w:tcPr>
+          <w:p>
+            <w:pPr>
+              <w:bidi/>
+              <w:spacing w:after="0" w:line="280"/>
+              <w:jc w:val="right"/>
+            </w:pPr>
+            <w:r>
+              <w:rPr>
+                <w:rFonts w:ascii="Arial" w:cs="Arial" w:eastAsia="Arial" w:hAnsi="Arial"/>
+                <w:b/>
+                <w:bCs/>
+                <w:color w:val="FFFFFF"/>
+                <w:sz w:val="19"/>
+                <w:szCs w:val="19"/>
+                <w:rtl/>
+              </w:rPr>
+              <w:t xml:space="preserve">الصفحة</w:t>
+            </w:r>
+          </w:p>
+        </w:tc>
+        <w:tc>
+          <w:tcPr>
+            <w:tcW w:type="dxa" w:w="1150"/>
+            <w:shd w:fill="2563EB" w:color="auto" w:val="clear"/>
+            <w:tcMar>
+              <w:top w:type="dxa" w:w="90"/>
+              <w:left w:type="dxa" w:w="110"/>
+              <w:bottom w:type="dxa" w:w="90"/>
+              <w:right w:type="dxa" w:w="110"/>
+            </w:tcMar>
+          </w:tcPr>
+          <w:p>
+            <w:pPr>
+              <w:bidi/>
+              <w:spacing w:after="0" w:line="280"/>
+              <w:jc w:val="right"/>
+            </w:pPr>
+            <w:r>
+              <w:rPr>
+                <w:rFonts w:ascii="Arial" w:cs="Arial" w:eastAsia="Arial" w:hAnsi="Arial"/>
+                <w:b/>
+                <w:bCs/>
+                <w:color w:val="FFFFFF"/>
+                <w:sz w:val="19"/>
+                <w:szCs w:val="19"/>
+                <w:rtl/>
+              </w:rPr>
+              <w:t xml:space="preserve">المسار</w:t>
+            </w:r>
+          </w:p>
+        </w:tc>
+        <w:tc>
+          <w:tcPr>
+            <w:tcW w:type="dxa" w:w="2500"/>
+            <w:shd w:fill="2563EB" w:color="auto" w:val="clear"/>
+            <w:tcMar>
+              <w:top w:type="dxa" w:w="90"/>
+              <w:left w:type="dxa" w:w="110"/>
+              <w:bottom w:type="dxa" w:w="90"/>
+              <w:right w:type="dxa" w:w="110"/>
+            </w:tcMar>
+          </w:tcPr>
+          <w:p>
+            <w:pPr>
+              <w:bidi/>
+              <w:spacing w:after="0" w:line="280"/>
+              <w:jc w:val="right"/>
+            </w:pPr>
+            <w:r>
+              <w:rPr>
+                <w:rFonts w:ascii="Arial" w:cs="Arial" w:eastAsia="Arial" w:hAnsi="Arial"/>
+                <w:b/>
+                <w:bCs/>
+                <w:color w:val="FFFFFF"/>
+                <w:sz w:val="19"/>
+                <w:szCs w:val="19"/>
+                <w:rtl/>
+              </w:rPr>
+              <w:t xml:space="preserve">الملف</w:t>
+            </w:r>
+          </w:p>
+        </w:tc>
+        <w:tc>
+          <w:tcPr>
+            <w:tcW w:type="dxa" w:w="1350"/>
+            <w:shd w:fill="2563EB" w:color="auto" w:val="clear"/>
+            <w:tcMar>
+              <w:top w:type="dxa" w:w="90"/>
+              <w:left w:type="dxa" w:w="110"/>
+              <w:bottom w:type="dxa" w:w="90"/>
+              <w:right w:type="dxa" w:w="110"/>
+            </w:tcMar>
+          </w:tcPr>
+          <w:p>
+            <w:pPr>
+              <w:bidi/>
+              <w:spacing w:after="0" w:line="280"/>
+              <w:jc w:val="right"/>
+            </w:pPr>
+            <w:r>
+              <w:rPr>
+                <w:rFonts w:ascii="Arial" w:cs="Arial" w:eastAsia="Arial" w:hAnsi="Arial"/>
+                <w:b/>
+                <w:bCs/>
+                <w:color w:val="FFFFFF"/>
+                <w:sz w:val="19"/>
+                <w:szCs w:val="19"/>
+                <w:rtl/>
+              </w:rPr>
+              <w:t xml:space="preserve">الكوميت</w:t>
+            </w:r>
+          </w:p>
+        </w:tc>
+        <w:tc>
+          <w:tcPr>
+            <w:tcW w:type="dxa" w:w="1500"/>
+            <w:shd w:fill="2563EB" w:color="auto" w:val="clear"/>
+            <w:tcMar>
+              <w:top w:type="dxa" w:w="90"/>
+              <w:left w:type="dxa" w:w="110"/>
+              <w:bottom w:type="dxa" w:w="90"/>
+              <w:right w:type="dxa" w:w="110"/>
+            </w:tcMar>
+          </w:tcPr>
+          <w:p>
+            <w:pPr>
+              <w:bidi/>
+              <w:spacing w:after="0" w:line="280"/>
+              <w:jc w:val="right"/>
+            </w:pPr>
+            <w:r>
+              <w:rPr>
+                <w:rFonts w:ascii="Arial" w:cs="Arial" w:eastAsia="Arial" w:hAnsi="Arial"/>
+                <w:b/>
+                <w:bCs/>
+                <w:color w:val="FFFFFF"/>
+                <w:sz w:val="19"/>
+                <w:szCs w:val="19"/>
+                <w:rtl/>
+              </w:rPr>
+              <w:t xml:space="preserve">الحالة</w:t>
+            </w:r>
+          </w:p>
+        </w:tc>
+      </w:tr>
+      <w:tr>
+        <w:tc>
+          <w:tcPr>
+            <w:tcW w:type="dxa" w:w="1250"/>
+            <w:tcMar>
+              <w:top w:type="dxa" w:w="90"/>
+              <w:left w:type="dxa" w:w="110"/>
+              <w:bottom w:type="dxa" w:w="90"/>
+              <w:right w:type="dxa" w:w="110"/>
+            </w:tcMar>
+          </w:tcPr>
+          <w:p>
+            <w:pPr>
+              <w:bidi/>
+              <w:spacing w:after="0" w:line="280"/>
+              <w:jc w:val="right"/>
+            </w:pPr>
+            <w:r>
+              <w:rPr>
+                <w:rFonts w:ascii="Arial" w:cs="Arial" w:eastAsia="Arial" w:hAnsi="Arial"/>
+                <w:b w:val="false"/>
+                <w:bCs w:val="false"/>
+                <w:color w:val="1E293B"/>
+                <w:sz w:val="19"/>
+                <w:szCs w:val="19"/>
+                <w:rtl/>
+              </w:rPr>
+              <w:t xml:space="preserve">9 سبتمبر 2026</w:t>
+            </w:r>
+          </w:p>
+        </w:tc>
+        <w:tc>
+          <w:tcPr>
+            <w:tcW w:type="dxa" w:w="1250"/>
+            <w:tcMar>
+              <w:top w:type="dxa" w:w="90"/>
+              <w:left w:type="dxa" w:w="110"/>
+              <w:bottom w:type="dxa" w:w="90"/>
+              <w:right w:type="dxa" w:w="110"/>
+            </w:tcMar>
+          </w:tcPr>
+          <w:p>
+            <w:pPr>
+              <w:bidi/>
+              <w:spacing w:after="0" w:line="280"/>
+              <w:jc w:val="right"/>
+            </w:pPr>
+            <w:r>
+              <w:rPr>
+                <w:rFonts w:ascii="Arial" w:cs="Arial" w:eastAsia="Arial" w:hAnsi="Arial"/>
+                <w:b w:val="false"/>
+                <w:bCs w:val="false"/>
+                <w:color w:val="1E293B"/>
+                <w:sz w:val="19"/>
+                <w:szCs w:val="19"/>
+                <w:rtl/>
+              </w:rPr>
+              <w:t xml:space="preserve">الاشتراك</w:t>
+            </w:r>
+          </w:p>
+        </w:tc>
+        <w:tc>
+          <w:tcPr>
+            <w:tcW w:type="dxa" w:w="1150"/>
+            <w:tcMar>
+              <w:top w:type="dxa" w:w="90"/>
+              <w:left w:type="dxa" w:w="110"/>
+              <w:bottom w:type="dxa" w:w="90"/>
+              <w:right w:type="dxa" w:w="110"/>
+            </w:tcMar>
+          </w:tcPr>
+          <w:p>
+            <w:pPr>
+              <w:bidi/>
+              <w:spacing w:after="0" w:line="280"/>
+              <w:jc w:val="right"/>
+            </w:pPr>
+            <w:r>
+              <w:rPr>
+                <w:rFonts w:ascii="Arial" w:cs="Arial" w:eastAsia="Arial" w:hAnsi="Arial"/>
+                <w:b w:val="false"/>
+                <w:bCs w:val="false"/>
+                <w:color w:val="1E293B"/>
+                <w:sz w:val="19"/>
+                <w:szCs w:val="19"/>
+                <w:rtl/>
+              </w:rPr>
+              <w:t xml:space="preserve">/subscribe</w:t>
+            </w:r>
+          </w:p>
+        </w:tc>
+        <w:tc>
+          <w:tcPr>
+            <w:tcW w:type="dxa" w:w="2500"/>
+            <w:tcMar>
+              <w:top w:type="dxa" w:w="90"/>
+              <w:left w:type="dxa" w:w="110"/>
+              <w:bottom w:type="dxa" w:w="90"/>
+              <w:right w:type="dxa" w:w="110"/>
+            </w:tcMar>
+          </w:tcPr>
+          <w:p>
+            <w:pPr>
+              <w:bidi/>
+              <w:spacing w:after="0" w:line="280"/>
+              <w:jc w:val="right"/>
+            </w:pPr>
+            <w:r>
+              <w:rPr>
+                <w:rFonts w:ascii="Arial" w:cs="Arial" w:eastAsia="Arial" w:hAnsi="Arial"/>
+                <w:b w:val="false"/>
+                <w:bCs w:val="false"/>
+                <w:color w:val="1E293B"/>
+                <w:sz w:val="19"/>
+                <w:szCs w:val="19"/>
+                <w:rtl/>
+              </w:rPr>
+              <w:t xml:space="preserve">src/pages/Subscribe.tsx</w:t>
+            </w:r>
+          </w:p>
+        </w:tc>
+        <w:tc>
+          <w:tcPr>
+            <w:tcW w:type="dxa" w:w="1350"/>
+            <w:tcMar>
+              <w:top w:type="dxa" w:w="90"/>
+              <w:left w:type="dxa" w:w="110"/>
+              <w:bottom w:type="dxa" w:w="90"/>
+              <w:right w:type="dxa" w:w="110"/>
+            </w:tcMar>
+          </w:tcPr>
+          <w:p>
+            <w:pPr>
+              <w:bidi/>
+              <w:spacing w:after="0" w:line="280"/>
+              <w:jc w:val="right"/>
+            </w:pPr>
+            <w:r>
+              <w:rPr>
+                <w:rFonts w:ascii="Arial" w:cs="Arial" w:eastAsia="Arial" w:hAnsi="Arial"/>
+                <w:b w:val="false"/>
+                <w:bCs w:val="false"/>
+                <w:color w:val="1E293B"/>
+                <w:sz w:val="19"/>
+                <w:szCs w:val="19"/>
+                <w:rtl/>
+              </w:rPr>
+              <w:t xml:space="preserve">be5b3c0 · c49b797</w:t>
+            </w:r>
+          </w:p>
+        </w:tc>
+        <w:tc>
+          <w:tcPr>
+            <w:tcW w:type="dxa" w:w="1500"/>
+            <w:shd w:fill="ECFDF5" w:color="auto" w:val="clear"/>
+            <w:tcMar>
+              <w:top w:type="dxa" w:w="90"/>
+              <w:left w:type="dxa" w:w="110"/>
+              <w:bottom w:type="dxa" w:w="90"/>
+              <w:right w:type="dxa" w:w="110"/>
+            </w:tcMar>
+          </w:tcPr>
+          <w:p>
+            <w:pPr>
+              <w:bidi/>
+              <w:spacing w:after="0" w:line="280"/>
+              <w:jc w:val="right"/>
+            </w:pPr>
+            <w:r>
+              <w:rPr>
+                <w:rFonts w:ascii="Arial" w:cs="Arial" w:eastAsia="Arial" w:hAnsi="Arial"/>
+                <w:b/>
+                <w:bCs/>
+                <w:color w:val="15803D"/>
+                <w:sz w:val="19"/>
+                <w:szCs w:val="19"/>
+                <w:rtl/>
+              </w:rPr>
+              <w:t xml:space="preserve">منشور على الإنتاج</w:t>
+            </w:r>
+          </w:p>
+        </w:tc>
+      </w:tr>
+    </w:tbl>
+    <w:p>
+      <w:pPr>
+        <w:spacing w:after="90"/>
+      </w:pPr>
     </w:p>
     <w:p>
       <w:pPr>
@@ -6674,7 +7390,7 @@
           <w:szCs w:val="21"/>
           <w:rtl/>
         </w:rPr>
-        <w:t xml:space="preserve">مسار من ست خطوات: اختيار الباقة، ثم تأكيد التخفيض، ثم الدفع، ثم المعالجة، ثم النجاح أو الفشل.</w:t>
+        <w:t xml:space="preserve">إعادة بناء شبه كاملة للصفحة — 715 سطراً متغيّراً.</w:t>
       </w:r>
     </w:p>
     <w:p>
@@ -6696,7 +7412,7 @@
           <w:szCs w:val="21"/>
           <w:rtl/>
         </w:rPr>
-        <w:t xml:space="preserve">احتساب تناسبي للترقية: يُحصَّل فرق السعر عن الأيام المتبقية من الدورة الحالية فقط، ويظهر المبلغ مفصّلاً في ملخص الدفع.</w:t>
+        <w:t xml:space="preserve">اختيار الباقة صار بشريط تمرير (slider) حسب عدد المحادثات الشهرية بدل شبكة الكروت. كل باقة نقطة توقف على الشريط، وباقة المؤسسات هي النقطة الأخيرة بعنوان «غير محدود».</w:t>
       </w:r>
     </w:p>
     <w:p>
@@ -6718,7 +7434,7 @@
           <w:szCs w:val="21"/>
           <w:rtl/>
         </w:rPr>
-        <w:t xml:space="preserve">التخفيض له شاشة تأكيد مستقلة ولا يذهب مباشرة إلى الدفع.</w:t>
+        <w:t xml:space="preserve">مسار من ست خطوات: اختيار الباقة، ثم تأكيد التخفيض، ثم الدفع، ثم المعالجة، ثم النجاح أو الفشل.</w:t>
       </w:r>
     </w:p>
     <w:p>
@@ -6740,7 +7456,7 @@
           <w:szCs w:val="21"/>
           <w:rtl/>
         </w:rPr>
-        <w:t xml:space="preserve">دورة الفوترة تُقرأ من اشتراك العميل الحالي بدل أن تبدأ بقيمة ثابتة.</w:t>
+        <w:t xml:space="preserve">احتساب تناسبي للترقية: يُحصَّل فرق السعر عن الأيام المتبقية من الدورة الحالية فقط، ويظهر المبلغ مفصّلاً في ملخص الدفع.</w:t>
       </w:r>
     </w:p>
     <w:p>
@@ -6762,6 +7478,50 @@
           <w:szCs w:val="21"/>
           <w:rtl/>
         </w:rPr>
+        <w:t xml:space="preserve">التخفيض له شاشة تأكيد مستقلة ولا يذهب مباشرة إلى الدفع.</w:t>
+      </w:r>
+    </w:p>
+    <w:p>
+      <w:pPr>
+        <w:pStyle w:val="ListParagraph"/>
+        <w:numPr>
+          <w:ilvl w:val="0"/>
+          <w:numId w:val="2"/>
+        </w:numPr>
+        <w:bidi/>
+        <w:spacing w:after="70" w:line="290"/>
+        <w:jc w:val="right"/>
+      </w:pPr>
+      <w:r>
+        <w:rPr>
+          <w:rFonts w:ascii="Arial" w:cs="Arial" w:eastAsia="Arial" w:hAnsi="Arial"/>
+          <w:color w:val="1E293B"/>
+          <w:sz w:val="21"/>
+          <w:szCs w:val="21"/>
+          <w:rtl/>
+        </w:rPr>
+        <w:t xml:space="preserve">دورة الفوترة تُقرأ من اشتراك العميل الحالي بدل أن تبدأ بقيمة ثابتة.</w:t>
+      </w:r>
+    </w:p>
+    <w:p>
+      <w:pPr>
+        <w:pStyle w:val="ListParagraph"/>
+        <w:numPr>
+          <w:ilvl w:val="0"/>
+          <w:numId w:val="2"/>
+        </w:numPr>
+        <w:bidi/>
+        <w:spacing w:after="70" w:line="290"/>
+        <w:jc w:val="right"/>
+      </w:pPr>
+      <w:r>
+        <w:rPr>
+          <w:rFonts w:ascii="Arial" w:cs="Arial" w:eastAsia="Arial" w:hAnsi="Arial"/>
+          <w:color w:val="1E293B"/>
+          <w:sz w:val="21"/>
+          <w:szCs w:val="21"/>
+          <w:rtl/>
+        </w:rPr>
         <w:t xml:space="preserve">أُصلحت علامات تعارض الدمج (merge conflict markers) التي كانت باقية في الملف — كوميت c49b797.</w:t>
       </w:r>
     </w:p>
@@ -6948,7 +7708,7 @@
           <w:szCs w:val="20"/>
           <w:rtl/>
         </w:rPr>
-        <w:t xml:space="preserve">عدد التعديلات المسجّلة: 8</w:t>
+        <w:t xml:space="preserve">عدد التعديلات المسجّلة: 9</w:t>
       </w:r>
     </w:p>
     <w:sectPr>

</xml_diff>

<commit_message>
deploy build 57ecc758 to production
Publishes the scheduled-downgrade state in the client portal, the numbered
cycle dividers in the thread, and the optional staff phone number. All nine
changelog entries are now live and the tracked dist artifacts match what is
served.

Co-Authored-By: Claude Opus 5 <noreply@anthropic.com>
Claude-Session: https://claude.ai/code/session_01JGHUnSrtQwLX2BGbB3j6wk
</commit_message>
<xml_diff>
--- a/docs/سجل التعديلات الاخيرة.docx
+++ b/docs/سجل التعديلات الاخيرة.docx
@@ -451,31 +451,31 @@
         <w:tc>
           <w:tcPr>
             <w:tcW w:type="dxa" w:w="1800"/>
-            <w:shd w:fill="FFFBEB" w:color="auto" w:val="clear"/>
-            <w:tcMar>
-              <w:top w:type="dxa" w:w="90"/>
-              <w:left w:type="dxa" w:w="110"/>
-              <w:bottom w:type="dxa" w:w="90"/>
-              <w:right w:type="dxa" w:w="110"/>
-            </w:tcMar>
-          </w:tcPr>
-          <w:p>
-            <w:pPr>
-              <w:bidi/>
-              <w:spacing w:after="0" w:line="280"/>
-              <w:jc w:val="right"/>
-            </w:pPr>
-            <w:r>
-              <w:rPr>
-                <w:rFonts w:ascii="Arial" w:cs="Arial" w:eastAsia="Arial" w:hAnsi="Arial"/>
-                <w:b/>
-                <w:bCs/>
-                <w:color w:val="B45309"/>
-                <w:sz w:val="19"/>
-                <w:szCs w:val="19"/>
-                <w:rtl/>
-              </w:rPr>
-              <w:t xml:space="preserve">مرفوع — غير منشور</w:t>
+            <w:shd w:fill="ECFDF5" w:color="auto" w:val="clear"/>
+            <w:tcMar>
+              <w:top w:type="dxa" w:w="90"/>
+              <w:left w:type="dxa" w:w="110"/>
+              <w:bottom w:type="dxa" w:w="90"/>
+              <w:right w:type="dxa" w:w="110"/>
+            </w:tcMar>
+          </w:tcPr>
+          <w:p>
+            <w:pPr>
+              <w:bidi/>
+              <w:spacing w:after="0" w:line="280"/>
+              <w:jc w:val="right"/>
+            </w:pPr>
+            <w:r>
+              <w:rPr>
+                <w:rFonts w:ascii="Arial" w:cs="Arial" w:eastAsia="Arial" w:hAnsi="Arial"/>
+                <w:b/>
+                <w:bCs/>
+                <w:color w:val="15803D"/>
+                <w:sz w:val="19"/>
+                <w:szCs w:val="19"/>
+                <w:rtl/>
+              </w:rPr>
+              <w:t xml:space="preserve">منشور على الإنتاج</w:t>
             </w:r>
           </w:p>
         </w:tc>
@@ -608,31 +608,31 @@
         <w:tc>
           <w:tcPr>
             <w:tcW w:type="dxa" w:w="1800"/>
-            <w:shd w:fill="FFFBEB" w:color="auto" w:val="clear"/>
-            <w:tcMar>
-              <w:top w:type="dxa" w:w="90"/>
-              <w:left w:type="dxa" w:w="110"/>
-              <w:bottom w:type="dxa" w:w="90"/>
-              <w:right w:type="dxa" w:w="110"/>
-            </w:tcMar>
-          </w:tcPr>
-          <w:p>
-            <w:pPr>
-              <w:bidi/>
-              <w:spacing w:after="0" w:line="280"/>
-              <w:jc w:val="right"/>
-            </w:pPr>
-            <w:r>
-              <w:rPr>
-                <w:rFonts w:ascii="Arial" w:cs="Arial" w:eastAsia="Arial" w:hAnsi="Arial"/>
-                <w:b/>
-                <w:bCs/>
-                <w:color w:val="B45309"/>
-                <w:sz w:val="19"/>
-                <w:szCs w:val="19"/>
-                <w:rtl/>
-              </w:rPr>
-              <w:t xml:space="preserve">مرفوع — غير منشور</w:t>
+            <w:shd w:fill="ECFDF5" w:color="auto" w:val="clear"/>
+            <w:tcMar>
+              <w:top w:type="dxa" w:w="90"/>
+              <w:left w:type="dxa" w:w="110"/>
+              <w:bottom w:type="dxa" w:w="90"/>
+              <w:right w:type="dxa" w:w="110"/>
+            </w:tcMar>
+          </w:tcPr>
+          <w:p>
+            <w:pPr>
+              <w:bidi/>
+              <w:spacing w:after="0" w:line="280"/>
+              <w:jc w:val="right"/>
+            </w:pPr>
+            <w:r>
+              <w:rPr>
+                <w:rFonts w:ascii="Arial" w:cs="Arial" w:eastAsia="Arial" w:hAnsi="Arial"/>
+                <w:b/>
+                <w:bCs/>
+                <w:color w:val="15803D"/>
+                <w:sz w:val="19"/>
+                <w:szCs w:val="19"/>
+                <w:rtl/>
+              </w:rPr>
+              <w:t xml:space="preserve">منشور على الإنتاج</w:t>
             </w:r>
           </w:p>
         </w:tc>
@@ -761,31 +761,31 @@
         <w:tc>
           <w:tcPr>
             <w:tcW w:type="dxa" w:w="1800"/>
-            <w:shd w:fill="FFFBEB" w:color="auto" w:val="clear"/>
-            <w:tcMar>
-              <w:top w:type="dxa" w:w="90"/>
-              <w:left w:type="dxa" w:w="110"/>
-              <w:bottom w:type="dxa" w:w="90"/>
-              <w:right w:type="dxa" w:w="110"/>
-            </w:tcMar>
-          </w:tcPr>
-          <w:p>
-            <w:pPr>
-              <w:bidi/>
-              <w:spacing w:after="0" w:line="280"/>
-              <w:jc w:val="right"/>
-            </w:pPr>
-            <w:r>
-              <w:rPr>
-                <w:rFonts w:ascii="Arial" w:cs="Arial" w:eastAsia="Arial" w:hAnsi="Arial"/>
-                <w:b/>
-                <w:bCs/>
-                <w:color w:val="B45309"/>
-                <w:sz w:val="19"/>
-                <w:szCs w:val="19"/>
-                <w:rtl/>
-              </w:rPr>
-              <w:t xml:space="preserve">مرفوع — غير منشور</w:t>
+            <w:shd w:fill="ECFDF5" w:color="auto" w:val="clear"/>
+            <w:tcMar>
+              <w:top w:type="dxa" w:w="90"/>
+              <w:left w:type="dxa" w:w="110"/>
+              <w:bottom w:type="dxa" w:w="90"/>
+              <w:right w:type="dxa" w:w="110"/>
+            </w:tcMar>
+          </w:tcPr>
+          <w:p>
+            <w:pPr>
+              <w:bidi/>
+              <w:spacing w:after="0" w:line="280"/>
+              <w:jc w:val="right"/>
+            </w:pPr>
+            <w:r>
+              <w:rPr>
+                <w:rFonts w:ascii="Arial" w:cs="Arial" w:eastAsia="Arial" w:hAnsi="Arial"/>
+                <w:b/>
+                <w:bCs/>
+                <w:color w:val="15803D"/>
+                <w:sz w:val="19"/>
+                <w:szCs w:val="19"/>
+                <w:rtl/>
+              </w:rPr>
+              <w:t xml:space="preserve">منشور على الإنتاج</w:t>
             </w:r>
           </w:p>
         </w:tc>
@@ -2087,7 +2087,7 @@
                 <w:szCs w:val="20"/>
                 <w:rtl/>
               </w:rPr>
-              <w:t xml:space="preserve">البناء المنشور على الإنتاج: 8bb2487f-c80a-4577-a876-61061b147ecc</w:t>
+              <w:t xml:space="preserve">البناء المنشور على الإنتاج: 57ecc758-14ef-4540-9dfc-29bfe7050fa2</w:t>
             </w:r>
           </w:p>
           <w:p>
@@ -2104,7 +2104,7 @@
                 <w:szCs w:val="20"/>
                 <w:rtl/>
               </w:rPr>
-              <w:t xml:space="preserve">يوجد 3 تعديل مرفوع على الفرع ولم يُنشر بعد — مبيّن في الجدول أعلاه.</w:t>
+              <w:t xml:space="preserve">كل التعديلات المرفوعة منشورة على الإنتاج.</w:t>
             </w:r>
           </w:p>
           <w:p>
@@ -2539,38 +2539,38 @@
                 <w:szCs w:val="19"/>
                 <w:rtl/>
               </w:rPr>
-              <w:t xml:space="preserve">—</w:t>
+              <w:t xml:space="preserve">a4d8398</w:t>
             </w:r>
           </w:p>
         </w:tc>
         <w:tc>
           <w:tcPr>
             <w:tcW w:type="dxa" w:w="1500"/>
-            <w:shd w:fill="FFFBEB" w:color="auto" w:val="clear"/>
-            <w:tcMar>
-              <w:top w:type="dxa" w:w="90"/>
-              <w:left w:type="dxa" w:w="110"/>
-              <w:bottom w:type="dxa" w:w="90"/>
-              <w:right w:type="dxa" w:w="110"/>
-            </w:tcMar>
-          </w:tcPr>
-          <w:p>
-            <w:pPr>
-              <w:bidi/>
-              <w:spacing w:after="0" w:line="280"/>
-              <w:jc w:val="right"/>
-            </w:pPr>
-            <w:r>
-              <w:rPr>
-                <w:rFonts w:ascii="Arial" w:cs="Arial" w:eastAsia="Arial" w:hAnsi="Arial"/>
-                <w:b/>
-                <w:bCs/>
-                <w:color w:val="B45309"/>
-                <w:sz w:val="19"/>
-                <w:szCs w:val="19"/>
-                <w:rtl/>
-              </w:rPr>
-              <w:t xml:space="preserve">مرفوع — غير منشور</w:t>
+            <w:shd w:fill="ECFDF5" w:color="auto" w:val="clear"/>
+            <w:tcMar>
+              <w:top w:type="dxa" w:w="90"/>
+              <w:left w:type="dxa" w:w="110"/>
+              <w:bottom w:type="dxa" w:w="90"/>
+              <w:right w:type="dxa" w:w="110"/>
+            </w:tcMar>
+          </w:tcPr>
+          <w:p>
+            <w:pPr>
+              <w:bidi/>
+              <w:spacing w:after="0" w:line="280"/>
+              <w:jc w:val="right"/>
+            </w:pPr>
+            <w:r>
+              <w:rPr>
+                <w:rFonts w:ascii="Arial" w:cs="Arial" w:eastAsia="Arial" w:hAnsi="Arial"/>
+                <w:b/>
+                <w:bCs/>
+                <w:color w:val="15803D"/>
+                <w:sz w:val="19"/>
+                <w:szCs w:val="19"/>
+                <w:rtl/>
+              </w:rPr>
+              <w:t xml:space="preserve">منشور على الإنتاج</w:t>
             </w:r>
           </w:p>
         </w:tc>
@@ -3146,38 +3146,38 @@
                 <w:szCs w:val="19"/>
                 <w:rtl/>
               </w:rPr>
-              <w:t xml:space="preserve">—</w:t>
+              <w:t xml:space="preserve">f9b43fd</w:t>
             </w:r>
           </w:p>
         </w:tc>
         <w:tc>
           <w:tcPr>
             <w:tcW w:type="dxa" w:w="1500"/>
-            <w:shd w:fill="FFFBEB" w:color="auto" w:val="clear"/>
-            <w:tcMar>
-              <w:top w:type="dxa" w:w="90"/>
-              <w:left w:type="dxa" w:w="110"/>
-              <w:bottom w:type="dxa" w:w="90"/>
-              <w:right w:type="dxa" w:w="110"/>
-            </w:tcMar>
-          </w:tcPr>
-          <w:p>
-            <w:pPr>
-              <w:bidi/>
-              <w:spacing w:after="0" w:line="280"/>
-              <w:jc w:val="right"/>
-            </w:pPr>
-            <w:r>
-              <w:rPr>
-                <w:rFonts w:ascii="Arial" w:cs="Arial" w:eastAsia="Arial" w:hAnsi="Arial"/>
-                <w:b/>
-                <w:bCs/>
-                <w:color w:val="B45309"/>
-                <w:sz w:val="19"/>
-                <w:szCs w:val="19"/>
-                <w:rtl/>
-              </w:rPr>
-              <w:t xml:space="preserve">مرفوع — غير منشور</w:t>
+            <w:shd w:fill="ECFDF5" w:color="auto" w:val="clear"/>
+            <w:tcMar>
+              <w:top w:type="dxa" w:w="90"/>
+              <w:left w:type="dxa" w:w="110"/>
+              <w:bottom w:type="dxa" w:w="90"/>
+              <w:right w:type="dxa" w:w="110"/>
+            </w:tcMar>
+          </w:tcPr>
+          <w:p>
+            <w:pPr>
+              <w:bidi/>
+              <w:spacing w:after="0" w:line="280"/>
+              <w:jc w:val="right"/>
+            </w:pPr>
+            <w:r>
+              <w:rPr>
+                <w:rFonts w:ascii="Arial" w:cs="Arial" w:eastAsia="Arial" w:hAnsi="Arial"/>
+                <w:b/>
+                <w:bCs/>
+                <w:color w:val="15803D"/>
+                <w:sz w:val="19"/>
+                <w:szCs w:val="19"/>
+                <w:rtl/>
+              </w:rPr>
+              <w:t xml:space="preserve">منشور على الإنتاج</w:t>
             </w:r>
           </w:p>
         </w:tc>
@@ -3753,38 +3753,38 @@
                 <w:szCs w:val="19"/>
                 <w:rtl/>
               </w:rPr>
-              <w:t xml:space="preserve">—</w:t>
+              <w:t xml:space="preserve">5202dba</w:t>
             </w:r>
           </w:p>
         </w:tc>
         <w:tc>
           <w:tcPr>
             <w:tcW w:type="dxa" w:w="1500"/>
-            <w:shd w:fill="FFFBEB" w:color="auto" w:val="clear"/>
-            <w:tcMar>
-              <w:top w:type="dxa" w:w="90"/>
-              <w:left w:type="dxa" w:w="110"/>
-              <w:bottom w:type="dxa" w:w="90"/>
-              <w:right w:type="dxa" w:w="110"/>
-            </w:tcMar>
-          </w:tcPr>
-          <w:p>
-            <w:pPr>
-              <w:bidi/>
-              <w:spacing w:after="0" w:line="280"/>
-              <w:jc w:val="right"/>
-            </w:pPr>
-            <w:r>
-              <w:rPr>
-                <w:rFonts w:ascii="Arial" w:cs="Arial" w:eastAsia="Arial" w:hAnsi="Arial"/>
-                <w:b/>
-                <w:bCs/>
-                <w:color w:val="B45309"/>
-                <w:sz w:val="19"/>
-                <w:szCs w:val="19"/>
-                <w:rtl/>
-              </w:rPr>
-              <w:t xml:space="preserve">مرفوع — غير منشور</w:t>
+            <w:shd w:fill="ECFDF5" w:color="auto" w:val="clear"/>
+            <w:tcMar>
+              <w:top w:type="dxa" w:w="90"/>
+              <w:left w:type="dxa" w:w="110"/>
+              <w:bottom w:type="dxa" w:w="90"/>
+              <w:right w:type="dxa" w:w="110"/>
+            </w:tcMar>
+          </w:tcPr>
+          <w:p>
+            <w:pPr>
+              <w:bidi/>
+              <w:spacing w:after="0" w:line="280"/>
+              <w:jc w:val="right"/>
+            </w:pPr>
+            <w:r>
+              <w:rPr>
+                <w:rFonts w:ascii="Arial" w:cs="Arial" w:eastAsia="Arial" w:hAnsi="Arial"/>
+                <w:b/>
+                <w:bCs/>
+                <w:color w:val="15803D"/>
+                <w:sz w:val="19"/>
+                <w:szCs w:val="19"/>
+                <w:rtl/>
+              </w:rPr>
+              <w:t xml:space="preserve">منشور على الإنتاج</w:t>
             </w:r>
           </w:p>
         </w:tc>

</xml_diff>

<commit_message>
deploy build a332b5cf to production
Publish the two-factor login challenge and the optional staff phone
field to qhub-client.apexes.click. All 90 assets uploaded and verified
against the local build before any index.html was replaced, then the 65
route copies, then version.json last.

Mark changelog entry 10 as live and point BUILD_LIVE at a332b5cf.

Co-Authored-By: Claude Opus 5 <noreply@anthropic.com>
Claude-Session: https://claude.ai/code/session_01JGHUnSrtQwLX2BGbB3j6wk
</commit_message>
<xml_diff>
--- a/docs/سجل التعديلات الاخيرة.docx
+++ b/docs/سجل التعديلات الاخيرة.docx
@@ -451,31 +451,31 @@
         <w:tc>
           <w:tcPr>
             <w:tcW w:type="dxa" w:w="1800"/>
-            <w:shd w:fill="FFFBEB" w:color="auto" w:val="clear"/>
-            <w:tcMar>
-              <w:top w:type="dxa" w:w="90"/>
-              <w:left w:type="dxa" w:w="110"/>
-              <w:bottom w:type="dxa" w:w="90"/>
-              <w:right w:type="dxa" w:w="110"/>
-            </w:tcMar>
-          </w:tcPr>
-          <w:p>
-            <w:pPr>
-              <w:bidi/>
-              <w:spacing w:after="0" w:line="280"/>
-              <w:jc w:val="right"/>
-            </w:pPr>
-            <w:r>
-              <w:rPr>
-                <w:rFonts w:ascii="Arial" w:cs="Arial" w:eastAsia="Arial" w:hAnsi="Arial"/>
-                <w:b/>
-                <w:bCs/>
-                <w:color w:val="B45309"/>
-                <w:sz w:val="19"/>
-                <w:szCs w:val="19"/>
-                <w:rtl/>
-              </w:rPr>
-              <w:t xml:space="preserve">مرفوع — غير منشور</w:t>
+            <w:shd w:fill="ECFDF5" w:color="auto" w:val="clear"/>
+            <w:tcMar>
+              <w:top w:type="dxa" w:w="90"/>
+              <w:left w:type="dxa" w:w="110"/>
+              <w:bottom w:type="dxa" w:w="90"/>
+              <w:right w:type="dxa" w:w="110"/>
+            </w:tcMar>
+          </w:tcPr>
+          <w:p>
+            <w:pPr>
+              <w:bidi/>
+              <w:spacing w:after="0" w:line="280"/>
+              <w:jc w:val="right"/>
+            </w:pPr>
+            <w:r>
+              <w:rPr>
+                <w:rFonts w:ascii="Arial" w:cs="Arial" w:eastAsia="Arial" w:hAnsi="Arial"/>
+                <w:b/>
+                <w:bCs/>
+                <w:color w:val="15803D"/>
+                <w:sz w:val="19"/>
+                <w:szCs w:val="19"/>
+                <w:rtl/>
+              </w:rPr>
+              <w:t xml:space="preserve">منشور على الإنتاج</w:t>
             </w:r>
           </w:p>
         </w:tc>
@@ -2244,7 +2244,7 @@
                 <w:szCs w:val="20"/>
                 <w:rtl/>
               </w:rPr>
-              <w:t xml:space="preserve">البناء المنشور على الإنتاج: 57ecc758-14ef-4540-9dfc-29bfe7050fa2</w:t>
+              <w:t xml:space="preserve">البناء المنشور على الإنتاج: a332b5cf-22f8-4cfb-afc1-07f093a9065f</w:t>
             </w:r>
           </w:p>
           <w:p>
@@ -2261,7 +2261,7 @@
                 <w:szCs w:val="20"/>
                 <w:rtl/>
               </w:rPr>
-              <w:t xml:space="preserve">يوجد 1 تعديل مرفوع على الفرع ولم يُنشر بعد — مبيّن في الجدول أعلاه.</w:t>
+              <w:t xml:space="preserve">كل التعديلات المرفوعة منشورة على الإنتاج.</w:t>
             </w:r>
           </w:p>
           <w:p>
@@ -2696,38 +2696,38 @@
                 <w:szCs w:val="19"/>
                 <w:rtl/>
               </w:rPr>
-              <w:t xml:space="preserve">—</w:t>
+              <w:t xml:space="preserve">743042c</w:t>
             </w:r>
           </w:p>
         </w:tc>
         <w:tc>
           <w:tcPr>
             <w:tcW w:type="dxa" w:w="1500"/>
-            <w:shd w:fill="FFFBEB" w:color="auto" w:val="clear"/>
-            <w:tcMar>
-              <w:top w:type="dxa" w:w="90"/>
-              <w:left w:type="dxa" w:w="110"/>
-              <w:bottom w:type="dxa" w:w="90"/>
-              <w:right w:type="dxa" w:w="110"/>
-            </w:tcMar>
-          </w:tcPr>
-          <w:p>
-            <w:pPr>
-              <w:bidi/>
-              <w:spacing w:after="0" w:line="280"/>
-              <w:jc w:val="right"/>
-            </w:pPr>
-            <w:r>
-              <w:rPr>
-                <w:rFonts w:ascii="Arial" w:cs="Arial" w:eastAsia="Arial" w:hAnsi="Arial"/>
-                <w:b/>
-                <w:bCs/>
-                <w:color w:val="B45309"/>
-                <w:sz w:val="19"/>
-                <w:szCs w:val="19"/>
-                <w:rtl/>
-              </w:rPr>
-              <w:t xml:space="preserve">مرفوع — غير منشور</w:t>
+            <w:shd w:fill="ECFDF5" w:color="auto" w:val="clear"/>
+            <w:tcMar>
+              <w:top w:type="dxa" w:w="90"/>
+              <w:left w:type="dxa" w:w="110"/>
+              <w:bottom w:type="dxa" w:w="90"/>
+              <w:right w:type="dxa" w:w="110"/>
+            </w:tcMar>
+          </w:tcPr>
+          <w:p>
+            <w:pPr>
+              <w:bidi/>
+              <w:spacing w:after="0" w:line="280"/>
+              <w:jc w:val="right"/>
+            </w:pPr>
+            <w:r>
+              <w:rPr>
+                <w:rFonts w:ascii="Arial" w:cs="Arial" w:eastAsia="Arial" w:hAnsi="Arial"/>
+                <w:b/>
+                <w:bCs/>
+                <w:color w:val="15803D"/>
+                <w:sz w:val="19"/>
+                <w:szCs w:val="19"/>
+                <w:rtl/>
+              </w:rPr>
+              <w:t xml:space="preserve">منشور على الإنتاج</w:t>
             </w:r>
           </w:p>
         </w:tc>

</xml_diff>

<commit_message>
deploy build 793b4e4b to production
Publish the scannable 2FA QR code and the optional profile phone field
to qhub-client.apexes.click. All 91 assets uploaded and diffed against
the local build before any HTML was touched — the diff caught one file
(channelTypes) missed in the upload batches — then the 65 route copies,
then version.json last.

Record both changes in the changelog and point BUILD_LIVE at 793b4e4b.

Co-Authored-By: Claude Opus 5 <noreply@anthropic.com>
Claude-Session: https://claude.ai/code/session_01JGHUnSrtQwLX2BGbB3j6wk
</commit_message>
<xml_diff>
--- a/docs/سجل التعديلات الاخيرة.docx
+++ b/docs/سجل التعديلات الاخيرة.docx
@@ -354,6 +354,316 @@
                 <w:szCs w:val="19"/>
                 <w:rtl/>
               </w:rPr>
+              <w:t xml:space="preserve">12</w:t>
+            </w:r>
+          </w:p>
+        </w:tc>
+        <w:tc>
+          <w:tcPr>
+            <w:tcW w:type="dxa" w:w="1500"/>
+            <w:tcMar>
+              <w:top w:type="dxa" w:w="90"/>
+              <w:left w:type="dxa" w:w="110"/>
+              <w:bottom w:type="dxa" w:w="90"/>
+              <w:right w:type="dxa" w:w="110"/>
+            </w:tcMar>
+          </w:tcPr>
+          <w:p>
+            <w:pPr>
+              <w:bidi/>
+              <w:spacing w:after="0" w:line="280"/>
+              <w:jc w:val="right"/>
+            </w:pPr>
+            <w:r>
+              <w:rPr>
+                <w:rFonts w:ascii="Arial" w:cs="Arial" w:eastAsia="Arial" w:hAnsi="Arial"/>
+                <w:b w:val="false"/>
+                <w:bCs w:val="false"/>
+                <w:color w:val="1E293B"/>
+                <w:sz w:val="19"/>
+                <w:szCs w:val="19"/>
+                <w:rtl/>
+              </w:rPr>
+              <w:t xml:space="preserve">10 سبتمبر 2026</w:t>
+            </w:r>
+          </w:p>
+        </w:tc>
+        <w:tc>
+          <w:tcPr>
+            <w:tcW w:type="dxa" w:w="3600"/>
+            <w:tcMar>
+              <w:top w:type="dxa" w:w="90"/>
+              <w:left w:type="dxa" w:w="110"/>
+              <w:bottom w:type="dxa" w:w="90"/>
+              <w:right w:type="dxa" w:w="110"/>
+            </w:tcMar>
+          </w:tcPr>
+          <w:p>
+            <w:pPr>
+              <w:bidi/>
+              <w:spacing w:after="0" w:line="280"/>
+              <w:jc w:val="right"/>
+            </w:pPr>
+            <w:r>
+              <w:rPr>
+                <w:rFonts w:ascii="Arial" w:cs="Arial" w:eastAsia="Arial" w:hAnsi="Arial"/>
+                <w:b w:val="false"/>
+                <w:bCs w:val="false"/>
+                <w:color w:val="1E293B"/>
+                <w:sz w:val="19"/>
+                <w:szCs w:val="19"/>
+                <w:rtl/>
+              </w:rPr>
+              <w:t xml:space="preserve">رمز QR حقيقي قابل للمسح في إعداد المصادقة الثنائية</w:t>
+            </w:r>
+          </w:p>
+        </w:tc>
+        <w:tc>
+          <w:tcPr>
+            <w:tcW w:type="dxa" w:w="1500"/>
+            <w:tcMar>
+              <w:top w:type="dxa" w:w="90"/>
+              <w:left w:type="dxa" w:w="110"/>
+              <w:bottom w:type="dxa" w:w="90"/>
+              <w:right w:type="dxa" w:w="110"/>
+            </w:tcMar>
+          </w:tcPr>
+          <w:p>
+            <w:pPr>
+              <w:bidi/>
+              <w:spacing w:after="0" w:line="280"/>
+              <w:jc w:val="right"/>
+            </w:pPr>
+            <w:r>
+              <w:rPr>
+                <w:rFonts w:ascii="Arial" w:cs="Arial" w:eastAsia="Arial" w:hAnsi="Arial"/>
+                <w:b w:val="false"/>
+                <w:bCs w:val="false"/>
+                <w:color w:val="1E293B"/>
+                <w:sz w:val="19"/>
+                <w:szCs w:val="19"/>
+                <w:rtl/>
+              </w:rPr>
+              <w:t xml:space="preserve">الإعدادات ← الأمان</w:t>
+            </w:r>
+          </w:p>
+        </w:tc>
+        <w:tc>
+          <w:tcPr>
+            <w:tcW w:type="dxa" w:w="1800"/>
+            <w:shd w:fill="ECFDF5" w:color="auto" w:val="clear"/>
+            <w:tcMar>
+              <w:top w:type="dxa" w:w="90"/>
+              <w:left w:type="dxa" w:w="110"/>
+              <w:bottom w:type="dxa" w:w="90"/>
+              <w:right w:type="dxa" w:w="110"/>
+            </w:tcMar>
+          </w:tcPr>
+          <w:p>
+            <w:pPr>
+              <w:bidi/>
+              <w:spacing w:after="0" w:line="280"/>
+              <w:jc w:val="right"/>
+            </w:pPr>
+            <w:r>
+              <w:rPr>
+                <w:rFonts w:ascii="Arial" w:cs="Arial" w:eastAsia="Arial" w:hAnsi="Arial"/>
+                <w:b/>
+                <w:bCs/>
+                <w:color w:val="15803D"/>
+                <w:sz w:val="19"/>
+                <w:szCs w:val="19"/>
+                <w:rtl/>
+              </w:rPr>
+              <w:t xml:space="preserve">منشور على الإنتاج</w:t>
+            </w:r>
+          </w:p>
+        </w:tc>
+      </w:tr>
+      <w:tr>
+        <w:tc>
+          <w:tcPr>
+            <w:tcW w:type="dxa" w:w="600"/>
+            <w:shd w:fill="F1F5F9" w:color="auto" w:val="clear"/>
+            <w:tcMar>
+              <w:top w:type="dxa" w:w="90"/>
+              <w:left w:type="dxa" w:w="110"/>
+              <w:bottom w:type="dxa" w:w="90"/>
+              <w:right w:type="dxa" w:w="110"/>
+            </w:tcMar>
+          </w:tcPr>
+          <w:p>
+            <w:pPr>
+              <w:bidi/>
+              <w:spacing w:after="0" w:line="280"/>
+              <w:jc w:val="right"/>
+            </w:pPr>
+            <w:r>
+              <w:rPr>
+                <w:rFonts w:ascii="Arial" w:cs="Arial" w:eastAsia="Arial" w:hAnsi="Arial"/>
+                <w:b/>
+                <w:bCs/>
+                <w:color w:val="2563EB"/>
+                <w:sz w:val="19"/>
+                <w:szCs w:val="19"/>
+                <w:rtl/>
+              </w:rPr>
+              <w:t xml:space="preserve">11</w:t>
+            </w:r>
+          </w:p>
+        </w:tc>
+        <w:tc>
+          <w:tcPr>
+            <w:tcW w:type="dxa" w:w="1500"/>
+            <w:shd w:fill="F1F5F9" w:color="auto" w:val="clear"/>
+            <w:tcMar>
+              <w:top w:type="dxa" w:w="90"/>
+              <w:left w:type="dxa" w:w="110"/>
+              <w:bottom w:type="dxa" w:w="90"/>
+              <w:right w:type="dxa" w:w="110"/>
+            </w:tcMar>
+          </w:tcPr>
+          <w:p>
+            <w:pPr>
+              <w:bidi/>
+              <w:spacing w:after="0" w:line="280"/>
+              <w:jc w:val="right"/>
+            </w:pPr>
+            <w:r>
+              <w:rPr>
+                <w:rFonts w:ascii="Arial" w:cs="Arial" w:eastAsia="Arial" w:hAnsi="Arial"/>
+                <w:b w:val="false"/>
+                <w:bCs w:val="false"/>
+                <w:color w:val="1E293B"/>
+                <w:sz w:val="19"/>
+                <w:szCs w:val="19"/>
+                <w:rtl/>
+              </w:rPr>
+              <w:t xml:space="preserve">10 سبتمبر 2026</w:t>
+            </w:r>
+          </w:p>
+        </w:tc>
+        <w:tc>
+          <w:tcPr>
+            <w:tcW w:type="dxa" w:w="3600"/>
+            <w:shd w:fill="F1F5F9" w:color="auto" w:val="clear"/>
+            <w:tcMar>
+              <w:top w:type="dxa" w:w="90"/>
+              <w:left w:type="dxa" w:w="110"/>
+              <w:bottom w:type="dxa" w:w="90"/>
+              <w:right w:type="dxa" w:w="110"/>
+            </w:tcMar>
+          </w:tcPr>
+          <w:p>
+            <w:pPr>
+              <w:bidi/>
+              <w:spacing w:after="0" w:line="280"/>
+              <w:jc w:val="right"/>
+            </w:pPr>
+            <w:r>
+              <w:rPr>
+                <w:rFonts w:ascii="Arial" w:cs="Arial" w:eastAsia="Arial" w:hAnsi="Arial"/>
+                <w:b w:val="false"/>
+                <w:bCs w:val="false"/>
+                <w:color w:val="1E293B"/>
+                <w:sz w:val="19"/>
+                <w:szCs w:val="19"/>
+                <w:rtl/>
+              </w:rPr>
+              <w:t xml:space="preserve">رقم جوال اختياري في الملف الشخصي</w:t>
+            </w:r>
+          </w:p>
+        </w:tc>
+        <w:tc>
+          <w:tcPr>
+            <w:tcW w:type="dxa" w:w="1500"/>
+            <w:shd w:fill="F1F5F9" w:color="auto" w:val="clear"/>
+            <w:tcMar>
+              <w:top w:type="dxa" w:w="90"/>
+              <w:left w:type="dxa" w:w="110"/>
+              <w:bottom w:type="dxa" w:w="90"/>
+              <w:right w:type="dxa" w:w="110"/>
+            </w:tcMar>
+          </w:tcPr>
+          <w:p>
+            <w:pPr>
+              <w:bidi/>
+              <w:spacing w:after="0" w:line="280"/>
+              <w:jc w:val="right"/>
+            </w:pPr>
+            <w:r>
+              <w:rPr>
+                <w:rFonts w:ascii="Arial" w:cs="Arial" w:eastAsia="Arial" w:hAnsi="Arial"/>
+                <w:b w:val="false"/>
+                <w:bCs w:val="false"/>
+                <w:color w:val="1E293B"/>
+                <w:sz w:val="19"/>
+                <w:szCs w:val="19"/>
+                <w:rtl/>
+              </w:rPr>
+              <w:t xml:space="preserve">الإعدادات ← الملف الشخصي</w:t>
+            </w:r>
+          </w:p>
+        </w:tc>
+        <w:tc>
+          <w:tcPr>
+            <w:tcW w:type="dxa" w:w="1800"/>
+            <w:shd w:fill="ECFDF5" w:color="auto" w:val="clear"/>
+            <w:tcMar>
+              <w:top w:type="dxa" w:w="90"/>
+              <w:left w:type="dxa" w:w="110"/>
+              <w:bottom w:type="dxa" w:w="90"/>
+              <w:right w:type="dxa" w:w="110"/>
+            </w:tcMar>
+          </w:tcPr>
+          <w:p>
+            <w:pPr>
+              <w:bidi/>
+              <w:spacing w:after="0" w:line="280"/>
+              <w:jc w:val="right"/>
+            </w:pPr>
+            <w:r>
+              <w:rPr>
+                <w:rFonts w:ascii="Arial" w:cs="Arial" w:eastAsia="Arial" w:hAnsi="Arial"/>
+                <w:b/>
+                <w:bCs/>
+                <w:color w:val="15803D"/>
+                <w:sz w:val="19"/>
+                <w:szCs w:val="19"/>
+                <w:rtl/>
+              </w:rPr>
+              <w:t xml:space="preserve">منشور على الإنتاج</w:t>
+            </w:r>
+          </w:p>
+        </w:tc>
+      </w:tr>
+      <w:tr>
+        <w:tc>
+          <w:tcPr>
+            <w:tcW w:type="dxa" w:w="600"/>
+            <w:tcMar>
+              <w:top w:type="dxa" w:w="90"/>
+              <w:left w:type="dxa" w:w="110"/>
+              <w:bottom w:type="dxa" w:w="90"/>
+              <w:right w:type="dxa" w:w="110"/>
+            </w:tcMar>
+          </w:tcPr>
+          <w:p>
+            <w:pPr>
+              <w:bidi/>
+              <w:spacing w:after="0" w:line="280"/>
+              <w:jc w:val="right"/>
+            </w:pPr>
+            <w:r>
+              <w:rPr>
+                <w:rFonts w:ascii="Arial" w:cs="Arial" w:eastAsia="Arial" w:hAnsi="Arial"/>
+                <w:b/>
+                <w:bCs/>
+                <w:color w:val="2563EB"/>
+                <w:sz w:val="19"/>
+                <w:szCs w:val="19"/>
+                <w:rtl/>
+              </w:rPr>
               <w:t xml:space="preserve">10</w:t>
             </w:r>
           </w:p>
@@ -2244,7 +2554,7 @@
                 <w:szCs w:val="20"/>
                 <w:rtl/>
               </w:rPr>
-              <w:t xml:space="preserve">البناء المنشور على الإنتاج: a332b5cf-22f8-4cfb-afc1-07f093a9065f</w:t>
+              <w:t xml:space="preserve">البناء المنشور على الإنتاج: 793b4e4b-cec1-4d11-a65a-4e6408df5fe5</w:t>
             </w:r>
           </w:p>
           <w:p>
@@ -2329,7 +2639,7 @@
           <w:szCs w:val="24"/>
           <w:rtl/>
         </w:rPr>
-        <w:t xml:space="preserve">تعديل رقم 10 — شاشة التحقق بخطوتين في تسجيل الدخول</w:t>
+        <w:t xml:space="preserve">تعديل رقم 12 — رمز QR حقيقي قابل للمسح في إعداد المصادقة الثنائية</w:t>
       </w:r>
     </w:p>
     <w:p>
@@ -2606,7 +2916,7 @@
                 <w:szCs w:val="19"/>
                 <w:rtl/>
               </w:rPr>
-              <w:t xml:space="preserve">تسجيل الدخول</w:t>
+              <w:t xml:space="preserve">الإعدادات ← الأمان</w:t>
             </w:r>
           </w:p>
         </w:tc>
@@ -2636,7 +2946,7 @@
                 <w:szCs w:val="19"/>
                 <w:rtl/>
               </w:rPr>
-              <w:t xml:space="preserve">/login</w:t>
+              <w:t xml:space="preserve">/settings</w:t>
             </w:r>
           </w:p>
         </w:tc>
@@ -2666,7 +2976,7 @@
                 <w:szCs w:val="19"/>
                 <w:rtl/>
               </w:rPr>
-              <w:t xml:space="preserve">src/utils/twoFactor.ts · src/components/auth/TwoFactorChallenge.tsx · src/store/useAuthStore.ts · src/pages/Login.tsx</w:t>
+              <w:t xml:space="preserve">src/components/ui/QrCode.tsx · src/pages/Settings.tsx · src/utils/twoFactor.ts</w:t>
             </w:r>
           </w:p>
         </w:tc>
@@ -2696,7 +3006,7 @@
                 <w:szCs w:val="19"/>
                 <w:rtl/>
               </w:rPr>
-              <w:t xml:space="preserve">743042c</w:t>
+              <w:t xml:space="preserve">e5a121d</w:t>
             </w:r>
           </w:p>
         </w:tc>
@@ -2757,7 +3067,7 @@
           <w:szCs w:val="21"/>
           <w:rtl/>
         </w:rPr>
-        <w:t xml:space="preserve">⚠️ هيكل واجهة لا أمان: التحقق يجري في المتصفح والمفتاح السري داخل حزمة الجافاسكربت، فيمكن تجاوزه. الغرض تجهيز الواجهة والعقد لحين وجود باكيند، وهذا مكتوب صراحةً في رأس ملف twoFactor.ts.</w:t>
+        <w:t xml:space="preserve">كان المعروض رسمة SVG مربّعات مرصوفة يدوياً تشبه رمز QR ولا تحمل أي بيانات، فلا يقرأها أي تطبيق مصادقة. الطريقة الوحيدة للربط كانت نسخ المفتاح يدوياً.</w:t>
       </w:r>
     </w:p>
     <w:p>
@@ -2779,7 +3089,7 @@
           <w:szCs w:val="21"/>
           <w:rtl/>
         </w:rPr>
-        <w:t xml:space="preserve">كان الدخول يوثّق فوراً بعد كلمة المرور. صار مرحلتين: كلمة المرور تنتج حالة معلّقة في الذاكرة فقط، ولا يُكتب شيء في التخزين حتى يمرّ العامل الثاني — فإغلاق التبويب في منتصف العملية لا يترك جلسة مفتوحة.</w:t>
+        <w:t xml:space="preserve">صار الرمز يُولَّد فعلياً من رابط otpauth:// بمكتبة qrcode.</w:t>
       </w:r>
     </w:p>
     <w:p>
@@ -2801,7 +3111,7 @@
           <w:szCs w:val="21"/>
           <w:rtl/>
         </w:rPr>
-        <w:t xml:space="preserve">شاشة التحقق تظهر داخل مسار الدخول نفسه لا على عنوان مستقل، لأن عنواناً مستقلاً يفتحه أي شخص دون المرور بالمرحلة الأولى.</w:t>
+        <w:t xml:space="preserve">تحقّقت منه بالتصوير والفكّ لا بالنظر: صوّرت العنصر المرسوم على الشاشة وفككته بقارئ QR، فرجع الرابط المتوقّع — في الوضع الفاتح والداكن.</w:t>
       </w:r>
     </w:p>
     <w:p>
@@ -2823,7 +3133,7 @@
           <w:szCs w:val="21"/>
           <w:rtl/>
         </w:rPr>
-        <w:t xml:space="preserve">نُفِّذت خوارزمية TOTP (المعيار RFC 6238) بـ Web Crypto، فأكواد Google Authenticator الحقيقية تُقبل فعلاً. تحقّقت من التنفيذ بمتجهات الاختبار الخمسة الواردة في المعيار نفسه وكلها طابقت.</w:t>
+        <w:t xml:space="preserve">ثُبّت الرمز أبيض على أسود بصرف النظر عن الثيم. لو ورث currentColor لانقلبت ألوانه في الوضع الداكن وتعذّر مسحه.</w:t>
       </w:r>
     </w:p>
     <w:p>
@@ -2845,7 +3155,7 @@
           <w:szCs w:val="21"/>
           <w:rtl/>
         </w:rPr>
-        <w:t xml:space="preserve">نافذة تسامح خطوة واحدة قبل وبعد لاستيعاب فروق ساعة الجهاز.</w:t>
+        <w:t xml:space="preserve">أُضيفت algorithm وdigits وperiod صراحةً إلى الرابط. Google Authenticator يفترض SHA1/6/30، أما Authy و1Password فلا، وافتراض مختلف يولّد رموزاً يرفضها التحقق عندنا.</w:t>
       </w:r>
     </w:p>
     <w:p>
@@ -2867,7 +3177,7 @@
           <w:szCs w:val="21"/>
           <w:rtl/>
         </w:rPr>
-        <w:t xml:space="preserve">ستة مربعات بانتقال تلقائي بين الخانات ودعم اللصق وإرسال تلقائي عند اكتمال الرمز.</w:t>
+        <w:t xml:space="preserve">عدد الخانات صار ثابتاً واحداً يقرأه المولّد والرابط معاً، فلا ينفصلان.</w:t>
       </w:r>
     </w:p>
     <w:p>
@@ -2889,7 +3199,7 @@
           <w:szCs w:val="21"/>
           <w:rtl/>
         </w:rPr>
-        <w:t xml:space="preserve">لا يوجد زر «إعادة إرسال» — التطبيق يولّد الرمز على الجهاز ولا شيء يُرسَل. وُضع مكانه عدّاد يبيّن الثواني المتبقية قبل تغيّر الرمز، فلا ينتظر الموظف رسالة لن تصل.</w:t>
+        <w:t xml:space="preserve">المكتبة تُحمَّل بـ dynamic import عند فتح النافذة فقط، فحزمة الإعدادات بقيت ~50KB بدل 74KB.</w:t>
       </w:r>
     </w:p>
     <w:p>
@@ -2911,161 +3221,7 @@
           <w:szCs w:val="21"/>
           <w:rtl/>
         </w:rPr>
-        <w:t xml:space="preserve">مسار الرموز الاحتياطية داخل الشاشة نفسها، لأن فاقد هاتفه بلا رمز احتياطي يُقفل خارج حسابه نهائياً.</w:t>
-      </w:r>
-    </w:p>
-    <w:p>
-      <w:pPr>
-        <w:pStyle w:val="ListParagraph"/>
-        <w:numPr>
-          <w:ilvl w:val="0"/>
-          <w:numId w:val="2"/>
-        </w:numPr>
-        <w:bidi/>
-        <w:spacing w:after="70" w:line="290"/>
-        <w:jc w:val="right"/>
-      </w:pPr>
-      <w:r>
-        <w:rPr>
-          <w:rFonts w:ascii="Arial" w:cs="Arial" w:eastAsia="Arial" w:hAnsi="Arial"/>
-          <w:color w:val="1E293B"/>
-          <w:sz w:val="21"/>
-          <w:szCs w:val="21"/>
-          <w:rtl/>
-        </w:rPr>
-        <w:t xml:space="preserve">رسالة الخطأ واحدة للرمز الخاطئ وللمنتهي عمداً، حتى لا تُعطي المهاجم معلومة يفرّق بها.</w:t>
-      </w:r>
-    </w:p>
-    <w:p>
-      <w:pPr>
-        <w:pStyle w:val="ListParagraph"/>
-        <w:numPr>
-          <w:ilvl w:val="0"/>
-          <w:numId w:val="2"/>
-        </w:numPr>
-        <w:bidi/>
-        <w:spacing w:after="70" w:line="290"/>
-        <w:jc w:val="right"/>
-      </w:pPr>
-      <w:r>
-        <w:rPr>
-          <w:rFonts w:ascii="Arial" w:cs="Arial" w:eastAsia="Arial" w:hAnsi="Arial"/>
-          <w:color w:val="1E293B"/>
-          <w:sz w:val="21"/>
-          <w:szCs w:val="21"/>
-          <w:rtl/>
-        </w:rPr>
-        <w:t xml:space="preserve">حدّ خمس محاولات ثم قفل خمس دقائق — وهذا في الواجهة للتوثيق فقط، ومكانه الصحيح الخادم.</w:t>
-      </w:r>
-    </w:p>
-    <w:p>
-      <w:pPr>
-        <w:pStyle w:val="ListParagraph"/>
-        <w:numPr>
-          <w:ilvl w:val="0"/>
-          <w:numId w:val="2"/>
-        </w:numPr>
-        <w:bidi/>
-        <w:spacing w:after="70" w:line="290"/>
-        <w:jc w:val="right"/>
-      </w:pPr>
-      <w:r>
-        <w:rPr>
-          <w:rFonts w:ascii="Arial" w:cs="Arial" w:eastAsia="Arial" w:hAnsi="Arial"/>
-          <w:color w:val="1E293B"/>
-          <w:sz w:val="21"/>
-          <w:szCs w:val="21"/>
-          <w:rtl/>
-        </w:rPr>
-        <w:t xml:space="preserve">شاشة الإعداد في الإعدادات كانت تقبل أي ستة أرقام وتفعّل 2FA بناءً عليها. صارت تتحقق فعلياً، لأن التفعيل بعد مسح خاطئ للرمز يقفل صاحب الحساب خارج حسابه.</w:t>
-      </w:r>
-    </w:p>
-    <w:p>
-      <w:pPr>
-        <w:pStyle w:val="ListParagraph"/>
-        <w:numPr>
-          <w:ilvl w:val="0"/>
-          <w:numId w:val="2"/>
-        </w:numPr>
-        <w:bidi/>
-        <w:spacing w:after="70" w:line="290"/>
-        <w:jc w:val="right"/>
-      </w:pPr>
-      <w:r>
-        <w:rPr>
-          <w:rFonts w:ascii="Arial" w:cs="Arial" w:eastAsia="Arial" w:hAnsi="Arial"/>
-          <w:color w:val="1E293B"/>
-          <w:sz w:val="21"/>
-          <w:szCs w:val="21"/>
-          <w:rtl/>
-        </w:rPr>
-        <w:t xml:space="preserve">وُحّد المفتاح والرموز الاحتياطية بين شاشة الإعداد وشاشة الدخول في ملف واحد، فما يعرضه الـQR هو ما يُتحقّق منه.</w:t>
-      </w:r>
-    </w:p>
-    <w:p>
-      <w:pPr>
-        <w:pStyle w:val="ListParagraph"/>
-        <w:numPr>
-          <w:ilvl w:val="0"/>
-          <w:numId w:val="2"/>
-        </w:numPr>
-        <w:bidi/>
-        <w:spacing w:after="70" w:line="290"/>
-        <w:jc w:val="right"/>
-      </w:pPr>
-      <w:r>
-        <w:rPr>
-          <w:rFonts w:ascii="Arial" w:cs="Arial" w:eastAsia="Arial" w:hAnsi="Arial"/>
-          <w:color w:val="1E293B"/>
-          <w:sz w:val="21"/>
-          <w:szCs w:val="21"/>
-          <w:rtl/>
-        </w:rPr>
-        <w:t xml:space="preserve">حُذف الحقل المكرّر AppSettings.twoFactorEnabled — كان يُكتب عند التهيئة ولا يُقرأ في أي مكان، بينما الحقل الحيّ هو security.twoFactor. وجود علمين لنفس المعنى كان سيُظهر الميزة مفعّلة في شاشة ومطفأة في أخرى.</w:t>
-      </w:r>
-    </w:p>
-    <w:p>
-      <w:pPr>
-        <w:pStyle w:val="ListParagraph"/>
-        <w:numPr>
-          <w:ilvl w:val="0"/>
-          <w:numId w:val="2"/>
-        </w:numPr>
-        <w:bidi/>
-        <w:spacing w:after="70" w:line="290"/>
-        <w:jc w:val="right"/>
-      </w:pPr>
-      <w:r>
-        <w:rPr>
-          <w:rFonts w:ascii="Arial" w:cs="Arial" w:eastAsia="Arial" w:hAnsi="Arial"/>
-          <w:color w:val="1E293B"/>
-          <w:sz w:val="21"/>
-          <w:szCs w:val="21"/>
-          <w:rtl/>
-        </w:rPr>
-        <w:t xml:space="preserve">أخطأتُ في شرط الإرسال التلقائي: كتبت فحصاً يتضمّن includes('') وهو دائماً صحيح في جافاسكربت، فلم يكن الإرسال التلقائي يعمل إطلاقاً. كشفه اختبار المتصفح وأُصلح.</w:t>
-      </w:r>
-    </w:p>
-    <w:p>
-      <w:pPr>
-        <w:pStyle w:val="ListParagraph"/>
-        <w:numPr>
-          <w:ilvl w:val="0"/>
-          <w:numId w:val="2"/>
-        </w:numPr>
-        <w:bidi/>
-        <w:spacing w:after="70" w:line="290"/>
-        <w:jc w:val="right"/>
-      </w:pPr>
-      <w:r>
-        <w:rPr>
-          <w:rFonts w:ascii="Arial" w:cs="Arial" w:eastAsia="Arial" w:hAnsi="Arial"/>
-          <w:color w:val="1E293B"/>
-          <w:sz w:val="21"/>
-          <w:szCs w:val="21"/>
-          <w:rtl/>
-        </w:rPr>
-        <w:t xml:space="preserve">اختُبر التدفّق كاملاً في المتصفح: الدخول المباشر عند تعطيل 2FA، ظهور الشاشة عند تفعيلها، خلوّ التخزين قبل التحقق، رفض الرمز الخاطئ، قبول رمز TOTP صحيح، وقبول رمز احتياطي.</w:t>
+        <w:t xml:space="preserve">يبقى المفتاح واحداً لكل الحسابات (ثابت في الكود)، فالربط يثبت صحّة الآلية لا أكثر — التوليد لكل مستخدم مكانه الخادم.</w:t>
       </w:r>
     </w:p>
     <w:p>
@@ -3090,7 +3246,7 @@
           <w:szCs w:val="24"/>
           <w:rtl/>
         </w:rPr>
-        <w:t xml:space="preserve">تعديل رقم 9 — رقم هاتف اختياري عند دعوة الموظف</w:t>
+        <w:t xml:space="preserve">تعديل رقم 11 — رقم جوال اختياري في الملف الشخصي</w:t>
       </w:r>
     </w:p>
     <w:p>
@@ -3367,7 +3523,7 @@
                 <w:szCs w:val="19"/>
                 <w:rtl/>
               </w:rPr>
-              <w:t xml:space="preserve">فريق العمل</w:t>
+              <w:t xml:space="preserve">الإعدادات ← الملف الشخصي</w:t>
             </w:r>
           </w:p>
         </w:tc>
@@ -3397,7 +3553,7 @@
                 <w:szCs w:val="19"/>
                 <w:rtl/>
               </w:rPr>
-              <w:t xml:space="preserve">/team</w:t>
+              <w:t xml:space="preserve">/settings</w:t>
             </w:r>
           </w:p>
         </w:tc>
@@ -3427,7 +3583,7 @@
                 <w:szCs w:val="19"/>
                 <w:rtl/>
               </w:rPr>
-              <w:t xml:space="preserve">src/pages/Team.tsx · src/types/index.ts · src/store/useDataStore.ts</w:t>
+              <w:t xml:space="preserve">src/pages/Settings.tsx · src/store/useAuthStore.ts</w:t>
             </w:r>
           </w:p>
         </w:tc>
@@ -3457,7 +3613,7 @@
                 <w:szCs w:val="19"/>
                 <w:rtl/>
               </w:rPr>
-              <w:t xml:space="preserve">a4d8398</w:t>
+              <w:t xml:space="preserve">27dc01f</w:t>
             </w:r>
           </w:p>
         </w:tc>
@@ -3518,7 +3674,7 @@
           <w:szCs w:val="21"/>
           <w:rtl/>
         </w:rPr>
-        <w:t xml:space="preserve">أُضيف حقل رقم الهاتف إلى نموذج دعوة الموظف وتعديله — لم يكن موجوداً من قبل أصلاً.</w:t>
+        <w:t xml:space="preserve">كان الملف الشخصي يجمع اسم العرض والبريد فقط، فلا سبيل للوصول لصاحب الحساب خارج صندوق الوارد.</w:t>
       </w:r>
     </w:p>
     <w:p>
@@ -3540,7 +3696,7 @@
           <w:szCs w:val="21"/>
           <w:rtl/>
         </w:rPr>
-        <w:t xml:space="preserve">الحقل اختياري: يحمل وسم «(اختياري)» بنفس أسلوب حقل الأقسام، وبلا النجمة الحمراء التي تعلّم الاسم والبريد والدور. إرسال الدعوة بدونه يمرّ دون اعتراض.</w:t>
+        <w:t xml:space="preserve">استُخدم مكوّن PhoneField نفسه المستعمل في جهات الاتصال ودعوة الموظفين، فجاء معه منتقي الدولة ورمز الاتصال بدل حقل نصّي حرّ.</w:t>
       </w:r>
     </w:p>
     <w:p>
@@ -3562,7 +3718,7 @@
           <w:szCs w:val="21"/>
           <w:rtl/>
         </w:rPr>
-        <w:t xml:space="preserve">استُخدم مكوّن PhoneField نفسه المستعمل في جهات الاتصال والتسجيل، فيأتي معه منتقي الدولة ورمز الاتصال بدل حقل نصّي حرّ.</w:t>
+        <w:t xml:space="preserve">الحقل اختياري ويحمل وسم «(اختياري)» بنفس أسلوب باقي الحقول غير الإلزامية.</w:t>
       </w:r>
     </w:p>
     <w:p>
@@ -3584,7 +3740,7 @@
           <w:szCs w:val="21"/>
           <w:rtl/>
         </w:rPr>
-        <w:t xml:space="preserve">الرقم لا يُخزَّن إلا إذا كُتب فعلاً، حتى لا يبقى رمز دولة معلّقاً بلا رقم في بيانات موظف تركه فارغاً.</w:t>
+        <w:t xml:space="preserve">الرقم لا يُخزَّن إلا إذا كُتب فعلاً، حتى لا يبقى رمز دولة وحده متظاهراً بأنه رقم بعد تفريغ الحقل.</w:t>
       </w:r>
     </w:p>
     <w:p>
@@ -3606,7 +3762,7 @@
           <w:szCs w:val="21"/>
           <w:rtl/>
         </w:rPr>
-        <w:t xml:space="preserve">عند فتح موظف للتعديل يُفصل الرقم المحفوظ إلى رمز دولة ورقم محلي بمطابقة أطول رمز مطابق من قائمة الدول — لا بتعبير نمطي جشع، لأن ذلك كان سيقرأ ‎+96891234567 على أنه ‎+9689 ثم يشوّه الرقم.</w:t>
+        <w:t xml:space="preserve">عند التحميل يُفصل الرقم المحفوظ إلى رمز دولة ورقم محلي بمطابقة أطول رمز — لا بتعبير نمطي جشع، لأن ذلك كان سيقرأ ‎+96891234567 على أنه ‎+9689 ويشوّه الباقي.</w:t>
       </w:r>
     </w:p>
     <w:p>
@@ -3628,51 +3784,7 @@
           <w:szCs w:val="21"/>
           <w:rtl/>
         </w:rPr>
-        <w:t xml:space="preserve">الرقم يظهر في لوحة تفاصيل الموظف حين يكون موجوداً، فلا تُجمع بيانات لا تُعرض في أي مكان.</w:t>
-      </w:r>
-    </w:p>
-    <w:p>
-      <w:pPr>
-        <w:pStyle w:val="ListParagraph"/>
-        <w:numPr>
-          <w:ilvl w:val="0"/>
-          <w:numId w:val="2"/>
-        </w:numPr>
-        <w:bidi/>
-        <w:spacing w:after="70" w:line="290"/>
-        <w:jc w:val="right"/>
-      </w:pPr>
-      <w:r>
-        <w:rPr>
-          <w:rFonts w:ascii="Arial" w:cs="Arial" w:eastAsia="Arial" w:hAnsi="Arial"/>
-          <w:color w:val="1E293B"/>
-          <w:sz w:val="21"/>
-          <w:szCs w:val="21"/>
-          <w:rtl/>
-        </w:rPr>
-        <w:t xml:space="preserve">وُسّع توقيع inviteAgent ليقبل الحقل الجديد.</w:t>
-      </w:r>
-    </w:p>
-    <w:p>
-      <w:pPr>
-        <w:pStyle w:val="ListParagraph"/>
-        <w:numPr>
-          <w:ilvl w:val="0"/>
-          <w:numId w:val="2"/>
-        </w:numPr>
-        <w:bidi/>
-        <w:spacing w:after="70" w:line="290"/>
-        <w:jc w:val="right"/>
-      </w:pPr>
-      <w:r>
-        <w:rPr>
-          <w:rFonts w:ascii="Arial" w:cs="Arial" w:eastAsia="Arial" w:hAnsi="Arial"/>
-          <w:color w:val="1E293B"/>
-          <w:sz w:val="21"/>
-          <w:szCs w:val="21"/>
-          <w:rtl/>
-        </w:rPr>
-        <w:t xml:space="preserve">عوينت النتيجة في المتصفح: الحقل ووسم الاختياري ظاهران، ودعوة موظف بلا رقم هاتف نجحت.</w:t>
+        <w:t xml:space="preserve">عوينت النتيجة في المتصفح: حفظ 91234567 مع ‎+968 خزّنه ‎+96891234567، وبعد إعادة التحميل رجع مقسوماً صحيحاً.</w:t>
       </w:r>
     </w:p>
     <w:p>
@@ -3697,7 +3809,7 @@
           <w:szCs w:val="24"/>
           <w:rtl/>
         </w:rPr>
-        <w:t xml:space="preserve">تعديل رقم 8 — فاصل مرقّم بين دورات المحادثة داخل الثريد</w:t>
+        <w:t xml:space="preserve">تعديل رقم 10 — شاشة التحقق بخطوتين في تسجيل الدخول</w:t>
       </w:r>
     </w:p>
     <w:p>
@@ -3974,7 +4086,7 @@
                 <w:szCs w:val="19"/>
                 <w:rtl/>
               </w:rPr>
-              <w:t xml:space="preserve">صندوق الوارد</w:t>
+              <w:t xml:space="preserve">تسجيل الدخول</w:t>
             </w:r>
           </w:p>
         </w:tc>
@@ -4004,7 +4116,7 @@
                 <w:szCs w:val="19"/>
                 <w:rtl/>
               </w:rPr>
-              <w:t xml:space="preserve">/inbox</w:t>
+              <w:t xml:space="preserve">/login</w:t>
             </w:r>
           </w:p>
         </w:tc>
@@ -4034,7 +4146,7 @@
                 <w:szCs w:val="19"/>
                 <w:rtl/>
               </w:rPr>
-              <w:t xml:space="preserve">src/pages/Inbox.tsx</w:t>
+              <w:t xml:space="preserve">src/utils/twoFactor.ts · src/components/auth/TwoFactorChallenge.tsx · src/store/useAuthStore.ts · src/pages/Login.tsx</w:t>
             </w:r>
           </w:p>
         </w:tc>
@@ -4064,7 +4176,7 @@
                 <w:szCs w:val="19"/>
                 <w:rtl/>
               </w:rPr>
-              <w:t xml:space="preserve">f9b43fd</w:t>
+              <w:t xml:space="preserve">743042c</w:t>
             </w:r>
           </w:p>
         </w:tc>
@@ -4125,7 +4237,7 @@
           <w:szCs w:val="21"/>
           <w:rtl/>
         </w:rPr>
-        <w:t xml:space="preserve">كل دورة جديدة صار يسبقها فاصل أفقي ظاهر داخل الثريد، فيُعرف أين انتهت دورة وبدأت التي تليها من غير رجوع إلى شريط الفهرسة.</w:t>
+        <w:t xml:space="preserve">⚠️ هيكل واجهة لا أمان: التحقق يجري في المتصفح والمفتاح السري داخل حزمة الجافاسكربت، فيمكن تجاوزه. الغرض تجهيز الواجهة والعقد لحين وجود باكيند، وهذا مكتوب صراحةً في رأس ملف twoFactor.ts.</w:t>
       </w:r>
     </w:p>
     <w:p>
@@ -4147,7 +4259,7 @@
           <w:szCs w:val="21"/>
           <w:rtl/>
         </w:rPr>
-        <w:t xml:space="preserve">الفاصل يحمل رقم الدورة وكلمة «إعادة فتح» والتاريخ، فيجيب عن ثلاثة أسئلة في سطر: أي دورة، وماذا جرى، ومتى.</w:t>
+        <w:t xml:space="preserve">كان الدخول يوثّق فوراً بعد كلمة المرور. صار مرحلتين: كلمة المرور تنتج حالة معلّقة في الذاكرة فقط، ولا يُكتب شيء في التخزين حتى يمرّ العامل الثاني — فإغلاق التبويب في منتصف العملية لا يترك جلسة مفتوحة.</w:t>
       </w:r>
     </w:p>
     <w:p>
@@ -4169,7 +4281,7 @@
           <w:szCs w:val="21"/>
           <w:rtl/>
         </w:rPr>
-        <w:t xml:space="preserve">صيغته بلون العلامة التجارية بخطّين وشارة بارزة، لأن المطلوب أن يُلاحَظ لا أن يمرّ مرور الكرام.</w:t>
+        <w:t xml:space="preserve">شاشة التحقق تظهر داخل مسار الدخول نفسه لا على عنوان مستقل، لأن عنواناً مستقلاً يفتحه أي شخص دون المرور بالمرحلة الأولى.</w:t>
       </w:r>
     </w:p>
     <w:p>
@@ -4191,7 +4303,7 @@
           <w:szCs w:val="21"/>
           <w:rtl/>
         </w:rPr>
-        <w:t xml:space="preserve">الفاصل يحلّ محلّ شريحة التاريخ العادية في ذلك الموضع لأنه يحمل التاريخ أصلاً، فلا يجتمع فاصلان متتاليان.</w:t>
+        <w:t xml:space="preserve">نُفِّذت خوارزمية TOTP (المعيار RFC 6238) بـ Web Crypto، فأكواد Google Authenticator الحقيقية تُقبل فعلاً. تحقّقت من التنفيذ بمتجهات الاختبار الخمسة الواردة في المعيار نفسه وكلها طابقت.</w:t>
       </w:r>
     </w:p>
     <w:p>
@@ -4213,7 +4325,7 @@
           <w:szCs w:val="21"/>
           <w:rtl/>
         </w:rPr>
-        <w:t xml:space="preserve">لا يظهر قبل الدورة الأولى لأنها بداية المحادثة لا إعادة فتح لها.</w:t>
+        <w:t xml:space="preserve">نافذة تسامح خطوة واحدة قبل وبعد لاستيعاب فروق ساعة الجهاز.</w:t>
       </w:r>
     </w:p>
     <w:p>
@@ -4235,7 +4347,7 @@
           <w:szCs w:val="21"/>
           <w:rtl/>
         </w:rPr>
-        <w:t xml:space="preserve">الدورة ذات البداية المستنتجة تُوسم «(تقديري)» في الفاصل نفسه، اتساقاً مع العلامة المتقطّعة في شريط الفهرسة.</w:t>
+        <w:t xml:space="preserve">ستة مربعات بانتقال تلقائي بين الخانات ودعم اللصق وإرسال تلقائي عند اكتمال الرمز.</w:t>
       </w:r>
     </w:p>
     <w:p>
@@ -4257,7 +4369,7 @@
           <w:szCs w:val="21"/>
           <w:rtl/>
         </w:rPr>
-        <w:t xml:space="preserve">الترقيم يتبع رقم الدورة (الدورة 2، الدورة 3) لا رقم إعادة الفتح، ليطابق ما يعرضه شريط الفهرسة وحقل sessionCount ولا يتضارب معهما.</w:t>
+        <w:t xml:space="preserve">لا يوجد زر «إعادة إرسال» — التطبيق يولّد الرمز على الجهاز ولا شيء يُرسَل. وُضع مكانه عدّاد يبيّن الثواني المتبقية قبل تغيّر الرمز، فلا ينتظر الموظف رسالة لن تصل.</w:t>
       </w:r>
     </w:p>
     <w:p>
@@ -4279,7 +4391,161 @@
           <w:szCs w:val="21"/>
           <w:rtl/>
         </w:rPr>
-        <w:t xml:space="preserve">عوينت النتيجة في المتصفح: فاصلان بالرقمين الصحيحين، وشريحة التاريخ المكرّرة اختفت من موضعيهما.</w:t>
+        <w:t xml:space="preserve">مسار الرموز الاحتياطية داخل الشاشة نفسها، لأن فاقد هاتفه بلا رمز احتياطي يُقفل خارج حسابه نهائياً.</w:t>
+      </w:r>
+    </w:p>
+    <w:p>
+      <w:pPr>
+        <w:pStyle w:val="ListParagraph"/>
+        <w:numPr>
+          <w:ilvl w:val="0"/>
+          <w:numId w:val="2"/>
+        </w:numPr>
+        <w:bidi/>
+        <w:spacing w:after="70" w:line="290"/>
+        <w:jc w:val="right"/>
+      </w:pPr>
+      <w:r>
+        <w:rPr>
+          <w:rFonts w:ascii="Arial" w:cs="Arial" w:eastAsia="Arial" w:hAnsi="Arial"/>
+          <w:color w:val="1E293B"/>
+          <w:sz w:val="21"/>
+          <w:szCs w:val="21"/>
+          <w:rtl/>
+        </w:rPr>
+        <w:t xml:space="preserve">رسالة الخطأ واحدة للرمز الخاطئ وللمنتهي عمداً، حتى لا تُعطي المهاجم معلومة يفرّق بها.</w:t>
+      </w:r>
+    </w:p>
+    <w:p>
+      <w:pPr>
+        <w:pStyle w:val="ListParagraph"/>
+        <w:numPr>
+          <w:ilvl w:val="0"/>
+          <w:numId w:val="2"/>
+        </w:numPr>
+        <w:bidi/>
+        <w:spacing w:after="70" w:line="290"/>
+        <w:jc w:val="right"/>
+      </w:pPr>
+      <w:r>
+        <w:rPr>
+          <w:rFonts w:ascii="Arial" w:cs="Arial" w:eastAsia="Arial" w:hAnsi="Arial"/>
+          <w:color w:val="1E293B"/>
+          <w:sz w:val="21"/>
+          <w:szCs w:val="21"/>
+          <w:rtl/>
+        </w:rPr>
+        <w:t xml:space="preserve">حدّ خمس محاولات ثم قفل خمس دقائق — وهذا في الواجهة للتوثيق فقط، ومكانه الصحيح الخادم.</w:t>
+      </w:r>
+    </w:p>
+    <w:p>
+      <w:pPr>
+        <w:pStyle w:val="ListParagraph"/>
+        <w:numPr>
+          <w:ilvl w:val="0"/>
+          <w:numId w:val="2"/>
+        </w:numPr>
+        <w:bidi/>
+        <w:spacing w:after="70" w:line="290"/>
+        <w:jc w:val="right"/>
+      </w:pPr>
+      <w:r>
+        <w:rPr>
+          <w:rFonts w:ascii="Arial" w:cs="Arial" w:eastAsia="Arial" w:hAnsi="Arial"/>
+          <w:color w:val="1E293B"/>
+          <w:sz w:val="21"/>
+          <w:szCs w:val="21"/>
+          <w:rtl/>
+        </w:rPr>
+        <w:t xml:space="preserve">شاشة الإعداد في الإعدادات كانت تقبل أي ستة أرقام وتفعّل 2FA بناءً عليها. صارت تتحقق فعلياً، لأن التفعيل بعد مسح خاطئ للرمز يقفل صاحب الحساب خارج حسابه.</w:t>
+      </w:r>
+    </w:p>
+    <w:p>
+      <w:pPr>
+        <w:pStyle w:val="ListParagraph"/>
+        <w:numPr>
+          <w:ilvl w:val="0"/>
+          <w:numId w:val="2"/>
+        </w:numPr>
+        <w:bidi/>
+        <w:spacing w:after="70" w:line="290"/>
+        <w:jc w:val="right"/>
+      </w:pPr>
+      <w:r>
+        <w:rPr>
+          <w:rFonts w:ascii="Arial" w:cs="Arial" w:eastAsia="Arial" w:hAnsi="Arial"/>
+          <w:color w:val="1E293B"/>
+          <w:sz w:val="21"/>
+          <w:szCs w:val="21"/>
+          <w:rtl/>
+        </w:rPr>
+        <w:t xml:space="preserve">وُحّد المفتاح والرموز الاحتياطية بين شاشة الإعداد وشاشة الدخول في ملف واحد، فما يعرضه الـQR هو ما يُتحقّق منه.</w:t>
+      </w:r>
+    </w:p>
+    <w:p>
+      <w:pPr>
+        <w:pStyle w:val="ListParagraph"/>
+        <w:numPr>
+          <w:ilvl w:val="0"/>
+          <w:numId w:val="2"/>
+        </w:numPr>
+        <w:bidi/>
+        <w:spacing w:after="70" w:line="290"/>
+        <w:jc w:val="right"/>
+      </w:pPr>
+      <w:r>
+        <w:rPr>
+          <w:rFonts w:ascii="Arial" w:cs="Arial" w:eastAsia="Arial" w:hAnsi="Arial"/>
+          <w:color w:val="1E293B"/>
+          <w:sz w:val="21"/>
+          <w:szCs w:val="21"/>
+          <w:rtl/>
+        </w:rPr>
+        <w:t xml:space="preserve">حُذف الحقل المكرّر AppSettings.twoFactorEnabled — كان يُكتب عند التهيئة ولا يُقرأ في أي مكان، بينما الحقل الحيّ هو security.twoFactor. وجود علمين لنفس المعنى كان سيُظهر الميزة مفعّلة في شاشة ومطفأة في أخرى.</w:t>
+      </w:r>
+    </w:p>
+    <w:p>
+      <w:pPr>
+        <w:pStyle w:val="ListParagraph"/>
+        <w:numPr>
+          <w:ilvl w:val="0"/>
+          <w:numId w:val="2"/>
+        </w:numPr>
+        <w:bidi/>
+        <w:spacing w:after="70" w:line="290"/>
+        <w:jc w:val="right"/>
+      </w:pPr>
+      <w:r>
+        <w:rPr>
+          <w:rFonts w:ascii="Arial" w:cs="Arial" w:eastAsia="Arial" w:hAnsi="Arial"/>
+          <w:color w:val="1E293B"/>
+          <w:sz w:val="21"/>
+          <w:szCs w:val="21"/>
+          <w:rtl/>
+        </w:rPr>
+        <w:t xml:space="preserve">أخطأتُ في شرط الإرسال التلقائي: كتبت فحصاً يتضمّن includes('') وهو دائماً صحيح في جافاسكربت، فلم يكن الإرسال التلقائي يعمل إطلاقاً. كشفه اختبار المتصفح وأُصلح.</w:t>
+      </w:r>
+    </w:p>
+    <w:p>
+      <w:pPr>
+        <w:pStyle w:val="ListParagraph"/>
+        <w:numPr>
+          <w:ilvl w:val="0"/>
+          <w:numId w:val="2"/>
+        </w:numPr>
+        <w:bidi/>
+        <w:spacing w:after="70" w:line="290"/>
+        <w:jc w:val="right"/>
+      </w:pPr>
+      <w:r>
+        <w:rPr>
+          <w:rFonts w:ascii="Arial" w:cs="Arial" w:eastAsia="Arial" w:hAnsi="Arial"/>
+          <w:color w:val="1E293B"/>
+          <w:sz w:val="21"/>
+          <w:szCs w:val="21"/>
+          <w:rtl/>
+        </w:rPr>
+        <w:t xml:space="preserve">اختُبر التدفّق كاملاً في المتصفح: الدخول المباشر عند تعطيل 2FA، ظهور الشاشة عند تفعيلها، خلوّ التخزين قبل التحقق، رفض الرمز الخاطئ، قبول رمز TOTP صحيح، وقبول رمز احتياطي.</w:t>
       </w:r>
     </w:p>
     <w:p>
@@ -4304,7 +4570,7 @@
           <w:szCs w:val="24"/>
           <w:rtl/>
         </w:rPr>
-        <w:t xml:space="preserve">تعديل رقم 7 — انعكاس حالة «مجدولة» للتخفيض المؤجّل في بورتال العميل</w:t>
+        <w:t xml:space="preserve">تعديل رقم 9 — رقم هاتف اختياري عند دعوة الموظف</w:t>
       </w:r>
     </w:p>
     <w:p>
@@ -4581,7 +4847,7 @@
                 <w:szCs w:val="19"/>
                 <w:rtl/>
               </w:rPr>
-              <w:t xml:space="preserve">الباقات والاشتراك</w:t>
+              <w:t xml:space="preserve">فريق العمل</w:t>
             </w:r>
           </w:p>
         </w:tc>
@@ -4611,7 +4877,7 @@
                 <w:szCs w:val="19"/>
                 <w:rtl/>
               </w:rPr>
-              <w:t xml:space="preserve">/billing</w:t>
+              <w:t xml:space="preserve">/team</w:t>
             </w:r>
           </w:p>
         </w:tc>
@@ -4641,7 +4907,7 @@
                 <w:szCs w:val="19"/>
                 <w:rtl/>
               </w:rPr>
-              <w:t xml:space="preserve">src/types/index.ts · src/pages/Billing.tsx · src/store/adminMockData.ts</w:t>
+              <w:t xml:space="preserve">src/pages/Team.tsx · src/types/index.ts · src/store/useDataStore.ts</w:t>
             </w:r>
           </w:p>
         </w:tc>
@@ -4671,7 +4937,7 @@
                 <w:szCs w:val="19"/>
                 <w:rtl/>
               </w:rPr>
-              <w:t xml:space="preserve">5202dba</w:t>
+              <w:t xml:space="preserve">a4d8398</w:t>
             </w:r>
           </w:p>
         </w:tc>
@@ -4732,7 +4998,7 @@
           <w:szCs w:val="21"/>
           <w:rtl/>
         </w:rPr>
-        <w:t xml:space="preserve">الاشتراك الذي عليه تخفيض مؤجّل إلى تاريخ لاحق صارت حالته «مجدولة» ظاهرة للعميل، لا في بورتال الإدارة وحده.</w:t>
+        <w:t xml:space="preserve">أُضيف حقل رقم الهاتف إلى نموذج دعوة الموظف وتعديله — لم يكن موجوداً من قبل أصلاً.</w:t>
       </w:r>
     </w:p>
     <w:p>
@@ -4754,7 +5020,7 @@
           <w:szCs w:val="21"/>
           <w:rtl/>
         </w:rPr>
-        <w:t xml:space="preserve">أُضيف الحقل scheduledChange إلى الاشتراك ويحمل الباقة المستهدفة ودورة الفوترة وتاريخ السريان، وأُضيفت «مجدولة» إلى حالات الفاتورة.</w:t>
+        <w:t xml:space="preserve">الحقل اختياري: يحمل وسم «(اختياري)» بنفس أسلوب حقل الأقسام، وبلا النجمة الحمراء التي تعلّم الاسم والبريد والدور. إرسال الدعوة بدونه يمرّ دون اعتراض.</w:t>
       </w:r>
     </w:p>
     <w:p>
@@ -4776,7 +5042,7 @@
           <w:szCs w:val="21"/>
           <w:rtl/>
         </w:rPr>
-        <w:t xml:space="preserve">بطاقة الاشتراك تعرض شارة «مجدولة» وجملة صريحة تذكر اسم الباقة المستهدفة وتاريخ التحويل، وتؤكّد أن الباقة الحالية ومزاياها مستمرة حتى ذلك التاريخ — فلا يظن العميل أن باقته انخفضت الآن.</w:t>
+        <w:t xml:space="preserve">استُخدم مكوّن PhoneField نفسه المستعمل في جهات الاتصال والتسجيل، فيأتي معه منتقي الدولة ورمز الاتصال بدل حقل نصّي حرّ.</w:t>
       </w:r>
     </w:p>
     <w:p>
@@ -4798,7 +5064,7 @@
           <w:szCs w:val="21"/>
           <w:rtl/>
         </w:rPr>
-        <w:t xml:space="preserve">جدول الفواتير وفلاترها ونافذة معاينة الفاتورة تعرض الحالة نفسها.</w:t>
+        <w:t xml:space="preserve">الرقم لا يُخزَّن إلا إذا كُتب فعلاً، حتى لا يبقى رمز دولة معلّقاً بلا رقم في بيانات موظف تركه فارغاً.</w:t>
       </w:r>
     </w:p>
     <w:p>
@@ -4820,7 +5086,7 @@
           <w:szCs w:val="21"/>
           <w:rtl/>
         </w:rPr>
-        <w:t xml:space="preserve">الحالة مشتقّة من الاشتراك لا مخزّنة على الفاتورة: إلغاء الجدولة يُزيلها من كل المواضع في آن واحد، بدل أن تبقى فاتورة تحمل حالة قديمة.</w:t>
+        <w:t xml:space="preserve">عند فتح موظف للتعديل يُفصل الرقم المحفوظ إلى رمز دولة ورقم محلي بمطابقة أطول رمز مطابق من قائمة الدول — لا بتعبير نمطي جشع، لأن ذلك كان سيقرأ ‎+96891234567 على أنه ‎+9689 ثم يشوّه الرقم.</w:t>
       </w:r>
     </w:p>
     <w:p>
@@ -4842,7 +5108,7 @@
           <w:szCs w:val="21"/>
           <w:rtl/>
         </w:rPr>
-        <w:t xml:space="preserve">قرار مقصود: الاشتقاق يطال الفواتير غير المسدّدة فقط (معلّقة ومسودة). الفاتورة المدفوعة أو المستردة أو الملغاة أو الفاشلة تحتفظ بحالتها، وكذلك المتأخرة لأن التأخّر مشكلة سداد لا يصح حجبها خلف حالة الجدولة.</w:t>
+        <w:t xml:space="preserve">الرقم يظهر في لوحة تفاصيل الموظف حين يكون موجوداً، فلا تُجمع بيانات لا تُعرض في أي مكان.</w:t>
       </w:r>
     </w:p>
     <w:p>
@@ -4864,7 +5130,7 @@
           <w:szCs w:val="21"/>
           <w:rtl/>
         </w:rPr>
-        <w:t xml:space="preserve">زر «إلغاء الجدولة» إجراء إداري بحسب المواصفة، فبورتال العميل يعرض الحالة دون التحكم فيها.</w:t>
+        <w:t xml:space="preserve">وُسّع توقيع inviteAgent ليقبل الحقل الجديد.</w:t>
       </w:r>
     </w:p>
     <w:p>
@@ -4886,29 +5152,7 @@
           <w:szCs w:val="21"/>
           <w:rtl/>
         </w:rPr>
-        <w:t xml:space="preserve">أُضيفت جدولة تجريبية لعميل العرض (تحويل من الأعمال إلى الاحترافي بعد 15 يوماً) لتصير الحالة قابلة للمعاينة.</w:t>
-      </w:r>
-    </w:p>
-    <w:p>
-      <w:pPr>
-        <w:pStyle w:val="ListParagraph"/>
-        <w:numPr>
-          <w:ilvl w:val="0"/>
-          <w:numId w:val="2"/>
-        </w:numPr>
-        <w:bidi/>
-        <w:spacing w:after="70" w:line="290"/>
-        <w:jc w:val="right"/>
-      </w:pPr>
-      <w:r>
-        <w:rPr>
-          <w:rFonts w:ascii="Arial" w:cs="Arial" w:eastAsia="Arial" w:hAnsi="Arial"/>
-          <w:color w:val="1E293B"/>
-          <w:sz w:val="21"/>
-          <w:szCs w:val="21"/>
-          <w:rtl/>
-        </w:rPr>
-        <w:t xml:space="preserve">عوينت النتيجة في المتصفح: الشارة والجملة والفلتر وحالتا الفاتورتين غير المسدّدتين ظهرت، والفاتورتان المدفوعتان بقيتا «مدفوعة».</w:t>
+        <w:t xml:space="preserve">عوينت النتيجة في المتصفح: الحقل ووسم الاختياري ظاهران، ودعوة موظف بلا رقم هاتف نجحت.</w:t>
       </w:r>
     </w:p>
     <w:p>
@@ -4933,7 +5177,7 @@
           <w:szCs w:val="24"/>
           <w:rtl/>
         </w:rPr>
-        <w:t xml:space="preserve">تعديل رقم 6 — إعادة تصميم شريط الفهرسة على هيئة مسطرة تظهر عند الاقتراب</w:t>
+        <w:t xml:space="preserve">تعديل رقم 8 — فاصل مرقّم بين دورات المحادثة داخل الثريد</w:t>
       </w:r>
     </w:p>
     <w:p>
@@ -5270,7 +5514,7 @@
                 <w:szCs w:val="19"/>
                 <w:rtl/>
               </w:rPr>
-              <w:t xml:space="preserve">src/components/inbox/SessionRail.tsx · src/pages/Inbox.tsx</w:t>
+              <w:t xml:space="preserve">src/pages/Inbox.tsx</w:t>
             </w:r>
           </w:p>
         </w:tc>
@@ -5300,7 +5544,7 @@
                 <w:szCs w:val="19"/>
                 <w:rtl/>
               </w:rPr>
-              <w:t xml:space="preserve">4163939</w:t>
+              <w:t xml:space="preserve">f9b43fd</w:t>
             </w:r>
           </w:p>
         </w:tc>
@@ -5361,7 +5605,7 @@
           <w:szCs w:val="21"/>
           <w:rtl/>
         </w:rPr>
-        <w:t xml:space="preserve">الشكل السابق كان كتلاً سميكة بينها فجوات، فكان يُقرأ كشريط تقدّم مكسور لا كأداة تنقّل. صار الآن مسطرة: خطّ شعري على حافة الثريد وعليه علامات رفيعة عند بدايات الدورات.</w:t>
+        <w:t xml:space="preserve">كل دورة جديدة صار يسبقها فاصل أفقي ظاهر داخل الثريد، فيُعرف أين انتهت دورة وبدأت التي تليها من غير رجوع إلى شريط الفهرسة.</w:t>
       </w:r>
     </w:p>
     <w:p>
@@ -5383,7 +5627,7 @@
           <w:szCs w:val="21"/>
           <w:rtl/>
         </w:rPr>
-        <w:t xml:space="preserve">العلامات مجمّعة في منتصف ارتفاع الحافة كمجموعة واحدة مرتّبة، لا موزّعة على كامل الطول.</w:t>
+        <w:t xml:space="preserve">الفاصل يحمل رقم الدورة وكلمة «إعادة فتح» والتاريخ، فيجيب عن ثلاثة أسئلة في سطر: أي دورة، وماذا جرى، ومتى.</w:t>
       </w:r>
     </w:p>
     <w:p>
@@ -5405,7 +5649,7 @@
           <w:szCs w:val="21"/>
           <w:rtl/>
         </w:rPr>
-        <w:t xml:space="preserve">جُرّب توزيعها على مواضعها النسبية من ارتفاع التمرير أولاً، ثم استُبدل بالتجميع في المنتصف بقرار من الإدارة: الشكل المرتّب فُضّل على دلالة الموضع. أُزيل معه كود القياس ومراقب تغيّر الحجم لأنه لم يعد له عمل.</w:t>
+        <w:t xml:space="preserve">صيغته بلون العلامة التجارية بخطّين وشارة بارزة، لأن المطلوب أن يُلاحَظ لا أن يمرّ مرور الكرام.</w:t>
       </w:r>
     </w:p>
     <w:p>
@@ -5427,7 +5671,7 @@
           <w:szCs w:val="21"/>
           <w:rtl/>
         </w:rPr>
-        <w:t xml:space="preserve">المسطرة باهتة في الوضع العادي وتتوضّح بالكامل عند اقتراب المؤشر من الحافة أو عند وصول لوحة المفاتيح إليها.</w:t>
+        <w:t xml:space="preserve">الفاصل يحلّ محلّ شريحة التاريخ العادية في ذلك الموضع لأنه يحمل التاريخ أصلاً، فلا يجتمع فاصلان متتاليان.</w:t>
       </w:r>
     </w:p>
     <w:p>
@@ -5449,7 +5693,7 @@
           <w:szCs w:val="21"/>
           <w:rtl/>
         </w:rPr>
-        <w:t xml:space="preserve">أُبقي أثر خافت دائم بدل الإخفاء التام: ميزة لا يدل عليها شيء لا يعرفها أحد، والإخفاء الكامل كان سيجعلها غير قابلة للاكتشاف.</w:t>
+        <w:t xml:space="preserve">لا يظهر قبل الدورة الأولى لأنها بداية المحادثة لا إعادة فتح لها.</w:t>
       </w:r>
     </w:p>
     <w:p>
@@ -5471,7 +5715,7 @@
           <w:szCs w:val="21"/>
           <w:rtl/>
         </w:rPr>
-        <w:t xml:space="preserve">صارت طبقة عائمة (overlay) بدل عمود يحجز عرضاً ثابتاً، فرجع نحو 36 بكسل لمساحة الرسائل.</w:t>
+        <w:t xml:space="preserve">الدورة ذات البداية المستنتجة تُوسم «(تقديري)» في الفاصل نفسه، اتساقاً مع العلامة المتقطّعة في شريط الفهرسة.</w:t>
       </w:r>
     </w:p>
     <w:p>
@@ -5493,7 +5737,7 @@
           <w:szCs w:val="21"/>
           <w:rtl/>
         </w:rPr>
-        <w:t xml:space="preserve">وُضعت بعد شريط التمرير بمقدار 8 بكسل حتى لا تحجب سحبه.</w:t>
+        <w:t xml:space="preserve">الترقيم يتبع رقم الدورة (الدورة 2، الدورة 3) لا رقم إعادة الفتح، ليطابق ما يعرضه شريط الفهرسة وحقل sessionCount ولا يتضارب معهما.</w:t>
       </w:r>
     </w:p>
     <w:p>
@@ -5515,73 +5759,7 @@
           <w:szCs w:val="21"/>
           <w:rtl/>
         </w:rPr>
-        <w:t xml:space="preserve">التمييز بين المؤكَّد والمقدَّر بقي قائماً بصرياً: علامة متصلة للدورة المسجّلة، ومتقطّعة للمستنتَجة، مع بقاء «بداية تقديرية» في التلميح.</w:t>
-      </w:r>
-    </w:p>
-    <w:p>
-      <w:pPr>
-        <w:pStyle w:val="ListParagraph"/>
-        <w:numPr>
-          <w:ilvl w:val="0"/>
-          <w:numId w:val="2"/>
-        </w:numPr>
-        <w:bidi/>
-        <w:spacing w:after="70" w:line="290"/>
-        <w:jc w:val="right"/>
-      </w:pPr>
-      <w:r>
-        <w:rPr>
-          <w:rFonts w:ascii="Arial" w:cs="Arial" w:eastAsia="Arial" w:hAnsi="Arial"/>
-          <w:color w:val="1E293B"/>
-          <w:sz w:val="21"/>
-          <w:szCs w:val="21"/>
-          <w:rtl/>
-        </w:rPr>
-        <w:t xml:space="preserve">تنازل مقصود: الشكل السابق كان يعبّر عن حجم كل دورة بارتفاعها، والمسطرة لا تفعل. حجم الدورة انتقل إلى التلميح.</w:t>
-      </w:r>
-    </w:p>
-    <w:p>
-      <w:pPr>
-        <w:pStyle w:val="ListParagraph"/>
-        <w:numPr>
-          <w:ilvl w:val="0"/>
-          <w:numId w:val="2"/>
-        </w:numPr>
-        <w:bidi/>
-        <w:spacing w:after="70" w:line="290"/>
-        <w:jc w:val="right"/>
-      </w:pPr>
-      <w:r>
-        <w:rPr>
-          <w:rFonts w:ascii="Arial" w:cs="Arial" w:eastAsia="Arial" w:hAnsi="Arial"/>
-          <w:color w:val="1E293B"/>
-          <w:sz w:val="21"/>
-          <w:szCs w:val="21"/>
-          <w:rtl/>
-        </w:rPr>
-        <w:t xml:space="preserve">مجموعة العلامات تقبل التمرير داخلها إن كثرت الدورات حتى لا تتجاوز ارتفاع اللوحة. ولأن ذلك يقصّ التلميح، رُفع التلميح خارج المجموعة ويُحاذى رأسياً بالعلامة المؤشَّر عليها بالقياس.</w:t>
-      </w:r>
-    </w:p>
-    <w:p>
-      <w:pPr>
-        <w:pStyle w:val="ListParagraph"/>
-        <w:numPr>
-          <w:ilvl w:val="0"/>
-          <w:numId w:val="2"/>
-        </w:numPr>
-        <w:bidi/>
-        <w:spacing w:after="70" w:line="290"/>
-        <w:jc w:val="right"/>
-      </w:pPr>
-      <w:r>
-        <w:rPr>
-          <w:rFonts w:ascii="Arial" w:cs="Arial" w:eastAsia="Arial" w:hAnsi="Arial"/>
-          <w:color w:val="1E293B"/>
-          <w:sz w:val="21"/>
-          <w:szCs w:val="21"/>
-          <w:rtl/>
-        </w:rPr>
-        <w:t xml:space="preserve">عوينت النتيجة في المتصفح: العلامات الثلاث متجمّعة في المنتصف، والتوضّح بالاقتراب والتلميح والانتقال تعمل.</w:t>
+        <w:t xml:space="preserve">عوينت النتيجة في المتصفح: فاصلان بالرقمين الصحيحين، وشريحة التاريخ المكرّرة اختفت من موضعيهما.</w:t>
       </w:r>
     </w:p>
     <w:p>
@@ -5606,7 +5784,7 @@
           <w:szCs w:val="24"/>
           <w:rtl/>
         </w:rPr>
-        <w:t xml:space="preserve">تعديل رقم 5 — شريط فهرسة دورات المحادثة داخل الثريد</w:t>
+        <w:t xml:space="preserve">تعديل رقم 7 — انعكاس حالة «مجدولة» للتخفيض المؤجّل في بورتال العميل</w:t>
       </w:r>
     </w:p>
     <w:p>
@@ -5883,7 +6061,7 @@
                 <w:szCs w:val="19"/>
                 <w:rtl/>
               </w:rPr>
-              <w:t xml:space="preserve">صندوق الوارد</w:t>
+              <w:t xml:space="preserve">الباقات والاشتراك</w:t>
             </w:r>
           </w:p>
         </w:tc>
@@ -5913,7 +6091,7 @@
                 <w:szCs w:val="19"/>
                 <w:rtl/>
               </w:rPr>
-              <w:t xml:space="preserve">/inbox</w:t>
+              <w:t xml:space="preserve">/billing</w:t>
             </w:r>
           </w:p>
         </w:tc>
@@ -5943,7 +6121,7 @@
                 <w:szCs w:val="19"/>
                 <w:rtl/>
               </w:rPr>
-              <w:t xml:space="preserve">src/components/inbox/SessionRail.tsx · src/pages/Inbox.tsx · src/store/mockData.ts</w:t>
+              <w:t xml:space="preserve">src/types/index.ts · src/pages/Billing.tsx · src/store/adminMockData.ts</w:t>
             </w:r>
           </w:p>
         </w:tc>
@@ -5973,7 +6151,7 @@
                 <w:szCs w:val="19"/>
                 <w:rtl/>
               </w:rPr>
-              <w:t xml:space="preserve">e05e715</w:t>
+              <w:t xml:space="preserve">5202dba</w:t>
             </w:r>
           </w:p>
         </w:tc>
@@ -6034,7 +6212,7 @@
           <w:szCs w:val="21"/>
           <w:rtl/>
         </w:rPr>
-        <w:t xml:space="preserve">شريط رأسي على حافة الثريد يقسّمه إلى دورات فتح وإغلاق، ليصل الموظف إلى بداية أي دورة في المحادثات الطويلة التي تُعاد فتحها مراراً.</w:t>
+        <w:t xml:space="preserve">الاشتراك الذي عليه تخفيض مؤجّل إلى تاريخ لاحق صارت حالته «مجدولة» ظاهرة للعميل، لا في بورتال الإدارة وحده.</w:t>
       </w:r>
     </w:p>
     <w:p>
@@ -6056,7 +6234,7 @@
           <w:szCs w:val="21"/>
           <w:rtl/>
         </w:rPr>
-        <w:t xml:space="preserve">ارتفاع كل مقطع يتناسب مع عدد رسائله، فيعطي إحساساً بحجم كل دورة قبل الدخول إليها.</w:t>
+        <w:t xml:space="preserve">أُضيف الحقل scheduledChange إلى الاشتراك ويحمل الباقة المستهدفة ودورة الفوترة وتاريخ السريان، وأُضيفت «مجدولة» إلى حالات الفاتورة.</w:t>
       </w:r>
     </w:p>
     <w:p>
@@ -6078,7 +6256,7 @@
           <w:szCs w:val="21"/>
           <w:rtl/>
         </w:rPr>
-        <w:t xml:space="preserve">المرور على المقطع يُظهر اليوم والتاريخ وعدد الرسائل — «اليوم» و«أمس» لما قرُب، واسم اليوم لما بعُد.</w:t>
+        <w:t xml:space="preserve">بطاقة الاشتراك تعرض شارة «مجدولة» وجملة صريحة تذكر اسم الباقة المستهدفة وتاريخ التحويل، وتؤكّد أن الباقة الحالية ومزاياها مستمرة حتى ذلك التاريخ — فلا يظن العميل أن باقته انخفضت الآن.</w:t>
       </w:r>
     </w:p>
     <w:p>
@@ -6100,7 +6278,7 @@
           <w:szCs w:val="21"/>
           <w:rtl/>
         </w:rPr>
-        <w:t xml:space="preserve">الضغط ينقل إلى أول رسالة في الدورة، والمقطع الذي يقابل موضع القراءة الحالي يُبرَز تلقائياً أثناء التمرير.</w:t>
+        <w:t xml:space="preserve">جدول الفواتير وفلاترها ونافذة معاينة الفاتورة تعرض الحالة نفسها.</w:t>
       </w:r>
     </w:p>
     <w:p>
@@ -6122,7 +6300,7 @@
           <w:szCs w:val="21"/>
           <w:rtl/>
         </w:rPr>
-        <w:t xml:space="preserve">المقاطع ذات البداية المستنتجة تُعرض بحدّ متقطّع ويذكر التلميح «بداية تقديرية»، فيبقى الفرق بين المؤكَّد والمقدَّر ظاهراً للموظف لا مخفياً عنه.</w:t>
+        <w:t xml:space="preserve">الحالة مشتقّة من الاشتراك لا مخزّنة على الفاتورة: إلغاء الجدولة يُزيلها من كل المواضع في آن واحد، بدل أن تبقى فاتورة تحمل حالة قديمة.</w:t>
       </w:r>
     </w:p>
     <w:p>
@@ -6144,7 +6322,7 @@
           <w:szCs w:val="21"/>
           <w:rtl/>
         </w:rPr>
-        <w:t xml:space="preserve">الشريط يختفي كلياً حين تكون المحادثة دورة واحدة، فلا معنى لفهرس لا يفهرس شيئاً.</w:t>
+        <w:t xml:space="preserve">قرار مقصود: الاشتقاق يطال الفواتير غير المسدّدة فقط (معلّقة ومسودة). الفاتورة المدفوعة أو المستردة أو الملغاة أو الفاشلة تحتفظ بحالتها، وكذلك المتأخرة لأن التأخّر مشكلة سداد لا يصح حجبها خلف حالة الجدولة.</w:t>
       </w:r>
     </w:p>
     <w:p>
@@ -6166,7 +6344,7 @@
           <w:szCs w:val="21"/>
           <w:rtl/>
         </w:rPr>
-        <w:t xml:space="preserve">الدورات الخالية من الرسائل مستبعدة من الشريط بقرار مقصود — لا شيء يمكن الانتقال إليه فيها.</w:t>
+        <w:t xml:space="preserve">زر «إلغاء الجدولة» إجراء إداري بحسب المواصفة، فبورتال العميل يعرض الحالة دون التحكم فيها.</w:t>
       </w:r>
     </w:p>
     <w:p>
@@ -6188,7 +6366,7 @@
           <w:szCs w:val="21"/>
           <w:rtl/>
         </w:rPr>
-        <w:t xml:space="preserve">وُزّعت رسائل محادثة أحمد الشعيلي التجريبية على ثلاث دورات عبر ثلاثة أشهر لتصير الميزة قابلة للمعاينة، وصار sessionCount فيها مطابقاً للواقع بعد أن كان رقماً مكتوباً بلا سند. آخر دورة مسجّلة بحدث حقيقي وما قبلها مستنتج، ليظهر الشكلان معاً.</w:t>
+        <w:t xml:space="preserve">أُضيفت جدولة تجريبية لعميل العرض (تحويل من الأعمال إلى الاحترافي بعد 15 يوماً) لتصير الحالة قابلة للمعاينة.</w:t>
       </w:r>
     </w:p>
     <w:p>
@@ -6210,7 +6388,7 @@
           <w:szCs w:val="21"/>
           <w:rtl/>
         </w:rPr>
-        <w:t xml:space="preserve">عوينت النتيجة في المتصفح: الشريط والتلميح والانتقال والإبراز تعمل في الوضعين الفاتح والليلي، والمحادثات أحادية الدورة سليمة بلا شريط.</w:t>
+        <w:t xml:space="preserve">عوينت النتيجة في المتصفح: الشارة والجملة والفلتر وحالتا الفاتورتين غير المسدّدتين ظهرت، والفاتورتان المدفوعتان بقيتا «مدفوعة».</w:t>
       </w:r>
     </w:p>
     <w:p>
@@ -6235,7 +6413,7 @@
           <w:szCs w:val="24"/>
           <w:rtl/>
         </w:rPr>
-        <w:t xml:space="preserve">تعديل رقم 4 — تسجيل دورات المحادثة واشتقاقها — أساس شريط فهرسة الثريد</w:t>
+        <w:t xml:space="preserve">تعديل رقم 6 — إعادة تصميم شريط الفهرسة على هيئة مسطرة تظهر عند الاقتراب</w:t>
       </w:r>
     </w:p>
     <w:p>
@@ -6512,7 +6690,7 @@
                 <w:szCs w:val="19"/>
                 <w:rtl/>
               </w:rPr>
-              <w:t xml:space="preserve">صندوق الوارد (طبقة البيانات)</w:t>
+              <w:t xml:space="preserve">صندوق الوارد</w:t>
             </w:r>
           </w:p>
         </w:tc>
@@ -6572,7 +6750,7 @@
                 <w:szCs w:val="19"/>
                 <w:rtl/>
               </w:rPr>
-              <w:t xml:space="preserve">src/utils/sessions.ts · src/store/useDataStore.ts · src/types/index.ts</w:t>
+              <w:t xml:space="preserve">src/components/inbox/SessionRail.tsx · src/pages/Inbox.tsx</w:t>
             </w:r>
           </w:p>
         </w:tc>
@@ -6602,7 +6780,7 @@
                 <w:szCs w:val="19"/>
                 <w:rtl/>
               </w:rPr>
-              <w:t xml:space="preserve">5cf29e1</w:t>
+              <w:t xml:space="preserve">4163939</w:t>
             </w:r>
           </w:p>
         </w:tc>
@@ -6663,7 +6841,7 @@
           <w:szCs w:val="21"/>
           <w:rtl/>
         </w:rPr>
-        <w:t xml:space="preserve">المشكلة: المحادثة الواحدة تُعاد فتحها كلما راسل العميل بعد الإغلاق، فيصير الثريد بلا نهاية. ولرسم شريط فهرسة يقسّمه إلى دورات، لزم معرفة توقيت كل فتح وإغلاق — وهي بيانات لم تكن تُسجَّل إطلاقاً.</w:t>
+        <w:t xml:space="preserve">الشكل السابق كان كتلاً سميكة بينها فجوات، فكان يُقرأ كشريط تقدّم مكسور لا كأداة تنقّل. صار الآن مسطرة: خطّ شعري على حافة الثريد وعليه علامات رفيعة عند بدايات الدورات.</w:t>
       </w:r>
     </w:p>
     <w:p>
@@ -6685,7 +6863,7 @@
           <w:szCs w:val="21"/>
           <w:rtl/>
         </w:rPr>
-        <w:t xml:space="preserve">كان الحقل sessionCount يُكتب مرة واحدة عند الإنشاء ولا يزيده أي سطر في المشروع، وقيمه في البيانات التجريبية مكتوبة يدوياً. كذلك activityLog على المحادثة كان مُعرَّفاً في الأنواع لكن لا دالة تكتب فيه وقت التشغيل.</w:t>
+        <w:t xml:space="preserve">العلامات مجمّعة في منتصف ارتفاع الحافة كمجموعة واحدة مرتّبة، لا موزّعة على كامل الطول.</w:t>
       </w:r>
     </w:p>
     <w:p>
@@ -6707,7 +6885,7 @@
           <w:szCs w:val="21"/>
           <w:rtl/>
         </w:rPr>
-        <w:t xml:space="preserve">أُضيف النوع SessionEvent لتسجيل حدث فتح أو إغلاق بتوقيته وصاحبه، والنوع ConversationSession يمثّل الدورة المشتقّة.</w:t>
+        <w:t xml:space="preserve">جُرّب توزيعها على مواضعها النسبية من ارتفاع التمرير أولاً، ثم استُبدل بالتجميع في المنتصف بقرار من الإدارة: الشكل المرتّب فُضّل على دلالة الموضع. أُزيل معه كود القياس ومراقب تغيّر الحجم لأنه لم يعد له عمل.</w:t>
       </w:r>
     </w:p>
     <w:p>
@@ -6729,7 +6907,7 @@
           <w:szCs w:val="21"/>
           <w:rtl/>
         </w:rPr>
-        <w:t xml:space="preserve">صارت أربعة مواضع تسجّل الحدث فعلياً: setConversationStatus عند الإغلاق أو إعادة الفتح، reopenConversation، ورسالة العميل الواردة نصية أو صوتية حين تُحيي محادثة مغلقة — وهذا آخرها كان يمرّ بلا أي أثر رغم أنه أكثرها تكراراً.</w:t>
+        <w:t xml:space="preserve">المسطرة باهتة في الوضع العادي وتتوضّح بالكامل عند اقتراب المؤشر من الحافة أو عند وصول لوحة المفاتيح إليها.</w:t>
       </w:r>
     </w:p>
     <w:p>
@@ -6751,7 +6929,7 @@
           <w:szCs w:val="21"/>
           <w:rtl/>
         </w:rPr>
-        <w:t xml:space="preserve">أُضيفت الدالة deriveSessions التي تقسّم الثريد إلى دورات: الأحداث المسجّلة مرجع قاطع، وما سبقها من تاريخ قديم تُستنتج حدوده من فجوات الصمت (24 ساعة افتراضاً) وتُعلَّم inferred حتى يظل الفرق بين المؤكَّد والمقدَّر ظاهراً.</w:t>
+        <w:t xml:space="preserve">أُبقي أثر خافت دائم بدل الإخفاء التام: ميزة لا يدل عليها شيء لا يعرفها أحد، والإخفاء الكامل كان سيجعلها غير قابلة للاكتشاف.</w:t>
       </w:r>
     </w:p>
     <w:p>
@@ -6773,7 +6951,7 @@
           <w:szCs w:val="21"/>
           <w:rtl/>
         </w:rPr>
-        <w:t xml:space="preserve">الدالة تتعامل مع الحالة المختلطة: ثريد فيه تاريخ قديم مُستنتج ودورات جديدة مسجّلة في آن واحد.</w:t>
+        <w:t xml:space="preserve">صارت طبقة عائمة (overlay) بدل عمود يحجز عرضاً ثابتاً، فرجع نحو 36 بكسل لمساحة الرسائل.</w:t>
       </w:r>
     </w:p>
     <w:p>
@@ -6795,7 +6973,7 @@
           <w:szCs w:val="21"/>
           <w:rtl/>
         </w:rPr>
-        <w:t xml:space="preserve">اختُبر المنطق على ثماني حالات شملت الثريد الفارغ والرسالة الواحدة والفجوات المتعددة والأحداث المسجّلة والحالة المختلطة والمدخلات غير المرتّبة زمنياً — جميعها نجحت.</w:t>
+        <w:t xml:space="preserve">وُضعت بعد شريط التمرير بمقدار 8 بكسل حتى لا تحجب سحبه.</w:t>
       </w:r>
     </w:p>
     <w:p>
@@ -6817,7 +6995,7 @@
           <w:szCs w:val="21"/>
           <w:rtl/>
         </w:rPr>
-        <w:t xml:space="preserve">ملاحظة على البيانات الحالية: كل المحادثات التجريبية تُنتج دورة واحدة لأن رسائلها متقاربة بدقائق ولا فجوات فيها. الشريط لن يُظهر تقسيماً حقيقياً قبل توفّر بيانات متباعدة زمنياً.</w:t>
+        <w:t xml:space="preserve">التمييز بين المؤكَّد والمقدَّر بقي قائماً بصرياً: علامة متصلة للدورة المسجّلة، ومتقطّعة للمستنتَجة، مع بقاء «بداية تقديرية» في التلميح.</w:t>
       </w:r>
     </w:p>
     <w:p>
@@ -6839,7 +7017,51 @@
           <w:szCs w:val="21"/>
           <w:rtl/>
         </w:rPr>
-        <w:t xml:space="preserve">لم تُبنَ واجهة الشريط بعد — هذا التعديل يغطّي طبقة البيانات وحدها.</w:t>
+        <w:t xml:space="preserve">تنازل مقصود: الشكل السابق كان يعبّر عن حجم كل دورة بارتفاعها، والمسطرة لا تفعل. حجم الدورة انتقل إلى التلميح.</w:t>
+      </w:r>
+    </w:p>
+    <w:p>
+      <w:pPr>
+        <w:pStyle w:val="ListParagraph"/>
+        <w:numPr>
+          <w:ilvl w:val="0"/>
+          <w:numId w:val="2"/>
+        </w:numPr>
+        <w:bidi/>
+        <w:spacing w:after="70" w:line="290"/>
+        <w:jc w:val="right"/>
+      </w:pPr>
+      <w:r>
+        <w:rPr>
+          <w:rFonts w:ascii="Arial" w:cs="Arial" w:eastAsia="Arial" w:hAnsi="Arial"/>
+          <w:color w:val="1E293B"/>
+          <w:sz w:val="21"/>
+          <w:szCs w:val="21"/>
+          <w:rtl/>
+        </w:rPr>
+        <w:t xml:space="preserve">مجموعة العلامات تقبل التمرير داخلها إن كثرت الدورات حتى لا تتجاوز ارتفاع اللوحة. ولأن ذلك يقصّ التلميح، رُفع التلميح خارج المجموعة ويُحاذى رأسياً بالعلامة المؤشَّر عليها بالقياس.</w:t>
+      </w:r>
+    </w:p>
+    <w:p>
+      <w:pPr>
+        <w:pStyle w:val="ListParagraph"/>
+        <w:numPr>
+          <w:ilvl w:val="0"/>
+          <w:numId w:val="2"/>
+        </w:numPr>
+        <w:bidi/>
+        <w:spacing w:after="70" w:line="290"/>
+        <w:jc w:val="right"/>
+      </w:pPr>
+      <w:r>
+        <w:rPr>
+          <w:rFonts w:ascii="Arial" w:cs="Arial" w:eastAsia="Arial" w:hAnsi="Arial"/>
+          <w:color w:val="1E293B"/>
+          <w:sz w:val="21"/>
+          <w:szCs w:val="21"/>
+          <w:rtl/>
+        </w:rPr>
+        <w:t xml:space="preserve">عوينت النتيجة في المتصفح: العلامات الثلاث متجمّعة في المنتصف، والتوضّح بالاقتراب والتلميح والانتقال تعمل.</w:t>
       </w:r>
     </w:p>
     <w:p>
@@ -6864,7 +7086,7 @@
           <w:szCs w:val="24"/>
           <w:rtl/>
         </w:rPr>
-        <w:t xml:space="preserve">تعديل رقم 3 — إزالة كارت نسبة الاستجابة من صفحة تقييمات العملاء</w:t>
+        <w:t xml:space="preserve">تعديل رقم 5 — شريط فهرسة دورات المحادثة داخل الثريد</w:t>
       </w:r>
     </w:p>
     <w:p>
@@ -7141,7 +7363,7 @@
                 <w:szCs w:val="19"/>
                 <w:rtl/>
               </w:rPr>
-              <w:t xml:space="preserve">تقييمات العملاء</w:t>
+              <w:t xml:space="preserve">صندوق الوارد</w:t>
             </w:r>
           </w:p>
         </w:tc>
@@ -7171,7 +7393,7 @@
                 <w:szCs w:val="19"/>
                 <w:rtl/>
               </w:rPr>
-              <w:t xml:space="preserve">/rating</w:t>
+              <w:t xml:space="preserve">/inbox</w:t>
             </w:r>
           </w:p>
         </w:tc>
@@ -7201,7 +7423,7 @@
                 <w:szCs w:val="19"/>
                 <w:rtl/>
               </w:rPr>
-              <w:t xml:space="preserve">src/pages/CustomerRatings.tsx</w:t>
+              <w:t xml:space="preserve">src/components/inbox/SessionRail.tsx · src/pages/Inbox.tsx · src/store/mockData.ts</w:t>
             </w:r>
           </w:p>
         </w:tc>
@@ -7231,7 +7453,7 @@
                 <w:szCs w:val="19"/>
                 <w:rtl/>
               </w:rPr>
-              <w:t xml:space="preserve">cc8bd4f</w:t>
+              <w:t xml:space="preserve">e05e715</w:t>
             </w:r>
           </w:p>
         </w:tc>
@@ -7292,7 +7514,7 @@
           <w:szCs w:val="21"/>
           <w:rtl/>
         </w:rPr>
-        <w:t xml:space="preserve">حُذف كارت «نسبة الاستجابة» بالكامل من شريط الإحصائيات — صارت 3 كروت بدل 4.</w:t>
+        <w:t xml:space="preserve">شريط رأسي على حافة الثريد يقسّمه إلى دورات فتح وإغلاق، ليصل الموظف إلى بداية أي دورة في المحادثات الطويلة التي تُعاد فتحها مراراً.</w:t>
       </w:r>
     </w:p>
     <w:p>
@@ -7314,7 +7536,7 @@
           <w:szCs w:val="21"/>
           <w:rtl/>
         </w:rPr>
-        <w:t xml:space="preserve">حُذف معه حساب responseRate لأنه لم يعد له مستهلك في الصفحة.</w:t>
+        <w:t xml:space="preserve">ارتفاع كل مقطع يتناسب مع عدد رسائله، فيعطي إحساساً بحجم كل دورة قبل الدخول إليها.</w:t>
       </w:r>
     </w:p>
     <w:p>
@@ -7336,7 +7558,7 @@
           <w:szCs w:val="21"/>
           <w:rtl/>
         </w:rPr>
-        <w:t xml:space="preserve">حُذف استيراد أيقونة TrendingUp لأنها كانت مستخدمة في هذا الكارت وحده.</w:t>
+        <w:t xml:space="preserve">المرور على المقطع يُظهر اليوم والتاريخ وعدد الرسائل — «اليوم» و«أمس» لما قرُب، واسم اليوم لما بعُد.</w:t>
       </w:r>
     </w:p>
     <w:p>
@@ -7358,7 +7580,7 @@
           <w:szCs w:val="21"/>
           <w:rtl/>
         </w:rPr>
-        <w:t xml:space="preserve">عُدّلت شبكة العرض من grid-cols-2 lg:grid-cols-4 إلى grid-cols-1 sm:grid-cols-3، حتى لا يبقى كارت يتيم في سطر منفصل على الشاشات الصغيرة.</w:t>
+        <w:t xml:space="preserve">الضغط ينقل إلى أول رسالة في الدورة، والمقطع الذي يقابل موضع القراءة الحالي يُبرَز تلقائياً أثناء التمرير.</w:t>
       </w:r>
     </w:p>
     <w:p>
@@ -7380,7 +7602,95 @@
           <w:szCs w:val="21"/>
           <w:rtl/>
         </w:rPr>
-        <w:t xml:space="preserve">الكروت الباقية: متوسط تقييم المحادثة، متوسط تقييم الموظفين، إجمالي الروابط.</w:t>
+        <w:t xml:space="preserve">المقاطع ذات البداية المستنتجة تُعرض بحدّ متقطّع ويذكر التلميح «بداية تقديرية»، فيبقى الفرق بين المؤكَّد والمقدَّر ظاهراً للموظف لا مخفياً عنه.</w:t>
+      </w:r>
+    </w:p>
+    <w:p>
+      <w:pPr>
+        <w:pStyle w:val="ListParagraph"/>
+        <w:numPr>
+          <w:ilvl w:val="0"/>
+          <w:numId w:val="2"/>
+        </w:numPr>
+        <w:bidi/>
+        <w:spacing w:after="70" w:line="290"/>
+        <w:jc w:val="right"/>
+      </w:pPr>
+      <w:r>
+        <w:rPr>
+          <w:rFonts w:ascii="Arial" w:cs="Arial" w:eastAsia="Arial" w:hAnsi="Arial"/>
+          <w:color w:val="1E293B"/>
+          <w:sz w:val="21"/>
+          <w:szCs w:val="21"/>
+          <w:rtl/>
+        </w:rPr>
+        <w:t xml:space="preserve">الشريط يختفي كلياً حين تكون المحادثة دورة واحدة، فلا معنى لفهرس لا يفهرس شيئاً.</w:t>
+      </w:r>
+    </w:p>
+    <w:p>
+      <w:pPr>
+        <w:pStyle w:val="ListParagraph"/>
+        <w:numPr>
+          <w:ilvl w:val="0"/>
+          <w:numId w:val="2"/>
+        </w:numPr>
+        <w:bidi/>
+        <w:spacing w:after="70" w:line="290"/>
+        <w:jc w:val="right"/>
+      </w:pPr>
+      <w:r>
+        <w:rPr>
+          <w:rFonts w:ascii="Arial" w:cs="Arial" w:eastAsia="Arial" w:hAnsi="Arial"/>
+          <w:color w:val="1E293B"/>
+          <w:sz w:val="21"/>
+          <w:szCs w:val="21"/>
+          <w:rtl/>
+        </w:rPr>
+        <w:t xml:space="preserve">الدورات الخالية من الرسائل مستبعدة من الشريط بقرار مقصود — لا شيء يمكن الانتقال إليه فيها.</w:t>
+      </w:r>
+    </w:p>
+    <w:p>
+      <w:pPr>
+        <w:pStyle w:val="ListParagraph"/>
+        <w:numPr>
+          <w:ilvl w:val="0"/>
+          <w:numId w:val="2"/>
+        </w:numPr>
+        <w:bidi/>
+        <w:spacing w:after="70" w:line="290"/>
+        <w:jc w:val="right"/>
+      </w:pPr>
+      <w:r>
+        <w:rPr>
+          <w:rFonts w:ascii="Arial" w:cs="Arial" w:eastAsia="Arial" w:hAnsi="Arial"/>
+          <w:color w:val="1E293B"/>
+          <w:sz w:val="21"/>
+          <w:szCs w:val="21"/>
+          <w:rtl/>
+        </w:rPr>
+        <w:t xml:space="preserve">وُزّعت رسائل محادثة أحمد الشعيلي التجريبية على ثلاث دورات عبر ثلاثة أشهر لتصير الميزة قابلة للمعاينة، وصار sessionCount فيها مطابقاً للواقع بعد أن كان رقماً مكتوباً بلا سند. آخر دورة مسجّلة بحدث حقيقي وما قبلها مستنتج، ليظهر الشكلان معاً.</w:t>
+      </w:r>
+    </w:p>
+    <w:p>
+      <w:pPr>
+        <w:pStyle w:val="ListParagraph"/>
+        <w:numPr>
+          <w:ilvl w:val="0"/>
+          <w:numId w:val="2"/>
+        </w:numPr>
+        <w:bidi/>
+        <w:spacing w:after="70" w:line="290"/>
+        <w:jc w:val="right"/>
+      </w:pPr>
+      <w:r>
+        <w:rPr>
+          <w:rFonts w:ascii="Arial" w:cs="Arial" w:eastAsia="Arial" w:hAnsi="Arial"/>
+          <w:color w:val="1E293B"/>
+          <w:sz w:val="21"/>
+          <w:szCs w:val="21"/>
+          <w:rtl/>
+        </w:rPr>
+        <w:t xml:space="preserve">عوينت النتيجة في المتصفح: الشريط والتلميح والانتقال والإبراز تعمل في الوضعين الفاتح والليلي، والمحادثات أحادية الدورة سليمة بلا شريط.</w:t>
       </w:r>
     </w:p>
     <w:p>
@@ -7405,7 +7715,7 @@
           <w:szCs w:val="24"/>
           <w:rtl/>
         </w:rPr>
-        <w:t xml:space="preserve">تعديل رقم 2 — تغيير تسمية زر الترقية في صفحة الفوترة</w:t>
+        <w:t xml:space="preserve">تعديل رقم 4 — تسجيل دورات المحادثة واشتقاقها — أساس شريط فهرسة الثريد</w:t>
       </w:r>
     </w:p>
     <w:p>
@@ -7652,7 +7962,7 @@
                 <w:szCs w:val="19"/>
                 <w:rtl/>
               </w:rPr>
-              <w:t xml:space="preserve">9 سبتمبر 2026</w:t>
+              <w:t xml:space="preserve">10 سبتمبر 2026</w:t>
             </w:r>
           </w:p>
         </w:tc>
@@ -7682,7 +7992,7 @@
                 <w:szCs w:val="19"/>
                 <w:rtl/>
               </w:rPr>
-              <w:t xml:space="preserve">الفوترة</w:t>
+              <w:t xml:space="preserve">صندوق الوارد (طبقة البيانات)</w:t>
             </w:r>
           </w:p>
         </w:tc>
@@ -7712,7 +8022,7 @@
                 <w:szCs w:val="19"/>
                 <w:rtl/>
               </w:rPr>
-              <w:t xml:space="preserve">/billing</w:t>
+              <w:t xml:space="preserve">/inbox</w:t>
             </w:r>
           </w:p>
         </w:tc>
@@ -7742,7 +8052,7 @@
                 <w:szCs w:val="19"/>
                 <w:rtl/>
               </w:rPr>
-              <w:t xml:space="preserve">src/pages/Billing.tsx</w:t>
+              <w:t xml:space="preserve">src/utils/sessions.ts · src/store/useDataStore.ts · src/types/index.ts</w:t>
             </w:r>
           </w:p>
         </w:tc>
@@ -7772,7 +8082,7 @@
                 <w:szCs w:val="19"/>
                 <w:rtl/>
               </w:rPr>
-              <w:t xml:space="preserve">be5b3c0</w:t>
+              <w:t xml:space="preserve">5cf29e1</w:t>
             </w:r>
           </w:p>
         </w:tc>
@@ -7833,7 +8143,7 @@
           <w:szCs w:val="21"/>
           <w:rtl/>
         </w:rPr>
-        <w:t xml:space="preserve">زر «ترقية» أصبح «تغيير الباقة».</w:t>
+        <w:t xml:space="preserve">المشكلة: المحادثة الواحدة تُعاد فتحها كلما راسل العميل بعد الإغلاق، فيصير الثريد بلا نهاية. ولرسم شريط فهرسة يقسّمه إلى دورات، لزم معرفة توقيت كل فتح وإغلاق — وهي بيانات لم تكن تُسجَّل إطلاقاً.</w:t>
       </w:r>
     </w:p>
     <w:p>
@@ -7855,7 +8165,161 @@
           <w:szCs w:val="21"/>
           <w:rtl/>
         </w:rPr>
-        <w:t xml:space="preserve">سبب التغيير: الزر يوصّل إلى مسار يشمل الترقية والتخفيض معاً، فالتسمية القديمة كانت تصف نصف وظيفته.</w:t>
+        <w:t xml:space="preserve">كان الحقل sessionCount يُكتب مرة واحدة عند الإنشاء ولا يزيده أي سطر في المشروع، وقيمه في البيانات التجريبية مكتوبة يدوياً. كذلك activityLog على المحادثة كان مُعرَّفاً في الأنواع لكن لا دالة تكتب فيه وقت التشغيل.</w:t>
+      </w:r>
+    </w:p>
+    <w:p>
+      <w:pPr>
+        <w:pStyle w:val="ListParagraph"/>
+        <w:numPr>
+          <w:ilvl w:val="0"/>
+          <w:numId w:val="2"/>
+        </w:numPr>
+        <w:bidi/>
+        <w:spacing w:after="70" w:line="290"/>
+        <w:jc w:val="right"/>
+      </w:pPr>
+      <w:r>
+        <w:rPr>
+          <w:rFonts w:ascii="Arial" w:cs="Arial" w:eastAsia="Arial" w:hAnsi="Arial"/>
+          <w:color w:val="1E293B"/>
+          <w:sz w:val="21"/>
+          <w:szCs w:val="21"/>
+          <w:rtl/>
+        </w:rPr>
+        <w:t xml:space="preserve">أُضيف النوع SessionEvent لتسجيل حدث فتح أو إغلاق بتوقيته وصاحبه، والنوع ConversationSession يمثّل الدورة المشتقّة.</w:t>
+      </w:r>
+    </w:p>
+    <w:p>
+      <w:pPr>
+        <w:pStyle w:val="ListParagraph"/>
+        <w:numPr>
+          <w:ilvl w:val="0"/>
+          <w:numId w:val="2"/>
+        </w:numPr>
+        <w:bidi/>
+        <w:spacing w:after="70" w:line="290"/>
+        <w:jc w:val="right"/>
+      </w:pPr>
+      <w:r>
+        <w:rPr>
+          <w:rFonts w:ascii="Arial" w:cs="Arial" w:eastAsia="Arial" w:hAnsi="Arial"/>
+          <w:color w:val="1E293B"/>
+          <w:sz w:val="21"/>
+          <w:szCs w:val="21"/>
+          <w:rtl/>
+        </w:rPr>
+        <w:t xml:space="preserve">صارت أربعة مواضع تسجّل الحدث فعلياً: setConversationStatus عند الإغلاق أو إعادة الفتح، reopenConversation، ورسالة العميل الواردة نصية أو صوتية حين تُحيي محادثة مغلقة — وهذا آخرها كان يمرّ بلا أي أثر رغم أنه أكثرها تكراراً.</w:t>
+      </w:r>
+    </w:p>
+    <w:p>
+      <w:pPr>
+        <w:pStyle w:val="ListParagraph"/>
+        <w:numPr>
+          <w:ilvl w:val="0"/>
+          <w:numId w:val="2"/>
+        </w:numPr>
+        <w:bidi/>
+        <w:spacing w:after="70" w:line="290"/>
+        <w:jc w:val="right"/>
+      </w:pPr>
+      <w:r>
+        <w:rPr>
+          <w:rFonts w:ascii="Arial" w:cs="Arial" w:eastAsia="Arial" w:hAnsi="Arial"/>
+          <w:color w:val="1E293B"/>
+          <w:sz w:val="21"/>
+          <w:szCs w:val="21"/>
+          <w:rtl/>
+        </w:rPr>
+        <w:t xml:space="preserve">أُضيفت الدالة deriveSessions التي تقسّم الثريد إلى دورات: الأحداث المسجّلة مرجع قاطع، وما سبقها من تاريخ قديم تُستنتج حدوده من فجوات الصمت (24 ساعة افتراضاً) وتُعلَّم inferred حتى يظل الفرق بين المؤكَّد والمقدَّر ظاهراً.</w:t>
+      </w:r>
+    </w:p>
+    <w:p>
+      <w:pPr>
+        <w:pStyle w:val="ListParagraph"/>
+        <w:numPr>
+          <w:ilvl w:val="0"/>
+          <w:numId w:val="2"/>
+        </w:numPr>
+        <w:bidi/>
+        <w:spacing w:after="70" w:line="290"/>
+        <w:jc w:val="right"/>
+      </w:pPr>
+      <w:r>
+        <w:rPr>
+          <w:rFonts w:ascii="Arial" w:cs="Arial" w:eastAsia="Arial" w:hAnsi="Arial"/>
+          <w:color w:val="1E293B"/>
+          <w:sz w:val="21"/>
+          <w:szCs w:val="21"/>
+          <w:rtl/>
+        </w:rPr>
+        <w:t xml:space="preserve">الدالة تتعامل مع الحالة المختلطة: ثريد فيه تاريخ قديم مُستنتج ودورات جديدة مسجّلة في آن واحد.</w:t>
+      </w:r>
+    </w:p>
+    <w:p>
+      <w:pPr>
+        <w:pStyle w:val="ListParagraph"/>
+        <w:numPr>
+          <w:ilvl w:val="0"/>
+          <w:numId w:val="2"/>
+        </w:numPr>
+        <w:bidi/>
+        <w:spacing w:after="70" w:line="290"/>
+        <w:jc w:val="right"/>
+      </w:pPr>
+      <w:r>
+        <w:rPr>
+          <w:rFonts w:ascii="Arial" w:cs="Arial" w:eastAsia="Arial" w:hAnsi="Arial"/>
+          <w:color w:val="1E293B"/>
+          <w:sz w:val="21"/>
+          <w:szCs w:val="21"/>
+          <w:rtl/>
+        </w:rPr>
+        <w:t xml:space="preserve">اختُبر المنطق على ثماني حالات شملت الثريد الفارغ والرسالة الواحدة والفجوات المتعددة والأحداث المسجّلة والحالة المختلطة والمدخلات غير المرتّبة زمنياً — جميعها نجحت.</w:t>
+      </w:r>
+    </w:p>
+    <w:p>
+      <w:pPr>
+        <w:pStyle w:val="ListParagraph"/>
+        <w:numPr>
+          <w:ilvl w:val="0"/>
+          <w:numId w:val="2"/>
+        </w:numPr>
+        <w:bidi/>
+        <w:spacing w:after="70" w:line="290"/>
+        <w:jc w:val="right"/>
+      </w:pPr>
+      <w:r>
+        <w:rPr>
+          <w:rFonts w:ascii="Arial" w:cs="Arial" w:eastAsia="Arial" w:hAnsi="Arial"/>
+          <w:color w:val="1E293B"/>
+          <w:sz w:val="21"/>
+          <w:szCs w:val="21"/>
+          <w:rtl/>
+        </w:rPr>
+        <w:t xml:space="preserve">ملاحظة على البيانات الحالية: كل المحادثات التجريبية تُنتج دورة واحدة لأن رسائلها متقاربة بدقائق ولا فجوات فيها. الشريط لن يُظهر تقسيماً حقيقياً قبل توفّر بيانات متباعدة زمنياً.</w:t>
+      </w:r>
+    </w:p>
+    <w:p>
+      <w:pPr>
+        <w:pStyle w:val="ListParagraph"/>
+        <w:numPr>
+          <w:ilvl w:val="0"/>
+          <w:numId w:val="2"/>
+        </w:numPr>
+        <w:bidi/>
+        <w:spacing w:after="70" w:line="290"/>
+        <w:jc w:val="right"/>
+      </w:pPr>
+      <w:r>
+        <w:rPr>
+          <w:rFonts w:ascii="Arial" w:cs="Arial" w:eastAsia="Arial" w:hAnsi="Arial"/>
+          <w:color w:val="1E293B"/>
+          <w:sz w:val="21"/>
+          <w:szCs w:val="21"/>
+          <w:rtl/>
+        </w:rPr>
+        <w:t xml:space="preserve">لم تُبنَ واجهة الشريط بعد — هذا التعديل يغطّي طبقة البيانات وحدها.</w:t>
       </w:r>
     </w:p>
     <w:p>
@@ -7880,7 +8344,7 @@
           <w:szCs w:val="24"/>
           <w:rtl/>
         </w:rPr>
-        <w:t xml:space="preserve">تعديل رقم 1 — ميزة تغيير الباقة — US-131</w:t>
+        <w:t xml:space="preserve">تعديل رقم 3 — إزالة كارت نسبة الاستجابة من صفحة تقييمات العملاء</w:t>
       </w:r>
     </w:p>
     <w:p>
@@ -8127,7 +8591,7 @@
                 <w:szCs w:val="19"/>
                 <w:rtl/>
               </w:rPr>
-              <w:t xml:space="preserve">9 سبتمبر 2026</w:t>
+              <w:t xml:space="preserve">10 سبتمبر 2026</w:t>
             </w:r>
           </w:p>
         </w:tc>
@@ -8157,7 +8621,7 @@
                 <w:szCs w:val="19"/>
                 <w:rtl/>
               </w:rPr>
-              <w:t xml:space="preserve">الاشتراك</w:t>
+              <w:t xml:space="preserve">تقييمات العملاء</w:t>
             </w:r>
           </w:p>
         </w:tc>
@@ -8187,7 +8651,7 @@
                 <w:szCs w:val="19"/>
                 <w:rtl/>
               </w:rPr>
-              <w:t xml:space="preserve">/subscribe</w:t>
+              <w:t xml:space="preserve">/rating</w:t>
             </w:r>
           </w:p>
         </w:tc>
@@ -8217,7 +8681,7 @@
                 <w:szCs w:val="19"/>
                 <w:rtl/>
               </w:rPr>
-              <w:t xml:space="preserve">src/pages/Subscribe.tsx</w:t>
+              <w:t xml:space="preserve">src/pages/CustomerRatings.tsx</w:t>
             </w:r>
           </w:p>
         </w:tc>
@@ -8247,7 +8711,7 @@
                 <w:szCs w:val="19"/>
                 <w:rtl/>
               </w:rPr>
-              <w:t xml:space="preserve">be5b3c0 · c49b797</w:t>
+              <w:t xml:space="preserve">cc8bd4f</w:t>
             </w:r>
           </w:p>
         </w:tc>
@@ -8308,7 +8772,7 @@
           <w:szCs w:val="21"/>
           <w:rtl/>
         </w:rPr>
-        <w:t xml:space="preserve">إعادة بناء شبه كاملة للصفحة — 715 سطراً متغيّراً.</w:t>
+        <w:t xml:space="preserve">حُذف كارت «نسبة الاستجابة» بالكامل من شريط الإحصائيات — صارت 3 كروت بدل 4.</w:t>
       </w:r>
     </w:p>
     <w:p>
@@ -8330,7 +8794,7 @@
           <w:szCs w:val="21"/>
           <w:rtl/>
         </w:rPr>
-        <w:t xml:space="preserve">اختيار الباقة صار بشريط تمرير (slider) حسب عدد المحادثات الشهرية بدل شبكة الكروت. كل باقة نقطة توقف على الشريط، وباقة المؤسسات هي النقطة الأخيرة بعنوان «غير محدود».</w:t>
+        <w:t xml:space="preserve">حُذف معه حساب responseRate لأنه لم يعد له مستهلك في الصفحة.</w:t>
       </w:r>
     </w:p>
     <w:p>
@@ -8352,7 +8816,7 @@
           <w:szCs w:val="21"/>
           <w:rtl/>
         </w:rPr>
-        <w:t xml:space="preserve">مسار من ست خطوات: اختيار الباقة، ثم تأكيد التخفيض، ثم الدفع، ثم المعالجة، ثم النجاح أو الفشل.</w:t>
+        <w:t xml:space="preserve">حُذف استيراد أيقونة TrendingUp لأنها كانت مستخدمة في هذا الكارت وحده.</w:t>
       </w:r>
     </w:p>
     <w:p>
@@ -8374,7 +8838,7 @@
           <w:szCs w:val="21"/>
           <w:rtl/>
         </w:rPr>
-        <w:t xml:space="preserve">احتساب تناسبي للترقية: يُحصَّل فرق السعر عن الأيام المتبقية من الدورة الحالية فقط، ويظهر المبلغ مفصّلاً في ملخص الدفع.</w:t>
+        <w:t xml:space="preserve">عُدّلت شبكة العرض من grid-cols-2 lg:grid-cols-4 إلى grid-cols-1 sm:grid-cols-3، حتى لا يبقى كارت يتيم في سطر منفصل على الشاشات الصغيرة.</w:t>
       </w:r>
     </w:p>
     <w:p>
@@ -8396,8 +8860,439 @@
           <w:szCs w:val="21"/>
           <w:rtl/>
         </w:rPr>
-        <w:t xml:space="preserve">التخفيض له شاشة تأكيد مستقلة ولا يذهب مباشرة إلى الدفع.</w:t>
-      </w:r>
+        <w:t xml:space="preserve">الكروت الباقية: متوسط تقييم المحادثة، متوسط تقييم الموظفين، إجمالي الروابط.</w:t>
+      </w:r>
+    </w:p>
+    <w:p>
+      <w:pPr>
+        <w:spacing w:after="160"/>
+      </w:pPr>
+    </w:p>
+    <w:p>
+      <w:pPr>
+        <w:pStyle w:val="Heading2"/>
+        <w:bidi/>
+        <w:spacing w:after="120" w:before="300"/>
+        <w:jc w:val="right"/>
+      </w:pPr>
+      <w:r>
+        <w:rPr>
+          <w:rFonts w:ascii="Arial" w:cs="Arial" w:eastAsia="Arial" w:hAnsi="Arial"/>
+          <w:b/>
+          <w:bCs/>
+          <w:color w:val="1E293B"/>
+          <w:sz w:val="24"/>
+          <w:szCs w:val="24"/>
+          <w:rtl/>
+        </w:rPr>
+        <w:t xml:space="preserve">تعديل رقم 2 — تغيير تسمية زر الترقية في صفحة الفوترة</w:t>
+      </w:r>
+    </w:p>
+    <w:p>
+      <w:pPr>
+        <w:spacing w:after="50"/>
+      </w:pPr>
+    </w:p>
+    <w:tbl>
+      <w:tblPr>
+        <w:bidiVisual/>
+        <w:tblW w:type="dxa" w:w="9000"/>
+        <w:tblBorders>
+          <w:top w:val="single" w:color="CBD5E1" w:sz="4"/>
+          <w:left w:val="single" w:color="CBD5E1" w:sz="4"/>
+          <w:bottom w:val="single" w:color="CBD5E1" w:sz="4"/>
+          <w:right w:val="single" w:color="CBD5E1" w:sz="4"/>
+          <w:insideH w:val="single" w:color="CBD5E1" w:sz="4"/>
+          <w:insideV w:val="single" w:color="CBD5E1" w:sz="4"/>
+        </w:tblBorders>
+      </w:tblPr>
+      <w:tblGrid>
+        <w:gridCol w:w="1250"/>
+        <w:gridCol w:w="1250"/>
+        <w:gridCol w:w="1150"/>
+        <w:gridCol w:w="2500"/>
+        <w:gridCol w:w="1350"/>
+        <w:gridCol w:w="1500"/>
+      </w:tblGrid>
+      <w:tr>
+        <w:trPr>
+          <w:tblHeader/>
+        </w:trPr>
+        <w:tc>
+          <w:tcPr>
+            <w:tcW w:type="dxa" w:w="1250"/>
+            <w:shd w:fill="2563EB" w:color="auto" w:val="clear"/>
+            <w:tcMar>
+              <w:top w:type="dxa" w:w="90"/>
+              <w:left w:type="dxa" w:w="110"/>
+              <w:bottom w:type="dxa" w:w="90"/>
+              <w:right w:type="dxa" w:w="110"/>
+            </w:tcMar>
+          </w:tcPr>
+          <w:p>
+            <w:pPr>
+              <w:bidi/>
+              <w:spacing w:after="0" w:line="280"/>
+              <w:jc w:val="right"/>
+            </w:pPr>
+            <w:r>
+              <w:rPr>
+                <w:rFonts w:ascii="Arial" w:cs="Arial" w:eastAsia="Arial" w:hAnsi="Arial"/>
+                <w:b/>
+                <w:bCs/>
+                <w:color w:val="FFFFFF"/>
+                <w:sz w:val="19"/>
+                <w:szCs w:val="19"/>
+                <w:rtl/>
+              </w:rPr>
+              <w:t xml:space="preserve">التاريخ</w:t>
+            </w:r>
+          </w:p>
+        </w:tc>
+        <w:tc>
+          <w:tcPr>
+            <w:tcW w:type="dxa" w:w="1250"/>
+            <w:shd w:fill="2563EB" w:color="auto" w:val="clear"/>
+            <w:tcMar>
+              <w:top w:type="dxa" w:w="90"/>
+              <w:left w:type="dxa" w:w="110"/>
+              <w:bottom w:type="dxa" w:w="90"/>
+              <w:right w:type="dxa" w:w="110"/>
+            </w:tcMar>
+          </w:tcPr>
+          <w:p>
+            <w:pPr>
+              <w:bidi/>
+              <w:spacing w:after="0" w:line="280"/>
+              <w:jc w:val="right"/>
+            </w:pPr>
+            <w:r>
+              <w:rPr>
+                <w:rFonts w:ascii="Arial" w:cs="Arial" w:eastAsia="Arial" w:hAnsi="Arial"/>
+                <w:b/>
+                <w:bCs/>
+                <w:color w:val="FFFFFF"/>
+                <w:sz w:val="19"/>
+                <w:szCs w:val="19"/>
+                <w:rtl/>
+              </w:rPr>
+              <w:t xml:space="preserve">الصفحة</w:t>
+            </w:r>
+          </w:p>
+        </w:tc>
+        <w:tc>
+          <w:tcPr>
+            <w:tcW w:type="dxa" w:w="1150"/>
+            <w:shd w:fill="2563EB" w:color="auto" w:val="clear"/>
+            <w:tcMar>
+              <w:top w:type="dxa" w:w="90"/>
+              <w:left w:type="dxa" w:w="110"/>
+              <w:bottom w:type="dxa" w:w="90"/>
+              <w:right w:type="dxa" w:w="110"/>
+            </w:tcMar>
+          </w:tcPr>
+          <w:p>
+            <w:pPr>
+              <w:bidi/>
+              <w:spacing w:after="0" w:line="280"/>
+              <w:jc w:val="right"/>
+            </w:pPr>
+            <w:r>
+              <w:rPr>
+                <w:rFonts w:ascii="Arial" w:cs="Arial" w:eastAsia="Arial" w:hAnsi="Arial"/>
+                <w:b/>
+                <w:bCs/>
+                <w:color w:val="FFFFFF"/>
+                <w:sz w:val="19"/>
+                <w:szCs w:val="19"/>
+                <w:rtl/>
+              </w:rPr>
+              <w:t xml:space="preserve">المسار</w:t>
+            </w:r>
+          </w:p>
+        </w:tc>
+        <w:tc>
+          <w:tcPr>
+            <w:tcW w:type="dxa" w:w="2500"/>
+            <w:shd w:fill="2563EB" w:color="auto" w:val="clear"/>
+            <w:tcMar>
+              <w:top w:type="dxa" w:w="90"/>
+              <w:left w:type="dxa" w:w="110"/>
+              <w:bottom w:type="dxa" w:w="90"/>
+              <w:right w:type="dxa" w:w="110"/>
+            </w:tcMar>
+          </w:tcPr>
+          <w:p>
+            <w:pPr>
+              <w:bidi/>
+              <w:spacing w:after="0" w:line="280"/>
+              <w:jc w:val="right"/>
+            </w:pPr>
+            <w:r>
+              <w:rPr>
+                <w:rFonts w:ascii="Arial" w:cs="Arial" w:eastAsia="Arial" w:hAnsi="Arial"/>
+                <w:b/>
+                <w:bCs/>
+                <w:color w:val="FFFFFF"/>
+                <w:sz w:val="19"/>
+                <w:szCs w:val="19"/>
+                <w:rtl/>
+              </w:rPr>
+              <w:t xml:space="preserve">الملف</w:t>
+            </w:r>
+          </w:p>
+        </w:tc>
+        <w:tc>
+          <w:tcPr>
+            <w:tcW w:type="dxa" w:w="1350"/>
+            <w:shd w:fill="2563EB" w:color="auto" w:val="clear"/>
+            <w:tcMar>
+              <w:top w:type="dxa" w:w="90"/>
+              <w:left w:type="dxa" w:w="110"/>
+              <w:bottom w:type="dxa" w:w="90"/>
+              <w:right w:type="dxa" w:w="110"/>
+            </w:tcMar>
+          </w:tcPr>
+          <w:p>
+            <w:pPr>
+              <w:bidi/>
+              <w:spacing w:after="0" w:line="280"/>
+              <w:jc w:val="right"/>
+            </w:pPr>
+            <w:r>
+              <w:rPr>
+                <w:rFonts w:ascii="Arial" w:cs="Arial" w:eastAsia="Arial" w:hAnsi="Arial"/>
+                <w:b/>
+                <w:bCs/>
+                <w:color w:val="FFFFFF"/>
+                <w:sz w:val="19"/>
+                <w:szCs w:val="19"/>
+                <w:rtl/>
+              </w:rPr>
+              <w:t xml:space="preserve">الكوميت</w:t>
+            </w:r>
+          </w:p>
+        </w:tc>
+        <w:tc>
+          <w:tcPr>
+            <w:tcW w:type="dxa" w:w="1500"/>
+            <w:shd w:fill="2563EB" w:color="auto" w:val="clear"/>
+            <w:tcMar>
+              <w:top w:type="dxa" w:w="90"/>
+              <w:left w:type="dxa" w:w="110"/>
+              <w:bottom w:type="dxa" w:w="90"/>
+              <w:right w:type="dxa" w:w="110"/>
+            </w:tcMar>
+          </w:tcPr>
+          <w:p>
+            <w:pPr>
+              <w:bidi/>
+              <w:spacing w:after="0" w:line="280"/>
+              <w:jc w:val="right"/>
+            </w:pPr>
+            <w:r>
+              <w:rPr>
+                <w:rFonts w:ascii="Arial" w:cs="Arial" w:eastAsia="Arial" w:hAnsi="Arial"/>
+                <w:b/>
+                <w:bCs/>
+                <w:color w:val="FFFFFF"/>
+                <w:sz w:val="19"/>
+                <w:szCs w:val="19"/>
+                <w:rtl/>
+              </w:rPr>
+              <w:t xml:space="preserve">الحالة</w:t>
+            </w:r>
+          </w:p>
+        </w:tc>
+      </w:tr>
+      <w:tr>
+        <w:tc>
+          <w:tcPr>
+            <w:tcW w:type="dxa" w:w="1250"/>
+            <w:tcMar>
+              <w:top w:type="dxa" w:w="90"/>
+              <w:left w:type="dxa" w:w="110"/>
+              <w:bottom w:type="dxa" w:w="90"/>
+              <w:right w:type="dxa" w:w="110"/>
+            </w:tcMar>
+          </w:tcPr>
+          <w:p>
+            <w:pPr>
+              <w:bidi/>
+              <w:spacing w:after="0" w:line="280"/>
+              <w:jc w:val="right"/>
+            </w:pPr>
+            <w:r>
+              <w:rPr>
+                <w:rFonts w:ascii="Arial" w:cs="Arial" w:eastAsia="Arial" w:hAnsi="Arial"/>
+                <w:b w:val="false"/>
+                <w:bCs w:val="false"/>
+                <w:color w:val="1E293B"/>
+                <w:sz w:val="19"/>
+                <w:szCs w:val="19"/>
+                <w:rtl/>
+              </w:rPr>
+              <w:t xml:space="preserve">9 سبتمبر 2026</w:t>
+            </w:r>
+          </w:p>
+        </w:tc>
+        <w:tc>
+          <w:tcPr>
+            <w:tcW w:type="dxa" w:w="1250"/>
+            <w:tcMar>
+              <w:top w:type="dxa" w:w="90"/>
+              <w:left w:type="dxa" w:w="110"/>
+              <w:bottom w:type="dxa" w:w="90"/>
+              <w:right w:type="dxa" w:w="110"/>
+            </w:tcMar>
+          </w:tcPr>
+          <w:p>
+            <w:pPr>
+              <w:bidi/>
+              <w:spacing w:after="0" w:line="280"/>
+              <w:jc w:val="right"/>
+            </w:pPr>
+            <w:r>
+              <w:rPr>
+                <w:rFonts w:ascii="Arial" w:cs="Arial" w:eastAsia="Arial" w:hAnsi="Arial"/>
+                <w:b w:val="false"/>
+                <w:bCs w:val="false"/>
+                <w:color w:val="1E293B"/>
+                <w:sz w:val="19"/>
+                <w:szCs w:val="19"/>
+                <w:rtl/>
+              </w:rPr>
+              <w:t xml:space="preserve">الفوترة</w:t>
+            </w:r>
+          </w:p>
+        </w:tc>
+        <w:tc>
+          <w:tcPr>
+            <w:tcW w:type="dxa" w:w="1150"/>
+            <w:tcMar>
+              <w:top w:type="dxa" w:w="90"/>
+              <w:left w:type="dxa" w:w="110"/>
+              <w:bottom w:type="dxa" w:w="90"/>
+              <w:right w:type="dxa" w:w="110"/>
+            </w:tcMar>
+          </w:tcPr>
+          <w:p>
+            <w:pPr>
+              <w:bidi/>
+              <w:spacing w:after="0" w:line="280"/>
+              <w:jc w:val="right"/>
+            </w:pPr>
+            <w:r>
+              <w:rPr>
+                <w:rFonts w:ascii="Arial" w:cs="Arial" w:eastAsia="Arial" w:hAnsi="Arial"/>
+                <w:b w:val="false"/>
+                <w:bCs w:val="false"/>
+                <w:color w:val="1E293B"/>
+                <w:sz w:val="19"/>
+                <w:szCs w:val="19"/>
+                <w:rtl/>
+              </w:rPr>
+              <w:t xml:space="preserve">/billing</w:t>
+            </w:r>
+          </w:p>
+        </w:tc>
+        <w:tc>
+          <w:tcPr>
+            <w:tcW w:type="dxa" w:w="2500"/>
+            <w:tcMar>
+              <w:top w:type="dxa" w:w="90"/>
+              <w:left w:type="dxa" w:w="110"/>
+              <w:bottom w:type="dxa" w:w="90"/>
+              <w:right w:type="dxa" w:w="110"/>
+            </w:tcMar>
+          </w:tcPr>
+          <w:p>
+            <w:pPr>
+              <w:bidi/>
+              <w:spacing w:after="0" w:line="280"/>
+              <w:jc w:val="right"/>
+            </w:pPr>
+            <w:r>
+              <w:rPr>
+                <w:rFonts w:ascii="Arial" w:cs="Arial" w:eastAsia="Arial" w:hAnsi="Arial"/>
+                <w:b w:val="false"/>
+                <w:bCs w:val="false"/>
+                <w:color w:val="1E293B"/>
+                <w:sz w:val="19"/>
+                <w:szCs w:val="19"/>
+                <w:rtl/>
+              </w:rPr>
+              <w:t xml:space="preserve">src/pages/Billing.tsx</w:t>
+            </w:r>
+          </w:p>
+        </w:tc>
+        <w:tc>
+          <w:tcPr>
+            <w:tcW w:type="dxa" w:w="1350"/>
+            <w:tcMar>
+              <w:top w:type="dxa" w:w="90"/>
+              <w:left w:type="dxa" w:w="110"/>
+              <w:bottom w:type="dxa" w:w="90"/>
+              <w:right w:type="dxa" w:w="110"/>
+            </w:tcMar>
+          </w:tcPr>
+          <w:p>
+            <w:pPr>
+              <w:bidi/>
+              <w:spacing w:after="0" w:line="280"/>
+              <w:jc w:val="right"/>
+            </w:pPr>
+            <w:r>
+              <w:rPr>
+                <w:rFonts w:ascii="Arial" w:cs="Arial" w:eastAsia="Arial" w:hAnsi="Arial"/>
+                <w:b w:val="false"/>
+                <w:bCs w:val="false"/>
+                <w:color w:val="1E293B"/>
+                <w:sz w:val="19"/>
+                <w:szCs w:val="19"/>
+                <w:rtl/>
+              </w:rPr>
+              <w:t xml:space="preserve">be5b3c0</w:t>
+            </w:r>
+          </w:p>
+        </w:tc>
+        <w:tc>
+          <w:tcPr>
+            <w:tcW w:type="dxa" w:w="1500"/>
+            <w:shd w:fill="ECFDF5" w:color="auto" w:val="clear"/>
+            <w:tcMar>
+              <w:top w:type="dxa" w:w="90"/>
+              <w:left w:type="dxa" w:w="110"/>
+              <w:bottom w:type="dxa" w:w="90"/>
+              <w:right w:type="dxa" w:w="110"/>
+            </w:tcMar>
+          </w:tcPr>
+          <w:p>
+            <w:pPr>
+              <w:bidi/>
+              <w:spacing w:after="0" w:line="280"/>
+              <w:jc w:val="right"/>
+            </w:pPr>
+            <w:r>
+              <w:rPr>
+                <w:rFonts w:ascii="Arial" w:cs="Arial" w:eastAsia="Arial" w:hAnsi="Arial"/>
+                <w:b/>
+                <w:bCs/>
+                <w:color w:val="15803D"/>
+                <w:sz w:val="19"/>
+                <w:szCs w:val="19"/>
+                <w:rtl/>
+              </w:rPr>
+              <w:t xml:space="preserve">منشور على الإنتاج</w:t>
+            </w:r>
+          </w:p>
+        </w:tc>
+      </w:tr>
+    </w:tbl>
+    <w:p>
+      <w:pPr>
+        <w:spacing w:after="90"/>
+      </w:pPr>
     </w:p>
     <w:p>
       <w:pPr>
@@ -8418,7 +9313,7 @@
           <w:szCs w:val="21"/>
           <w:rtl/>
         </w:rPr>
-        <w:t xml:space="preserve">دورة الفوترة تُقرأ من اشتراك العميل الحالي بدل أن تبدأ بقيمة ثابتة.</w:t>
+        <w:t xml:space="preserve">زر «ترقية» أصبح «تغيير الباقة».</w:t>
       </w:r>
     </w:p>
     <w:p>
@@ -8440,6 +9335,591 @@
           <w:szCs w:val="21"/>
           <w:rtl/>
         </w:rPr>
+        <w:t xml:space="preserve">سبب التغيير: الزر يوصّل إلى مسار يشمل الترقية والتخفيض معاً، فالتسمية القديمة كانت تصف نصف وظيفته.</w:t>
+      </w:r>
+    </w:p>
+    <w:p>
+      <w:pPr>
+        <w:spacing w:after="160"/>
+      </w:pPr>
+    </w:p>
+    <w:p>
+      <w:pPr>
+        <w:pStyle w:val="Heading2"/>
+        <w:bidi/>
+        <w:spacing w:after="120" w:before="300"/>
+        <w:jc w:val="right"/>
+      </w:pPr>
+      <w:r>
+        <w:rPr>
+          <w:rFonts w:ascii="Arial" w:cs="Arial" w:eastAsia="Arial" w:hAnsi="Arial"/>
+          <w:b/>
+          <w:bCs/>
+          <w:color w:val="1E293B"/>
+          <w:sz w:val="24"/>
+          <w:szCs w:val="24"/>
+          <w:rtl/>
+        </w:rPr>
+        <w:t xml:space="preserve">تعديل رقم 1 — ميزة تغيير الباقة — US-131</w:t>
+      </w:r>
+    </w:p>
+    <w:p>
+      <w:pPr>
+        <w:spacing w:after="50"/>
+      </w:pPr>
+    </w:p>
+    <w:tbl>
+      <w:tblPr>
+        <w:bidiVisual/>
+        <w:tblW w:type="dxa" w:w="9000"/>
+        <w:tblBorders>
+          <w:top w:val="single" w:color="CBD5E1" w:sz="4"/>
+          <w:left w:val="single" w:color="CBD5E1" w:sz="4"/>
+          <w:bottom w:val="single" w:color="CBD5E1" w:sz="4"/>
+          <w:right w:val="single" w:color="CBD5E1" w:sz="4"/>
+          <w:insideH w:val="single" w:color="CBD5E1" w:sz="4"/>
+          <w:insideV w:val="single" w:color="CBD5E1" w:sz="4"/>
+        </w:tblBorders>
+      </w:tblPr>
+      <w:tblGrid>
+        <w:gridCol w:w="1250"/>
+        <w:gridCol w:w="1250"/>
+        <w:gridCol w:w="1150"/>
+        <w:gridCol w:w="2500"/>
+        <w:gridCol w:w="1350"/>
+        <w:gridCol w:w="1500"/>
+      </w:tblGrid>
+      <w:tr>
+        <w:trPr>
+          <w:tblHeader/>
+        </w:trPr>
+        <w:tc>
+          <w:tcPr>
+            <w:tcW w:type="dxa" w:w="1250"/>
+            <w:shd w:fill="2563EB" w:color="auto" w:val="clear"/>
+            <w:tcMar>
+              <w:top w:type="dxa" w:w="90"/>
+              <w:left w:type="dxa" w:w="110"/>
+              <w:bottom w:type="dxa" w:w="90"/>
+              <w:right w:type="dxa" w:w="110"/>
+            </w:tcMar>
+          </w:tcPr>
+          <w:p>
+            <w:pPr>
+              <w:bidi/>
+              <w:spacing w:after="0" w:line="280"/>
+              <w:jc w:val="right"/>
+            </w:pPr>
+            <w:r>
+              <w:rPr>
+                <w:rFonts w:ascii="Arial" w:cs="Arial" w:eastAsia="Arial" w:hAnsi="Arial"/>
+                <w:b/>
+                <w:bCs/>
+                <w:color w:val="FFFFFF"/>
+                <w:sz w:val="19"/>
+                <w:szCs w:val="19"/>
+                <w:rtl/>
+              </w:rPr>
+              <w:t xml:space="preserve">التاريخ</w:t>
+            </w:r>
+          </w:p>
+        </w:tc>
+        <w:tc>
+          <w:tcPr>
+            <w:tcW w:type="dxa" w:w="1250"/>
+            <w:shd w:fill="2563EB" w:color="auto" w:val="clear"/>
+            <w:tcMar>
+              <w:top w:type="dxa" w:w="90"/>
+              <w:left w:type="dxa" w:w="110"/>
+              <w:bottom w:type="dxa" w:w="90"/>
+              <w:right w:type="dxa" w:w="110"/>
+            </w:tcMar>
+          </w:tcPr>
+          <w:p>
+            <w:pPr>
+              <w:bidi/>
+              <w:spacing w:after="0" w:line="280"/>
+              <w:jc w:val="right"/>
+            </w:pPr>
+            <w:r>
+              <w:rPr>
+                <w:rFonts w:ascii="Arial" w:cs="Arial" w:eastAsia="Arial" w:hAnsi="Arial"/>
+                <w:b/>
+                <w:bCs/>
+                <w:color w:val="FFFFFF"/>
+                <w:sz w:val="19"/>
+                <w:szCs w:val="19"/>
+                <w:rtl/>
+              </w:rPr>
+              <w:t xml:space="preserve">الصفحة</w:t>
+            </w:r>
+          </w:p>
+        </w:tc>
+        <w:tc>
+          <w:tcPr>
+            <w:tcW w:type="dxa" w:w="1150"/>
+            <w:shd w:fill="2563EB" w:color="auto" w:val="clear"/>
+            <w:tcMar>
+              <w:top w:type="dxa" w:w="90"/>
+              <w:left w:type="dxa" w:w="110"/>
+              <w:bottom w:type="dxa" w:w="90"/>
+              <w:right w:type="dxa" w:w="110"/>
+            </w:tcMar>
+          </w:tcPr>
+          <w:p>
+            <w:pPr>
+              <w:bidi/>
+              <w:spacing w:after="0" w:line="280"/>
+              <w:jc w:val="right"/>
+            </w:pPr>
+            <w:r>
+              <w:rPr>
+                <w:rFonts w:ascii="Arial" w:cs="Arial" w:eastAsia="Arial" w:hAnsi="Arial"/>
+                <w:b/>
+                <w:bCs/>
+                <w:color w:val="FFFFFF"/>
+                <w:sz w:val="19"/>
+                <w:szCs w:val="19"/>
+                <w:rtl/>
+              </w:rPr>
+              <w:t xml:space="preserve">المسار</w:t>
+            </w:r>
+          </w:p>
+        </w:tc>
+        <w:tc>
+          <w:tcPr>
+            <w:tcW w:type="dxa" w:w="2500"/>
+            <w:shd w:fill="2563EB" w:color="auto" w:val="clear"/>
+            <w:tcMar>
+              <w:top w:type="dxa" w:w="90"/>
+              <w:left w:type="dxa" w:w="110"/>
+              <w:bottom w:type="dxa" w:w="90"/>
+              <w:right w:type="dxa" w:w="110"/>
+            </w:tcMar>
+          </w:tcPr>
+          <w:p>
+            <w:pPr>
+              <w:bidi/>
+              <w:spacing w:after="0" w:line="280"/>
+              <w:jc w:val="right"/>
+            </w:pPr>
+            <w:r>
+              <w:rPr>
+                <w:rFonts w:ascii="Arial" w:cs="Arial" w:eastAsia="Arial" w:hAnsi="Arial"/>
+                <w:b/>
+                <w:bCs/>
+                <w:color w:val="FFFFFF"/>
+                <w:sz w:val="19"/>
+                <w:szCs w:val="19"/>
+                <w:rtl/>
+              </w:rPr>
+              <w:t xml:space="preserve">الملف</w:t>
+            </w:r>
+          </w:p>
+        </w:tc>
+        <w:tc>
+          <w:tcPr>
+            <w:tcW w:type="dxa" w:w="1350"/>
+            <w:shd w:fill="2563EB" w:color="auto" w:val="clear"/>
+            <w:tcMar>
+              <w:top w:type="dxa" w:w="90"/>
+              <w:left w:type="dxa" w:w="110"/>
+              <w:bottom w:type="dxa" w:w="90"/>
+              <w:right w:type="dxa" w:w="110"/>
+            </w:tcMar>
+          </w:tcPr>
+          <w:p>
+            <w:pPr>
+              <w:bidi/>
+              <w:spacing w:after="0" w:line="280"/>
+              <w:jc w:val="right"/>
+            </w:pPr>
+            <w:r>
+              <w:rPr>
+                <w:rFonts w:ascii="Arial" w:cs="Arial" w:eastAsia="Arial" w:hAnsi="Arial"/>
+                <w:b/>
+                <w:bCs/>
+                <w:color w:val="FFFFFF"/>
+                <w:sz w:val="19"/>
+                <w:szCs w:val="19"/>
+                <w:rtl/>
+              </w:rPr>
+              <w:t xml:space="preserve">الكوميت</w:t>
+            </w:r>
+          </w:p>
+        </w:tc>
+        <w:tc>
+          <w:tcPr>
+            <w:tcW w:type="dxa" w:w="1500"/>
+            <w:shd w:fill="2563EB" w:color="auto" w:val="clear"/>
+            <w:tcMar>
+              <w:top w:type="dxa" w:w="90"/>
+              <w:left w:type="dxa" w:w="110"/>
+              <w:bottom w:type="dxa" w:w="90"/>
+              <w:right w:type="dxa" w:w="110"/>
+            </w:tcMar>
+          </w:tcPr>
+          <w:p>
+            <w:pPr>
+              <w:bidi/>
+              <w:spacing w:after="0" w:line="280"/>
+              <w:jc w:val="right"/>
+            </w:pPr>
+            <w:r>
+              <w:rPr>
+                <w:rFonts w:ascii="Arial" w:cs="Arial" w:eastAsia="Arial" w:hAnsi="Arial"/>
+                <w:b/>
+                <w:bCs/>
+                <w:color w:val="FFFFFF"/>
+                <w:sz w:val="19"/>
+                <w:szCs w:val="19"/>
+                <w:rtl/>
+              </w:rPr>
+              <w:t xml:space="preserve">الحالة</w:t>
+            </w:r>
+          </w:p>
+        </w:tc>
+      </w:tr>
+      <w:tr>
+        <w:tc>
+          <w:tcPr>
+            <w:tcW w:type="dxa" w:w="1250"/>
+            <w:tcMar>
+              <w:top w:type="dxa" w:w="90"/>
+              <w:left w:type="dxa" w:w="110"/>
+              <w:bottom w:type="dxa" w:w="90"/>
+              <w:right w:type="dxa" w:w="110"/>
+            </w:tcMar>
+          </w:tcPr>
+          <w:p>
+            <w:pPr>
+              <w:bidi/>
+              <w:spacing w:after="0" w:line="280"/>
+              <w:jc w:val="right"/>
+            </w:pPr>
+            <w:r>
+              <w:rPr>
+                <w:rFonts w:ascii="Arial" w:cs="Arial" w:eastAsia="Arial" w:hAnsi="Arial"/>
+                <w:b w:val="false"/>
+                <w:bCs w:val="false"/>
+                <w:color w:val="1E293B"/>
+                <w:sz w:val="19"/>
+                <w:szCs w:val="19"/>
+                <w:rtl/>
+              </w:rPr>
+              <w:t xml:space="preserve">9 سبتمبر 2026</w:t>
+            </w:r>
+          </w:p>
+        </w:tc>
+        <w:tc>
+          <w:tcPr>
+            <w:tcW w:type="dxa" w:w="1250"/>
+            <w:tcMar>
+              <w:top w:type="dxa" w:w="90"/>
+              <w:left w:type="dxa" w:w="110"/>
+              <w:bottom w:type="dxa" w:w="90"/>
+              <w:right w:type="dxa" w:w="110"/>
+            </w:tcMar>
+          </w:tcPr>
+          <w:p>
+            <w:pPr>
+              <w:bidi/>
+              <w:spacing w:after="0" w:line="280"/>
+              <w:jc w:val="right"/>
+            </w:pPr>
+            <w:r>
+              <w:rPr>
+                <w:rFonts w:ascii="Arial" w:cs="Arial" w:eastAsia="Arial" w:hAnsi="Arial"/>
+                <w:b w:val="false"/>
+                <w:bCs w:val="false"/>
+                <w:color w:val="1E293B"/>
+                <w:sz w:val="19"/>
+                <w:szCs w:val="19"/>
+                <w:rtl/>
+              </w:rPr>
+              <w:t xml:space="preserve">الاشتراك</w:t>
+            </w:r>
+          </w:p>
+        </w:tc>
+        <w:tc>
+          <w:tcPr>
+            <w:tcW w:type="dxa" w:w="1150"/>
+            <w:tcMar>
+              <w:top w:type="dxa" w:w="90"/>
+              <w:left w:type="dxa" w:w="110"/>
+              <w:bottom w:type="dxa" w:w="90"/>
+              <w:right w:type="dxa" w:w="110"/>
+            </w:tcMar>
+          </w:tcPr>
+          <w:p>
+            <w:pPr>
+              <w:bidi/>
+              <w:spacing w:after="0" w:line="280"/>
+              <w:jc w:val="right"/>
+            </w:pPr>
+            <w:r>
+              <w:rPr>
+                <w:rFonts w:ascii="Arial" w:cs="Arial" w:eastAsia="Arial" w:hAnsi="Arial"/>
+                <w:b w:val="false"/>
+                <w:bCs w:val="false"/>
+                <w:color w:val="1E293B"/>
+                <w:sz w:val="19"/>
+                <w:szCs w:val="19"/>
+                <w:rtl/>
+              </w:rPr>
+              <w:t xml:space="preserve">/subscribe</w:t>
+            </w:r>
+          </w:p>
+        </w:tc>
+        <w:tc>
+          <w:tcPr>
+            <w:tcW w:type="dxa" w:w="2500"/>
+            <w:tcMar>
+              <w:top w:type="dxa" w:w="90"/>
+              <w:left w:type="dxa" w:w="110"/>
+              <w:bottom w:type="dxa" w:w="90"/>
+              <w:right w:type="dxa" w:w="110"/>
+            </w:tcMar>
+          </w:tcPr>
+          <w:p>
+            <w:pPr>
+              <w:bidi/>
+              <w:spacing w:after="0" w:line="280"/>
+              <w:jc w:val="right"/>
+            </w:pPr>
+            <w:r>
+              <w:rPr>
+                <w:rFonts w:ascii="Arial" w:cs="Arial" w:eastAsia="Arial" w:hAnsi="Arial"/>
+                <w:b w:val="false"/>
+                <w:bCs w:val="false"/>
+                <w:color w:val="1E293B"/>
+                <w:sz w:val="19"/>
+                <w:szCs w:val="19"/>
+                <w:rtl/>
+              </w:rPr>
+              <w:t xml:space="preserve">src/pages/Subscribe.tsx</w:t>
+            </w:r>
+          </w:p>
+        </w:tc>
+        <w:tc>
+          <w:tcPr>
+            <w:tcW w:type="dxa" w:w="1350"/>
+            <w:tcMar>
+              <w:top w:type="dxa" w:w="90"/>
+              <w:left w:type="dxa" w:w="110"/>
+              <w:bottom w:type="dxa" w:w="90"/>
+              <w:right w:type="dxa" w:w="110"/>
+            </w:tcMar>
+          </w:tcPr>
+          <w:p>
+            <w:pPr>
+              <w:bidi/>
+              <w:spacing w:after="0" w:line="280"/>
+              <w:jc w:val="right"/>
+            </w:pPr>
+            <w:r>
+              <w:rPr>
+                <w:rFonts w:ascii="Arial" w:cs="Arial" w:eastAsia="Arial" w:hAnsi="Arial"/>
+                <w:b w:val="false"/>
+                <w:bCs w:val="false"/>
+                <w:color w:val="1E293B"/>
+                <w:sz w:val="19"/>
+                <w:szCs w:val="19"/>
+                <w:rtl/>
+              </w:rPr>
+              <w:t xml:space="preserve">be5b3c0 · c49b797</w:t>
+            </w:r>
+          </w:p>
+        </w:tc>
+        <w:tc>
+          <w:tcPr>
+            <w:tcW w:type="dxa" w:w="1500"/>
+            <w:shd w:fill="ECFDF5" w:color="auto" w:val="clear"/>
+            <w:tcMar>
+              <w:top w:type="dxa" w:w="90"/>
+              <w:left w:type="dxa" w:w="110"/>
+              <w:bottom w:type="dxa" w:w="90"/>
+              <w:right w:type="dxa" w:w="110"/>
+            </w:tcMar>
+          </w:tcPr>
+          <w:p>
+            <w:pPr>
+              <w:bidi/>
+              <w:spacing w:after="0" w:line="280"/>
+              <w:jc w:val="right"/>
+            </w:pPr>
+            <w:r>
+              <w:rPr>
+                <w:rFonts w:ascii="Arial" w:cs="Arial" w:eastAsia="Arial" w:hAnsi="Arial"/>
+                <w:b/>
+                <w:bCs/>
+                <w:color w:val="15803D"/>
+                <w:sz w:val="19"/>
+                <w:szCs w:val="19"/>
+                <w:rtl/>
+              </w:rPr>
+              <w:t xml:space="preserve">منشور على الإنتاج</w:t>
+            </w:r>
+          </w:p>
+        </w:tc>
+      </w:tr>
+    </w:tbl>
+    <w:p>
+      <w:pPr>
+        <w:spacing w:after="90"/>
+      </w:pPr>
+    </w:p>
+    <w:p>
+      <w:pPr>
+        <w:pStyle w:val="ListParagraph"/>
+        <w:numPr>
+          <w:ilvl w:val="0"/>
+          <w:numId w:val="2"/>
+        </w:numPr>
+        <w:bidi/>
+        <w:spacing w:after="70" w:line="290"/>
+        <w:jc w:val="right"/>
+      </w:pPr>
+      <w:r>
+        <w:rPr>
+          <w:rFonts w:ascii="Arial" w:cs="Arial" w:eastAsia="Arial" w:hAnsi="Arial"/>
+          <w:color w:val="1E293B"/>
+          <w:sz w:val="21"/>
+          <w:szCs w:val="21"/>
+          <w:rtl/>
+        </w:rPr>
+        <w:t xml:space="preserve">إعادة بناء شبه كاملة للصفحة — 715 سطراً متغيّراً.</w:t>
+      </w:r>
+    </w:p>
+    <w:p>
+      <w:pPr>
+        <w:pStyle w:val="ListParagraph"/>
+        <w:numPr>
+          <w:ilvl w:val="0"/>
+          <w:numId w:val="2"/>
+        </w:numPr>
+        <w:bidi/>
+        <w:spacing w:after="70" w:line="290"/>
+        <w:jc w:val="right"/>
+      </w:pPr>
+      <w:r>
+        <w:rPr>
+          <w:rFonts w:ascii="Arial" w:cs="Arial" w:eastAsia="Arial" w:hAnsi="Arial"/>
+          <w:color w:val="1E293B"/>
+          <w:sz w:val="21"/>
+          <w:szCs w:val="21"/>
+          <w:rtl/>
+        </w:rPr>
+        <w:t xml:space="preserve">اختيار الباقة صار بشريط تمرير (slider) حسب عدد المحادثات الشهرية بدل شبكة الكروت. كل باقة نقطة توقف على الشريط، وباقة المؤسسات هي النقطة الأخيرة بعنوان «غير محدود».</w:t>
+      </w:r>
+    </w:p>
+    <w:p>
+      <w:pPr>
+        <w:pStyle w:val="ListParagraph"/>
+        <w:numPr>
+          <w:ilvl w:val="0"/>
+          <w:numId w:val="2"/>
+        </w:numPr>
+        <w:bidi/>
+        <w:spacing w:after="70" w:line="290"/>
+        <w:jc w:val="right"/>
+      </w:pPr>
+      <w:r>
+        <w:rPr>
+          <w:rFonts w:ascii="Arial" w:cs="Arial" w:eastAsia="Arial" w:hAnsi="Arial"/>
+          <w:color w:val="1E293B"/>
+          <w:sz w:val="21"/>
+          <w:szCs w:val="21"/>
+          <w:rtl/>
+        </w:rPr>
+        <w:t xml:space="preserve">مسار من ست خطوات: اختيار الباقة، ثم تأكيد التخفيض، ثم الدفع، ثم المعالجة، ثم النجاح أو الفشل.</w:t>
+      </w:r>
+    </w:p>
+    <w:p>
+      <w:pPr>
+        <w:pStyle w:val="ListParagraph"/>
+        <w:numPr>
+          <w:ilvl w:val="0"/>
+          <w:numId w:val="2"/>
+        </w:numPr>
+        <w:bidi/>
+        <w:spacing w:after="70" w:line="290"/>
+        <w:jc w:val="right"/>
+      </w:pPr>
+      <w:r>
+        <w:rPr>
+          <w:rFonts w:ascii="Arial" w:cs="Arial" w:eastAsia="Arial" w:hAnsi="Arial"/>
+          <w:color w:val="1E293B"/>
+          <w:sz w:val="21"/>
+          <w:szCs w:val="21"/>
+          <w:rtl/>
+        </w:rPr>
+        <w:t xml:space="preserve">احتساب تناسبي للترقية: يُحصَّل فرق السعر عن الأيام المتبقية من الدورة الحالية فقط، ويظهر المبلغ مفصّلاً في ملخص الدفع.</w:t>
+      </w:r>
+    </w:p>
+    <w:p>
+      <w:pPr>
+        <w:pStyle w:val="ListParagraph"/>
+        <w:numPr>
+          <w:ilvl w:val="0"/>
+          <w:numId w:val="2"/>
+        </w:numPr>
+        <w:bidi/>
+        <w:spacing w:after="70" w:line="290"/>
+        <w:jc w:val="right"/>
+      </w:pPr>
+      <w:r>
+        <w:rPr>
+          <w:rFonts w:ascii="Arial" w:cs="Arial" w:eastAsia="Arial" w:hAnsi="Arial"/>
+          <w:color w:val="1E293B"/>
+          <w:sz w:val="21"/>
+          <w:szCs w:val="21"/>
+          <w:rtl/>
+        </w:rPr>
+        <w:t xml:space="preserve">التخفيض له شاشة تأكيد مستقلة ولا يذهب مباشرة إلى الدفع.</w:t>
+      </w:r>
+    </w:p>
+    <w:p>
+      <w:pPr>
+        <w:pStyle w:val="ListParagraph"/>
+        <w:numPr>
+          <w:ilvl w:val="0"/>
+          <w:numId w:val="2"/>
+        </w:numPr>
+        <w:bidi/>
+        <w:spacing w:after="70" w:line="290"/>
+        <w:jc w:val="right"/>
+      </w:pPr>
+      <w:r>
+        <w:rPr>
+          <w:rFonts w:ascii="Arial" w:cs="Arial" w:eastAsia="Arial" w:hAnsi="Arial"/>
+          <w:color w:val="1E293B"/>
+          <w:sz w:val="21"/>
+          <w:szCs w:val="21"/>
+          <w:rtl/>
+        </w:rPr>
+        <w:t xml:space="preserve">دورة الفوترة تُقرأ من اشتراك العميل الحالي بدل أن تبدأ بقيمة ثابتة.</w:t>
+      </w:r>
+    </w:p>
+    <w:p>
+      <w:pPr>
+        <w:pStyle w:val="ListParagraph"/>
+        <w:numPr>
+          <w:ilvl w:val="0"/>
+          <w:numId w:val="2"/>
+        </w:numPr>
+        <w:bidi/>
+        <w:spacing w:after="70" w:line="290"/>
+        <w:jc w:val="right"/>
+      </w:pPr>
+      <w:r>
+        <w:rPr>
+          <w:rFonts w:ascii="Arial" w:cs="Arial" w:eastAsia="Arial" w:hAnsi="Arial"/>
+          <w:color w:val="1E293B"/>
+          <w:sz w:val="21"/>
+          <w:szCs w:val="21"/>
+          <w:rtl/>
+        </w:rPr>
         <w:t xml:space="preserve">أُصلحت علامات تعارض الدمج (merge conflict markers) التي كانت باقية في الملف — كوميت c49b797.</w:t>
       </w:r>
     </w:p>
@@ -8626,7 +10106,7 @@
           <w:szCs w:val="20"/>
           <w:rtl/>
         </w:rPr>
-        <w:t xml:space="preserve">عدد التعديلات المسجّلة: 10</w:t>
+        <w:t xml:space="preserve">عدد التعديلات المسجّلة: 12</w:t>
       </w:r>
     </w:p>
     <w:sectPr>

</xml_diff>

<commit_message>
deploy build 31b0afbc to production
Publish the two-factor disable check to qhub-client.apexes.click.

First deploy to follow the corrected procedure: all 91 assets uploaded
and diffed against the local build before any HTML was touched (clean),
then all 114 route copies enumerated from the live tree — including the
49 nested ones the old 65-file list left behind — then version.json last.

Record the change in the changelog and point BUILD_LIVE at 31b0afbc.

Co-Authored-By: Claude Opus 5 <noreply@anthropic.com>
Claude-Session: https://claude.ai/code/session_01JGHUnSrtQwLX2BGbB3j6wk
</commit_message>
<xml_diff>
--- a/docs/سجل التعديلات الاخيرة.docx
+++ b/docs/سجل التعديلات الاخيرة.docx
@@ -354,7 +354,7 @@
                 <w:szCs w:val="19"/>
                 <w:rtl/>
               </w:rPr>
-              <w:t xml:space="preserve">12</w:t>
+              <w:t xml:space="preserve">13</w:t>
             </w:r>
           </w:p>
         </w:tc>
@@ -414,7 +414,7 @@
                 <w:szCs w:val="19"/>
                 <w:rtl/>
               </w:rPr>
-              <w:t xml:space="preserve">رمز QR حقيقي قابل للمسح في إعداد المصادقة الثنائية</w:t>
+              <w:t xml:space="preserve">تعطيل المصادقة الثنائية صار يتطلّب كلمة المرور أو رمزاً</w:t>
             </w:r>
           </w:p>
         </w:tc>
@@ -508,7 +508,7 @@
                 <w:szCs w:val="19"/>
                 <w:rtl/>
               </w:rPr>
-              <w:t xml:space="preserve">11</w:t>
+              <w:t xml:space="preserve">12</w:t>
             </w:r>
           </w:p>
         </w:tc>
@@ -570,7 +570,7 @@
                 <w:szCs w:val="19"/>
                 <w:rtl/>
               </w:rPr>
-              <w:t xml:space="preserve">رقم جوال اختياري في الملف الشخصي</w:t>
+              <w:t xml:space="preserve">رمز QR حقيقي قابل للمسح في إعداد المصادقة الثنائية</w:t>
             </w:r>
           </w:p>
         </w:tc>
@@ -601,7 +601,7 @@
                 <w:szCs w:val="19"/>
                 <w:rtl/>
               </w:rPr>
-              <w:t xml:space="preserve">الإعدادات ← الملف الشخصي</w:t>
+              <w:t xml:space="preserve">الإعدادات ← الأمان</w:t>
             </w:r>
           </w:p>
         </w:tc>
@@ -664,7 +664,7 @@
                 <w:szCs w:val="19"/>
                 <w:rtl/>
               </w:rPr>
-              <w:t xml:space="preserve">10</w:t>
+              <w:t xml:space="preserve">11</w:t>
             </w:r>
           </w:p>
         </w:tc>
@@ -724,7 +724,7 @@
                 <w:szCs w:val="19"/>
                 <w:rtl/>
               </w:rPr>
-              <w:t xml:space="preserve">شاشة التحقق بخطوتين في تسجيل الدخول</w:t>
+              <w:t xml:space="preserve">رقم جوال اختياري في الملف الشخصي</w:t>
             </w:r>
           </w:p>
         </w:tc>
@@ -754,7 +754,7 @@
                 <w:szCs w:val="19"/>
                 <w:rtl/>
               </w:rPr>
-              <w:t xml:space="preserve">تسجيل الدخول</w:t>
+              <w:t xml:space="preserve">الإعدادات ← الملف الشخصي</w:t>
             </w:r>
           </w:p>
         </w:tc>
@@ -818,7 +818,7 @@
                 <w:szCs w:val="19"/>
                 <w:rtl/>
               </w:rPr>
-              <w:t xml:space="preserve">9</w:t>
+              <w:t xml:space="preserve">10</w:t>
             </w:r>
           </w:p>
         </w:tc>
@@ -880,7 +880,7 @@
                 <w:szCs w:val="19"/>
                 <w:rtl/>
               </w:rPr>
-              <w:t xml:space="preserve">رقم هاتف اختياري عند دعوة الموظف</w:t>
+              <w:t xml:space="preserve">شاشة التحقق بخطوتين في تسجيل الدخول</w:t>
             </w:r>
           </w:p>
         </w:tc>
@@ -911,7 +911,7 @@
                 <w:szCs w:val="19"/>
                 <w:rtl/>
               </w:rPr>
-              <w:t xml:space="preserve">فريق العمل</w:t>
+              <w:t xml:space="preserve">تسجيل الدخول</w:t>
             </w:r>
           </w:p>
         </w:tc>
@@ -974,7 +974,7 @@
                 <w:szCs w:val="19"/>
                 <w:rtl/>
               </w:rPr>
-              <w:t xml:space="preserve">8</w:t>
+              <w:t xml:space="preserve">9</w:t>
             </w:r>
           </w:p>
         </w:tc>
@@ -1034,7 +1034,7 @@
                 <w:szCs w:val="19"/>
                 <w:rtl/>
               </w:rPr>
-              <w:t xml:space="preserve">فاصل مرقّم بين دورات المحادثة داخل الثريد</w:t>
+              <w:t xml:space="preserve">رقم هاتف اختياري عند دعوة الموظف</w:t>
             </w:r>
           </w:p>
         </w:tc>
@@ -1064,7 +1064,7 @@
                 <w:szCs w:val="19"/>
                 <w:rtl/>
               </w:rPr>
-              <w:t xml:space="preserve">صندوق الوارد</w:t>
+              <w:t xml:space="preserve">فريق العمل</w:t>
             </w:r>
           </w:p>
         </w:tc>
@@ -1128,7 +1128,7 @@
                 <w:szCs w:val="19"/>
                 <w:rtl/>
               </w:rPr>
-              <w:t xml:space="preserve">7</w:t>
+              <w:t xml:space="preserve">8</w:t>
             </w:r>
           </w:p>
         </w:tc>
@@ -1190,7 +1190,7 @@
                 <w:szCs w:val="19"/>
                 <w:rtl/>
               </w:rPr>
-              <w:t xml:space="preserve">انعكاس حالة «مجدولة» للتخفيض المؤجّل في بورتال العميل</w:t>
+              <w:t xml:space="preserve">فاصل مرقّم بين دورات المحادثة داخل الثريد</w:t>
             </w:r>
           </w:p>
         </w:tc>
@@ -1221,7 +1221,7 @@
                 <w:szCs w:val="19"/>
                 <w:rtl/>
               </w:rPr>
-              <w:t xml:space="preserve">الباقات والاشتراك</w:t>
+              <w:t xml:space="preserve">صندوق الوارد</w:t>
             </w:r>
           </w:p>
         </w:tc>
@@ -1284,7 +1284,7 @@
                 <w:szCs w:val="19"/>
                 <w:rtl/>
               </w:rPr>
-              <w:t xml:space="preserve">6</w:t>
+              <w:t xml:space="preserve">7</w:t>
             </w:r>
           </w:p>
         </w:tc>
@@ -1344,7 +1344,7 @@
                 <w:szCs w:val="19"/>
                 <w:rtl/>
               </w:rPr>
-              <w:t xml:space="preserve">إعادة تصميم شريط الفهرسة على هيئة مسطرة تظهر عند الاقتراب</w:t>
+              <w:t xml:space="preserve">انعكاس حالة «مجدولة» للتخفيض المؤجّل في بورتال العميل</w:t>
             </w:r>
           </w:p>
         </w:tc>
@@ -1374,7 +1374,7 @@
                 <w:szCs w:val="19"/>
                 <w:rtl/>
               </w:rPr>
-              <w:t xml:space="preserve">صندوق الوارد</w:t>
+              <w:t xml:space="preserve">الباقات والاشتراك</w:t>
             </w:r>
           </w:p>
         </w:tc>
@@ -1438,7 +1438,7 @@
                 <w:szCs w:val="19"/>
                 <w:rtl/>
               </w:rPr>
-              <w:t xml:space="preserve">5</w:t>
+              <w:t xml:space="preserve">6</w:t>
             </w:r>
           </w:p>
         </w:tc>
@@ -1500,7 +1500,7 @@
                 <w:szCs w:val="19"/>
                 <w:rtl/>
               </w:rPr>
-              <w:t xml:space="preserve">شريط فهرسة دورات المحادثة داخل الثريد</w:t>
+              <w:t xml:space="preserve">إعادة تصميم شريط الفهرسة على هيئة مسطرة تظهر عند الاقتراب</w:t>
             </w:r>
           </w:p>
         </w:tc>
@@ -1594,7 +1594,7 @@
                 <w:szCs w:val="19"/>
                 <w:rtl/>
               </w:rPr>
-              <w:t xml:space="preserve">4</w:t>
+              <w:t xml:space="preserve">5</w:t>
             </w:r>
           </w:p>
         </w:tc>
@@ -1654,7 +1654,7 @@
                 <w:szCs w:val="19"/>
                 <w:rtl/>
               </w:rPr>
-              <w:t xml:space="preserve">تسجيل دورات المحادثة واشتقاقها — أساس شريط فهرسة الثريد</w:t>
+              <w:t xml:space="preserve">شريط فهرسة دورات المحادثة داخل الثريد</w:t>
             </w:r>
           </w:p>
         </w:tc>
@@ -1684,7 +1684,7 @@
                 <w:szCs w:val="19"/>
                 <w:rtl/>
               </w:rPr>
-              <w:t xml:space="preserve">صندوق الوارد (طبقة البيانات)</w:t>
+              <w:t xml:space="preserve">صندوق الوارد</w:t>
             </w:r>
           </w:p>
         </w:tc>
@@ -1748,7 +1748,7 @@
                 <w:szCs w:val="19"/>
                 <w:rtl/>
               </w:rPr>
-              <w:t xml:space="preserve">3</w:t>
+              <w:t xml:space="preserve">4</w:t>
             </w:r>
           </w:p>
         </w:tc>
@@ -1810,7 +1810,7 @@
                 <w:szCs w:val="19"/>
                 <w:rtl/>
               </w:rPr>
-              <w:t xml:space="preserve">إزالة كارت نسبة الاستجابة من صفحة تقييمات العملاء</w:t>
+              <w:t xml:space="preserve">تسجيل دورات المحادثة واشتقاقها — أساس شريط فهرسة الثريد</w:t>
             </w:r>
           </w:p>
         </w:tc>
@@ -1841,7 +1841,7 @@
                 <w:szCs w:val="19"/>
                 <w:rtl/>
               </w:rPr>
-              <w:t xml:space="preserve">تقييمات العملاء</w:t>
+              <w:t xml:space="preserve">صندوق الوارد (طبقة البيانات)</w:t>
             </w:r>
           </w:p>
         </w:tc>
@@ -1904,7 +1904,7 @@
                 <w:szCs w:val="19"/>
                 <w:rtl/>
               </w:rPr>
-              <w:t xml:space="preserve">2</w:t>
+              <w:t xml:space="preserve">3</w:t>
             </w:r>
           </w:p>
         </w:tc>
@@ -1934,7 +1934,7 @@
                 <w:szCs w:val="19"/>
                 <w:rtl/>
               </w:rPr>
-              <w:t xml:space="preserve">9 سبتمبر 2026</w:t>
+              <w:t xml:space="preserve">10 سبتمبر 2026</w:t>
             </w:r>
           </w:p>
         </w:tc>
@@ -1964,7 +1964,7 @@
                 <w:szCs w:val="19"/>
                 <w:rtl/>
               </w:rPr>
-              <w:t xml:space="preserve">تغيير تسمية زر الترقية في صفحة الفوترة</w:t>
+              <w:t xml:space="preserve">إزالة كارت نسبة الاستجابة من صفحة تقييمات العملاء</w:t>
             </w:r>
           </w:p>
         </w:tc>
@@ -1994,7 +1994,7 @@
                 <w:szCs w:val="19"/>
                 <w:rtl/>
               </w:rPr>
-              <w:t xml:space="preserve">الفوترة</w:t>
+              <w:t xml:space="preserve">تقييمات العملاء</w:t>
             </w:r>
           </w:p>
         </w:tc>
@@ -2058,7 +2058,7 @@
                 <w:szCs w:val="19"/>
                 <w:rtl/>
               </w:rPr>
-              <w:t xml:space="preserve">1</w:t>
+              <w:t xml:space="preserve">2</w:t>
             </w:r>
           </w:p>
         </w:tc>
@@ -2120,7 +2120,7 @@
                 <w:szCs w:val="19"/>
                 <w:rtl/>
               </w:rPr>
-              <w:t xml:space="preserve">ميزة تغيير الباقة — US-131</w:t>
+              <w:t xml:space="preserve">تغيير تسمية زر الترقية في صفحة الفوترة</w:t>
             </w:r>
           </w:p>
         </w:tc>
@@ -2128,6 +2128,159 @@
           <w:tcPr>
             <w:tcW w:type="dxa" w:w="1500"/>
             <w:shd w:fill="F1F5F9" w:color="auto" w:val="clear"/>
+            <w:tcMar>
+              <w:top w:type="dxa" w:w="90"/>
+              <w:left w:type="dxa" w:w="110"/>
+              <w:bottom w:type="dxa" w:w="90"/>
+              <w:right w:type="dxa" w:w="110"/>
+            </w:tcMar>
+          </w:tcPr>
+          <w:p>
+            <w:pPr>
+              <w:bidi/>
+              <w:spacing w:after="0" w:line="280"/>
+              <w:jc w:val="right"/>
+            </w:pPr>
+            <w:r>
+              <w:rPr>
+                <w:rFonts w:ascii="Arial" w:cs="Arial" w:eastAsia="Arial" w:hAnsi="Arial"/>
+                <w:b w:val="false"/>
+                <w:bCs w:val="false"/>
+                <w:color w:val="1E293B"/>
+                <w:sz w:val="19"/>
+                <w:szCs w:val="19"/>
+                <w:rtl/>
+              </w:rPr>
+              <w:t xml:space="preserve">الفوترة</w:t>
+            </w:r>
+          </w:p>
+        </w:tc>
+        <w:tc>
+          <w:tcPr>
+            <w:tcW w:type="dxa" w:w="1800"/>
+            <w:shd w:fill="ECFDF5" w:color="auto" w:val="clear"/>
+            <w:tcMar>
+              <w:top w:type="dxa" w:w="90"/>
+              <w:left w:type="dxa" w:w="110"/>
+              <w:bottom w:type="dxa" w:w="90"/>
+              <w:right w:type="dxa" w:w="110"/>
+            </w:tcMar>
+          </w:tcPr>
+          <w:p>
+            <w:pPr>
+              <w:bidi/>
+              <w:spacing w:after="0" w:line="280"/>
+              <w:jc w:val="right"/>
+            </w:pPr>
+            <w:r>
+              <w:rPr>
+                <w:rFonts w:ascii="Arial" w:cs="Arial" w:eastAsia="Arial" w:hAnsi="Arial"/>
+                <w:b/>
+                <w:bCs/>
+                <w:color w:val="15803D"/>
+                <w:sz w:val="19"/>
+                <w:szCs w:val="19"/>
+                <w:rtl/>
+              </w:rPr>
+              <w:t xml:space="preserve">منشور على الإنتاج</w:t>
+            </w:r>
+          </w:p>
+        </w:tc>
+      </w:tr>
+      <w:tr>
+        <w:tc>
+          <w:tcPr>
+            <w:tcW w:type="dxa" w:w="600"/>
+            <w:tcMar>
+              <w:top w:type="dxa" w:w="90"/>
+              <w:left w:type="dxa" w:w="110"/>
+              <w:bottom w:type="dxa" w:w="90"/>
+              <w:right w:type="dxa" w:w="110"/>
+            </w:tcMar>
+          </w:tcPr>
+          <w:p>
+            <w:pPr>
+              <w:bidi/>
+              <w:spacing w:after="0" w:line="280"/>
+              <w:jc w:val="right"/>
+            </w:pPr>
+            <w:r>
+              <w:rPr>
+                <w:rFonts w:ascii="Arial" w:cs="Arial" w:eastAsia="Arial" w:hAnsi="Arial"/>
+                <w:b/>
+                <w:bCs/>
+                <w:color w:val="2563EB"/>
+                <w:sz w:val="19"/>
+                <w:szCs w:val="19"/>
+                <w:rtl/>
+              </w:rPr>
+              <w:t xml:space="preserve">1</w:t>
+            </w:r>
+          </w:p>
+        </w:tc>
+        <w:tc>
+          <w:tcPr>
+            <w:tcW w:type="dxa" w:w="1500"/>
+            <w:tcMar>
+              <w:top w:type="dxa" w:w="90"/>
+              <w:left w:type="dxa" w:w="110"/>
+              <w:bottom w:type="dxa" w:w="90"/>
+              <w:right w:type="dxa" w:w="110"/>
+            </w:tcMar>
+          </w:tcPr>
+          <w:p>
+            <w:pPr>
+              <w:bidi/>
+              <w:spacing w:after="0" w:line="280"/>
+              <w:jc w:val="right"/>
+            </w:pPr>
+            <w:r>
+              <w:rPr>
+                <w:rFonts w:ascii="Arial" w:cs="Arial" w:eastAsia="Arial" w:hAnsi="Arial"/>
+                <w:b w:val="false"/>
+                <w:bCs w:val="false"/>
+                <w:color w:val="1E293B"/>
+                <w:sz w:val="19"/>
+                <w:szCs w:val="19"/>
+                <w:rtl/>
+              </w:rPr>
+              <w:t xml:space="preserve">9 سبتمبر 2026</w:t>
+            </w:r>
+          </w:p>
+        </w:tc>
+        <w:tc>
+          <w:tcPr>
+            <w:tcW w:type="dxa" w:w="3600"/>
+            <w:tcMar>
+              <w:top w:type="dxa" w:w="90"/>
+              <w:left w:type="dxa" w:w="110"/>
+              <w:bottom w:type="dxa" w:w="90"/>
+              <w:right w:type="dxa" w:w="110"/>
+            </w:tcMar>
+          </w:tcPr>
+          <w:p>
+            <w:pPr>
+              <w:bidi/>
+              <w:spacing w:after="0" w:line="280"/>
+              <w:jc w:val="right"/>
+            </w:pPr>
+            <w:r>
+              <w:rPr>
+                <w:rFonts w:ascii="Arial" w:cs="Arial" w:eastAsia="Arial" w:hAnsi="Arial"/>
+                <w:b w:val="false"/>
+                <w:bCs w:val="false"/>
+                <w:color w:val="1E293B"/>
+                <w:sz w:val="19"/>
+                <w:szCs w:val="19"/>
+                <w:rtl/>
+              </w:rPr>
+              <w:t xml:space="preserve">ميزة تغيير الباقة — US-131</w:t>
+            </w:r>
+          </w:p>
+        </w:tc>
+        <w:tc>
+          <w:tcPr>
+            <w:tcW w:type="dxa" w:w="1500"/>
             <w:tcMar>
               <w:top w:type="dxa" w:w="90"/>
               <w:left w:type="dxa" w:w="110"/>
@@ -2554,7 +2707,7 @@
                 <w:szCs w:val="20"/>
                 <w:rtl/>
               </w:rPr>
-              <w:t xml:space="preserve">البناء المنشور على الإنتاج: 793b4e4b-cec1-4d11-a65a-4e6408df5fe5</w:t>
+              <w:t xml:space="preserve">البناء المنشور على الإنتاج: 31b0afbc-9240-4967-b26c-ad43dce1a638</w:t>
             </w:r>
           </w:p>
           <w:p>
@@ -2639,7 +2792,7 @@
           <w:szCs w:val="24"/>
           <w:rtl/>
         </w:rPr>
-        <w:t xml:space="preserve">تعديل رقم 12 — رمز QR حقيقي قابل للمسح في إعداد المصادقة الثنائية</w:t>
+        <w:t xml:space="preserve">تعديل رقم 13 — تعطيل المصادقة الثنائية صار يتطلّب كلمة المرور أو رمزاً</w:t>
       </w:r>
     </w:p>
     <w:p>
@@ -2946,7 +3099,7 @@
                 <w:szCs w:val="19"/>
                 <w:rtl/>
               </w:rPr>
-              <w:t xml:space="preserve">/settings</w:t>
+              <w:t xml:space="preserve">/settings/security</w:t>
             </w:r>
           </w:p>
         </w:tc>
@@ -2976,7 +3129,7 @@
                 <w:szCs w:val="19"/>
                 <w:rtl/>
               </w:rPr>
-              <w:t xml:space="preserve">src/components/ui/QrCode.tsx · src/pages/Settings.tsx · src/utils/twoFactor.ts</w:t>
+              <w:t xml:space="preserve">src/pages/Settings.tsx · src/store/useAuthStore.ts</w:t>
             </w:r>
           </w:p>
         </w:tc>
@@ -3006,7 +3159,7 @@
                 <w:szCs w:val="19"/>
                 <w:rtl/>
               </w:rPr>
-              <w:t xml:space="preserve">e5a121d</w:t>
+              <w:t xml:space="preserve">aedca85</w:t>
             </w:r>
           </w:p>
         </w:tc>
@@ -3067,7 +3220,7 @@
           <w:szCs w:val="21"/>
           <w:rtl/>
         </w:rPr>
-        <w:t xml:space="preserve">كان المعروض رسمة SVG مربّعات مرصوفة يدوياً تشبه رمز QR ولا تحمل أي بيانات، فلا يقرأها أي تطبيق مصادقة. الطريقة الوحيدة للربط كانت نسخ المفتاح يدوياً.</w:t>
+        <w:t xml:space="preserve">كان التعطيل نافذة تأكيد ولا شيء غيرها، فكانت الحماية بقوة تبويب مفتوح بلا رقيب: من يصل إلى صفحة الإعدادات يطفئها، وبعدها كلمة المرور وحدها تفتح الحساب ولا يعود الهاتف يعني شيئاً.</w:t>
       </w:r>
     </w:p>
     <w:p>
@@ -3089,7 +3242,7 @@
           <w:szCs w:val="21"/>
           <w:rtl/>
         </w:rPr>
-        <w:t xml:space="preserve">صار الرمز يُولَّد فعلياً من رابط otpauth:// بمكتبة qrcode.</w:t>
+        <w:t xml:space="preserve">صار التعطيل يكلّف نفس الإثبات الذي يكلّفه تجاوز الشاشة: كلمة المرور افتراضياً، أو رمز من تطبيق المصادقة عبر رابط داخل النافذة.</w:t>
       </w:r>
     </w:p>
     <w:p>
@@ -3111,7 +3264,7 @@
           <w:szCs w:val="21"/>
           <w:rtl/>
         </w:rPr>
-        <w:t xml:space="preserve">تحقّقت منه بالتصوير والفكّ لا بالنظر: صوّرت العنصر المرسوم على الشاشة وفككته بقارئ QR، فرجع الرابط المتوقّع — في الوضع الفاتح والداكن.</w:t>
+        <w:t xml:space="preserve">الرموز الاحتياطية مقبولة في نفس الحقل، لأن فاقد هاتفه يحتاج طريقة يطفّيها بها.</w:t>
       </w:r>
     </w:p>
     <w:p>
@@ -3133,7 +3286,7 @@
           <w:szCs w:val="21"/>
           <w:rtl/>
         </w:rPr>
-        <w:t xml:space="preserve">ثُبّت الرمز أبيض على أسود بصرف النظر عن الثيم. لو ورث currentColor لانقلبت ألوانه في الوضع الداكن وتعذّر مسحه.</w:t>
+        <w:t xml:space="preserve">قُبل العاملان معاً عن قصد: من يشكّ أن كلمة مروره تسرّبت يحتاج مساراً لا يمرّ بها.</w:t>
       </w:r>
     </w:p>
     <w:p>
@@ -3155,7 +3308,7 @@
           <w:szCs w:val="21"/>
           <w:rtl/>
         </w:rPr>
-        <w:t xml:space="preserve">أُضيفت algorithm وdigits وperiod صراحةً إلى الرابط. Google Authenticator يفترض SHA1/6/30، أما Authy و1Password فلا، وافتراض مختلف يولّد رموزاً يرفضها التحقق عندنا.</w:t>
+        <w:t xml:space="preserve">حدّ خمس محاولات. رمز من ست خانات بلا سقف محاولات ليس عاملاً ثانياً.</w:t>
       </w:r>
     </w:p>
     <w:p>
@@ -3177,7 +3330,7 @@
           <w:szCs w:val="21"/>
           <w:rtl/>
         </w:rPr>
-        <w:t xml:space="preserve">عدد الخانات صار ثابتاً واحداً يقرأه المولّد والرابط معاً، فلا ينفصلان.</w:t>
+        <w:t xml:space="preserve">اختُبرت خمسة مسارات في المتصفح: كلمة مرور خاطئة تُبقيها مفعّلة وتُظهر الخطأ؛ كلمة المرور الصحيحة ورمز TOTP حيّ ورمز احتياطي كلٌّ منها يعطّلها؛ وخمس محاولات خاطئة تُقفل النافذة و2FA ما زالت مفعّلة.</w:t>
       </w:r>
     </w:p>
     <w:p>
@@ -3199,29 +3352,7 @@
           <w:szCs w:val="21"/>
           <w:rtl/>
         </w:rPr>
-        <w:t xml:space="preserve">المكتبة تُحمَّل بـ dynamic import عند فتح النافذة فقط، فحزمة الإعدادات بقيت ~50KB بدل 74KB.</w:t>
-      </w:r>
-    </w:p>
-    <w:p>
-      <w:pPr>
-        <w:pStyle w:val="ListParagraph"/>
-        <w:numPr>
-          <w:ilvl w:val="0"/>
-          <w:numId w:val="2"/>
-        </w:numPr>
-        <w:bidi/>
-        <w:spacing w:after="70" w:line="290"/>
-        <w:jc w:val="right"/>
-      </w:pPr>
-      <w:r>
-        <w:rPr>
-          <w:rFonts w:ascii="Arial" w:cs="Arial" w:eastAsia="Arial" w:hAnsi="Arial"/>
-          <w:color w:val="1E293B"/>
-          <w:sz w:val="21"/>
-          <w:szCs w:val="21"/>
-          <w:rtl/>
-        </w:rPr>
-        <w:t xml:space="preserve">يبقى المفتاح واحداً لكل الحسابات (ثابت في الكود)، فالربط يثبت صحّة الآلية لا أكثر — التوليد لكل مستخدم مكانه الخادم.</w:t>
+        <w:t xml:space="preserve">هذه الخطوة لم تكن موجودة أصلاً ولم تُحذف — تأكّدت من ذلك بمراجعة النسخة السابقة للكود (743042c^) قبل الشروع في البناء.</w:t>
       </w:r>
     </w:p>
     <w:p>
@@ -3246,7 +3377,7 @@
           <w:szCs w:val="24"/>
           <w:rtl/>
         </w:rPr>
-        <w:t xml:space="preserve">تعديل رقم 11 — رقم جوال اختياري في الملف الشخصي</w:t>
+        <w:t xml:space="preserve">تعديل رقم 12 — رمز QR حقيقي قابل للمسح في إعداد المصادقة الثنائية</w:t>
       </w:r>
     </w:p>
     <w:p>
@@ -3523,7 +3654,7 @@
                 <w:szCs w:val="19"/>
                 <w:rtl/>
               </w:rPr>
-              <w:t xml:space="preserve">الإعدادات ← الملف الشخصي</w:t>
+              <w:t xml:space="preserve">الإعدادات ← الأمان</w:t>
             </w:r>
           </w:p>
         </w:tc>
@@ -3583,7 +3714,7 @@
                 <w:szCs w:val="19"/>
                 <w:rtl/>
               </w:rPr>
-              <w:t xml:space="preserve">src/pages/Settings.tsx · src/store/useAuthStore.ts</w:t>
+              <w:t xml:space="preserve">src/components/ui/QrCode.tsx · src/pages/Settings.tsx · src/utils/twoFactor.ts</w:t>
             </w:r>
           </w:p>
         </w:tc>
@@ -3613,7 +3744,7 @@
                 <w:szCs w:val="19"/>
                 <w:rtl/>
               </w:rPr>
-              <w:t xml:space="preserve">27dc01f</w:t>
+              <w:t xml:space="preserve">e5a121d</w:t>
             </w:r>
           </w:p>
         </w:tc>
@@ -3674,7 +3805,7 @@
           <w:szCs w:val="21"/>
           <w:rtl/>
         </w:rPr>
-        <w:t xml:space="preserve">كان الملف الشخصي يجمع اسم العرض والبريد فقط، فلا سبيل للوصول لصاحب الحساب خارج صندوق الوارد.</w:t>
+        <w:t xml:space="preserve">كان المعروض رسمة SVG مربّعات مرصوفة يدوياً تشبه رمز QR ولا تحمل أي بيانات، فلا يقرأها أي تطبيق مصادقة. الطريقة الوحيدة للربط كانت نسخ المفتاح يدوياً.</w:t>
       </w:r>
     </w:p>
     <w:p>
@@ -3696,7 +3827,7 @@
           <w:szCs w:val="21"/>
           <w:rtl/>
         </w:rPr>
-        <w:t xml:space="preserve">استُخدم مكوّن PhoneField نفسه المستعمل في جهات الاتصال ودعوة الموظفين، فجاء معه منتقي الدولة ورمز الاتصال بدل حقل نصّي حرّ.</w:t>
+        <w:t xml:space="preserve">صار الرمز يُولَّد فعلياً من رابط otpauth:// بمكتبة qrcode.</w:t>
       </w:r>
     </w:p>
     <w:p>
@@ -3718,7 +3849,7 @@
           <w:szCs w:val="21"/>
           <w:rtl/>
         </w:rPr>
-        <w:t xml:space="preserve">الحقل اختياري ويحمل وسم «(اختياري)» بنفس أسلوب باقي الحقول غير الإلزامية.</w:t>
+        <w:t xml:space="preserve">تحقّقت منه بالتصوير والفكّ لا بالنظر: صوّرت العنصر المرسوم على الشاشة وفككته بقارئ QR، فرجع الرابط المتوقّع — في الوضع الفاتح والداكن.</w:t>
       </w:r>
     </w:p>
     <w:p>
@@ -3740,7 +3871,7 @@
           <w:szCs w:val="21"/>
           <w:rtl/>
         </w:rPr>
-        <w:t xml:space="preserve">الرقم لا يُخزَّن إلا إذا كُتب فعلاً، حتى لا يبقى رمز دولة وحده متظاهراً بأنه رقم بعد تفريغ الحقل.</w:t>
+        <w:t xml:space="preserve">ثُبّت الرمز أبيض على أسود بصرف النظر عن الثيم. لو ورث currentColor لانقلبت ألوانه في الوضع الداكن وتعذّر مسحه.</w:t>
       </w:r>
     </w:p>
     <w:p>
@@ -3762,7 +3893,7 @@
           <w:szCs w:val="21"/>
           <w:rtl/>
         </w:rPr>
-        <w:t xml:space="preserve">عند التحميل يُفصل الرقم المحفوظ إلى رمز دولة ورقم محلي بمطابقة أطول رمز — لا بتعبير نمطي جشع، لأن ذلك كان سيقرأ ‎+96891234567 على أنه ‎+9689 ويشوّه الباقي.</w:t>
+        <w:t xml:space="preserve">أُضيفت algorithm وdigits وperiod صراحةً إلى الرابط. Google Authenticator يفترض SHA1/6/30، أما Authy و1Password فلا، وافتراض مختلف يولّد رموزاً يرفضها التحقق عندنا.</w:t>
       </w:r>
     </w:p>
     <w:p>
@@ -3784,7 +3915,51 @@
           <w:szCs w:val="21"/>
           <w:rtl/>
         </w:rPr>
-        <w:t xml:space="preserve">عوينت النتيجة في المتصفح: حفظ 91234567 مع ‎+968 خزّنه ‎+96891234567، وبعد إعادة التحميل رجع مقسوماً صحيحاً.</w:t>
+        <w:t xml:space="preserve">عدد الخانات صار ثابتاً واحداً يقرأه المولّد والرابط معاً، فلا ينفصلان.</w:t>
+      </w:r>
+    </w:p>
+    <w:p>
+      <w:pPr>
+        <w:pStyle w:val="ListParagraph"/>
+        <w:numPr>
+          <w:ilvl w:val="0"/>
+          <w:numId w:val="2"/>
+        </w:numPr>
+        <w:bidi/>
+        <w:spacing w:after="70" w:line="290"/>
+        <w:jc w:val="right"/>
+      </w:pPr>
+      <w:r>
+        <w:rPr>
+          <w:rFonts w:ascii="Arial" w:cs="Arial" w:eastAsia="Arial" w:hAnsi="Arial"/>
+          <w:color w:val="1E293B"/>
+          <w:sz w:val="21"/>
+          <w:szCs w:val="21"/>
+          <w:rtl/>
+        </w:rPr>
+        <w:t xml:space="preserve">المكتبة تُحمَّل بـ dynamic import عند فتح النافذة فقط، فحزمة الإعدادات بقيت ~50KB بدل 74KB.</w:t>
+      </w:r>
+    </w:p>
+    <w:p>
+      <w:pPr>
+        <w:pStyle w:val="ListParagraph"/>
+        <w:numPr>
+          <w:ilvl w:val="0"/>
+          <w:numId w:val="2"/>
+        </w:numPr>
+        <w:bidi/>
+        <w:spacing w:after="70" w:line="290"/>
+        <w:jc w:val="right"/>
+      </w:pPr>
+      <w:r>
+        <w:rPr>
+          <w:rFonts w:ascii="Arial" w:cs="Arial" w:eastAsia="Arial" w:hAnsi="Arial"/>
+          <w:color w:val="1E293B"/>
+          <w:sz w:val="21"/>
+          <w:szCs w:val="21"/>
+          <w:rtl/>
+        </w:rPr>
+        <w:t xml:space="preserve">يبقى المفتاح واحداً لكل الحسابات (ثابت في الكود)، فالربط يثبت صحّة الآلية لا أكثر — التوليد لكل مستخدم مكانه الخادم.</w:t>
       </w:r>
     </w:p>
     <w:p>
@@ -3809,7 +3984,7 @@
           <w:szCs w:val="24"/>
           <w:rtl/>
         </w:rPr>
-        <w:t xml:space="preserve">تعديل رقم 10 — شاشة التحقق بخطوتين في تسجيل الدخول</w:t>
+        <w:t xml:space="preserve">تعديل رقم 11 — رقم جوال اختياري في الملف الشخصي</w:t>
       </w:r>
     </w:p>
     <w:p>
@@ -4086,7 +4261,7 @@
                 <w:szCs w:val="19"/>
                 <w:rtl/>
               </w:rPr>
-              <w:t xml:space="preserve">تسجيل الدخول</w:t>
+              <w:t xml:space="preserve">الإعدادات ← الملف الشخصي</w:t>
             </w:r>
           </w:p>
         </w:tc>
@@ -4116,7 +4291,7 @@
                 <w:szCs w:val="19"/>
                 <w:rtl/>
               </w:rPr>
-              <w:t xml:space="preserve">/login</w:t>
+              <w:t xml:space="preserve">/settings</w:t>
             </w:r>
           </w:p>
         </w:tc>
@@ -4146,7 +4321,7 @@
                 <w:szCs w:val="19"/>
                 <w:rtl/>
               </w:rPr>
-              <w:t xml:space="preserve">src/utils/twoFactor.ts · src/components/auth/TwoFactorChallenge.tsx · src/store/useAuthStore.ts · src/pages/Login.tsx</w:t>
+              <w:t xml:space="preserve">src/pages/Settings.tsx · src/store/useAuthStore.ts</w:t>
             </w:r>
           </w:p>
         </w:tc>
@@ -4176,7 +4351,7 @@
                 <w:szCs w:val="19"/>
                 <w:rtl/>
               </w:rPr>
-              <w:t xml:space="preserve">743042c</w:t>
+              <w:t xml:space="preserve">27dc01f</w:t>
             </w:r>
           </w:p>
         </w:tc>
@@ -4237,7 +4412,7 @@
           <w:szCs w:val="21"/>
           <w:rtl/>
         </w:rPr>
-        <w:t xml:space="preserve">⚠️ هيكل واجهة لا أمان: التحقق يجري في المتصفح والمفتاح السري داخل حزمة الجافاسكربت، فيمكن تجاوزه. الغرض تجهيز الواجهة والعقد لحين وجود باكيند، وهذا مكتوب صراحةً في رأس ملف twoFactor.ts.</w:t>
+        <w:t xml:space="preserve">كان الملف الشخصي يجمع اسم العرض والبريد فقط، فلا سبيل للوصول لصاحب الحساب خارج صندوق الوارد.</w:t>
       </w:r>
     </w:p>
     <w:p>
@@ -4259,7 +4434,7 @@
           <w:szCs w:val="21"/>
           <w:rtl/>
         </w:rPr>
-        <w:t xml:space="preserve">كان الدخول يوثّق فوراً بعد كلمة المرور. صار مرحلتين: كلمة المرور تنتج حالة معلّقة في الذاكرة فقط، ولا يُكتب شيء في التخزين حتى يمرّ العامل الثاني — فإغلاق التبويب في منتصف العملية لا يترك جلسة مفتوحة.</w:t>
+        <w:t xml:space="preserve">استُخدم مكوّن PhoneField نفسه المستعمل في جهات الاتصال ودعوة الموظفين، فجاء معه منتقي الدولة ورمز الاتصال بدل حقل نصّي حرّ.</w:t>
       </w:r>
     </w:p>
     <w:p>
@@ -4281,7 +4456,7 @@
           <w:szCs w:val="21"/>
           <w:rtl/>
         </w:rPr>
-        <w:t xml:space="preserve">شاشة التحقق تظهر داخل مسار الدخول نفسه لا على عنوان مستقل، لأن عنواناً مستقلاً يفتحه أي شخص دون المرور بالمرحلة الأولى.</w:t>
+        <w:t xml:space="preserve">الحقل اختياري ويحمل وسم «(اختياري)» بنفس أسلوب باقي الحقول غير الإلزامية.</w:t>
       </w:r>
     </w:p>
     <w:p>
@@ -4303,7 +4478,7 @@
           <w:szCs w:val="21"/>
           <w:rtl/>
         </w:rPr>
-        <w:t xml:space="preserve">نُفِّذت خوارزمية TOTP (المعيار RFC 6238) بـ Web Crypto، فأكواد Google Authenticator الحقيقية تُقبل فعلاً. تحقّقت من التنفيذ بمتجهات الاختبار الخمسة الواردة في المعيار نفسه وكلها طابقت.</w:t>
+        <w:t xml:space="preserve">الرقم لا يُخزَّن إلا إذا كُتب فعلاً، حتى لا يبقى رمز دولة وحده متظاهراً بأنه رقم بعد تفريغ الحقل.</w:t>
       </w:r>
     </w:p>
     <w:p>
@@ -4325,7 +4500,7 @@
           <w:szCs w:val="21"/>
           <w:rtl/>
         </w:rPr>
-        <w:t xml:space="preserve">نافذة تسامح خطوة واحدة قبل وبعد لاستيعاب فروق ساعة الجهاز.</w:t>
+        <w:t xml:space="preserve">عند التحميل يُفصل الرقم المحفوظ إلى رمز دولة ورقم محلي بمطابقة أطول رمز — لا بتعبير نمطي جشع، لأن ذلك كان سيقرأ ‎+96891234567 على أنه ‎+9689 ويشوّه الباقي.</w:t>
       </w:r>
     </w:p>
     <w:p>
@@ -4347,205 +4522,7 @@
           <w:szCs w:val="21"/>
           <w:rtl/>
         </w:rPr>
-        <w:t xml:space="preserve">ستة مربعات بانتقال تلقائي بين الخانات ودعم اللصق وإرسال تلقائي عند اكتمال الرمز.</w:t>
-      </w:r>
-    </w:p>
-    <w:p>
-      <w:pPr>
-        <w:pStyle w:val="ListParagraph"/>
-        <w:numPr>
-          <w:ilvl w:val="0"/>
-          <w:numId w:val="2"/>
-        </w:numPr>
-        <w:bidi/>
-        <w:spacing w:after="70" w:line="290"/>
-        <w:jc w:val="right"/>
-      </w:pPr>
-      <w:r>
-        <w:rPr>
-          <w:rFonts w:ascii="Arial" w:cs="Arial" w:eastAsia="Arial" w:hAnsi="Arial"/>
-          <w:color w:val="1E293B"/>
-          <w:sz w:val="21"/>
-          <w:szCs w:val="21"/>
-          <w:rtl/>
-        </w:rPr>
-        <w:t xml:space="preserve">لا يوجد زر «إعادة إرسال» — التطبيق يولّد الرمز على الجهاز ولا شيء يُرسَل. وُضع مكانه عدّاد يبيّن الثواني المتبقية قبل تغيّر الرمز، فلا ينتظر الموظف رسالة لن تصل.</w:t>
-      </w:r>
-    </w:p>
-    <w:p>
-      <w:pPr>
-        <w:pStyle w:val="ListParagraph"/>
-        <w:numPr>
-          <w:ilvl w:val="0"/>
-          <w:numId w:val="2"/>
-        </w:numPr>
-        <w:bidi/>
-        <w:spacing w:after="70" w:line="290"/>
-        <w:jc w:val="right"/>
-      </w:pPr>
-      <w:r>
-        <w:rPr>
-          <w:rFonts w:ascii="Arial" w:cs="Arial" w:eastAsia="Arial" w:hAnsi="Arial"/>
-          <w:color w:val="1E293B"/>
-          <w:sz w:val="21"/>
-          <w:szCs w:val="21"/>
-          <w:rtl/>
-        </w:rPr>
-        <w:t xml:space="preserve">مسار الرموز الاحتياطية داخل الشاشة نفسها، لأن فاقد هاتفه بلا رمز احتياطي يُقفل خارج حسابه نهائياً.</w:t>
-      </w:r>
-    </w:p>
-    <w:p>
-      <w:pPr>
-        <w:pStyle w:val="ListParagraph"/>
-        <w:numPr>
-          <w:ilvl w:val="0"/>
-          <w:numId w:val="2"/>
-        </w:numPr>
-        <w:bidi/>
-        <w:spacing w:after="70" w:line="290"/>
-        <w:jc w:val="right"/>
-      </w:pPr>
-      <w:r>
-        <w:rPr>
-          <w:rFonts w:ascii="Arial" w:cs="Arial" w:eastAsia="Arial" w:hAnsi="Arial"/>
-          <w:color w:val="1E293B"/>
-          <w:sz w:val="21"/>
-          <w:szCs w:val="21"/>
-          <w:rtl/>
-        </w:rPr>
-        <w:t xml:space="preserve">رسالة الخطأ واحدة للرمز الخاطئ وللمنتهي عمداً، حتى لا تُعطي المهاجم معلومة يفرّق بها.</w:t>
-      </w:r>
-    </w:p>
-    <w:p>
-      <w:pPr>
-        <w:pStyle w:val="ListParagraph"/>
-        <w:numPr>
-          <w:ilvl w:val="0"/>
-          <w:numId w:val="2"/>
-        </w:numPr>
-        <w:bidi/>
-        <w:spacing w:after="70" w:line="290"/>
-        <w:jc w:val="right"/>
-      </w:pPr>
-      <w:r>
-        <w:rPr>
-          <w:rFonts w:ascii="Arial" w:cs="Arial" w:eastAsia="Arial" w:hAnsi="Arial"/>
-          <w:color w:val="1E293B"/>
-          <w:sz w:val="21"/>
-          <w:szCs w:val="21"/>
-          <w:rtl/>
-        </w:rPr>
-        <w:t xml:space="preserve">حدّ خمس محاولات ثم قفل خمس دقائق — وهذا في الواجهة للتوثيق فقط، ومكانه الصحيح الخادم.</w:t>
-      </w:r>
-    </w:p>
-    <w:p>
-      <w:pPr>
-        <w:pStyle w:val="ListParagraph"/>
-        <w:numPr>
-          <w:ilvl w:val="0"/>
-          <w:numId w:val="2"/>
-        </w:numPr>
-        <w:bidi/>
-        <w:spacing w:after="70" w:line="290"/>
-        <w:jc w:val="right"/>
-      </w:pPr>
-      <w:r>
-        <w:rPr>
-          <w:rFonts w:ascii="Arial" w:cs="Arial" w:eastAsia="Arial" w:hAnsi="Arial"/>
-          <w:color w:val="1E293B"/>
-          <w:sz w:val="21"/>
-          <w:szCs w:val="21"/>
-          <w:rtl/>
-        </w:rPr>
-        <w:t xml:space="preserve">شاشة الإعداد في الإعدادات كانت تقبل أي ستة أرقام وتفعّل 2FA بناءً عليها. صارت تتحقق فعلياً، لأن التفعيل بعد مسح خاطئ للرمز يقفل صاحب الحساب خارج حسابه.</w:t>
-      </w:r>
-    </w:p>
-    <w:p>
-      <w:pPr>
-        <w:pStyle w:val="ListParagraph"/>
-        <w:numPr>
-          <w:ilvl w:val="0"/>
-          <w:numId w:val="2"/>
-        </w:numPr>
-        <w:bidi/>
-        <w:spacing w:after="70" w:line="290"/>
-        <w:jc w:val="right"/>
-      </w:pPr>
-      <w:r>
-        <w:rPr>
-          <w:rFonts w:ascii="Arial" w:cs="Arial" w:eastAsia="Arial" w:hAnsi="Arial"/>
-          <w:color w:val="1E293B"/>
-          <w:sz w:val="21"/>
-          <w:szCs w:val="21"/>
-          <w:rtl/>
-        </w:rPr>
-        <w:t xml:space="preserve">وُحّد المفتاح والرموز الاحتياطية بين شاشة الإعداد وشاشة الدخول في ملف واحد، فما يعرضه الـQR هو ما يُتحقّق منه.</w:t>
-      </w:r>
-    </w:p>
-    <w:p>
-      <w:pPr>
-        <w:pStyle w:val="ListParagraph"/>
-        <w:numPr>
-          <w:ilvl w:val="0"/>
-          <w:numId w:val="2"/>
-        </w:numPr>
-        <w:bidi/>
-        <w:spacing w:after="70" w:line="290"/>
-        <w:jc w:val="right"/>
-      </w:pPr>
-      <w:r>
-        <w:rPr>
-          <w:rFonts w:ascii="Arial" w:cs="Arial" w:eastAsia="Arial" w:hAnsi="Arial"/>
-          <w:color w:val="1E293B"/>
-          <w:sz w:val="21"/>
-          <w:szCs w:val="21"/>
-          <w:rtl/>
-        </w:rPr>
-        <w:t xml:space="preserve">حُذف الحقل المكرّر AppSettings.twoFactorEnabled — كان يُكتب عند التهيئة ولا يُقرأ في أي مكان، بينما الحقل الحيّ هو security.twoFactor. وجود علمين لنفس المعنى كان سيُظهر الميزة مفعّلة في شاشة ومطفأة في أخرى.</w:t>
-      </w:r>
-    </w:p>
-    <w:p>
-      <w:pPr>
-        <w:pStyle w:val="ListParagraph"/>
-        <w:numPr>
-          <w:ilvl w:val="0"/>
-          <w:numId w:val="2"/>
-        </w:numPr>
-        <w:bidi/>
-        <w:spacing w:after="70" w:line="290"/>
-        <w:jc w:val="right"/>
-      </w:pPr>
-      <w:r>
-        <w:rPr>
-          <w:rFonts w:ascii="Arial" w:cs="Arial" w:eastAsia="Arial" w:hAnsi="Arial"/>
-          <w:color w:val="1E293B"/>
-          <w:sz w:val="21"/>
-          <w:szCs w:val="21"/>
-          <w:rtl/>
-        </w:rPr>
-        <w:t xml:space="preserve">أخطأتُ في شرط الإرسال التلقائي: كتبت فحصاً يتضمّن includes('') وهو دائماً صحيح في جافاسكربت، فلم يكن الإرسال التلقائي يعمل إطلاقاً. كشفه اختبار المتصفح وأُصلح.</w:t>
-      </w:r>
-    </w:p>
-    <w:p>
-      <w:pPr>
-        <w:pStyle w:val="ListParagraph"/>
-        <w:numPr>
-          <w:ilvl w:val="0"/>
-          <w:numId w:val="2"/>
-        </w:numPr>
-        <w:bidi/>
-        <w:spacing w:after="70" w:line="290"/>
-        <w:jc w:val="right"/>
-      </w:pPr>
-      <w:r>
-        <w:rPr>
-          <w:rFonts w:ascii="Arial" w:cs="Arial" w:eastAsia="Arial" w:hAnsi="Arial"/>
-          <w:color w:val="1E293B"/>
-          <w:sz w:val="21"/>
-          <w:szCs w:val="21"/>
-          <w:rtl/>
-        </w:rPr>
-        <w:t xml:space="preserve">اختُبر التدفّق كاملاً في المتصفح: الدخول المباشر عند تعطيل 2FA، ظهور الشاشة عند تفعيلها، خلوّ التخزين قبل التحقق، رفض الرمز الخاطئ، قبول رمز TOTP صحيح، وقبول رمز احتياطي.</w:t>
+        <w:t xml:space="preserve">عوينت النتيجة في المتصفح: حفظ 91234567 مع ‎+968 خزّنه ‎+96891234567، وبعد إعادة التحميل رجع مقسوماً صحيحاً.</w:t>
       </w:r>
     </w:p>
     <w:p>
@@ -4570,7 +4547,7 @@
           <w:szCs w:val="24"/>
           <w:rtl/>
         </w:rPr>
-        <w:t xml:space="preserve">تعديل رقم 9 — رقم هاتف اختياري عند دعوة الموظف</w:t>
+        <w:t xml:space="preserve">تعديل رقم 10 — شاشة التحقق بخطوتين في تسجيل الدخول</w:t>
       </w:r>
     </w:p>
     <w:p>
@@ -4847,7 +4824,7 @@
                 <w:szCs w:val="19"/>
                 <w:rtl/>
               </w:rPr>
-              <w:t xml:space="preserve">فريق العمل</w:t>
+              <w:t xml:space="preserve">تسجيل الدخول</w:t>
             </w:r>
           </w:p>
         </w:tc>
@@ -4877,7 +4854,7 @@
                 <w:szCs w:val="19"/>
                 <w:rtl/>
               </w:rPr>
-              <w:t xml:space="preserve">/team</w:t>
+              <w:t xml:space="preserve">/login</w:t>
             </w:r>
           </w:p>
         </w:tc>
@@ -4907,7 +4884,7 @@
                 <w:szCs w:val="19"/>
                 <w:rtl/>
               </w:rPr>
-              <w:t xml:space="preserve">src/pages/Team.tsx · src/types/index.ts · src/store/useDataStore.ts</w:t>
+              <w:t xml:space="preserve">src/utils/twoFactor.ts · src/components/auth/TwoFactorChallenge.tsx · src/store/useAuthStore.ts · src/pages/Login.tsx</w:t>
             </w:r>
           </w:p>
         </w:tc>
@@ -4937,7 +4914,7 @@
                 <w:szCs w:val="19"/>
                 <w:rtl/>
               </w:rPr>
-              <w:t xml:space="preserve">a4d8398</w:t>
+              <w:t xml:space="preserve">743042c</w:t>
             </w:r>
           </w:p>
         </w:tc>
@@ -4998,7 +4975,7 @@
           <w:szCs w:val="21"/>
           <w:rtl/>
         </w:rPr>
-        <w:t xml:space="preserve">أُضيف حقل رقم الهاتف إلى نموذج دعوة الموظف وتعديله — لم يكن موجوداً من قبل أصلاً.</w:t>
+        <w:t xml:space="preserve">⚠️ هيكل واجهة لا أمان: التحقق يجري في المتصفح والمفتاح السري داخل حزمة الجافاسكربت، فيمكن تجاوزه. الغرض تجهيز الواجهة والعقد لحين وجود باكيند، وهذا مكتوب صراحةً في رأس ملف twoFactor.ts.</w:t>
       </w:r>
     </w:p>
     <w:p>
@@ -5020,7 +4997,7 @@
           <w:szCs w:val="21"/>
           <w:rtl/>
         </w:rPr>
-        <w:t xml:space="preserve">الحقل اختياري: يحمل وسم «(اختياري)» بنفس أسلوب حقل الأقسام، وبلا النجمة الحمراء التي تعلّم الاسم والبريد والدور. إرسال الدعوة بدونه يمرّ دون اعتراض.</w:t>
+        <w:t xml:space="preserve">كان الدخول يوثّق فوراً بعد كلمة المرور. صار مرحلتين: كلمة المرور تنتج حالة معلّقة في الذاكرة فقط، ولا يُكتب شيء في التخزين حتى يمرّ العامل الثاني — فإغلاق التبويب في منتصف العملية لا يترك جلسة مفتوحة.</w:t>
       </w:r>
     </w:p>
     <w:p>
@@ -5042,7 +5019,7 @@
           <w:szCs w:val="21"/>
           <w:rtl/>
         </w:rPr>
-        <w:t xml:space="preserve">استُخدم مكوّن PhoneField نفسه المستعمل في جهات الاتصال والتسجيل، فيأتي معه منتقي الدولة ورمز الاتصال بدل حقل نصّي حرّ.</w:t>
+        <w:t xml:space="preserve">شاشة التحقق تظهر داخل مسار الدخول نفسه لا على عنوان مستقل، لأن عنواناً مستقلاً يفتحه أي شخص دون المرور بالمرحلة الأولى.</w:t>
       </w:r>
     </w:p>
     <w:p>
@@ -5064,7 +5041,7 @@
           <w:szCs w:val="21"/>
           <w:rtl/>
         </w:rPr>
-        <w:t xml:space="preserve">الرقم لا يُخزَّن إلا إذا كُتب فعلاً، حتى لا يبقى رمز دولة معلّقاً بلا رقم في بيانات موظف تركه فارغاً.</w:t>
+        <w:t xml:space="preserve">نُفِّذت خوارزمية TOTP (المعيار RFC 6238) بـ Web Crypto، فأكواد Google Authenticator الحقيقية تُقبل فعلاً. تحقّقت من التنفيذ بمتجهات الاختبار الخمسة الواردة في المعيار نفسه وكلها طابقت.</w:t>
       </w:r>
     </w:p>
     <w:p>
@@ -5086,7 +5063,7 @@
           <w:szCs w:val="21"/>
           <w:rtl/>
         </w:rPr>
-        <w:t xml:space="preserve">عند فتح موظف للتعديل يُفصل الرقم المحفوظ إلى رمز دولة ورقم محلي بمطابقة أطول رمز مطابق من قائمة الدول — لا بتعبير نمطي جشع، لأن ذلك كان سيقرأ ‎+96891234567 على أنه ‎+9689 ثم يشوّه الرقم.</w:t>
+        <w:t xml:space="preserve">نافذة تسامح خطوة واحدة قبل وبعد لاستيعاب فروق ساعة الجهاز.</w:t>
       </w:r>
     </w:p>
     <w:p>
@@ -5108,7 +5085,7 @@
           <w:szCs w:val="21"/>
           <w:rtl/>
         </w:rPr>
-        <w:t xml:space="preserve">الرقم يظهر في لوحة تفاصيل الموظف حين يكون موجوداً، فلا تُجمع بيانات لا تُعرض في أي مكان.</w:t>
+        <w:t xml:space="preserve">ستة مربعات بانتقال تلقائي بين الخانات ودعم اللصق وإرسال تلقائي عند اكتمال الرمز.</w:t>
       </w:r>
     </w:p>
     <w:p>
@@ -5130,7 +5107,7 @@
           <w:szCs w:val="21"/>
           <w:rtl/>
         </w:rPr>
-        <w:t xml:space="preserve">وُسّع توقيع inviteAgent ليقبل الحقل الجديد.</w:t>
+        <w:t xml:space="preserve">لا يوجد زر «إعادة إرسال» — التطبيق يولّد الرمز على الجهاز ولا شيء يُرسَل. وُضع مكانه عدّاد يبيّن الثواني المتبقية قبل تغيّر الرمز، فلا ينتظر الموظف رسالة لن تصل.</w:t>
       </w:r>
     </w:p>
     <w:p>
@@ -5152,7 +5129,161 @@
           <w:szCs w:val="21"/>
           <w:rtl/>
         </w:rPr>
-        <w:t xml:space="preserve">عوينت النتيجة في المتصفح: الحقل ووسم الاختياري ظاهران، ودعوة موظف بلا رقم هاتف نجحت.</w:t>
+        <w:t xml:space="preserve">مسار الرموز الاحتياطية داخل الشاشة نفسها، لأن فاقد هاتفه بلا رمز احتياطي يُقفل خارج حسابه نهائياً.</w:t>
+      </w:r>
+    </w:p>
+    <w:p>
+      <w:pPr>
+        <w:pStyle w:val="ListParagraph"/>
+        <w:numPr>
+          <w:ilvl w:val="0"/>
+          <w:numId w:val="2"/>
+        </w:numPr>
+        <w:bidi/>
+        <w:spacing w:after="70" w:line="290"/>
+        <w:jc w:val="right"/>
+      </w:pPr>
+      <w:r>
+        <w:rPr>
+          <w:rFonts w:ascii="Arial" w:cs="Arial" w:eastAsia="Arial" w:hAnsi="Arial"/>
+          <w:color w:val="1E293B"/>
+          <w:sz w:val="21"/>
+          <w:szCs w:val="21"/>
+          <w:rtl/>
+        </w:rPr>
+        <w:t xml:space="preserve">رسالة الخطأ واحدة للرمز الخاطئ وللمنتهي عمداً، حتى لا تُعطي المهاجم معلومة يفرّق بها.</w:t>
+      </w:r>
+    </w:p>
+    <w:p>
+      <w:pPr>
+        <w:pStyle w:val="ListParagraph"/>
+        <w:numPr>
+          <w:ilvl w:val="0"/>
+          <w:numId w:val="2"/>
+        </w:numPr>
+        <w:bidi/>
+        <w:spacing w:after="70" w:line="290"/>
+        <w:jc w:val="right"/>
+      </w:pPr>
+      <w:r>
+        <w:rPr>
+          <w:rFonts w:ascii="Arial" w:cs="Arial" w:eastAsia="Arial" w:hAnsi="Arial"/>
+          <w:color w:val="1E293B"/>
+          <w:sz w:val="21"/>
+          <w:szCs w:val="21"/>
+          <w:rtl/>
+        </w:rPr>
+        <w:t xml:space="preserve">حدّ خمس محاولات ثم قفل خمس دقائق — وهذا في الواجهة للتوثيق فقط، ومكانه الصحيح الخادم.</w:t>
+      </w:r>
+    </w:p>
+    <w:p>
+      <w:pPr>
+        <w:pStyle w:val="ListParagraph"/>
+        <w:numPr>
+          <w:ilvl w:val="0"/>
+          <w:numId w:val="2"/>
+        </w:numPr>
+        <w:bidi/>
+        <w:spacing w:after="70" w:line="290"/>
+        <w:jc w:val="right"/>
+      </w:pPr>
+      <w:r>
+        <w:rPr>
+          <w:rFonts w:ascii="Arial" w:cs="Arial" w:eastAsia="Arial" w:hAnsi="Arial"/>
+          <w:color w:val="1E293B"/>
+          <w:sz w:val="21"/>
+          <w:szCs w:val="21"/>
+          <w:rtl/>
+        </w:rPr>
+        <w:t xml:space="preserve">شاشة الإعداد في الإعدادات كانت تقبل أي ستة أرقام وتفعّل 2FA بناءً عليها. صارت تتحقق فعلياً، لأن التفعيل بعد مسح خاطئ للرمز يقفل صاحب الحساب خارج حسابه.</w:t>
+      </w:r>
+    </w:p>
+    <w:p>
+      <w:pPr>
+        <w:pStyle w:val="ListParagraph"/>
+        <w:numPr>
+          <w:ilvl w:val="0"/>
+          <w:numId w:val="2"/>
+        </w:numPr>
+        <w:bidi/>
+        <w:spacing w:after="70" w:line="290"/>
+        <w:jc w:val="right"/>
+      </w:pPr>
+      <w:r>
+        <w:rPr>
+          <w:rFonts w:ascii="Arial" w:cs="Arial" w:eastAsia="Arial" w:hAnsi="Arial"/>
+          <w:color w:val="1E293B"/>
+          <w:sz w:val="21"/>
+          <w:szCs w:val="21"/>
+          <w:rtl/>
+        </w:rPr>
+        <w:t xml:space="preserve">وُحّد المفتاح والرموز الاحتياطية بين شاشة الإعداد وشاشة الدخول في ملف واحد، فما يعرضه الـQR هو ما يُتحقّق منه.</w:t>
+      </w:r>
+    </w:p>
+    <w:p>
+      <w:pPr>
+        <w:pStyle w:val="ListParagraph"/>
+        <w:numPr>
+          <w:ilvl w:val="0"/>
+          <w:numId w:val="2"/>
+        </w:numPr>
+        <w:bidi/>
+        <w:spacing w:after="70" w:line="290"/>
+        <w:jc w:val="right"/>
+      </w:pPr>
+      <w:r>
+        <w:rPr>
+          <w:rFonts w:ascii="Arial" w:cs="Arial" w:eastAsia="Arial" w:hAnsi="Arial"/>
+          <w:color w:val="1E293B"/>
+          <w:sz w:val="21"/>
+          <w:szCs w:val="21"/>
+          <w:rtl/>
+        </w:rPr>
+        <w:t xml:space="preserve">حُذف الحقل المكرّر AppSettings.twoFactorEnabled — كان يُكتب عند التهيئة ولا يُقرأ في أي مكان، بينما الحقل الحيّ هو security.twoFactor. وجود علمين لنفس المعنى كان سيُظهر الميزة مفعّلة في شاشة ومطفأة في أخرى.</w:t>
+      </w:r>
+    </w:p>
+    <w:p>
+      <w:pPr>
+        <w:pStyle w:val="ListParagraph"/>
+        <w:numPr>
+          <w:ilvl w:val="0"/>
+          <w:numId w:val="2"/>
+        </w:numPr>
+        <w:bidi/>
+        <w:spacing w:after="70" w:line="290"/>
+        <w:jc w:val="right"/>
+      </w:pPr>
+      <w:r>
+        <w:rPr>
+          <w:rFonts w:ascii="Arial" w:cs="Arial" w:eastAsia="Arial" w:hAnsi="Arial"/>
+          <w:color w:val="1E293B"/>
+          <w:sz w:val="21"/>
+          <w:szCs w:val="21"/>
+          <w:rtl/>
+        </w:rPr>
+        <w:t xml:space="preserve">أخطأتُ في شرط الإرسال التلقائي: كتبت فحصاً يتضمّن includes('') وهو دائماً صحيح في جافاسكربت، فلم يكن الإرسال التلقائي يعمل إطلاقاً. كشفه اختبار المتصفح وأُصلح.</w:t>
+      </w:r>
+    </w:p>
+    <w:p>
+      <w:pPr>
+        <w:pStyle w:val="ListParagraph"/>
+        <w:numPr>
+          <w:ilvl w:val="0"/>
+          <w:numId w:val="2"/>
+        </w:numPr>
+        <w:bidi/>
+        <w:spacing w:after="70" w:line="290"/>
+        <w:jc w:val="right"/>
+      </w:pPr>
+      <w:r>
+        <w:rPr>
+          <w:rFonts w:ascii="Arial" w:cs="Arial" w:eastAsia="Arial" w:hAnsi="Arial"/>
+          <w:color w:val="1E293B"/>
+          <w:sz w:val="21"/>
+          <w:szCs w:val="21"/>
+          <w:rtl/>
+        </w:rPr>
+        <w:t xml:space="preserve">اختُبر التدفّق كاملاً في المتصفح: الدخول المباشر عند تعطيل 2FA، ظهور الشاشة عند تفعيلها، خلوّ التخزين قبل التحقق، رفض الرمز الخاطئ، قبول رمز TOTP صحيح، وقبول رمز احتياطي.</w:t>
       </w:r>
     </w:p>
     <w:p>
@@ -5177,7 +5308,7 @@
           <w:szCs w:val="24"/>
           <w:rtl/>
         </w:rPr>
-        <w:t xml:space="preserve">تعديل رقم 8 — فاصل مرقّم بين دورات المحادثة داخل الثريد</w:t>
+        <w:t xml:space="preserve">تعديل رقم 9 — رقم هاتف اختياري عند دعوة الموظف</w:t>
       </w:r>
     </w:p>
     <w:p>
@@ -5454,7 +5585,7 @@
                 <w:szCs w:val="19"/>
                 <w:rtl/>
               </w:rPr>
-              <w:t xml:space="preserve">صندوق الوارد</w:t>
+              <w:t xml:space="preserve">فريق العمل</w:t>
             </w:r>
           </w:p>
         </w:tc>
@@ -5484,7 +5615,7 @@
                 <w:szCs w:val="19"/>
                 <w:rtl/>
               </w:rPr>
-              <w:t xml:space="preserve">/inbox</w:t>
+              <w:t xml:space="preserve">/team</w:t>
             </w:r>
           </w:p>
         </w:tc>
@@ -5514,7 +5645,7 @@
                 <w:szCs w:val="19"/>
                 <w:rtl/>
               </w:rPr>
-              <w:t xml:space="preserve">src/pages/Inbox.tsx</w:t>
+              <w:t xml:space="preserve">src/pages/Team.tsx · src/types/index.ts · src/store/useDataStore.ts</w:t>
             </w:r>
           </w:p>
         </w:tc>
@@ -5544,7 +5675,7 @@
                 <w:szCs w:val="19"/>
                 <w:rtl/>
               </w:rPr>
-              <w:t xml:space="preserve">f9b43fd</w:t>
+              <w:t xml:space="preserve">a4d8398</w:t>
             </w:r>
           </w:p>
         </w:tc>
@@ -5605,7 +5736,7 @@
           <w:szCs w:val="21"/>
           <w:rtl/>
         </w:rPr>
-        <w:t xml:space="preserve">كل دورة جديدة صار يسبقها فاصل أفقي ظاهر داخل الثريد، فيُعرف أين انتهت دورة وبدأت التي تليها من غير رجوع إلى شريط الفهرسة.</w:t>
+        <w:t xml:space="preserve">أُضيف حقل رقم الهاتف إلى نموذج دعوة الموظف وتعديله — لم يكن موجوداً من قبل أصلاً.</w:t>
       </w:r>
     </w:p>
     <w:p>
@@ -5627,7 +5758,7 @@
           <w:szCs w:val="21"/>
           <w:rtl/>
         </w:rPr>
-        <w:t xml:space="preserve">الفاصل يحمل رقم الدورة وكلمة «إعادة فتح» والتاريخ، فيجيب عن ثلاثة أسئلة في سطر: أي دورة، وماذا جرى، ومتى.</w:t>
+        <w:t xml:space="preserve">الحقل اختياري: يحمل وسم «(اختياري)» بنفس أسلوب حقل الأقسام، وبلا النجمة الحمراء التي تعلّم الاسم والبريد والدور. إرسال الدعوة بدونه يمرّ دون اعتراض.</w:t>
       </w:r>
     </w:p>
     <w:p>
@@ -5649,7 +5780,7 @@
           <w:szCs w:val="21"/>
           <w:rtl/>
         </w:rPr>
-        <w:t xml:space="preserve">صيغته بلون العلامة التجارية بخطّين وشارة بارزة، لأن المطلوب أن يُلاحَظ لا أن يمرّ مرور الكرام.</w:t>
+        <w:t xml:space="preserve">استُخدم مكوّن PhoneField نفسه المستعمل في جهات الاتصال والتسجيل، فيأتي معه منتقي الدولة ورمز الاتصال بدل حقل نصّي حرّ.</w:t>
       </w:r>
     </w:p>
     <w:p>
@@ -5671,7 +5802,7 @@
           <w:szCs w:val="21"/>
           <w:rtl/>
         </w:rPr>
-        <w:t xml:space="preserve">الفاصل يحلّ محلّ شريحة التاريخ العادية في ذلك الموضع لأنه يحمل التاريخ أصلاً، فلا يجتمع فاصلان متتاليان.</w:t>
+        <w:t xml:space="preserve">الرقم لا يُخزَّن إلا إذا كُتب فعلاً، حتى لا يبقى رمز دولة معلّقاً بلا رقم في بيانات موظف تركه فارغاً.</w:t>
       </w:r>
     </w:p>
     <w:p>
@@ -5693,7 +5824,7 @@
           <w:szCs w:val="21"/>
           <w:rtl/>
         </w:rPr>
-        <w:t xml:space="preserve">لا يظهر قبل الدورة الأولى لأنها بداية المحادثة لا إعادة فتح لها.</w:t>
+        <w:t xml:space="preserve">عند فتح موظف للتعديل يُفصل الرقم المحفوظ إلى رمز دولة ورقم محلي بمطابقة أطول رمز مطابق من قائمة الدول — لا بتعبير نمطي جشع، لأن ذلك كان سيقرأ ‎+96891234567 على أنه ‎+9689 ثم يشوّه الرقم.</w:t>
       </w:r>
     </w:p>
     <w:p>
@@ -5715,7 +5846,7 @@
           <w:szCs w:val="21"/>
           <w:rtl/>
         </w:rPr>
-        <w:t xml:space="preserve">الدورة ذات البداية المستنتجة تُوسم «(تقديري)» في الفاصل نفسه، اتساقاً مع العلامة المتقطّعة في شريط الفهرسة.</w:t>
+        <w:t xml:space="preserve">الرقم يظهر في لوحة تفاصيل الموظف حين يكون موجوداً، فلا تُجمع بيانات لا تُعرض في أي مكان.</w:t>
       </w:r>
     </w:p>
     <w:p>
@@ -5737,7 +5868,7 @@
           <w:szCs w:val="21"/>
           <w:rtl/>
         </w:rPr>
-        <w:t xml:space="preserve">الترقيم يتبع رقم الدورة (الدورة 2، الدورة 3) لا رقم إعادة الفتح، ليطابق ما يعرضه شريط الفهرسة وحقل sessionCount ولا يتضارب معهما.</w:t>
+        <w:t xml:space="preserve">وُسّع توقيع inviteAgent ليقبل الحقل الجديد.</w:t>
       </w:r>
     </w:p>
     <w:p>
@@ -5759,7 +5890,7 @@
           <w:szCs w:val="21"/>
           <w:rtl/>
         </w:rPr>
-        <w:t xml:space="preserve">عوينت النتيجة في المتصفح: فاصلان بالرقمين الصحيحين، وشريحة التاريخ المكرّرة اختفت من موضعيهما.</w:t>
+        <w:t xml:space="preserve">عوينت النتيجة في المتصفح: الحقل ووسم الاختياري ظاهران، ودعوة موظف بلا رقم هاتف نجحت.</w:t>
       </w:r>
     </w:p>
     <w:p>
@@ -5784,7 +5915,7 @@
           <w:szCs w:val="24"/>
           <w:rtl/>
         </w:rPr>
-        <w:t xml:space="preserve">تعديل رقم 7 — انعكاس حالة «مجدولة» للتخفيض المؤجّل في بورتال العميل</w:t>
+        <w:t xml:space="preserve">تعديل رقم 8 — فاصل مرقّم بين دورات المحادثة داخل الثريد</w:t>
       </w:r>
     </w:p>
     <w:p>
@@ -6061,7 +6192,7 @@
                 <w:szCs w:val="19"/>
                 <w:rtl/>
               </w:rPr>
-              <w:t xml:space="preserve">الباقات والاشتراك</w:t>
+              <w:t xml:space="preserve">صندوق الوارد</w:t>
             </w:r>
           </w:p>
         </w:tc>
@@ -6091,7 +6222,7 @@
                 <w:szCs w:val="19"/>
                 <w:rtl/>
               </w:rPr>
-              <w:t xml:space="preserve">/billing</w:t>
+              <w:t xml:space="preserve">/inbox</w:t>
             </w:r>
           </w:p>
         </w:tc>
@@ -6121,7 +6252,7 @@
                 <w:szCs w:val="19"/>
                 <w:rtl/>
               </w:rPr>
-              <w:t xml:space="preserve">src/types/index.ts · src/pages/Billing.tsx · src/store/adminMockData.ts</w:t>
+              <w:t xml:space="preserve">src/pages/Inbox.tsx</w:t>
             </w:r>
           </w:p>
         </w:tc>
@@ -6151,7 +6282,7 @@
                 <w:szCs w:val="19"/>
                 <w:rtl/>
               </w:rPr>
-              <w:t xml:space="preserve">5202dba</w:t>
+              <w:t xml:space="preserve">f9b43fd</w:t>
             </w:r>
           </w:p>
         </w:tc>
@@ -6212,7 +6343,7 @@
           <w:szCs w:val="21"/>
           <w:rtl/>
         </w:rPr>
-        <w:t xml:space="preserve">الاشتراك الذي عليه تخفيض مؤجّل إلى تاريخ لاحق صارت حالته «مجدولة» ظاهرة للعميل، لا في بورتال الإدارة وحده.</w:t>
+        <w:t xml:space="preserve">كل دورة جديدة صار يسبقها فاصل أفقي ظاهر داخل الثريد، فيُعرف أين انتهت دورة وبدأت التي تليها من غير رجوع إلى شريط الفهرسة.</w:t>
       </w:r>
     </w:p>
     <w:p>
@@ -6234,7 +6365,7 @@
           <w:szCs w:val="21"/>
           <w:rtl/>
         </w:rPr>
-        <w:t xml:space="preserve">أُضيف الحقل scheduledChange إلى الاشتراك ويحمل الباقة المستهدفة ودورة الفوترة وتاريخ السريان، وأُضيفت «مجدولة» إلى حالات الفاتورة.</w:t>
+        <w:t xml:space="preserve">الفاصل يحمل رقم الدورة وكلمة «إعادة فتح» والتاريخ، فيجيب عن ثلاثة أسئلة في سطر: أي دورة، وماذا جرى، ومتى.</w:t>
       </w:r>
     </w:p>
     <w:p>
@@ -6256,7 +6387,7 @@
           <w:szCs w:val="21"/>
           <w:rtl/>
         </w:rPr>
-        <w:t xml:space="preserve">بطاقة الاشتراك تعرض شارة «مجدولة» وجملة صريحة تذكر اسم الباقة المستهدفة وتاريخ التحويل، وتؤكّد أن الباقة الحالية ومزاياها مستمرة حتى ذلك التاريخ — فلا يظن العميل أن باقته انخفضت الآن.</w:t>
+        <w:t xml:space="preserve">صيغته بلون العلامة التجارية بخطّين وشارة بارزة، لأن المطلوب أن يُلاحَظ لا أن يمرّ مرور الكرام.</w:t>
       </w:r>
     </w:p>
     <w:p>
@@ -6278,7 +6409,7 @@
           <w:szCs w:val="21"/>
           <w:rtl/>
         </w:rPr>
-        <w:t xml:space="preserve">جدول الفواتير وفلاترها ونافذة معاينة الفاتورة تعرض الحالة نفسها.</w:t>
+        <w:t xml:space="preserve">الفاصل يحلّ محلّ شريحة التاريخ العادية في ذلك الموضع لأنه يحمل التاريخ أصلاً، فلا يجتمع فاصلان متتاليان.</w:t>
       </w:r>
     </w:p>
     <w:p>
@@ -6300,7 +6431,7 @@
           <w:szCs w:val="21"/>
           <w:rtl/>
         </w:rPr>
-        <w:t xml:space="preserve">الحالة مشتقّة من الاشتراك لا مخزّنة على الفاتورة: إلغاء الجدولة يُزيلها من كل المواضع في آن واحد، بدل أن تبقى فاتورة تحمل حالة قديمة.</w:t>
+        <w:t xml:space="preserve">لا يظهر قبل الدورة الأولى لأنها بداية المحادثة لا إعادة فتح لها.</w:t>
       </w:r>
     </w:p>
     <w:p>
@@ -6322,7 +6453,7 @@
           <w:szCs w:val="21"/>
           <w:rtl/>
         </w:rPr>
-        <w:t xml:space="preserve">قرار مقصود: الاشتقاق يطال الفواتير غير المسدّدة فقط (معلّقة ومسودة). الفاتورة المدفوعة أو المستردة أو الملغاة أو الفاشلة تحتفظ بحالتها، وكذلك المتأخرة لأن التأخّر مشكلة سداد لا يصح حجبها خلف حالة الجدولة.</w:t>
+        <w:t xml:space="preserve">الدورة ذات البداية المستنتجة تُوسم «(تقديري)» في الفاصل نفسه، اتساقاً مع العلامة المتقطّعة في شريط الفهرسة.</w:t>
       </w:r>
     </w:p>
     <w:p>
@@ -6344,7 +6475,7 @@
           <w:szCs w:val="21"/>
           <w:rtl/>
         </w:rPr>
-        <w:t xml:space="preserve">زر «إلغاء الجدولة» إجراء إداري بحسب المواصفة، فبورتال العميل يعرض الحالة دون التحكم فيها.</w:t>
+        <w:t xml:space="preserve">الترقيم يتبع رقم الدورة (الدورة 2، الدورة 3) لا رقم إعادة الفتح، ليطابق ما يعرضه شريط الفهرسة وحقل sessionCount ولا يتضارب معهما.</w:t>
       </w:r>
     </w:p>
     <w:p>
@@ -6366,29 +6497,7 @@
           <w:szCs w:val="21"/>
           <w:rtl/>
         </w:rPr>
-        <w:t xml:space="preserve">أُضيفت جدولة تجريبية لعميل العرض (تحويل من الأعمال إلى الاحترافي بعد 15 يوماً) لتصير الحالة قابلة للمعاينة.</w:t>
-      </w:r>
-    </w:p>
-    <w:p>
-      <w:pPr>
-        <w:pStyle w:val="ListParagraph"/>
-        <w:numPr>
-          <w:ilvl w:val="0"/>
-          <w:numId w:val="2"/>
-        </w:numPr>
-        <w:bidi/>
-        <w:spacing w:after="70" w:line="290"/>
-        <w:jc w:val="right"/>
-      </w:pPr>
-      <w:r>
-        <w:rPr>
-          <w:rFonts w:ascii="Arial" w:cs="Arial" w:eastAsia="Arial" w:hAnsi="Arial"/>
-          <w:color w:val="1E293B"/>
-          <w:sz w:val="21"/>
-          <w:szCs w:val="21"/>
-          <w:rtl/>
-        </w:rPr>
-        <w:t xml:space="preserve">عوينت النتيجة في المتصفح: الشارة والجملة والفلتر وحالتا الفاتورتين غير المسدّدتين ظهرت، والفاتورتان المدفوعتان بقيتا «مدفوعة».</w:t>
+        <w:t xml:space="preserve">عوينت النتيجة في المتصفح: فاصلان بالرقمين الصحيحين، وشريحة التاريخ المكرّرة اختفت من موضعيهما.</w:t>
       </w:r>
     </w:p>
     <w:p>
@@ -6413,7 +6522,7 @@
           <w:szCs w:val="24"/>
           <w:rtl/>
         </w:rPr>
-        <w:t xml:space="preserve">تعديل رقم 6 — إعادة تصميم شريط الفهرسة على هيئة مسطرة تظهر عند الاقتراب</w:t>
+        <w:t xml:space="preserve">تعديل رقم 7 — انعكاس حالة «مجدولة» للتخفيض المؤجّل في بورتال العميل</w:t>
       </w:r>
     </w:p>
     <w:p>
@@ -6690,7 +6799,7 @@
                 <w:szCs w:val="19"/>
                 <w:rtl/>
               </w:rPr>
-              <w:t xml:space="preserve">صندوق الوارد</w:t>
+              <w:t xml:space="preserve">الباقات والاشتراك</w:t>
             </w:r>
           </w:p>
         </w:tc>
@@ -6720,7 +6829,7 @@
                 <w:szCs w:val="19"/>
                 <w:rtl/>
               </w:rPr>
-              <w:t xml:space="preserve">/inbox</w:t>
+              <w:t xml:space="preserve">/billing</w:t>
             </w:r>
           </w:p>
         </w:tc>
@@ -6750,7 +6859,7 @@
                 <w:szCs w:val="19"/>
                 <w:rtl/>
               </w:rPr>
-              <w:t xml:space="preserve">src/components/inbox/SessionRail.tsx · src/pages/Inbox.tsx</w:t>
+              <w:t xml:space="preserve">src/types/index.ts · src/pages/Billing.tsx · src/store/adminMockData.ts</w:t>
             </w:r>
           </w:p>
         </w:tc>
@@ -6780,7 +6889,7 @@
                 <w:szCs w:val="19"/>
                 <w:rtl/>
               </w:rPr>
-              <w:t xml:space="preserve">4163939</w:t>
+              <w:t xml:space="preserve">5202dba</w:t>
             </w:r>
           </w:p>
         </w:tc>
@@ -6841,7 +6950,7 @@
           <w:szCs w:val="21"/>
           <w:rtl/>
         </w:rPr>
-        <w:t xml:space="preserve">الشكل السابق كان كتلاً سميكة بينها فجوات، فكان يُقرأ كشريط تقدّم مكسور لا كأداة تنقّل. صار الآن مسطرة: خطّ شعري على حافة الثريد وعليه علامات رفيعة عند بدايات الدورات.</w:t>
+        <w:t xml:space="preserve">الاشتراك الذي عليه تخفيض مؤجّل إلى تاريخ لاحق صارت حالته «مجدولة» ظاهرة للعميل، لا في بورتال الإدارة وحده.</w:t>
       </w:r>
     </w:p>
     <w:p>
@@ -6863,7 +6972,7 @@
           <w:szCs w:val="21"/>
           <w:rtl/>
         </w:rPr>
-        <w:t xml:space="preserve">العلامات مجمّعة في منتصف ارتفاع الحافة كمجموعة واحدة مرتّبة، لا موزّعة على كامل الطول.</w:t>
+        <w:t xml:space="preserve">أُضيف الحقل scheduledChange إلى الاشتراك ويحمل الباقة المستهدفة ودورة الفوترة وتاريخ السريان، وأُضيفت «مجدولة» إلى حالات الفاتورة.</w:t>
       </w:r>
     </w:p>
     <w:p>
@@ -6885,7 +6994,7 @@
           <w:szCs w:val="21"/>
           <w:rtl/>
         </w:rPr>
-        <w:t xml:space="preserve">جُرّب توزيعها على مواضعها النسبية من ارتفاع التمرير أولاً، ثم استُبدل بالتجميع في المنتصف بقرار من الإدارة: الشكل المرتّب فُضّل على دلالة الموضع. أُزيل معه كود القياس ومراقب تغيّر الحجم لأنه لم يعد له عمل.</w:t>
+        <w:t xml:space="preserve">بطاقة الاشتراك تعرض شارة «مجدولة» وجملة صريحة تذكر اسم الباقة المستهدفة وتاريخ التحويل، وتؤكّد أن الباقة الحالية ومزاياها مستمرة حتى ذلك التاريخ — فلا يظن العميل أن باقته انخفضت الآن.</w:t>
       </w:r>
     </w:p>
     <w:p>
@@ -6907,7 +7016,7 @@
           <w:szCs w:val="21"/>
           <w:rtl/>
         </w:rPr>
-        <w:t xml:space="preserve">المسطرة باهتة في الوضع العادي وتتوضّح بالكامل عند اقتراب المؤشر من الحافة أو عند وصول لوحة المفاتيح إليها.</w:t>
+        <w:t xml:space="preserve">جدول الفواتير وفلاترها ونافذة معاينة الفاتورة تعرض الحالة نفسها.</w:t>
       </w:r>
     </w:p>
     <w:p>
@@ -6929,7 +7038,7 @@
           <w:szCs w:val="21"/>
           <w:rtl/>
         </w:rPr>
-        <w:t xml:space="preserve">أُبقي أثر خافت دائم بدل الإخفاء التام: ميزة لا يدل عليها شيء لا يعرفها أحد، والإخفاء الكامل كان سيجعلها غير قابلة للاكتشاف.</w:t>
+        <w:t xml:space="preserve">الحالة مشتقّة من الاشتراك لا مخزّنة على الفاتورة: إلغاء الجدولة يُزيلها من كل المواضع في آن واحد، بدل أن تبقى فاتورة تحمل حالة قديمة.</w:t>
       </w:r>
     </w:p>
     <w:p>
@@ -6951,7 +7060,7 @@
           <w:szCs w:val="21"/>
           <w:rtl/>
         </w:rPr>
-        <w:t xml:space="preserve">صارت طبقة عائمة (overlay) بدل عمود يحجز عرضاً ثابتاً، فرجع نحو 36 بكسل لمساحة الرسائل.</w:t>
+        <w:t xml:space="preserve">قرار مقصود: الاشتقاق يطال الفواتير غير المسدّدة فقط (معلّقة ومسودة). الفاتورة المدفوعة أو المستردة أو الملغاة أو الفاشلة تحتفظ بحالتها، وكذلك المتأخرة لأن التأخّر مشكلة سداد لا يصح حجبها خلف حالة الجدولة.</w:t>
       </w:r>
     </w:p>
     <w:p>
@@ -6973,7 +7082,7 @@
           <w:szCs w:val="21"/>
           <w:rtl/>
         </w:rPr>
-        <w:t xml:space="preserve">وُضعت بعد شريط التمرير بمقدار 8 بكسل حتى لا تحجب سحبه.</w:t>
+        <w:t xml:space="preserve">زر «إلغاء الجدولة» إجراء إداري بحسب المواصفة، فبورتال العميل يعرض الحالة دون التحكم فيها.</w:t>
       </w:r>
     </w:p>
     <w:p>
@@ -6995,7 +7104,7 @@
           <w:szCs w:val="21"/>
           <w:rtl/>
         </w:rPr>
-        <w:t xml:space="preserve">التمييز بين المؤكَّد والمقدَّر بقي قائماً بصرياً: علامة متصلة للدورة المسجّلة، ومتقطّعة للمستنتَجة، مع بقاء «بداية تقديرية» في التلميح.</w:t>
+        <w:t xml:space="preserve">أُضيفت جدولة تجريبية لعميل العرض (تحويل من الأعمال إلى الاحترافي بعد 15 يوماً) لتصير الحالة قابلة للمعاينة.</w:t>
       </w:r>
     </w:p>
     <w:p>
@@ -7017,51 +7126,7 @@
           <w:szCs w:val="21"/>
           <w:rtl/>
         </w:rPr>
-        <w:t xml:space="preserve">تنازل مقصود: الشكل السابق كان يعبّر عن حجم كل دورة بارتفاعها، والمسطرة لا تفعل. حجم الدورة انتقل إلى التلميح.</w:t>
-      </w:r>
-    </w:p>
-    <w:p>
-      <w:pPr>
-        <w:pStyle w:val="ListParagraph"/>
-        <w:numPr>
-          <w:ilvl w:val="0"/>
-          <w:numId w:val="2"/>
-        </w:numPr>
-        <w:bidi/>
-        <w:spacing w:after="70" w:line="290"/>
-        <w:jc w:val="right"/>
-      </w:pPr>
-      <w:r>
-        <w:rPr>
-          <w:rFonts w:ascii="Arial" w:cs="Arial" w:eastAsia="Arial" w:hAnsi="Arial"/>
-          <w:color w:val="1E293B"/>
-          <w:sz w:val="21"/>
-          <w:szCs w:val="21"/>
-          <w:rtl/>
-        </w:rPr>
-        <w:t xml:space="preserve">مجموعة العلامات تقبل التمرير داخلها إن كثرت الدورات حتى لا تتجاوز ارتفاع اللوحة. ولأن ذلك يقصّ التلميح، رُفع التلميح خارج المجموعة ويُحاذى رأسياً بالعلامة المؤشَّر عليها بالقياس.</w:t>
-      </w:r>
-    </w:p>
-    <w:p>
-      <w:pPr>
-        <w:pStyle w:val="ListParagraph"/>
-        <w:numPr>
-          <w:ilvl w:val="0"/>
-          <w:numId w:val="2"/>
-        </w:numPr>
-        <w:bidi/>
-        <w:spacing w:after="70" w:line="290"/>
-        <w:jc w:val="right"/>
-      </w:pPr>
-      <w:r>
-        <w:rPr>
-          <w:rFonts w:ascii="Arial" w:cs="Arial" w:eastAsia="Arial" w:hAnsi="Arial"/>
-          <w:color w:val="1E293B"/>
-          <w:sz w:val="21"/>
-          <w:szCs w:val="21"/>
-          <w:rtl/>
-        </w:rPr>
-        <w:t xml:space="preserve">عوينت النتيجة في المتصفح: العلامات الثلاث متجمّعة في المنتصف، والتوضّح بالاقتراب والتلميح والانتقال تعمل.</w:t>
+        <w:t xml:space="preserve">عوينت النتيجة في المتصفح: الشارة والجملة والفلتر وحالتا الفاتورتين غير المسدّدتين ظهرت، والفاتورتان المدفوعتان بقيتا «مدفوعة».</w:t>
       </w:r>
     </w:p>
     <w:p>
@@ -7086,7 +7151,7 @@
           <w:szCs w:val="24"/>
           <w:rtl/>
         </w:rPr>
-        <w:t xml:space="preserve">تعديل رقم 5 — شريط فهرسة دورات المحادثة داخل الثريد</w:t>
+        <w:t xml:space="preserve">تعديل رقم 6 — إعادة تصميم شريط الفهرسة على هيئة مسطرة تظهر عند الاقتراب</w:t>
       </w:r>
     </w:p>
     <w:p>
@@ -7423,7 +7488,7 @@
                 <w:szCs w:val="19"/>
                 <w:rtl/>
               </w:rPr>
-              <w:t xml:space="preserve">src/components/inbox/SessionRail.tsx · src/pages/Inbox.tsx · src/store/mockData.ts</w:t>
+              <w:t xml:space="preserve">src/components/inbox/SessionRail.tsx · src/pages/Inbox.tsx</w:t>
             </w:r>
           </w:p>
         </w:tc>
@@ -7453,7 +7518,7 @@
                 <w:szCs w:val="19"/>
                 <w:rtl/>
               </w:rPr>
-              <w:t xml:space="preserve">e05e715</w:t>
+              <w:t xml:space="preserve">4163939</w:t>
             </w:r>
           </w:p>
         </w:tc>
@@ -7514,7 +7579,7 @@
           <w:szCs w:val="21"/>
           <w:rtl/>
         </w:rPr>
-        <w:t xml:space="preserve">شريط رأسي على حافة الثريد يقسّمه إلى دورات فتح وإغلاق، ليصل الموظف إلى بداية أي دورة في المحادثات الطويلة التي تُعاد فتحها مراراً.</w:t>
+        <w:t xml:space="preserve">الشكل السابق كان كتلاً سميكة بينها فجوات، فكان يُقرأ كشريط تقدّم مكسور لا كأداة تنقّل. صار الآن مسطرة: خطّ شعري على حافة الثريد وعليه علامات رفيعة عند بدايات الدورات.</w:t>
       </w:r>
     </w:p>
     <w:p>
@@ -7536,7 +7601,7 @@
           <w:szCs w:val="21"/>
           <w:rtl/>
         </w:rPr>
-        <w:t xml:space="preserve">ارتفاع كل مقطع يتناسب مع عدد رسائله، فيعطي إحساساً بحجم كل دورة قبل الدخول إليها.</w:t>
+        <w:t xml:space="preserve">العلامات مجمّعة في منتصف ارتفاع الحافة كمجموعة واحدة مرتّبة، لا موزّعة على كامل الطول.</w:t>
       </w:r>
     </w:p>
     <w:p>
@@ -7558,7 +7623,7 @@
           <w:szCs w:val="21"/>
           <w:rtl/>
         </w:rPr>
-        <w:t xml:space="preserve">المرور على المقطع يُظهر اليوم والتاريخ وعدد الرسائل — «اليوم» و«أمس» لما قرُب، واسم اليوم لما بعُد.</w:t>
+        <w:t xml:space="preserve">جُرّب توزيعها على مواضعها النسبية من ارتفاع التمرير أولاً، ثم استُبدل بالتجميع في المنتصف بقرار من الإدارة: الشكل المرتّب فُضّل على دلالة الموضع. أُزيل معه كود القياس ومراقب تغيّر الحجم لأنه لم يعد له عمل.</w:t>
       </w:r>
     </w:p>
     <w:p>
@@ -7580,7 +7645,7 @@
           <w:szCs w:val="21"/>
           <w:rtl/>
         </w:rPr>
-        <w:t xml:space="preserve">الضغط ينقل إلى أول رسالة في الدورة، والمقطع الذي يقابل موضع القراءة الحالي يُبرَز تلقائياً أثناء التمرير.</w:t>
+        <w:t xml:space="preserve">المسطرة باهتة في الوضع العادي وتتوضّح بالكامل عند اقتراب المؤشر من الحافة أو عند وصول لوحة المفاتيح إليها.</w:t>
       </w:r>
     </w:p>
     <w:p>
@@ -7602,7 +7667,7 @@
           <w:szCs w:val="21"/>
           <w:rtl/>
         </w:rPr>
-        <w:t xml:space="preserve">المقاطع ذات البداية المستنتجة تُعرض بحدّ متقطّع ويذكر التلميح «بداية تقديرية»، فيبقى الفرق بين المؤكَّد والمقدَّر ظاهراً للموظف لا مخفياً عنه.</w:t>
+        <w:t xml:space="preserve">أُبقي أثر خافت دائم بدل الإخفاء التام: ميزة لا يدل عليها شيء لا يعرفها أحد، والإخفاء الكامل كان سيجعلها غير قابلة للاكتشاف.</w:t>
       </w:r>
     </w:p>
     <w:p>
@@ -7624,7 +7689,7 @@
           <w:szCs w:val="21"/>
           <w:rtl/>
         </w:rPr>
-        <w:t xml:space="preserve">الشريط يختفي كلياً حين تكون المحادثة دورة واحدة، فلا معنى لفهرس لا يفهرس شيئاً.</w:t>
+        <w:t xml:space="preserve">صارت طبقة عائمة (overlay) بدل عمود يحجز عرضاً ثابتاً، فرجع نحو 36 بكسل لمساحة الرسائل.</w:t>
       </w:r>
     </w:p>
     <w:p>
@@ -7646,7 +7711,7 @@
           <w:szCs w:val="21"/>
           <w:rtl/>
         </w:rPr>
-        <w:t xml:space="preserve">الدورات الخالية من الرسائل مستبعدة من الشريط بقرار مقصود — لا شيء يمكن الانتقال إليه فيها.</w:t>
+        <w:t xml:space="preserve">وُضعت بعد شريط التمرير بمقدار 8 بكسل حتى لا تحجب سحبه.</w:t>
       </w:r>
     </w:p>
     <w:p>
@@ -7668,7 +7733,7 @@
           <w:szCs w:val="21"/>
           <w:rtl/>
         </w:rPr>
-        <w:t xml:space="preserve">وُزّعت رسائل محادثة أحمد الشعيلي التجريبية على ثلاث دورات عبر ثلاثة أشهر لتصير الميزة قابلة للمعاينة، وصار sessionCount فيها مطابقاً للواقع بعد أن كان رقماً مكتوباً بلا سند. آخر دورة مسجّلة بحدث حقيقي وما قبلها مستنتج، ليظهر الشكلان معاً.</w:t>
+        <w:t xml:space="preserve">التمييز بين المؤكَّد والمقدَّر بقي قائماً بصرياً: علامة متصلة للدورة المسجّلة، ومتقطّعة للمستنتَجة، مع بقاء «بداية تقديرية» في التلميح.</w:t>
       </w:r>
     </w:p>
     <w:p>
@@ -7690,7 +7755,51 @@
           <w:szCs w:val="21"/>
           <w:rtl/>
         </w:rPr>
-        <w:t xml:space="preserve">عوينت النتيجة في المتصفح: الشريط والتلميح والانتقال والإبراز تعمل في الوضعين الفاتح والليلي، والمحادثات أحادية الدورة سليمة بلا شريط.</w:t>
+        <w:t xml:space="preserve">تنازل مقصود: الشكل السابق كان يعبّر عن حجم كل دورة بارتفاعها، والمسطرة لا تفعل. حجم الدورة انتقل إلى التلميح.</w:t>
+      </w:r>
+    </w:p>
+    <w:p>
+      <w:pPr>
+        <w:pStyle w:val="ListParagraph"/>
+        <w:numPr>
+          <w:ilvl w:val="0"/>
+          <w:numId w:val="2"/>
+        </w:numPr>
+        <w:bidi/>
+        <w:spacing w:after="70" w:line="290"/>
+        <w:jc w:val="right"/>
+      </w:pPr>
+      <w:r>
+        <w:rPr>
+          <w:rFonts w:ascii="Arial" w:cs="Arial" w:eastAsia="Arial" w:hAnsi="Arial"/>
+          <w:color w:val="1E293B"/>
+          <w:sz w:val="21"/>
+          <w:szCs w:val="21"/>
+          <w:rtl/>
+        </w:rPr>
+        <w:t xml:space="preserve">مجموعة العلامات تقبل التمرير داخلها إن كثرت الدورات حتى لا تتجاوز ارتفاع اللوحة. ولأن ذلك يقصّ التلميح، رُفع التلميح خارج المجموعة ويُحاذى رأسياً بالعلامة المؤشَّر عليها بالقياس.</w:t>
+      </w:r>
+    </w:p>
+    <w:p>
+      <w:pPr>
+        <w:pStyle w:val="ListParagraph"/>
+        <w:numPr>
+          <w:ilvl w:val="0"/>
+          <w:numId w:val="2"/>
+        </w:numPr>
+        <w:bidi/>
+        <w:spacing w:after="70" w:line="290"/>
+        <w:jc w:val="right"/>
+      </w:pPr>
+      <w:r>
+        <w:rPr>
+          <w:rFonts w:ascii="Arial" w:cs="Arial" w:eastAsia="Arial" w:hAnsi="Arial"/>
+          <w:color w:val="1E293B"/>
+          <w:sz w:val="21"/>
+          <w:szCs w:val="21"/>
+          <w:rtl/>
+        </w:rPr>
+        <w:t xml:space="preserve">عوينت النتيجة في المتصفح: العلامات الثلاث متجمّعة في المنتصف، والتوضّح بالاقتراب والتلميح والانتقال تعمل.</w:t>
       </w:r>
     </w:p>
     <w:p>
@@ -7715,7 +7824,7 @@
           <w:szCs w:val="24"/>
           <w:rtl/>
         </w:rPr>
-        <w:t xml:space="preserve">تعديل رقم 4 — تسجيل دورات المحادثة واشتقاقها — أساس شريط فهرسة الثريد</w:t>
+        <w:t xml:space="preserve">تعديل رقم 5 — شريط فهرسة دورات المحادثة داخل الثريد</w:t>
       </w:r>
     </w:p>
     <w:p>
@@ -7992,7 +8101,7 @@
                 <w:szCs w:val="19"/>
                 <w:rtl/>
               </w:rPr>
-              <w:t xml:space="preserve">صندوق الوارد (طبقة البيانات)</w:t>
+              <w:t xml:space="preserve">صندوق الوارد</w:t>
             </w:r>
           </w:p>
         </w:tc>
@@ -8052,7 +8161,7 @@
                 <w:szCs w:val="19"/>
                 <w:rtl/>
               </w:rPr>
-              <w:t xml:space="preserve">src/utils/sessions.ts · src/store/useDataStore.ts · src/types/index.ts</w:t>
+              <w:t xml:space="preserve">src/components/inbox/SessionRail.tsx · src/pages/Inbox.tsx · src/store/mockData.ts</w:t>
             </w:r>
           </w:p>
         </w:tc>
@@ -8082,7 +8191,7 @@
                 <w:szCs w:val="19"/>
                 <w:rtl/>
               </w:rPr>
-              <w:t xml:space="preserve">5cf29e1</w:t>
+              <w:t xml:space="preserve">e05e715</w:t>
             </w:r>
           </w:p>
         </w:tc>
@@ -8143,7 +8252,7 @@
           <w:szCs w:val="21"/>
           <w:rtl/>
         </w:rPr>
-        <w:t xml:space="preserve">المشكلة: المحادثة الواحدة تُعاد فتحها كلما راسل العميل بعد الإغلاق، فيصير الثريد بلا نهاية. ولرسم شريط فهرسة يقسّمه إلى دورات، لزم معرفة توقيت كل فتح وإغلاق — وهي بيانات لم تكن تُسجَّل إطلاقاً.</w:t>
+        <w:t xml:space="preserve">شريط رأسي على حافة الثريد يقسّمه إلى دورات فتح وإغلاق، ليصل الموظف إلى بداية أي دورة في المحادثات الطويلة التي تُعاد فتحها مراراً.</w:t>
       </w:r>
     </w:p>
     <w:p>
@@ -8165,7 +8274,7 @@
           <w:szCs w:val="21"/>
           <w:rtl/>
         </w:rPr>
-        <w:t xml:space="preserve">كان الحقل sessionCount يُكتب مرة واحدة عند الإنشاء ولا يزيده أي سطر في المشروع، وقيمه في البيانات التجريبية مكتوبة يدوياً. كذلك activityLog على المحادثة كان مُعرَّفاً في الأنواع لكن لا دالة تكتب فيه وقت التشغيل.</w:t>
+        <w:t xml:space="preserve">ارتفاع كل مقطع يتناسب مع عدد رسائله، فيعطي إحساساً بحجم كل دورة قبل الدخول إليها.</w:t>
       </w:r>
     </w:p>
     <w:p>
@@ -8187,7 +8296,7 @@
           <w:szCs w:val="21"/>
           <w:rtl/>
         </w:rPr>
-        <w:t xml:space="preserve">أُضيف النوع SessionEvent لتسجيل حدث فتح أو إغلاق بتوقيته وصاحبه، والنوع ConversationSession يمثّل الدورة المشتقّة.</w:t>
+        <w:t xml:space="preserve">المرور على المقطع يُظهر اليوم والتاريخ وعدد الرسائل — «اليوم» و«أمس» لما قرُب، واسم اليوم لما بعُد.</w:t>
       </w:r>
     </w:p>
     <w:p>
@@ -8209,7 +8318,7 @@
           <w:szCs w:val="21"/>
           <w:rtl/>
         </w:rPr>
-        <w:t xml:space="preserve">صارت أربعة مواضع تسجّل الحدث فعلياً: setConversationStatus عند الإغلاق أو إعادة الفتح، reopenConversation، ورسالة العميل الواردة نصية أو صوتية حين تُحيي محادثة مغلقة — وهذا آخرها كان يمرّ بلا أي أثر رغم أنه أكثرها تكراراً.</w:t>
+        <w:t xml:space="preserve">الضغط ينقل إلى أول رسالة في الدورة، والمقطع الذي يقابل موضع القراءة الحالي يُبرَز تلقائياً أثناء التمرير.</w:t>
       </w:r>
     </w:p>
     <w:p>
@@ -8231,7 +8340,7 @@
           <w:szCs w:val="21"/>
           <w:rtl/>
         </w:rPr>
-        <w:t xml:space="preserve">أُضيفت الدالة deriveSessions التي تقسّم الثريد إلى دورات: الأحداث المسجّلة مرجع قاطع، وما سبقها من تاريخ قديم تُستنتج حدوده من فجوات الصمت (24 ساعة افتراضاً) وتُعلَّم inferred حتى يظل الفرق بين المؤكَّد والمقدَّر ظاهراً.</w:t>
+        <w:t xml:space="preserve">المقاطع ذات البداية المستنتجة تُعرض بحدّ متقطّع ويذكر التلميح «بداية تقديرية»، فيبقى الفرق بين المؤكَّد والمقدَّر ظاهراً للموظف لا مخفياً عنه.</w:t>
       </w:r>
     </w:p>
     <w:p>
@@ -8253,7 +8362,7 @@
           <w:szCs w:val="21"/>
           <w:rtl/>
         </w:rPr>
-        <w:t xml:space="preserve">الدالة تتعامل مع الحالة المختلطة: ثريد فيه تاريخ قديم مُستنتج ودورات جديدة مسجّلة في آن واحد.</w:t>
+        <w:t xml:space="preserve">الشريط يختفي كلياً حين تكون المحادثة دورة واحدة، فلا معنى لفهرس لا يفهرس شيئاً.</w:t>
       </w:r>
     </w:p>
     <w:p>
@@ -8275,7 +8384,7 @@
           <w:szCs w:val="21"/>
           <w:rtl/>
         </w:rPr>
-        <w:t xml:space="preserve">اختُبر المنطق على ثماني حالات شملت الثريد الفارغ والرسالة الواحدة والفجوات المتعددة والأحداث المسجّلة والحالة المختلطة والمدخلات غير المرتّبة زمنياً — جميعها نجحت.</w:t>
+        <w:t xml:space="preserve">الدورات الخالية من الرسائل مستبعدة من الشريط بقرار مقصود — لا شيء يمكن الانتقال إليه فيها.</w:t>
       </w:r>
     </w:p>
     <w:p>
@@ -8297,7 +8406,7 @@
           <w:szCs w:val="21"/>
           <w:rtl/>
         </w:rPr>
-        <w:t xml:space="preserve">ملاحظة على البيانات الحالية: كل المحادثات التجريبية تُنتج دورة واحدة لأن رسائلها متقاربة بدقائق ولا فجوات فيها. الشريط لن يُظهر تقسيماً حقيقياً قبل توفّر بيانات متباعدة زمنياً.</w:t>
+        <w:t xml:space="preserve">وُزّعت رسائل محادثة أحمد الشعيلي التجريبية على ثلاث دورات عبر ثلاثة أشهر لتصير الميزة قابلة للمعاينة، وصار sessionCount فيها مطابقاً للواقع بعد أن كان رقماً مكتوباً بلا سند. آخر دورة مسجّلة بحدث حقيقي وما قبلها مستنتج، ليظهر الشكلان معاً.</w:t>
       </w:r>
     </w:p>
     <w:p>
@@ -8319,7 +8428,7 @@
           <w:szCs w:val="21"/>
           <w:rtl/>
         </w:rPr>
-        <w:t xml:space="preserve">لم تُبنَ واجهة الشريط بعد — هذا التعديل يغطّي طبقة البيانات وحدها.</w:t>
+        <w:t xml:space="preserve">عوينت النتيجة في المتصفح: الشريط والتلميح والانتقال والإبراز تعمل في الوضعين الفاتح والليلي، والمحادثات أحادية الدورة سليمة بلا شريط.</w:t>
       </w:r>
     </w:p>
     <w:p>
@@ -8344,7 +8453,7 @@
           <w:szCs w:val="24"/>
           <w:rtl/>
         </w:rPr>
-        <w:t xml:space="preserve">تعديل رقم 3 — إزالة كارت نسبة الاستجابة من صفحة تقييمات العملاء</w:t>
+        <w:t xml:space="preserve">تعديل رقم 4 — تسجيل دورات المحادثة واشتقاقها — أساس شريط فهرسة الثريد</w:t>
       </w:r>
     </w:p>
     <w:p>
@@ -8621,7 +8730,7 @@
                 <w:szCs w:val="19"/>
                 <w:rtl/>
               </w:rPr>
-              <w:t xml:space="preserve">تقييمات العملاء</w:t>
+              <w:t xml:space="preserve">صندوق الوارد (طبقة البيانات)</w:t>
             </w:r>
           </w:p>
         </w:tc>
@@ -8651,7 +8760,7 @@
                 <w:szCs w:val="19"/>
                 <w:rtl/>
               </w:rPr>
-              <w:t xml:space="preserve">/rating</w:t>
+              <w:t xml:space="preserve">/inbox</w:t>
             </w:r>
           </w:p>
         </w:tc>
@@ -8681,7 +8790,7 @@
                 <w:szCs w:val="19"/>
                 <w:rtl/>
               </w:rPr>
-              <w:t xml:space="preserve">src/pages/CustomerRatings.tsx</w:t>
+              <w:t xml:space="preserve">src/utils/sessions.ts · src/store/useDataStore.ts · src/types/index.ts</w:t>
             </w:r>
           </w:p>
         </w:tc>
@@ -8711,7 +8820,7 @@
                 <w:szCs w:val="19"/>
                 <w:rtl/>
               </w:rPr>
-              <w:t xml:space="preserve">cc8bd4f</w:t>
+              <w:t xml:space="preserve">5cf29e1</w:t>
             </w:r>
           </w:p>
         </w:tc>
@@ -8772,7 +8881,7 @@
           <w:szCs w:val="21"/>
           <w:rtl/>
         </w:rPr>
-        <w:t xml:space="preserve">حُذف كارت «نسبة الاستجابة» بالكامل من شريط الإحصائيات — صارت 3 كروت بدل 4.</w:t>
+        <w:t xml:space="preserve">المشكلة: المحادثة الواحدة تُعاد فتحها كلما راسل العميل بعد الإغلاق، فيصير الثريد بلا نهاية. ولرسم شريط فهرسة يقسّمه إلى دورات، لزم معرفة توقيت كل فتح وإغلاق — وهي بيانات لم تكن تُسجَّل إطلاقاً.</w:t>
       </w:r>
     </w:p>
     <w:p>
@@ -8794,7 +8903,7 @@
           <w:szCs w:val="21"/>
           <w:rtl/>
         </w:rPr>
-        <w:t xml:space="preserve">حُذف معه حساب responseRate لأنه لم يعد له مستهلك في الصفحة.</w:t>
+        <w:t xml:space="preserve">كان الحقل sessionCount يُكتب مرة واحدة عند الإنشاء ولا يزيده أي سطر في المشروع، وقيمه في البيانات التجريبية مكتوبة يدوياً. كذلك activityLog على المحادثة كان مُعرَّفاً في الأنواع لكن لا دالة تكتب فيه وقت التشغيل.</w:t>
       </w:r>
     </w:p>
     <w:p>
@@ -8816,7 +8925,7 @@
           <w:szCs w:val="21"/>
           <w:rtl/>
         </w:rPr>
-        <w:t xml:space="preserve">حُذف استيراد أيقونة TrendingUp لأنها كانت مستخدمة في هذا الكارت وحده.</w:t>
+        <w:t xml:space="preserve">أُضيف النوع SessionEvent لتسجيل حدث فتح أو إغلاق بتوقيته وصاحبه، والنوع ConversationSession يمثّل الدورة المشتقّة.</w:t>
       </w:r>
     </w:p>
     <w:p>
@@ -8838,7 +8947,7 @@
           <w:szCs w:val="21"/>
           <w:rtl/>
         </w:rPr>
-        <w:t xml:space="preserve">عُدّلت شبكة العرض من grid-cols-2 lg:grid-cols-4 إلى grid-cols-1 sm:grid-cols-3، حتى لا يبقى كارت يتيم في سطر منفصل على الشاشات الصغيرة.</w:t>
+        <w:t xml:space="preserve">صارت أربعة مواضع تسجّل الحدث فعلياً: setConversationStatus عند الإغلاق أو إعادة الفتح، reopenConversation، ورسالة العميل الواردة نصية أو صوتية حين تُحيي محادثة مغلقة — وهذا آخرها كان يمرّ بلا أي أثر رغم أنه أكثرها تكراراً.</w:t>
       </w:r>
     </w:p>
     <w:p>
@@ -8860,7 +8969,95 @@
           <w:szCs w:val="21"/>
           <w:rtl/>
         </w:rPr>
-        <w:t xml:space="preserve">الكروت الباقية: متوسط تقييم المحادثة، متوسط تقييم الموظفين، إجمالي الروابط.</w:t>
+        <w:t xml:space="preserve">أُضيفت الدالة deriveSessions التي تقسّم الثريد إلى دورات: الأحداث المسجّلة مرجع قاطع، وما سبقها من تاريخ قديم تُستنتج حدوده من فجوات الصمت (24 ساعة افتراضاً) وتُعلَّم inferred حتى يظل الفرق بين المؤكَّد والمقدَّر ظاهراً.</w:t>
+      </w:r>
+    </w:p>
+    <w:p>
+      <w:pPr>
+        <w:pStyle w:val="ListParagraph"/>
+        <w:numPr>
+          <w:ilvl w:val="0"/>
+          <w:numId w:val="2"/>
+        </w:numPr>
+        <w:bidi/>
+        <w:spacing w:after="70" w:line="290"/>
+        <w:jc w:val="right"/>
+      </w:pPr>
+      <w:r>
+        <w:rPr>
+          <w:rFonts w:ascii="Arial" w:cs="Arial" w:eastAsia="Arial" w:hAnsi="Arial"/>
+          <w:color w:val="1E293B"/>
+          <w:sz w:val="21"/>
+          <w:szCs w:val="21"/>
+          <w:rtl/>
+        </w:rPr>
+        <w:t xml:space="preserve">الدالة تتعامل مع الحالة المختلطة: ثريد فيه تاريخ قديم مُستنتج ودورات جديدة مسجّلة في آن واحد.</w:t>
+      </w:r>
+    </w:p>
+    <w:p>
+      <w:pPr>
+        <w:pStyle w:val="ListParagraph"/>
+        <w:numPr>
+          <w:ilvl w:val="0"/>
+          <w:numId w:val="2"/>
+        </w:numPr>
+        <w:bidi/>
+        <w:spacing w:after="70" w:line="290"/>
+        <w:jc w:val="right"/>
+      </w:pPr>
+      <w:r>
+        <w:rPr>
+          <w:rFonts w:ascii="Arial" w:cs="Arial" w:eastAsia="Arial" w:hAnsi="Arial"/>
+          <w:color w:val="1E293B"/>
+          <w:sz w:val="21"/>
+          <w:szCs w:val="21"/>
+          <w:rtl/>
+        </w:rPr>
+        <w:t xml:space="preserve">اختُبر المنطق على ثماني حالات شملت الثريد الفارغ والرسالة الواحدة والفجوات المتعددة والأحداث المسجّلة والحالة المختلطة والمدخلات غير المرتّبة زمنياً — جميعها نجحت.</w:t>
+      </w:r>
+    </w:p>
+    <w:p>
+      <w:pPr>
+        <w:pStyle w:val="ListParagraph"/>
+        <w:numPr>
+          <w:ilvl w:val="0"/>
+          <w:numId w:val="2"/>
+        </w:numPr>
+        <w:bidi/>
+        <w:spacing w:after="70" w:line="290"/>
+        <w:jc w:val="right"/>
+      </w:pPr>
+      <w:r>
+        <w:rPr>
+          <w:rFonts w:ascii="Arial" w:cs="Arial" w:eastAsia="Arial" w:hAnsi="Arial"/>
+          <w:color w:val="1E293B"/>
+          <w:sz w:val="21"/>
+          <w:szCs w:val="21"/>
+          <w:rtl/>
+        </w:rPr>
+        <w:t xml:space="preserve">ملاحظة على البيانات الحالية: كل المحادثات التجريبية تُنتج دورة واحدة لأن رسائلها متقاربة بدقائق ولا فجوات فيها. الشريط لن يُظهر تقسيماً حقيقياً قبل توفّر بيانات متباعدة زمنياً.</w:t>
+      </w:r>
+    </w:p>
+    <w:p>
+      <w:pPr>
+        <w:pStyle w:val="ListParagraph"/>
+        <w:numPr>
+          <w:ilvl w:val="0"/>
+          <w:numId w:val="2"/>
+        </w:numPr>
+        <w:bidi/>
+        <w:spacing w:after="70" w:line="290"/>
+        <w:jc w:val="right"/>
+      </w:pPr>
+      <w:r>
+        <w:rPr>
+          <w:rFonts w:ascii="Arial" w:cs="Arial" w:eastAsia="Arial" w:hAnsi="Arial"/>
+          <w:color w:val="1E293B"/>
+          <w:sz w:val="21"/>
+          <w:szCs w:val="21"/>
+          <w:rtl/>
+        </w:rPr>
+        <w:t xml:space="preserve">لم تُبنَ واجهة الشريط بعد — هذا التعديل يغطّي طبقة البيانات وحدها.</w:t>
       </w:r>
     </w:p>
     <w:p>
@@ -8885,7 +9082,7 @@
           <w:szCs w:val="24"/>
           <w:rtl/>
         </w:rPr>
-        <w:t xml:space="preserve">تعديل رقم 2 — تغيير تسمية زر الترقية في صفحة الفوترة</w:t>
+        <w:t xml:space="preserve">تعديل رقم 3 — إزالة كارت نسبة الاستجابة من صفحة تقييمات العملاء</w:t>
       </w:r>
     </w:p>
     <w:p>
@@ -9132,7 +9329,7 @@
                 <w:szCs w:val="19"/>
                 <w:rtl/>
               </w:rPr>
-              <w:t xml:space="preserve">9 سبتمبر 2026</w:t>
+              <w:t xml:space="preserve">10 سبتمبر 2026</w:t>
             </w:r>
           </w:p>
         </w:tc>
@@ -9162,7 +9359,7 @@
                 <w:szCs w:val="19"/>
                 <w:rtl/>
               </w:rPr>
-              <w:t xml:space="preserve">الفوترة</w:t>
+              <w:t xml:space="preserve">تقييمات العملاء</w:t>
             </w:r>
           </w:p>
         </w:tc>
@@ -9192,7 +9389,7 @@
                 <w:szCs w:val="19"/>
                 <w:rtl/>
               </w:rPr>
-              <w:t xml:space="preserve">/billing</w:t>
+              <w:t xml:space="preserve">/rating</w:t>
             </w:r>
           </w:p>
         </w:tc>
@@ -9222,7 +9419,7 @@
                 <w:szCs w:val="19"/>
                 <w:rtl/>
               </w:rPr>
-              <w:t xml:space="preserve">src/pages/Billing.tsx</w:t>
+              <w:t xml:space="preserve">src/pages/CustomerRatings.tsx</w:t>
             </w:r>
           </w:p>
         </w:tc>
@@ -9252,7 +9449,7 @@
                 <w:szCs w:val="19"/>
                 <w:rtl/>
               </w:rPr>
-              <w:t xml:space="preserve">be5b3c0</w:t>
+              <w:t xml:space="preserve">cc8bd4f</w:t>
             </w:r>
           </w:p>
         </w:tc>
@@ -9313,7 +9510,7 @@
           <w:szCs w:val="21"/>
           <w:rtl/>
         </w:rPr>
-        <w:t xml:space="preserve">زر «ترقية» أصبح «تغيير الباقة».</w:t>
+        <w:t xml:space="preserve">حُذف كارت «نسبة الاستجابة» بالكامل من شريط الإحصائيات — صارت 3 كروت بدل 4.</w:t>
       </w:r>
     </w:p>
     <w:p>
@@ -9335,7 +9532,73 @@
           <w:szCs w:val="21"/>
           <w:rtl/>
         </w:rPr>
-        <w:t xml:space="preserve">سبب التغيير: الزر يوصّل إلى مسار يشمل الترقية والتخفيض معاً، فالتسمية القديمة كانت تصف نصف وظيفته.</w:t>
+        <w:t xml:space="preserve">حُذف معه حساب responseRate لأنه لم يعد له مستهلك في الصفحة.</w:t>
+      </w:r>
+    </w:p>
+    <w:p>
+      <w:pPr>
+        <w:pStyle w:val="ListParagraph"/>
+        <w:numPr>
+          <w:ilvl w:val="0"/>
+          <w:numId w:val="2"/>
+        </w:numPr>
+        <w:bidi/>
+        <w:spacing w:after="70" w:line="290"/>
+        <w:jc w:val="right"/>
+      </w:pPr>
+      <w:r>
+        <w:rPr>
+          <w:rFonts w:ascii="Arial" w:cs="Arial" w:eastAsia="Arial" w:hAnsi="Arial"/>
+          <w:color w:val="1E293B"/>
+          <w:sz w:val="21"/>
+          <w:szCs w:val="21"/>
+          <w:rtl/>
+        </w:rPr>
+        <w:t xml:space="preserve">حُذف استيراد أيقونة TrendingUp لأنها كانت مستخدمة في هذا الكارت وحده.</w:t>
+      </w:r>
+    </w:p>
+    <w:p>
+      <w:pPr>
+        <w:pStyle w:val="ListParagraph"/>
+        <w:numPr>
+          <w:ilvl w:val="0"/>
+          <w:numId w:val="2"/>
+        </w:numPr>
+        <w:bidi/>
+        <w:spacing w:after="70" w:line="290"/>
+        <w:jc w:val="right"/>
+      </w:pPr>
+      <w:r>
+        <w:rPr>
+          <w:rFonts w:ascii="Arial" w:cs="Arial" w:eastAsia="Arial" w:hAnsi="Arial"/>
+          <w:color w:val="1E293B"/>
+          <w:sz w:val="21"/>
+          <w:szCs w:val="21"/>
+          <w:rtl/>
+        </w:rPr>
+        <w:t xml:space="preserve">عُدّلت شبكة العرض من grid-cols-2 lg:grid-cols-4 إلى grid-cols-1 sm:grid-cols-3، حتى لا يبقى كارت يتيم في سطر منفصل على الشاشات الصغيرة.</w:t>
+      </w:r>
+    </w:p>
+    <w:p>
+      <w:pPr>
+        <w:pStyle w:val="ListParagraph"/>
+        <w:numPr>
+          <w:ilvl w:val="0"/>
+          <w:numId w:val="2"/>
+        </w:numPr>
+        <w:bidi/>
+        <w:spacing w:after="70" w:line="290"/>
+        <w:jc w:val="right"/>
+      </w:pPr>
+      <w:r>
+        <w:rPr>
+          <w:rFonts w:ascii="Arial" w:cs="Arial" w:eastAsia="Arial" w:hAnsi="Arial"/>
+          <w:color w:val="1E293B"/>
+          <w:sz w:val="21"/>
+          <w:szCs w:val="21"/>
+          <w:rtl/>
+        </w:rPr>
+        <w:t xml:space="preserve">الكروت الباقية: متوسط تقييم المحادثة، متوسط تقييم الموظفين، إجمالي الروابط.</w:t>
       </w:r>
     </w:p>
     <w:p>
@@ -9360,7 +9623,7 @@
           <w:szCs w:val="24"/>
           <w:rtl/>
         </w:rPr>
-        <w:t xml:space="preserve">تعديل رقم 1 — ميزة تغيير الباقة — US-131</w:t>
+        <w:t xml:space="preserve">تعديل رقم 2 — تغيير تسمية زر الترقية في صفحة الفوترة</w:t>
       </w:r>
     </w:p>
     <w:p>
@@ -9637,7 +9900,7 @@
                 <w:szCs w:val="19"/>
                 <w:rtl/>
               </w:rPr>
-              <w:t xml:space="preserve">الاشتراك</w:t>
+              <w:t xml:space="preserve">الفوترة</w:t>
             </w:r>
           </w:p>
         </w:tc>
@@ -9667,7 +9930,7 @@
                 <w:szCs w:val="19"/>
                 <w:rtl/>
               </w:rPr>
-              <w:t xml:space="preserve">/subscribe</w:t>
+              <w:t xml:space="preserve">/billing</w:t>
             </w:r>
           </w:p>
         </w:tc>
@@ -9697,7 +9960,7 @@
                 <w:szCs w:val="19"/>
                 <w:rtl/>
               </w:rPr>
-              <w:t xml:space="preserve">src/pages/Subscribe.tsx</w:t>
+              <w:t xml:space="preserve">src/pages/Billing.tsx</w:t>
             </w:r>
           </w:p>
         </w:tc>
@@ -9727,7 +9990,7 @@
                 <w:szCs w:val="19"/>
                 <w:rtl/>
               </w:rPr>
-              <w:t xml:space="preserve">be5b3c0 · c49b797</w:t>
+              <w:t xml:space="preserve">be5b3c0</w:t>
             </w:r>
           </w:p>
         </w:tc>
@@ -9788,7 +10051,7 @@
           <w:szCs w:val="21"/>
           <w:rtl/>
         </w:rPr>
-        <w:t xml:space="preserve">إعادة بناء شبه كاملة للصفحة — 715 سطراً متغيّراً.</w:t>
+        <w:t xml:space="preserve">زر «ترقية» أصبح «تغيير الباقة».</w:t>
       </w:r>
     </w:p>
     <w:p>
@@ -9810,8 +10073,439 @@
           <w:szCs w:val="21"/>
           <w:rtl/>
         </w:rPr>
-        <w:t xml:space="preserve">اختيار الباقة صار بشريط تمرير (slider) حسب عدد المحادثات الشهرية بدل شبكة الكروت. كل باقة نقطة توقف على الشريط، وباقة المؤسسات هي النقطة الأخيرة بعنوان «غير محدود».</w:t>
-      </w:r>
+        <w:t xml:space="preserve">سبب التغيير: الزر يوصّل إلى مسار يشمل الترقية والتخفيض معاً، فالتسمية القديمة كانت تصف نصف وظيفته.</w:t>
+      </w:r>
+    </w:p>
+    <w:p>
+      <w:pPr>
+        <w:spacing w:after="160"/>
+      </w:pPr>
+    </w:p>
+    <w:p>
+      <w:pPr>
+        <w:pStyle w:val="Heading2"/>
+        <w:bidi/>
+        <w:spacing w:after="120" w:before="300"/>
+        <w:jc w:val="right"/>
+      </w:pPr>
+      <w:r>
+        <w:rPr>
+          <w:rFonts w:ascii="Arial" w:cs="Arial" w:eastAsia="Arial" w:hAnsi="Arial"/>
+          <w:b/>
+          <w:bCs/>
+          <w:color w:val="1E293B"/>
+          <w:sz w:val="24"/>
+          <w:szCs w:val="24"/>
+          <w:rtl/>
+        </w:rPr>
+        <w:t xml:space="preserve">تعديل رقم 1 — ميزة تغيير الباقة — US-131</w:t>
+      </w:r>
+    </w:p>
+    <w:p>
+      <w:pPr>
+        <w:spacing w:after="50"/>
+      </w:pPr>
+    </w:p>
+    <w:tbl>
+      <w:tblPr>
+        <w:bidiVisual/>
+        <w:tblW w:type="dxa" w:w="9000"/>
+        <w:tblBorders>
+          <w:top w:val="single" w:color="CBD5E1" w:sz="4"/>
+          <w:left w:val="single" w:color="CBD5E1" w:sz="4"/>
+          <w:bottom w:val="single" w:color="CBD5E1" w:sz="4"/>
+          <w:right w:val="single" w:color="CBD5E1" w:sz="4"/>
+          <w:insideH w:val="single" w:color="CBD5E1" w:sz="4"/>
+          <w:insideV w:val="single" w:color="CBD5E1" w:sz="4"/>
+        </w:tblBorders>
+      </w:tblPr>
+      <w:tblGrid>
+        <w:gridCol w:w="1250"/>
+        <w:gridCol w:w="1250"/>
+        <w:gridCol w:w="1150"/>
+        <w:gridCol w:w="2500"/>
+        <w:gridCol w:w="1350"/>
+        <w:gridCol w:w="1500"/>
+      </w:tblGrid>
+      <w:tr>
+        <w:trPr>
+          <w:tblHeader/>
+        </w:trPr>
+        <w:tc>
+          <w:tcPr>
+            <w:tcW w:type="dxa" w:w="1250"/>
+            <w:shd w:fill="2563EB" w:color="auto" w:val="clear"/>
+            <w:tcMar>
+              <w:top w:type="dxa" w:w="90"/>
+              <w:left w:type="dxa" w:w="110"/>
+              <w:bottom w:type="dxa" w:w="90"/>
+              <w:right w:type="dxa" w:w="110"/>
+            </w:tcMar>
+          </w:tcPr>
+          <w:p>
+            <w:pPr>
+              <w:bidi/>
+              <w:spacing w:after="0" w:line="280"/>
+              <w:jc w:val="right"/>
+            </w:pPr>
+            <w:r>
+              <w:rPr>
+                <w:rFonts w:ascii="Arial" w:cs="Arial" w:eastAsia="Arial" w:hAnsi="Arial"/>
+                <w:b/>
+                <w:bCs/>
+                <w:color w:val="FFFFFF"/>
+                <w:sz w:val="19"/>
+                <w:szCs w:val="19"/>
+                <w:rtl/>
+              </w:rPr>
+              <w:t xml:space="preserve">التاريخ</w:t>
+            </w:r>
+          </w:p>
+        </w:tc>
+        <w:tc>
+          <w:tcPr>
+            <w:tcW w:type="dxa" w:w="1250"/>
+            <w:shd w:fill="2563EB" w:color="auto" w:val="clear"/>
+            <w:tcMar>
+              <w:top w:type="dxa" w:w="90"/>
+              <w:left w:type="dxa" w:w="110"/>
+              <w:bottom w:type="dxa" w:w="90"/>
+              <w:right w:type="dxa" w:w="110"/>
+            </w:tcMar>
+          </w:tcPr>
+          <w:p>
+            <w:pPr>
+              <w:bidi/>
+              <w:spacing w:after="0" w:line="280"/>
+              <w:jc w:val="right"/>
+            </w:pPr>
+            <w:r>
+              <w:rPr>
+                <w:rFonts w:ascii="Arial" w:cs="Arial" w:eastAsia="Arial" w:hAnsi="Arial"/>
+                <w:b/>
+                <w:bCs/>
+                <w:color w:val="FFFFFF"/>
+                <w:sz w:val="19"/>
+                <w:szCs w:val="19"/>
+                <w:rtl/>
+              </w:rPr>
+              <w:t xml:space="preserve">الصفحة</w:t>
+            </w:r>
+          </w:p>
+        </w:tc>
+        <w:tc>
+          <w:tcPr>
+            <w:tcW w:type="dxa" w:w="1150"/>
+            <w:shd w:fill="2563EB" w:color="auto" w:val="clear"/>
+            <w:tcMar>
+              <w:top w:type="dxa" w:w="90"/>
+              <w:left w:type="dxa" w:w="110"/>
+              <w:bottom w:type="dxa" w:w="90"/>
+              <w:right w:type="dxa" w:w="110"/>
+            </w:tcMar>
+          </w:tcPr>
+          <w:p>
+            <w:pPr>
+              <w:bidi/>
+              <w:spacing w:after="0" w:line="280"/>
+              <w:jc w:val="right"/>
+            </w:pPr>
+            <w:r>
+              <w:rPr>
+                <w:rFonts w:ascii="Arial" w:cs="Arial" w:eastAsia="Arial" w:hAnsi="Arial"/>
+                <w:b/>
+                <w:bCs/>
+                <w:color w:val="FFFFFF"/>
+                <w:sz w:val="19"/>
+                <w:szCs w:val="19"/>
+                <w:rtl/>
+              </w:rPr>
+              <w:t xml:space="preserve">المسار</w:t>
+            </w:r>
+          </w:p>
+        </w:tc>
+        <w:tc>
+          <w:tcPr>
+            <w:tcW w:type="dxa" w:w="2500"/>
+            <w:shd w:fill="2563EB" w:color="auto" w:val="clear"/>
+            <w:tcMar>
+              <w:top w:type="dxa" w:w="90"/>
+              <w:left w:type="dxa" w:w="110"/>
+              <w:bottom w:type="dxa" w:w="90"/>
+              <w:right w:type="dxa" w:w="110"/>
+            </w:tcMar>
+          </w:tcPr>
+          <w:p>
+            <w:pPr>
+              <w:bidi/>
+              <w:spacing w:after="0" w:line="280"/>
+              <w:jc w:val="right"/>
+            </w:pPr>
+            <w:r>
+              <w:rPr>
+                <w:rFonts w:ascii="Arial" w:cs="Arial" w:eastAsia="Arial" w:hAnsi="Arial"/>
+                <w:b/>
+                <w:bCs/>
+                <w:color w:val="FFFFFF"/>
+                <w:sz w:val="19"/>
+                <w:szCs w:val="19"/>
+                <w:rtl/>
+              </w:rPr>
+              <w:t xml:space="preserve">الملف</w:t>
+            </w:r>
+          </w:p>
+        </w:tc>
+        <w:tc>
+          <w:tcPr>
+            <w:tcW w:type="dxa" w:w="1350"/>
+            <w:shd w:fill="2563EB" w:color="auto" w:val="clear"/>
+            <w:tcMar>
+              <w:top w:type="dxa" w:w="90"/>
+              <w:left w:type="dxa" w:w="110"/>
+              <w:bottom w:type="dxa" w:w="90"/>
+              <w:right w:type="dxa" w:w="110"/>
+            </w:tcMar>
+          </w:tcPr>
+          <w:p>
+            <w:pPr>
+              <w:bidi/>
+              <w:spacing w:after="0" w:line="280"/>
+              <w:jc w:val="right"/>
+            </w:pPr>
+            <w:r>
+              <w:rPr>
+                <w:rFonts w:ascii="Arial" w:cs="Arial" w:eastAsia="Arial" w:hAnsi="Arial"/>
+                <w:b/>
+                <w:bCs/>
+                <w:color w:val="FFFFFF"/>
+                <w:sz w:val="19"/>
+                <w:szCs w:val="19"/>
+                <w:rtl/>
+              </w:rPr>
+              <w:t xml:space="preserve">الكوميت</w:t>
+            </w:r>
+          </w:p>
+        </w:tc>
+        <w:tc>
+          <w:tcPr>
+            <w:tcW w:type="dxa" w:w="1500"/>
+            <w:shd w:fill="2563EB" w:color="auto" w:val="clear"/>
+            <w:tcMar>
+              <w:top w:type="dxa" w:w="90"/>
+              <w:left w:type="dxa" w:w="110"/>
+              <w:bottom w:type="dxa" w:w="90"/>
+              <w:right w:type="dxa" w:w="110"/>
+            </w:tcMar>
+          </w:tcPr>
+          <w:p>
+            <w:pPr>
+              <w:bidi/>
+              <w:spacing w:after="0" w:line="280"/>
+              <w:jc w:val="right"/>
+            </w:pPr>
+            <w:r>
+              <w:rPr>
+                <w:rFonts w:ascii="Arial" w:cs="Arial" w:eastAsia="Arial" w:hAnsi="Arial"/>
+                <w:b/>
+                <w:bCs/>
+                <w:color w:val="FFFFFF"/>
+                <w:sz w:val="19"/>
+                <w:szCs w:val="19"/>
+                <w:rtl/>
+              </w:rPr>
+              <w:t xml:space="preserve">الحالة</w:t>
+            </w:r>
+          </w:p>
+        </w:tc>
+      </w:tr>
+      <w:tr>
+        <w:tc>
+          <w:tcPr>
+            <w:tcW w:type="dxa" w:w="1250"/>
+            <w:tcMar>
+              <w:top w:type="dxa" w:w="90"/>
+              <w:left w:type="dxa" w:w="110"/>
+              <w:bottom w:type="dxa" w:w="90"/>
+              <w:right w:type="dxa" w:w="110"/>
+            </w:tcMar>
+          </w:tcPr>
+          <w:p>
+            <w:pPr>
+              <w:bidi/>
+              <w:spacing w:after="0" w:line="280"/>
+              <w:jc w:val="right"/>
+            </w:pPr>
+            <w:r>
+              <w:rPr>
+                <w:rFonts w:ascii="Arial" w:cs="Arial" w:eastAsia="Arial" w:hAnsi="Arial"/>
+                <w:b w:val="false"/>
+                <w:bCs w:val="false"/>
+                <w:color w:val="1E293B"/>
+                <w:sz w:val="19"/>
+                <w:szCs w:val="19"/>
+                <w:rtl/>
+              </w:rPr>
+              <w:t xml:space="preserve">9 سبتمبر 2026</w:t>
+            </w:r>
+          </w:p>
+        </w:tc>
+        <w:tc>
+          <w:tcPr>
+            <w:tcW w:type="dxa" w:w="1250"/>
+            <w:tcMar>
+              <w:top w:type="dxa" w:w="90"/>
+              <w:left w:type="dxa" w:w="110"/>
+              <w:bottom w:type="dxa" w:w="90"/>
+              <w:right w:type="dxa" w:w="110"/>
+            </w:tcMar>
+          </w:tcPr>
+          <w:p>
+            <w:pPr>
+              <w:bidi/>
+              <w:spacing w:after="0" w:line="280"/>
+              <w:jc w:val="right"/>
+            </w:pPr>
+            <w:r>
+              <w:rPr>
+                <w:rFonts w:ascii="Arial" w:cs="Arial" w:eastAsia="Arial" w:hAnsi="Arial"/>
+                <w:b w:val="false"/>
+                <w:bCs w:val="false"/>
+                <w:color w:val="1E293B"/>
+                <w:sz w:val="19"/>
+                <w:szCs w:val="19"/>
+                <w:rtl/>
+              </w:rPr>
+              <w:t xml:space="preserve">الاشتراك</w:t>
+            </w:r>
+          </w:p>
+        </w:tc>
+        <w:tc>
+          <w:tcPr>
+            <w:tcW w:type="dxa" w:w="1150"/>
+            <w:tcMar>
+              <w:top w:type="dxa" w:w="90"/>
+              <w:left w:type="dxa" w:w="110"/>
+              <w:bottom w:type="dxa" w:w="90"/>
+              <w:right w:type="dxa" w:w="110"/>
+            </w:tcMar>
+          </w:tcPr>
+          <w:p>
+            <w:pPr>
+              <w:bidi/>
+              <w:spacing w:after="0" w:line="280"/>
+              <w:jc w:val="right"/>
+            </w:pPr>
+            <w:r>
+              <w:rPr>
+                <w:rFonts w:ascii="Arial" w:cs="Arial" w:eastAsia="Arial" w:hAnsi="Arial"/>
+                <w:b w:val="false"/>
+                <w:bCs w:val="false"/>
+                <w:color w:val="1E293B"/>
+                <w:sz w:val="19"/>
+                <w:szCs w:val="19"/>
+                <w:rtl/>
+              </w:rPr>
+              <w:t xml:space="preserve">/subscribe</w:t>
+            </w:r>
+          </w:p>
+        </w:tc>
+        <w:tc>
+          <w:tcPr>
+            <w:tcW w:type="dxa" w:w="2500"/>
+            <w:tcMar>
+              <w:top w:type="dxa" w:w="90"/>
+              <w:left w:type="dxa" w:w="110"/>
+              <w:bottom w:type="dxa" w:w="90"/>
+              <w:right w:type="dxa" w:w="110"/>
+            </w:tcMar>
+          </w:tcPr>
+          <w:p>
+            <w:pPr>
+              <w:bidi/>
+              <w:spacing w:after="0" w:line="280"/>
+              <w:jc w:val="right"/>
+            </w:pPr>
+            <w:r>
+              <w:rPr>
+                <w:rFonts w:ascii="Arial" w:cs="Arial" w:eastAsia="Arial" w:hAnsi="Arial"/>
+                <w:b w:val="false"/>
+                <w:bCs w:val="false"/>
+                <w:color w:val="1E293B"/>
+                <w:sz w:val="19"/>
+                <w:szCs w:val="19"/>
+                <w:rtl/>
+              </w:rPr>
+              <w:t xml:space="preserve">src/pages/Subscribe.tsx</w:t>
+            </w:r>
+          </w:p>
+        </w:tc>
+        <w:tc>
+          <w:tcPr>
+            <w:tcW w:type="dxa" w:w="1350"/>
+            <w:tcMar>
+              <w:top w:type="dxa" w:w="90"/>
+              <w:left w:type="dxa" w:w="110"/>
+              <w:bottom w:type="dxa" w:w="90"/>
+              <w:right w:type="dxa" w:w="110"/>
+            </w:tcMar>
+          </w:tcPr>
+          <w:p>
+            <w:pPr>
+              <w:bidi/>
+              <w:spacing w:after="0" w:line="280"/>
+              <w:jc w:val="right"/>
+            </w:pPr>
+            <w:r>
+              <w:rPr>
+                <w:rFonts w:ascii="Arial" w:cs="Arial" w:eastAsia="Arial" w:hAnsi="Arial"/>
+                <w:b w:val="false"/>
+                <w:bCs w:val="false"/>
+                <w:color w:val="1E293B"/>
+                <w:sz w:val="19"/>
+                <w:szCs w:val="19"/>
+                <w:rtl/>
+              </w:rPr>
+              <w:t xml:space="preserve">be5b3c0 · c49b797</w:t>
+            </w:r>
+          </w:p>
+        </w:tc>
+        <w:tc>
+          <w:tcPr>
+            <w:tcW w:type="dxa" w:w="1500"/>
+            <w:shd w:fill="ECFDF5" w:color="auto" w:val="clear"/>
+            <w:tcMar>
+              <w:top w:type="dxa" w:w="90"/>
+              <w:left w:type="dxa" w:w="110"/>
+              <w:bottom w:type="dxa" w:w="90"/>
+              <w:right w:type="dxa" w:w="110"/>
+            </w:tcMar>
+          </w:tcPr>
+          <w:p>
+            <w:pPr>
+              <w:bidi/>
+              <w:spacing w:after="0" w:line="280"/>
+              <w:jc w:val="right"/>
+            </w:pPr>
+            <w:r>
+              <w:rPr>
+                <w:rFonts w:ascii="Arial" w:cs="Arial" w:eastAsia="Arial" w:hAnsi="Arial"/>
+                <w:b/>
+                <w:bCs/>
+                <w:color w:val="15803D"/>
+                <w:sz w:val="19"/>
+                <w:szCs w:val="19"/>
+                <w:rtl/>
+              </w:rPr>
+              <w:t xml:space="preserve">منشور على الإنتاج</w:t>
+            </w:r>
+          </w:p>
+        </w:tc>
+      </w:tr>
+    </w:tbl>
+    <w:p>
+      <w:pPr>
+        <w:spacing w:after="90"/>
+      </w:pPr>
     </w:p>
     <w:p>
       <w:pPr>
@@ -9832,7 +10526,7 @@
           <w:szCs w:val="21"/>
           <w:rtl/>
         </w:rPr>
-        <w:t xml:space="preserve">مسار من ست خطوات: اختيار الباقة، ثم تأكيد التخفيض، ثم الدفع، ثم المعالجة، ثم النجاح أو الفشل.</w:t>
+        <w:t xml:space="preserve">إعادة بناء شبه كاملة للصفحة — 715 سطراً متغيّراً.</w:t>
       </w:r>
     </w:p>
     <w:p>
@@ -9854,7 +10548,7 @@
           <w:szCs w:val="21"/>
           <w:rtl/>
         </w:rPr>
-        <w:t xml:space="preserve">احتساب تناسبي للترقية: يُحصَّل فرق السعر عن الأيام المتبقية من الدورة الحالية فقط، ويظهر المبلغ مفصّلاً في ملخص الدفع.</w:t>
+        <w:t xml:space="preserve">اختيار الباقة صار بشريط تمرير (slider) حسب عدد المحادثات الشهرية بدل شبكة الكروت. كل باقة نقطة توقف على الشريط، وباقة المؤسسات هي النقطة الأخيرة بعنوان «غير محدود».</w:t>
       </w:r>
     </w:p>
     <w:p>
@@ -9876,7 +10570,7 @@
           <w:szCs w:val="21"/>
           <w:rtl/>
         </w:rPr>
-        <w:t xml:space="preserve">التخفيض له شاشة تأكيد مستقلة ولا يذهب مباشرة إلى الدفع.</w:t>
+        <w:t xml:space="preserve">مسار من ست خطوات: اختيار الباقة، ثم تأكيد التخفيض، ثم الدفع، ثم المعالجة، ثم النجاح أو الفشل.</w:t>
       </w:r>
     </w:p>
     <w:p>
@@ -9898,7 +10592,7 @@
           <w:szCs w:val="21"/>
           <w:rtl/>
         </w:rPr>
-        <w:t xml:space="preserve">دورة الفوترة تُقرأ من اشتراك العميل الحالي بدل أن تبدأ بقيمة ثابتة.</w:t>
+        <w:t xml:space="preserve">احتساب تناسبي للترقية: يُحصَّل فرق السعر عن الأيام المتبقية من الدورة الحالية فقط، ويظهر المبلغ مفصّلاً في ملخص الدفع.</w:t>
       </w:r>
     </w:p>
     <w:p>
@@ -9920,6 +10614,50 @@
           <w:szCs w:val="21"/>
           <w:rtl/>
         </w:rPr>
+        <w:t xml:space="preserve">التخفيض له شاشة تأكيد مستقلة ولا يذهب مباشرة إلى الدفع.</w:t>
+      </w:r>
+    </w:p>
+    <w:p>
+      <w:pPr>
+        <w:pStyle w:val="ListParagraph"/>
+        <w:numPr>
+          <w:ilvl w:val="0"/>
+          <w:numId w:val="2"/>
+        </w:numPr>
+        <w:bidi/>
+        <w:spacing w:after="70" w:line="290"/>
+        <w:jc w:val="right"/>
+      </w:pPr>
+      <w:r>
+        <w:rPr>
+          <w:rFonts w:ascii="Arial" w:cs="Arial" w:eastAsia="Arial" w:hAnsi="Arial"/>
+          <w:color w:val="1E293B"/>
+          <w:sz w:val="21"/>
+          <w:szCs w:val="21"/>
+          <w:rtl/>
+        </w:rPr>
+        <w:t xml:space="preserve">دورة الفوترة تُقرأ من اشتراك العميل الحالي بدل أن تبدأ بقيمة ثابتة.</w:t>
+      </w:r>
+    </w:p>
+    <w:p>
+      <w:pPr>
+        <w:pStyle w:val="ListParagraph"/>
+        <w:numPr>
+          <w:ilvl w:val="0"/>
+          <w:numId w:val="2"/>
+        </w:numPr>
+        <w:bidi/>
+        <w:spacing w:after="70" w:line="290"/>
+        <w:jc w:val="right"/>
+      </w:pPr>
+      <w:r>
+        <w:rPr>
+          <w:rFonts w:ascii="Arial" w:cs="Arial" w:eastAsia="Arial" w:hAnsi="Arial"/>
+          <w:color w:val="1E293B"/>
+          <w:sz w:val="21"/>
+          <w:szCs w:val="21"/>
+          <w:rtl/>
+        </w:rPr>
         <w:t xml:space="preserve">أُصلحت علامات تعارض الدمج (merge conflict markers) التي كانت باقية في الملف — كوميت c49b797.</w:t>
       </w:r>
     </w:p>
@@ -10106,7 +10844,7 @@
           <w:szCs w:val="20"/>
           <w:rtl/>
         </w:rPr>
-        <w:t xml:space="preserve">عدد التعديلات المسجّلة: 12</w:t>
+        <w:t xml:space="preserve">عدد التعديلات المسجّلة: 13</w:t>
       </w:r>
     </w:p>
     <w:sectPr>

</xml_diff>

<commit_message>
deploy build f06334f4 to production
Publish the plans comparison table to qhub-client.apexes.click.

All 90 assets uploaded and diffed against the local build before any HTML
was touched (clean), then all 114 route copies enumerated from the live
tree, then version.json last.

Record the change in the changelog and point BUILD_LIVE at f06334f4.

Co-Authored-By: Claude Opus 5 <noreply@anthropic.com>
Claude-Session: https://claude.ai/code/session_01JGHUnSrtQwLX2BGbB3j6wk
</commit_message>
<xml_diff>
--- a/docs/سجل التعديلات الاخيرة.docx
+++ b/docs/سجل التعديلات الاخيرة.docx
@@ -354,7 +354,7 @@
                 <w:szCs w:val="19"/>
                 <w:rtl/>
               </w:rPr>
-              <w:t xml:space="preserve">13</w:t>
+              <w:t xml:space="preserve">14</w:t>
             </w:r>
           </w:p>
         </w:tc>
@@ -414,7 +414,7 @@
                 <w:szCs w:val="19"/>
                 <w:rtl/>
               </w:rPr>
-              <w:t xml:space="preserve">تعطيل المصادقة الثنائية صار يتطلّب كلمة المرور أو رمزاً</w:t>
+              <w:t xml:space="preserve">صفحة الباقات صارت جدول مقارنة على نسق اللاندنج بيج</w:t>
             </w:r>
           </w:p>
         </w:tc>
@@ -444,7 +444,7 @@
                 <w:szCs w:val="19"/>
                 <w:rtl/>
               </w:rPr>
-              <w:t xml:space="preserve">الإعدادات ← الأمان</w:t>
+              <w:t xml:space="preserve">الباقات والاشتراك</w:t>
             </w:r>
           </w:p>
         </w:tc>
@@ -508,7 +508,7 @@
                 <w:szCs w:val="19"/>
                 <w:rtl/>
               </w:rPr>
-              <w:t xml:space="preserve">12</w:t>
+              <w:t xml:space="preserve">13</w:t>
             </w:r>
           </w:p>
         </w:tc>
@@ -570,7 +570,7 @@
                 <w:szCs w:val="19"/>
                 <w:rtl/>
               </w:rPr>
-              <w:t xml:space="preserve">رمز QR حقيقي قابل للمسح في إعداد المصادقة الثنائية</w:t>
+              <w:t xml:space="preserve">تعطيل المصادقة الثنائية صار يتطلّب كلمة المرور أو رمزاً</w:t>
             </w:r>
           </w:p>
         </w:tc>
@@ -664,7 +664,7 @@
                 <w:szCs w:val="19"/>
                 <w:rtl/>
               </w:rPr>
-              <w:t xml:space="preserve">11</w:t>
+              <w:t xml:space="preserve">12</w:t>
             </w:r>
           </w:p>
         </w:tc>
@@ -724,7 +724,7 @@
                 <w:szCs w:val="19"/>
                 <w:rtl/>
               </w:rPr>
-              <w:t xml:space="preserve">رقم جوال اختياري في الملف الشخصي</w:t>
+              <w:t xml:space="preserve">رمز QR حقيقي قابل للمسح في إعداد المصادقة الثنائية</w:t>
             </w:r>
           </w:p>
         </w:tc>
@@ -754,7 +754,7 @@
                 <w:szCs w:val="19"/>
                 <w:rtl/>
               </w:rPr>
-              <w:t xml:space="preserve">الإعدادات ← الملف الشخصي</w:t>
+              <w:t xml:space="preserve">الإعدادات ← الأمان</w:t>
             </w:r>
           </w:p>
         </w:tc>
@@ -818,7 +818,7 @@
                 <w:szCs w:val="19"/>
                 <w:rtl/>
               </w:rPr>
-              <w:t xml:space="preserve">10</w:t>
+              <w:t xml:space="preserve">11</w:t>
             </w:r>
           </w:p>
         </w:tc>
@@ -880,7 +880,7 @@
                 <w:szCs w:val="19"/>
                 <w:rtl/>
               </w:rPr>
-              <w:t xml:space="preserve">شاشة التحقق بخطوتين في تسجيل الدخول</w:t>
+              <w:t xml:space="preserve">رقم جوال اختياري في الملف الشخصي</w:t>
             </w:r>
           </w:p>
         </w:tc>
@@ -911,7 +911,7 @@
                 <w:szCs w:val="19"/>
                 <w:rtl/>
               </w:rPr>
-              <w:t xml:space="preserve">تسجيل الدخول</w:t>
+              <w:t xml:space="preserve">الإعدادات ← الملف الشخصي</w:t>
             </w:r>
           </w:p>
         </w:tc>
@@ -974,7 +974,7 @@
                 <w:szCs w:val="19"/>
                 <w:rtl/>
               </w:rPr>
-              <w:t xml:space="preserve">9</w:t>
+              <w:t xml:space="preserve">10</w:t>
             </w:r>
           </w:p>
         </w:tc>
@@ -1034,7 +1034,7 @@
                 <w:szCs w:val="19"/>
                 <w:rtl/>
               </w:rPr>
-              <w:t xml:space="preserve">رقم هاتف اختياري عند دعوة الموظف</w:t>
+              <w:t xml:space="preserve">شاشة التحقق بخطوتين في تسجيل الدخول</w:t>
             </w:r>
           </w:p>
         </w:tc>
@@ -1064,7 +1064,7 @@
                 <w:szCs w:val="19"/>
                 <w:rtl/>
               </w:rPr>
-              <w:t xml:space="preserve">فريق العمل</w:t>
+              <w:t xml:space="preserve">تسجيل الدخول</w:t>
             </w:r>
           </w:p>
         </w:tc>
@@ -1128,7 +1128,7 @@
                 <w:szCs w:val="19"/>
                 <w:rtl/>
               </w:rPr>
-              <w:t xml:space="preserve">8</w:t>
+              <w:t xml:space="preserve">9</w:t>
             </w:r>
           </w:p>
         </w:tc>
@@ -1190,7 +1190,7 @@
                 <w:szCs w:val="19"/>
                 <w:rtl/>
               </w:rPr>
-              <w:t xml:space="preserve">فاصل مرقّم بين دورات المحادثة داخل الثريد</w:t>
+              <w:t xml:space="preserve">رقم هاتف اختياري عند دعوة الموظف</w:t>
             </w:r>
           </w:p>
         </w:tc>
@@ -1221,7 +1221,7 @@
                 <w:szCs w:val="19"/>
                 <w:rtl/>
               </w:rPr>
-              <w:t xml:space="preserve">صندوق الوارد</w:t>
+              <w:t xml:space="preserve">فريق العمل</w:t>
             </w:r>
           </w:p>
         </w:tc>
@@ -1284,7 +1284,7 @@
                 <w:szCs w:val="19"/>
                 <w:rtl/>
               </w:rPr>
-              <w:t xml:space="preserve">7</w:t>
+              <w:t xml:space="preserve">8</w:t>
             </w:r>
           </w:p>
         </w:tc>
@@ -1344,7 +1344,7 @@
                 <w:szCs w:val="19"/>
                 <w:rtl/>
               </w:rPr>
-              <w:t xml:space="preserve">انعكاس حالة «مجدولة» للتخفيض المؤجّل في بورتال العميل</w:t>
+              <w:t xml:space="preserve">فاصل مرقّم بين دورات المحادثة داخل الثريد</w:t>
             </w:r>
           </w:p>
         </w:tc>
@@ -1374,7 +1374,7 @@
                 <w:szCs w:val="19"/>
                 <w:rtl/>
               </w:rPr>
-              <w:t xml:space="preserve">الباقات والاشتراك</w:t>
+              <w:t xml:space="preserve">صندوق الوارد</w:t>
             </w:r>
           </w:p>
         </w:tc>
@@ -1438,7 +1438,7 @@
                 <w:szCs w:val="19"/>
                 <w:rtl/>
               </w:rPr>
-              <w:t xml:space="preserve">6</w:t>
+              <w:t xml:space="preserve">7</w:t>
             </w:r>
           </w:p>
         </w:tc>
@@ -1500,7 +1500,7 @@
                 <w:szCs w:val="19"/>
                 <w:rtl/>
               </w:rPr>
-              <w:t xml:space="preserve">إعادة تصميم شريط الفهرسة على هيئة مسطرة تظهر عند الاقتراب</w:t>
+              <w:t xml:space="preserve">انعكاس حالة «مجدولة» للتخفيض المؤجّل في بورتال العميل</w:t>
             </w:r>
           </w:p>
         </w:tc>
@@ -1531,7 +1531,7 @@
                 <w:szCs w:val="19"/>
                 <w:rtl/>
               </w:rPr>
-              <w:t xml:space="preserve">صندوق الوارد</w:t>
+              <w:t xml:space="preserve">الباقات والاشتراك</w:t>
             </w:r>
           </w:p>
         </w:tc>
@@ -1594,7 +1594,7 @@
                 <w:szCs w:val="19"/>
                 <w:rtl/>
               </w:rPr>
-              <w:t xml:space="preserve">5</w:t>
+              <w:t xml:space="preserve">6</w:t>
             </w:r>
           </w:p>
         </w:tc>
@@ -1654,7 +1654,7 @@
                 <w:szCs w:val="19"/>
                 <w:rtl/>
               </w:rPr>
-              <w:t xml:space="preserve">شريط فهرسة دورات المحادثة داخل الثريد</w:t>
+              <w:t xml:space="preserve">إعادة تصميم شريط الفهرسة على هيئة مسطرة تظهر عند الاقتراب</w:t>
             </w:r>
           </w:p>
         </w:tc>
@@ -1748,7 +1748,7 @@
                 <w:szCs w:val="19"/>
                 <w:rtl/>
               </w:rPr>
-              <w:t xml:space="preserve">4</w:t>
+              <w:t xml:space="preserve">5</w:t>
             </w:r>
           </w:p>
         </w:tc>
@@ -1810,7 +1810,7 @@
                 <w:szCs w:val="19"/>
                 <w:rtl/>
               </w:rPr>
-              <w:t xml:space="preserve">تسجيل دورات المحادثة واشتقاقها — أساس شريط فهرسة الثريد</w:t>
+              <w:t xml:space="preserve">شريط فهرسة دورات المحادثة داخل الثريد</w:t>
             </w:r>
           </w:p>
         </w:tc>
@@ -1841,7 +1841,7 @@
                 <w:szCs w:val="19"/>
                 <w:rtl/>
               </w:rPr>
-              <w:t xml:space="preserve">صندوق الوارد (طبقة البيانات)</w:t>
+              <w:t xml:space="preserve">صندوق الوارد</w:t>
             </w:r>
           </w:p>
         </w:tc>
@@ -1904,7 +1904,7 @@
                 <w:szCs w:val="19"/>
                 <w:rtl/>
               </w:rPr>
-              <w:t xml:space="preserve">3</w:t>
+              <w:t xml:space="preserve">4</w:t>
             </w:r>
           </w:p>
         </w:tc>
@@ -1964,7 +1964,7 @@
                 <w:szCs w:val="19"/>
                 <w:rtl/>
               </w:rPr>
-              <w:t xml:space="preserve">إزالة كارت نسبة الاستجابة من صفحة تقييمات العملاء</w:t>
+              <w:t xml:space="preserve">تسجيل دورات المحادثة واشتقاقها — أساس شريط فهرسة الثريد</w:t>
             </w:r>
           </w:p>
         </w:tc>
@@ -1994,7 +1994,7 @@
                 <w:szCs w:val="19"/>
                 <w:rtl/>
               </w:rPr>
-              <w:t xml:space="preserve">تقييمات العملاء</w:t>
+              <w:t xml:space="preserve">صندوق الوارد (طبقة البيانات)</w:t>
             </w:r>
           </w:p>
         </w:tc>
@@ -2058,7 +2058,7 @@
                 <w:szCs w:val="19"/>
                 <w:rtl/>
               </w:rPr>
-              <w:t xml:space="preserve">2</w:t>
+              <w:t xml:space="preserve">3</w:t>
             </w:r>
           </w:p>
         </w:tc>
@@ -2089,7 +2089,7 @@
                 <w:szCs w:val="19"/>
                 <w:rtl/>
               </w:rPr>
-              <w:t xml:space="preserve">9 سبتمبر 2026</w:t>
+              <w:t xml:space="preserve">10 سبتمبر 2026</w:t>
             </w:r>
           </w:p>
         </w:tc>
@@ -2120,7 +2120,7 @@
                 <w:szCs w:val="19"/>
                 <w:rtl/>
               </w:rPr>
-              <w:t xml:space="preserve">تغيير تسمية زر الترقية في صفحة الفوترة</w:t>
+              <w:t xml:space="preserve">إزالة كارت نسبة الاستجابة من صفحة تقييمات العملاء</w:t>
             </w:r>
           </w:p>
         </w:tc>
@@ -2151,7 +2151,7 @@
                 <w:szCs w:val="19"/>
                 <w:rtl/>
               </w:rPr>
-              <w:t xml:space="preserve">الفوترة</w:t>
+              <w:t xml:space="preserve">تقييمات العملاء</w:t>
             </w:r>
           </w:p>
         </w:tc>
@@ -2214,7 +2214,7 @@
                 <w:szCs w:val="19"/>
                 <w:rtl/>
               </w:rPr>
-              <w:t xml:space="preserve">1</w:t>
+              <w:t xml:space="preserve">2</w:t>
             </w:r>
           </w:p>
         </w:tc>
@@ -2274,6 +2274,162 @@
                 <w:szCs w:val="19"/>
                 <w:rtl/>
               </w:rPr>
+              <w:t xml:space="preserve">تغيير تسمية زر الترقية في صفحة الفوترة</w:t>
+            </w:r>
+          </w:p>
+        </w:tc>
+        <w:tc>
+          <w:tcPr>
+            <w:tcW w:type="dxa" w:w="1500"/>
+            <w:tcMar>
+              <w:top w:type="dxa" w:w="90"/>
+              <w:left w:type="dxa" w:w="110"/>
+              <w:bottom w:type="dxa" w:w="90"/>
+              <w:right w:type="dxa" w:w="110"/>
+            </w:tcMar>
+          </w:tcPr>
+          <w:p>
+            <w:pPr>
+              <w:bidi/>
+              <w:spacing w:after="0" w:line="280"/>
+              <w:jc w:val="right"/>
+            </w:pPr>
+            <w:r>
+              <w:rPr>
+                <w:rFonts w:ascii="Arial" w:cs="Arial" w:eastAsia="Arial" w:hAnsi="Arial"/>
+                <w:b w:val="false"/>
+                <w:bCs w:val="false"/>
+                <w:color w:val="1E293B"/>
+                <w:sz w:val="19"/>
+                <w:szCs w:val="19"/>
+                <w:rtl/>
+              </w:rPr>
+              <w:t xml:space="preserve">الفوترة</w:t>
+            </w:r>
+          </w:p>
+        </w:tc>
+        <w:tc>
+          <w:tcPr>
+            <w:tcW w:type="dxa" w:w="1800"/>
+            <w:shd w:fill="ECFDF5" w:color="auto" w:val="clear"/>
+            <w:tcMar>
+              <w:top w:type="dxa" w:w="90"/>
+              <w:left w:type="dxa" w:w="110"/>
+              <w:bottom w:type="dxa" w:w="90"/>
+              <w:right w:type="dxa" w:w="110"/>
+            </w:tcMar>
+          </w:tcPr>
+          <w:p>
+            <w:pPr>
+              <w:bidi/>
+              <w:spacing w:after="0" w:line="280"/>
+              <w:jc w:val="right"/>
+            </w:pPr>
+            <w:r>
+              <w:rPr>
+                <w:rFonts w:ascii="Arial" w:cs="Arial" w:eastAsia="Arial" w:hAnsi="Arial"/>
+                <w:b/>
+                <w:bCs/>
+                <w:color w:val="15803D"/>
+                <w:sz w:val="19"/>
+                <w:szCs w:val="19"/>
+                <w:rtl/>
+              </w:rPr>
+              <w:t xml:space="preserve">منشور على الإنتاج</w:t>
+            </w:r>
+          </w:p>
+        </w:tc>
+      </w:tr>
+      <w:tr>
+        <w:tc>
+          <w:tcPr>
+            <w:tcW w:type="dxa" w:w="600"/>
+            <w:shd w:fill="F1F5F9" w:color="auto" w:val="clear"/>
+            <w:tcMar>
+              <w:top w:type="dxa" w:w="90"/>
+              <w:left w:type="dxa" w:w="110"/>
+              <w:bottom w:type="dxa" w:w="90"/>
+              <w:right w:type="dxa" w:w="110"/>
+            </w:tcMar>
+          </w:tcPr>
+          <w:p>
+            <w:pPr>
+              <w:bidi/>
+              <w:spacing w:after="0" w:line="280"/>
+              <w:jc w:val="right"/>
+            </w:pPr>
+            <w:r>
+              <w:rPr>
+                <w:rFonts w:ascii="Arial" w:cs="Arial" w:eastAsia="Arial" w:hAnsi="Arial"/>
+                <w:b/>
+                <w:bCs/>
+                <w:color w:val="2563EB"/>
+                <w:sz w:val="19"/>
+                <w:szCs w:val="19"/>
+                <w:rtl/>
+              </w:rPr>
+              <w:t xml:space="preserve">1</w:t>
+            </w:r>
+          </w:p>
+        </w:tc>
+        <w:tc>
+          <w:tcPr>
+            <w:tcW w:type="dxa" w:w="1500"/>
+            <w:shd w:fill="F1F5F9" w:color="auto" w:val="clear"/>
+            <w:tcMar>
+              <w:top w:type="dxa" w:w="90"/>
+              <w:left w:type="dxa" w:w="110"/>
+              <w:bottom w:type="dxa" w:w="90"/>
+              <w:right w:type="dxa" w:w="110"/>
+            </w:tcMar>
+          </w:tcPr>
+          <w:p>
+            <w:pPr>
+              <w:bidi/>
+              <w:spacing w:after="0" w:line="280"/>
+              <w:jc w:val="right"/>
+            </w:pPr>
+            <w:r>
+              <w:rPr>
+                <w:rFonts w:ascii="Arial" w:cs="Arial" w:eastAsia="Arial" w:hAnsi="Arial"/>
+                <w:b w:val="false"/>
+                <w:bCs w:val="false"/>
+                <w:color w:val="1E293B"/>
+                <w:sz w:val="19"/>
+                <w:szCs w:val="19"/>
+                <w:rtl/>
+              </w:rPr>
+              <w:t xml:space="preserve">9 سبتمبر 2026</w:t>
+            </w:r>
+          </w:p>
+        </w:tc>
+        <w:tc>
+          <w:tcPr>
+            <w:tcW w:type="dxa" w:w="3600"/>
+            <w:shd w:fill="F1F5F9" w:color="auto" w:val="clear"/>
+            <w:tcMar>
+              <w:top w:type="dxa" w:w="90"/>
+              <w:left w:type="dxa" w:w="110"/>
+              <w:bottom w:type="dxa" w:w="90"/>
+              <w:right w:type="dxa" w:w="110"/>
+            </w:tcMar>
+          </w:tcPr>
+          <w:p>
+            <w:pPr>
+              <w:bidi/>
+              <w:spacing w:after="0" w:line="280"/>
+              <w:jc w:val="right"/>
+            </w:pPr>
+            <w:r>
+              <w:rPr>
+                <w:rFonts w:ascii="Arial" w:cs="Arial" w:eastAsia="Arial" w:hAnsi="Arial"/>
+                <w:b w:val="false"/>
+                <w:bCs w:val="false"/>
+                <w:color w:val="1E293B"/>
+                <w:sz w:val="19"/>
+                <w:szCs w:val="19"/>
+                <w:rtl/>
+              </w:rPr>
               <w:t xml:space="preserve">ميزة تغيير الباقة — US-131</w:t>
             </w:r>
           </w:p>
@@ -2281,6 +2437,7 @@
         <w:tc>
           <w:tcPr>
             <w:tcW w:type="dxa" w:w="1500"/>
+            <w:shd w:fill="F1F5F9" w:color="auto" w:val="clear"/>
             <w:tcMar>
               <w:top w:type="dxa" w:w="90"/>
               <w:left w:type="dxa" w:w="110"/>
@@ -2707,7 +2864,7 @@
                 <w:szCs w:val="20"/>
                 <w:rtl/>
               </w:rPr>
-              <w:t xml:space="preserve">البناء المنشور على الإنتاج: 31b0afbc-9240-4967-b26c-ad43dce1a638</w:t>
+              <w:t xml:space="preserve">البناء المنشور على الإنتاج: f06334f4-9f6a-4837-97e6-e606c26cca83</w:t>
             </w:r>
           </w:p>
           <w:p>
@@ -2792,7 +2949,7 @@
           <w:szCs w:val="24"/>
           <w:rtl/>
         </w:rPr>
-        <w:t xml:space="preserve">تعديل رقم 13 — تعطيل المصادقة الثنائية صار يتطلّب كلمة المرور أو رمزاً</w:t>
+        <w:t xml:space="preserve">تعديل رقم 14 — صفحة الباقات صارت جدول مقارنة على نسق اللاندنج بيج</w:t>
       </w:r>
     </w:p>
     <w:p>
@@ -3069,7 +3226,7 @@
                 <w:szCs w:val="19"/>
                 <w:rtl/>
               </w:rPr>
-              <w:t xml:space="preserve">الإعدادات ← الأمان</w:t>
+              <w:t xml:space="preserve">الباقات والاشتراك</w:t>
             </w:r>
           </w:p>
         </w:tc>
@@ -3099,7 +3256,7 @@
                 <w:szCs w:val="19"/>
                 <w:rtl/>
               </w:rPr>
-              <w:t xml:space="preserve">/settings/security</w:t>
+              <w:t xml:space="preserve">/subscribe</w:t>
             </w:r>
           </w:p>
         </w:tc>
@@ -3129,7 +3286,7 @@
                 <w:szCs w:val="19"/>
                 <w:rtl/>
               </w:rPr>
-              <w:t xml:space="preserve">src/pages/Settings.tsx · src/store/useAuthStore.ts</w:t>
+              <w:t xml:space="preserve">src/pages/Subscribe.tsx</w:t>
             </w:r>
           </w:p>
         </w:tc>
@@ -3159,7 +3316,7 @@
                 <w:szCs w:val="19"/>
                 <w:rtl/>
               </w:rPr>
-              <w:t xml:space="preserve">aedca85</w:t>
+              <w:t xml:space="preserve">8bc9d51</w:t>
             </w:r>
           </w:p>
         </w:tc>
@@ -3220,7 +3377,7 @@
           <w:szCs w:val="21"/>
           <w:rtl/>
         </w:rPr>
-        <w:t xml:space="preserve">كان التعطيل نافذة تأكيد ولا شيء غيرها، فكانت الحماية بقوة تبويب مفتوح بلا رقيب: من يصل إلى صفحة الإعدادات يطفئها، وبعدها كلمة المرور وحدها تفتح الحساب ولا يعود الهاتف يعني شيئاً.</w:t>
+        <w:t xml:space="preserve">كانت الصفحة تعرض باقة واحدة في كل مرة: المؤشر يختار الباقة، وكارت واحد يعرض سعرها، وقائمة مسطّحة تؤشّر على مزاياها. مقارنة باقتين كانت تعني سحب المؤشر جيئة وذهاباً وحفظ ما رأيته — وهو بالضبط ما يفعله من يختار باقة.</w:t>
       </w:r>
     </w:p>
     <w:p>
@@ -3242,7 +3399,7 @@
           <w:szCs w:val="21"/>
           <w:rtl/>
         </w:rPr>
-        <w:t xml:space="preserve">صار التعطيل يكلّف نفس الإثبات الذي يكلّفه تجاوز الشاشة: كلمة المرور افتراضياً، أو رمز من تطبيق المصادقة عبر رابط داخل النافذة.</w:t>
+        <w:t xml:space="preserve">صارت الأربع باقات جنباً إلى جنب كأعمدة، كل عمود بسعره وتوفيره السنوي وزرّه، فوق جدول صفوفه مقسومة إلى «الأساسيات» و«المزايا».</w:t>
       </w:r>
     </w:p>
     <w:p>
@@ -3264,7 +3421,7 @@
           <w:szCs w:val="21"/>
           <w:rtl/>
         </w:rPr>
-        <w:t xml:space="preserve">الرموز الاحتياطية مقبولة في نفس الحقل، لأن فاقد هاتفه يحتاج طريقة يطفّيها بها.</w:t>
+        <w:t xml:space="preserve">المؤشر بقي لكنه صار يرشّح ويلوّن العمود المناسب فقط، فكل زر يعمل على باقته لا على ما يشير إليه المؤشر.</w:t>
       </w:r>
     </w:p>
     <w:p>
@@ -3286,7 +3443,7 @@
           <w:szCs w:val="21"/>
           <w:rtl/>
         </w:rPr>
-        <w:t xml:space="preserve">قُبل العاملان معاً عن قصد: من يشكّ أن كلمة مروره تسرّبت يحتاج مساراً لا يمرّ بها.</w:t>
+        <w:t xml:space="preserve">المزايا في البيانات ليست تراكمية: كل باقة تسرد إضافاتها خلف سطر «كل مزايا باقة X». مصفوفة includes() بسيطة كانت ستضع «—» أمام كل ميزة موروثة وتُظهر الباقة الأعلى أفقر من الأدنى، فحُلّت الوراثة إلى ✓ حقيقية وحُذفت أسطر الإشارة.</w:t>
       </w:r>
     </w:p>
     <w:p>
@@ -3308,7 +3465,7 @@
           <w:szCs w:val="21"/>
           <w:rtl/>
         </w:rPr>
-        <w:t xml:space="preserve">حدّ خمس محاولات. رمز من ست خانات بلا سقف محاولات ليس عاملاً ثانياً.</w:t>
+        <w:t xml:space="preserve">عطل كنت سأُدخله: نافذة تأكيد التخفيض كانت تقرأ السعر من المؤشر — صحيح حين كان المؤشر هو المُختار، وخطأ مع أزرار لكل عمود. صارت الأسعار تُشتق من الباقة المختارة.</w:t>
       </w:r>
     </w:p>
     <w:p>
@@ -3330,7 +3487,7 @@
           <w:szCs w:val="21"/>
           <w:rtl/>
         </w:rPr>
-        <w:t xml:space="preserve">اختُبرت خمسة مسارات في المتصفح: كلمة مرور خاطئة تُبقيها مفعّلة وتُظهر الخطأ؛ كلمة المرور الصحيحة ورمز TOTP حيّ ورمز احتياطي كلٌّ منها يعطّلها؛ وخمس محاولات خاطئة تُقفل النافذة و2FA ما زالت مفعّلة.</w:t>
+        <w:t xml:space="preserve">نسبة الخصم السنوي تُحسب من الأسعار (17%) بدل أن تُكتب يدوياً.</w:t>
       </w:r>
     </w:p>
     <w:p>
@@ -3352,7 +3509,29 @@
           <w:szCs w:val="21"/>
           <w:rtl/>
         </w:rPr>
-        <w:t xml:space="preserve">هذه الخطوة لم تكن موجودة أصلاً ولم تُحذف — تأكّدت من ذلك بمراجعة النسخة السابقة للكود (743042c^) قبل الشروع في البناء.</w:t>
+        <w:t xml:space="preserve">اختُبر في المتصفح: الأعمدة الأربعة تُرسم، والأسماء والأسعار والأزرار كلٌّ على سطر واحد في الدورتين، وعمود العناوين يثبت أثناء التمرير الأفقي، ولا تجاوز أفقي عند 400px.</w:t>
+      </w:r>
+    </w:p>
+    <w:p>
+      <w:pPr>
+        <w:pStyle w:val="ListParagraph"/>
+        <w:numPr>
+          <w:ilvl w:val="0"/>
+          <w:numId w:val="2"/>
+        </w:numPr>
+        <w:bidi/>
+        <w:spacing w:after="70" w:line="290"/>
+        <w:jc w:val="right"/>
+      </w:pPr>
+      <w:r>
+        <w:rPr>
+          <w:rFonts w:ascii="Arial" w:cs="Arial" w:eastAsia="Arial" w:hAnsi="Arial"/>
+          <w:color w:val="1E293B"/>
+          <w:sz w:val="21"/>
+          <w:szCs w:val="21"/>
+          <w:rtl/>
+        </w:rPr>
+        <w:t xml:space="preserve">فرق باقٍ عن اللاندنج بيج: هناك خمس مجموعات مسمّاة للمزايا، وهنا مجموعتان، لأن features في موديول الباقات مجرد string[] بلا تصنيف. التقسيم الكامل يحتاج حقل تصنيف في محرّر الباقات عند الأدمن.</w:t>
       </w:r>
     </w:p>
     <w:p>
@@ -3377,7 +3556,7 @@
           <w:szCs w:val="24"/>
           <w:rtl/>
         </w:rPr>
-        <w:t xml:space="preserve">تعديل رقم 12 — رمز QR حقيقي قابل للمسح في إعداد المصادقة الثنائية</w:t>
+        <w:t xml:space="preserve">تعديل رقم 13 — تعطيل المصادقة الثنائية صار يتطلّب كلمة المرور أو رمزاً</w:t>
       </w:r>
     </w:p>
     <w:p>
@@ -3684,7 +3863,7 @@
                 <w:szCs w:val="19"/>
                 <w:rtl/>
               </w:rPr>
-              <w:t xml:space="preserve">/settings</w:t>
+              <w:t xml:space="preserve">/settings/security</w:t>
             </w:r>
           </w:p>
         </w:tc>
@@ -3714,7 +3893,7 @@
                 <w:szCs w:val="19"/>
                 <w:rtl/>
               </w:rPr>
-              <w:t xml:space="preserve">src/components/ui/QrCode.tsx · src/pages/Settings.tsx · src/utils/twoFactor.ts</w:t>
+              <w:t xml:space="preserve">src/pages/Settings.tsx · src/store/useAuthStore.ts</w:t>
             </w:r>
           </w:p>
         </w:tc>
@@ -3744,7 +3923,7 @@
                 <w:szCs w:val="19"/>
                 <w:rtl/>
               </w:rPr>
-              <w:t xml:space="preserve">e5a121d</w:t>
+              <w:t xml:space="preserve">aedca85</w:t>
             </w:r>
           </w:p>
         </w:tc>
@@ -3805,7 +3984,7 @@
           <w:szCs w:val="21"/>
           <w:rtl/>
         </w:rPr>
-        <w:t xml:space="preserve">كان المعروض رسمة SVG مربّعات مرصوفة يدوياً تشبه رمز QR ولا تحمل أي بيانات، فلا يقرأها أي تطبيق مصادقة. الطريقة الوحيدة للربط كانت نسخ المفتاح يدوياً.</w:t>
+        <w:t xml:space="preserve">كان التعطيل نافذة تأكيد ولا شيء غيرها، فكانت الحماية بقوة تبويب مفتوح بلا رقيب: من يصل إلى صفحة الإعدادات يطفئها، وبعدها كلمة المرور وحدها تفتح الحساب ولا يعود الهاتف يعني شيئاً.</w:t>
       </w:r>
     </w:p>
     <w:p>
@@ -3827,7 +4006,7 @@
           <w:szCs w:val="21"/>
           <w:rtl/>
         </w:rPr>
-        <w:t xml:space="preserve">صار الرمز يُولَّد فعلياً من رابط otpauth:// بمكتبة qrcode.</w:t>
+        <w:t xml:space="preserve">صار التعطيل يكلّف نفس الإثبات الذي يكلّفه تجاوز الشاشة: كلمة المرور افتراضياً، أو رمز من تطبيق المصادقة عبر رابط داخل النافذة.</w:t>
       </w:r>
     </w:p>
     <w:p>
@@ -3849,7 +4028,7 @@
           <w:szCs w:val="21"/>
           <w:rtl/>
         </w:rPr>
-        <w:t xml:space="preserve">تحقّقت منه بالتصوير والفكّ لا بالنظر: صوّرت العنصر المرسوم على الشاشة وفككته بقارئ QR، فرجع الرابط المتوقّع — في الوضع الفاتح والداكن.</w:t>
+        <w:t xml:space="preserve">الرموز الاحتياطية مقبولة في نفس الحقل، لأن فاقد هاتفه يحتاج طريقة يطفّيها بها.</w:t>
       </w:r>
     </w:p>
     <w:p>
@@ -3871,7 +4050,7 @@
           <w:szCs w:val="21"/>
           <w:rtl/>
         </w:rPr>
-        <w:t xml:space="preserve">ثُبّت الرمز أبيض على أسود بصرف النظر عن الثيم. لو ورث currentColor لانقلبت ألوانه في الوضع الداكن وتعذّر مسحه.</w:t>
+        <w:t xml:space="preserve">قُبل العاملان معاً عن قصد: من يشكّ أن كلمة مروره تسرّبت يحتاج مساراً لا يمرّ بها.</w:t>
       </w:r>
     </w:p>
     <w:p>
@@ -3893,7 +4072,7 @@
           <w:szCs w:val="21"/>
           <w:rtl/>
         </w:rPr>
-        <w:t xml:space="preserve">أُضيفت algorithm وdigits وperiod صراحةً إلى الرابط. Google Authenticator يفترض SHA1/6/30، أما Authy و1Password فلا، وافتراض مختلف يولّد رموزاً يرفضها التحقق عندنا.</w:t>
+        <w:t xml:space="preserve">حدّ خمس محاولات. رمز من ست خانات بلا سقف محاولات ليس عاملاً ثانياً.</w:t>
       </w:r>
     </w:p>
     <w:p>
@@ -3915,7 +4094,7 @@
           <w:szCs w:val="21"/>
           <w:rtl/>
         </w:rPr>
-        <w:t xml:space="preserve">عدد الخانات صار ثابتاً واحداً يقرأه المولّد والرابط معاً، فلا ينفصلان.</w:t>
+        <w:t xml:space="preserve">اختُبرت خمسة مسارات في المتصفح: كلمة مرور خاطئة تُبقيها مفعّلة وتُظهر الخطأ؛ كلمة المرور الصحيحة ورمز TOTP حيّ ورمز احتياطي كلٌّ منها يعطّلها؛ وخمس محاولات خاطئة تُقفل النافذة و2FA ما زالت مفعّلة.</w:t>
       </w:r>
     </w:p>
     <w:p>
@@ -3937,29 +4116,7 @@
           <w:szCs w:val="21"/>
           <w:rtl/>
         </w:rPr>
-        <w:t xml:space="preserve">المكتبة تُحمَّل بـ dynamic import عند فتح النافذة فقط، فحزمة الإعدادات بقيت ~50KB بدل 74KB.</w:t>
-      </w:r>
-    </w:p>
-    <w:p>
-      <w:pPr>
-        <w:pStyle w:val="ListParagraph"/>
-        <w:numPr>
-          <w:ilvl w:val="0"/>
-          <w:numId w:val="2"/>
-        </w:numPr>
-        <w:bidi/>
-        <w:spacing w:after="70" w:line="290"/>
-        <w:jc w:val="right"/>
-      </w:pPr>
-      <w:r>
-        <w:rPr>
-          <w:rFonts w:ascii="Arial" w:cs="Arial" w:eastAsia="Arial" w:hAnsi="Arial"/>
-          <w:color w:val="1E293B"/>
-          <w:sz w:val="21"/>
-          <w:szCs w:val="21"/>
-          <w:rtl/>
-        </w:rPr>
-        <w:t xml:space="preserve">يبقى المفتاح واحداً لكل الحسابات (ثابت في الكود)، فالربط يثبت صحّة الآلية لا أكثر — التوليد لكل مستخدم مكانه الخادم.</w:t>
+        <w:t xml:space="preserve">هذه الخطوة لم تكن موجودة أصلاً ولم تُحذف — تأكّدت من ذلك بمراجعة النسخة السابقة للكود (743042c^) قبل الشروع في البناء.</w:t>
       </w:r>
     </w:p>
     <w:p>
@@ -3984,7 +4141,7 @@
           <w:szCs w:val="24"/>
           <w:rtl/>
         </w:rPr>
-        <w:t xml:space="preserve">تعديل رقم 11 — رقم جوال اختياري في الملف الشخصي</w:t>
+        <w:t xml:space="preserve">تعديل رقم 12 — رمز QR حقيقي قابل للمسح في إعداد المصادقة الثنائية</w:t>
       </w:r>
     </w:p>
     <w:p>
@@ -4261,7 +4418,7 @@
                 <w:szCs w:val="19"/>
                 <w:rtl/>
               </w:rPr>
-              <w:t xml:space="preserve">الإعدادات ← الملف الشخصي</w:t>
+              <w:t xml:space="preserve">الإعدادات ← الأمان</w:t>
             </w:r>
           </w:p>
         </w:tc>
@@ -4321,7 +4478,7 @@
                 <w:szCs w:val="19"/>
                 <w:rtl/>
               </w:rPr>
-              <w:t xml:space="preserve">src/pages/Settings.tsx · src/store/useAuthStore.ts</w:t>
+              <w:t xml:space="preserve">src/components/ui/QrCode.tsx · src/pages/Settings.tsx · src/utils/twoFactor.ts</w:t>
             </w:r>
           </w:p>
         </w:tc>
@@ -4351,7 +4508,7 @@
                 <w:szCs w:val="19"/>
                 <w:rtl/>
               </w:rPr>
-              <w:t xml:space="preserve">27dc01f</w:t>
+              <w:t xml:space="preserve">e5a121d</w:t>
             </w:r>
           </w:p>
         </w:tc>
@@ -4412,7 +4569,7 @@
           <w:szCs w:val="21"/>
           <w:rtl/>
         </w:rPr>
-        <w:t xml:space="preserve">كان الملف الشخصي يجمع اسم العرض والبريد فقط، فلا سبيل للوصول لصاحب الحساب خارج صندوق الوارد.</w:t>
+        <w:t xml:space="preserve">كان المعروض رسمة SVG مربّعات مرصوفة يدوياً تشبه رمز QR ولا تحمل أي بيانات، فلا يقرأها أي تطبيق مصادقة. الطريقة الوحيدة للربط كانت نسخ المفتاح يدوياً.</w:t>
       </w:r>
     </w:p>
     <w:p>
@@ -4434,7 +4591,7 @@
           <w:szCs w:val="21"/>
           <w:rtl/>
         </w:rPr>
-        <w:t xml:space="preserve">استُخدم مكوّن PhoneField نفسه المستعمل في جهات الاتصال ودعوة الموظفين، فجاء معه منتقي الدولة ورمز الاتصال بدل حقل نصّي حرّ.</w:t>
+        <w:t xml:space="preserve">صار الرمز يُولَّد فعلياً من رابط otpauth:// بمكتبة qrcode.</w:t>
       </w:r>
     </w:p>
     <w:p>
@@ -4456,7 +4613,7 @@
           <w:szCs w:val="21"/>
           <w:rtl/>
         </w:rPr>
-        <w:t xml:space="preserve">الحقل اختياري ويحمل وسم «(اختياري)» بنفس أسلوب باقي الحقول غير الإلزامية.</w:t>
+        <w:t xml:space="preserve">تحقّقت منه بالتصوير والفكّ لا بالنظر: صوّرت العنصر المرسوم على الشاشة وفككته بقارئ QR، فرجع الرابط المتوقّع — في الوضع الفاتح والداكن.</w:t>
       </w:r>
     </w:p>
     <w:p>
@@ -4478,7 +4635,7 @@
           <w:szCs w:val="21"/>
           <w:rtl/>
         </w:rPr>
-        <w:t xml:space="preserve">الرقم لا يُخزَّن إلا إذا كُتب فعلاً، حتى لا يبقى رمز دولة وحده متظاهراً بأنه رقم بعد تفريغ الحقل.</w:t>
+        <w:t xml:space="preserve">ثُبّت الرمز أبيض على أسود بصرف النظر عن الثيم. لو ورث currentColor لانقلبت ألوانه في الوضع الداكن وتعذّر مسحه.</w:t>
       </w:r>
     </w:p>
     <w:p>
@@ -4500,7 +4657,7 @@
           <w:szCs w:val="21"/>
           <w:rtl/>
         </w:rPr>
-        <w:t xml:space="preserve">عند التحميل يُفصل الرقم المحفوظ إلى رمز دولة ورقم محلي بمطابقة أطول رمز — لا بتعبير نمطي جشع، لأن ذلك كان سيقرأ ‎+96891234567 على أنه ‎+9689 ويشوّه الباقي.</w:t>
+        <w:t xml:space="preserve">أُضيفت algorithm وdigits وperiod صراحةً إلى الرابط. Google Authenticator يفترض SHA1/6/30، أما Authy و1Password فلا، وافتراض مختلف يولّد رموزاً يرفضها التحقق عندنا.</w:t>
       </w:r>
     </w:p>
     <w:p>
@@ -4522,7 +4679,51 @@
           <w:szCs w:val="21"/>
           <w:rtl/>
         </w:rPr>
-        <w:t xml:space="preserve">عوينت النتيجة في المتصفح: حفظ 91234567 مع ‎+968 خزّنه ‎+96891234567، وبعد إعادة التحميل رجع مقسوماً صحيحاً.</w:t>
+        <w:t xml:space="preserve">عدد الخانات صار ثابتاً واحداً يقرأه المولّد والرابط معاً، فلا ينفصلان.</w:t>
+      </w:r>
+    </w:p>
+    <w:p>
+      <w:pPr>
+        <w:pStyle w:val="ListParagraph"/>
+        <w:numPr>
+          <w:ilvl w:val="0"/>
+          <w:numId w:val="2"/>
+        </w:numPr>
+        <w:bidi/>
+        <w:spacing w:after="70" w:line="290"/>
+        <w:jc w:val="right"/>
+      </w:pPr>
+      <w:r>
+        <w:rPr>
+          <w:rFonts w:ascii="Arial" w:cs="Arial" w:eastAsia="Arial" w:hAnsi="Arial"/>
+          <w:color w:val="1E293B"/>
+          <w:sz w:val="21"/>
+          <w:szCs w:val="21"/>
+          <w:rtl/>
+        </w:rPr>
+        <w:t xml:space="preserve">المكتبة تُحمَّل بـ dynamic import عند فتح النافذة فقط، فحزمة الإعدادات بقيت ~50KB بدل 74KB.</w:t>
+      </w:r>
+    </w:p>
+    <w:p>
+      <w:pPr>
+        <w:pStyle w:val="ListParagraph"/>
+        <w:numPr>
+          <w:ilvl w:val="0"/>
+          <w:numId w:val="2"/>
+        </w:numPr>
+        <w:bidi/>
+        <w:spacing w:after="70" w:line="290"/>
+        <w:jc w:val="right"/>
+      </w:pPr>
+      <w:r>
+        <w:rPr>
+          <w:rFonts w:ascii="Arial" w:cs="Arial" w:eastAsia="Arial" w:hAnsi="Arial"/>
+          <w:color w:val="1E293B"/>
+          <w:sz w:val="21"/>
+          <w:szCs w:val="21"/>
+          <w:rtl/>
+        </w:rPr>
+        <w:t xml:space="preserve">يبقى المفتاح واحداً لكل الحسابات (ثابت في الكود)، فالربط يثبت صحّة الآلية لا أكثر — التوليد لكل مستخدم مكانه الخادم.</w:t>
       </w:r>
     </w:p>
     <w:p>
@@ -4547,7 +4748,7 @@
           <w:szCs w:val="24"/>
           <w:rtl/>
         </w:rPr>
-        <w:t xml:space="preserve">تعديل رقم 10 — شاشة التحقق بخطوتين في تسجيل الدخول</w:t>
+        <w:t xml:space="preserve">تعديل رقم 11 — رقم جوال اختياري في الملف الشخصي</w:t>
       </w:r>
     </w:p>
     <w:p>
@@ -4824,7 +5025,7 @@
                 <w:szCs w:val="19"/>
                 <w:rtl/>
               </w:rPr>
-              <w:t xml:space="preserve">تسجيل الدخول</w:t>
+              <w:t xml:space="preserve">الإعدادات ← الملف الشخصي</w:t>
             </w:r>
           </w:p>
         </w:tc>
@@ -4854,7 +5055,7 @@
                 <w:szCs w:val="19"/>
                 <w:rtl/>
               </w:rPr>
-              <w:t xml:space="preserve">/login</w:t>
+              <w:t xml:space="preserve">/settings</w:t>
             </w:r>
           </w:p>
         </w:tc>
@@ -4884,7 +5085,7 @@
                 <w:szCs w:val="19"/>
                 <w:rtl/>
               </w:rPr>
-              <w:t xml:space="preserve">src/utils/twoFactor.ts · src/components/auth/TwoFactorChallenge.tsx · src/store/useAuthStore.ts · src/pages/Login.tsx</w:t>
+              <w:t xml:space="preserve">src/pages/Settings.tsx · src/store/useAuthStore.ts</w:t>
             </w:r>
           </w:p>
         </w:tc>
@@ -4914,7 +5115,7 @@
                 <w:szCs w:val="19"/>
                 <w:rtl/>
               </w:rPr>
-              <w:t xml:space="preserve">743042c</w:t>
+              <w:t xml:space="preserve">27dc01f</w:t>
             </w:r>
           </w:p>
         </w:tc>
@@ -4975,7 +5176,7 @@
           <w:szCs w:val="21"/>
           <w:rtl/>
         </w:rPr>
-        <w:t xml:space="preserve">⚠️ هيكل واجهة لا أمان: التحقق يجري في المتصفح والمفتاح السري داخل حزمة الجافاسكربت، فيمكن تجاوزه. الغرض تجهيز الواجهة والعقد لحين وجود باكيند، وهذا مكتوب صراحةً في رأس ملف twoFactor.ts.</w:t>
+        <w:t xml:space="preserve">كان الملف الشخصي يجمع اسم العرض والبريد فقط، فلا سبيل للوصول لصاحب الحساب خارج صندوق الوارد.</w:t>
       </w:r>
     </w:p>
     <w:p>
@@ -4997,7 +5198,7 @@
           <w:szCs w:val="21"/>
           <w:rtl/>
         </w:rPr>
-        <w:t xml:space="preserve">كان الدخول يوثّق فوراً بعد كلمة المرور. صار مرحلتين: كلمة المرور تنتج حالة معلّقة في الذاكرة فقط، ولا يُكتب شيء في التخزين حتى يمرّ العامل الثاني — فإغلاق التبويب في منتصف العملية لا يترك جلسة مفتوحة.</w:t>
+        <w:t xml:space="preserve">استُخدم مكوّن PhoneField نفسه المستعمل في جهات الاتصال ودعوة الموظفين، فجاء معه منتقي الدولة ورمز الاتصال بدل حقل نصّي حرّ.</w:t>
       </w:r>
     </w:p>
     <w:p>
@@ -5019,7 +5220,7 @@
           <w:szCs w:val="21"/>
           <w:rtl/>
         </w:rPr>
-        <w:t xml:space="preserve">شاشة التحقق تظهر داخل مسار الدخول نفسه لا على عنوان مستقل، لأن عنواناً مستقلاً يفتحه أي شخص دون المرور بالمرحلة الأولى.</w:t>
+        <w:t xml:space="preserve">الحقل اختياري ويحمل وسم «(اختياري)» بنفس أسلوب باقي الحقول غير الإلزامية.</w:t>
       </w:r>
     </w:p>
     <w:p>
@@ -5041,7 +5242,7 @@
           <w:szCs w:val="21"/>
           <w:rtl/>
         </w:rPr>
-        <w:t xml:space="preserve">نُفِّذت خوارزمية TOTP (المعيار RFC 6238) بـ Web Crypto، فأكواد Google Authenticator الحقيقية تُقبل فعلاً. تحقّقت من التنفيذ بمتجهات الاختبار الخمسة الواردة في المعيار نفسه وكلها طابقت.</w:t>
+        <w:t xml:space="preserve">الرقم لا يُخزَّن إلا إذا كُتب فعلاً، حتى لا يبقى رمز دولة وحده متظاهراً بأنه رقم بعد تفريغ الحقل.</w:t>
       </w:r>
     </w:p>
     <w:p>
@@ -5063,7 +5264,7 @@
           <w:szCs w:val="21"/>
           <w:rtl/>
         </w:rPr>
-        <w:t xml:space="preserve">نافذة تسامح خطوة واحدة قبل وبعد لاستيعاب فروق ساعة الجهاز.</w:t>
+        <w:t xml:space="preserve">عند التحميل يُفصل الرقم المحفوظ إلى رمز دولة ورقم محلي بمطابقة أطول رمز — لا بتعبير نمطي جشع، لأن ذلك كان سيقرأ ‎+96891234567 على أنه ‎+9689 ويشوّه الباقي.</w:t>
       </w:r>
     </w:p>
     <w:p>
@@ -5085,205 +5286,7 @@
           <w:szCs w:val="21"/>
           <w:rtl/>
         </w:rPr>
-        <w:t xml:space="preserve">ستة مربعات بانتقال تلقائي بين الخانات ودعم اللصق وإرسال تلقائي عند اكتمال الرمز.</w:t>
-      </w:r>
-    </w:p>
-    <w:p>
-      <w:pPr>
-        <w:pStyle w:val="ListParagraph"/>
-        <w:numPr>
-          <w:ilvl w:val="0"/>
-          <w:numId w:val="2"/>
-        </w:numPr>
-        <w:bidi/>
-        <w:spacing w:after="70" w:line="290"/>
-        <w:jc w:val="right"/>
-      </w:pPr>
-      <w:r>
-        <w:rPr>
-          <w:rFonts w:ascii="Arial" w:cs="Arial" w:eastAsia="Arial" w:hAnsi="Arial"/>
-          <w:color w:val="1E293B"/>
-          <w:sz w:val="21"/>
-          <w:szCs w:val="21"/>
-          <w:rtl/>
-        </w:rPr>
-        <w:t xml:space="preserve">لا يوجد زر «إعادة إرسال» — التطبيق يولّد الرمز على الجهاز ولا شيء يُرسَل. وُضع مكانه عدّاد يبيّن الثواني المتبقية قبل تغيّر الرمز، فلا ينتظر الموظف رسالة لن تصل.</w:t>
-      </w:r>
-    </w:p>
-    <w:p>
-      <w:pPr>
-        <w:pStyle w:val="ListParagraph"/>
-        <w:numPr>
-          <w:ilvl w:val="0"/>
-          <w:numId w:val="2"/>
-        </w:numPr>
-        <w:bidi/>
-        <w:spacing w:after="70" w:line="290"/>
-        <w:jc w:val="right"/>
-      </w:pPr>
-      <w:r>
-        <w:rPr>
-          <w:rFonts w:ascii="Arial" w:cs="Arial" w:eastAsia="Arial" w:hAnsi="Arial"/>
-          <w:color w:val="1E293B"/>
-          <w:sz w:val="21"/>
-          <w:szCs w:val="21"/>
-          <w:rtl/>
-        </w:rPr>
-        <w:t xml:space="preserve">مسار الرموز الاحتياطية داخل الشاشة نفسها، لأن فاقد هاتفه بلا رمز احتياطي يُقفل خارج حسابه نهائياً.</w:t>
-      </w:r>
-    </w:p>
-    <w:p>
-      <w:pPr>
-        <w:pStyle w:val="ListParagraph"/>
-        <w:numPr>
-          <w:ilvl w:val="0"/>
-          <w:numId w:val="2"/>
-        </w:numPr>
-        <w:bidi/>
-        <w:spacing w:after="70" w:line="290"/>
-        <w:jc w:val="right"/>
-      </w:pPr>
-      <w:r>
-        <w:rPr>
-          <w:rFonts w:ascii="Arial" w:cs="Arial" w:eastAsia="Arial" w:hAnsi="Arial"/>
-          <w:color w:val="1E293B"/>
-          <w:sz w:val="21"/>
-          <w:szCs w:val="21"/>
-          <w:rtl/>
-        </w:rPr>
-        <w:t xml:space="preserve">رسالة الخطأ واحدة للرمز الخاطئ وللمنتهي عمداً، حتى لا تُعطي المهاجم معلومة يفرّق بها.</w:t>
-      </w:r>
-    </w:p>
-    <w:p>
-      <w:pPr>
-        <w:pStyle w:val="ListParagraph"/>
-        <w:numPr>
-          <w:ilvl w:val="0"/>
-          <w:numId w:val="2"/>
-        </w:numPr>
-        <w:bidi/>
-        <w:spacing w:after="70" w:line="290"/>
-        <w:jc w:val="right"/>
-      </w:pPr>
-      <w:r>
-        <w:rPr>
-          <w:rFonts w:ascii="Arial" w:cs="Arial" w:eastAsia="Arial" w:hAnsi="Arial"/>
-          <w:color w:val="1E293B"/>
-          <w:sz w:val="21"/>
-          <w:szCs w:val="21"/>
-          <w:rtl/>
-        </w:rPr>
-        <w:t xml:space="preserve">حدّ خمس محاولات ثم قفل خمس دقائق — وهذا في الواجهة للتوثيق فقط، ومكانه الصحيح الخادم.</w:t>
-      </w:r>
-    </w:p>
-    <w:p>
-      <w:pPr>
-        <w:pStyle w:val="ListParagraph"/>
-        <w:numPr>
-          <w:ilvl w:val="0"/>
-          <w:numId w:val="2"/>
-        </w:numPr>
-        <w:bidi/>
-        <w:spacing w:after="70" w:line="290"/>
-        <w:jc w:val="right"/>
-      </w:pPr>
-      <w:r>
-        <w:rPr>
-          <w:rFonts w:ascii="Arial" w:cs="Arial" w:eastAsia="Arial" w:hAnsi="Arial"/>
-          <w:color w:val="1E293B"/>
-          <w:sz w:val="21"/>
-          <w:szCs w:val="21"/>
-          <w:rtl/>
-        </w:rPr>
-        <w:t xml:space="preserve">شاشة الإعداد في الإعدادات كانت تقبل أي ستة أرقام وتفعّل 2FA بناءً عليها. صارت تتحقق فعلياً، لأن التفعيل بعد مسح خاطئ للرمز يقفل صاحب الحساب خارج حسابه.</w:t>
-      </w:r>
-    </w:p>
-    <w:p>
-      <w:pPr>
-        <w:pStyle w:val="ListParagraph"/>
-        <w:numPr>
-          <w:ilvl w:val="0"/>
-          <w:numId w:val="2"/>
-        </w:numPr>
-        <w:bidi/>
-        <w:spacing w:after="70" w:line="290"/>
-        <w:jc w:val="right"/>
-      </w:pPr>
-      <w:r>
-        <w:rPr>
-          <w:rFonts w:ascii="Arial" w:cs="Arial" w:eastAsia="Arial" w:hAnsi="Arial"/>
-          <w:color w:val="1E293B"/>
-          <w:sz w:val="21"/>
-          <w:szCs w:val="21"/>
-          <w:rtl/>
-        </w:rPr>
-        <w:t xml:space="preserve">وُحّد المفتاح والرموز الاحتياطية بين شاشة الإعداد وشاشة الدخول في ملف واحد، فما يعرضه الـQR هو ما يُتحقّق منه.</w:t>
-      </w:r>
-    </w:p>
-    <w:p>
-      <w:pPr>
-        <w:pStyle w:val="ListParagraph"/>
-        <w:numPr>
-          <w:ilvl w:val="0"/>
-          <w:numId w:val="2"/>
-        </w:numPr>
-        <w:bidi/>
-        <w:spacing w:after="70" w:line="290"/>
-        <w:jc w:val="right"/>
-      </w:pPr>
-      <w:r>
-        <w:rPr>
-          <w:rFonts w:ascii="Arial" w:cs="Arial" w:eastAsia="Arial" w:hAnsi="Arial"/>
-          <w:color w:val="1E293B"/>
-          <w:sz w:val="21"/>
-          <w:szCs w:val="21"/>
-          <w:rtl/>
-        </w:rPr>
-        <w:t xml:space="preserve">حُذف الحقل المكرّر AppSettings.twoFactorEnabled — كان يُكتب عند التهيئة ولا يُقرأ في أي مكان، بينما الحقل الحيّ هو security.twoFactor. وجود علمين لنفس المعنى كان سيُظهر الميزة مفعّلة في شاشة ومطفأة في أخرى.</w:t>
-      </w:r>
-    </w:p>
-    <w:p>
-      <w:pPr>
-        <w:pStyle w:val="ListParagraph"/>
-        <w:numPr>
-          <w:ilvl w:val="0"/>
-          <w:numId w:val="2"/>
-        </w:numPr>
-        <w:bidi/>
-        <w:spacing w:after="70" w:line="290"/>
-        <w:jc w:val="right"/>
-      </w:pPr>
-      <w:r>
-        <w:rPr>
-          <w:rFonts w:ascii="Arial" w:cs="Arial" w:eastAsia="Arial" w:hAnsi="Arial"/>
-          <w:color w:val="1E293B"/>
-          <w:sz w:val="21"/>
-          <w:szCs w:val="21"/>
-          <w:rtl/>
-        </w:rPr>
-        <w:t xml:space="preserve">أخطأتُ في شرط الإرسال التلقائي: كتبت فحصاً يتضمّن includes('') وهو دائماً صحيح في جافاسكربت، فلم يكن الإرسال التلقائي يعمل إطلاقاً. كشفه اختبار المتصفح وأُصلح.</w:t>
-      </w:r>
-    </w:p>
-    <w:p>
-      <w:pPr>
-        <w:pStyle w:val="ListParagraph"/>
-        <w:numPr>
-          <w:ilvl w:val="0"/>
-          <w:numId w:val="2"/>
-        </w:numPr>
-        <w:bidi/>
-        <w:spacing w:after="70" w:line="290"/>
-        <w:jc w:val="right"/>
-      </w:pPr>
-      <w:r>
-        <w:rPr>
-          <w:rFonts w:ascii="Arial" w:cs="Arial" w:eastAsia="Arial" w:hAnsi="Arial"/>
-          <w:color w:val="1E293B"/>
-          <w:sz w:val="21"/>
-          <w:szCs w:val="21"/>
-          <w:rtl/>
-        </w:rPr>
-        <w:t xml:space="preserve">اختُبر التدفّق كاملاً في المتصفح: الدخول المباشر عند تعطيل 2FA، ظهور الشاشة عند تفعيلها، خلوّ التخزين قبل التحقق، رفض الرمز الخاطئ، قبول رمز TOTP صحيح، وقبول رمز احتياطي.</w:t>
+        <w:t xml:space="preserve">عوينت النتيجة في المتصفح: حفظ 91234567 مع ‎+968 خزّنه ‎+96891234567، وبعد إعادة التحميل رجع مقسوماً صحيحاً.</w:t>
       </w:r>
     </w:p>
     <w:p>
@@ -5308,7 +5311,7 @@
           <w:szCs w:val="24"/>
           <w:rtl/>
         </w:rPr>
-        <w:t xml:space="preserve">تعديل رقم 9 — رقم هاتف اختياري عند دعوة الموظف</w:t>
+        <w:t xml:space="preserve">تعديل رقم 10 — شاشة التحقق بخطوتين في تسجيل الدخول</w:t>
       </w:r>
     </w:p>
     <w:p>
@@ -5585,7 +5588,7 @@
                 <w:szCs w:val="19"/>
                 <w:rtl/>
               </w:rPr>
-              <w:t xml:space="preserve">فريق العمل</w:t>
+              <w:t xml:space="preserve">تسجيل الدخول</w:t>
             </w:r>
           </w:p>
         </w:tc>
@@ -5615,7 +5618,7 @@
                 <w:szCs w:val="19"/>
                 <w:rtl/>
               </w:rPr>
-              <w:t xml:space="preserve">/team</w:t>
+              <w:t xml:space="preserve">/login</w:t>
             </w:r>
           </w:p>
         </w:tc>
@@ -5645,7 +5648,7 @@
                 <w:szCs w:val="19"/>
                 <w:rtl/>
               </w:rPr>
-              <w:t xml:space="preserve">src/pages/Team.tsx · src/types/index.ts · src/store/useDataStore.ts</w:t>
+              <w:t xml:space="preserve">src/utils/twoFactor.ts · src/components/auth/TwoFactorChallenge.tsx · src/store/useAuthStore.ts · src/pages/Login.tsx</w:t>
             </w:r>
           </w:p>
         </w:tc>
@@ -5675,7 +5678,7 @@
                 <w:szCs w:val="19"/>
                 <w:rtl/>
               </w:rPr>
-              <w:t xml:space="preserve">a4d8398</w:t>
+              <w:t xml:space="preserve">743042c</w:t>
             </w:r>
           </w:p>
         </w:tc>
@@ -5736,7 +5739,7 @@
           <w:szCs w:val="21"/>
           <w:rtl/>
         </w:rPr>
-        <w:t xml:space="preserve">أُضيف حقل رقم الهاتف إلى نموذج دعوة الموظف وتعديله — لم يكن موجوداً من قبل أصلاً.</w:t>
+        <w:t xml:space="preserve">⚠️ هيكل واجهة لا أمان: التحقق يجري في المتصفح والمفتاح السري داخل حزمة الجافاسكربت، فيمكن تجاوزه. الغرض تجهيز الواجهة والعقد لحين وجود باكيند، وهذا مكتوب صراحةً في رأس ملف twoFactor.ts.</w:t>
       </w:r>
     </w:p>
     <w:p>
@@ -5758,7 +5761,7 @@
           <w:szCs w:val="21"/>
           <w:rtl/>
         </w:rPr>
-        <w:t xml:space="preserve">الحقل اختياري: يحمل وسم «(اختياري)» بنفس أسلوب حقل الأقسام، وبلا النجمة الحمراء التي تعلّم الاسم والبريد والدور. إرسال الدعوة بدونه يمرّ دون اعتراض.</w:t>
+        <w:t xml:space="preserve">كان الدخول يوثّق فوراً بعد كلمة المرور. صار مرحلتين: كلمة المرور تنتج حالة معلّقة في الذاكرة فقط، ولا يُكتب شيء في التخزين حتى يمرّ العامل الثاني — فإغلاق التبويب في منتصف العملية لا يترك جلسة مفتوحة.</w:t>
       </w:r>
     </w:p>
     <w:p>
@@ -5780,7 +5783,7 @@
           <w:szCs w:val="21"/>
           <w:rtl/>
         </w:rPr>
-        <w:t xml:space="preserve">استُخدم مكوّن PhoneField نفسه المستعمل في جهات الاتصال والتسجيل، فيأتي معه منتقي الدولة ورمز الاتصال بدل حقل نصّي حرّ.</w:t>
+        <w:t xml:space="preserve">شاشة التحقق تظهر داخل مسار الدخول نفسه لا على عنوان مستقل، لأن عنواناً مستقلاً يفتحه أي شخص دون المرور بالمرحلة الأولى.</w:t>
       </w:r>
     </w:p>
     <w:p>
@@ -5802,7 +5805,7 @@
           <w:szCs w:val="21"/>
           <w:rtl/>
         </w:rPr>
-        <w:t xml:space="preserve">الرقم لا يُخزَّن إلا إذا كُتب فعلاً، حتى لا يبقى رمز دولة معلّقاً بلا رقم في بيانات موظف تركه فارغاً.</w:t>
+        <w:t xml:space="preserve">نُفِّذت خوارزمية TOTP (المعيار RFC 6238) بـ Web Crypto، فأكواد Google Authenticator الحقيقية تُقبل فعلاً. تحقّقت من التنفيذ بمتجهات الاختبار الخمسة الواردة في المعيار نفسه وكلها طابقت.</w:t>
       </w:r>
     </w:p>
     <w:p>
@@ -5824,7 +5827,7 @@
           <w:szCs w:val="21"/>
           <w:rtl/>
         </w:rPr>
-        <w:t xml:space="preserve">عند فتح موظف للتعديل يُفصل الرقم المحفوظ إلى رمز دولة ورقم محلي بمطابقة أطول رمز مطابق من قائمة الدول — لا بتعبير نمطي جشع، لأن ذلك كان سيقرأ ‎+96891234567 على أنه ‎+9689 ثم يشوّه الرقم.</w:t>
+        <w:t xml:space="preserve">نافذة تسامح خطوة واحدة قبل وبعد لاستيعاب فروق ساعة الجهاز.</w:t>
       </w:r>
     </w:p>
     <w:p>
@@ -5846,7 +5849,7 @@
           <w:szCs w:val="21"/>
           <w:rtl/>
         </w:rPr>
-        <w:t xml:space="preserve">الرقم يظهر في لوحة تفاصيل الموظف حين يكون موجوداً، فلا تُجمع بيانات لا تُعرض في أي مكان.</w:t>
+        <w:t xml:space="preserve">ستة مربعات بانتقال تلقائي بين الخانات ودعم اللصق وإرسال تلقائي عند اكتمال الرمز.</w:t>
       </w:r>
     </w:p>
     <w:p>
@@ -5868,7 +5871,7 @@
           <w:szCs w:val="21"/>
           <w:rtl/>
         </w:rPr>
-        <w:t xml:space="preserve">وُسّع توقيع inviteAgent ليقبل الحقل الجديد.</w:t>
+        <w:t xml:space="preserve">لا يوجد زر «إعادة إرسال» — التطبيق يولّد الرمز على الجهاز ولا شيء يُرسَل. وُضع مكانه عدّاد يبيّن الثواني المتبقية قبل تغيّر الرمز، فلا ينتظر الموظف رسالة لن تصل.</w:t>
       </w:r>
     </w:p>
     <w:p>
@@ -5890,7 +5893,161 @@
           <w:szCs w:val="21"/>
           <w:rtl/>
         </w:rPr>
-        <w:t xml:space="preserve">عوينت النتيجة في المتصفح: الحقل ووسم الاختياري ظاهران، ودعوة موظف بلا رقم هاتف نجحت.</w:t>
+        <w:t xml:space="preserve">مسار الرموز الاحتياطية داخل الشاشة نفسها، لأن فاقد هاتفه بلا رمز احتياطي يُقفل خارج حسابه نهائياً.</w:t>
+      </w:r>
+    </w:p>
+    <w:p>
+      <w:pPr>
+        <w:pStyle w:val="ListParagraph"/>
+        <w:numPr>
+          <w:ilvl w:val="0"/>
+          <w:numId w:val="2"/>
+        </w:numPr>
+        <w:bidi/>
+        <w:spacing w:after="70" w:line="290"/>
+        <w:jc w:val="right"/>
+      </w:pPr>
+      <w:r>
+        <w:rPr>
+          <w:rFonts w:ascii="Arial" w:cs="Arial" w:eastAsia="Arial" w:hAnsi="Arial"/>
+          <w:color w:val="1E293B"/>
+          <w:sz w:val="21"/>
+          <w:szCs w:val="21"/>
+          <w:rtl/>
+        </w:rPr>
+        <w:t xml:space="preserve">رسالة الخطأ واحدة للرمز الخاطئ وللمنتهي عمداً، حتى لا تُعطي المهاجم معلومة يفرّق بها.</w:t>
+      </w:r>
+    </w:p>
+    <w:p>
+      <w:pPr>
+        <w:pStyle w:val="ListParagraph"/>
+        <w:numPr>
+          <w:ilvl w:val="0"/>
+          <w:numId w:val="2"/>
+        </w:numPr>
+        <w:bidi/>
+        <w:spacing w:after="70" w:line="290"/>
+        <w:jc w:val="right"/>
+      </w:pPr>
+      <w:r>
+        <w:rPr>
+          <w:rFonts w:ascii="Arial" w:cs="Arial" w:eastAsia="Arial" w:hAnsi="Arial"/>
+          <w:color w:val="1E293B"/>
+          <w:sz w:val="21"/>
+          <w:szCs w:val="21"/>
+          <w:rtl/>
+        </w:rPr>
+        <w:t xml:space="preserve">حدّ خمس محاولات ثم قفل خمس دقائق — وهذا في الواجهة للتوثيق فقط، ومكانه الصحيح الخادم.</w:t>
+      </w:r>
+    </w:p>
+    <w:p>
+      <w:pPr>
+        <w:pStyle w:val="ListParagraph"/>
+        <w:numPr>
+          <w:ilvl w:val="0"/>
+          <w:numId w:val="2"/>
+        </w:numPr>
+        <w:bidi/>
+        <w:spacing w:after="70" w:line="290"/>
+        <w:jc w:val="right"/>
+      </w:pPr>
+      <w:r>
+        <w:rPr>
+          <w:rFonts w:ascii="Arial" w:cs="Arial" w:eastAsia="Arial" w:hAnsi="Arial"/>
+          <w:color w:val="1E293B"/>
+          <w:sz w:val="21"/>
+          <w:szCs w:val="21"/>
+          <w:rtl/>
+        </w:rPr>
+        <w:t xml:space="preserve">شاشة الإعداد في الإعدادات كانت تقبل أي ستة أرقام وتفعّل 2FA بناءً عليها. صارت تتحقق فعلياً، لأن التفعيل بعد مسح خاطئ للرمز يقفل صاحب الحساب خارج حسابه.</w:t>
+      </w:r>
+    </w:p>
+    <w:p>
+      <w:pPr>
+        <w:pStyle w:val="ListParagraph"/>
+        <w:numPr>
+          <w:ilvl w:val="0"/>
+          <w:numId w:val="2"/>
+        </w:numPr>
+        <w:bidi/>
+        <w:spacing w:after="70" w:line="290"/>
+        <w:jc w:val="right"/>
+      </w:pPr>
+      <w:r>
+        <w:rPr>
+          <w:rFonts w:ascii="Arial" w:cs="Arial" w:eastAsia="Arial" w:hAnsi="Arial"/>
+          <w:color w:val="1E293B"/>
+          <w:sz w:val="21"/>
+          <w:szCs w:val="21"/>
+          <w:rtl/>
+        </w:rPr>
+        <w:t xml:space="preserve">وُحّد المفتاح والرموز الاحتياطية بين شاشة الإعداد وشاشة الدخول في ملف واحد، فما يعرضه الـQR هو ما يُتحقّق منه.</w:t>
+      </w:r>
+    </w:p>
+    <w:p>
+      <w:pPr>
+        <w:pStyle w:val="ListParagraph"/>
+        <w:numPr>
+          <w:ilvl w:val="0"/>
+          <w:numId w:val="2"/>
+        </w:numPr>
+        <w:bidi/>
+        <w:spacing w:after="70" w:line="290"/>
+        <w:jc w:val="right"/>
+      </w:pPr>
+      <w:r>
+        <w:rPr>
+          <w:rFonts w:ascii="Arial" w:cs="Arial" w:eastAsia="Arial" w:hAnsi="Arial"/>
+          <w:color w:val="1E293B"/>
+          <w:sz w:val="21"/>
+          <w:szCs w:val="21"/>
+          <w:rtl/>
+        </w:rPr>
+        <w:t xml:space="preserve">حُذف الحقل المكرّر AppSettings.twoFactorEnabled — كان يُكتب عند التهيئة ولا يُقرأ في أي مكان، بينما الحقل الحيّ هو security.twoFactor. وجود علمين لنفس المعنى كان سيُظهر الميزة مفعّلة في شاشة ومطفأة في أخرى.</w:t>
+      </w:r>
+    </w:p>
+    <w:p>
+      <w:pPr>
+        <w:pStyle w:val="ListParagraph"/>
+        <w:numPr>
+          <w:ilvl w:val="0"/>
+          <w:numId w:val="2"/>
+        </w:numPr>
+        <w:bidi/>
+        <w:spacing w:after="70" w:line="290"/>
+        <w:jc w:val="right"/>
+      </w:pPr>
+      <w:r>
+        <w:rPr>
+          <w:rFonts w:ascii="Arial" w:cs="Arial" w:eastAsia="Arial" w:hAnsi="Arial"/>
+          <w:color w:val="1E293B"/>
+          <w:sz w:val="21"/>
+          <w:szCs w:val="21"/>
+          <w:rtl/>
+        </w:rPr>
+        <w:t xml:space="preserve">أخطأتُ في شرط الإرسال التلقائي: كتبت فحصاً يتضمّن includes('') وهو دائماً صحيح في جافاسكربت، فلم يكن الإرسال التلقائي يعمل إطلاقاً. كشفه اختبار المتصفح وأُصلح.</w:t>
+      </w:r>
+    </w:p>
+    <w:p>
+      <w:pPr>
+        <w:pStyle w:val="ListParagraph"/>
+        <w:numPr>
+          <w:ilvl w:val="0"/>
+          <w:numId w:val="2"/>
+        </w:numPr>
+        <w:bidi/>
+        <w:spacing w:after="70" w:line="290"/>
+        <w:jc w:val="right"/>
+      </w:pPr>
+      <w:r>
+        <w:rPr>
+          <w:rFonts w:ascii="Arial" w:cs="Arial" w:eastAsia="Arial" w:hAnsi="Arial"/>
+          <w:color w:val="1E293B"/>
+          <w:sz w:val="21"/>
+          <w:szCs w:val="21"/>
+          <w:rtl/>
+        </w:rPr>
+        <w:t xml:space="preserve">اختُبر التدفّق كاملاً في المتصفح: الدخول المباشر عند تعطيل 2FA، ظهور الشاشة عند تفعيلها، خلوّ التخزين قبل التحقق، رفض الرمز الخاطئ، قبول رمز TOTP صحيح، وقبول رمز احتياطي.</w:t>
       </w:r>
     </w:p>
     <w:p>
@@ -5915,7 +6072,7 @@
           <w:szCs w:val="24"/>
           <w:rtl/>
         </w:rPr>
-        <w:t xml:space="preserve">تعديل رقم 8 — فاصل مرقّم بين دورات المحادثة داخل الثريد</w:t>
+        <w:t xml:space="preserve">تعديل رقم 9 — رقم هاتف اختياري عند دعوة الموظف</w:t>
       </w:r>
     </w:p>
     <w:p>
@@ -6192,7 +6349,7 @@
                 <w:szCs w:val="19"/>
                 <w:rtl/>
               </w:rPr>
-              <w:t xml:space="preserve">صندوق الوارد</w:t>
+              <w:t xml:space="preserve">فريق العمل</w:t>
             </w:r>
           </w:p>
         </w:tc>
@@ -6222,7 +6379,7 @@
                 <w:szCs w:val="19"/>
                 <w:rtl/>
               </w:rPr>
-              <w:t xml:space="preserve">/inbox</w:t>
+              <w:t xml:space="preserve">/team</w:t>
             </w:r>
           </w:p>
         </w:tc>
@@ -6252,7 +6409,7 @@
                 <w:szCs w:val="19"/>
                 <w:rtl/>
               </w:rPr>
-              <w:t xml:space="preserve">src/pages/Inbox.tsx</w:t>
+              <w:t xml:space="preserve">src/pages/Team.tsx · src/types/index.ts · src/store/useDataStore.ts</w:t>
             </w:r>
           </w:p>
         </w:tc>
@@ -6282,7 +6439,7 @@
                 <w:szCs w:val="19"/>
                 <w:rtl/>
               </w:rPr>
-              <w:t xml:space="preserve">f9b43fd</w:t>
+              <w:t xml:space="preserve">a4d8398</w:t>
             </w:r>
           </w:p>
         </w:tc>
@@ -6343,7 +6500,7 @@
           <w:szCs w:val="21"/>
           <w:rtl/>
         </w:rPr>
-        <w:t xml:space="preserve">كل دورة جديدة صار يسبقها فاصل أفقي ظاهر داخل الثريد، فيُعرف أين انتهت دورة وبدأت التي تليها من غير رجوع إلى شريط الفهرسة.</w:t>
+        <w:t xml:space="preserve">أُضيف حقل رقم الهاتف إلى نموذج دعوة الموظف وتعديله — لم يكن موجوداً من قبل أصلاً.</w:t>
       </w:r>
     </w:p>
     <w:p>
@@ -6365,7 +6522,7 @@
           <w:szCs w:val="21"/>
           <w:rtl/>
         </w:rPr>
-        <w:t xml:space="preserve">الفاصل يحمل رقم الدورة وكلمة «إعادة فتح» والتاريخ، فيجيب عن ثلاثة أسئلة في سطر: أي دورة، وماذا جرى، ومتى.</w:t>
+        <w:t xml:space="preserve">الحقل اختياري: يحمل وسم «(اختياري)» بنفس أسلوب حقل الأقسام، وبلا النجمة الحمراء التي تعلّم الاسم والبريد والدور. إرسال الدعوة بدونه يمرّ دون اعتراض.</w:t>
       </w:r>
     </w:p>
     <w:p>
@@ -6387,7 +6544,7 @@
           <w:szCs w:val="21"/>
           <w:rtl/>
         </w:rPr>
-        <w:t xml:space="preserve">صيغته بلون العلامة التجارية بخطّين وشارة بارزة، لأن المطلوب أن يُلاحَظ لا أن يمرّ مرور الكرام.</w:t>
+        <w:t xml:space="preserve">استُخدم مكوّن PhoneField نفسه المستعمل في جهات الاتصال والتسجيل، فيأتي معه منتقي الدولة ورمز الاتصال بدل حقل نصّي حرّ.</w:t>
       </w:r>
     </w:p>
     <w:p>
@@ -6409,7 +6566,7 @@
           <w:szCs w:val="21"/>
           <w:rtl/>
         </w:rPr>
-        <w:t xml:space="preserve">الفاصل يحلّ محلّ شريحة التاريخ العادية في ذلك الموضع لأنه يحمل التاريخ أصلاً، فلا يجتمع فاصلان متتاليان.</w:t>
+        <w:t xml:space="preserve">الرقم لا يُخزَّن إلا إذا كُتب فعلاً، حتى لا يبقى رمز دولة معلّقاً بلا رقم في بيانات موظف تركه فارغاً.</w:t>
       </w:r>
     </w:p>
     <w:p>
@@ -6431,7 +6588,7 @@
           <w:szCs w:val="21"/>
           <w:rtl/>
         </w:rPr>
-        <w:t xml:space="preserve">لا يظهر قبل الدورة الأولى لأنها بداية المحادثة لا إعادة فتح لها.</w:t>
+        <w:t xml:space="preserve">عند فتح موظف للتعديل يُفصل الرقم المحفوظ إلى رمز دولة ورقم محلي بمطابقة أطول رمز مطابق من قائمة الدول — لا بتعبير نمطي جشع، لأن ذلك كان سيقرأ ‎+96891234567 على أنه ‎+9689 ثم يشوّه الرقم.</w:t>
       </w:r>
     </w:p>
     <w:p>
@@ -6453,7 +6610,7 @@
           <w:szCs w:val="21"/>
           <w:rtl/>
         </w:rPr>
-        <w:t xml:space="preserve">الدورة ذات البداية المستنتجة تُوسم «(تقديري)» في الفاصل نفسه، اتساقاً مع العلامة المتقطّعة في شريط الفهرسة.</w:t>
+        <w:t xml:space="preserve">الرقم يظهر في لوحة تفاصيل الموظف حين يكون موجوداً، فلا تُجمع بيانات لا تُعرض في أي مكان.</w:t>
       </w:r>
     </w:p>
     <w:p>
@@ -6475,7 +6632,7 @@
           <w:szCs w:val="21"/>
           <w:rtl/>
         </w:rPr>
-        <w:t xml:space="preserve">الترقيم يتبع رقم الدورة (الدورة 2، الدورة 3) لا رقم إعادة الفتح، ليطابق ما يعرضه شريط الفهرسة وحقل sessionCount ولا يتضارب معهما.</w:t>
+        <w:t xml:space="preserve">وُسّع توقيع inviteAgent ليقبل الحقل الجديد.</w:t>
       </w:r>
     </w:p>
     <w:p>
@@ -6497,7 +6654,7 @@
           <w:szCs w:val="21"/>
           <w:rtl/>
         </w:rPr>
-        <w:t xml:space="preserve">عوينت النتيجة في المتصفح: فاصلان بالرقمين الصحيحين، وشريحة التاريخ المكرّرة اختفت من موضعيهما.</w:t>
+        <w:t xml:space="preserve">عوينت النتيجة في المتصفح: الحقل ووسم الاختياري ظاهران، ودعوة موظف بلا رقم هاتف نجحت.</w:t>
       </w:r>
     </w:p>
     <w:p>
@@ -6522,7 +6679,7 @@
           <w:szCs w:val="24"/>
           <w:rtl/>
         </w:rPr>
-        <w:t xml:space="preserve">تعديل رقم 7 — انعكاس حالة «مجدولة» للتخفيض المؤجّل في بورتال العميل</w:t>
+        <w:t xml:space="preserve">تعديل رقم 8 — فاصل مرقّم بين دورات المحادثة داخل الثريد</w:t>
       </w:r>
     </w:p>
     <w:p>
@@ -6799,7 +6956,7 @@
                 <w:szCs w:val="19"/>
                 <w:rtl/>
               </w:rPr>
-              <w:t xml:space="preserve">الباقات والاشتراك</w:t>
+              <w:t xml:space="preserve">صندوق الوارد</w:t>
             </w:r>
           </w:p>
         </w:tc>
@@ -6829,7 +6986,7 @@
                 <w:szCs w:val="19"/>
                 <w:rtl/>
               </w:rPr>
-              <w:t xml:space="preserve">/billing</w:t>
+              <w:t xml:space="preserve">/inbox</w:t>
             </w:r>
           </w:p>
         </w:tc>
@@ -6859,7 +7016,7 @@
                 <w:szCs w:val="19"/>
                 <w:rtl/>
               </w:rPr>
-              <w:t xml:space="preserve">src/types/index.ts · src/pages/Billing.tsx · src/store/adminMockData.ts</w:t>
+              <w:t xml:space="preserve">src/pages/Inbox.tsx</w:t>
             </w:r>
           </w:p>
         </w:tc>
@@ -6889,7 +7046,7 @@
                 <w:szCs w:val="19"/>
                 <w:rtl/>
               </w:rPr>
-              <w:t xml:space="preserve">5202dba</w:t>
+              <w:t xml:space="preserve">f9b43fd</w:t>
             </w:r>
           </w:p>
         </w:tc>
@@ -6950,7 +7107,7 @@
           <w:szCs w:val="21"/>
           <w:rtl/>
         </w:rPr>
-        <w:t xml:space="preserve">الاشتراك الذي عليه تخفيض مؤجّل إلى تاريخ لاحق صارت حالته «مجدولة» ظاهرة للعميل، لا في بورتال الإدارة وحده.</w:t>
+        <w:t xml:space="preserve">كل دورة جديدة صار يسبقها فاصل أفقي ظاهر داخل الثريد، فيُعرف أين انتهت دورة وبدأت التي تليها من غير رجوع إلى شريط الفهرسة.</w:t>
       </w:r>
     </w:p>
     <w:p>
@@ -6972,7 +7129,7 @@
           <w:szCs w:val="21"/>
           <w:rtl/>
         </w:rPr>
-        <w:t xml:space="preserve">أُضيف الحقل scheduledChange إلى الاشتراك ويحمل الباقة المستهدفة ودورة الفوترة وتاريخ السريان، وأُضيفت «مجدولة» إلى حالات الفاتورة.</w:t>
+        <w:t xml:space="preserve">الفاصل يحمل رقم الدورة وكلمة «إعادة فتح» والتاريخ، فيجيب عن ثلاثة أسئلة في سطر: أي دورة، وماذا جرى، ومتى.</w:t>
       </w:r>
     </w:p>
     <w:p>
@@ -6994,7 +7151,7 @@
           <w:szCs w:val="21"/>
           <w:rtl/>
         </w:rPr>
-        <w:t xml:space="preserve">بطاقة الاشتراك تعرض شارة «مجدولة» وجملة صريحة تذكر اسم الباقة المستهدفة وتاريخ التحويل، وتؤكّد أن الباقة الحالية ومزاياها مستمرة حتى ذلك التاريخ — فلا يظن العميل أن باقته انخفضت الآن.</w:t>
+        <w:t xml:space="preserve">صيغته بلون العلامة التجارية بخطّين وشارة بارزة، لأن المطلوب أن يُلاحَظ لا أن يمرّ مرور الكرام.</w:t>
       </w:r>
     </w:p>
     <w:p>
@@ -7016,7 +7173,7 @@
           <w:szCs w:val="21"/>
           <w:rtl/>
         </w:rPr>
-        <w:t xml:space="preserve">جدول الفواتير وفلاترها ونافذة معاينة الفاتورة تعرض الحالة نفسها.</w:t>
+        <w:t xml:space="preserve">الفاصل يحلّ محلّ شريحة التاريخ العادية في ذلك الموضع لأنه يحمل التاريخ أصلاً، فلا يجتمع فاصلان متتاليان.</w:t>
       </w:r>
     </w:p>
     <w:p>
@@ -7038,7 +7195,7 @@
           <w:szCs w:val="21"/>
           <w:rtl/>
         </w:rPr>
-        <w:t xml:space="preserve">الحالة مشتقّة من الاشتراك لا مخزّنة على الفاتورة: إلغاء الجدولة يُزيلها من كل المواضع في آن واحد، بدل أن تبقى فاتورة تحمل حالة قديمة.</w:t>
+        <w:t xml:space="preserve">لا يظهر قبل الدورة الأولى لأنها بداية المحادثة لا إعادة فتح لها.</w:t>
       </w:r>
     </w:p>
     <w:p>
@@ -7060,7 +7217,7 @@
           <w:szCs w:val="21"/>
           <w:rtl/>
         </w:rPr>
-        <w:t xml:space="preserve">قرار مقصود: الاشتقاق يطال الفواتير غير المسدّدة فقط (معلّقة ومسودة). الفاتورة المدفوعة أو المستردة أو الملغاة أو الفاشلة تحتفظ بحالتها، وكذلك المتأخرة لأن التأخّر مشكلة سداد لا يصح حجبها خلف حالة الجدولة.</w:t>
+        <w:t xml:space="preserve">الدورة ذات البداية المستنتجة تُوسم «(تقديري)» في الفاصل نفسه، اتساقاً مع العلامة المتقطّعة في شريط الفهرسة.</w:t>
       </w:r>
     </w:p>
     <w:p>
@@ -7082,7 +7239,7 @@
           <w:szCs w:val="21"/>
           <w:rtl/>
         </w:rPr>
-        <w:t xml:space="preserve">زر «إلغاء الجدولة» إجراء إداري بحسب المواصفة، فبورتال العميل يعرض الحالة دون التحكم فيها.</w:t>
+        <w:t xml:space="preserve">الترقيم يتبع رقم الدورة (الدورة 2، الدورة 3) لا رقم إعادة الفتح، ليطابق ما يعرضه شريط الفهرسة وحقل sessionCount ولا يتضارب معهما.</w:t>
       </w:r>
     </w:p>
     <w:p>
@@ -7104,29 +7261,7 @@
           <w:szCs w:val="21"/>
           <w:rtl/>
         </w:rPr>
-        <w:t xml:space="preserve">أُضيفت جدولة تجريبية لعميل العرض (تحويل من الأعمال إلى الاحترافي بعد 15 يوماً) لتصير الحالة قابلة للمعاينة.</w:t>
-      </w:r>
-    </w:p>
-    <w:p>
-      <w:pPr>
-        <w:pStyle w:val="ListParagraph"/>
-        <w:numPr>
-          <w:ilvl w:val="0"/>
-          <w:numId w:val="2"/>
-        </w:numPr>
-        <w:bidi/>
-        <w:spacing w:after="70" w:line="290"/>
-        <w:jc w:val="right"/>
-      </w:pPr>
-      <w:r>
-        <w:rPr>
-          <w:rFonts w:ascii="Arial" w:cs="Arial" w:eastAsia="Arial" w:hAnsi="Arial"/>
-          <w:color w:val="1E293B"/>
-          <w:sz w:val="21"/>
-          <w:szCs w:val="21"/>
-          <w:rtl/>
-        </w:rPr>
-        <w:t xml:space="preserve">عوينت النتيجة في المتصفح: الشارة والجملة والفلتر وحالتا الفاتورتين غير المسدّدتين ظهرت، والفاتورتان المدفوعتان بقيتا «مدفوعة».</w:t>
+        <w:t xml:space="preserve">عوينت النتيجة في المتصفح: فاصلان بالرقمين الصحيحين، وشريحة التاريخ المكرّرة اختفت من موضعيهما.</w:t>
       </w:r>
     </w:p>
     <w:p>
@@ -7151,7 +7286,7 @@
           <w:szCs w:val="24"/>
           <w:rtl/>
         </w:rPr>
-        <w:t xml:space="preserve">تعديل رقم 6 — إعادة تصميم شريط الفهرسة على هيئة مسطرة تظهر عند الاقتراب</w:t>
+        <w:t xml:space="preserve">تعديل رقم 7 — انعكاس حالة «مجدولة» للتخفيض المؤجّل في بورتال العميل</w:t>
       </w:r>
     </w:p>
     <w:p>
@@ -7428,7 +7563,7 @@
                 <w:szCs w:val="19"/>
                 <w:rtl/>
               </w:rPr>
-              <w:t xml:space="preserve">صندوق الوارد</w:t>
+              <w:t xml:space="preserve">الباقات والاشتراك</w:t>
             </w:r>
           </w:p>
         </w:tc>
@@ -7458,7 +7593,7 @@
                 <w:szCs w:val="19"/>
                 <w:rtl/>
               </w:rPr>
-              <w:t xml:space="preserve">/inbox</w:t>
+              <w:t xml:space="preserve">/billing</w:t>
             </w:r>
           </w:p>
         </w:tc>
@@ -7488,7 +7623,7 @@
                 <w:szCs w:val="19"/>
                 <w:rtl/>
               </w:rPr>
-              <w:t xml:space="preserve">src/components/inbox/SessionRail.tsx · src/pages/Inbox.tsx</w:t>
+              <w:t xml:space="preserve">src/types/index.ts · src/pages/Billing.tsx · src/store/adminMockData.ts</w:t>
             </w:r>
           </w:p>
         </w:tc>
@@ -7518,7 +7653,7 @@
                 <w:szCs w:val="19"/>
                 <w:rtl/>
               </w:rPr>
-              <w:t xml:space="preserve">4163939</w:t>
+              <w:t xml:space="preserve">5202dba</w:t>
             </w:r>
           </w:p>
         </w:tc>
@@ -7579,7 +7714,7 @@
           <w:szCs w:val="21"/>
           <w:rtl/>
         </w:rPr>
-        <w:t xml:space="preserve">الشكل السابق كان كتلاً سميكة بينها فجوات، فكان يُقرأ كشريط تقدّم مكسور لا كأداة تنقّل. صار الآن مسطرة: خطّ شعري على حافة الثريد وعليه علامات رفيعة عند بدايات الدورات.</w:t>
+        <w:t xml:space="preserve">الاشتراك الذي عليه تخفيض مؤجّل إلى تاريخ لاحق صارت حالته «مجدولة» ظاهرة للعميل، لا في بورتال الإدارة وحده.</w:t>
       </w:r>
     </w:p>
     <w:p>
@@ -7601,7 +7736,7 @@
           <w:szCs w:val="21"/>
           <w:rtl/>
         </w:rPr>
-        <w:t xml:space="preserve">العلامات مجمّعة في منتصف ارتفاع الحافة كمجموعة واحدة مرتّبة، لا موزّعة على كامل الطول.</w:t>
+        <w:t xml:space="preserve">أُضيف الحقل scheduledChange إلى الاشتراك ويحمل الباقة المستهدفة ودورة الفوترة وتاريخ السريان، وأُضيفت «مجدولة» إلى حالات الفاتورة.</w:t>
       </w:r>
     </w:p>
     <w:p>
@@ -7623,7 +7758,7 @@
           <w:szCs w:val="21"/>
           <w:rtl/>
         </w:rPr>
-        <w:t xml:space="preserve">جُرّب توزيعها على مواضعها النسبية من ارتفاع التمرير أولاً، ثم استُبدل بالتجميع في المنتصف بقرار من الإدارة: الشكل المرتّب فُضّل على دلالة الموضع. أُزيل معه كود القياس ومراقب تغيّر الحجم لأنه لم يعد له عمل.</w:t>
+        <w:t xml:space="preserve">بطاقة الاشتراك تعرض شارة «مجدولة» وجملة صريحة تذكر اسم الباقة المستهدفة وتاريخ التحويل، وتؤكّد أن الباقة الحالية ومزاياها مستمرة حتى ذلك التاريخ — فلا يظن العميل أن باقته انخفضت الآن.</w:t>
       </w:r>
     </w:p>
     <w:p>
@@ -7645,7 +7780,7 @@
           <w:szCs w:val="21"/>
           <w:rtl/>
         </w:rPr>
-        <w:t xml:space="preserve">المسطرة باهتة في الوضع العادي وتتوضّح بالكامل عند اقتراب المؤشر من الحافة أو عند وصول لوحة المفاتيح إليها.</w:t>
+        <w:t xml:space="preserve">جدول الفواتير وفلاترها ونافذة معاينة الفاتورة تعرض الحالة نفسها.</w:t>
       </w:r>
     </w:p>
     <w:p>
@@ -7667,7 +7802,7 @@
           <w:szCs w:val="21"/>
           <w:rtl/>
         </w:rPr>
-        <w:t xml:space="preserve">أُبقي أثر خافت دائم بدل الإخفاء التام: ميزة لا يدل عليها شيء لا يعرفها أحد، والإخفاء الكامل كان سيجعلها غير قابلة للاكتشاف.</w:t>
+        <w:t xml:space="preserve">الحالة مشتقّة من الاشتراك لا مخزّنة على الفاتورة: إلغاء الجدولة يُزيلها من كل المواضع في آن واحد، بدل أن تبقى فاتورة تحمل حالة قديمة.</w:t>
       </w:r>
     </w:p>
     <w:p>
@@ -7689,7 +7824,7 @@
           <w:szCs w:val="21"/>
           <w:rtl/>
         </w:rPr>
-        <w:t xml:space="preserve">صارت طبقة عائمة (overlay) بدل عمود يحجز عرضاً ثابتاً، فرجع نحو 36 بكسل لمساحة الرسائل.</w:t>
+        <w:t xml:space="preserve">قرار مقصود: الاشتقاق يطال الفواتير غير المسدّدة فقط (معلّقة ومسودة). الفاتورة المدفوعة أو المستردة أو الملغاة أو الفاشلة تحتفظ بحالتها، وكذلك المتأخرة لأن التأخّر مشكلة سداد لا يصح حجبها خلف حالة الجدولة.</w:t>
       </w:r>
     </w:p>
     <w:p>
@@ -7711,7 +7846,7 @@
           <w:szCs w:val="21"/>
           <w:rtl/>
         </w:rPr>
-        <w:t xml:space="preserve">وُضعت بعد شريط التمرير بمقدار 8 بكسل حتى لا تحجب سحبه.</w:t>
+        <w:t xml:space="preserve">زر «إلغاء الجدولة» إجراء إداري بحسب المواصفة، فبورتال العميل يعرض الحالة دون التحكم فيها.</w:t>
       </w:r>
     </w:p>
     <w:p>
@@ -7733,7 +7868,7 @@
           <w:szCs w:val="21"/>
           <w:rtl/>
         </w:rPr>
-        <w:t xml:space="preserve">التمييز بين المؤكَّد والمقدَّر بقي قائماً بصرياً: علامة متصلة للدورة المسجّلة، ومتقطّعة للمستنتَجة، مع بقاء «بداية تقديرية» في التلميح.</w:t>
+        <w:t xml:space="preserve">أُضيفت جدولة تجريبية لعميل العرض (تحويل من الأعمال إلى الاحترافي بعد 15 يوماً) لتصير الحالة قابلة للمعاينة.</w:t>
       </w:r>
     </w:p>
     <w:p>
@@ -7755,51 +7890,7 @@
           <w:szCs w:val="21"/>
           <w:rtl/>
         </w:rPr>
-        <w:t xml:space="preserve">تنازل مقصود: الشكل السابق كان يعبّر عن حجم كل دورة بارتفاعها، والمسطرة لا تفعل. حجم الدورة انتقل إلى التلميح.</w:t>
-      </w:r>
-    </w:p>
-    <w:p>
-      <w:pPr>
-        <w:pStyle w:val="ListParagraph"/>
-        <w:numPr>
-          <w:ilvl w:val="0"/>
-          <w:numId w:val="2"/>
-        </w:numPr>
-        <w:bidi/>
-        <w:spacing w:after="70" w:line="290"/>
-        <w:jc w:val="right"/>
-      </w:pPr>
-      <w:r>
-        <w:rPr>
-          <w:rFonts w:ascii="Arial" w:cs="Arial" w:eastAsia="Arial" w:hAnsi="Arial"/>
-          <w:color w:val="1E293B"/>
-          <w:sz w:val="21"/>
-          <w:szCs w:val="21"/>
-          <w:rtl/>
-        </w:rPr>
-        <w:t xml:space="preserve">مجموعة العلامات تقبل التمرير داخلها إن كثرت الدورات حتى لا تتجاوز ارتفاع اللوحة. ولأن ذلك يقصّ التلميح، رُفع التلميح خارج المجموعة ويُحاذى رأسياً بالعلامة المؤشَّر عليها بالقياس.</w:t>
-      </w:r>
-    </w:p>
-    <w:p>
-      <w:pPr>
-        <w:pStyle w:val="ListParagraph"/>
-        <w:numPr>
-          <w:ilvl w:val="0"/>
-          <w:numId w:val="2"/>
-        </w:numPr>
-        <w:bidi/>
-        <w:spacing w:after="70" w:line="290"/>
-        <w:jc w:val="right"/>
-      </w:pPr>
-      <w:r>
-        <w:rPr>
-          <w:rFonts w:ascii="Arial" w:cs="Arial" w:eastAsia="Arial" w:hAnsi="Arial"/>
-          <w:color w:val="1E293B"/>
-          <w:sz w:val="21"/>
-          <w:szCs w:val="21"/>
-          <w:rtl/>
-        </w:rPr>
-        <w:t xml:space="preserve">عوينت النتيجة في المتصفح: العلامات الثلاث متجمّعة في المنتصف، والتوضّح بالاقتراب والتلميح والانتقال تعمل.</w:t>
+        <w:t xml:space="preserve">عوينت النتيجة في المتصفح: الشارة والجملة والفلتر وحالتا الفاتورتين غير المسدّدتين ظهرت، والفاتورتان المدفوعتان بقيتا «مدفوعة».</w:t>
       </w:r>
     </w:p>
     <w:p>
@@ -7824,7 +7915,7 @@
           <w:szCs w:val="24"/>
           <w:rtl/>
         </w:rPr>
-        <w:t xml:space="preserve">تعديل رقم 5 — شريط فهرسة دورات المحادثة داخل الثريد</w:t>
+        <w:t xml:space="preserve">تعديل رقم 6 — إعادة تصميم شريط الفهرسة على هيئة مسطرة تظهر عند الاقتراب</w:t>
       </w:r>
     </w:p>
     <w:p>
@@ -8161,7 +8252,7 @@
                 <w:szCs w:val="19"/>
                 <w:rtl/>
               </w:rPr>
-              <w:t xml:space="preserve">src/components/inbox/SessionRail.tsx · src/pages/Inbox.tsx · src/store/mockData.ts</w:t>
+              <w:t xml:space="preserve">src/components/inbox/SessionRail.tsx · src/pages/Inbox.tsx</w:t>
             </w:r>
           </w:p>
         </w:tc>
@@ -8191,7 +8282,7 @@
                 <w:szCs w:val="19"/>
                 <w:rtl/>
               </w:rPr>
-              <w:t xml:space="preserve">e05e715</w:t>
+              <w:t xml:space="preserve">4163939</w:t>
             </w:r>
           </w:p>
         </w:tc>
@@ -8252,7 +8343,7 @@
           <w:szCs w:val="21"/>
           <w:rtl/>
         </w:rPr>
-        <w:t xml:space="preserve">شريط رأسي على حافة الثريد يقسّمه إلى دورات فتح وإغلاق، ليصل الموظف إلى بداية أي دورة في المحادثات الطويلة التي تُعاد فتحها مراراً.</w:t>
+        <w:t xml:space="preserve">الشكل السابق كان كتلاً سميكة بينها فجوات، فكان يُقرأ كشريط تقدّم مكسور لا كأداة تنقّل. صار الآن مسطرة: خطّ شعري على حافة الثريد وعليه علامات رفيعة عند بدايات الدورات.</w:t>
       </w:r>
     </w:p>
     <w:p>
@@ -8274,7 +8365,7 @@
           <w:szCs w:val="21"/>
           <w:rtl/>
         </w:rPr>
-        <w:t xml:space="preserve">ارتفاع كل مقطع يتناسب مع عدد رسائله، فيعطي إحساساً بحجم كل دورة قبل الدخول إليها.</w:t>
+        <w:t xml:space="preserve">العلامات مجمّعة في منتصف ارتفاع الحافة كمجموعة واحدة مرتّبة، لا موزّعة على كامل الطول.</w:t>
       </w:r>
     </w:p>
     <w:p>
@@ -8296,7 +8387,7 @@
           <w:szCs w:val="21"/>
           <w:rtl/>
         </w:rPr>
-        <w:t xml:space="preserve">المرور على المقطع يُظهر اليوم والتاريخ وعدد الرسائل — «اليوم» و«أمس» لما قرُب، واسم اليوم لما بعُد.</w:t>
+        <w:t xml:space="preserve">جُرّب توزيعها على مواضعها النسبية من ارتفاع التمرير أولاً، ثم استُبدل بالتجميع في المنتصف بقرار من الإدارة: الشكل المرتّب فُضّل على دلالة الموضع. أُزيل معه كود القياس ومراقب تغيّر الحجم لأنه لم يعد له عمل.</w:t>
       </w:r>
     </w:p>
     <w:p>
@@ -8318,7 +8409,7 @@
           <w:szCs w:val="21"/>
           <w:rtl/>
         </w:rPr>
-        <w:t xml:space="preserve">الضغط ينقل إلى أول رسالة في الدورة، والمقطع الذي يقابل موضع القراءة الحالي يُبرَز تلقائياً أثناء التمرير.</w:t>
+        <w:t xml:space="preserve">المسطرة باهتة في الوضع العادي وتتوضّح بالكامل عند اقتراب المؤشر من الحافة أو عند وصول لوحة المفاتيح إليها.</w:t>
       </w:r>
     </w:p>
     <w:p>
@@ -8340,7 +8431,7 @@
           <w:szCs w:val="21"/>
           <w:rtl/>
         </w:rPr>
-        <w:t xml:space="preserve">المقاطع ذات البداية المستنتجة تُعرض بحدّ متقطّع ويذكر التلميح «بداية تقديرية»، فيبقى الفرق بين المؤكَّد والمقدَّر ظاهراً للموظف لا مخفياً عنه.</w:t>
+        <w:t xml:space="preserve">أُبقي أثر خافت دائم بدل الإخفاء التام: ميزة لا يدل عليها شيء لا يعرفها أحد، والإخفاء الكامل كان سيجعلها غير قابلة للاكتشاف.</w:t>
       </w:r>
     </w:p>
     <w:p>
@@ -8362,7 +8453,7 @@
           <w:szCs w:val="21"/>
           <w:rtl/>
         </w:rPr>
-        <w:t xml:space="preserve">الشريط يختفي كلياً حين تكون المحادثة دورة واحدة، فلا معنى لفهرس لا يفهرس شيئاً.</w:t>
+        <w:t xml:space="preserve">صارت طبقة عائمة (overlay) بدل عمود يحجز عرضاً ثابتاً، فرجع نحو 36 بكسل لمساحة الرسائل.</w:t>
       </w:r>
     </w:p>
     <w:p>
@@ -8384,7 +8475,7 @@
           <w:szCs w:val="21"/>
           <w:rtl/>
         </w:rPr>
-        <w:t xml:space="preserve">الدورات الخالية من الرسائل مستبعدة من الشريط بقرار مقصود — لا شيء يمكن الانتقال إليه فيها.</w:t>
+        <w:t xml:space="preserve">وُضعت بعد شريط التمرير بمقدار 8 بكسل حتى لا تحجب سحبه.</w:t>
       </w:r>
     </w:p>
     <w:p>
@@ -8406,7 +8497,7 @@
           <w:szCs w:val="21"/>
           <w:rtl/>
         </w:rPr>
-        <w:t xml:space="preserve">وُزّعت رسائل محادثة أحمد الشعيلي التجريبية على ثلاث دورات عبر ثلاثة أشهر لتصير الميزة قابلة للمعاينة، وصار sessionCount فيها مطابقاً للواقع بعد أن كان رقماً مكتوباً بلا سند. آخر دورة مسجّلة بحدث حقيقي وما قبلها مستنتج، ليظهر الشكلان معاً.</w:t>
+        <w:t xml:space="preserve">التمييز بين المؤكَّد والمقدَّر بقي قائماً بصرياً: علامة متصلة للدورة المسجّلة، ومتقطّعة للمستنتَجة، مع بقاء «بداية تقديرية» في التلميح.</w:t>
       </w:r>
     </w:p>
     <w:p>
@@ -8428,7 +8519,51 @@
           <w:szCs w:val="21"/>
           <w:rtl/>
         </w:rPr>
-        <w:t xml:space="preserve">عوينت النتيجة في المتصفح: الشريط والتلميح والانتقال والإبراز تعمل في الوضعين الفاتح والليلي، والمحادثات أحادية الدورة سليمة بلا شريط.</w:t>
+        <w:t xml:space="preserve">تنازل مقصود: الشكل السابق كان يعبّر عن حجم كل دورة بارتفاعها، والمسطرة لا تفعل. حجم الدورة انتقل إلى التلميح.</w:t>
+      </w:r>
+    </w:p>
+    <w:p>
+      <w:pPr>
+        <w:pStyle w:val="ListParagraph"/>
+        <w:numPr>
+          <w:ilvl w:val="0"/>
+          <w:numId w:val="2"/>
+        </w:numPr>
+        <w:bidi/>
+        <w:spacing w:after="70" w:line="290"/>
+        <w:jc w:val="right"/>
+      </w:pPr>
+      <w:r>
+        <w:rPr>
+          <w:rFonts w:ascii="Arial" w:cs="Arial" w:eastAsia="Arial" w:hAnsi="Arial"/>
+          <w:color w:val="1E293B"/>
+          <w:sz w:val="21"/>
+          <w:szCs w:val="21"/>
+          <w:rtl/>
+        </w:rPr>
+        <w:t xml:space="preserve">مجموعة العلامات تقبل التمرير داخلها إن كثرت الدورات حتى لا تتجاوز ارتفاع اللوحة. ولأن ذلك يقصّ التلميح، رُفع التلميح خارج المجموعة ويُحاذى رأسياً بالعلامة المؤشَّر عليها بالقياس.</w:t>
+      </w:r>
+    </w:p>
+    <w:p>
+      <w:pPr>
+        <w:pStyle w:val="ListParagraph"/>
+        <w:numPr>
+          <w:ilvl w:val="0"/>
+          <w:numId w:val="2"/>
+        </w:numPr>
+        <w:bidi/>
+        <w:spacing w:after="70" w:line="290"/>
+        <w:jc w:val="right"/>
+      </w:pPr>
+      <w:r>
+        <w:rPr>
+          <w:rFonts w:ascii="Arial" w:cs="Arial" w:eastAsia="Arial" w:hAnsi="Arial"/>
+          <w:color w:val="1E293B"/>
+          <w:sz w:val="21"/>
+          <w:szCs w:val="21"/>
+          <w:rtl/>
+        </w:rPr>
+        <w:t xml:space="preserve">عوينت النتيجة في المتصفح: العلامات الثلاث متجمّعة في المنتصف، والتوضّح بالاقتراب والتلميح والانتقال تعمل.</w:t>
       </w:r>
     </w:p>
     <w:p>
@@ -8453,7 +8588,7 @@
           <w:szCs w:val="24"/>
           <w:rtl/>
         </w:rPr>
-        <w:t xml:space="preserve">تعديل رقم 4 — تسجيل دورات المحادثة واشتقاقها — أساس شريط فهرسة الثريد</w:t>
+        <w:t xml:space="preserve">تعديل رقم 5 — شريط فهرسة دورات المحادثة داخل الثريد</w:t>
       </w:r>
     </w:p>
     <w:p>
@@ -8730,7 +8865,7 @@
                 <w:szCs w:val="19"/>
                 <w:rtl/>
               </w:rPr>
-              <w:t xml:space="preserve">صندوق الوارد (طبقة البيانات)</w:t>
+              <w:t xml:space="preserve">صندوق الوارد</w:t>
             </w:r>
           </w:p>
         </w:tc>
@@ -8790,7 +8925,7 @@
                 <w:szCs w:val="19"/>
                 <w:rtl/>
               </w:rPr>
-              <w:t xml:space="preserve">src/utils/sessions.ts · src/store/useDataStore.ts · src/types/index.ts</w:t>
+              <w:t xml:space="preserve">src/components/inbox/SessionRail.tsx · src/pages/Inbox.tsx · src/store/mockData.ts</w:t>
             </w:r>
           </w:p>
         </w:tc>
@@ -8820,7 +8955,7 @@
                 <w:szCs w:val="19"/>
                 <w:rtl/>
               </w:rPr>
-              <w:t xml:space="preserve">5cf29e1</w:t>
+              <w:t xml:space="preserve">e05e715</w:t>
             </w:r>
           </w:p>
         </w:tc>
@@ -8881,7 +9016,7 @@
           <w:szCs w:val="21"/>
           <w:rtl/>
         </w:rPr>
-        <w:t xml:space="preserve">المشكلة: المحادثة الواحدة تُعاد فتحها كلما راسل العميل بعد الإغلاق، فيصير الثريد بلا نهاية. ولرسم شريط فهرسة يقسّمه إلى دورات، لزم معرفة توقيت كل فتح وإغلاق — وهي بيانات لم تكن تُسجَّل إطلاقاً.</w:t>
+        <w:t xml:space="preserve">شريط رأسي على حافة الثريد يقسّمه إلى دورات فتح وإغلاق، ليصل الموظف إلى بداية أي دورة في المحادثات الطويلة التي تُعاد فتحها مراراً.</w:t>
       </w:r>
     </w:p>
     <w:p>
@@ -8903,7 +9038,7 @@
           <w:szCs w:val="21"/>
           <w:rtl/>
         </w:rPr>
-        <w:t xml:space="preserve">كان الحقل sessionCount يُكتب مرة واحدة عند الإنشاء ولا يزيده أي سطر في المشروع، وقيمه في البيانات التجريبية مكتوبة يدوياً. كذلك activityLog على المحادثة كان مُعرَّفاً في الأنواع لكن لا دالة تكتب فيه وقت التشغيل.</w:t>
+        <w:t xml:space="preserve">ارتفاع كل مقطع يتناسب مع عدد رسائله، فيعطي إحساساً بحجم كل دورة قبل الدخول إليها.</w:t>
       </w:r>
     </w:p>
     <w:p>
@@ -8925,7 +9060,7 @@
           <w:szCs w:val="21"/>
           <w:rtl/>
         </w:rPr>
-        <w:t xml:space="preserve">أُضيف النوع SessionEvent لتسجيل حدث فتح أو إغلاق بتوقيته وصاحبه، والنوع ConversationSession يمثّل الدورة المشتقّة.</w:t>
+        <w:t xml:space="preserve">المرور على المقطع يُظهر اليوم والتاريخ وعدد الرسائل — «اليوم» و«أمس» لما قرُب، واسم اليوم لما بعُد.</w:t>
       </w:r>
     </w:p>
     <w:p>
@@ -8947,7 +9082,7 @@
           <w:szCs w:val="21"/>
           <w:rtl/>
         </w:rPr>
-        <w:t xml:space="preserve">صارت أربعة مواضع تسجّل الحدث فعلياً: setConversationStatus عند الإغلاق أو إعادة الفتح، reopenConversation، ورسالة العميل الواردة نصية أو صوتية حين تُحيي محادثة مغلقة — وهذا آخرها كان يمرّ بلا أي أثر رغم أنه أكثرها تكراراً.</w:t>
+        <w:t xml:space="preserve">الضغط ينقل إلى أول رسالة في الدورة، والمقطع الذي يقابل موضع القراءة الحالي يُبرَز تلقائياً أثناء التمرير.</w:t>
       </w:r>
     </w:p>
     <w:p>
@@ -8969,7 +9104,7 @@
           <w:szCs w:val="21"/>
           <w:rtl/>
         </w:rPr>
-        <w:t xml:space="preserve">أُضيفت الدالة deriveSessions التي تقسّم الثريد إلى دورات: الأحداث المسجّلة مرجع قاطع، وما سبقها من تاريخ قديم تُستنتج حدوده من فجوات الصمت (24 ساعة افتراضاً) وتُعلَّم inferred حتى يظل الفرق بين المؤكَّد والمقدَّر ظاهراً.</w:t>
+        <w:t xml:space="preserve">المقاطع ذات البداية المستنتجة تُعرض بحدّ متقطّع ويذكر التلميح «بداية تقديرية»، فيبقى الفرق بين المؤكَّد والمقدَّر ظاهراً للموظف لا مخفياً عنه.</w:t>
       </w:r>
     </w:p>
     <w:p>
@@ -8991,7 +9126,7 @@
           <w:szCs w:val="21"/>
           <w:rtl/>
         </w:rPr>
-        <w:t xml:space="preserve">الدالة تتعامل مع الحالة المختلطة: ثريد فيه تاريخ قديم مُستنتج ودورات جديدة مسجّلة في آن واحد.</w:t>
+        <w:t xml:space="preserve">الشريط يختفي كلياً حين تكون المحادثة دورة واحدة، فلا معنى لفهرس لا يفهرس شيئاً.</w:t>
       </w:r>
     </w:p>
     <w:p>
@@ -9013,7 +9148,7 @@
           <w:szCs w:val="21"/>
           <w:rtl/>
         </w:rPr>
-        <w:t xml:space="preserve">اختُبر المنطق على ثماني حالات شملت الثريد الفارغ والرسالة الواحدة والفجوات المتعددة والأحداث المسجّلة والحالة المختلطة والمدخلات غير المرتّبة زمنياً — جميعها نجحت.</w:t>
+        <w:t xml:space="preserve">الدورات الخالية من الرسائل مستبعدة من الشريط بقرار مقصود — لا شيء يمكن الانتقال إليه فيها.</w:t>
       </w:r>
     </w:p>
     <w:p>
@@ -9035,7 +9170,7 @@
           <w:szCs w:val="21"/>
           <w:rtl/>
         </w:rPr>
-        <w:t xml:space="preserve">ملاحظة على البيانات الحالية: كل المحادثات التجريبية تُنتج دورة واحدة لأن رسائلها متقاربة بدقائق ولا فجوات فيها. الشريط لن يُظهر تقسيماً حقيقياً قبل توفّر بيانات متباعدة زمنياً.</w:t>
+        <w:t xml:space="preserve">وُزّعت رسائل محادثة أحمد الشعيلي التجريبية على ثلاث دورات عبر ثلاثة أشهر لتصير الميزة قابلة للمعاينة، وصار sessionCount فيها مطابقاً للواقع بعد أن كان رقماً مكتوباً بلا سند. آخر دورة مسجّلة بحدث حقيقي وما قبلها مستنتج، ليظهر الشكلان معاً.</w:t>
       </w:r>
     </w:p>
     <w:p>
@@ -9057,7 +9192,7 @@
           <w:szCs w:val="21"/>
           <w:rtl/>
         </w:rPr>
-        <w:t xml:space="preserve">لم تُبنَ واجهة الشريط بعد — هذا التعديل يغطّي طبقة البيانات وحدها.</w:t>
+        <w:t xml:space="preserve">عوينت النتيجة في المتصفح: الشريط والتلميح والانتقال والإبراز تعمل في الوضعين الفاتح والليلي، والمحادثات أحادية الدورة سليمة بلا شريط.</w:t>
       </w:r>
     </w:p>
     <w:p>
@@ -9082,7 +9217,7 @@
           <w:szCs w:val="24"/>
           <w:rtl/>
         </w:rPr>
-        <w:t xml:space="preserve">تعديل رقم 3 — إزالة كارت نسبة الاستجابة من صفحة تقييمات العملاء</w:t>
+        <w:t xml:space="preserve">تعديل رقم 4 — تسجيل دورات المحادثة واشتقاقها — أساس شريط فهرسة الثريد</w:t>
       </w:r>
     </w:p>
     <w:p>
@@ -9359,7 +9494,7 @@
                 <w:szCs w:val="19"/>
                 <w:rtl/>
               </w:rPr>
-              <w:t xml:space="preserve">تقييمات العملاء</w:t>
+              <w:t xml:space="preserve">صندوق الوارد (طبقة البيانات)</w:t>
             </w:r>
           </w:p>
         </w:tc>
@@ -9389,7 +9524,7 @@
                 <w:szCs w:val="19"/>
                 <w:rtl/>
               </w:rPr>
-              <w:t xml:space="preserve">/rating</w:t>
+              <w:t xml:space="preserve">/inbox</w:t>
             </w:r>
           </w:p>
         </w:tc>
@@ -9419,7 +9554,7 @@
                 <w:szCs w:val="19"/>
                 <w:rtl/>
               </w:rPr>
-              <w:t xml:space="preserve">src/pages/CustomerRatings.tsx</w:t>
+              <w:t xml:space="preserve">src/utils/sessions.ts · src/store/useDataStore.ts · src/types/index.ts</w:t>
             </w:r>
           </w:p>
         </w:tc>
@@ -9449,7 +9584,7 @@
                 <w:szCs w:val="19"/>
                 <w:rtl/>
               </w:rPr>
-              <w:t xml:space="preserve">cc8bd4f</w:t>
+              <w:t xml:space="preserve">5cf29e1</w:t>
             </w:r>
           </w:p>
         </w:tc>
@@ -9510,7 +9645,7 @@
           <w:szCs w:val="21"/>
           <w:rtl/>
         </w:rPr>
-        <w:t xml:space="preserve">حُذف كارت «نسبة الاستجابة» بالكامل من شريط الإحصائيات — صارت 3 كروت بدل 4.</w:t>
+        <w:t xml:space="preserve">المشكلة: المحادثة الواحدة تُعاد فتحها كلما راسل العميل بعد الإغلاق، فيصير الثريد بلا نهاية. ولرسم شريط فهرسة يقسّمه إلى دورات، لزم معرفة توقيت كل فتح وإغلاق — وهي بيانات لم تكن تُسجَّل إطلاقاً.</w:t>
       </w:r>
     </w:p>
     <w:p>
@@ -9532,7 +9667,7 @@
           <w:szCs w:val="21"/>
           <w:rtl/>
         </w:rPr>
-        <w:t xml:space="preserve">حُذف معه حساب responseRate لأنه لم يعد له مستهلك في الصفحة.</w:t>
+        <w:t xml:space="preserve">كان الحقل sessionCount يُكتب مرة واحدة عند الإنشاء ولا يزيده أي سطر في المشروع، وقيمه في البيانات التجريبية مكتوبة يدوياً. كذلك activityLog على المحادثة كان مُعرَّفاً في الأنواع لكن لا دالة تكتب فيه وقت التشغيل.</w:t>
       </w:r>
     </w:p>
     <w:p>
@@ -9554,7 +9689,7 @@
           <w:szCs w:val="21"/>
           <w:rtl/>
         </w:rPr>
-        <w:t xml:space="preserve">حُذف استيراد أيقونة TrendingUp لأنها كانت مستخدمة في هذا الكارت وحده.</w:t>
+        <w:t xml:space="preserve">أُضيف النوع SessionEvent لتسجيل حدث فتح أو إغلاق بتوقيته وصاحبه، والنوع ConversationSession يمثّل الدورة المشتقّة.</w:t>
       </w:r>
     </w:p>
     <w:p>
@@ -9576,7 +9711,7 @@
           <w:szCs w:val="21"/>
           <w:rtl/>
         </w:rPr>
-        <w:t xml:space="preserve">عُدّلت شبكة العرض من grid-cols-2 lg:grid-cols-4 إلى grid-cols-1 sm:grid-cols-3، حتى لا يبقى كارت يتيم في سطر منفصل على الشاشات الصغيرة.</w:t>
+        <w:t xml:space="preserve">صارت أربعة مواضع تسجّل الحدث فعلياً: setConversationStatus عند الإغلاق أو إعادة الفتح، reopenConversation، ورسالة العميل الواردة نصية أو صوتية حين تُحيي محادثة مغلقة — وهذا آخرها كان يمرّ بلا أي أثر رغم أنه أكثرها تكراراً.</w:t>
       </w:r>
     </w:p>
     <w:p>
@@ -9598,7 +9733,95 @@
           <w:szCs w:val="21"/>
           <w:rtl/>
         </w:rPr>
-        <w:t xml:space="preserve">الكروت الباقية: متوسط تقييم المحادثة، متوسط تقييم الموظفين، إجمالي الروابط.</w:t>
+        <w:t xml:space="preserve">أُضيفت الدالة deriveSessions التي تقسّم الثريد إلى دورات: الأحداث المسجّلة مرجع قاطع، وما سبقها من تاريخ قديم تُستنتج حدوده من فجوات الصمت (24 ساعة افتراضاً) وتُعلَّم inferred حتى يظل الفرق بين المؤكَّد والمقدَّر ظاهراً.</w:t>
+      </w:r>
+    </w:p>
+    <w:p>
+      <w:pPr>
+        <w:pStyle w:val="ListParagraph"/>
+        <w:numPr>
+          <w:ilvl w:val="0"/>
+          <w:numId w:val="2"/>
+        </w:numPr>
+        <w:bidi/>
+        <w:spacing w:after="70" w:line="290"/>
+        <w:jc w:val="right"/>
+      </w:pPr>
+      <w:r>
+        <w:rPr>
+          <w:rFonts w:ascii="Arial" w:cs="Arial" w:eastAsia="Arial" w:hAnsi="Arial"/>
+          <w:color w:val="1E293B"/>
+          <w:sz w:val="21"/>
+          <w:szCs w:val="21"/>
+          <w:rtl/>
+        </w:rPr>
+        <w:t xml:space="preserve">الدالة تتعامل مع الحالة المختلطة: ثريد فيه تاريخ قديم مُستنتج ودورات جديدة مسجّلة في آن واحد.</w:t>
+      </w:r>
+    </w:p>
+    <w:p>
+      <w:pPr>
+        <w:pStyle w:val="ListParagraph"/>
+        <w:numPr>
+          <w:ilvl w:val="0"/>
+          <w:numId w:val="2"/>
+        </w:numPr>
+        <w:bidi/>
+        <w:spacing w:after="70" w:line="290"/>
+        <w:jc w:val="right"/>
+      </w:pPr>
+      <w:r>
+        <w:rPr>
+          <w:rFonts w:ascii="Arial" w:cs="Arial" w:eastAsia="Arial" w:hAnsi="Arial"/>
+          <w:color w:val="1E293B"/>
+          <w:sz w:val="21"/>
+          <w:szCs w:val="21"/>
+          <w:rtl/>
+        </w:rPr>
+        <w:t xml:space="preserve">اختُبر المنطق على ثماني حالات شملت الثريد الفارغ والرسالة الواحدة والفجوات المتعددة والأحداث المسجّلة والحالة المختلطة والمدخلات غير المرتّبة زمنياً — جميعها نجحت.</w:t>
+      </w:r>
+    </w:p>
+    <w:p>
+      <w:pPr>
+        <w:pStyle w:val="ListParagraph"/>
+        <w:numPr>
+          <w:ilvl w:val="0"/>
+          <w:numId w:val="2"/>
+        </w:numPr>
+        <w:bidi/>
+        <w:spacing w:after="70" w:line="290"/>
+        <w:jc w:val="right"/>
+      </w:pPr>
+      <w:r>
+        <w:rPr>
+          <w:rFonts w:ascii="Arial" w:cs="Arial" w:eastAsia="Arial" w:hAnsi="Arial"/>
+          <w:color w:val="1E293B"/>
+          <w:sz w:val="21"/>
+          <w:szCs w:val="21"/>
+          <w:rtl/>
+        </w:rPr>
+        <w:t xml:space="preserve">ملاحظة على البيانات الحالية: كل المحادثات التجريبية تُنتج دورة واحدة لأن رسائلها متقاربة بدقائق ولا فجوات فيها. الشريط لن يُظهر تقسيماً حقيقياً قبل توفّر بيانات متباعدة زمنياً.</w:t>
+      </w:r>
+    </w:p>
+    <w:p>
+      <w:pPr>
+        <w:pStyle w:val="ListParagraph"/>
+        <w:numPr>
+          <w:ilvl w:val="0"/>
+          <w:numId w:val="2"/>
+        </w:numPr>
+        <w:bidi/>
+        <w:spacing w:after="70" w:line="290"/>
+        <w:jc w:val="right"/>
+      </w:pPr>
+      <w:r>
+        <w:rPr>
+          <w:rFonts w:ascii="Arial" w:cs="Arial" w:eastAsia="Arial" w:hAnsi="Arial"/>
+          <w:color w:val="1E293B"/>
+          <w:sz w:val="21"/>
+          <w:szCs w:val="21"/>
+          <w:rtl/>
+        </w:rPr>
+        <w:t xml:space="preserve">لم تُبنَ واجهة الشريط بعد — هذا التعديل يغطّي طبقة البيانات وحدها.</w:t>
       </w:r>
     </w:p>
     <w:p>
@@ -9623,7 +9846,7 @@
           <w:szCs w:val="24"/>
           <w:rtl/>
         </w:rPr>
-        <w:t xml:space="preserve">تعديل رقم 2 — تغيير تسمية زر الترقية في صفحة الفوترة</w:t>
+        <w:t xml:space="preserve">تعديل رقم 3 — إزالة كارت نسبة الاستجابة من صفحة تقييمات العملاء</w:t>
       </w:r>
     </w:p>
     <w:p>
@@ -9870,7 +10093,7 @@
                 <w:szCs w:val="19"/>
                 <w:rtl/>
               </w:rPr>
-              <w:t xml:space="preserve">9 سبتمبر 2026</w:t>
+              <w:t xml:space="preserve">10 سبتمبر 2026</w:t>
             </w:r>
           </w:p>
         </w:tc>
@@ -9900,7 +10123,7 @@
                 <w:szCs w:val="19"/>
                 <w:rtl/>
               </w:rPr>
-              <w:t xml:space="preserve">الفوترة</w:t>
+              <w:t xml:space="preserve">تقييمات العملاء</w:t>
             </w:r>
           </w:p>
         </w:tc>
@@ -9930,7 +10153,7 @@
                 <w:szCs w:val="19"/>
                 <w:rtl/>
               </w:rPr>
-              <w:t xml:space="preserve">/billing</w:t>
+              <w:t xml:space="preserve">/rating</w:t>
             </w:r>
           </w:p>
         </w:tc>
@@ -9960,7 +10183,7 @@
                 <w:szCs w:val="19"/>
                 <w:rtl/>
               </w:rPr>
-              <w:t xml:space="preserve">src/pages/Billing.tsx</w:t>
+              <w:t xml:space="preserve">src/pages/CustomerRatings.tsx</w:t>
             </w:r>
           </w:p>
         </w:tc>
@@ -9990,7 +10213,7 @@
                 <w:szCs w:val="19"/>
                 <w:rtl/>
               </w:rPr>
-              <w:t xml:space="preserve">be5b3c0</w:t>
+              <w:t xml:space="preserve">cc8bd4f</w:t>
             </w:r>
           </w:p>
         </w:tc>
@@ -10051,7 +10274,7 @@
           <w:szCs w:val="21"/>
           <w:rtl/>
         </w:rPr>
-        <w:t xml:space="preserve">زر «ترقية» أصبح «تغيير الباقة».</w:t>
+        <w:t xml:space="preserve">حُذف كارت «نسبة الاستجابة» بالكامل من شريط الإحصائيات — صارت 3 كروت بدل 4.</w:t>
       </w:r>
     </w:p>
     <w:p>
@@ -10073,7 +10296,73 @@
           <w:szCs w:val="21"/>
           <w:rtl/>
         </w:rPr>
-        <w:t xml:space="preserve">سبب التغيير: الزر يوصّل إلى مسار يشمل الترقية والتخفيض معاً، فالتسمية القديمة كانت تصف نصف وظيفته.</w:t>
+        <w:t xml:space="preserve">حُذف معه حساب responseRate لأنه لم يعد له مستهلك في الصفحة.</w:t>
+      </w:r>
+    </w:p>
+    <w:p>
+      <w:pPr>
+        <w:pStyle w:val="ListParagraph"/>
+        <w:numPr>
+          <w:ilvl w:val="0"/>
+          <w:numId w:val="2"/>
+        </w:numPr>
+        <w:bidi/>
+        <w:spacing w:after="70" w:line="290"/>
+        <w:jc w:val="right"/>
+      </w:pPr>
+      <w:r>
+        <w:rPr>
+          <w:rFonts w:ascii="Arial" w:cs="Arial" w:eastAsia="Arial" w:hAnsi="Arial"/>
+          <w:color w:val="1E293B"/>
+          <w:sz w:val="21"/>
+          <w:szCs w:val="21"/>
+          <w:rtl/>
+        </w:rPr>
+        <w:t xml:space="preserve">حُذف استيراد أيقونة TrendingUp لأنها كانت مستخدمة في هذا الكارت وحده.</w:t>
+      </w:r>
+    </w:p>
+    <w:p>
+      <w:pPr>
+        <w:pStyle w:val="ListParagraph"/>
+        <w:numPr>
+          <w:ilvl w:val="0"/>
+          <w:numId w:val="2"/>
+        </w:numPr>
+        <w:bidi/>
+        <w:spacing w:after="70" w:line="290"/>
+        <w:jc w:val="right"/>
+      </w:pPr>
+      <w:r>
+        <w:rPr>
+          <w:rFonts w:ascii="Arial" w:cs="Arial" w:eastAsia="Arial" w:hAnsi="Arial"/>
+          <w:color w:val="1E293B"/>
+          <w:sz w:val="21"/>
+          <w:szCs w:val="21"/>
+          <w:rtl/>
+        </w:rPr>
+        <w:t xml:space="preserve">عُدّلت شبكة العرض من grid-cols-2 lg:grid-cols-4 إلى grid-cols-1 sm:grid-cols-3، حتى لا يبقى كارت يتيم في سطر منفصل على الشاشات الصغيرة.</w:t>
+      </w:r>
+    </w:p>
+    <w:p>
+      <w:pPr>
+        <w:pStyle w:val="ListParagraph"/>
+        <w:numPr>
+          <w:ilvl w:val="0"/>
+          <w:numId w:val="2"/>
+        </w:numPr>
+        <w:bidi/>
+        <w:spacing w:after="70" w:line="290"/>
+        <w:jc w:val="right"/>
+      </w:pPr>
+      <w:r>
+        <w:rPr>
+          <w:rFonts w:ascii="Arial" w:cs="Arial" w:eastAsia="Arial" w:hAnsi="Arial"/>
+          <w:color w:val="1E293B"/>
+          <w:sz w:val="21"/>
+          <w:szCs w:val="21"/>
+          <w:rtl/>
+        </w:rPr>
+        <w:t xml:space="preserve">الكروت الباقية: متوسط تقييم المحادثة، متوسط تقييم الموظفين، إجمالي الروابط.</w:t>
       </w:r>
     </w:p>
     <w:p>
@@ -10098,7 +10387,7 @@
           <w:szCs w:val="24"/>
           <w:rtl/>
         </w:rPr>
-        <w:t xml:space="preserve">تعديل رقم 1 — ميزة تغيير الباقة — US-131</w:t>
+        <w:t xml:space="preserve">تعديل رقم 2 — تغيير تسمية زر الترقية في صفحة الفوترة</w:t>
       </w:r>
     </w:p>
     <w:p>
@@ -10375,7 +10664,7 @@
                 <w:szCs w:val="19"/>
                 <w:rtl/>
               </w:rPr>
-              <w:t xml:space="preserve">الاشتراك</w:t>
+              <w:t xml:space="preserve">الفوترة</w:t>
             </w:r>
           </w:p>
         </w:tc>
@@ -10405,7 +10694,7 @@
                 <w:szCs w:val="19"/>
                 <w:rtl/>
               </w:rPr>
-              <w:t xml:space="preserve">/subscribe</w:t>
+              <w:t xml:space="preserve">/billing</w:t>
             </w:r>
           </w:p>
         </w:tc>
@@ -10435,7 +10724,7 @@
                 <w:szCs w:val="19"/>
                 <w:rtl/>
               </w:rPr>
-              <w:t xml:space="preserve">src/pages/Subscribe.tsx</w:t>
+              <w:t xml:space="preserve">src/pages/Billing.tsx</w:t>
             </w:r>
           </w:p>
         </w:tc>
@@ -10465,7 +10754,7 @@
                 <w:szCs w:val="19"/>
                 <w:rtl/>
               </w:rPr>
-              <w:t xml:space="preserve">be5b3c0 · c49b797</w:t>
+              <w:t xml:space="preserve">be5b3c0</w:t>
             </w:r>
           </w:p>
         </w:tc>
@@ -10526,7 +10815,7 @@
           <w:szCs w:val="21"/>
           <w:rtl/>
         </w:rPr>
-        <w:t xml:space="preserve">إعادة بناء شبه كاملة للصفحة — 715 سطراً متغيّراً.</w:t>
+        <w:t xml:space="preserve">زر «ترقية» أصبح «تغيير الباقة».</w:t>
       </w:r>
     </w:p>
     <w:p>
@@ -10548,8 +10837,439 @@
           <w:szCs w:val="21"/>
           <w:rtl/>
         </w:rPr>
-        <w:t xml:space="preserve">اختيار الباقة صار بشريط تمرير (slider) حسب عدد المحادثات الشهرية بدل شبكة الكروت. كل باقة نقطة توقف على الشريط، وباقة المؤسسات هي النقطة الأخيرة بعنوان «غير محدود».</w:t>
-      </w:r>
+        <w:t xml:space="preserve">سبب التغيير: الزر يوصّل إلى مسار يشمل الترقية والتخفيض معاً، فالتسمية القديمة كانت تصف نصف وظيفته.</w:t>
+      </w:r>
+    </w:p>
+    <w:p>
+      <w:pPr>
+        <w:spacing w:after="160"/>
+      </w:pPr>
+    </w:p>
+    <w:p>
+      <w:pPr>
+        <w:pStyle w:val="Heading2"/>
+        <w:bidi/>
+        <w:spacing w:after="120" w:before="300"/>
+        <w:jc w:val="right"/>
+      </w:pPr>
+      <w:r>
+        <w:rPr>
+          <w:rFonts w:ascii="Arial" w:cs="Arial" w:eastAsia="Arial" w:hAnsi="Arial"/>
+          <w:b/>
+          <w:bCs/>
+          <w:color w:val="1E293B"/>
+          <w:sz w:val="24"/>
+          <w:szCs w:val="24"/>
+          <w:rtl/>
+        </w:rPr>
+        <w:t xml:space="preserve">تعديل رقم 1 — ميزة تغيير الباقة — US-131</w:t>
+      </w:r>
+    </w:p>
+    <w:p>
+      <w:pPr>
+        <w:spacing w:after="50"/>
+      </w:pPr>
+    </w:p>
+    <w:tbl>
+      <w:tblPr>
+        <w:bidiVisual/>
+        <w:tblW w:type="dxa" w:w="9000"/>
+        <w:tblBorders>
+          <w:top w:val="single" w:color="CBD5E1" w:sz="4"/>
+          <w:left w:val="single" w:color="CBD5E1" w:sz="4"/>
+          <w:bottom w:val="single" w:color="CBD5E1" w:sz="4"/>
+          <w:right w:val="single" w:color="CBD5E1" w:sz="4"/>
+          <w:insideH w:val="single" w:color="CBD5E1" w:sz="4"/>
+          <w:insideV w:val="single" w:color="CBD5E1" w:sz="4"/>
+        </w:tblBorders>
+      </w:tblPr>
+      <w:tblGrid>
+        <w:gridCol w:w="1250"/>
+        <w:gridCol w:w="1250"/>
+        <w:gridCol w:w="1150"/>
+        <w:gridCol w:w="2500"/>
+        <w:gridCol w:w="1350"/>
+        <w:gridCol w:w="1500"/>
+      </w:tblGrid>
+      <w:tr>
+        <w:trPr>
+          <w:tblHeader/>
+        </w:trPr>
+        <w:tc>
+          <w:tcPr>
+            <w:tcW w:type="dxa" w:w="1250"/>
+            <w:shd w:fill="2563EB" w:color="auto" w:val="clear"/>
+            <w:tcMar>
+              <w:top w:type="dxa" w:w="90"/>
+              <w:left w:type="dxa" w:w="110"/>
+              <w:bottom w:type="dxa" w:w="90"/>
+              <w:right w:type="dxa" w:w="110"/>
+            </w:tcMar>
+          </w:tcPr>
+          <w:p>
+            <w:pPr>
+              <w:bidi/>
+              <w:spacing w:after="0" w:line="280"/>
+              <w:jc w:val="right"/>
+            </w:pPr>
+            <w:r>
+              <w:rPr>
+                <w:rFonts w:ascii="Arial" w:cs="Arial" w:eastAsia="Arial" w:hAnsi="Arial"/>
+                <w:b/>
+                <w:bCs/>
+                <w:color w:val="FFFFFF"/>
+                <w:sz w:val="19"/>
+                <w:szCs w:val="19"/>
+                <w:rtl/>
+              </w:rPr>
+              <w:t xml:space="preserve">التاريخ</w:t>
+            </w:r>
+          </w:p>
+        </w:tc>
+        <w:tc>
+          <w:tcPr>
+            <w:tcW w:type="dxa" w:w="1250"/>
+            <w:shd w:fill="2563EB" w:color="auto" w:val="clear"/>
+            <w:tcMar>
+              <w:top w:type="dxa" w:w="90"/>
+              <w:left w:type="dxa" w:w="110"/>
+              <w:bottom w:type="dxa" w:w="90"/>
+              <w:right w:type="dxa" w:w="110"/>
+            </w:tcMar>
+          </w:tcPr>
+          <w:p>
+            <w:pPr>
+              <w:bidi/>
+              <w:spacing w:after="0" w:line="280"/>
+              <w:jc w:val="right"/>
+            </w:pPr>
+            <w:r>
+              <w:rPr>
+                <w:rFonts w:ascii="Arial" w:cs="Arial" w:eastAsia="Arial" w:hAnsi="Arial"/>
+                <w:b/>
+                <w:bCs/>
+                <w:color w:val="FFFFFF"/>
+                <w:sz w:val="19"/>
+                <w:szCs w:val="19"/>
+                <w:rtl/>
+              </w:rPr>
+              <w:t xml:space="preserve">الصفحة</w:t>
+            </w:r>
+          </w:p>
+        </w:tc>
+        <w:tc>
+          <w:tcPr>
+            <w:tcW w:type="dxa" w:w="1150"/>
+            <w:shd w:fill="2563EB" w:color="auto" w:val="clear"/>
+            <w:tcMar>
+              <w:top w:type="dxa" w:w="90"/>
+              <w:left w:type="dxa" w:w="110"/>
+              <w:bottom w:type="dxa" w:w="90"/>
+              <w:right w:type="dxa" w:w="110"/>
+            </w:tcMar>
+          </w:tcPr>
+          <w:p>
+            <w:pPr>
+              <w:bidi/>
+              <w:spacing w:after="0" w:line="280"/>
+              <w:jc w:val="right"/>
+            </w:pPr>
+            <w:r>
+              <w:rPr>
+                <w:rFonts w:ascii="Arial" w:cs="Arial" w:eastAsia="Arial" w:hAnsi="Arial"/>
+                <w:b/>
+                <w:bCs/>
+                <w:color w:val="FFFFFF"/>
+                <w:sz w:val="19"/>
+                <w:szCs w:val="19"/>
+                <w:rtl/>
+              </w:rPr>
+              <w:t xml:space="preserve">المسار</w:t>
+            </w:r>
+          </w:p>
+        </w:tc>
+        <w:tc>
+          <w:tcPr>
+            <w:tcW w:type="dxa" w:w="2500"/>
+            <w:shd w:fill="2563EB" w:color="auto" w:val="clear"/>
+            <w:tcMar>
+              <w:top w:type="dxa" w:w="90"/>
+              <w:left w:type="dxa" w:w="110"/>
+              <w:bottom w:type="dxa" w:w="90"/>
+              <w:right w:type="dxa" w:w="110"/>
+            </w:tcMar>
+          </w:tcPr>
+          <w:p>
+            <w:pPr>
+              <w:bidi/>
+              <w:spacing w:after="0" w:line="280"/>
+              <w:jc w:val="right"/>
+            </w:pPr>
+            <w:r>
+              <w:rPr>
+                <w:rFonts w:ascii="Arial" w:cs="Arial" w:eastAsia="Arial" w:hAnsi="Arial"/>
+                <w:b/>
+                <w:bCs/>
+                <w:color w:val="FFFFFF"/>
+                <w:sz w:val="19"/>
+                <w:szCs w:val="19"/>
+                <w:rtl/>
+              </w:rPr>
+              <w:t xml:space="preserve">الملف</w:t>
+            </w:r>
+          </w:p>
+        </w:tc>
+        <w:tc>
+          <w:tcPr>
+            <w:tcW w:type="dxa" w:w="1350"/>
+            <w:shd w:fill="2563EB" w:color="auto" w:val="clear"/>
+            <w:tcMar>
+              <w:top w:type="dxa" w:w="90"/>
+              <w:left w:type="dxa" w:w="110"/>
+              <w:bottom w:type="dxa" w:w="90"/>
+              <w:right w:type="dxa" w:w="110"/>
+            </w:tcMar>
+          </w:tcPr>
+          <w:p>
+            <w:pPr>
+              <w:bidi/>
+              <w:spacing w:after="0" w:line="280"/>
+              <w:jc w:val="right"/>
+            </w:pPr>
+            <w:r>
+              <w:rPr>
+                <w:rFonts w:ascii="Arial" w:cs="Arial" w:eastAsia="Arial" w:hAnsi="Arial"/>
+                <w:b/>
+                <w:bCs/>
+                <w:color w:val="FFFFFF"/>
+                <w:sz w:val="19"/>
+                <w:szCs w:val="19"/>
+                <w:rtl/>
+              </w:rPr>
+              <w:t xml:space="preserve">الكوميت</w:t>
+            </w:r>
+          </w:p>
+        </w:tc>
+        <w:tc>
+          <w:tcPr>
+            <w:tcW w:type="dxa" w:w="1500"/>
+            <w:shd w:fill="2563EB" w:color="auto" w:val="clear"/>
+            <w:tcMar>
+              <w:top w:type="dxa" w:w="90"/>
+              <w:left w:type="dxa" w:w="110"/>
+              <w:bottom w:type="dxa" w:w="90"/>
+              <w:right w:type="dxa" w:w="110"/>
+            </w:tcMar>
+          </w:tcPr>
+          <w:p>
+            <w:pPr>
+              <w:bidi/>
+              <w:spacing w:after="0" w:line="280"/>
+              <w:jc w:val="right"/>
+            </w:pPr>
+            <w:r>
+              <w:rPr>
+                <w:rFonts w:ascii="Arial" w:cs="Arial" w:eastAsia="Arial" w:hAnsi="Arial"/>
+                <w:b/>
+                <w:bCs/>
+                <w:color w:val="FFFFFF"/>
+                <w:sz w:val="19"/>
+                <w:szCs w:val="19"/>
+                <w:rtl/>
+              </w:rPr>
+              <w:t xml:space="preserve">الحالة</w:t>
+            </w:r>
+          </w:p>
+        </w:tc>
+      </w:tr>
+      <w:tr>
+        <w:tc>
+          <w:tcPr>
+            <w:tcW w:type="dxa" w:w="1250"/>
+            <w:tcMar>
+              <w:top w:type="dxa" w:w="90"/>
+              <w:left w:type="dxa" w:w="110"/>
+              <w:bottom w:type="dxa" w:w="90"/>
+              <w:right w:type="dxa" w:w="110"/>
+            </w:tcMar>
+          </w:tcPr>
+          <w:p>
+            <w:pPr>
+              <w:bidi/>
+              <w:spacing w:after="0" w:line="280"/>
+              <w:jc w:val="right"/>
+            </w:pPr>
+            <w:r>
+              <w:rPr>
+                <w:rFonts w:ascii="Arial" w:cs="Arial" w:eastAsia="Arial" w:hAnsi="Arial"/>
+                <w:b w:val="false"/>
+                <w:bCs w:val="false"/>
+                <w:color w:val="1E293B"/>
+                <w:sz w:val="19"/>
+                <w:szCs w:val="19"/>
+                <w:rtl/>
+              </w:rPr>
+              <w:t xml:space="preserve">9 سبتمبر 2026</w:t>
+            </w:r>
+          </w:p>
+        </w:tc>
+        <w:tc>
+          <w:tcPr>
+            <w:tcW w:type="dxa" w:w="1250"/>
+            <w:tcMar>
+              <w:top w:type="dxa" w:w="90"/>
+              <w:left w:type="dxa" w:w="110"/>
+              <w:bottom w:type="dxa" w:w="90"/>
+              <w:right w:type="dxa" w:w="110"/>
+            </w:tcMar>
+          </w:tcPr>
+          <w:p>
+            <w:pPr>
+              <w:bidi/>
+              <w:spacing w:after="0" w:line="280"/>
+              <w:jc w:val="right"/>
+            </w:pPr>
+            <w:r>
+              <w:rPr>
+                <w:rFonts w:ascii="Arial" w:cs="Arial" w:eastAsia="Arial" w:hAnsi="Arial"/>
+                <w:b w:val="false"/>
+                <w:bCs w:val="false"/>
+                <w:color w:val="1E293B"/>
+                <w:sz w:val="19"/>
+                <w:szCs w:val="19"/>
+                <w:rtl/>
+              </w:rPr>
+              <w:t xml:space="preserve">الاشتراك</w:t>
+            </w:r>
+          </w:p>
+        </w:tc>
+        <w:tc>
+          <w:tcPr>
+            <w:tcW w:type="dxa" w:w="1150"/>
+            <w:tcMar>
+              <w:top w:type="dxa" w:w="90"/>
+              <w:left w:type="dxa" w:w="110"/>
+              <w:bottom w:type="dxa" w:w="90"/>
+              <w:right w:type="dxa" w:w="110"/>
+            </w:tcMar>
+          </w:tcPr>
+          <w:p>
+            <w:pPr>
+              <w:bidi/>
+              <w:spacing w:after="0" w:line="280"/>
+              <w:jc w:val="right"/>
+            </w:pPr>
+            <w:r>
+              <w:rPr>
+                <w:rFonts w:ascii="Arial" w:cs="Arial" w:eastAsia="Arial" w:hAnsi="Arial"/>
+                <w:b w:val="false"/>
+                <w:bCs w:val="false"/>
+                <w:color w:val="1E293B"/>
+                <w:sz w:val="19"/>
+                <w:szCs w:val="19"/>
+                <w:rtl/>
+              </w:rPr>
+              <w:t xml:space="preserve">/subscribe</w:t>
+            </w:r>
+          </w:p>
+        </w:tc>
+        <w:tc>
+          <w:tcPr>
+            <w:tcW w:type="dxa" w:w="2500"/>
+            <w:tcMar>
+              <w:top w:type="dxa" w:w="90"/>
+              <w:left w:type="dxa" w:w="110"/>
+              <w:bottom w:type="dxa" w:w="90"/>
+              <w:right w:type="dxa" w:w="110"/>
+            </w:tcMar>
+          </w:tcPr>
+          <w:p>
+            <w:pPr>
+              <w:bidi/>
+              <w:spacing w:after="0" w:line="280"/>
+              <w:jc w:val="right"/>
+            </w:pPr>
+            <w:r>
+              <w:rPr>
+                <w:rFonts w:ascii="Arial" w:cs="Arial" w:eastAsia="Arial" w:hAnsi="Arial"/>
+                <w:b w:val="false"/>
+                <w:bCs w:val="false"/>
+                <w:color w:val="1E293B"/>
+                <w:sz w:val="19"/>
+                <w:szCs w:val="19"/>
+                <w:rtl/>
+              </w:rPr>
+              <w:t xml:space="preserve">src/pages/Subscribe.tsx</w:t>
+            </w:r>
+          </w:p>
+        </w:tc>
+        <w:tc>
+          <w:tcPr>
+            <w:tcW w:type="dxa" w:w="1350"/>
+            <w:tcMar>
+              <w:top w:type="dxa" w:w="90"/>
+              <w:left w:type="dxa" w:w="110"/>
+              <w:bottom w:type="dxa" w:w="90"/>
+              <w:right w:type="dxa" w:w="110"/>
+            </w:tcMar>
+          </w:tcPr>
+          <w:p>
+            <w:pPr>
+              <w:bidi/>
+              <w:spacing w:after="0" w:line="280"/>
+              <w:jc w:val="right"/>
+            </w:pPr>
+            <w:r>
+              <w:rPr>
+                <w:rFonts w:ascii="Arial" w:cs="Arial" w:eastAsia="Arial" w:hAnsi="Arial"/>
+                <w:b w:val="false"/>
+                <w:bCs w:val="false"/>
+                <w:color w:val="1E293B"/>
+                <w:sz w:val="19"/>
+                <w:szCs w:val="19"/>
+                <w:rtl/>
+              </w:rPr>
+              <w:t xml:space="preserve">be5b3c0 · c49b797</w:t>
+            </w:r>
+          </w:p>
+        </w:tc>
+        <w:tc>
+          <w:tcPr>
+            <w:tcW w:type="dxa" w:w="1500"/>
+            <w:shd w:fill="ECFDF5" w:color="auto" w:val="clear"/>
+            <w:tcMar>
+              <w:top w:type="dxa" w:w="90"/>
+              <w:left w:type="dxa" w:w="110"/>
+              <w:bottom w:type="dxa" w:w="90"/>
+              <w:right w:type="dxa" w:w="110"/>
+            </w:tcMar>
+          </w:tcPr>
+          <w:p>
+            <w:pPr>
+              <w:bidi/>
+              <w:spacing w:after="0" w:line="280"/>
+              <w:jc w:val="right"/>
+            </w:pPr>
+            <w:r>
+              <w:rPr>
+                <w:rFonts w:ascii="Arial" w:cs="Arial" w:eastAsia="Arial" w:hAnsi="Arial"/>
+                <w:b/>
+                <w:bCs/>
+                <w:color w:val="15803D"/>
+                <w:sz w:val="19"/>
+                <w:szCs w:val="19"/>
+                <w:rtl/>
+              </w:rPr>
+              <w:t xml:space="preserve">منشور على الإنتاج</w:t>
+            </w:r>
+          </w:p>
+        </w:tc>
+      </w:tr>
+    </w:tbl>
+    <w:p>
+      <w:pPr>
+        <w:spacing w:after="90"/>
+      </w:pPr>
     </w:p>
     <w:p>
       <w:pPr>
@@ -10570,7 +11290,7 @@
           <w:szCs w:val="21"/>
           <w:rtl/>
         </w:rPr>
-        <w:t xml:space="preserve">مسار من ست خطوات: اختيار الباقة، ثم تأكيد التخفيض، ثم الدفع، ثم المعالجة، ثم النجاح أو الفشل.</w:t>
+        <w:t xml:space="preserve">إعادة بناء شبه كاملة للصفحة — 715 سطراً متغيّراً.</w:t>
       </w:r>
     </w:p>
     <w:p>
@@ -10592,7 +11312,7 @@
           <w:szCs w:val="21"/>
           <w:rtl/>
         </w:rPr>
-        <w:t xml:space="preserve">احتساب تناسبي للترقية: يُحصَّل فرق السعر عن الأيام المتبقية من الدورة الحالية فقط، ويظهر المبلغ مفصّلاً في ملخص الدفع.</w:t>
+        <w:t xml:space="preserve">اختيار الباقة صار بشريط تمرير (slider) حسب عدد المحادثات الشهرية بدل شبكة الكروت. كل باقة نقطة توقف على الشريط، وباقة المؤسسات هي النقطة الأخيرة بعنوان «غير محدود».</w:t>
       </w:r>
     </w:p>
     <w:p>
@@ -10614,7 +11334,7 @@
           <w:szCs w:val="21"/>
           <w:rtl/>
         </w:rPr>
-        <w:t xml:space="preserve">التخفيض له شاشة تأكيد مستقلة ولا يذهب مباشرة إلى الدفع.</w:t>
+        <w:t xml:space="preserve">مسار من ست خطوات: اختيار الباقة، ثم تأكيد التخفيض، ثم الدفع، ثم المعالجة، ثم النجاح أو الفشل.</w:t>
       </w:r>
     </w:p>
     <w:p>
@@ -10636,7 +11356,7 @@
           <w:szCs w:val="21"/>
           <w:rtl/>
         </w:rPr>
-        <w:t xml:space="preserve">دورة الفوترة تُقرأ من اشتراك العميل الحالي بدل أن تبدأ بقيمة ثابتة.</w:t>
+        <w:t xml:space="preserve">احتساب تناسبي للترقية: يُحصَّل فرق السعر عن الأيام المتبقية من الدورة الحالية فقط، ويظهر المبلغ مفصّلاً في ملخص الدفع.</w:t>
       </w:r>
     </w:p>
     <w:p>
@@ -10658,6 +11378,50 @@
           <w:szCs w:val="21"/>
           <w:rtl/>
         </w:rPr>
+        <w:t xml:space="preserve">التخفيض له شاشة تأكيد مستقلة ولا يذهب مباشرة إلى الدفع.</w:t>
+      </w:r>
+    </w:p>
+    <w:p>
+      <w:pPr>
+        <w:pStyle w:val="ListParagraph"/>
+        <w:numPr>
+          <w:ilvl w:val="0"/>
+          <w:numId w:val="2"/>
+        </w:numPr>
+        <w:bidi/>
+        <w:spacing w:after="70" w:line="290"/>
+        <w:jc w:val="right"/>
+      </w:pPr>
+      <w:r>
+        <w:rPr>
+          <w:rFonts w:ascii="Arial" w:cs="Arial" w:eastAsia="Arial" w:hAnsi="Arial"/>
+          <w:color w:val="1E293B"/>
+          <w:sz w:val="21"/>
+          <w:szCs w:val="21"/>
+          <w:rtl/>
+        </w:rPr>
+        <w:t xml:space="preserve">دورة الفوترة تُقرأ من اشتراك العميل الحالي بدل أن تبدأ بقيمة ثابتة.</w:t>
+      </w:r>
+    </w:p>
+    <w:p>
+      <w:pPr>
+        <w:pStyle w:val="ListParagraph"/>
+        <w:numPr>
+          <w:ilvl w:val="0"/>
+          <w:numId w:val="2"/>
+        </w:numPr>
+        <w:bidi/>
+        <w:spacing w:after="70" w:line="290"/>
+        <w:jc w:val="right"/>
+      </w:pPr>
+      <w:r>
+        <w:rPr>
+          <w:rFonts w:ascii="Arial" w:cs="Arial" w:eastAsia="Arial" w:hAnsi="Arial"/>
+          <w:color w:val="1E293B"/>
+          <w:sz w:val="21"/>
+          <w:szCs w:val="21"/>
+          <w:rtl/>
+        </w:rPr>
         <w:t xml:space="preserve">أُصلحت علامات تعارض الدمج (merge conflict markers) التي كانت باقية في الملف — كوميت c49b797.</w:t>
       </w:r>
     </w:p>
@@ -10844,7 +11608,7 @@
           <w:szCs w:val="20"/>
           <w:rtl/>
         </w:rPr>
-        <w:t xml:space="preserve">عدد التعديلات المسجّلة: 13</w:t>
+        <w:t xml:space="preserve">عدد التعديلات المسجّلة: 14</w:t>
       </w:r>
     </w:p>
     <w:sectPr>

</xml_diff>

<commit_message>
deploy build 5c9b337b to production
Publish the stepped plan picker to qhub-client.apexes.click.

All 90 assets uploaded and diffed against the local build before any HTML
was touched (clean), then all 114 route copies enumerated from the live
tree, then version.json last.

Record the change in the changelog and point BUILD_LIVE at 5c9b337b.

Co-Authored-By: Claude Opus 5 <noreply@anthropic.com>
Claude-Session: https://claude.ai/code/session_01JGHUnSrtQwLX2BGbB3j6wk
</commit_message>
<xml_diff>
--- a/docs/سجل التعديلات الاخيرة.docx
+++ b/docs/سجل التعديلات الاخيرة.docx
@@ -354,7 +354,7 @@
                 <w:szCs w:val="19"/>
                 <w:rtl/>
               </w:rPr>
-              <w:t xml:space="preserve">14</w:t>
+              <w:t xml:space="preserve">15</w:t>
             </w:r>
           </w:p>
         </w:tc>
@@ -384,7 +384,7 @@
                 <w:szCs w:val="19"/>
                 <w:rtl/>
               </w:rPr>
-              <w:t xml:space="preserve">10 سبتمبر 2026</w:t>
+              <w:t xml:space="preserve">13 سبتمبر 2026</w:t>
             </w:r>
           </w:p>
         </w:tc>
@@ -414,7 +414,7 @@
                 <w:szCs w:val="19"/>
                 <w:rtl/>
               </w:rPr>
-              <w:t xml:space="preserve">صفحة الباقات صارت جدول مقارنة على نسق اللاندنج بيج</w:t>
+              <w:t xml:space="preserve">مؤشّر الباقات صار اختياراً بخطوات لا شريط تقدّم</w:t>
             </w:r>
           </w:p>
         </w:tc>
@@ -508,7 +508,7 @@
                 <w:szCs w:val="19"/>
                 <w:rtl/>
               </w:rPr>
-              <w:t xml:space="preserve">13</w:t>
+              <w:t xml:space="preserve">14</w:t>
             </w:r>
           </w:p>
         </w:tc>
@@ -570,7 +570,7 @@
                 <w:szCs w:val="19"/>
                 <w:rtl/>
               </w:rPr>
-              <w:t xml:space="preserve">تعطيل المصادقة الثنائية صار يتطلّب كلمة المرور أو رمزاً</w:t>
+              <w:t xml:space="preserve">صفحة الباقات صارت جدول مقارنة على نسق اللاندنج بيج</w:t>
             </w:r>
           </w:p>
         </w:tc>
@@ -601,7 +601,7 @@
                 <w:szCs w:val="19"/>
                 <w:rtl/>
               </w:rPr>
-              <w:t xml:space="preserve">الإعدادات ← الأمان</w:t>
+              <w:t xml:space="preserve">الباقات والاشتراك</w:t>
             </w:r>
           </w:p>
         </w:tc>
@@ -664,7 +664,7 @@
                 <w:szCs w:val="19"/>
                 <w:rtl/>
               </w:rPr>
-              <w:t xml:space="preserve">12</w:t>
+              <w:t xml:space="preserve">13</w:t>
             </w:r>
           </w:p>
         </w:tc>
@@ -724,7 +724,7 @@
                 <w:szCs w:val="19"/>
                 <w:rtl/>
               </w:rPr>
-              <w:t xml:space="preserve">رمز QR حقيقي قابل للمسح في إعداد المصادقة الثنائية</w:t>
+              <w:t xml:space="preserve">تعطيل المصادقة الثنائية صار يتطلّب كلمة المرور أو رمزاً</w:t>
             </w:r>
           </w:p>
         </w:tc>
@@ -818,7 +818,7 @@
                 <w:szCs w:val="19"/>
                 <w:rtl/>
               </w:rPr>
-              <w:t xml:space="preserve">11</w:t>
+              <w:t xml:space="preserve">12</w:t>
             </w:r>
           </w:p>
         </w:tc>
@@ -880,7 +880,7 @@
                 <w:szCs w:val="19"/>
                 <w:rtl/>
               </w:rPr>
-              <w:t xml:space="preserve">رقم جوال اختياري في الملف الشخصي</w:t>
+              <w:t xml:space="preserve">رمز QR حقيقي قابل للمسح في إعداد المصادقة الثنائية</w:t>
             </w:r>
           </w:p>
         </w:tc>
@@ -911,7 +911,7 @@
                 <w:szCs w:val="19"/>
                 <w:rtl/>
               </w:rPr>
-              <w:t xml:space="preserve">الإعدادات ← الملف الشخصي</w:t>
+              <w:t xml:space="preserve">الإعدادات ← الأمان</w:t>
             </w:r>
           </w:p>
         </w:tc>
@@ -974,7 +974,7 @@
                 <w:szCs w:val="19"/>
                 <w:rtl/>
               </w:rPr>
-              <w:t xml:space="preserve">10</w:t>
+              <w:t xml:space="preserve">11</w:t>
             </w:r>
           </w:p>
         </w:tc>
@@ -1034,7 +1034,7 @@
                 <w:szCs w:val="19"/>
                 <w:rtl/>
               </w:rPr>
-              <w:t xml:space="preserve">شاشة التحقق بخطوتين في تسجيل الدخول</w:t>
+              <w:t xml:space="preserve">رقم جوال اختياري في الملف الشخصي</w:t>
             </w:r>
           </w:p>
         </w:tc>
@@ -1064,7 +1064,7 @@
                 <w:szCs w:val="19"/>
                 <w:rtl/>
               </w:rPr>
-              <w:t xml:space="preserve">تسجيل الدخول</w:t>
+              <w:t xml:space="preserve">الإعدادات ← الملف الشخصي</w:t>
             </w:r>
           </w:p>
         </w:tc>
@@ -1128,7 +1128,7 @@
                 <w:szCs w:val="19"/>
                 <w:rtl/>
               </w:rPr>
-              <w:t xml:space="preserve">9</w:t>
+              <w:t xml:space="preserve">10</w:t>
             </w:r>
           </w:p>
         </w:tc>
@@ -1190,7 +1190,7 @@
                 <w:szCs w:val="19"/>
                 <w:rtl/>
               </w:rPr>
-              <w:t xml:space="preserve">رقم هاتف اختياري عند دعوة الموظف</w:t>
+              <w:t xml:space="preserve">شاشة التحقق بخطوتين في تسجيل الدخول</w:t>
             </w:r>
           </w:p>
         </w:tc>
@@ -1221,7 +1221,7 @@
                 <w:szCs w:val="19"/>
                 <w:rtl/>
               </w:rPr>
-              <w:t xml:space="preserve">فريق العمل</w:t>
+              <w:t xml:space="preserve">تسجيل الدخول</w:t>
             </w:r>
           </w:p>
         </w:tc>
@@ -1284,7 +1284,7 @@
                 <w:szCs w:val="19"/>
                 <w:rtl/>
               </w:rPr>
-              <w:t xml:space="preserve">8</w:t>
+              <w:t xml:space="preserve">9</w:t>
             </w:r>
           </w:p>
         </w:tc>
@@ -1344,7 +1344,7 @@
                 <w:szCs w:val="19"/>
                 <w:rtl/>
               </w:rPr>
-              <w:t xml:space="preserve">فاصل مرقّم بين دورات المحادثة داخل الثريد</w:t>
+              <w:t xml:space="preserve">رقم هاتف اختياري عند دعوة الموظف</w:t>
             </w:r>
           </w:p>
         </w:tc>
@@ -1374,7 +1374,7 @@
                 <w:szCs w:val="19"/>
                 <w:rtl/>
               </w:rPr>
-              <w:t xml:space="preserve">صندوق الوارد</w:t>
+              <w:t xml:space="preserve">فريق العمل</w:t>
             </w:r>
           </w:p>
         </w:tc>
@@ -1438,7 +1438,7 @@
                 <w:szCs w:val="19"/>
                 <w:rtl/>
               </w:rPr>
-              <w:t xml:space="preserve">7</w:t>
+              <w:t xml:space="preserve">8</w:t>
             </w:r>
           </w:p>
         </w:tc>
@@ -1500,7 +1500,7 @@
                 <w:szCs w:val="19"/>
                 <w:rtl/>
               </w:rPr>
-              <w:t xml:space="preserve">انعكاس حالة «مجدولة» للتخفيض المؤجّل في بورتال العميل</w:t>
+              <w:t xml:space="preserve">فاصل مرقّم بين دورات المحادثة داخل الثريد</w:t>
             </w:r>
           </w:p>
         </w:tc>
@@ -1531,7 +1531,7 @@
                 <w:szCs w:val="19"/>
                 <w:rtl/>
               </w:rPr>
-              <w:t xml:space="preserve">الباقات والاشتراك</w:t>
+              <w:t xml:space="preserve">صندوق الوارد</w:t>
             </w:r>
           </w:p>
         </w:tc>
@@ -1594,7 +1594,7 @@
                 <w:szCs w:val="19"/>
                 <w:rtl/>
               </w:rPr>
-              <w:t xml:space="preserve">6</w:t>
+              <w:t xml:space="preserve">7</w:t>
             </w:r>
           </w:p>
         </w:tc>
@@ -1654,7 +1654,7 @@
                 <w:szCs w:val="19"/>
                 <w:rtl/>
               </w:rPr>
-              <w:t xml:space="preserve">إعادة تصميم شريط الفهرسة على هيئة مسطرة تظهر عند الاقتراب</w:t>
+              <w:t xml:space="preserve">انعكاس حالة «مجدولة» للتخفيض المؤجّل في بورتال العميل</w:t>
             </w:r>
           </w:p>
         </w:tc>
@@ -1684,7 +1684,7 @@
                 <w:szCs w:val="19"/>
                 <w:rtl/>
               </w:rPr>
-              <w:t xml:space="preserve">صندوق الوارد</w:t>
+              <w:t xml:space="preserve">الباقات والاشتراك</w:t>
             </w:r>
           </w:p>
         </w:tc>
@@ -1748,7 +1748,7 @@
                 <w:szCs w:val="19"/>
                 <w:rtl/>
               </w:rPr>
-              <w:t xml:space="preserve">5</w:t>
+              <w:t xml:space="preserve">6</w:t>
             </w:r>
           </w:p>
         </w:tc>
@@ -1810,7 +1810,7 @@
                 <w:szCs w:val="19"/>
                 <w:rtl/>
               </w:rPr>
-              <w:t xml:space="preserve">شريط فهرسة دورات المحادثة داخل الثريد</w:t>
+              <w:t xml:space="preserve">إعادة تصميم شريط الفهرسة على هيئة مسطرة تظهر عند الاقتراب</w:t>
             </w:r>
           </w:p>
         </w:tc>
@@ -1904,7 +1904,7 @@
                 <w:szCs w:val="19"/>
                 <w:rtl/>
               </w:rPr>
-              <w:t xml:space="preserve">4</w:t>
+              <w:t xml:space="preserve">5</w:t>
             </w:r>
           </w:p>
         </w:tc>
@@ -1964,7 +1964,7 @@
                 <w:szCs w:val="19"/>
                 <w:rtl/>
               </w:rPr>
-              <w:t xml:space="preserve">تسجيل دورات المحادثة واشتقاقها — أساس شريط فهرسة الثريد</w:t>
+              <w:t xml:space="preserve">شريط فهرسة دورات المحادثة داخل الثريد</w:t>
             </w:r>
           </w:p>
         </w:tc>
@@ -1994,7 +1994,7 @@
                 <w:szCs w:val="19"/>
                 <w:rtl/>
               </w:rPr>
-              <w:t xml:space="preserve">صندوق الوارد (طبقة البيانات)</w:t>
+              <w:t xml:space="preserve">صندوق الوارد</w:t>
             </w:r>
           </w:p>
         </w:tc>
@@ -2058,7 +2058,7 @@
                 <w:szCs w:val="19"/>
                 <w:rtl/>
               </w:rPr>
-              <w:t xml:space="preserve">3</w:t>
+              <w:t xml:space="preserve">4</w:t>
             </w:r>
           </w:p>
         </w:tc>
@@ -2120,7 +2120,7 @@
                 <w:szCs w:val="19"/>
                 <w:rtl/>
               </w:rPr>
-              <w:t xml:space="preserve">إزالة كارت نسبة الاستجابة من صفحة تقييمات العملاء</w:t>
+              <w:t xml:space="preserve">تسجيل دورات المحادثة واشتقاقها — أساس شريط فهرسة الثريد</w:t>
             </w:r>
           </w:p>
         </w:tc>
@@ -2151,7 +2151,7 @@
                 <w:szCs w:val="19"/>
                 <w:rtl/>
               </w:rPr>
-              <w:t xml:space="preserve">تقييمات العملاء</w:t>
+              <w:t xml:space="preserve">صندوق الوارد (طبقة البيانات)</w:t>
             </w:r>
           </w:p>
         </w:tc>
@@ -2214,7 +2214,7 @@
                 <w:szCs w:val="19"/>
                 <w:rtl/>
               </w:rPr>
-              <w:t xml:space="preserve">2</w:t>
+              <w:t xml:space="preserve">3</w:t>
             </w:r>
           </w:p>
         </w:tc>
@@ -2244,7 +2244,7 @@
                 <w:szCs w:val="19"/>
                 <w:rtl/>
               </w:rPr>
-              <w:t xml:space="preserve">9 سبتمبر 2026</w:t>
+              <w:t xml:space="preserve">10 سبتمبر 2026</w:t>
             </w:r>
           </w:p>
         </w:tc>
@@ -2274,7 +2274,7 @@
                 <w:szCs w:val="19"/>
                 <w:rtl/>
               </w:rPr>
-              <w:t xml:space="preserve">تغيير تسمية زر الترقية في صفحة الفوترة</w:t>
+              <w:t xml:space="preserve">إزالة كارت نسبة الاستجابة من صفحة تقييمات العملاء</w:t>
             </w:r>
           </w:p>
         </w:tc>
@@ -2304,7 +2304,7 @@
                 <w:szCs w:val="19"/>
                 <w:rtl/>
               </w:rPr>
-              <w:t xml:space="preserve">الفوترة</w:t>
+              <w:t xml:space="preserve">تقييمات العملاء</w:t>
             </w:r>
           </w:p>
         </w:tc>
@@ -2368,7 +2368,7 @@
                 <w:szCs w:val="19"/>
                 <w:rtl/>
               </w:rPr>
-              <w:t xml:space="preserve">1</w:t>
+              <w:t xml:space="preserve">2</w:t>
             </w:r>
           </w:p>
         </w:tc>
@@ -2430,7 +2430,7 @@
                 <w:szCs w:val="19"/>
                 <w:rtl/>
               </w:rPr>
-              <w:t xml:space="preserve">ميزة تغيير الباقة — US-131</w:t>
+              <w:t xml:space="preserve">تغيير تسمية زر الترقية في صفحة الفوترة</w:t>
             </w:r>
           </w:p>
         </w:tc>
@@ -2438,6 +2438,159 @@
           <w:tcPr>
             <w:tcW w:type="dxa" w:w="1500"/>
             <w:shd w:fill="F1F5F9" w:color="auto" w:val="clear"/>
+            <w:tcMar>
+              <w:top w:type="dxa" w:w="90"/>
+              <w:left w:type="dxa" w:w="110"/>
+              <w:bottom w:type="dxa" w:w="90"/>
+              <w:right w:type="dxa" w:w="110"/>
+            </w:tcMar>
+          </w:tcPr>
+          <w:p>
+            <w:pPr>
+              <w:bidi/>
+              <w:spacing w:after="0" w:line="280"/>
+              <w:jc w:val="right"/>
+            </w:pPr>
+            <w:r>
+              <w:rPr>
+                <w:rFonts w:ascii="Arial" w:cs="Arial" w:eastAsia="Arial" w:hAnsi="Arial"/>
+                <w:b w:val="false"/>
+                <w:bCs w:val="false"/>
+                <w:color w:val="1E293B"/>
+                <w:sz w:val="19"/>
+                <w:szCs w:val="19"/>
+                <w:rtl/>
+              </w:rPr>
+              <w:t xml:space="preserve">الفوترة</w:t>
+            </w:r>
+          </w:p>
+        </w:tc>
+        <w:tc>
+          <w:tcPr>
+            <w:tcW w:type="dxa" w:w="1800"/>
+            <w:shd w:fill="ECFDF5" w:color="auto" w:val="clear"/>
+            <w:tcMar>
+              <w:top w:type="dxa" w:w="90"/>
+              <w:left w:type="dxa" w:w="110"/>
+              <w:bottom w:type="dxa" w:w="90"/>
+              <w:right w:type="dxa" w:w="110"/>
+            </w:tcMar>
+          </w:tcPr>
+          <w:p>
+            <w:pPr>
+              <w:bidi/>
+              <w:spacing w:after="0" w:line="280"/>
+              <w:jc w:val="right"/>
+            </w:pPr>
+            <w:r>
+              <w:rPr>
+                <w:rFonts w:ascii="Arial" w:cs="Arial" w:eastAsia="Arial" w:hAnsi="Arial"/>
+                <w:b/>
+                <w:bCs/>
+                <w:color w:val="15803D"/>
+                <w:sz w:val="19"/>
+                <w:szCs w:val="19"/>
+                <w:rtl/>
+              </w:rPr>
+              <w:t xml:space="preserve">منشور على الإنتاج</w:t>
+            </w:r>
+          </w:p>
+        </w:tc>
+      </w:tr>
+      <w:tr>
+        <w:tc>
+          <w:tcPr>
+            <w:tcW w:type="dxa" w:w="600"/>
+            <w:tcMar>
+              <w:top w:type="dxa" w:w="90"/>
+              <w:left w:type="dxa" w:w="110"/>
+              <w:bottom w:type="dxa" w:w="90"/>
+              <w:right w:type="dxa" w:w="110"/>
+            </w:tcMar>
+          </w:tcPr>
+          <w:p>
+            <w:pPr>
+              <w:bidi/>
+              <w:spacing w:after="0" w:line="280"/>
+              <w:jc w:val="right"/>
+            </w:pPr>
+            <w:r>
+              <w:rPr>
+                <w:rFonts w:ascii="Arial" w:cs="Arial" w:eastAsia="Arial" w:hAnsi="Arial"/>
+                <w:b/>
+                <w:bCs/>
+                <w:color w:val="2563EB"/>
+                <w:sz w:val="19"/>
+                <w:szCs w:val="19"/>
+                <w:rtl/>
+              </w:rPr>
+              <w:t xml:space="preserve">1</w:t>
+            </w:r>
+          </w:p>
+        </w:tc>
+        <w:tc>
+          <w:tcPr>
+            <w:tcW w:type="dxa" w:w="1500"/>
+            <w:tcMar>
+              <w:top w:type="dxa" w:w="90"/>
+              <w:left w:type="dxa" w:w="110"/>
+              <w:bottom w:type="dxa" w:w="90"/>
+              <w:right w:type="dxa" w:w="110"/>
+            </w:tcMar>
+          </w:tcPr>
+          <w:p>
+            <w:pPr>
+              <w:bidi/>
+              <w:spacing w:after="0" w:line="280"/>
+              <w:jc w:val="right"/>
+            </w:pPr>
+            <w:r>
+              <w:rPr>
+                <w:rFonts w:ascii="Arial" w:cs="Arial" w:eastAsia="Arial" w:hAnsi="Arial"/>
+                <w:b w:val="false"/>
+                <w:bCs w:val="false"/>
+                <w:color w:val="1E293B"/>
+                <w:sz w:val="19"/>
+                <w:szCs w:val="19"/>
+                <w:rtl/>
+              </w:rPr>
+              <w:t xml:space="preserve">9 سبتمبر 2026</w:t>
+            </w:r>
+          </w:p>
+        </w:tc>
+        <w:tc>
+          <w:tcPr>
+            <w:tcW w:type="dxa" w:w="3600"/>
+            <w:tcMar>
+              <w:top w:type="dxa" w:w="90"/>
+              <w:left w:type="dxa" w:w="110"/>
+              <w:bottom w:type="dxa" w:w="90"/>
+              <w:right w:type="dxa" w:w="110"/>
+            </w:tcMar>
+          </w:tcPr>
+          <w:p>
+            <w:pPr>
+              <w:bidi/>
+              <w:spacing w:after="0" w:line="280"/>
+              <w:jc w:val="right"/>
+            </w:pPr>
+            <w:r>
+              <w:rPr>
+                <w:rFonts w:ascii="Arial" w:cs="Arial" w:eastAsia="Arial" w:hAnsi="Arial"/>
+                <w:b w:val="false"/>
+                <w:bCs w:val="false"/>
+                <w:color w:val="1E293B"/>
+                <w:sz w:val="19"/>
+                <w:szCs w:val="19"/>
+                <w:rtl/>
+              </w:rPr>
+              <w:t xml:space="preserve">ميزة تغيير الباقة — US-131</w:t>
+            </w:r>
+          </w:p>
+        </w:tc>
+        <w:tc>
+          <w:tcPr>
+            <w:tcW w:type="dxa" w:w="1500"/>
             <w:tcMar>
               <w:top w:type="dxa" w:w="90"/>
               <w:left w:type="dxa" w:w="110"/>
@@ -2864,7 +3017,7 @@
                 <w:szCs w:val="20"/>
                 <w:rtl/>
               </w:rPr>
-              <w:t xml:space="preserve">البناء المنشور على الإنتاج: f06334f4-9f6a-4837-97e6-e606c26cca83</w:t>
+              <w:t xml:space="preserve">البناء المنشور على الإنتاج: 5c9b337b-c002-4af8-aaaa-ad0d0c18ac10</w:t>
             </w:r>
           </w:p>
           <w:p>
@@ -2949,7 +3102,7 @@
           <w:szCs w:val="24"/>
           <w:rtl/>
         </w:rPr>
-        <w:t xml:space="preserve">تعديل رقم 14 — صفحة الباقات صارت جدول مقارنة على نسق اللاندنج بيج</w:t>
+        <w:t xml:space="preserve">تعديل رقم 15 — مؤشّر الباقات صار اختياراً بخطوات لا شريط تقدّم</w:t>
       </w:r>
     </w:p>
     <w:p>
@@ -3196,7 +3349,7 @@
                 <w:szCs w:val="19"/>
                 <w:rtl/>
               </w:rPr>
-              <w:t xml:space="preserve">10 سبتمبر 2026</w:t>
+              <w:t xml:space="preserve">13 سبتمبر 2026</w:t>
             </w:r>
           </w:p>
         </w:tc>
@@ -3316,7 +3469,7 @@
                 <w:szCs w:val="19"/>
                 <w:rtl/>
               </w:rPr>
-              <w:t xml:space="preserve">8bc9d51</w:t>
+              <w:t xml:space="preserve">3cec803</w:t>
             </w:r>
           </w:p>
         </w:tc>
@@ -3377,7 +3530,7 @@
           <w:szCs w:val="21"/>
           <w:rtl/>
         </w:rPr>
-        <w:t xml:space="preserve">كانت الصفحة تعرض باقة واحدة في كل مرة: المؤشر يختار الباقة، وكارت واحد يعرض سعرها، وقائمة مسطّحة تؤشّر على مزاياها. مقارنة باقتين كانت تعني سحب المؤشر جيئة وذهاباً وحفظ ما رأيته — وهو بالضبط ما يفعله من يختار باقة.</w:t>
+        <w:t xml:space="preserve">كان حقل range يلوّن المسار بالأزرق من البداية حتى المؤشّر، وهذا يقول «أنت قطعت 40% من شيء». الباقات أربع خيارات منفصلة لا كمية تتراكم، فكانت التعبئة تدّعي معنى لا يملكه العنصر، وجعلت الصف يبدو شريط تحميل.</w:t>
       </w:r>
     </w:p>
     <w:p>
@@ -3399,7 +3552,7 @@
           <w:szCs w:val="21"/>
           <w:rtl/>
         </w:rPr>
-        <w:t xml:space="preserve">صارت الأربع باقات جنباً إلى جنب كأعمدة، كل عمود بسعره وتوفيره السنوي وزرّه، فوق جدول صفوفه مقسومة إلى «الأساسيات» و«المزايا».</w:t>
+        <w:t xml:space="preserve">صار المسار رمادياً من طرف إلى طرف والحالة كلها في النقاط: نقاط مفرغة للباقات الأخرى، وحلقة للمختارة، وسقف المحادثات في فقاعة فوقها. لا شيء ممتلئ فلا شيء يُقرأ كتقدّم.</w:t>
       </w:r>
     </w:p>
     <w:p>
@@ -3421,7 +3574,7 @@
           <w:szCs w:val="21"/>
           <w:rtl/>
         </w:rPr>
-        <w:t xml:space="preserve">المؤشر بقي لكنه صار يرشّح ويلوّن العمود المناسب فقط، فكل زر يعمل على باقته لا على ما يشير إليه المؤشر.</w:t>
+        <w:t xml:space="preserve">حُذف صف الأرقام تحت المسار معه؛ صار المعروض القيمة المختارة وحدها بدل أربعة أرقام تزاحمها.</w:t>
       </w:r>
     </w:p>
     <w:p>
@@ -3443,7 +3596,7 @@
           <w:szCs w:val="21"/>
           <w:rtl/>
         </w:rPr>
-        <w:t xml:space="preserve">المزايا في البيانات ليست تراكمية: كل باقة تسرد إضافاتها خلف سطر «كل مزايا باقة X». مصفوفة includes() بسيطة كانت ستضع «—» أمام كل ميزة موروثة وتُظهر الباقة الأعلى أفقر من الأدنى، فحُلّت الوراثة إلى ✓ حقيقية وحُذفت أسطر الإشارة.</w:t>
+        <w:t xml:space="preserve">دعم الكيبورد باقٍ ومُوجَّه بصرياً: في RTL السهم الأيسر ينتقل للباقة الأكبر لأن الأكبر هناك، وHome وEnd للطرفين.</w:t>
       </w:r>
     </w:p>
     <w:p>
@@ -3465,7 +3618,7 @@
           <w:szCs w:val="21"/>
           <w:rtl/>
         </w:rPr>
-        <w:t xml:space="preserve">عطل كنت سأُدخله: نافذة تأكيد التخفيض كانت تقرأ السعر من المؤشر — صحيح حين كان المؤشر هو المُختار، وخطأ مع أزرار لكل عمود. صارت الأسعار تُشتق من الباقة المختارة.</w:t>
+        <w:t xml:space="preserve">فخّ RTL أول: start-* تُترجم إلى right، فاقترانها بـ ‎-translate-x-1/2 أزاح سهم الفقاعة عن المؤشّر بنصف عرضه. قِسته فطلع 8px — صار السهم يستخدم left الفيزيائي والانحراف صفر.</w:t>
       </w:r>
     </w:p>
     <w:p>
@@ -3487,7 +3640,7 @@
           <w:szCs w:val="21"/>
           <w:rtl/>
         </w:rPr>
-        <w:t xml:space="preserve">نسبة الخصم السنوي تُحسب من الأسعار (17%) بدل أن تُكتب يدوياً.</w:t>
+        <w:t xml:space="preserve">فخّ RTL ثانٍ: عند الطرفين تخرج الفقاعة المتوسّطة عن الشاشة الضيقة، فصارت تتعلّق من الجهة الداخلية للمؤشّر والسهم يتبعها.</w:t>
       </w:r>
     </w:p>
     <w:p>
@@ -3509,7 +3662,7 @@
           <w:szCs w:val="21"/>
           <w:rtl/>
         </w:rPr>
-        <w:t xml:space="preserve">اختُبر في المتصفح: الأعمدة الأربعة تُرسم، والأسماء والأسعار والأزرار كلٌّ على سطر واحد في الدورتين، وعمود العناوين يثبت أثناء التمرير الأفقي، ولا تجاوز أفقي عند 400px.</w:t>
+        <w:t xml:space="preserve">اختُبر في المتصفح: خلفية المسار تُحسب لوناً مصمتاً بلا تدرّج، والنقاط الأربع موزّعة بالتساوي، والأسهم والنقر يحرّكان الاختيار، والفقاعة وسهمها على مركز المؤشّر بالبكسل، والفقاعة تسع داخل المحتوى عند 1440 و1024 و768.</w:t>
       </w:r>
     </w:p>
     <w:p>
@@ -3531,7 +3684,7 @@
           <w:szCs w:val="21"/>
           <w:rtl/>
         </w:rPr>
-        <w:t xml:space="preserve">فرق باقٍ عن اللاندنج بيج: هناك خمس مجموعات مسمّاة للمزايا، وهنا مجموعتان، لأن features في موديول الباقات مجرد string[] بلا تصنيف. التقسيم الكامل يحتاج حقل تصنيف في محرّر الباقات عند الأدمن.</w:t>
+        <w:t xml:space="preserve">تحت ~500px لا تسع الفقاعة لأن الشريط الجانبي يبقى مفتوحاً ويترك للصفحة 160px فقط — يخصّ الصفحة كلها لا هذا العنصر، وتُرك كما هو.</w:t>
       </w:r>
     </w:p>
     <w:p>
@@ -3556,7 +3709,7 @@
           <w:szCs w:val="24"/>
           <w:rtl/>
         </w:rPr>
-        <w:t xml:space="preserve">تعديل رقم 13 — تعطيل المصادقة الثنائية صار يتطلّب كلمة المرور أو رمزاً</w:t>
+        <w:t xml:space="preserve">تعديل رقم 14 — صفحة الباقات صارت جدول مقارنة على نسق اللاندنج بيج</w:t>
       </w:r>
     </w:p>
     <w:p>
@@ -3833,7 +3986,7 @@
                 <w:szCs w:val="19"/>
                 <w:rtl/>
               </w:rPr>
-              <w:t xml:space="preserve">الإعدادات ← الأمان</w:t>
+              <w:t xml:space="preserve">الباقات والاشتراك</w:t>
             </w:r>
           </w:p>
         </w:tc>
@@ -3863,7 +4016,7 @@
                 <w:szCs w:val="19"/>
                 <w:rtl/>
               </w:rPr>
-              <w:t xml:space="preserve">/settings/security</w:t>
+              <w:t xml:space="preserve">/subscribe</w:t>
             </w:r>
           </w:p>
         </w:tc>
@@ -3893,7 +4046,7 @@
                 <w:szCs w:val="19"/>
                 <w:rtl/>
               </w:rPr>
-              <w:t xml:space="preserve">src/pages/Settings.tsx · src/store/useAuthStore.ts</w:t>
+              <w:t xml:space="preserve">src/pages/Subscribe.tsx</w:t>
             </w:r>
           </w:p>
         </w:tc>
@@ -3923,7 +4076,7 @@
                 <w:szCs w:val="19"/>
                 <w:rtl/>
               </w:rPr>
-              <w:t xml:space="preserve">aedca85</w:t>
+              <w:t xml:space="preserve">8bc9d51</w:t>
             </w:r>
           </w:p>
         </w:tc>
@@ -3984,7 +4137,7 @@
           <w:szCs w:val="21"/>
           <w:rtl/>
         </w:rPr>
-        <w:t xml:space="preserve">كان التعطيل نافذة تأكيد ولا شيء غيرها، فكانت الحماية بقوة تبويب مفتوح بلا رقيب: من يصل إلى صفحة الإعدادات يطفئها، وبعدها كلمة المرور وحدها تفتح الحساب ولا يعود الهاتف يعني شيئاً.</w:t>
+        <w:t xml:space="preserve">كانت الصفحة تعرض باقة واحدة في كل مرة: المؤشر يختار الباقة، وكارت واحد يعرض سعرها، وقائمة مسطّحة تؤشّر على مزاياها. مقارنة باقتين كانت تعني سحب المؤشر جيئة وذهاباً وحفظ ما رأيته — وهو بالضبط ما يفعله من يختار باقة.</w:t>
       </w:r>
     </w:p>
     <w:p>
@@ -4006,7 +4159,7 @@
           <w:szCs w:val="21"/>
           <w:rtl/>
         </w:rPr>
-        <w:t xml:space="preserve">صار التعطيل يكلّف نفس الإثبات الذي يكلّفه تجاوز الشاشة: كلمة المرور افتراضياً، أو رمز من تطبيق المصادقة عبر رابط داخل النافذة.</w:t>
+        <w:t xml:space="preserve">صارت الأربع باقات جنباً إلى جنب كأعمدة، كل عمود بسعره وتوفيره السنوي وزرّه، فوق جدول صفوفه مقسومة إلى «الأساسيات» و«المزايا».</w:t>
       </w:r>
     </w:p>
     <w:p>
@@ -4028,7 +4181,7 @@
           <w:szCs w:val="21"/>
           <w:rtl/>
         </w:rPr>
-        <w:t xml:space="preserve">الرموز الاحتياطية مقبولة في نفس الحقل، لأن فاقد هاتفه يحتاج طريقة يطفّيها بها.</w:t>
+        <w:t xml:space="preserve">المؤشر بقي لكنه صار يرشّح ويلوّن العمود المناسب فقط، فكل زر يعمل على باقته لا على ما يشير إليه المؤشر.</w:t>
       </w:r>
     </w:p>
     <w:p>
@@ -4050,7 +4203,7 @@
           <w:szCs w:val="21"/>
           <w:rtl/>
         </w:rPr>
-        <w:t xml:space="preserve">قُبل العاملان معاً عن قصد: من يشكّ أن كلمة مروره تسرّبت يحتاج مساراً لا يمرّ بها.</w:t>
+        <w:t xml:space="preserve">المزايا في البيانات ليست تراكمية: كل باقة تسرد إضافاتها خلف سطر «كل مزايا باقة X». مصفوفة includes() بسيطة كانت ستضع «—» أمام كل ميزة موروثة وتُظهر الباقة الأعلى أفقر من الأدنى، فحُلّت الوراثة إلى ✓ حقيقية وحُذفت أسطر الإشارة.</w:t>
       </w:r>
     </w:p>
     <w:p>
@@ -4072,7 +4225,7 @@
           <w:szCs w:val="21"/>
           <w:rtl/>
         </w:rPr>
-        <w:t xml:space="preserve">حدّ خمس محاولات. رمز من ست خانات بلا سقف محاولات ليس عاملاً ثانياً.</w:t>
+        <w:t xml:space="preserve">عطل كنت سأُدخله: نافذة تأكيد التخفيض كانت تقرأ السعر من المؤشر — صحيح حين كان المؤشر هو المُختار، وخطأ مع أزرار لكل عمود. صارت الأسعار تُشتق من الباقة المختارة.</w:t>
       </w:r>
     </w:p>
     <w:p>
@@ -4094,7 +4247,7 @@
           <w:szCs w:val="21"/>
           <w:rtl/>
         </w:rPr>
-        <w:t xml:space="preserve">اختُبرت خمسة مسارات في المتصفح: كلمة مرور خاطئة تُبقيها مفعّلة وتُظهر الخطأ؛ كلمة المرور الصحيحة ورمز TOTP حيّ ورمز احتياطي كلٌّ منها يعطّلها؛ وخمس محاولات خاطئة تُقفل النافذة و2FA ما زالت مفعّلة.</w:t>
+        <w:t xml:space="preserve">نسبة الخصم السنوي تُحسب من الأسعار (17%) بدل أن تُكتب يدوياً.</w:t>
       </w:r>
     </w:p>
     <w:p>
@@ -4116,7 +4269,29 @@
           <w:szCs w:val="21"/>
           <w:rtl/>
         </w:rPr>
-        <w:t xml:space="preserve">هذه الخطوة لم تكن موجودة أصلاً ولم تُحذف — تأكّدت من ذلك بمراجعة النسخة السابقة للكود (743042c^) قبل الشروع في البناء.</w:t>
+        <w:t xml:space="preserve">اختُبر في المتصفح: الأعمدة الأربعة تُرسم، والأسماء والأسعار والأزرار كلٌّ على سطر واحد في الدورتين، وعمود العناوين يثبت أثناء التمرير الأفقي، ولا تجاوز أفقي عند 400px.</w:t>
+      </w:r>
+    </w:p>
+    <w:p>
+      <w:pPr>
+        <w:pStyle w:val="ListParagraph"/>
+        <w:numPr>
+          <w:ilvl w:val="0"/>
+          <w:numId w:val="2"/>
+        </w:numPr>
+        <w:bidi/>
+        <w:spacing w:after="70" w:line="290"/>
+        <w:jc w:val="right"/>
+      </w:pPr>
+      <w:r>
+        <w:rPr>
+          <w:rFonts w:ascii="Arial" w:cs="Arial" w:eastAsia="Arial" w:hAnsi="Arial"/>
+          <w:color w:val="1E293B"/>
+          <w:sz w:val="21"/>
+          <w:szCs w:val="21"/>
+          <w:rtl/>
+        </w:rPr>
+        <w:t xml:space="preserve">فرق باقٍ عن اللاندنج بيج: هناك خمس مجموعات مسمّاة للمزايا، وهنا مجموعتان، لأن features في موديول الباقات مجرد string[] بلا تصنيف. التقسيم الكامل يحتاج حقل تصنيف في محرّر الباقات عند الأدمن.</w:t>
       </w:r>
     </w:p>
     <w:p>
@@ -4141,7 +4316,7 @@
           <w:szCs w:val="24"/>
           <w:rtl/>
         </w:rPr>
-        <w:t xml:space="preserve">تعديل رقم 12 — رمز QR حقيقي قابل للمسح في إعداد المصادقة الثنائية</w:t>
+        <w:t xml:space="preserve">تعديل رقم 13 — تعطيل المصادقة الثنائية صار يتطلّب كلمة المرور أو رمزاً</w:t>
       </w:r>
     </w:p>
     <w:p>
@@ -4448,7 +4623,7 @@
                 <w:szCs w:val="19"/>
                 <w:rtl/>
               </w:rPr>
-              <w:t xml:space="preserve">/settings</w:t>
+              <w:t xml:space="preserve">/settings/security</w:t>
             </w:r>
           </w:p>
         </w:tc>
@@ -4478,7 +4653,7 @@
                 <w:szCs w:val="19"/>
                 <w:rtl/>
               </w:rPr>
-              <w:t xml:space="preserve">src/components/ui/QrCode.tsx · src/pages/Settings.tsx · src/utils/twoFactor.ts</w:t>
+              <w:t xml:space="preserve">src/pages/Settings.tsx · src/store/useAuthStore.ts</w:t>
             </w:r>
           </w:p>
         </w:tc>
@@ -4508,7 +4683,7 @@
                 <w:szCs w:val="19"/>
                 <w:rtl/>
               </w:rPr>
-              <w:t xml:space="preserve">e5a121d</w:t>
+              <w:t xml:space="preserve">aedca85</w:t>
             </w:r>
           </w:p>
         </w:tc>
@@ -4569,7 +4744,7 @@
           <w:szCs w:val="21"/>
           <w:rtl/>
         </w:rPr>
-        <w:t xml:space="preserve">كان المعروض رسمة SVG مربّعات مرصوفة يدوياً تشبه رمز QR ولا تحمل أي بيانات، فلا يقرأها أي تطبيق مصادقة. الطريقة الوحيدة للربط كانت نسخ المفتاح يدوياً.</w:t>
+        <w:t xml:space="preserve">كان التعطيل نافذة تأكيد ولا شيء غيرها، فكانت الحماية بقوة تبويب مفتوح بلا رقيب: من يصل إلى صفحة الإعدادات يطفئها، وبعدها كلمة المرور وحدها تفتح الحساب ولا يعود الهاتف يعني شيئاً.</w:t>
       </w:r>
     </w:p>
     <w:p>
@@ -4591,7 +4766,7 @@
           <w:szCs w:val="21"/>
           <w:rtl/>
         </w:rPr>
-        <w:t xml:space="preserve">صار الرمز يُولَّد فعلياً من رابط otpauth:// بمكتبة qrcode.</w:t>
+        <w:t xml:space="preserve">صار التعطيل يكلّف نفس الإثبات الذي يكلّفه تجاوز الشاشة: كلمة المرور افتراضياً، أو رمز من تطبيق المصادقة عبر رابط داخل النافذة.</w:t>
       </w:r>
     </w:p>
     <w:p>
@@ -4613,7 +4788,7 @@
           <w:szCs w:val="21"/>
           <w:rtl/>
         </w:rPr>
-        <w:t xml:space="preserve">تحقّقت منه بالتصوير والفكّ لا بالنظر: صوّرت العنصر المرسوم على الشاشة وفككته بقارئ QR، فرجع الرابط المتوقّع — في الوضع الفاتح والداكن.</w:t>
+        <w:t xml:space="preserve">الرموز الاحتياطية مقبولة في نفس الحقل، لأن فاقد هاتفه يحتاج طريقة يطفّيها بها.</w:t>
       </w:r>
     </w:p>
     <w:p>
@@ -4635,7 +4810,7 @@
           <w:szCs w:val="21"/>
           <w:rtl/>
         </w:rPr>
-        <w:t xml:space="preserve">ثُبّت الرمز أبيض على أسود بصرف النظر عن الثيم. لو ورث currentColor لانقلبت ألوانه في الوضع الداكن وتعذّر مسحه.</w:t>
+        <w:t xml:space="preserve">قُبل العاملان معاً عن قصد: من يشكّ أن كلمة مروره تسرّبت يحتاج مساراً لا يمرّ بها.</w:t>
       </w:r>
     </w:p>
     <w:p>
@@ -4657,7 +4832,7 @@
           <w:szCs w:val="21"/>
           <w:rtl/>
         </w:rPr>
-        <w:t xml:space="preserve">أُضيفت algorithm وdigits وperiod صراحةً إلى الرابط. Google Authenticator يفترض SHA1/6/30، أما Authy و1Password فلا، وافتراض مختلف يولّد رموزاً يرفضها التحقق عندنا.</w:t>
+        <w:t xml:space="preserve">حدّ خمس محاولات. رمز من ست خانات بلا سقف محاولات ليس عاملاً ثانياً.</w:t>
       </w:r>
     </w:p>
     <w:p>
@@ -4679,7 +4854,7 @@
           <w:szCs w:val="21"/>
           <w:rtl/>
         </w:rPr>
-        <w:t xml:space="preserve">عدد الخانات صار ثابتاً واحداً يقرأه المولّد والرابط معاً، فلا ينفصلان.</w:t>
+        <w:t xml:space="preserve">اختُبرت خمسة مسارات في المتصفح: كلمة مرور خاطئة تُبقيها مفعّلة وتُظهر الخطأ؛ كلمة المرور الصحيحة ورمز TOTP حيّ ورمز احتياطي كلٌّ منها يعطّلها؛ وخمس محاولات خاطئة تُقفل النافذة و2FA ما زالت مفعّلة.</w:t>
       </w:r>
     </w:p>
     <w:p>
@@ -4701,29 +4876,7 @@
           <w:szCs w:val="21"/>
           <w:rtl/>
         </w:rPr>
-        <w:t xml:space="preserve">المكتبة تُحمَّل بـ dynamic import عند فتح النافذة فقط، فحزمة الإعدادات بقيت ~50KB بدل 74KB.</w:t>
-      </w:r>
-    </w:p>
-    <w:p>
-      <w:pPr>
-        <w:pStyle w:val="ListParagraph"/>
-        <w:numPr>
-          <w:ilvl w:val="0"/>
-          <w:numId w:val="2"/>
-        </w:numPr>
-        <w:bidi/>
-        <w:spacing w:after="70" w:line="290"/>
-        <w:jc w:val="right"/>
-      </w:pPr>
-      <w:r>
-        <w:rPr>
-          <w:rFonts w:ascii="Arial" w:cs="Arial" w:eastAsia="Arial" w:hAnsi="Arial"/>
-          <w:color w:val="1E293B"/>
-          <w:sz w:val="21"/>
-          <w:szCs w:val="21"/>
-          <w:rtl/>
-        </w:rPr>
-        <w:t xml:space="preserve">يبقى المفتاح واحداً لكل الحسابات (ثابت في الكود)، فالربط يثبت صحّة الآلية لا أكثر — التوليد لكل مستخدم مكانه الخادم.</w:t>
+        <w:t xml:space="preserve">هذه الخطوة لم تكن موجودة أصلاً ولم تُحذف — تأكّدت من ذلك بمراجعة النسخة السابقة للكود (743042c^) قبل الشروع في البناء.</w:t>
       </w:r>
     </w:p>
     <w:p>
@@ -4748,7 +4901,7 @@
           <w:szCs w:val="24"/>
           <w:rtl/>
         </w:rPr>
-        <w:t xml:space="preserve">تعديل رقم 11 — رقم جوال اختياري في الملف الشخصي</w:t>
+        <w:t xml:space="preserve">تعديل رقم 12 — رمز QR حقيقي قابل للمسح في إعداد المصادقة الثنائية</w:t>
       </w:r>
     </w:p>
     <w:p>
@@ -5025,7 +5178,7 @@
                 <w:szCs w:val="19"/>
                 <w:rtl/>
               </w:rPr>
-              <w:t xml:space="preserve">الإعدادات ← الملف الشخصي</w:t>
+              <w:t xml:space="preserve">الإعدادات ← الأمان</w:t>
             </w:r>
           </w:p>
         </w:tc>
@@ -5085,7 +5238,7 @@
                 <w:szCs w:val="19"/>
                 <w:rtl/>
               </w:rPr>
-              <w:t xml:space="preserve">src/pages/Settings.tsx · src/store/useAuthStore.ts</w:t>
+              <w:t xml:space="preserve">src/components/ui/QrCode.tsx · src/pages/Settings.tsx · src/utils/twoFactor.ts</w:t>
             </w:r>
           </w:p>
         </w:tc>
@@ -5115,7 +5268,7 @@
                 <w:szCs w:val="19"/>
                 <w:rtl/>
               </w:rPr>
-              <w:t xml:space="preserve">27dc01f</w:t>
+              <w:t xml:space="preserve">e5a121d</w:t>
             </w:r>
           </w:p>
         </w:tc>
@@ -5176,7 +5329,7 @@
           <w:szCs w:val="21"/>
           <w:rtl/>
         </w:rPr>
-        <w:t xml:space="preserve">كان الملف الشخصي يجمع اسم العرض والبريد فقط، فلا سبيل للوصول لصاحب الحساب خارج صندوق الوارد.</w:t>
+        <w:t xml:space="preserve">كان المعروض رسمة SVG مربّعات مرصوفة يدوياً تشبه رمز QR ولا تحمل أي بيانات، فلا يقرأها أي تطبيق مصادقة. الطريقة الوحيدة للربط كانت نسخ المفتاح يدوياً.</w:t>
       </w:r>
     </w:p>
     <w:p>
@@ -5198,7 +5351,7 @@
           <w:szCs w:val="21"/>
           <w:rtl/>
         </w:rPr>
-        <w:t xml:space="preserve">استُخدم مكوّن PhoneField نفسه المستعمل في جهات الاتصال ودعوة الموظفين، فجاء معه منتقي الدولة ورمز الاتصال بدل حقل نصّي حرّ.</w:t>
+        <w:t xml:space="preserve">صار الرمز يُولَّد فعلياً من رابط otpauth:// بمكتبة qrcode.</w:t>
       </w:r>
     </w:p>
     <w:p>
@@ -5220,7 +5373,7 @@
           <w:szCs w:val="21"/>
           <w:rtl/>
         </w:rPr>
-        <w:t xml:space="preserve">الحقل اختياري ويحمل وسم «(اختياري)» بنفس أسلوب باقي الحقول غير الإلزامية.</w:t>
+        <w:t xml:space="preserve">تحقّقت منه بالتصوير والفكّ لا بالنظر: صوّرت العنصر المرسوم على الشاشة وفككته بقارئ QR، فرجع الرابط المتوقّع — في الوضع الفاتح والداكن.</w:t>
       </w:r>
     </w:p>
     <w:p>
@@ -5242,7 +5395,7 @@
           <w:szCs w:val="21"/>
           <w:rtl/>
         </w:rPr>
-        <w:t xml:space="preserve">الرقم لا يُخزَّن إلا إذا كُتب فعلاً، حتى لا يبقى رمز دولة وحده متظاهراً بأنه رقم بعد تفريغ الحقل.</w:t>
+        <w:t xml:space="preserve">ثُبّت الرمز أبيض على أسود بصرف النظر عن الثيم. لو ورث currentColor لانقلبت ألوانه في الوضع الداكن وتعذّر مسحه.</w:t>
       </w:r>
     </w:p>
     <w:p>
@@ -5264,7 +5417,7 @@
           <w:szCs w:val="21"/>
           <w:rtl/>
         </w:rPr>
-        <w:t xml:space="preserve">عند التحميل يُفصل الرقم المحفوظ إلى رمز دولة ورقم محلي بمطابقة أطول رمز — لا بتعبير نمطي جشع، لأن ذلك كان سيقرأ ‎+96891234567 على أنه ‎+9689 ويشوّه الباقي.</w:t>
+        <w:t xml:space="preserve">أُضيفت algorithm وdigits وperiod صراحةً إلى الرابط. Google Authenticator يفترض SHA1/6/30، أما Authy و1Password فلا، وافتراض مختلف يولّد رموزاً يرفضها التحقق عندنا.</w:t>
       </w:r>
     </w:p>
     <w:p>
@@ -5286,7 +5439,51 @@
           <w:szCs w:val="21"/>
           <w:rtl/>
         </w:rPr>
-        <w:t xml:space="preserve">عوينت النتيجة في المتصفح: حفظ 91234567 مع ‎+968 خزّنه ‎+96891234567، وبعد إعادة التحميل رجع مقسوماً صحيحاً.</w:t>
+        <w:t xml:space="preserve">عدد الخانات صار ثابتاً واحداً يقرأه المولّد والرابط معاً، فلا ينفصلان.</w:t>
+      </w:r>
+    </w:p>
+    <w:p>
+      <w:pPr>
+        <w:pStyle w:val="ListParagraph"/>
+        <w:numPr>
+          <w:ilvl w:val="0"/>
+          <w:numId w:val="2"/>
+        </w:numPr>
+        <w:bidi/>
+        <w:spacing w:after="70" w:line="290"/>
+        <w:jc w:val="right"/>
+      </w:pPr>
+      <w:r>
+        <w:rPr>
+          <w:rFonts w:ascii="Arial" w:cs="Arial" w:eastAsia="Arial" w:hAnsi="Arial"/>
+          <w:color w:val="1E293B"/>
+          <w:sz w:val="21"/>
+          <w:szCs w:val="21"/>
+          <w:rtl/>
+        </w:rPr>
+        <w:t xml:space="preserve">المكتبة تُحمَّل بـ dynamic import عند فتح النافذة فقط، فحزمة الإعدادات بقيت ~50KB بدل 74KB.</w:t>
+      </w:r>
+    </w:p>
+    <w:p>
+      <w:pPr>
+        <w:pStyle w:val="ListParagraph"/>
+        <w:numPr>
+          <w:ilvl w:val="0"/>
+          <w:numId w:val="2"/>
+        </w:numPr>
+        <w:bidi/>
+        <w:spacing w:after="70" w:line="290"/>
+        <w:jc w:val="right"/>
+      </w:pPr>
+      <w:r>
+        <w:rPr>
+          <w:rFonts w:ascii="Arial" w:cs="Arial" w:eastAsia="Arial" w:hAnsi="Arial"/>
+          <w:color w:val="1E293B"/>
+          <w:sz w:val="21"/>
+          <w:szCs w:val="21"/>
+          <w:rtl/>
+        </w:rPr>
+        <w:t xml:space="preserve">يبقى المفتاح واحداً لكل الحسابات (ثابت في الكود)، فالربط يثبت صحّة الآلية لا أكثر — التوليد لكل مستخدم مكانه الخادم.</w:t>
       </w:r>
     </w:p>
     <w:p>
@@ -5311,7 +5508,7 @@
           <w:szCs w:val="24"/>
           <w:rtl/>
         </w:rPr>
-        <w:t xml:space="preserve">تعديل رقم 10 — شاشة التحقق بخطوتين في تسجيل الدخول</w:t>
+        <w:t xml:space="preserve">تعديل رقم 11 — رقم جوال اختياري في الملف الشخصي</w:t>
       </w:r>
     </w:p>
     <w:p>
@@ -5588,7 +5785,7 @@
                 <w:szCs w:val="19"/>
                 <w:rtl/>
               </w:rPr>
-              <w:t xml:space="preserve">تسجيل الدخول</w:t>
+              <w:t xml:space="preserve">الإعدادات ← الملف الشخصي</w:t>
             </w:r>
           </w:p>
         </w:tc>
@@ -5618,7 +5815,7 @@
                 <w:szCs w:val="19"/>
                 <w:rtl/>
               </w:rPr>
-              <w:t xml:space="preserve">/login</w:t>
+              <w:t xml:space="preserve">/settings</w:t>
             </w:r>
           </w:p>
         </w:tc>
@@ -5648,7 +5845,7 @@
                 <w:szCs w:val="19"/>
                 <w:rtl/>
               </w:rPr>
-              <w:t xml:space="preserve">src/utils/twoFactor.ts · src/components/auth/TwoFactorChallenge.tsx · src/store/useAuthStore.ts · src/pages/Login.tsx</w:t>
+              <w:t xml:space="preserve">src/pages/Settings.tsx · src/store/useAuthStore.ts</w:t>
             </w:r>
           </w:p>
         </w:tc>
@@ -5678,7 +5875,7 @@
                 <w:szCs w:val="19"/>
                 <w:rtl/>
               </w:rPr>
-              <w:t xml:space="preserve">743042c</w:t>
+              <w:t xml:space="preserve">27dc01f</w:t>
             </w:r>
           </w:p>
         </w:tc>
@@ -5739,7 +5936,7 @@
           <w:szCs w:val="21"/>
           <w:rtl/>
         </w:rPr>
-        <w:t xml:space="preserve">⚠️ هيكل واجهة لا أمان: التحقق يجري في المتصفح والمفتاح السري داخل حزمة الجافاسكربت، فيمكن تجاوزه. الغرض تجهيز الواجهة والعقد لحين وجود باكيند، وهذا مكتوب صراحةً في رأس ملف twoFactor.ts.</w:t>
+        <w:t xml:space="preserve">كان الملف الشخصي يجمع اسم العرض والبريد فقط، فلا سبيل للوصول لصاحب الحساب خارج صندوق الوارد.</w:t>
       </w:r>
     </w:p>
     <w:p>
@@ -5761,7 +5958,7 @@
           <w:szCs w:val="21"/>
           <w:rtl/>
         </w:rPr>
-        <w:t xml:space="preserve">كان الدخول يوثّق فوراً بعد كلمة المرور. صار مرحلتين: كلمة المرور تنتج حالة معلّقة في الذاكرة فقط، ولا يُكتب شيء في التخزين حتى يمرّ العامل الثاني — فإغلاق التبويب في منتصف العملية لا يترك جلسة مفتوحة.</w:t>
+        <w:t xml:space="preserve">استُخدم مكوّن PhoneField نفسه المستعمل في جهات الاتصال ودعوة الموظفين، فجاء معه منتقي الدولة ورمز الاتصال بدل حقل نصّي حرّ.</w:t>
       </w:r>
     </w:p>
     <w:p>
@@ -5783,7 +5980,7 @@
           <w:szCs w:val="21"/>
           <w:rtl/>
         </w:rPr>
-        <w:t xml:space="preserve">شاشة التحقق تظهر داخل مسار الدخول نفسه لا على عنوان مستقل، لأن عنواناً مستقلاً يفتحه أي شخص دون المرور بالمرحلة الأولى.</w:t>
+        <w:t xml:space="preserve">الحقل اختياري ويحمل وسم «(اختياري)» بنفس أسلوب باقي الحقول غير الإلزامية.</w:t>
       </w:r>
     </w:p>
     <w:p>
@@ -5805,7 +6002,7 @@
           <w:szCs w:val="21"/>
           <w:rtl/>
         </w:rPr>
-        <w:t xml:space="preserve">نُفِّذت خوارزمية TOTP (المعيار RFC 6238) بـ Web Crypto، فأكواد Google Authenticator الحقيقية تُقبل فعلاً. تحقّقت من التنفيذ بمتجهات الاختبار الخمسة الواردة في المعيار نفسه وكلها طابقت.</w:t>
+        <w:t xml:space="preserve">الرقم لا يُخزَّن إلا إذا كُتب فعلاً، حتى لا يبقى رمز دولة وحده متظاهراً بأنه رقم بعد تفريغ الحقل.</w:t>
       </w:r>
     </w:p>
     <w:p>
@@ -5827,7 +6024,7 @@
           <w:szCs w:val="21"/>
           <w:rtl/>
         </w:rPr>
-        <w:t xml:space="preserve">نافذة تسامح خطوة واحدة قبل وبعد لاستيعاب فروق ساعة الجهاز.</w:t>
+        <w:t xml:space="preserve">عند التحميل يُفصل الرقم المحفوظ إلى رمز دولة ورقم محلي بمطابقة أطول رمز — لا بتعبير نمطي جشع، لأن ذلك كان سيقرأ ‎+96891234567 على أنه ‎+9689 ويشوّه الباقي.</w:t>
       </w:r>
     </w:p>
     <w:p>
@@ -5849,205 +6046,7 @@
           <w:szCs w:val="21"/>
           <w:rtl/>
         </w:rPr>
-        <w:t xml:space="preserve">ستة مربعات بانتقال تلقائي بين الخانات ودعم اللصق وإرسال تلقائي عند اكتمال الرمز.</w:t>
-      </w:r>
-    </w:p>
-    <w:p>
-      <w:pPr>
-        <w:pStyle w:val="ListParagraph"/>
-        <w:numPr>
-          <w:ilvl w:val="0"/>
-          <w:numId w:val="2"/>
-        </w:numPr>
-        <w:bidi/>
-        <w:spacing w:after="70" w:line="290"/>
-        <w:jc w:val="right"/>
-      </w:pPr>
-      <w:r>
-        <w:rPr>
-          <w:rFonts w:ascii="Arial" w:cs="Arial" w:eastAsia="Arial" w:hAnsi="Arial"/>
-          <w:color w:val="1E293B"/>
-          <w:sz w:val="21"/>
-          <w:szCs w:val="21"/>
-          <w:rtl/>
-        </w:rPr>
-        <w:t xml:space="preserve">لا يوجد زر «إعادة إرسال» — التطبيق يولّد الرمز على الجهاز ولا شيء يُرسَل. وُضع مكانه عدّاد يبيّن الثواني المتبقية قبل تغيّر الرمز، فلا ينتظر الموظف رسالة لن تصل.</w:t>
-      </w:r>
-    </w:p>
-    <w:p>
-      <w:pPr>
-        <w:pStyle w:val="ListParagraph"/>
-        <w:numPr>
-          <w:ilvl w:val="0"/>
-          <w:numId w:val="2"/>
-        </w:numPr>
-        <w:bidi/>
-        <w:spacing w:after="70" w:line="290"/>
-        <w:jc w:val="right"/>
-      </w:pPr>
-      <w:r>
-        <w:rPr>
-          <w:rFonts w:ascii="Arial" w:cs="Arial" w:eastAsia="Arial" w:hAnsi="Arial"/>
-          <w:color w:val="1E293B"/>
-          <w:sz w:val="21"/>
-          <w:szCs w:val="21"/>
-          <w:rtl/>
-        </w:rPr>
-        <w:t xml:space="preserve">مسار الرموز الاحتياطية داخل الشاشة نفسها، لأن فاقد هاتفه بلا رمز احتياطي يُقفل خارج حسابه نهائياً.</w:t>
-      </w:r>
-    </w:p>
-    <w:p>
-      <w:pPr>
-        <w:pStyle w:val="ListParagraph"/>
-        <w:numPr>
-          <w:ilvl w:val="0"/>
-          <w:numId w:val="2"/>
-        </w:numPr>
-        <w:bidi/>
-        <w:spacing w:after="70" w:line="290"/>
-        <w:jc w:val="right"/>
-      </w:pPr>
-      <w:r>
-        <w:rPr>
-          <w:rFonts w:ascii="Arial" w:cs="Arial" w:eastAsia="Arial" w:hAnsi="Arial"/>
-          <w:color w:val="1E293B"/>
-          <w:sz w:val="21"/>
-          <w:szCs w:val="21"/>
-          <w:rtl/>
-        </w:rPr>
-        <w:t xml:space="preserve">رسالة الخطأ واحدة للرمز الخاطئ وللمنتهي عمداً، حتى لا تُعطي المهاجم معلومة يفرّق بها.</w:t>
-      </w:r>
-    </w:p>
-    <w:p>
-      <w:pPr>
-        <w:pStyle w:val="ListParagraph"/>
-        <w:numPr>
-          <w:ilvl w:val="0"/>
-          <w:numId w:val="2"/>
-        </w:numPr>
-        <w:bidi/>
-        <w:spacing w:after="70" w:line="290"/>
-        <w:jc w:val="right"/>
-      </w:pPr>
-      <w:r>
-        <w:rPr>
-          <w:rFonts w:ascii="Arial" w:cs="Arial" w:eastAsia="Arial" w:hAnsi="Arial"/>
-          <w:color w:val="1E293B"/>
-          <w:sz w:val="21"/>
-          <w:szCs w:val="21"/>
-          <w:rtl/>
-        </w:rPr>
-        <w:t xml:space="preserve">حدّ خمس محاولات ثم قفل خمس دقائق — وهذا في الواجهة للتوثيق فقط، ومكانه الصحيح الخادم.</w:t>
-      </w:r>
-    </w:p>
-    <w:p>
-      <w:pPr>
-        <w:pStyle w:val="ListParagraph"/>
-        <w:numPr>
-          <w:ilvl w:val="0"/>
-          <w:numId w:val="2"/>
-        </w:numPr>
-        <w:bidi/>
-        <w:spacing w:after="70" w:line="290"/>
-        <w:jc w:val="right"/>
-      </w:pPr>
-      <w:r>
-        <w:rPr>
-          <w:rFonts w:ascii="Arial" w:cs="Arial" w:eastAsia="Arial" w:hAnsi="Arial"/>
-          <w:color w:val="1E293B"/>
-          <w:sz w:val="21"/>
-          <w:szCs w:val="21"/>
-          <w:rtl/>
-        </w:rPr>
-        <w:t xml:space="preserve">شاشة الإعداد في الإعدادات كانت تقبل أي ستة أرقام وتفعّل 2FA بناءً عليها. صارت تتحقق فعلياً، لأن التفعيل بعد مسح خاطئ للرمز يقفل صاحب الحساب خارج حسابه.</w:t>
-      </w:r>
-    </w:p>
-    <w:p>
-      <w:pPr>
-        <w:pStyle w:val="ListParagraph"/>
-        <w:numPr>
-          <w:ilvl w:val="0"/>
-          <w:numId w:val="2"/>
-        </w:numPr>
-        <w:bidi/>
-        <w:spacing w:after="70" w:line="290"/>
-        <w:jc w:val="right"/>
-      </w:pPr>
-      <w:r>
-        <w:rPr>
-          <w:rFonts w:ascii="Arial" w:cs="Arial" w:eastAsia="Arial" w:hAnsi="Arial"/>
-          <w:color w:val="1E293B"/>
-          <w:sz w:val="21"/>
-          <w:szCs w:val="21"/>
-          <w:rtl/>
-        </w:rPr>
-        <w:t xml:space="preserve">وُحّد المفتاح والرموز الاحتياطية بين شاشة الإعداد وشاشة الدخول في ملف واحد، فما يعرضه الـQR هو ما يُتحقّق منه.</w:t>
-      </w:r>
-    </w:p>
-    <w:p>
-      <w:pPr>
-        <w:pStyle w:val="ListParagraph"/>
-        <w:numPr>
-          <w:ilvl w:val="0"/>
-          <w:numId w:val="2"/>
-        </w:numPr>
-        <w:bidi/>
-        <w:spacing w:after="70" w:line="290"/>
-        <w:jc w:val="right"/>
-      </w:pPr>
-      <w:r>
-        <w:rPr>
-          <w:rFonts w:ascii="Arial" w:cs="Arial" w:eastAsia="Arial" w:hAnsi="Arial"/>
-          <w:color w:val="1E293B"/>
-          <w:sz w:val="21"/>
-          <w:szCs w:val="21"/>
-          <w:rtl/>
-        </w:rPr>
-        <w:t xml:space="preserve">حُذف الحقل المكرّر AppSettings.twoFactorEnabled — كان يُكتب عند التهيئة ولا يُقرأ في أي مكان، بينما الحقل الحيّ هو security.twoFactor. وجود علمين لنفس المعنى كان سيُظهر الميزة مفعّلة في شاشة ومطفأة في أخرى.</w:t>
-      </w:r>
-    </w:p>
-    <w:p>
-      <w:pPr>
-        <w:pStyle w:val="ListParagraph"/>
-        <w:numPr>
-          <w:ilvl w:val="0"/>
-          <w:numId w:val="2"/>
-        </w:numPr>
-        <w:bidi/>
-        <w:spacing w:after="70" w:line="290"/>
-        <w:jc w:val="right"/>
-      </w:pPr>
-      <w:r>
-        <w:rPr>
-          <w:rFonts w:ascii="Arial" w:cs="Arial" w:eastAsia="Arial" w:hAnsi="Arial"/>
-          <w:color w:val="1E293B"/>
-          <w:sz w:val="21"/>
-          <w:szCs w:val="21"/>
-          <w:rtl/>
-        </w:rPr>
-        <w:t xml:space="preserve">أخطأتُ في شرط الإرسال التلقائي: كتبت فحصاً يتضمّن includes('') وهو دائماً صحيح في جافاسكربت، فلم يكن الإرسال التلقائي يعمل إطلاقاً. كشفه اختبار المتصفح وأُصلح.</w:t>
-      </w:r>
-    </w:p>
-    <w:p>
-      <w:pPr>
-        <w:pStyle w:val="ListParagraph"/>
-        <w:numPr>
-          <w:ilvl w:val="0"/>
-          <w:numId w:val="2"/>
-        </w:numPr>
-        <w:bidi/>
-        <w:spacing w:after="70" w:line="290"/>
-        <w:jc w:val="right"/>
-      </w:pPr>
-      <w:r>
-        <w:rPr>
-          <w:rFonts w:ascii="Arial" w:cs="Arial" w:eastAsia="Arial" w:hAnsi="Arial"/>
-          <w:color w:val="1E293B"/>
-          <w:sz w:val="21"/>
-          <w:szCs w:val="21"/>
-          <w:rtl/>
-        </w:rPr>
-        <w:t xml:space="preserve">اختُبر التدفّق كاملاً في المتصفح: الدخول المباشر عند تعطيل 2FA، ظهور الشاشة عند تفعيلها، خلوّ التخزين قبل التحقق، رفض الرمز الخاطئ، قبول رمز TOTP صحيح، وقبول رمز احتياطي.</w:t>
+        <w:t xml:space="preserve">عوينت النتيجة في المتصفح: حفظ 91234567 مع ‎+968 خزّنه ‎+96891234567، وبعد إعادة التحميل رجع مقسوماً صحيحاً.</w:t>
       </w:r>
     </w:p>
     <w:p>
@@ -6072,7 +6071,7 @@
           <w:szCs w:val="24"/>
           <w:rtl/>
         </w:rPr>
-        <w:t xml:space="preserve">تعديل رقم 9 — رقم هاتف اختياري عند دعوة الموظف</w:t>
+        <w:t xml:space="preserve">تعديل رقم 10 — شاشة التحقق بخطوتين في تسجيل الدخول</w:t>
       </w:r>
     </w:p>
     <w:p>
@@ -6349,7 +6348,7 @@
                 <w:szCs w:val="19"/>
                 <w:rtl/>
               </w:rPr>
-              <w:t xml:space="preserve">فريق العمل</w:t>
+              <w:t xml:space="preserve">تسجيل الدخول</w:t>
             </w:r>
           </w:p>
         </w:tc>
@@ -6379,7 +6378,7 @@
                 <w:szCs w:val="19"/>
                 <w:rtl/>
               </w:rPr>
-              <w:t xml:space="preserve">/team</w:t>
+              <w:t xml:space="preserve">/login</w:t>
             </w:r>
           </w:p>
         </w:tc>
@@ -6409,7 +6408,7 @@
                 <w:szCs w:val="19"/>
                 <w:rtl/>
               </w:rPr>
-              <w:t xml:space="preserve">src/pages/Team.tsx · src/types/index.ts · src/store/useDataStore.ts</w:t>
+              <w:t xml:space="preserve">src/utils/twoFactor.ts · src/components/auth/TwoFactorChallenge.tsx · src/store/useAuthStore.ts · src/pages/Login.tsx</w:t>
             </w:r>
           </w:p>
         </w:tc>
@@ -6439,7 +6438,7 @@
                 <w:szCs w:val="19"/>
                 <w:rtl/>
               </w:rPr>
-              <w:t xml:space="preserve">a4d8398</w:t>
+              <w:t xml:space="preserve">743042c</w:t>
             </w:r>
           </w:p>
         </w:tc>
@@ -6500,7 +6499,7 @@
           <w:szCs w:val="21"/>
           <w:rtl/>
         </w:rPr>
-        <w:t xml:space="preserve">أُضيف حقل رقم الهاتف إلى نموذج دعوة الموظف وتعديله — لم يكن موجوداً من قبل أصلاً.</w:t>
+        <w:t xml:space="preserve">⚠️ هيكل واجهة لا أمان: التحقق يجري في المتصفح والمفتاح السري داخل حزمة الجافاسكربت، فيمكن تجاوزه. الغرض تجهيز الواجهة والعقد لحين وجود باكيند، وهذا مكتوب صراحةً في رأس ملف twoFactor.ts.</w:t>
       </w:r>
     </w:p>
     <w:p>
@@ -6522,7 +6521,7 @@
           <w:szCs w:val="21"/>
           <w:rtl/>
         </w:rPr>
-        <w:t xml:space="preserve">الحقل اختياري: يحمل وسم «(اختياري)» بنفس أسلوب حقل الأقسام، وبلا النجمة الحمراء التي تعلّم الاسم والبريد والدور. إرسال الدعوة بدونه يمرّ دون اعتراض.</w:t>
+        <w:t xml:space="preserve">كان الدخول يوثّق فوراً بعد كلمة المرور. صار مرحلتين: كلمة المرور تنتج حالة معلّقة في الذاكرة فقط، ولا يُكتب شيء في التخزين حتى يمرّ العامل الثاني — فإغلاق التبويب في منتصف العملية لا يترك جلسة مفتوحة.</w:t>
       </w:r>
     </w:p>
     <w:p>
@@ -6544,7 +6543,7 @@
           <w:szCs w:val="21"/>
           <w:rtl/>
         </w:rPr>
-        <w:t xml:space="preserve">استُخدم مكوّن PhoneField نفسه المستعمل في جهات الاتصال والتسجيل، فيأتي معه منتقي الدولة ورمز الاتصال بدل حقل نصّي حرّ.</w:t>
+        <w:t xml:space="preserve">شاشة التحقق تظهر داخل مسار الدخول نفسه لا على عنوان مستقل، لأن عنواناً مستقلاً يفتحه أي شخص دون المرور بالمرحلة الأولى.</w:t>
       </w:r>
     </w:p>
     <w:p>
@@ -6566,7 +6565,7 @@
           <w:szCs w:val="21"/>
           <w:rtl/>
         </w:rPr>
-        <w:t xml:space="preserve">الرقم لا يُخزَّن إلا إذا كُتب فعلاً، حتى لا يبقى رمز دولة معلّقاً بلا رقم في بيانات موظف تركه فارغاً.</w:t>
+        <w:t xml:space="preserve">نُفِّذت خوارزمية TOTP (المعيار RFC 6238) بـ Web Crypto، فأكواد Google Authenticator الحقيقية تُقبل فعلاً. تحقّقت من التنفيذ بمتجهات الاختبار الخمسة الواردة في المعيار نفسه وكلها طابقت.</w:t>
       </w:r>
     </w:p>
     <w:p>
@@ -6588,7 +6587,7 @@
           <w:szCs w:val="21"/>
           <w:rtl/>
         </w:rPr>
-        <w:t xml:space="preserve">عند فتح موظف للتعديل يُفصل الرقم المحفوظ إلى رمز دولة ورقم محلي بمطابقة أطول رمز مطابق من قائمة الدول — لا بتعبير نمطي جشع، لأن ذلك كان سيقرأ ‎+96891234567 على أنه ‎+9689 ثم يشوّه الرقم.</w:t>
+        <w:t xml:space="preserve">نافذة تسامح خطوة واحدة قبل وبعد لاستيعاب فروق ساعة الجهاز.</w:t>
       </w:r>
     </w:p>
     <w:p>
@@ -6610,7 +6609,7 @@
           <w:szCs w:val="21"/>
           <w:rtl/>
         </w:rPr>
-        <w:t xml:space="preserve">الرقم يظهر في لوحة تفاصيل الموظف حين يكون موجوداً، فلا تُجمع بيانات لا تُعرض في أي مكان.</w:t>
+        <w:t xml:space="preserve">ستة مربعات بانتقال تلقائي بين الخانات ودعم اللصق وإرسال تلقائي عند اكتمال الرمز.</w:t>
       </w:r>
     </w:p>
     <w:p>
@@ -6632,7 +6631,7 @@
           <w:szCs w:val="21"/>
           <w:rtl/>
         </w:rPr>
-        <w:t xml:space="preserve">وُسّع توقيع inviteAgent ليقبل الحقل الجديد.</w:t>
+        <w:t xml:space="preserve">لا يوجد زر «إعادة إرسال» — التطبيق يولّد الرمز على الجهاز ولا شيء يُرسَل. وُضع مكانه عدّاد يبيّن الثواني المتبقية قبل تغيّر الرمز، فلا ينتظر الموظف رسالة لن تصل.</w:t>
       </w:r>
     </w:p>
     <w:p>
@@ -6654,7 +6653,161 @@
           <w:szCs w:val="21"/>
           <w:rtl/>
         </w:rPr>
-        <w:t xml:space="preserve">عوينت النتيجة في المتصفح: الحقل ووسم الاختياري ظاهران، ودعوة موظف بلا رقم هاتف نجحت.</w:t>
+        <w:t xml:space="preserve">مسار الرموز الاحتياطية داخل الشاشة نفسها، لأن فاقد هاتفه بلا رمز احتياطي يُقفل خارج حسابه نهائياً.</w:t>
+      </w:r>
+    </w:p>
+    <w:p>
+      <w:pPr>
+        <w:pStyle w:val="ListParagraph"/>
+        <w:numPr>
+          <w:ilvl w:val="0"/>
+          <w:numId w:val="2"/>
+        </w:numPr>
+        <w:bidi/>
+        <w:spacing w:after="70" w:line="290"/>
+        <w:jc w:val="right"/>
+      </w:pPr>
+      <w:r>
+        <w:rPr>
+          <w:rFonts w:ascii="Arial" w:cs="Arial" w:eastAsia="Arial" w:hAnsi="Arial"/>
+          <w:color w:val="1E293B"/>
+          <w:sz w:val="21"/>
+          <w:szCs w:val="21"/>
+          <w:rtl/>
+        </w:rPr>
+        <w:t xml:space="preserve">رسالة الخطأ واحدة للرمز الخاطئ وللمنتهي عمداً، حتى لا تُعطي المهاجم معلومة يفرّق بها.</w:t>
+      </w:r>
+    </w:p>
+    <w:p>
+      <w:pPr>
+        <w:pStyle w:val="ListParagraph"/>
+        <w:numPr>
+          <w:ilvl w:val="0"/>
+          <w:numId w:val="2"/>
+        </w:numPr>
+        <w:bidi/>
+        <w:spacing w:after="70" w:line="290"/>
+        <w:jc w:val="right"/>
+      </w:pPr>
+      <w:r>
+        <w:rPr>
+          <w:rFonts w:ascii="Arial" w:cs="Arial" w:eastAsia="Arial" w:hAnsi="Arial"/>
+          <w:color w:val="1E293B"/>
+          <w:sz w:val="21"/>
+          <w:szCs w:val="21"/>
+          <w:rtl/>
+        </w:rPr>
+        <w:t xml:space="preserve">حدّ خمس محاولات ثم قفل خمس دقائق — وهذا في الواجهة للتوثيق فقط، ومكانه الصحيح الخادم.</w:t>
+      </w:r>
+    </w:p>
+    <w:p>
+      <w:pPr>
+        <w:pStyle w:val="ListParagraph"/>
+        <w:numPr>
+          <w:ilvl w:val="0"/>
+          <w:numId w:val="2"/>
+        </w:numPr>
+        <w:bidi/>
+        <w:spacing w:after="70" w:line="290"/>
+        <w:jc w:val="right"/>
+      </w:pPr>
+      <w:r>
+        <w:rPr>
+          <w:rFonts w:ascii="Arial" w:cs="Arial" w:eastAsia="Arial" w:hAnsi="Arial"/>
+          <w:color w:val="1E293B"/>
+          <w:sz w:val="21"/>
+          <w:szCs w:val="21"/>
+          <w:rtl/>
+        </w:rPr>
+        <w:t xml:space="preserve">شاشة الإعداد في الإعدادات كانت تقبل أي ستة أرقام وتفعّل 2FA بناءً عليها. صارت تتحقق فعلياً، لأن التفعيل بعد مسح خاطئ للرمز يقفل صاحب الحساب خارج حسابه.</w:t>
+      </w:r>
+    </w:p>
+    <w:p>
+      <w:pPr>
+        <w:pStyle w:val="ListParagraph"/>
+        <w:numPr>
+          <w:ilvl w:val="0"/>
+          <w:numId w:val="2"/>
+        </w:numPr>
+        <w:bidi/>
+        <w:spacing w:after="70" w:line="290"/>
+        <w:jc w:val="right"/>
+      </w:pPr>
+      <w:r>
+        <w:rPr>
+          <w:rFonts w:ascii="Arial" w:cs="Arial" w:eastAsia="Arial" w:hAnsi="Arial"/>
+          <w:color w:val="1E293B"/>
+          <w:sz w:val="21"/>
+          <w:szCs w:val="21"/>
+          <w:rtl/>
+        </w:rPr>
+        <w:t xml:space="preserve">وُحّد المفتاح والرموز الاحتياطية بين شاشة الإعداد وشاشة الدخول في ملف واحد، فما يعرضه الـQR هو ما يُتحقّق منه.</w:t>
+      </w:r>
+    </w:p>
+    <w:p>
+      <w:pPr>
+        <w:pStyle w:val="ListParagraph"/>
+        <w:numPr>
+          <w:ilvl w:val="0"/>
+          <w:numId w:val="2"/>
+        </w:numPr>
+        <w:bidi/>
+        <w:spacing w:after="70" w:line="290"/>
+        <w:jc w:val="right"/>
+      </w:pPr>
+      <w:r>
+        <w:rPr>
+          <w:rFonts w:ascii="Arial" w:cs="Arial" w:eastAsia="Arial" w:hAnsi="Arial"/>
+          <w:color w:val="1E293B"/>
+          <w:sz w:val="21"/>
+          <w:szCs w:val="21"/>
+          <w:rtl/>
+        </w:rPr>
+        <w:t xml:space="preserve">حُذف الحقل المكرّر AppSettings.twoFactorEnabled — كان يُكتب عند التهيئة ولا يُقرأ في أي مكان، بينما الحقل الحيّ هو security.twoFactor. وجود علمين لنفس المعنى كان سيُظهر الميزة مفعّلة في شاشة ومطفأة في أخرى.</w:t>
+      </w:r>
+    </w:p>
+    <w:p>
+      <w:pPr>
+        <w:pStyle w:val="ListParagraph"/>
+        <w:numPr>
+          <w:ilvl w:val="0"/>
+          <w:numId w:val="2"/>
+        </w:numPr>
+        <w:bidi/>
+        <w:spacing w:after="70" w:line="290"/>
+        <w:jc w:val="right"/>
+      </w:pPr>
+      <w:r>
+        <w:rPr>
+          <w:rFonts w:ascii="Arial" w:cs="Arial" w:eastAsia="Arial" w:hAnsi="Arial"/>
+          <w:color w:val="1E293B"/>
+          <w:sz w:val="21"/>
+          <w:szCs w:val="21"/>
+          <w:rtl/>
+        </w:rPr>
+        <w:t xml:space="preserve">أخطأتُ في شرط الإرسال التلقائي: كتبت فحصاً يتضمّن includes('') وهو دائماً صحيح في جافاسكربت، فلم يكن الإرسال التلقائي يعمل إطلاقاً. كشفه اختبار المتصفح وأُصلح.</w:t>
+      </w:r>
+    </w:p>
+    <w:p>
+      <w:pPr>
+        <w:pStyle w:val="ListParagraph"/>
+        <w:numPr>
+          <w:ilvl w:val="0"/>
+          <w:numId w:val="2"/>
+        </w:numPr>
+        <w:bidi/>
+        <w:spacing w:after="70" w:line="290"/>
+        <w:jc w:val="right"/>
+      </w:pPr>
+      <w:r>
+        <w:rPr>
+          <w:rFonts w:ascii="Arial" w:cs="Arial" w:eastAsia="Arial" w:hAnsi="Arial"/>
+          <w:color w:val="1E293B"/>
+          <w:sz w:val="21"/>
+          <w:szCs w:val="21"/>
+          <w:rtl/>
+        </w:rPr>
+        <w:t xml:space="preserve">اختُبر التدفّق كاملاً في المتصفح: الدخول المباشر عند تعطيل 2FA، ظهور الشاشة عند تفعيلها، خلوّ التخزين قبل التحقق، رفض الرمز الخاطئ، قبول رمز TOTP صحيح، وقبول رمز احتياطي.</w:t>
       </w:r>
     </w:p>
     <w:p>
@@ -6679,7 +6832,7 @@
           <w:szCs w:val="24"/>
           <w:rtl/>
         </w:rPr>
-        <w:t xml:space="preserve">تعديل رقم 8 — فاصل مرقّم بين دورات المحادثة داخل الثريد</w:t>
+        <w:t xml:space="preserve">تعديل رقم 9 — رقم هاتف اختياري عند دعوة الموظف</w:t>
       </w:r>
     </w:p>
     <w:p>
@@ -6956,7 +7109,7 @@
                 <w:szCs w:val="19"/>
                 <w:rtl/>
               </w:rPr>
-              <w:t xml:space="preserve">صندوق الوارد</w:t>
+              <w:t xml:space="preserve">فريق العمل</w:t>
             </w:r>
           </w:p>
         </w:tc>
@@ -6986,7 +7139,7 @@
                 <w:szCs w:val="19"/>
                 <w:rtl/>
               </w:rPr>
-              <w:t xml:space="preserve">/inbox</w:t>
+              <w:t xml:space="preserve">/team</w:t>
             </w:r>
           </w:p>
         </w:tc>
@@ -7016,7 +7169,7 @@
                 <w:szCs w:val="19"/>
                 <w:rtl/>
               </w:rPr>
-              <w:t xml:space="preserve">src/pages/Inbox.tsx</w:t>
+              <w:t xml:space="preserve">src/pages/Team.tsx · src/types/index.ts · src/store/useDataStore.ts</w:t>
             </w:r>
           </w:p>
         </w:tc>
@@ -7046,7 +7199,7 @@
                 <w:szCs w:val="19"/>
                 <w:rtl/>
               </w:rPr>
-              <w:t xml:space="preserve">f9b43fd</w:t>
+              <w:t xml:space="preserve">a4d8398</w:t>
             </w:r>
           </w:p>
         </w:tc>
@@ -7107,7 +7260,7 @@
           <w:szCs w:val="21"/>
           <w:rtl/>
         </w:rPr>
-        <w:t xml:space="preserve">كل دورة جديدة صار يسبقها فاصل أفقي ظاهر داخل الثريد، فيُعرف أين انتهت دورة وبدأت التي تليها من غير رجوع إلى شريط الفهرسة.</w:t>
+        <w:t xml:space="preserve">أُضيف حقل رقم الهاتف إلى نموذج دعوة الموظف وتعديله — لم يكن موجوداً من قبل أصلاً.</w:t>
       </w:r>
     </w:p>
     <w:p>
@@ -7129,7 +7282,7 @@
           <w:szCs w:val="21"/>
           <w:rtl/>
         </w:rPr>
-        <w:t xml:space="preserve">الفاصل يحمل رقم الدورة وكلمة «إعادة فتح» والتاريخ، فيجيب عن ثلاثة أسئلة في سطر: أي دورة، وماذا جرى، ومتى.</w:t>
+        <w:t xml:space="preserve">الحقل اختياري: يحمل وسم «(اختياري)» بنفس أسلوب حقل الأقسام، وبلا النجمة الحمراء التي تعلّم الاسم والبريد والدور. إرسال الدعوة بدونه يمرّ دون اعتراض.</w:t>
       </w:r>
     </w:p>
     <w:p>
@@ -7151,7 +7304,7 @@
           <w:szCs w:val="21"/>
           <w:rtl/>
         </w:rPr>
-        <w:t xml:space="preserve">صيغته بلون العلامة التجارية بخطّين وشارة بارزة، لأن المطلوب أن يُلاحَظ لا أن يمرّ مرور الكرام.</w:t>
+        <w:t xml:space="preserve">استُخدم مكوّن PhoneField نفسه المستعمل في جهات الاتصال والتسجيل، فيأتي معه منتقي الدولة ورمز الاتصال بدل حقل نصّي حرّ.</w:t>
       </w:r>
     </w:p>
     <w:p>
@@ -7173,7 +7326,7 @@
           <w:szCs w:val="21"/>
           <w:rtl/>
         </w:rPr>
-        <w:t xml:space="preserve">الفاصل يحلّ محلّ شريحة التاريخ العادية في ذلك الموضع لأنه يحمل التاريخ أصلاً، فلا يجتمع فاصلان متتاليان.</w:t>
+        <w:t xml:space="preserve">الرقم لا يُخزَّن إلا إذا كُتب فعلاً، حتى لا يبقى رمز دولة معلّقاً بلا رقم في بيانات موظف تركه فارغاً.</w:t>
       </w:r>
     </w:p>
     <w:p>
@@ -7195,7 +7348,7 @@
           <w:szCs w:val="21"/>
           <w:rtl/>
         </w:rPr>
-        <w:t xml:space="preserve">لا يظهر قبل الدورة الأولى لأنها بداية المحادثة لا إعادة فتح لها.</w:t>
+        <w:t xml:space="preserve">عند فتح موظف للتعديل يُفصل الرقم المحفوظ إلى رمز دولة ورقم محلي بمطابقة أطول رمز مطابق من قائمة الدول — لا بتعبير نمطي جشع، لأن ذلك كان سيقرأ ‎+96891234567 على أنه ‎+9689 ثم يشوّه الرقم.</w:t>
       </w:r>
     </w:p>
     <w:p>
@@ -7217,7 +7370,7 @@
           <w:szCs w:val="21"/>
           <w:rtl/>
         </w:rPr>
-        <w:t xml:space="preserve">الدورة ذات البداية المستنتجة تُوسم «(تقديري)» في الفاصل نفسه، اتساقاً مع العلامة المتقطّعة في شريط الفهرسة.</w:t>
+        <w:t xml:space="preserve">الرقم يظهر في لوحة تفاصيل الموظف حين يكون موجوداً، فلا تُجمع بيانات لا تُعرض في أي مكان.</w:t>
       </w:r>
     </w:p>
     <w:p>
@@ -7239,7 +7392,7 @@
           <w:szCs w:val="21"/>
           <w:rtl/>
         </w:rPr>
-        <w:t xml:space="preserve">الترقيم يتبع رقم الدورة (الدورة 2، الدورة 3) لا رقم إعادة الفتح، ليطابق ما يعرضه شريط الفهرسة وحقل sessionCount ولا يتضارب معهما.</w:t>
+        <w:t xml:space="preserve">وُسّع توقيع inviteAgent ليقبل الحقل الجديد.</w:t>
       </w:r>
     </w:p>
     <w:p>
@@ -7261,7 +7414,7 @@
           <w:szCs w:val="21"/>
           <w:rtl/>
         </w:rPr>
-        <w:t xml:space="preserve">عوينت النتيجة في المتصفح: فاصلان بالرقمين الصحيحين، وشريحة التاريخ المكرّرة اختفت من موضعيهما.</w:t>
+        <w:t xml:space="preserve">عوينت النتيجة في المتصفح: الحقل ووسم الاختياري ظاهران، ودعوة موظف بلا رقم هاتف نجحت.</w:t>
       </w:r>
     </w:p>
     <w:p>
@@ -7286,7 +7439,7 @@
           <w:szCs w:val="24"/>
           <w:rtl/>
         </w:rPr>
-        <w:t xml:space="preserve">تعديل رقم 7 — انعكاس حالة «مجدولة» للتخفيض المؤجّل في بورتال العميل</w:t>
+        <w:t xml:space="preserve">تعديل رقم 8 — فاصل مرقّم بين دورات المحادثة داخل الثريد</w:t>
       </w:r>
     </w:p>
     <w:p>
@@ -7563,7 +7716,7 @@
                 <w:szCs w:val="19"/>
                 <w:rtl/>
               </w:rPr>
-              <w:t xml:space="preserve">الباقات والاشتراك</w:t>
+              <w:t xml:space="preserve">صندوق الوارد</w:t>
             </w:r>
           </w:p>
         </w:tc>
@@ -7593,7 +7746,7 @@
                 <w:szCs w:val="19"/>
                 <w:rtl/>
               </w:rPr>
-              <w:t xml:space="preserve">/billing</w:t>
+              <w:t xml:space="preserve">/inbox</w:t>
             </w:r>
           </w:p>
         </w:tc>
@@ -7623,7 +7776,7 @@
                 <w:szCs w:val="19"/>
                 <w:rtl/>
               </w:rPr>
-              <w:t xml:space="preserve">src/types/index.ts · src/pages/Billing.tsx · src/store/adminMockData.ts</w:t>
+              <w:t xml:space="preserve">src/pages/Inbox.tsx</w:t>
             </w:r>
           </w:p>
         </w:tc>
@@ -7653,7 +7806,7 @@
                 <w:szCs w:val="19"/>
                 <w:rtl/>
               </w:rPr>
-              <w:t xml:space="preserve">5202dba</w:t>
+              <w:t xml:space="preserve">f9b43fd</w:t>
             </w:r>
           </w:p>
         </w:tc>
@@ -7714,7 +7867,7 @@
           <w:szCs w:val="21"/>
           <w:rtl/>
         </w:rPr>
-        <w:t xml:space="preserve">الاشتراك الذي عليه تخفيض مؤجّل إلى تاريخ لاحق صارت حالته «مجدولة» ظاهرة للعميل، لا في بورتال الإدارة وحده.</w:t>
+        <w:t xml:space="preserve">كل دورة جديدة صار يسبقها فاصل أفقي ظاهر داخل الثريد، فيُعرف أين انتهت دورة وبدأت التي تليها من غير رجوع إلى شريط الفهرسة.</w:t>
       </w:r>
     </w:p>
     <w:p>
@@ -7736,7 +7889,7 @@
           <w:szCs w:val="21"/>
           <w:rtl/>
         </w:rPr>
-        <w:t xml:space="preserve">أُضيف الحقل scheduledChange إلى الاشتراك ويحمل الباقة المستهدفة ودورة الفوترة وتاريخ السريان، وأُضيفت «مجدولة» إلى حالات الفاتورة.</w:t>
+        <w:t xml:space="preserve">الفاصل يحمل رقم الدورة وكلمة «إعادة فتح» والتاريخ، فيجيب عن ثلاثة أسئلة في سطر: أي دورة، وماذا جرى، ومتى.</w:t>
       </w:r>
     </w:p>
     <w:p>
@@ -7758,7 +7911,7 @@
           <w:szCs w:val="21"/>
           <w:rtl/>
         </w:rPr>
-        <w:t xml:space="preserve">بطاقة الاشتراك تعرض شارة «مجدولة» وجملة صريحة تذكر اسم الباقة المستهدفة وتاريخ التحويل، وتؤكّد أن الباقة الحالية ومزاياها مستمرة حتى ذلك التاريخ — فلا يظن العميل أن باقته انخفضت الآن.</w:t>
+        <w:t xml:space="preserve">صيغته بلون العلامة التجارية بخطّين وشارة بارزة، لأن المطلوب أن يُلاحَظ لا أن يمرّ مرور الكرام.</w:t>
       </w:r>
     </w:p>
     <w:p>
@@ -7780,7 +7933,7 @@
           <w:szCs w:val="21"/>
           <w:rtl/>
         </w:rPr>
-        <w:t xml:space="preserve">جدول الفواتير وفلاترها ونافذة معاينة الفاتورة تعرض الحالة نفسها.</w:t>
+        <w:t xml:space="preserve">الفاصل يحلّ محلّ شريحة التاريخ العادية في ذلك الموضع لأنه يحمل التاريخ أصلاً، فلا يجتمع فاصلان متتاليان.</w:t>
       </w:r>
     </w:p>
     <w:p>
@@ -7802,7 +7955,7 @@
           <w:szCs w:val="21"/>
           <w:rtl/>
         </w:rPr>
-        <w:t xml:space="preserve">الحالة مشتقّة من الاشتراك لا مخزّنة على الفاتورة: إلغاء الجدولة يُزيلها من كل المواضع في آن واحد، بدل أن تبقى فاتورة تحمل حالة قديمة.</w:t>
+        <w:t xml:space="preserve">لا يظهر قبل الدورة الأولى لأنها بداية المحادثة لا إعادة فتح لها.</w:t>
       </w:r>
     </w:p>
     <w:p>
@@ -7824,7 +7977,7 @@
           <w:szCs w:val="21"/>
           <w:rtl/>
         </w:rPr>
-        <w:t xml:space="preserve">قرار مقصود: الاشتقاق يطال الفواتير غير المسدّدة فقط (معلّقة ومسودة). الفاتورة المدفوعة أو المستردة أو الملغاة أو الفاشلة تحتفظ بحالتها، وكذلك المتأخرة لأن التأخّر مشكلة سداد لا يصح حجبها خلف حالة الجدولة.</w:t>
+        <w:t xml:space="preserve">الدورة ذات البداية المستنتجة تُوسم «(تقديري)» في الفاصل نفسه، اتساقاً مع العلامة المتقطّعة في شريط الفهرسة.</w:t>
       </w:r>
     </w:p>
     <w:p>
@@ -7846,7 +7999,7 @@
           <w:szCs w:val="21"/>
           <w:rtl/>
         </w:rPr>
-        <w:t xml:space="preserve">زر «إلغاء الجدولة» إجراء إداري بحسب المواصفة، فبورتال العميل يعرض الحالة دون التحكم فيها.</w:t>
+        <w:t xml:space="preserve">الترقيم يتبع رقم الدورة (الدورة 2، الدورة 3) لا رقم إعادة الفتح، ليطابق ما يعرضه شريط الفهرسة وحقل sessionCount ولا يتضارب معهما.</w:t>
       </w:r>
     </w:p>
     <w:p>
@@ -7868,29 +8021,7 @@
           <w:szCs w:val="21"/>
           <w:rtl/>
         </w:rPr>
-        <w:t xml:space="preserve">أُضيفت جدولة تجريبية لعميل العرض (تحويل من الأعمال إلى الاحترافي بعد 15 يوماً) لتصير الحالة قابلة للمعاينة.</w:t>
-      </w:r>
-    </w:p>
-    <w:p>
-      <w:pPr>
-        <w:pStyle w:val="ListParagraph"/>
-        <w:numPr>
-          <w:ilvl w:val="0"/>
-          <w:numId w:val="2"/>
-        </w:numPr>
-        <w:bidi/>
-        <w:spacing w:after="70" w:line="290"/>
-        <w:jc w:val="right"/>
-      </w:pPr>
-      <w:r>
-        <w:rPr>
-          <w:rFonts w:ascii="Arial" w:cs="Arial" w:eastAsia="Arial" w:hAnsi="Arial"/>
-          <w:color w:val="1E293B"/>
-          <w:sz w:val="21"/>
-          <w:szCs w:val="21"/>
-          <w:rtl/>
-        </w:rPr>
-        <w:t xml:space="preserve">عوينت النتيجة في المتصفح: الشارة والجملة والفلتر وحالتا الفاتورتين غير المسدّدتين ظهرت، والفاتورتان المدفوعتان بقيتا «مدفوعة».</w:t>
+        <w:t xml:space="preserve">عوينت النتيجة في المتصفح: فاصلان بالرقمين الصحيحين، وشريحة التاريخ المكرّرة اختفت من موضعيهما.</w:t>
       </w:r>
     </w:p>
     <w:p>
@@ -7915,7 +8046,7 @@
           <w:szCs w:val="24"/>
           <w:rtl/>
         </w:rPr>
-        <w:t xml:space="preserve">تعديل رقم 6 — إعادة تصميم شريط الفهرسة على هيئة مسطرة تظهر عند الاقتراب</w:t>
+        <w:t xml:space="preserve">تعديل رقم 7 — انعكاس حالة «مجدولة» للتخفيض المؤجّل في بورتال العميل</w:t>
       </w:r>
     </w:p>
     <w:p>
@@ -8192,7 +8323,7 @@
                 <w:szCs w:val="19"/>
                 <w:rtl/>
               </w:rPr>
-              <w:t xml:space="preserve">صندوق الوارد</w:t>
+              <w:t xml:space="preserve">الباقات والاشتراك</w:t>
             </w:r>
           </w:p>
         </w:tc>
@@ -8222,7 +8353,7 @@
                 <w:szCs w:val="19"/>
                 <w:rtl/>
               </w:rPr>
-              <w:t xml:space="preserve">/inbox</w:t>
+              <w:t xml:space="preserve">/billing</w:t>
             </w:r>
           </w:p>
         </w:tc>
@@ -8252,7 +8383,7 @@
                 <w:szCs w:val="19"/>
                 <w:rtl/>
               </w:rPr>
-              <w:t xml:space="preserve">src/components/inbox/SessionRail.tsx · src/pages/Inbox.tsx</w:t>
+              <w:t xml:space="preserve">src/types/index.ts · src/pages/Billing.tsx · src/store/adminMockData.ts</w:t>
             </w:r>
           </w:p>
         </w:tc>
@@ -8282,7 +8413,7 @@
                 <w:szCs w:val="19"/>
                 <w:rtl/>
               </w:rPr>
-              <w:t xml:space="preserve">4163939</w:t>
+              <w:t xml:space="preserve">5202dba</w:t>
             </w:r>
           </w:p>
         </w:tc>
@@ -8343,7 +8474,7 @@
           <w:szCs w:val="21"/>
           <w:rtl/>
         </w:rPr>
-        <w:t xml:space="preserve">الشكل السابق كان كتلاً سميكة بينها فجوات، فكان يُقرأ كشريط تقدّم مكسور لا كأداة تنقّل. صار الآن مسطرة: خطّ شعري على حافة الثريد وعليه علامات رفيعة عند بدايات الدورات.</w:t>
+        <w:t xml:space="preserve">الاشتراك الذي عليه تخفيض مؤجّل إلى تاريخ لاحق صارت حالته «مجدولة» ظاهرة للعميل، لا في بورتال الإدارة وحده.</w:t>
       </w:r>
     </w:p>
     <w:p>
@@ -8365,7 +8496,7 @@
           <w:szCs w:val="21"/>
           <w:rtl/>
         </w:rPr>
-        <w:t xml:space="preserve">العلامات مجمّعة في منتصف ارتفاع الحافة كمجموعة واحدة مرتّبة، لا موزّعة على كامل الطول.</w:t>
+        <w:t xml:space="preserve">أُضيف الحقل scheduledChange إلى الاشتراك ويحمل الباقة المستهدفة ودورة الفوترة وتاريخ السريان، وأُضيفت «مجدولة» إلى حالات الفاتورة.</w:t>
       </w:r>
     </w:p>
     <w:p>
@@ -8387,7 +8518,7 @@
           <w:szCs w:val="21"/>
           <w:rtl/>
         </w:rPr>
-        <w:t xml:space="preserve">جُرّب توزيعها على مواضعها النسبية من ارتفاع التمرير أولاً، ثم استُبدل بالتجميع في المنتصف بقرار من الإدارة: الشكل المرتّب فُضّل على دلالة الموضع. أُزيل معه كود القياس ومراقب تغيّر الحجم لأنه لم يعد له عمل.</w:t>
+        <w:t xml:space="preserve">بطاقة الاشتراك تعرض شارة «مجدولة» وجملة صريحة تذكر اسم الباقة المستهدفة وتاريخ التحويل، وتؤكّد أن الباقة الحالية ومزاياها مستمرة حتى ذلك التاريخ — فلا يظن العميل أن باقته انخفضت الآن.</w:t>
       </w:r>
     </w:p>
     <w:p>
@@ -8409,7 +8540,7 @@
           <w:szCs w:val="21"/>
           <w:rtl/>
         </w:rPr>
-        <w:t xml:space="preserve">المسطرة باهتة في الوضع العادي وتتوضّح بالكامل عند اقتراب المؤشر من الحافة أو عند وصول لوحة المفاتيح إليها.</w:t>
+        <w:t xml:space="preserve">جدول الفواتير وفلاترها ونافذة معاينة الفاتورة تعرض الحالة نفسها.</w:t>
       </w:r>
     </w:p>
     <w:p>
@@ -8431,7 +8562,7 @@
           <w:szCs w:val="21"/>
           <w:rtl/>
         </w:rPr>
-        <w:t xml:space="preserve">أُبقي أثر خافت دائم بدل الإخفاء التام: ميزة لا يدل عليها شيء لا يعرفها أحد، والإخفاء الكامل كان سيجعلها غير قابلة للاكتشاف.</w:t>
+        <w:t xml:space="preserve">الحالة مشتقّة من الاشتراك لا مخزّنة على الفاتورة: إلغاء الجدولة يُزيلها من كل المواضع في آن واحد، بدل أن تبقى فاتورة تحمل حالة قديمة.</w:t>
       </w:r>
     </w:p>
     <w:p>
@@ -8453,7 +8584,7 @@
           <w:szCs w:val="21"/>
           <w:rtl/>
         </w:rPr>
-        <w:t xml:space="preserve">صارت طبقة عائمة (overlay) بدل عمود يحجز عرضاً ثابتاً، فرجع نحو 36 بكسل لمساحة الرسائل.</w:t>
+        <w:t xml:space="preserve">قرار مقصود: الاشتقاق يطال الفواتير غير المسدّدة فقط (معلّقة ومسودة). الفاتورة المدفوعة أو المستردة أو الملغاة أو الفاشلة تحتفظ بحالتها، وكذلك المتأخرة لأن التأخّر مشكلة سداد لا يصح حجبها خلف حالة الجدولة.</w:t>
       </w:r>
     </w:p>
     <w:p>
@@ -8475,7 +8606,7 @@
           <w:szCs w:val="21"/>
           <w:rtl/>
         </w:rPr>
-        <w:t xml:space="preserve">وُضعت بعد شريط التمرير بمقدار 8 بكسل حتى لا تحجب سحبه.</w:t>
+        <w:t xml:space="preserve">زر «إلغاء الجدولة» إجراء إداري بحسب المواصفة، فبورتال العميل يعرض الحالة دون التحكم فيها.</w:t>
       </w:r>
     </w:p>
     <w:p>
@@ -8497,7 +8628,7 @@
           <w:szCs w:val="21"/>
           <w:rtl/>
         </w:rPr>
-        <w:t xml:space="preserve">التمييز بين المؤكَّد والمقدَّر بقي قائماً بصرياً: علامة متصلة للدورة المسجّلة، ومتقطّعة للمستنتَجة، مع بقاء «بداية تقديرية» في التلميح.</w:t>
+        <w:t xml:space="preserve">أُضيفت جدولة تجريبية لعميل العرض (تحويل من الأعمال إلى الاحترافي بعد 15 يوماً) لتصير الحالة قابلة للمعاينة.</w:t>
       </w:r>
     </w:p>
     <w:p>
@@ -8519,51 +8650,7 @@
           <w:szCs w:val="21"/>
           <w:rtl/>
         </w:rPr>
-        <w:t xml:space="preserve">تنازل مقصود: الشكل السابق كان يعبّر عن حجم كل دورة بارتفاعها، والمسطرة لا تفعل. حجم الدورة انتقل إلى التلميح.</w:t>
-      </w:r>
-    </w:p>
-    <w:p>
-      <w:pPr>
-        <w:pStyle w:val="ListParagraph"/>
-        <w:numPr>
-          <w:ilvl w:val="0"/>
-          <w:numId w:val="2"/>
-        </w:numPr>
-        <w:bidi/>
-        <w:spacing w:after="70" w:line="290"/>
-        <w:jc w:val="right"/>
-      </w:pPr>
-      <w:r>
-        <w:rPr>
-          <w:rFonts w:ascii="Arial" w:cs="Arial" w:eastAsia="Arial" w:hAnsi="Arial"/>
-          <w:color w:val="1E293B"/>
-          <w:sz w:val="21"/>
-          <w:szCs w:val="21"/>
-          <w:rtl/>
-        </w:rPr>
-        <w:t xml:space="preserve">مجموعة العلامات تقبل التمرير داخلها إن كثرت الدورات حتى لا تتجاوز ارتفاع اللوحة. ولأن ذلك يقصّ التلميح، رُفع التلميح خارج المجموعة ويُحاذى رأسياً بالعلامة المؤشَّر عليها بالقياس.</w:t>
-      </w:r>
-    </w:p>
-    <w:p>
-      <w:pPr>
-        <w:pStyle w:val="ListParagraph"/>
-        <w:numPr>
-          <w:ilvl w:val="0"/>
-          <w:numId w:val="2"/>
-        </w:numPr>
-        <w:bidi/>
-        <w:spacing w:after="70" w:line="290"/>
-        <w:jc w:val="right"/>
-      </w:pPr>
-      <w:r>
-        <w:rPr>
-          <w:rFonts w:ascii="Arial" w:cs="Arial" w:eastAsia="Arial" w:hAnsi="Arial"/>
-          <w:color w:val="1E293B"/>
-          <w:sz w:val="21"/>
-          <w:szCs w:val="21"/>
-          <w:rtl/>
-        </w:rPr>
-        <w:t xml:space="preserve">عوينت النتيجة في المتصفح: العلامات الثلاث متجمّعة في المنتصف، والتوضّح بالاقتراب والتلميح والانتقال تعمل.</w:t>
+        <w:t xml:space="preserve">عوينت النتيجة في المتصفح: الشارة والجملة والفلتر وحالتا الفاتورتين غير المسدّدتين ظهرت، والفاتورتان المدفوعتان بقيتا «مدفوعة».</w:t>
       </w:r>
     </w:p>
     <w:p>
@@ -8588,7 +8675,7 @@
           <w:szCs w:val="24"/>
           <w:rtl/>
         </w:rPr>
-        <w:t xml:space="preserve">تعديل رقم 5 — شريط فهرسة دورات المحادثة داخل الثريد</w:t>
+        <w:t xml:space="preserve">تعديل رقم 6 — إعادة تصميم شريط الفهرسة على هيئة مسطرة تظهر عند الاقتراب</w:t>
       </w:r>
     </w:p>
     <w:p>
@@ -8925,7 +9012,7 @@
                 <w:szCs w:val="19"/>
                 <w:rtl/>
               </w:rPr>
-              <w:t xml:space="preserve">src/components/inbox/SessionRail.tsx · src/pages/Inbox.tsx · src/store/mockData.ts</w:t>
+              <w:t xml:space="preserve">src/components/inbox/SessionRail.tsx · src/pages/Inbox.tsx</w:t>
             </w:r>
           </w:p>
         </w:tc>
@@ -8955,7 +9042,7 @@
                 <w:szCs w:val="19"/>
                 <w:rtl/>
               </w:rPr>
-              <w:t xml:space="preserve">e05e715</w:t>
+              <w:t xml:space="preserve">4163939</w:t>
             </w:r>
           </w:p>
         </w:tc>
@@ -9016,7 +9103,7 @@
           <w:szCs w:val="21"/>
           <w:rtl/>
         </w:rPr>
-        <w:t xml:space="preserve">شريط رأسي على حافة الثريد يقسّمه إلى دورات فتح وإغلاق، ليصل الموظف إلى بداية أي دورة في المحادثات الطويلة التي تُعاد فتحها مراراً.</w:t>
+        <w:t xml:space="preserve">الشكل السابق كان كتلاً سميكة بينها فجوات، فكان يُقرأ كشريط تقدّم مكسور لا كأداة تنقّل. صار الآن مسطرة: خطّ شعري على حافة الثريد وعليه علامات رفيعة عند بدايات الدورات.</w:t>
       </w:r>
     </w:p>
     <w:p>
@@ -9038,7 +9125,7 @@
           <w:szCs w:val="21"/>
           <w:rtl/>
         </w:rPr>
-        <w:t xml:space="preserve">ارتفاع كل مقطع يتناسب مع عدد رسائله، فيعطي إحساساً بحجم كل دورة قبل الدخول إليها.</w:t>
+        <w:t xml:space="preserve">العلامات مجمّعة في منتصف ارتفاع الحافة كمجموعة واحدة مرتّبة، لا موزّعة على كامل الطول.</w:t>
       </w:r>
     </w:p>
     <w:p>
@@ -9060,7 +9147,7 @@
           <w:szCs w:val="21"/>
           <w:rtl/>
         </w:rPr>
-        <w:t xml:space="preserve">المرور على المقطع يُظهر اليوم والتاريخ وعدد الرسائل — «اليوم» و«أمس» لما قرُب، واسم اليوم لما بعُد.</w:t>
+        <w:t xml:space="preserve">جُرّب توزيعها على مواضعها النسبية من ارتفاع التمرير أولاً، ثم استُبدل بالتجميع في المنتصف بقرار من الإدارة: الشكل المرتّب فُضّل على دلالة الموضع. أُزيل معه كود القياس ومراقب تغيّر الحجم لأنه لم يعد له عمل.</w:t>
       </w:r>
     </w:p>
     <w:p>
@@ -9082,7 +9169,7 @@
           <w:szCs w:val="21"/>
           <w:rtl/>
         </w:rPr>
-        <w:t xml:space="preserve">الضغط ينقل إلى أول رسالة في الدورة، والمقطع الذي يقابل موضع القراءة الحالي يُبرَز تلقائياً أثناء التمرير.</w:t>
+        <w:t xml:space="preserve">المسطرة باهتة في الوضع العادي وتتوضّح بالكامل عند اقتراب المؤشر من الحافة أو عند وصول لوحة المفاتيح إليها.</w:t>
       </w:r>
     </w:p>
     <w:p>
@@ -9104,7 +9191,7 @@
           <w:szCs w:val="21"/>
           <w:rtl/>
         </w:rPr>
-        <w:t xml:space="preserve">المقاطع ذات البداية المستنتجة تُعرض بحدّ متقطّع ويذكر التلميح «بداية تقديرية»، فيبقى الفرق بين المؤكَّد والمقدَّر ظاهراً للموظف لا مخفياً عنه.</w:t>
+        <w:t xml:space="preserve">أُبقي أثر خافت دائم بدل الإخفاء التام: ميزة لا يدل عليها شيء لا يعرفها أحد، والإخفاء الكامل كان سيجعلها غير قابلة للاكتشاف.</w:t>
       </w:r>
     </w:p>
     <w:p>
@@ -9126,7 +9213,7 @@
           <w:szCs w:val="21"/>
           <w:rtl/>
         </w:rPr>
-        <w:t xml:space="preserve">الشريط يختفي كلياً حين تكون المحادثة دورة واحدة، فلا معنى لفهرس لا يفهرس شيئاً.</w:t>
+        <w:t xml:space="preserve">صارت طبقة عائمة (overlay) بدل عمود يحجز عرضاً ثابتاً، فرجع نحو 36 بكسل لمساحة الرسائل.</w:t>
       </w:r>
     </w:p>
     <w:p>
@@ -9148,7 +9235,7 @@
           <w:szCs w:val="21"/>
           <w:rtl/>
         </w:rPr>
-        <w:t xml:space="preserve">الدورات الخالية من الرسائل مستبعدة من الشريط بقرار مقصود — لا شيء يمكن الانتقال إليه فيها.</w:t>
+        <w:t xml:space="preserve">وُضعت بعد شريط التمرير بمقدار 8 بكسل حتى لا تحجب سحبه.</w:t>
       </w:r>
     </w:p>
     <w:p>
@@ -9170,7 +9257,7 @@
           <w:szCs w:val="21"/>
           <w:rtl/>
         </w:rPr>
-        <w:t xml:space="preserve">وُزّعت رسائل محادثة أحمد الشعيلي التجريبية على ثلاث دورات عبر ثلاثة أشهر لتصير الميزة قابلة للمعاينة، وصار sessionCount فيها مطابقاً للواقع بعد أن كان رقماً مكتوباً بلا سند. آخر دورة مسجّلة بحدث حقيقي وما قبلها مستنتج، ليظهر الشكلان معاً.</w:t>
+        <w:t xml:space="preserve">التمييز بين المؤكَّد والمقدَّر بقي قائماً بصرياً: علامة متصلة للدورة المسجّلة، ومتقطّعة للمستنتَجة، مع بقاء «بداية تقديرية» في التلميح.</w:t>
       </w:r>
     </w:p>
     <w:p>
@@ -9192,7 +9279,51 @@
           <w:szCs w:val="21"/>
           <w:rtl/>
         </w:rPr>
-        <w:t xml:space="preserve">عوينت النتيجة في المتصفح: الشريط والتلميح والانتقال والإبراز تعمل في الوضعين الفاتح والليلي، والمحادثات أحادية الدورة سليمة بلا شريط.</w:t>
+        <w:t xml:space="preserve">تنازل مقصود: الشكل السابق كان يعبّر عن حجم كل دورة بارتفاعها، والمسطرة لا تفعل. حجم الدورة انتقل إلى التلميح.</w:t>
+      </w:r>
+    </w:p>
+    <w:p>
+      <w:pPr>
+        <w:pStyle w:val="ListParagraph"/>
+        <w:numPr>
+          <w:ilvl w:val="0"/>
+          <w:numId w:val="2"/>
+        </w:numPr>
+        <w:bidi/>
+        <w:spacing w:after="70" w:line="290"/>
+        <w:jc w:val="right"/>
+      </w:pPr>
+      <w:r>
+        <w:rPr>
+          <w:rFonts w:ascii="Arial" w:cs="Arial" w:eastAsia="Arial" w:hAnsi="Arial"/>
+          <w:color w:val="1E293B"/>
+          <w:sz w:val="21"/>
+          <w:szCs w:val="21"/>
+          <w:rtl/>
+        </w:rPr>
+        <w:t xml:space="preserve">مجموعة العلامات تقبل التمرير داخلها إن كثرت الدورات حتى لا تتجاوز ارتفاع اللوحة. ولأن ذلك يقصّ التلميح، رُفع التلميح خارج المجموعة ويُحاذى رأسياً بالعلامة المؤشَّر عليها بالقياس.</w:t>
+      </w:r>
+    </w:p>
+    <w:p>
+      <w:pPr>
+        <w:pStyle w:val="ListParagraph"/>
+        <w:numPr>
+          <w:ilvl w:val="0"/>
+          <w:numId w:val="2"/>
+        </w:numPr>
+        <w:bidi/>
+        <w:spacing w:after="70" w:line="290"/>
+        <w:jc w:val="right"/>
+      </w:pPr>
+      <w:r>
+        <w:rPr>
+          <w:rFonts w:ascii="Arial" w:cs="Arial" w:eastAsia="Arial" w:hAnsi="Arial"/>
+          <w:color w:val="1E293B"/>
+          <w:sz w:val="21"/>
+          <w:szCs w:val="21"/>
+          <w:rtl/>
+        </w:rPr>
+        <w:t xml:space="preserve">عوينت النتيجة في المتصفح: العلامات الثلاث متجمّعة في المنتصف، والتوضّح بالاقتراب والتلميح والانتقال تعمل.</w:t>
       </w:r>
     </w:p>
     <w:p>
@@ -9217,7 +9348,7 @@
           <w:szCs w:val="24"/>
           <w:rtl/>
         </w:rPr>
-        <w:t xml:space="preserve">تعديل رقم 4 — تسجيل دورات المحادثة واشتقاقها — أساس شريط فهرسة الثريد</w:t>
+        <w:t xml:space="preserve">تعديل رقم 5 — شريط فهرسة دورات المحادثة داخل الثريد</w:t>
       </w:r>
     </w:p>
     <w:p>
@@ -9494,7 +9625,7 @@
                 <w:szCs w:val="19"/>
                 <w:rtl/>
               </w:rPr>
-              <w:t xml:space="preserve">صندوق الوارد (طبقة البيانات)</w:t>
+              <w:t xml:space="preserve">صندوق الوارد</w:t>
             </w:r>
           </w:p>
         </w:tc>
@@ -9554,7 +9685,7 @@
                 <w:szCs w:val="19"/>
                 <w:rtl/>
               </w:rPr>
-              <w:t xml:space="preserve">src/utils/sessions.ts · src/store/useDataStore.ts · src/types/index.ts</w:t>
+              <w:t xml:space="preserve">src/components/inbox/SessionRail.tsx · src/pages/Inbox.tsx · src/store/mockData.ts</w:t>
             </w:r>
           </w:p>
         </w:tc>
@@ -9584,7 +9715,7 @@
                 <w:szCs w:val="19"/>
                 <w:rtl/>
               </w:rPr>
-              <w:t xml:space="preserve">5cf29e1</w:t>
+              <w:t xml:space="preserve">e05e715</w:t>
             </w:r>
           </w:p>
         </w:tc>
@@ -9645,7 +9776,7 @@
           <w:szCs w:val="21"/>
           <w:rtl/>
         </w:rPr>
-        <w:t xml:space="preserve">المشكلة: المحادثة الواحدة تُعاد فتحها كلما راسل العميل بعد الإغلاق، فيصير الثريد بلا نهاية. ولرسم شريط فهرسة يقسّمه إلى دورات، لزم معرفة توقيت كل فتح وإغلاق — وهي بيانات لم تكن تُسجَّل إطلاقاً.</w:t>
+        <w:t xml:space="preserve">شريط رأسي على حافة الثريد يقسّمه إلى دورات فتح وإغلاق، ليصل الموظف إلى بداية أي دورة في المحادثات الطويلة التي تُعاد فتحها مراراً.</w:t>
       </w:r>
     </w:p>
     <w:p>
@@ -9667,7 +9798,7 @@
           <w:szCs w:val="21"/>
           <w:rtl/>
         </w:rPr>
-        <w:t xml:space="preserve">كان الحقل sessionCount يُكتب مرة واحدة عند الإنشاء ولا يزيده أي سطر في المشروع، وقيمه في البيانات التجريبية مكتوبة يدوياً. كذلك activityLog على المحادثة كان مُعرَّفاً في الأنواع لكن لا دالة تكتب فيه وقت التشغيل.</w:t>
+        <w:t xml:space="preserve">ارتفاع كل مقطع يتناسب مع عدد رسائله، فيعطي إحساساً بحجم كل دورة قبل الدخول إليها.</w:t>
       </w:r>
     </w:p>
     <w:p>
@@ -9689,7 +9820,7 @@
           <w:szCs w:val="21"/>
           <w:rtl/>
         </w:rPr>
-        <w:t xml:space="preserve">أُضيف النوع SessionEvent لتسجيل حدث فتح أو إغلاق بتوقيته وصاحبه، والنوع ConversationSession يمثّل الدورة المشتقّة.</w:t>
+        <w:t xml:space="preserve">المرور على المقطع يُظهر اليوم والتاريخ وعدد الرسائل — «اليوم» و«أمس» لما قرُب، واسم اليوم لما بعُد.</w:t>
       </w:r>
     </w:p>
     <w:p>
@@ -9711,7 +9842,7 @@
           <w:szCs w:val="21"/>
           <w:rtl/>
         </w:rPr>
-        <w:t xml:space="preserve">صارت أربعة مواضع تسجّل الحدث فعلياً: setConversationStatus عند الإغلاق أو إعادة الفتح، reopenConversation، ورسالة العميل الواردة نصية أو صوتية حين تُحيي محادثة مغلقة — وهذا آخرها كان يمرّ بلا أي أثر رغم أنه أكثرها تكراراً.</w:t>
+        <w:t xml:space="preserve">الضغط ينقل إلى أول رسالة في الدورة، والمقطع الذي يقابل موضع القراءة الحالي يُبرَز تلقائياً أثناء التمرير.</w:t>
       </w:r>
     </w:p>
     <w:p>
@@ -9733,7 +9864,7 @@
           <w:szCs w:val="21"/>
           <w:rtl/>
         </w:rPr>
-        <w:t xml:space="preserve">أُضيفت الدالة deriveSessions التي تقسّم الثريد إلى دورات: الأحداث المسجّلة مرجع قاطع، وما سبقها من تاريخ قديم تُستنتج حدوده من فجوات الصمت (24 ساعة افتراضاً) وتُعلَّم inferred حتى يظل الفرق بين المؤكَّد والمقدَّر ظاهراً.</w:t>
+        <w:t xml:space="preserve">المقاطع ذات البداية المستنتجة تُعرض بحدّ متقطّع ويذكر التلميح «بداية تقديرية»، فيبقى الفرق بين المؤكَّد والمقدَّر ظاهراً للموظف لا مخفياً عنه.</w:t>
       </w:r>
     </w:p>
     <w:p>
@@ -9755,7 +9886,7 @@
           <w:szCs w:val="21"/>
           <w:rtl/>
         </w:rPr>
-        <w:t xml:space="preserve">الدالة تتعامل مع الحالة المختلطة: ثريد فيه تاريخ قديم مُستنتج ودورات جديدة مسجّلة في آن واحد.</w:t>
+        <w:t xml:space="preserve">الشريط يختفي كلياً حين تكون المحادثة دورة واحدة، فلا معنى لفهرس لا يفهرس شيئاً.</w:t>
       </w:r>
     </w:p>
     <w:p>
@@ -9777,7 +9908,7 @@
           <w:szCs w:val="21"/>
           <w:rtl/>
         </w:rPr>
-        <w:t xml:space="preserve">اختُبر المنطق على ثماني حالات شملت الثريد الفارغ والرسالة الواحدة والفجوات المتعددة والأحداث المسجّلة والحالة المختلطة والمدخلات غير المرتّبة زمنياً — جميعها نجحت.</w:t>
+        <w:t xml:space="preserve">الدورات الخالية من الرسائل مستبعدة من الشريط بقرار مقصود — لا شيء يمكن الانتقال إليه فيها.</w:t>
       </w:r>
     </w:p>
     <w:p>
@@ -9799,7 +9930,7 @@
           <w:szCs w:val="21"/>
           <w:rtl/>
         </w:rPr>
-        <w:t xml:space="preserve">ملاحظة على البيانات الحالية: كل المحادثات التجريبية تُنتج دورة واحدة لأن رسائلها متقاربة بدقائق ولا فجوات فيها. الشريط لن يُظهر تقسيماً حقيقياً قبل توفّر بيانات متباعدة زمنياً.</w:t>
+        <w:t xml:space="preserve">وُزّعت رسائل محادثة أحمد الشعيلي التجريبية على ثلاث دورات عبر ثلاثة أشهر لتصير الميزة قابلة للمعاينة، وصار sessionCount فيها مطابقاً للواقع بعد أن كان رقماً مكتوباً بلا سند. آخر دورة مسجّلة بحدث حقيقي وما قبلها مستنتج، ليظهر الشكلان معاً.</w:t>
       </w:r>
     </w:p>
     <w:p>
@@ -9821,7 +9952,7 @@
           <w:szCs w:val="21"/>
           <w:rtl/>
         </w:rPr>
-        <w:t xml:space="preserve">لم تُبنَ واجهة الشريط بعد — هذا التعديل يغطّي طبقة البيانات وحدها.</w:t>
+        <w:t xml:space="preserve">عوينت النتيجة في المتصفح: الشريط والتلميح والانتقال والإبراز تعمل في الوضعين الفاتح والليلي، والمحادثات أحادية الدورة سليمة بلا شريط.</w:t>
       </w:r>
     </w:p>
     <w:p>
@@ -9846,7 +9977,7 @@
           <w:szCs w:val="24"/>
           <w:rtl/>
         </w:rPr>
-        <w:t xml:space="preserve">تعديل رقم 3 — إزالة كارت نسبة الاستجابة من صفحة تقييمات العملاء</w:t>
+        <w:t xml:space="preserve">تعديل رقم 4 — تسجيل دورات المحادثة واشتقاقها — أساس شريط فهرسة الثريد</w:t>
       </w:r>
     </w:p>
     <w:p>
@@ -10123,7 +10254,7 @@
                 <w:szCs w:val="19"/>
                 <w:rtl/>
               </w:rPr>
-              <w:t xml:space="preserve">تقييمات العملاء</w:t>
+              <w:t xml:space="preserve">صندوق الوارد (طبقة البيانات)</w:t>
             </w:r>
           </w:p>
         </w:tc>
@@ -10153,7 +10284,7 @@
                 <w:szCs w:val="19"/>
                 <w:rtl/>
               </w:rPr>
-              <w:t xml:space="preserve">/rating</w:t>
+              <w:t xml:space="preserve">/inbox</w:t>
             </w:r>
           </w:p>
         </w:tc>
@@ -10183,7 +10314,7 @@
                 <w:szCs w:val="19"/>
                 <w:rtl/>
               </w:rPr>
-              <w:t xml:space="preserve">src/pages/CustomerRatings.tsx</w:t>
+              <w:t xml:space="preserve">src/utils/sessions.ts · src/store/useDataStore.ts · src/types/index.ts</w:t>
             </w:r>
           </w:p>
         </w:tc>
@@ -10213,7 +10344,7 @@
                 <w:szCs w:val="19"/>
                 <w:rtl/>
               </w:rPr>
-              <w:t xml:space="preserve">cc8bd4f</w:t>
+              <w:t xml:space="preserve">5cf29e1</w:t>
             </w:r>
           </w:p>
         </w:tc>
@@ -10274,7 +10405,7 @@
           <w:szCs w:val="21"/>
           <w:rtl/>
         </w:rPr>
-        <w:t xml:space="preserve">حُذف كارت «نسبة الاستجابة» بالكامل من شريط الإحصائيات — صارت 3 كروت بدل 4.</w:t>
+        <w:t xml:space="preserve">المشكلة: المحادثة الواحدة تُعاد فتحها كلما راسل العميل بعد الإغلاق، فيصير الثريد بلا نهاية. ولرسم شريط فهرسة يقسّمه إلى دورات، لزم معرفة توقيت كل فتح وإغلاق — وهي بيانات لم تكن تُسجَّل إطلاقاً.</w:t>
       </w:r>
     </w:p>
     <w:p>
@@ -10296,7 +10427,7 @@
           <w:szCs w:val="21"/>
           <w:rtl/>
         </w:rPr>
-        <w:t xml:space="preserve">حُذف معه حساب responseRate لأنه لم يعد له مستهلك في الصفحة.</w:t>
+        <w:t xml:space="preserve">كان الحقل sessionCount يُكتب مرة واحدة عند الإنشاء ولا يزيده أي سطر في المشروع، وقيمه في البيانات التجريبية مكتوبة يدوياً. كذلك activityLog على المحادثة كان مُعرَّفاً في الأنواع لكن لا دالة تكتب فيه وقت التشغيل.</w:t>
       </w:r>
     </w:p>
     <w:p>
@@ -10318,7 +10449,7 @@
           <w:szCs w:val="21"/>
           <w:rtl/>
         </w:rPr>
-        <w:t xml:space="preserve">حُذف استيراد أيقونة TrendingUp لأنها كانت مستخدمة في هذا الكارت وحده.</w:t>
+        <w:t xml:space="preserve">أُضيف النوع SessionEvent لتسجيل حدث فتح أو إغلاق بتوقيته وصاحبه، والنوع ConversationSession يمثّل الدورة المشتقّة.</w:t>
       </w:r>
     </w:p>
     <w:p>
@@ -10340,7 +10471,7 @@
           <w:szCs w:val="21"/>
           <w:rtl/>
         </w:rPr>
-        <w:t xml:space="preserve">عُدّلت شبكة العرض من grid-cols-2 lg:grid-cols-4 إلى grid-cols-1 sm:grid-cols-3، حتى لا يبقى كارت يتيم في سطر منفصل على الشاشات الصغيرة.</w:t>
+        <w:t xml:space="preserve">صارت أربعة مواضع تسجّل الحدث فعلياً: setConversationStatus عند الإغلاق أو إعادة الفتح، reopenConversation، ورسالة العميل الواردة نصية أو صوتية حين تُحيي محادثة مغلقة — وهذا آخرها كان يمرّ بلا أي أثر رغم أنه أكثرها تكراراً.</w:t>
       </w:r>
     </w:p>
     <w:p>
@@ -10362,7 +10493,95 @@
           <w:szCs w:val="21"/>
           <w:rtl/>
         </w:rPr>
-        <w:t xml:space="preserve">الكروت الباقية: متوسط تقييم المحادثة، متوسط تقييم الموظفين، إجمالي الروابط.</w:t>
+        <w:t xml:space="preserve">أُضيفت الدالة deriveSessions التي تقسّم الثريد إلى دورات: الأحداث المسجّلة مرجع قاطع، وما سبقها من تاريخ قديم تُستنتج حدوده من فجوات الصمت (24 ساعة افتراضاً) وتُعلَّم inferred حتى يظل الفرق بين المؤكَّد والمقدَّر ظاهراً.</w:t>
+      </w:r>
+    </w:p>
+    <w:p>
+      <w:pPr>
+        <w:pStyle w:val="ListParagraph"/>
+        <w:numPr>
+          <w:ilvl w:val="0"/>
+          <w:numId w:val="2"/>
+        </w:numPr>
+        <w:bidi/>
+        <w:spacing w:after="70" w:line="290"/>
+        <w:jc w:val="right"/>
+      </w:pPr>
+      <w:r>
+        <w:rPr>
+          <w:rFonts w:ascii="Arial" w:cs="Arial" w:eastAsia="Arial" w:hAnsi="Arial"/>
+          <w:color w:val="1E293B"/>
+          <w:sz w:val="21"/>
+          <w:szCs w:val="21"/>
+          <w:rtl/>
+        </w:rPr>
+        <w:t xml:space="preserve">الدالة تتعامل مع الحالة المختلطة: ثريد فيه تاريخ قديم مُستنتج ودورات جديدة مسجّلة في آن واحد.</w:t>
+      </w:r>
+    </w:p>
+    <w:p>
+      <w:pPr>
+        <w:pStyle w:val="ListParagraph"/>
+        <w:numPr>
+          <w:ilvl w:val="0"/>
+          <w:numId w:val="2"/>
+        </w:numPr>
+        <w:bidi/>
+        <w:spacing w:after="70" w:line="290"/>
+        <w:jc w:val="right"/>
+      </w:pPr>
+      <w:r>
+        <w:rPr>
+          <w:rFonts w:ascii="Arial" w:cs="Arial" w:eastAsia="Arial" w:hAnsi="Arial"/>
+          <w:color w:val="1E293B"/>
+          <w:sz w:val="21"/>
+          <w:szCs w:val="21"/>
+          <w:rtl/>
+        </w:rPr>
+        <w:t xml:space="preserve">اختُبر المنطق على ثماني حالات شملت الثريد الفارغ والرسالة الواحدة والفجوات المتعددة والأحداث المسجّلة والحالة المختلطة والمدخلات غير المرتّبة زمنياً — جميعها نجحت.</w:t>
+      </w:r>
+    </w:p>
+    <w:p>
+      <w:pPr>
+        <w:pStyle w:val="ListParagraph"/>
+        <w:numPr>
+          <w:ilvl w:val="0"/>
+          <w:numId w:val="2"/>
+        </w:numPr>
+        <w:bidi/>
+        <w:spacing w:after="70" w:line="290"/>
+        <w:jc w:val="right"/>
+      </w:pPr>
+      <w:r>
+        <w:rPr>
+          <w:rFonts w:ascii="Arial" w:cs="Arial" w:eastAsia="Arial" w:hAnsi="Arial"/>
+          <w:color w:val="1E293B"/>
+          <w:sz w:val="21"/>
+          <w:szCs w:val="21"/>
+          <w:rtl/>
+        </w:rPr>
+        <w:t xml:space="preserve">ملاحظة على البيانات الحالية: كل المحادثات التجريبية تُنتج دورة واحدة لأن رسائلها متقاربة بدقائق ولا فجوات فيها. الشريط لن يُظهر تقسيماً حقيقياً قبل توفّر بيانات متباعدة زمنياً.</w:t>
+      </w:r>
+    </w:p>
+    <w:p>
+      <w:pPr>
+        <w:pStyle w:val="ListParagraph"/>
+        <w:numPr>
+          <w:ilvl w:val="0"/>
+          <w:numId w:val="2"/>
+        </w:numPr>
+        <w:bidi/>
+        <w:spacing w:after="70" w:line="290"/>
+        <w:jc w:val="right"/>
+      </w:pPr>
+      <w:r>
+        <w:rPr>
+          <w:rFonts w:ascii="Arial" w:cs="Arial" w:eastAsia="Arial" w:hAnsi="Arial"/>
+          <w:color w:val="1E293B"/>
+          <w:sz w:val="21"/>
+          <w:szCs w:val="21"/>
+          <w:rtl/>
+        </w:rPr>
+        <w:t xml:space="preserve">لم تُبنَ واجهة الشريط بعد — هذا التعديل يغطّي طبقة البيانات وحدها.</w:t>
       </w:r>
     </w:p>
     <w:p>
@@ -10387,7 +10606,7 @@
           <w:szCs w:val="24"/>
           <w:rtl/>
         </w:rPr>
-        <w:t xml:space="preserve">تعديل رقم 2 — تغيير تسمية زر الترقية في صفحة الفوترة</w:t>
+        <w:t xml:space="preserve">تعديل رقم 3 — إزالة كارت نسبة الاستجابة من صفحة تقييمات العملاء</w:t>
       </w:r>
     </w:p>
     <w:p>
@@ -10634,7 +10853,7 @@
                 <w:szCs w:val="19"/>
                 <w:rtl/>
               </w:rPr>
-              <w:t xml:space="preserve">9 سبتمبر 2026</w:t>
+              <w:t xml:space="preserve">10 سبتمبر 2026</w:t>
             </w:r>
           </w:p>
         </w:tc>
@@ -10664,7 +10883,7 @@
                 <w:szCs w:val="19"/>
                 <w:rtl/>
               </w:rPr>
-              <w:t xml:space="preserve">الفوترة</w:t>
+              <w:t xml:space="preserve">تقييمات العملاء</w:t>
             </w:r>
           </w:p>
         </w:tc>
@@ -10694,7 +10913,7 @@
                 <w:szCs w:val="19"/>
                 <w:rtl/>
               </w:rPr>
-              <w:t xml:space="preserve">/billing</w:t>
+              <w:t xml:space="preserve">/rating</w:t>
             </w:r>
           </w:p>
         </w:tc>
@@ -10724,7 +10943,7 @@
                 <w:szCs w:val="19"/>
                 <w:rtl/>
               </w:rPr>
-              <w:t xml:space="preserve">src/pages/Billing.tsx</w:t>
+              <w:t xml:space="preserve">src/pages/CustomerRatings.tsx</w:t>
             </w:r>
           </w:p>
         </w:tc>
@@ -10754,7 +10973,7 @@
                 <w:szCs w:val="19"/>
                 <w:rtl/>
               </w:rPr>
-              <w:t xml:space="preserve">be5b3c0</w:t>
+              <w:t xml:space="preserve">cc8bd4f</w:t>
             </w:r>
           </w:p>
         </w:tc>
@@ -10815,7 +11034,7 @@
           <w:szCs w:val="21"/>
           <w:rtl/>
         </w:rPr>
-        <w:t xml:space="preserve">زر «ترقية» أصبح «تغيير الباقة».</w:t>
+        <w:t xml:space="preserve">حُذف كارت «نسبة الاستجابة» بالكامل من شريط الإحصائيات — صارت 3 كروت بدل 4.</w:t>
       </w:r>
     </w:p>
     <w:p>
@@ -10837,7 +11056,73 @@
           <w:szCs w:val="21"/>
           <w:rtl/>
         </w:rPr>
-        <w:t xml:space="preserve">سبب التغيير: الزر يوصّل إلى مسار يشمل الترقية والتخفيض معاً، فالتسمية القديمة كانت تصف نصف وظيفته.</w:t>
+        <w:t xml:space="preserve">حُذف معه حساب responseRate لأنه لم يعد له مستهلك في الصفحة.</w:t>
+      </w:r>
+    </w:p>
+    <w:p>
+      <w:pPr>
+        <w:pStyle w:val="ListParagraph"/>
+        <w:numPr>
+          <w:ilvl w:val="0"/>
+          <w:numId w:val="2"/>
+        </w:numPr>
+        <w:bidi/>
+        <w:spacing w:after="70" w:line="290"/>
+        <w:jc w:val="right"/>
+      </w:pPr>
+      <w:r>
+        <w:rPr>
+          <w:rFonts w:ascii="Arial" w:cs="Arial" w:eastAsia="Arial" w:hAnsi="Arial"/>
+          <w:color w:val="1E293B"/>
+          <w:sz w:val="21"/>
+          <w:szCs w:val="21"/>
+          <w:rtl/>
+        </w:rPr>
+        <w:t xml:space="preserve">حُذف استيراد أيقونة TrendingUp لأنها كانت مستخدمة في هذا الكارت وحده.</w:t>
+      </w:r>
+    </w:p>
+    <w:p>
+      <w:pPr>
+        <w:pStyle w:val="ListParagraph"/>
+        <w:numPr>
+          <w:ilvl w:val="0"/>
+          <w:numId w:val="2"/>
+        </w:numPr>
+        <w:bidi/>
+        <w:spacing w:after="70" w:line="290"/>
+        <w:jc w:val="right"/>
+      </w:pPr>
+      <w:r>
+        <w:rPr>
+          <w:rFonts w:ascii="Arial" w:cs="Arial" w:eastAsia="Arial" w:hAnsi="Arial"/>
+          <w:color w:val="1E293B"/>
+          <w:sz w:val="21"/>
+          <w:szCs w:val="21"/>
+          <w:rtl/>
+        </w:rPr>
+        <w:t xml:space="preserve">عُدّلت شبكة العرض من grid-cols-2 lg:grid-cols-4 إلى grid-cols-1 sm:grid-cols-3، حتى لا يبقى كارت يتيم في سطر منفصل على الشاشات الصغيرة.</w:t>
+      </w:r>
+    </w:p>
+    <w:p>
+      <w:pPr>
+        <w:pStyle w:val="ListParagraph"/>
+        <w:numPr>
+          <w:ilvl w:val="0"/>
+          <w:numId w:val="2"/>
+        </w:numPr>
+        <w:bidi/>
+        <w:spacing w:after="70" w:line="290"/>
+        <w:jc w:val="right"/>
+      </w:pPr>
+      <w:r>
+        <w:rPr>
+          <w:rFonts w:ascii="Arial" w:cs="Arial" w:eastAsia="Arial" w:hAnsi="Arial"/>
+          <w:color w:val="1E293B"/>
+          <w:sz w:val="21"/>
+          <w:szCs w:val="21"/>
+          <w:rtl/>
+        </w:rPr>
+        <w:t xml:space="preserve">الكروت الباقية: متوسط تقييم المحادثة، متوسط تقييم الموظفين، إجمالي الروابط.</w:t>
       </w:r>
     </w:p>
     <w:p>
@@ -10862,7 +11147,7 @@
           <w:szCs w:val="24"/>
           <w:rtl/>
         </w:rPr>
-        <w:t xml:space="preserve">تعديل رقم 1 — ميزة تغيير الباقة — US-131</w:t>
+        <w:t xml:space="preserve">تعديل رقم 2 — تغيير تسمية زر الترقية في صفحة الفوترة</w:t>
       </w:r>
     </w:p>
     <w:p>
@@ -11139,7 +11424,7 @@
                 <w:szCs w:val="19"/>
                 <w:rtl/>
               </w:rPr>
-              <w:t xml:space="preserve">الاشتراك</w:t>
+              <w:t xml:space="preserve">الفوترة</w:t>
             </w:r>
           </w:p>
         </w:tc>
@@ -11169,7 +11454,7 @@
                 <w:szCs w:val="19"/>
                 <w:rtl/>
               </w:rPr>
-              <w:t xml:space="preserve">/subscribe</w:t>
+              <w:t xml:space="preserve">/billing</w:t>
             </w:r>
           </w:p>
         </w:tc>
@@ -11199,7 +11484,7 @@
                 <w:szCs w:val="19"/>
                 <w:rtl/>
               </w:rPr>
-              <w:t xml:space="preserve">src/pages/Subscribe.tsx</w:t>
+              <w:t xml:space="preserve">src/pages/Billing.tsx</w:t>
             </w:r>
           </w:p>
         </w:tc>
@@ -11229,7 +11514,7 @@
                 <w:szCs w:val="19"/>
                 <w:rtl/>
               </w:rPr>
-              <w:t xml:space="preserve">be5b3c0 · c49b797</w:t>
+              <w:t xml:space="preserve">be5b3c0</w:t>
             </w:r>
           </w:p>
         </w:tc>
@@ -11290,7 +11575,7 @@
           <w:szCs w:val="21"/>
           <w:rtl/>
         </w:rPr>
-        <w:t xml:space="preserve">إعادة بناء شبه كاملة للصفحة — 715 سطراً متغيّراً.</w:t>
+        <w:t xml:space="preserve">زر «ترقية» أصبح «تغيير الباقة».</w:t>
       </w:r>
     </w:p>
     <w:p>
@@ -11312,8 +11597,439 @@
           <w:szCs w:val="21"/>
           <w:rtl/>
         </w:rPr>
-        <w:t xml:space="preserve">اختيار الباقة صار بشريط تمرير (slider) حسب عدد المحادثات الشهرية بدل شبكة الكروت. كل باقة نقطة توقف على الشريط، وباقة المؤسسات هي النقطة الأخيرة بعنوان «غير محدود».</w:t>
-      </w:r>
+        <w:t xml:space="preserve">سبب التغيير: الزر يوصّل إلى مسار يشمل الترقية والتخفيض معاً، فالتسمية القديمة كانت تصف نصف وظيفته.</w:t>
+      </w:r>
+    </w:p>
+    <w:p>
+      <w:pPr>
+        <w:spacing w:after="160"/>
+      </w:pPr>
+    </w:p>
+    <w:p>
+      <w:pPr>
+        <w:pStyle w:val="Heading2"/>
+        <w:bidi/>
+        <w:spacing w:after="120" w:before="300"/>
+        <w:jc w:val="right"/>
+      </w:pPr>
+      <w:r>
+        <w:rPr>
+          <w:rFonts w:ascii="Arial" w:cs="Arial" w:eastAsia="Arial" w:hAnsi="Arial"/>
+          <w:b/>
+          <w:bCs/>
+          <w:color w:val="1E293B"/>
+          <w:sz w:val="24"/>
+          <w:szCs w:val="24"/>
+          <w:rtl/>
+        </w:rPr>
+        <w:t xml:space="preserve">تعديل رقم 1 — ميزة تغيير الباقة — US-131</w:t>
+      </w:r>
+    </w:p>
+    <w:p>
+      <w:pPr>
+        <w:spacing w:after="50"/>
+      </w:pPr>
+    </w:p>
+    <w:tbl>
+      <w:tblPr>
+        <w:bidiVisual/>
+        <w:tblW w:type="dxa" w:w="9000"/>
+        <w:tblBorders>
+          <w:top w:val="single" w:color="CBD5E1" w:sz="4"/>
+          <w:left w:val="single" w:color="CBD5E1" w:sz="4"/>
+          <w:bottom w:val="single" w:color="CBD5E1" w:sz="4"/>
+          <w:right w:val="single" w:color="CBD5E1" w:sz="4"/>
+          <w:insideH w:val="single" w:color="CBD5E1" w:sz="4"/>
+          <w:insideV w:val="single" w:color="CBD5E1" w:sz="4"/>
+        </w:tblBorders>
+      </w:tblPr>
+      <w:tblGrid>
+        <w:gridCol w:w="1250"/>
+        <w:gridCol w:w="1250"/>
+        <w:gridCol w:w="1150"/>
+        <w:gridCol w:w="2500"/>
+        <w:gridCol w:w="1350"/>
+        <w:gridCol w:w="1500"/>
+      </w:tblGrid>
+      <w:tr>
+        <w:trPr>
+          <w:tblHeader/>
+        </w:trPr>
+        <w:tc>
+          <w:tcPr>
+            <w:tcW w:type="dxa" w:w="1250"/>
+            <w:shd w:fill="2563EB" w:color="auto" w:val="clear"/>
+            <w:tcMar>
+              <w:top w:type="dxa" w:w="90"/>
+              <w:left w:type="dxa" w:w="110"/>
+              <w:bottom w:type="dxa" w:w="90"/>
+              <w:right w:type="dxa" w:w="110"/>
+            </w:tcMar>
+          </w:tcPr>
+          <w:p>
+            <w:pPr>
+              <w:bidi/>
+              <w:spacing w:after="0" w:line="280"/>
+              <w:jc w:val="right"/>
+            </w:pPr>
+            <w:r>
+              <w:rPr>
+                <w:rFonts w:ascii="Arial" w:cs="Arial" w:eastAsia="Arial" w:hAnsi="Arial"/>
+                <w:b/>
+                <w:bCs/>
+                <w:color w:val="FFFFFF"/>
+                <w:sz w:val="19"/>
+                <w:szCs w:val="19"/>
+                <w:rtl/>
+              </w:rPr>
+              <w:t xml:space="preserve">التاريخ</w:t>
+            </w:r>
+          </w:p>
+        </w:tc>
+        <w:tc>
+          <w:tcPr>
+            <w:tcW w:type="dxa" w:w="1250"/>
+            <w:shd w:fill="2563EB" w:color="auto" w:val="clear"/>
+            <w:tcMar>
+              <w:top w:type="dxa" w:w="90"/>
+              <w:left w:type="dxa" w:w="110"/>
+              <w:bottom w:type="dxa" w:w="90"/>
+              <w:right w:type="dxa" w:w="110"/>
+            </w:tcMar>
+          </w:tcPr>
+          <w:p>
+            <w:pPr>
+              <w:bidi/>
+              <w:spacing w:after="0" w:line="280"/>
+              <w:jc w:val="right"/>
+            </w:pPr>
+            <w:r>
+              <w:rPr>
+                <w:rFonts w:ascii="Arial" w:cs="Arial" w:eastAsia="Arial" w:hAnsi="Arial"/>
+                <w:b/>
+                <w:bCs/>
+                <w:color w:val="FFFFFF"/>
+                <w:sz w:val="19"/>
+                <w:szCs w:val="19"/>
+                <w:rtl/>
+              </w:rPr>
+              <w:t xml:space="preserve">الصفحة</w:t>
+            </w:r>
+          </w:p>
+        </w:tc>
+        <w:tc>
+          <w:tcPr>
+            <w:tcW w:type="dxa" w:w="1150"/>
+            <w:shd w:fill="2563EB" w:color="auto" w:val="clear"/>
+            <w:tcMar>
+              <w:top w:type="dxa" w:w="90"/>
+              <w:left w:type="dxa" w:w="110"/>
+              <w:bottom w:type="dxa" w:w="90"/>
+              <w:right w:type="dxa" w:w="110"/>
+            </w:tcMar>
+          </w:tcPr>
+          <w:p>
+            <w:pPr>
+              <w:bidi/>
+              <w:spacing w:after="0" w:line="280"/>
+              <w:jc w:val="right"/>
+            </w:pPr>
+            <w:r>
+              <w:rPr>
+                <w:rFonts w:ascii="Arial" w:cs="Arial" w:eastAsia="Arial" w:hAnsi="Arial"/>
+                <w:b/>
+                <w:bCs/>
+                <w:color w:val="FFFFFF"/>
+                <w:sz w:val="19"/>
+                <w:szCs w:val="19"/>
+                <w:rtl/>
+              </w:rPr>
+              <w:t xml:space="preserve">المسار</w:t>
+            </w:r>
+          </w:p>
+        </w:tc>
+        <w:tc>
+          <w:tcPr>
+            <w:tcW w:type="dxa" w:w="2500"/>
+            <w:shd w:fill="2563EB" w:color="auto" w:val="clear"/>
+            <w:tcMar>
+              <w:top w:type="dxa" w:w="90"/>
+              <w:left w:type="dxa" w:w="110"/>
+              <w:bottom w:type="dxa" w:w="90"/>
+              <w:right w:type="dxa" w:w="110"/>
+            </w:tcMar>
+          </w:tcPr>
+          <w:p>
+            <w:pPr>
+              <w:bidi/>
+              <w:spacing w:after="0" w:line="280"/>
+              <w:jc w:val="right"/>
+            </w:pPr>
+            <w:r>
+              <w:rPr>
+                <w:rFonts w:ascii="Arial" w:cs="Arial" w:eastAsia="Arial" w:hAnsi="Arial"/>
+                <w:b/>
+                <w:bCs/>
+                <w:color w:val="FFFFFF"/>
+                <w:sz w:val="19"/>
+                <w:szCs w:val="19"/>
+                <w:rtl/>
+              </w:rPr>
+              <w:t xml:space="preserve">الملف</w:t>
+            </w:r>
+          </w:p>
+        </w:tc>
+        <w:tc>
+          <w:tcPr>
+            <w:tcW w:type="dxa" w:w="1350"/>
+            <w:shd w:fill="2563EB" w:color="auto" w:val="clear"/>
+            <w:tcMar>
+              <w:top w:type="dxa" w:w="90"/>
+              <w:left w:type="dxa" w:w="110"/>
+              <w:bottom w:type="dxa" w:w="90"/>
+              <w:right w:type="dxa" w:w="110"/>
+            </w:tcMar>
+          </w:tcPr>
+          <w:p>
+            <w:pPr>
+              <w:bidi/>
+              <w:spacing w:after="0" w:line="280"/>
+              <w:jc w:val="right"/>
+            </w:pPr>
+            <w:r>
+              <w:rPr>
+                <w:rFonts w:ascii="Arial" w:cs="Arial" w:eastAsia="Arial" w:hAnsi="Arial"/>
+                <w:b/>
+                <w:bCs/>
+                <w:color w:val="FFFFFF"/>
+                <w:sz w:val="19"/>
+                <w:szCs w:val="19"/>
+                <w:rtl/>
+              </w:rPr>
+              <w:t xml:space="preserve">الكوميت</w:t>
+            </w:r>
+          </w:p>
+        </w:tc>
+        <w:tc>
+          <w:tcPr>
+            <w:tcW w:type="dxa" w:w="1500"/>
+            <w:shd w:fill="2563EB" w:color="auto" w:val="clear"/>
+            <w:tcMar>
+              <w:top w:type="dxa" w:w="90"/>
+              <w:left w:type="dxa" w:w="110"/>
+              <w:bottom w:type="dxa" w:w="90"/>
+              <w:right w:type="dxa" w:w="110"/>
+            </w:tcMar>
+          </w:tcPr>
+          <w:p>
+            <w:pPr>
+              <w:bidi/>
+              <w:spacing w:after="0" w:line="280"/>
+              <w:jc w:val="right"/>
+            </w:pPr>
+            <w:r>
+              <w:rPr>
+                <w:rFonts w:ascii="Arial" w:cs="Arial" w:eastAsia="Arial" w:hAnsi="Arial"/>
+                <w:b/>
+                <w:bCs/>
+                <w:color w:val="FFFFFF"/>
+                <w:sz w:val="19"/>
+                <w:szCs w:val="19"/>
+                <w:rtl/>
+              </w:rPr>
+              <w:t xml:space="preserve">الحالة</w:t>
+            </w:r>
+          </w:p>
+        </w:tc>
+      </w:tr>
+      <w:tr>
+        <w:tc>
+          <w:tcPr>
+            <w:tcW w:type="dxa" w:w="1250"/>
+            <w:tcMar>
+              <w:top w:type="dxa" w:w="90"/>
+              <w:left w:type="dxa" w:w="110"/>
+              <w:bottom w:type="dxa" w:w="90"/>
+              <w:right w:type="dxa" w:w="110"/>
+            </w:tcMar>
+          </w:tcPr>
+          <w:p>
+            <w:pPr>
+              <w:bidi/>
+              <w:spacing w:after="0" w:line="280"/>
+              <w:jc w:val="right"/>
+            </w:pPr>
+            <w:r>
+              <w:rPr>
+                <w:rFonts w:ascii="Arial" w:cs="Arial" w:eastAsia="Arial" w:hAnsi="Arial"/>
+                <w:b w:val="false"/>
+                <w:bCs w:val="false"/>
+                <w:color w:val="1E293B"/>
+                <w:sz w:val="19"/>
+                <w:szCs w:val="19"/>
+                <w:rtl/>
+              </w:rPr>
+              <w:t xml:space="preserve">9 سبتمبر 2026</w:t>
+            </w:r>
+          </w:p>
+        </w:tc>
+        <w:tc>
+          <w:tcPr>
+            <w:tcW w:type="dxa" w:w="1250"/>
+            <w:tcMar>
+              <w:top w:type="dxa" w:w="90"/>
+              <w:left w:type="dxa" w:w="110"/>
+              <w:bottom w:type="dxa" w:w="90"/>
+              <w:right w:type="dxa" w:w="110"/>
+            </w:tcMar>
+          </w:tcPr>
+          <w:p>
+            <w:pPr>
+              <w:bidi/>
+              <w:spacing w:after="0" w:line="280"/>
+              <w:jc w:val="right"/>
+            </w:pPr>
+            <w:r>
+              <w:rPr>
+                <w:rFonts w:ascii="Arial" w:cs="Arial" w:eastAsia="Arial" w:hAnsi="Arial"/>
+                <w:b w:val="false"/>
+                <w:bCs w:val="false"/>
+                <w:color w:val="1E293B"/>
+                <w:sz w:val="19"/>
+                <w:szCs w:val="19"/>
+                <w:rtl/>
+              </w:rPr>
+              <w:t xml:space="preserve">الاشتراك</w:t>
+            </w:r>
+          </w:p>
+        </w:tc>
+        <w:tc>
+          <w:tcPr>
+            <w:tcW w:type="dxa" w:w="1150"/>
+            <w:tcMar>
+              <w:top w:type="dxa" w:w="90"/>
+              <w:left w:type="dxa" w:w="110"/>
+              <w:bottom w:type="dxa" w:w="90"/>
+              <w:right w:type="dxa" w:w="110"/>
+            </w:tcMar>
+          </w:tcPr>
+          <w:p>
+            <w:pPr>
+              <w:bidi/>
+              <w:spacing w:after="0" w:line="280"/>
+              <w:jc w:val="right"/>
+            </w:pPr>
+            <w:r>
+              <w:rPr>
+                <w:rFonts w:ascii="Arial" w:cs="Arial" w:eastAsia="Arial" w:hAnsi="Arial"/>
+                <w:b w:val="false"/>
+                <w:bCs w:val="false"/>
+                <w:color w:val="1E293B"/>
+                <w:sz w:val="19"/>
+                <w:szCs w:val="19"/>
+                <w:rtl/>
+              </w:rPr>
+              <w:t xml:space="preserve">/subscribe</w:t>
+            </w:r>
+          </w:p>
+        </w:tc>
+        <w:tc>
+          <w:tcPr>
+            <w:tcW w:type="dxa" w:w="2500"/>
+            <w:tcMar>
+              <w:top w:type="dxa" w:w="90"/>
+              <w:left w:type="dxa" w:w="110"/>
+              <w:bottom w:type="dxa" w:w="90"/>
+              <w:right w:type="dxa" w:w="110"/>
+            </w:tcMar>
+          </w:tcPr>
+          <w:p>
+            <w:pPr>
+              <w:bidi/>
+              <w:spacing w:after="0" w:line="280"/>
+              <w:jc w:val="right"/>
+            </w:pPr>
+            <w:r>
+              <w:rPr>
+                <w:rFonts w:ascii="Arial" w:cs="Arial" w:eastAsia="Arial" w:hAnsi="Arial"/>
+                <w:b w:val="false"/>
+                <w:bCs w:val="false"/>
+                <w:color w:val="1E293B"/>
+                <w:sz w:val="19"/>
+                <w:szCs w:val="19"/>
+                <w:rtl/>
+              </w:rPr>
+              <w:t xml:space="preserve">src/pages/Subscribe.tsx</w:t>
+            </w:r>
+          </w:p>
+        </w:tc>
+        <w:tc>
+          <w:tcPr>
+            <w:tcW w:type="dxa" w:w="1350"/>
+            <w:tcMar>
+              <w:top w:type="dxa" w:w="90"/>
+              <w:left w:type="dxa" w:w="110"/>
+              <w:bottom w:type="dxa" w:w="90"/>
+              <w:right w:type="dxa" w:w="110"/>
+            </w:tcMar>
+          </w:tcPr>
+          <w:p>
+            <w:pPr>
+              <w:bidi/>
+              <w:spacing w:after="0" w:line="280"/>
+              <w:jc w:val="right"/>
+            </w:pPr>
+            <w:r>
+              <w:rPr>
+                <w:rFonts w:ascii="Arial" w:cs="Arial" w:eastAsia="Arial" w:hAnsi="Arial"/>
+                <w:b w:val="false"/>
+                <w:bCs w:val="false"/>
+                <w:color w:val="1E293B"/>
+                <w:sz w:val="19"/>
+                <w:szCs w:val="19"/>
+                <w:rtl/>
+              </w:rPr>
+              <w:t xml:space="preserve">be5b3c0 · c49b797</w:t>
+            </w:r>
+          </w:p>
+        </w:tc>
+        <w:tc>
+          <w:tcPr>
+            <w:tcW w:type="dxa" w:w="1500"/>
+            <w:shd w:fill="ECFDF5" w:color="auto" w:val="clear"/>
+            <w:tcMar>
+              <w:top w:type="dxa" w:w="90"/>
+              <w:left w:type="dxa" w:w="110"/>
+              <w:bottom w:type="dxa" w:w="90"/>
+              <w:right w:type="dxa" w:w="110"/>
+            </w:tcMar>
+          </w:tcPr>
+          <w:p>
+            <w:pPr>
+              <w:bidi/>
+              <w:spacing w:after="0" w:line="280"/>
+              <w:jc w:val="right"/>
+            </w:pPr>
+            <w:r>
+              <w:rPr>
+                <w:rFonts w:ascii="Arial" w:cs="Arial" w:eastAsia="Arial" w:hAnsi="Arial"/>
+                <w:b/>
+                <w:bCs/>
+                <w:color w:val="15803D"/>
+                <w:sz w:val="19"/>
+                <w:szCs w:val="19"/>
+                <w:rtl/>
+              </w:rPr>
+              <w:t xml:space="preserve">منشور على الإنتاج</w:t>
+            </w:r>
+          </w:p>
+        </w:tc>
+      </w:tr>
+    </w:tbl>
+    <w:p>
+      <w:pPr>
+        <w:spacing w:after="90"/>
+      </w:pPr>
     </w:p>
     <w:p>
       <w:pPr>
@@ -11334,7 +12050,7 @@
           <w:szCs w:val="21"/>
           <w:rtl/>
         </w:rPr>
-        <w:t xml:space="preserve">مسار من ست خطوات: اختيار الباقة، ثم تأكيد التخفيض، ثم الدفع، ثم المعالجة، ثم النجاح أو الفشل.</w:t>
+        <w:t xml:space="preserve">إعادة بناء شبه كاملة للصفحة — 715 سطراً متغيّراً.</w:t>
       </w:r>
     </w:p>
     <w:p>
@@ -11356,7 +12072,7 @@
           <w:szCs w:val="21"/>
           <w:rtl/>
         </w:rPr>
-        <w:t xml:space="preserve">احتساب تناسبي للترقية: يُحصَّل فرق السعر عن الأيام المتبقية من الدورة الحالية فقط، ويظهر المبلغ مفصّلاً في ملخص الدفع.</w:t>
+        <w:t xml:space="preserve">اختيار الباقة صار بشريط تمرير (slider) حسب عدد المحادثات الشهرية بدل شبكة الكروت. كل باقة نقطة توقف على الشريط، وباقة المؤسسات هي النقطة الأخيرة بعنوان «غير محدود».</w:t>
       </w:r>
     </w:p>
     <w:p>
@@ -11378,7 +12094,7 @@
           <w:szCs w:val="21"/>
           <w:rtl/>
         </w:rPr>
-        <w:t xml:space="preserve">التخفيض له شاشة تأكيد مستقلة ولا يذهب مباشرة إلى الدفع.</w:t>
+        <w:t xml:space="preserve">مسار من ست خطوات: اختيار الباقة، ثم تأكيد التخفيض، ثم الدفع، ثم المعالجة، ثم النجاح أو الفشل.</w:t>
       </w:r>
     </w:p>
     <w:p>
@@ -11400,7 +12116,7 @@
           <w:szCs w:val="21"/>
           <w:rtl/>
         </w:rPr>
-        <w:t xml:space="preserve">دورة الفوترة تُقرأ من اشتراك العميل الحالي بدل أن تبدأ بقيمة ثابتة.</w:t>
+        <w:t xml:space="preserve">احتساب تناسبي للترقية: يُحصَّل فرق السعر عن الأيام المتبقية من الدورة الحالية فقط، ويظهر المبلغ مفصّلاً في ملخص الدفع.</w:t>
       </w:r>
     </w:p>
     <w:p>
@@ -11422,6 +12138,50 @@
           <w:szCs w:val="21"/>
           <w:rtl/>
         </w:rPr>
+        <w:t xml:space="preserve">التخفيض له شاشة تأكيد مستقلة ولا يذهب مباشرة إلى الدفع.</w:t>
+      </w:r>
+    </w:p>
+    <w:p>
+      <w:pPr>
+        <w:pStyle w:val="ListParagraph"/>
+        <w:numPr>
+          <w:ilvl w:val="0"/>
+          <w:numId w:val="2"/>
+        </w:numPr>
+        <w:bidi/>
+        <w:spacing w:after="70" w:line="290"/>
+        <w:jc w:val="right"/>
+      </w:pPr>
+      <w:r>
+        <w:rPr>
+          <w:rFonts w:ascii="Arial" w:cs="Arial" w:eastAsia="Arial" w:hAnsi="Arial"/>
+          <w:color w:val="1E293B"/>
+          <w:sz w:val="21"/>
+          <w:szCs w:val="21"/>
+          <w:rtl/>
+        </w:rPr>
+        <w:t xml:space="preserve">دورة الفوترة تُقرأ من اشتراك العميل الحالي بدل أن تبدأ بقيمة ثابتة.</w:t>
+      </w:r>
+    </w:p>
+    <w:p>
+      <w:pPr>
+        <w:pStyle w:val="ListParagraph"/>
+        <w:numPr>
+          <w:ilvl w:val="0"/>
+          <w:numId w:val="2"/>
+        </w:numPr>
+        <w:bidi/>
+        <w:spacing w:after="70" w:line="290"/>
+        <w:jc w:val="right"/>
+      </w:pPr>
+      <w:r>
+        <w:rPr>
+          <w:rFonts w:ascii="Arial" w:cs="Arial" w:eastAsia="Arial" w:hAnsi="Arial"/>
+          <w:color w:val="1E293B"/>
+          <w:sz w:val="21"/>
+          <w:szCs w:val="21"/>
+          <w:rtl/>
+        </w:rPr>
         <w:t xml:space="preserve">أُصلحت علامات تعارض الدمج (merge conflict markers) التي كانت باقية في الملف — كوميت c49b797.</w:t>
       </w:r>
     </w:p>
@@ -11608,7 +12368,7 @@
           <w:szCs w:val="20"/>
           <w:rtl/>
         </w:rPr>
-        <w:t xml:space="preserve">عدد التعديلات المسجّلة: 14</w:t>
+        <w:t xml:space="preserve">عدد التعديلات المسجّلة: 15</w:t>
       </w:r>
     </w:p>
     <w:sectPr>

</xml_diff>

<commit_message>
deploy build d469bcf6 to production
Publish the plan picker spacing fix to qhub-client.apexes.click.

All 90 assets uploaded and diffed against the local build before any HTML
was touched (clean), then all 114 route copies enumerated from the live
tree, then version.json last.

Record the change in the changelog and point BUILD_LIVE at d469bcf6.

Co-Authored-By: Claude Opus 5 <noreply@anthropic.com>
Claude-Session: https://claude.ai/code/session_01JGHUnSrtQwLX2BGbB3j6wk
</commit_message>
<xml_diff>
--- a/docs/سجل التعديلات الاخيرة.docx
+++ b/docs/سجل التعديلات الاخيرة.docx
@@ -354,7 +354,7 @@
                 <w:szCs w:val="19"/>
                 <w:rtl/>
               </w:rPr>
-              <w:t xml:space="preserve">15</w:t>
+              <w:t xml:space="preserve">16</w:t>
             </w:r>
           </w:p>
         </w:tc>
@@ -414,7 +414,7 @@
                 <w:szCs w:val="19"/>
                 <w:rtl/>
               </w:rPr>
-              <w:t xml:space="preserve">مؤشّر الباقات صار اختياراً بخطوات لا شريط تقدّم</w:t>
+              <w:t xml:space="preserve">توسعة المسافات حول مؤشّر الباقات</w:t>
             </w:r>
           </w:p>
         </w:tc>
@@ -508,7 +508,7 @@
                 <w:szCs w:val="19"/>
                 <w:rtl/>
               </w:rPr>
-              <w:t xml:space="preserve">14</w:t>
+              <w:t xml:space="preserve">15</w:t>
             </w:r>
           </w:p>
         </w:tc>
@@ -539,7 +539,7 @@
                 <w:szCs w:val="19"/>
                 <w:rtl/>
               </w:rPr>
-              <w:t xml:space="preserve">10 سبتمبر 2026</w:t>
+              <w:t xml:space="preserve">13 سبتمبر 2026</w:t>
             </w:r>
           </w:p>
         </w:tc>
@@ -570,7 +570,7 @@
                 <w:szCs w:val="19"/>
                 <w:rtl/>
               </w:rPr>
-              <w:t xml:space="preserve">صفحة الباقات صارت جدول مقارنة على نسق اللاندنج بيج</w:t>
+              <w:t xml:space="preserve">مؤشّر الباقات صار اختياراً بخطوات لا شريط تقدّم</w:t>
             </w:r>
           </w:p>
         </w:tc>
@@ -664,7 +664,7 @@
                 <w:szCs w:val="19"/>
                 <w:rtl/>
               </w:rPr>
-              <w:t xml:space="preserve">13</w:t>
+              <w:t xml:space="preserve">14</w:t>
             </w:r>
           </w:p>
         </w:tc>
@@ -724,7 +724,7 @@
                 <w:szCs w:val="19"/>
                 <w:rtl/>
               </w:rPr>
-              <w:t xml:space="preserve">تعطيل المصادقة الثنائية صار يتطلّب كلمة المرور أو رمزاً</w:t>
+              <w:t xml:space="preserve">صفحة الباقات صارت جدول مقارنة على نسق اللاندنج بيج</w:t>
             </w:r>
           </w:p>
         </w:tc>
@@ -754,7 +754,7 @@
                 <w:szCs w:val="19"/>
                 <w:rtl/>
               </w:rPr>
-              <w:t xml:space="preserve">الإعدادات ← الأمان</w:t>
+              <w:t xml:space="preserve">الباقات والاشتراك</w:t>
             </w:r>
           </w:p>
         </w:tc>
@@ -818,7 +818,7 @@
                 <w:szCs w:val="19"/>
                 <w:rtl/>
               </w:rPr>
-              <w:t xml:space="preserve">12</w:t>
+              <w:t xml:space="preserve">13</w:t>
             </w:r>
           </w:p>
         </w:tc>
@@ -880,7 +880,7 @@
                 <w:szCs w:val="19"/>
                 <w:rtl/>
               </w:rPr>
-              <w:t xml:space="preserve">رمز QR حقيقي قابل للمسح في إعداد المصادقة الثنائية</w:t>
+              <w:t xml:space="preserve">تعطيل المصادقة الثنائية صار يتطلّب كلمة المرور أو رمزاً</w:t>
             </w:r>
           </w:p>
         </w:tc>
@@ -974,7 +974,7 @@
                 <w:szCs w:val="19"/>
                 <w:rtl/>
               </w:rPr>
-              <w:t xml:space="preserve">11</w:t>
+              <w:t xml:space="preserve">12</w:t>
             </w:r>
           </w:p>
         </w:tc>
@@ -1034,7 +1034,7 @@
                 <w:szCs w:val="19"/>
                 <w:rtl/>
               </w:rPr>
-              <w:t xml:space="preserve">رقم جوال اختياري في الملف الشخصي</w:t>
+              <w:t xml:space="preserve">رمز QR حقيقي قابل للمسح في إعداد المصادقة الثنائية</w:t>
             </w:r>
           </w:p>
         </w:tc>
@@ -1064,7 +1064,7 @@
                 <w:szCs w:val="19"/>
                 <w:rtl/>
               </w:rPr>
-              <w:t xml:space="preserve">الإعدادات ← الملف الشخصي</w:t>
+              <w:t xml:space="preserve">الإعدادات ← الأمان</w:t>
             </w:r>
           </w:p>
         </w:tc>
@@ -1128,7 +1128,7 @@
                 <w:szCs w:val="19"/>
                 <w:rtl/>
               </w:rPr>
-              <w:t xml:space="preserve">10</w:t>
+              <w:t xml:space="preserve">11</w:t>
             </w:r>
           </w:p>
         </w:tc>
@@ -1190,7 +1190,7 @@
                 <w:szCs w:val="19"/>
                 <w:rtl/>
               </w:rPr>
-              <w:t xml:space="preserve">شاشة التحقق بخطوتين في تسجيل الدخول</w:t>
+              <w:t xml:space="preserve">رقم جوال اختياري في الملف الشخصي</w:t>
             </w:r>
           </w:p>
         </w:tc>
@@ -1221,7 +1221,7 @@
                 <w:szCs w:val="19"/>
                 <w:rtl/>
               </w:rPr>
-              <w:t xml:space="preserve">تسجيل الدخول</w:t>
+              <w:t xml:space="preserve">الإعدادات ← الملف الشخصي</w:t>
             </w:r>
           </w:p>
         </w:tc>
@@ -1284,7 +1284,7 @@
                 <w:szCs w:val="19"/>
                 <w:rtl/>
               </w:rPr>
-              <w:t xml:space="preserve">9</w:t>
+              <w:t xml:space="preserve">10</w:t>
             </w:r>
           </w:p>
         </w:tc>
@@ -1344,7 +1344,7 @@
                 <w:szCs w:val="19"/>
                 <w:rtl/>
               </w:rPr>
-              <w:t xml:space="preserve">رقم هاتف اختياري عند دعوة الموظف</w:t>
+              <w:t xml:space="preserve">شاشة التحقق بخطوتين في تسجيل الدخول</w:t>
             </w:r>
           </w:p>
         </w:tc>
@@ -1374,7 +1374,7 @@
                 <w:szCs w:val="19"/>
                 <w:rtl/>
               </w:rPr>
-              <w:t xml:space="preserve">فريق العمل</w:t>
+              <w:t xml:space="preserve">تسجيل الدخول</w:t>
             </w:r>
           </w:p>
         </w:tc>
@@ -1438,7 +1438,7 @@
                 <w:szCs w:val="19"/>
                 <w:rtl/>
               </w:rPr>
-              <w:t xml:space="preserve">8</w:t>
+              <w:t xml:space="preserve">9</w:t>
             </w:r>
           </w:p>
         </w:tc>
@@ -1500,7 +1500,7 @@
                 <w:szCs w:val="19"/>
                 <w:rtl/>
               </w:rPr>
-              <w:t xml:space="preserve">فاصل مرقّم بين دورات المحادثة داخل الثريد</w:t>
+              <w:t xml:space="preserve">رقم هاتف اختياري عند دعوة الموظف</w:t>
             </w:r>
           </w:p>
         </w:tc>
@@ -1531,7 +1531,7 @@
                 <w:szCs w:val="19"/>
                 <w:rtl/>
               </w:rPr>
-              <w:t xml:space="preserve">صندوق الوارد</w:t>
+              <w:t xml:space="preserve">فريق العمل</w:t>
             </w:r>
           </w:p>
         </w:tc>
@@ -1594,7 +1594,7 @@
                 <w:szCs w:val="19"/>
                 <w:rtl/>
               </w:rPr>
-              <w:t xml:space="preserve">7</w:t>
+              <w:t xml:space="preserve">8</w:t>
             </w:r>
           </w:p>
         </w:tc>
@@ -1654,7 +1654,7 @@
                 <w:szCs w:val="19"/>
                 <w:rtl/>
               </w:rPr>
-              <w:t xml:space="preserve">انعكاس حالة «مجدولة» للتخفيض المؤجّل في بورتال العميل</w:t>
+              <w:t xml:space="preserve">فاصل مرقّم بين دورات المحادثة داخل الثريد</w:t>
             </w:r>
           </w:p>
         </w:tc>
@@ -1684,7 +1684,7 @@
                 <w:szCs w:val="19"/>
                 <w:rtl/>
               </w:rPr>
-              <w:t xml:space="preserve">الباقات والاشتراك</w:t>
+              <w:t xml:space="preserve">صندوق الوارد</w:t>
             </w:r>
           </w:p>
         </w:tc>
@@ -1748,7 +1748,7 @@
                 <w:szCs w:val="19"/>
                 <w:rtl/>
               </w:rPr>
-              <w:t xml:space="preserve">6</w:t>
+              <w:t xml:space="preserve">7</w:t>
             </w:r>
           </w:p>
         </w:tc>
@@ -1810,7 +1810,7 @@
                 <w:szCs w:val="19"/>
                 <w:rtl/>
               </w:rPr>
-              <w:t xml:space="preserve">إعادة تصميم شريط الفهرسة على هيئة مسطرة تظهر عند الاقتراب</w:t>
+              <w:t xml:space="preserve">انعكاس حالة «مجدولة» للتخفيض المؤجّل في بورتال العميل</w:t>
             </w:r>
           </w:p>
         </w:tc>
@@ -1841,7 +1841,7 @@
                 <w:szCs w:val="19"/>
                 <w:rtl/>
               </w:rPr>
-              <w:t xml:space="preserve">صندوق الوارد</w:t>
+              <w:t xml:space="preserve">الباقات والاشتراك</w:t>
             </w:r>
           </w:p>
         </w:tc>
@@ -1904,7 +1904,7 @@
                 <w:szCs w:val="19"/>
                 <w:rtl/>
               </w:rPr>
-              <w:t xml:space="preserve">5</w:t>
+              <w:t xml:space="preserve">6</w:t>
             </w:r>
           </w:p>
         </w:tc>
@@ -1964,7 +1964,7 @@
                 <w:szCs w:val="19"/>
                 <w:rtl/>
               </w:rPr>
-              <w:t xml:space="preserve">شريط فهرسة دورات المحادثة داخل الثريد</w:t>
+              <w:t xml:space="preserve">إعادة تصميم شريط الفهرسة على هيئة مسطرة تظهر عند الاقتراب</w:t>
             </w:r>
           </w:p>
         </w:tc>
@@ -2058,7 +2058,7 @@
                 <w:szCs w:val="19"/>
                 <w:rtl/>
               </w:rPr>
-              <w:t xml:space="preserve">4</w:t>
+              <w:t xml:space="preserve">5</w:t>
             </w:r>
           </w:p>
         </w:tc>
@@ -2120,7 +2120,7 @@
                 <w:szCs w:val="19"/>
                 <w:rtl/>
               </w:rPr>
-              <w:t xml:space="preserve">تسجيل دورات المحادثة واشتقاقها — أساس شريط فهرسة الثريد</w:t>
+              <w:t xml:space="preserve">شريط فهرسة دورات المحادثة داخل الثريد</w:t>
             </w:r>
           </w:p>
         </w:tc>
@@ -2151,7 +2151,7 @@
                 <w:szCs w:val="19"/>
                 <w:rtl/>
               </w:rPr>
-              <w:t xml:space="preserve">صندوق الوارد (طبقة البيانات)</w:t>
+              <w:t xml:space="preserve">صندوق الوارد</w:t>
             </w:r>
           </w:p>
         </w:tc>
@@ -2214,7 +2214,7 @@
                 <w:szCs w:val="19"/>
                 <w:rtl/>
               </w:rPr>
-              <w:t xml:space="preserve">3</w:t>
+              <w:t xml:space="preserve">4</w:t>
             </w:r>
           </w:p>
         </w:tc>
@@ -2274,7 +2274,7 @@
                 <w:szCs w:val="19"/>
                 <w:rtl/>
               </w:rPr>
-              <w:t xml:space="preserve">إزالة كارت نسبة الاستجابة من صفحة تقييمات العملاء</w:t>
+              <w:t xml:space="preserve">تسجيل دورات المحادثة واشتقاقها — أساس شريط فهرسة الثريد</w:t>
             </w:r>
           </w:p>
         </w:tc>
@@ -2304,7 +2304,7 @@
                 <w:szCs w:val="19"/>
                 <w:rtl/>
               </w:rPr>
-              <w:t xml:space="preserve">تقييمات العملاء</w:t>
+              <w:t xml:space="preserve">صندوق الوارد (طبقة البيانات)</w:t>
             </w:r>
           </w:p>
         </w:tc>
@@ -2368,7 +2368,7 @@
                 <w:szCs w:val="19"/>
                 <w:rtl/>
               </w:rPr>
-              <w:t xml:space="preserve">2</w:t>
+              <w:t xml:space="preserve">3</w:t>
             </w:r>
           </w:p>
         </w:tc>
@@ -2399,7 +2399,7 @@
                 <w:szCs w:val="19"/>
                 <w:rtl/>
               </w:rPr>
-              <w:t xml:space="preserve">9 سبتمبر 2026</w:t>
+              <w:t xml:space="preserve">10 سبتمبر 2026</w:t>
             </w:r>
           </w:p>
         </w:tc>
@@ -2430,7 +2430,7 @@
                 <w:szCs w:val="19"/>
                 <w:rtl/>
               </w:rPr>
-              <w:t xml:space="preserve">تغيير تسمية زر الترقية في صفحة الفوترة</w:t>
+              <w:t xml:space="preserve">إزالة كارت نسبة الاستجابة من صفحة تقييمات العملاء</w:t>
             </w:r>
           </w:p>
         </w:tc>
@@ -2461,7 +2461,7 @@
                 <w:szCs w:val="19"/>
                 <w:rtl/>
               </w:rPr>
-              <w:t xml:space="preserve">الفوترة</w:t>
+              <w:t xml:space="preserve">تقييمات العملاء</w:t>
             </w:r>
           </w:p>
         </w:tc>
@@ -2524,7 +2524,7 @@
                 <w:szCs w:val="19"/>
                 <w:rtl/>
               </w:rPr>
-              <w:t xml:space="preserve">1</w:t>
+              <w:t xml:space="preserve">2</w:t>
             </w:r>
           </w:p>
         </w:tc>
@@ -2584,6 +2584,162 @@
                 <w:szCs w:val="19"/>
                 <w:rtl/>
               </w:rPr>
+              <w:t xml:space="preserve">تغيير تسمية زر الترقية في صفحة الفوترة</w:t>
+            </w:r>
+          </w:p>
+        </w:tc>
+        <w:tc>
+          <w:tcPr>
+            <w:tcW w:type="dxa" w:w="1500"/>
+            <w:tcMar>
+              <w:top w:type="dxa" w:w="90"/>
+              <w:left w:type="dxa" w:w="110"/>
+              <w:bottom w:type="dxa" w:w="90"/>
+              <w:right w:type="dxa" w:w="110"/>
+            </w:tcMar>
+          </w:tcPr>
+          <w:p>
+            <w:pPr>
+              <w:bidi/>
+              <w:spacing w:after="0" w:line="280"/>
+              <w:jc w:val="right"/>
+            </w:pPr>
+            <w:r>
+              <w:rPr>
+                <w:rFonts w:ascii="Arial" w:cs="Arial" w:eastAsia="Arial" w:hAnsi="Arial"/>
+                <w:b w:val="false"/>
+                <w:bCs w:val="false"/>
+                <w:color w:val="1E293B"/>
+                <w:sz w:val="19"/>
+                <w:szCs w:val="19"/>
+                <w:rtl/>
+              </w:rPr>
+              <w:t xml:space="preserve">الفوترة</w:t>
+            </w:r>
+          </w:p>
+        </w:tc>
+        <w:tc>
+          <w:tcPr>
+            <w:tcW w:type="dxa" w:w="1800"/>
+            <w:shd w:fill="ECFDF5" w:color="auto" w:val="clear"/>
+            <w:tcMar>
+              <w:top w:type="dxa" w:w="90"/>
+              <w:left w:type="dxa" w:w="110"/>
+              <w:bottom w:type="dxa" w:w="90"/>
+              <w:right w:type="dxa" w:w="110"/>
+            </w:tcMar>
+          </w:tcPr>
+          <w:p>
+            <w:pPr>
+              <w:bidi/>
+              <w:spacing w:after="0" w:line="280"/>
+              <w:jc w:val="right"/>
+            </w:pPr>
+            <w:r>
+              <w:rPr>
+                <w:rFonts w:ascii="Arial" w:cs="Arial" w:eastAsia="Arial" w:hAnsi="Arial"/>
+                <w:b/>
+                <w:bCs/>
+                <w:color w:val="15803D"/>
+                <w:sz w:val="19"/>
+                <w:szCs w:val="19"/>
+                <w:rtl/>
+              </w:rPr>
+              <w:t xml:space="preserve">منشور على الإنتاج</w:t>
+            </w:r>
+          </w:p>
+        </w:tc>
+      </w:tr>
+      <w:tr>
+        <w:tc>
+          <w:tcPr>
+            <w:tcW w:type="dxa" w:w="600"/>
+            <w:shd w:fill="F1F5F9" w:color="auto" w:val="clear"/>
+            <w:tcMar>
+              <w:top w:type="dxa" w:w="90"/>
+              <w:left w:type="dxa" w:w="110"/>
+              <w:bottom w:type="dxa" w:w="90"/>
+              <w:right w:type="dxa" w:w="110"/>
+            </w:tcMar>
+          </w:tcPr>
+          <w:p>
+            <w:pPr>
+              <w:bidi/>
+              <w:spacing w:after="0" w:line="280"/>
+              <w:jc w:val="right"/>
+            </w:pPr>
+            <w:r>
+              <w:rPr>
+                <w:rFonts w:ascii="Arial" w:cs="Arial" w:eastAsia="Arial" w:hAnsi="Arial"/>
+                <w:b/>
+                <w:bCs/>
+                <w:color w:val="2563EB"/>
+                <w:sz w:val="19"/>
+                <w:szCs w:val="19"/>
+                <w:rtl/>
+              </w:rPr>
+              <w:t xml:space="preserve">1</w:t>
+            </w:r>
+          </w:p>
+        </w:tc>
+        <w:tc>
+          <w:tcPr>
+            <w:tcW w:type="dxa" w:w="1500"/>
+            <w:shd w:fill="F1F5F9" w:color="auto" w:val="clear"/>
+            <w:tcMar>
+              <w:top w:type="dxa" w:w="90"/>
+              <w:left w:type="dxa" w:w="110"/>
+              <w:bottom w:type="dxa" w:w="90"/>
+              <w:right w:type="dxa" w:w="110"/>
+            </w:tcMar>
+          </w:tcPr>
+          <w:p>
+            <w:pPr>
+              <w:bidi/>
+              <w:spacing w:after="0" w:line="280"/>
+              <w:jc w:val="right"/>
+            </w:pPr>
+            <w:r>
+              <w:rPr>
+                <w:rFonts w:ascii="Arial" w:cs="Arial" w:eastAsia="Arial" w:hAnsi="Arial"/>
+                <w:b w:val="false"/>
+                <w:bCs w:val="false"/>
+                <w:color w:val="1E293B"/>
+                <w:sz w:val="19"/>
+                <w:szCs w:val="19"/>
+                <w:rtl/>
+              </w:rPr>
+              <w:t xml:space="preserve">9 سبتمبر 2026</w:t>
+            </w:r>
+          </w:p>
+        </w:tc>
+        <w:tc>
+          <w:tcPr>
+            <w:tcW w:type="dxa" w:w="3600"/>
+            <w:shd w:fill="F1F5F9" w:color="auto" w:val="clear"/>
+            <w:tcMar>
+              <w:top w:type="dxa" w:w="90"/>
+              <w:left w:type="dxa" w:w="110"/>
+              <w:bottom w:type="dxa" w:w="90"/>
+              <w:right w:type="dxa" w:w="110"/>
+            </w:tcMar>
+          </w:tcPr>
+          <w:p>
+            <w:pPr>
+              <w:bidi/>
+              <w:spacing w:after="0" w:line="280"/>
+              <w:jc w:val="right"/>
+            </w:pPr>
+            <w:r>
+              <w:rPr>
+                <w:rFonts w:ascii="Arial" w:cs="Arial" w:eastAsia="Arial" w:hAnsi="Arial"/>
+                <w:b w:val="false"/>
+                <w:bCs w:val="false"/>
+                <w:color w:val="1E293B"/>
+                <w:sz w:val="19"/>
+                <w:szCs w:val="19"/>
+                <w:rtl/>
+              </w:rPr>
               <w:t xml:space="preserve">ميزة تغيير الباقة — US-131</w:t>
             </w:r>
           </w:p>
@@ -2591,6 +2747,7 @@
         <w:tc>
           <w:tcPr>
             <w:tcW w:type="dxa" w:w="1500"/>
+            <w:shd w:fill="F1F5F9" w:color="auto" w:val="clear"/>
             <w:tcMar>
               <w:top w:type="dxa" w:w="90"/>
               <w:left w:type="dxa" w:w="110"/>
@@ -3017,7 +3174,7 @@
                 <w:szCs w:val="20"/>
                 <w:rtl/>
               </w:rPr>
-              <w:t xml:space="preserve">البناء المنشور على الإنتاج: 5c9b337b-c002-4af8-aaaa-ad0d0c18ac10</w:t>
+              <w:t xml:space="preserve">البناء المنشور على الإنتاج: d469bcf6-a7c9-415d-a1a5-5fd6a4c6eb36</w:t>
             </w:r>
           </w:p>
           <w:p>
@@ -3102,7 +3259,7 @@
           <w:szCs w:val="24"/>
           <w:rtl/>
         </w:rPr>
-        <w:t xml:space="preserve">تعديل رقم 15 — مؤشّر الباقات صار اختياراً بخطوات لا شريط تقدّم</w:t>
+        <w:t xml:space="preserve">تعديل رقم 16 — توسعة المسافات حول مؤشّر الباقات</w:t>
       </w:r>
     </w:p>
     <w:p>
@@ -3469,7 +3626,7 @@
                 <w:szCs w:val="19"/>
                 <w:rtl/>
               </w:rPr>
-              <w:t xml:space="preserve">3cec803</w:t>
+              <w:t xml:space="preserve">c3490b0</w:t>
             </w:r>
           </w:p>
         </w:tc>
@@ -3530,7 +3687,7 @@
           <w:szCs w:val="21"/>
           <w:rtl/>
         </w:rPr>
-        <w:t xml:space="preserve">كان حقل range يلوّن المسار بالأزرق من البداية حتى المؤشّر، وهذا يقول «أنت قطعت 40% من شيء». الباقات أربع خيارات منفصلة لا كمية تتراكم، فكانت التعبئة تدّعي معنى لا يملكه العنصر، وجعلت الصف يبدو شريط تحميل.</w:t>
+        <w:t xml:space="preserve">قِسْت المنطقة قبل التعديل فطلع السبب تداخلاً فعلياً لا مجرد ضيق: الفقاعة تتعلّق ~35px فوق المسار والسطر فوقها عنده 32px هامش، فكان أعلى الفقاعة يقع 3px داخل أسفل السطر — متراكبين عند كل نقطة.</w:t>
       </w:r>
     </w:p>
     <w:p>
@@ -3552,7 +3709,7 @@
           <w:szCs w:val="21"/>
           <w:rtl/>
         </w:rPr>
-        <w:t xml:space="preserve">صار المسار رمادياً من طرف إلى طرف والحالة كلها في النقاط: نقاط مفرغة للباقات الأخرى، وحلقة للمختارة، وسقف المحادثات في فقاعة فوقها. لا شيء ممتلئ فلا شيء يُقرأ كتقدّم.</w:t>
+        <w:t xml:space="preserve">الهامش تحت سطر «اسحب المؤشّر» صار 56px بدل 32، فتجاوز مدى الفقاعة.</w:t>
       </w:r>
     </w:p>
     <w:p>
@@ -3574,7 +3731,7 @@
           <w:szCs w:val="21"/>
           <w:rtl/>
         </w:rPr>
-        <w:t xml:space="preserve">حُذف صف الأرقام تحت المسار معه؛ صار المعروض القيمة المختارة وحدها بدل أربعة أرقام تزاحمها.</w:t>
+        <w:t xml:space="preserve">وُسّعت كذلك المسافة تحت العنوان (40px بدل 32)، وتحت مبدّل شهري/سنوي (40 بدل 24)، وبين المؤشّر والجدول (56 بدل 40) — كانت كلها أضيق من إيقاع بقية الصفحة.</w:t>
       </w:r>
     </w:p>
     <w:p>
@@ -3596,95 +3753,7 @@
           <w:szCs w:val="21"/>
           <w:rtl/>
         </w:rPr>
-        <w:t xml:space="preserve">دعم الكيبورد باقٍ ومُوجَّه بصرياً: في RTL السهم الأيسر ينتقل للباقة الأكبر لأن الأكبر هناك، وHome وEnd للطرفين.</w:t>
-      </w:r>
-    </w:p>
-    <w:p>
-      <w:pPr>
-        <w:pStyle w:val="ListParagraph"/>
-        <w:numPr>
-          <w:ilvl w:val="0"/>
-          <w:numId w:val="2"/>
-        </w:numPr>
-        <w:bidi/>
-        <w:spacing w:after="70" w:line="290"/>
-        <w:jc w:val="right"/>
-      </w:pPr>
-      <w:r>
-        <w:rPr>
-          <w:rFonts w:ascii="Arial" w:cs="Arial" w:eastAsia="Arial" w:hAnsi="Arial"/>
-          <w:color w:val="1E293B"/>
-          <w:sz w:val="21"/>
-          <w:szCs w:val="21"/>
-          <w:rtl/>
-        </w:rPr>
-        <w:t xml:space="preserve">فخّ RTL أول: start-* تُترجم إلى right، فاقترانها بـ ‎-translate-x-1/2 أزاح سهم الفقاعة عن المؤشّر بنصف عرضه. قِسته فطلع 8px — صار السهم يستخدم left الفيزيائي والانحراف صفر.</w:t>
-      </w:r>
-    </w:p>
-    <w:p>
-      <w:pPr>
-        <w:pStyle w:val="ListParagraph"/>
-        <w:numPr>
-          <w:ilvl w:val="0"/>
-          <w:numId w:val="2"/>
-        </w:numPr>
-        <w:bidi/>
-        <w:spacing w:after="70" w:line="290"/>
-        <w:jc w:val="right"/>
-      </w:pPr>
-      <w:r>
-        <w:rPr>
-          <w:rFonts w:ascii="Arial" w:cs="Arial" w:eastAsia="Arial" w:hAnsi="Arial"/>
-          <w:color w:val="1E293B"/>
-          <w:sz w:val="21"/>
-          <w:szCs w:val="21"/>
-          <w:rtl/>
-        </w:rPr>
-        <w:t xml:space="preserve">فخّ RTL ثانٍ: عند الطرفين تخرج الفقاعة المتوسّطة عن الشاشة الضيقة، فصارت تتعلّق من الجهة الداخلية للمؤشّر والسهم يتبعها.</w:t>
-      </w:r>
-    </w:p>
-    <w:p>
-      <w:pPr>
-        <w:pStyle w:val="ListParagraph"/>
-        <w:numPr>
-          <w:ilvl w:val="0"/>
-          <w:numId w:val="2"/>
-        </w:numPr>
-        <w:bidi/>
-        <w:spacing w:after="70" w:line="290"/>
-        <w:jc w:val="right"/>
-      </w:pPr>
-      <w:r>
-        <w:rPr>
-          <w:rFonts w:ascii="Arial" w:cs="Arial" w:eastAsia="Arial" w:hAnsi="Arial"/>
-          <w:color w:val="1E293B"/>
-          <w:sz w:val="21"/>
-          <w:szCs w:val="21"/>
-          <w:rtl/>
-        </w:rPr>
-        <w:t xml:space="preserve">اختُبر في المتصفح: خلفية المسار تُحسب لوناً مصمتاً بلا تدرّج، والنقاط الأربع موزّعة بالتساوي، والأسهم والنقر يحرّكان الاختيار، والفقاعة وسهمها على مركز المؤشّر بالبكسل، والفقاعة تسع داخل المحتوى عند 1440 و1024 و768.</w:t>
-      </w:r>
-    </w:p>
-    <w:p>
-      <w:pPr>
-        <w:pStyle w:val="ListParagraph"/>
-        <w:numPr>
-          <w:ilvl w:val="0"/>
-          <w:numId w:val="2"/>
-        </w:numPr>
-        <w:bidi/>
-        <w:spacing w:after="70" w:line="290"/>
-        <w:jc w:val="right"/>
-      </w:pPr>
-      <w:r>
-        <w:rPr>
-          <w:rFonts w:ascii="Arial" w:cs="Arial" w:eastAsia="Arial" w:hAnsi="Arial"/>
-          <w:color w:val="1E293B"/>
-          <w:sz w:val="21"/>
-          <w:szCs w:val="21"/>
-          <w:rtl/>
-        </w:rPr>
-        <w:t xml:space="preserve">تحت ~500px لا تسع الفقاعة لأن الشريط الجانبي يبقى مفتوحاً ويترك للصفحة 160px فقط — يخصّ الصفحة كلها لا هذا العنصر، وتُرك كما هو.</w:t>
+        <w:t xml:space="preserve">القياس بعد التعديل: الفقاعة تبتعد عن السطر 22px عند النقطة الأولى والأخيرة (أسوأ حالتين)، والجدول يبدأ 56px تحت المسار.</w:t>
       </w:r>
     </w:p>
     <w:p>
@@ -3709,7 +3778,7 @@
           <w:szCs w:val="24"/>
           <w:rtl/>
         </w:rPr>
-        <w:t xml:space="preserve">تعديل رقم 14 — صفحة الباقات صارت جدول مقارنة على نسق اللاندنج بيج</w:t>
+        <w:t xml:space="preserve">تعديل رقم 15 — مؤشّر الباقات صار اختياراً بخطوات لا شريط تقدّم</w:t>
       </w:r>
     </w:p>
     <w:p>
@@ -3956,7 +4025,7 @@
                 <w:szCs w:val="19"/>
                 <w:rtl/>
               </w:rPr>
-              <w:t xml:space="preserve">10 سبتمبر 2026</w:t>
+              <w:t xml:space="preserve">13 سبتمبر 2026</w:t>
             </w:r>
           </w:p>
         </w:tc>
@@ -4076,7 +4145,7 @@
                 <w:szCs w:val="19"/>
                 <w:rtl/>
               </w:rPr>
-              <w:t xml:space="preserve">8bc9d51</w:t>
+              <w:t xml:space="preserve">3cec803</w:t>
             </w:r>
           </w:p>
         </w:tc>
@@ -4137,7 +4206,7 @@
           <w:szCs w:val="21"/>
           <w:rtl/>
         </w:rPr>
-        <w:t xml:space="preserve">كانت الصفحة تعرض باقة واحدة في كل مرة: المؤشر يختار الباقة، وكارت واحد يعرض سعرها، وقائمة مسطّحة تؤشّر على مزاياها. مقارنة باقتين كانت تعني سحب المؤشر جيئة وذهاباً وحفظ ما رأيته — وهو بالضبط ما يفعله من يختار باقة.</w:t>
+        <w:t xml:space="preserve">كان حقل range يلوّن المسار بالأزرق من البداية حتى المؤشّر، وهذا يقول «أنت قطعت 40% من شيء». الباقات أربع خيارات منفصلة لا كمية تتراكم، فكانت التعبئة تدّعي معنى لا يملكه العنصر، وجعلت الصف يبدو شريط تحميل.</w:t>
       </w:r>
     </w:p>
     <w:p>
@@ -4159,7 +4228,7 @@
           <w:szCs w:val="21"/>
           <w:rtl/>
         </w:rPr>
-        <w:t xml:space="preserve">صارت الأربع باقات جنباً إلى جنب كأعمدة، كل عمود بسعره وتوفيره السنوي وزرّه، فوق جدول صفوفه مقسومة إلى «الأساسيات» و«المزايا».</w:t>
+        <w:t xml:space="preserve">صار المسار رمادياً من طرف إلى طرف والحالة كلها في النقاط: نقاط مفرغة للباقات الأخرى، وحلقة للمختارة، وسقف المحادثات في فقاعة فوقها. لا شيء ممتلئ فلا شيء يُقرأ كتقدّم.</w:t>
       </w:r>
     </w:p>
     <w:p>
@@ -4181,7 +4250,7 @@
           <w:szCs w:val="21"/>
           <w:rtl/>
         </w:rPr>
-        <w:t xml:space="preserve">المؤشر بقي لكنه صار يرشّح ويلوّن العمود المناسب فقط، فكل زر يعمل على باقته لا على ما يشير إليه المؤشر.</w:t>
+        <w:t xml:space="preserve">حُذف صف الأرقام تحت المسار معه؛ صار المعروض القيمة المختارة وحدها بدل أربعة أرقام تزاحمها.</w:t>
       </w:r>
     </w:p>
     <w:p>
@@ -4203,7 +4272,7 @@
           <w:szCs w:val="21"/>
           <w:rtl/>
         </w:rPr>
-        <w:t xml:space="preserve">المزايا في البيانات ليست تراكمية: كل باقة تسرد إضافاتها خلف سطر «كل مزايا باقة X». مصفوفة includes() بسيطة كانت ستضع «—» أمام كل ميزة موروثة وتُظهر الباقة الأعلى أفقر من الأدنى، فحُلّت الوراثة إلى ✓ حقيقية وحُذفت أسطر الإشارة.</w:t>
+        <w:t xml:space="preserve">دعم الكيبورد باقٍ ومُوجَّه بصرياً: في RTL السهم الأيسر ينتقل للباقة الأكبر لأن الأكبر هناك، وHome وEnd للطرفين.</w:t>
       </w:r>
     </w:p>
     <w:p>
@@ -4225,7 +4294,7 @@
           <w:szCs w:val="21"/>
           <w:rtl/>
         </w:rPr>
-        <w:t xml:space="preserve">عطل كنت سأُدخله: نافذة تأكيد التخفيض كانت تقرأ السعر من المؤشر — صحيح حين كان المؤشر هو المُختار، وخطأ مع أزرار لكل عمود. صارت الأسعار تُشتق من الباقة المختارة.</w:t>
+        <w:t xml:space="preserve">فخّ RTL أول: start-* تُترجم إلى right، فاقترانها بـ ‎-translate-x-1/2 أزاح سهم الفقاعة عن المؤشّر بنصف عرضه. قِسته فطلع 8px — صار السهم يستخدم left الفيزيائي والانحراف صفر.</w:t>
       </w:r>
     </w:p>
     <w:p>
@@ -4247,7 +4316,7 @@
           <w:szCs w:val="21"/>
           <w:rtl/>
         </w:rPr>
-        <w:t xml:space="preserve">نسبة الخصم السنوي تُحسب من الأسعار (17%) بدل أن تُكتب يدوياً.</w:t>
+        <w:t xml:space="preserve">فخّ RTL ثانٍ: عند الطرفين تخرج الفقاعة المتوسّطة عن الشاشة الضيقة، فصارت تتعلّق من الجهة الداخلية للمؤشّر والسهم يتبعها.</w:t>
       </w:r>
     </w:p>
     <w:p>
@@ -4269,7 +4338,7 @@
           <w:szCs w:val="21"/>
           <w:rtl/>
         </w:rPr>
-        <w:t xml:space="preserve">اختُبر في المتصفح: الأعمدة الأربعة تُرسم، والأسماء والأسعار والأزرار كلٌّ على سطر واحد في الدورتين، وعمود العناوين يثبت أثناء التمرير الأفقي، ولا تجاوز أفقي عند 400px.</w:t>
+        <w:t xml:space="preserve">اختُبر في المتصفح: خلفية المسار تُحسب لوناً مصمتاً بلا تدرّج، والنقاط الأربع موزّعة بالتساوي، والأسهم والنقر يحرّكان الاختيار، والفقاعة وسهمها على مركز المؤشّر بالبكسل، والفقاعة تسع داخل المحتوى عند 1440 و1024 و768.</w:t>
       </w:r>
     </w:p>
     <w:p>
@@ -4291,7 +4360,7 @@
           <w:szCs w:val="21"/>
           <w:rtl/>
         </w:rPr>
-        <w:t xml:space="preserve">فرق باقٍ عن اللاندنج بيج: هناك خمس مجموعات مسمّاة للمزايا، وهنا مجموعتان، لأن features في موديول الباقات مجرد string[] بلا تصنيف. التقسيم الكامل يحتاج حقل تصنيف في محرّر الباقات عند الأدمن.</w:t>
+        <w:t xml:space="preserve">تحت ~500px لا تسع الفقاعة لأن الشريط الجانبي يبقى مفتوحاً ويترك للصفحة 160px فقط — يخصّ الصفحة كلها لا هذا العنصر، وتُرك كما هو.</w:t>
       </w:r>
     </w:p>
     <w:p>
@@ -4316,7 +4385,7 @@
           <w:szCs w:val="24"/>
           <w:rtl/>
         </w:rPr>
-        <w:t xml:space="preserve">تعديل رقم 13 — تعطيل المصادقة الثنائية صار يتطلّب كلمة المرور أو رمزاً</w:t>
+        <w:t xml:space="preserve">تعديل رقم 14 — صفحة الباقات صارت جدول مقارنة على نسق اللاندنج بيج</w:t>
       </w:r>
     </w:p>
     <w:p>
@@ -4593,7 +4662,7 @@
                 <w:szCs w:val="19"/>
                 <w:rtl/>
               </w:rPr>
-              <w:t xml:space="preserve">الإعدادات ← الأمان</w:t>
+              <w:t xml:space="preserve">الباقات والاشتراك</w:t>
             </w:r>
           </w:p>
         </w:tc>
@@ -4623,7 +4692,7 @@
                 <w:szCs w:val="19"/>
                 <w:rtl/>
               </w:rPr>
-              <w:t xml:space="preserve">/settings/security</w:t>
+              <w:t xml:space="preserve">/subscribe</w:t>
             </w:r>
           </w:p>
         </w:tc>
@@ -4653,7 +4722,7 @@
                 <w:szCs w:val="19"/>
                 <w:rtl/>
               </w:rPr>
-              <w:t xml:space="preserve">src/pages/Settings.tsx · src/store/useAuthStore.ts</w:t>
+              <w:t xml:space="preserve">src/pages/Subscribe.tsx</w:t>
             </w:r>
           </w:p>
         </w:tc>
@@ -4683,7 +4752,7 @@
                 <w:szCs w:val="19"/>
                 <w:rtl/>
               </w:rPr>
-              <w:t xml:space="preserve">aedca85</w:t>
+              <w:t xml:space="preserve">8bc9d51</w:t>
             </w:r>
           </w:p>
         </w:tc>
@@ -4744,7 +4813,7 @@
           <w:szCs w:val="21"/>
           <w:rtl/>
         </w:rPr>
-        <w:t xml:space="preserve">كان التعطيل نافذة تأكيد ولا شيء غيرها، فكانت الحماية بقوة تبويب مفتوح بلا رقيب: من يصل إلى صفحة الإعدادات يطفئها، وبعدها كلمة المرور وحدها تفتح الحساب ولا يعود الهاتف يعني شيئاً.</w:t>
+        <w:t xml:space="preserve">كانت الصفحة تعرض باقة واحدة في كل مرة: المؤشر يختار الباقة، وكارت واحد يعرض سعرها، وقائمة مسطّحة تؤشّر على مزاياها. مقارنة باقتين كانت تعني سحب المؤشر جيئة وذهاباً وحفظ ما رأيته — وهو بالضبط ما يفعله من يختار باقة.</w:t>
       </w:r>
     </w:p>
     <w:p>
@@ -4766,7 +4835,7 @@
           <w:szCs w:val="21"/>
           <w:rtl/>
         </w:rPr>
-        <w:t xml:space="preserve">صار التعطيل يكلّف نفس الإثبات الذي يكلّفه تجاوز الشاشة: كلمة المرور افتراضياً، أو رمز من تطبيق المصادقة عبر رابط داخل النافذة.</w:t>
+        <w:t xml:space="preserve">صارت الأربع باقات جنباً إلى جنب كأعمدة، كل عمود بسعره وتوفيره السنوي وزرّه، فوق جدول صفوفه مقسومة إلى «الأساسيات» و«المزايا».</w:t>
       </w:r>
     </w:p>
     <w:p>
@@ -4788,7 +4857,7 @@
           <w:szCs w:val="21"/>
           <w:rtl/>
         </w:rPr>
-        <w:t xml:space="preserve">الرموز الاحتياطية مقبولة في نفس الحقل، لأن فاقد هاتفه يحتاج طريقة يطفّيها بها.</w:t>
+        <w:t xml:space="preserve">المؤشر بقي لكنه صار يرشّح ويلوّن العمود المناسب فقط، فكل زر يعمل على باقته لا على ما يشير إليه المؤشر.</w:t>
       </w:r>
     </w:p>
     <w:p>
@@ -4810,7 +4879,7 @@
           <w:szCs w:val="21"/>
           <w:rtl/>
         </w:rPr>
-        <w:t xml:space="preserve">قُبل العاملان معاً عن قصد: من يشكّ أن كلمة مروره تسرّبت يحتاج مساراً لا يمرّ بها.</w:t>
+        <w:t xml:space="preserve">المزايا في البيانات ليست تراكمية: كل باقة تسرد إضافاتها خلف سطر «كل مزايا باقة X». مصفوفة includes() بسيطة كانت ستضع «—» أمام كل ميزة موروثة وتُظهر الباقة الأعلى أفقر من الأدنى، فحُلّت الوراثة إلى ✓ حقيقية وحُذفت أسطر الإشارة.</w:t>
       </w:r>
     </w:p>
     <w:p>
@@ -4832,7 +4901,7 @@
           <w:szCs w:val="21"/>
           <w:rtl/>
         </w:rPr>
-        <w:t xml:space="preserve">حدّ خمس محاولات. رمز من ست خانات بلا سقف محاولات ليس عاملاً ثانياً.</w:t>
+        <w:t xml:space="preserve">عطل كنت سأُدخله: نافذة تأكيد التخفيض كانت تقرأ السعر من المؤشر — صحيح حين كان المؤشر هو المُختار، وخطأ مع أزرار لكل عمود. صارت الأسعار تُشتق من الباقة المختارة.</w:t>
       </w:r>
     </w:p>
     <w:p>
@@ -4854,7 +4923,7 @@
           <w:szCs w:val="21"/>
           <w:rtl/>
         </w:rPr>
-        <w:t xml:space="preserve">اختُبرت خمسة مسارات في المتصفح: كلمة مرور خاطئة تُبقيها مفعّلة وتُظهر الخطأ؛ كلمة المرور الصحيحة ورمز TOTP حيّ ورمز احتياطي كلٌّ منها يعطّلها؛ وخمس محاولات خاطئة تُقفل النافذة و2FA ما زالت مفعّلة.</w:t>
+        <w:t xml:space="preserve">نسبة الخصم السنوي تُحسب من الأسعار (17%) بدل أن تُكتب يدوياً.</w:t>
       </w:r>
     </w:p>
     <w:p>
@@ -4876,7 +4945,29 @@
           <w:szCs w:val="21"/>
           <w:rtl/>
         </w:rPr>
-        <w:t xml:space="preserve">هذه الخطوة لم تكن موجودة أصلاً ولم تُحذف — تأكّدت من ذلك بمراجعة النسخة السابقة للكود (743042c^) قبل الشروع في البناء.</w:t>
+        <w:t xml:space="preserve">اختُبر في المتصفح: الأعمدة الأربعة تُرسم، والأسماء والأسعار والأزرار كلٌّ على سطر واحد في الدورتين، وعمود العناوين يثبت أثناء التمرير الأفقي، ولا تجاوز أفقي عند 400px.</w:t>
+      </w:r>
+    </w:p>
+    <w:p>
+      <w:pPr>
+        <w:pStyle w:val="ListParagraph"/>
+        <w:numPr>
+          <w:ilvl w:val="0"/>
+          <w:numId w:val="2"/>
+        </w:numPr>
+        <w:bidi/>
+        <w:spacing w:after="70" w:line="290"/>
+        <w:jc w:val="right"/>
+      </w:pPr>
+      <w:r>
+        <w:rPr>
+          <w:rFonts w:ascii="Arial" w:cs="Arial" w:eastAsia="Arial" w:hAnsi="Arial"/>
+          <w:color w:val="1E293B"/>
+          <w:sz w:val="21"/>
+          <w:szCs w:val="21"/>
+          <w:rtl/>
+        </w:rPr>
+        <w:t xml:space="preserve">فرق باقٍ عن اللاندنج بيج: هناك خمس مجموعات مسمّاة للمزايا، وهنا مجموعتان، لأن features في موديول الباقات مجرد string[] بلا تصنيف. التقسيم الكامل يحتاج حقل تصنيف في محرّر الباقات عند الأدمن.</w:t>
       </w:r>
     </w:p>
     <w:p>
@@ -4901,7 +4992,7 @@
           <w:szCs w:val="24"/>
           <w:rtl/>
         </w:rPr>
-        <w:t xml:space="preserve">تعديل رقم 12 — رمز QR حقيقي قابل للمسح في إعداد المصادقة الثنائية</w:t>
+        <w:t xml:space="preserve">تعديل رقم 13 — تعطيل المصادقة الثنائية صار يتطلّب كلمة المرور أو رمزاً</w:t>
       </w:r>
     </w:p>
     <w:p>
@@ -5208,7 +5299,7 @@
                 <w:szCs w:val="19"/>
                 <w:rtl/>
               </w:rPr>
-              <w:t xml:space="preserve">/settings</w:t>
+              <w:t xml:space="preserve">/settings/security</w:t>
             </w:r>
           </w:p>
         </w:tc>
@@ -5238,7 +5329,7 @@
                 <w:szCs w:val="19"/>
                 <w:rtl/>
               </w:rPr>
-              <w:t xml:space="preserve">src/components/ui/QrCode.tsx · src/pages/Settings.tsx · src/utils/twoFactor.ts</w:t>
+              <w:t xml:space="preserve">src/pages/Settings.tsx · src/store/useAuthStore.ts</w:t>
             </w:r>
           </w:p>
         </w:tc>
@@ -5268,7 +5359,7 @@
                 <w:szCs w:val="19"/>
                 <w:rtl/>
               </w:rPr>
-              <w:t xml:space="preserve">e5a121d</w:t>
+              <w:t xml:space="preserve">aedca85</w:t>
             </w:r>
           </w:p>
         </w:tc>
@@ -5329,7 +5420,7 @@
           <w:szCs w:val="21"/>
           <w:rtl/>
         </w:rPr>
-        <w:t xml:space="preserve">كان المعروض رسمة SVG مربّعات مرصوفة يدوياً تشبه رمز QR ولا تحمل أي بيانات، فلا يقرأها أي تطبيق مصادقة. الطريقة الوحيدة للربط كانت نسخ المفتاح يدوياً.</w:t>
+        <w:t xml:space="preserve">كان التعطيل نافذة تأكيد ولا شيء غيرها، فكانت الحماية بقوة تبويب مفتوح بلا رقيب: من يصل إلى صفحة الإعدادات يطفئها، وبعدها كلمة المرور وحدها تفتح الحساب ولا يعود الهاتف يعني شيئاً.</w:t>
       </w:r>
     </w:p>
     <w:p>
@@ -5351,7 +5442,7 @@
           <w:szCs w:val="21"/>
           <w:rtl/>
         </w:rPr>
-        <w:t xml:space="preserve">صار الرمز يُولَّد فعلياً من رابط otpauth:// بمكتبة qrcode.</w:t>
+        <w:t xml:space="preserve">صار التعطيل يكلّف نفس الإثبات الذي يكلّفه تجاوز الشاشة: كلمة المرور افتراضياً، أو رمز من تطبيق المصادقة عبر رابط داخل النافذة.</w:t>
       </w:r>
     </w:p>
     <w:p>
@@ -5373,7 +5464,7 @@
           <w:szCs w:val="21"/>
           <w:rtl/>
         </w:rPr>
-        <w:t xml:space="preserve">تحقّقت منه بالتصوير والفكّ لا بالنظر: صوّرت العنصر المرسوم على الشاشة وفككته بقارئ QR، فرجع الرابط المتوقّع — في الوضع الفاتح والداكن.</w:t>
+        <w:t xml:space="preserve">الرموز الاحتياطية مقبولة في نفس الحقل، لأن فاقد هاتفه يحتاج طريقة يطفّيها بها.</w:t>
       </w:r>
     </w:p>
     <w:p>
@@ -5395,7 +5486,7 @@
           <w:szCs w:val="21"/>
           <w:rtl/>
         </w:rPr>
-        <w:t xml:space="preserve">ثُبّت الرمز أبيض على أسود بصرف النظر عن الثيم. لو ورث currentColor لانقلبت ألوانه في الوضع الداكن وتعذّر مسحه.</w:t>
+        <w:t xml:space="preserve">قُبل العاملان معاً عن قصد: من يشكّ أن كلمة مروره تسرّبت يحتاج مساراً لا يمرّ بها.</w:t>
       </w:r>
     </w:p>
     <w:p>
@@ -5417,7 +5508,7 @@
           <w:szCs w:val="21"/>
           <w:rtl/>
         </w:rPr>
-        <w:t xml:space="preserve">أُضيفت algorithm وdigits وperiod صراحةً إلى الرابط. Google Authenticator يفترض SHA1/6/30، أما Authy و1Password فلا، وافتراض مختلف يولّد رموزاً يرفضها التحقق عندنا.</w:t>
+        <w:t xml:space="preserve">حدّ خمس محاولات. رمز من ست خانات بلا سقف محاولات ليس عاملاً ثانياً.</w:t>
       </w:r>
     </w:p>
     <w:p>
@@ -5439,7 +5530,7 @@
           <w:szCs w:val="21"/>
           <w:rtl/>
         </w:rPr>
-        <w:t xml:space="preserve">عدد الخانات صار ثابتاً واحداً يقرأه المولّد والرابط معاً، فلا ينفصلان.</w:t>
+        <w:t xml:space="preserve">اختُبرت خمسة مسارات في المتصفح: كلمة مرور خاطئة تُبقيها مفعّلة وتُظهر الخطأ؛ كلمة المرور الصحيحة ورمز TOTP حيّ ورمز احتياطي كلٌّ منها يعطّلها؛ وخمس محاولات خاطئة تُقفل النافذة و2FA ما زالت مفعّلة.</w:t>
       </w:r>
     </w:p>
     <w:p>
@@ -5461,29 +5552,7 @@
           <w:szCs w:val="21"/>
           <w:rtl/>
         </w:rPr>
-        <w:t xml:space="preserve">المكتبة تُحمَّل بـ dynamic import عند فتح النافذة فقط، فحزمة الإعدادات بقيت ~50KB بدل 74KB.</w:t>
-      </w:r>
-    </w:p>
-    <w:p>
-      <w:pPr>
-        <w:pStyle w:val="ListParagraph"/>
-        <w:numPr>
-          <w:ilvl w:val="0"/>
-          <w:numId w:val="2"/>
-        </w:numPr>
-        <w:bidi/>
-        <w:spacing w:after="70" w:line="290"/>
-        <w:jc w:val="right"/>
-      </w:pPr>
-      <w:r>
-        <w:rPr>
-          <w:rFonts w:ascii="Arial" w:cs="Arial" w:eastAsia="Arial" w:hAnsi="Arial"/>
-          <w:color w:val="1E293B"/>
-          <w:sz w:val="21"/>
-          <w:szCs w:val="21"/>
-          <w:rtl/>
-        </w:rPr>
-        <w:t xml:space="preserve">يبقى المفتاح واحداً لكل الحسابات (ثابت في الكود)، فالربط يثبت صحّة الآلية لا أكثر — التوليد لكل مستخدم مكانه الخادم.</w:t>
+        <w:t xml:space="preserve">هذه الخطوة لم تكن موجودة أصلاً ولم تُحذف — تأكّدت من ذلك بمراجعة النسخة السابقة للكود (743042c^) قبل الشروع في البناء.</w:t>
       </w:r>
     </w:p>
     <w:p>
@@ -5508,7 +5577,7 @@
           <w:szCs w:val="24"/>
           <w:rtl/>
         </w:rPr>
-        <w:t xml:space="preserve">تعديل رقم 11 — رقم جوال اختياري في الملف الشخصي</w:t>
+        <w:t xml:space="preserve">تعديل رقم 12 — رمز QR حقيقي قابل للمسح في إعداد المصادقة الثنائية</w:t>
       </w:r>
     </w:p>
     <w:p>
@@ -5785,7 +5854,7 @@
                 <w:szCs w:val="19"/>
                 <w:rtl/>
               </w:rPr>
-              <w:t xml:space="preserve">الإعدادات ← الملف الشخصي</w:t>
+              <w:t xml:space="preserve">الإعدادات ← الأمان</w:t>
             </w:r>
           </w:p>
         </w:tc>
@@ -5845,7 +5914,7 @@
                 <w:szCs w:val="19"/>
                 <w:rtl/>
               </w:rPr>
-              <w:t xml:space="preserve">src/pages/Settings.tsx · src/store/useAuthStore.ts</w:t>
+              <w:t xml:space="preserve">src/components/ui/QrCode.tsx · src/pages/Settings.tsx · src/utils/twoFactor.ts</w:t>
             </w:r>
           </w:p>
         </w:tc>
@@ -5875,7 +5944,7 @@
                 <w:szCs w:val="19"/>
                 <w:rtl/>
               </w:rPr>
-              <w:t xml:space="preserve">27dc01f</w:t>
+              <w:t xml:space="preserve">e5a121d</w:t>
             </w:r>
           </w:p>
         </w:tc>
@@ -5936,7 +6005,7 @@
           <w:szCs w:val="21"/>
           <w:rtl/>
         </w:rPr>
-        <w:t xml:space="preserve">كان الملف الشخصي يجمع اسم العرض والبريد فقط، فلا سبيل للوصول لصاحب الحساب خارج صندوق الوارد.</w:t>
+        <w:t xml:space="preserve">كان المعروض رسمة SVG مربّعات مرصوفة يدوياً تشبه رمز QR ولا تحمل أي بيانات، فلا يقرأها أي تطبيق مصادقة. الطريقة الوحيدة للربط كانت نسخ المفتاح يدوياً.</w:t>
       </w:r>
     </w:p>
     <w:p>
@@ -5958,7 +6027,7 @@
           <w:szCs w:val="21"/>
           <w:rtl/>
         </w:rPr>
-        <w:t xml:space="preserve">استُخدم مكوّن PhoneField نفسه المستعمل في جهات الاتصال ودعوة الموظفين، فجاء معه منتقي الدولة ورمز الاتصال بدل حقل نصّي حرّ.</w:t>
+        <w:t xml:space="preserve">صار الرمز يُولَّد فعلياً من رابط otpauth:// بمكتبة qrcode.</w:t>
       </w:r>
     </w:p>
     <w:p>
@@ -5980,7 +6049,7 @@
           <w:szCs w:val="21"/>
           <w:rtl/>
         </w:rPr>
-        <w:t xml:space="preserve">الحقل اختياري ويحمل وسم «(اختياري)» بنفس أسلوب باقي الحقول غير الإلزامية.</w:t>
+        <w:t xml:space="preserve">تحقّقت منه بالتصوير والفكّ لا بالنظر: صوّرت العنصر المرسوم على الشاشة وفككته بقارئ QR، فرجع الرابط المتوقّع — في الوضع الفاتح والداكن.</w:t>
       </w:r>
     </w:p>
     <w:p>
@@ -6002,7 +6071,7 @@
           <w:szCs w:val="21"/>
           <w:rtl/>
         </w:rPr>
-        <w:t xml:space="preserve">الرقم لا يُخزَّن إلا إذا كُتب فعلاً، حتى لا يبقى رمز دولة وحده متظاهراً بأنه رقم بعد تفريغ الحقل.</w:t>
+        <w:t xml:space="preserve">ثُبّت الرمز أبيض على أسود بصرف النظر عن الثيم. لو ورث currentColor لانقلبت ألوانه في الوضع الداكن وتعذّر مسحه.</w:t>
       </w:r>
     </w:p>
     <w:p>
@@ -6024,7 +6093,7 @@
           <w:szCs w:val="21"/>
           <w:rtl/>
         </w:rPr>
-        <w:t xml:space="preserve">عند التحميل يُفصل الرقم المحفوظ إلى رمز دولة ورقم محلي بمطابقة أطول رمز — لا بتعبير نمطي جشع، لأن ذلك كان سيقرأ ‎+96891234567 على أنه ‎+9689 ويشوّه الباقي.</w:t>
+        <w:t xml:space="preserve">أُضيفت algorithm وdigits وperiod صراحةً إلى الرابط. Google Authenticator يفترض SHA1/6/30، أما Authy و1Password فلا، وافتراض مختلف يولّد رموزاً يرفضها التحقق عندنا.</w:t>
       </w:r>
     </w:p>
     <w:p>
@@ -6046,7 +6115,51 @@
           <w:szCs w:val="21"/>
           <w:rtl/>
         </w:rPr>
-        <w:t xml:space="preserve">عوينت النتيجة في المتصفح: حفظ 91234567 مع ‎+968 خزّنه ‎+96891234567، وبعد إعادة التحميل رجع مقسوماً صحيحاً.</w:t>
+        <w:t xml:space="preserve">عدد الخانات صار ثابتاً واحداً يقرأه المولّد والرابط معاً، فلا ينفصلان.</w:t>
+      </w:r>
+    </w:p>
+    <w:p>
+      <w:pPr>
+        <w:pStyle w:val="ListParagraph"/>
+        <w:numPr>
+          <w:ilvl w:val="0"/>
+          <w:numId w:val="2"/>
+        </w:numPr>
+        <w:bidi/>
+        <w:spacing w:after="70" w:line="290"/>
+        <w:jc w:val="right"/>
+      </w:pPr>
+      <w:r>
+        <w:rPr>
+          <w:rFonts w:ascii="Arial" w:cs="Arial" w:eastAsia="Arial" w:hAnsi="Arial"/>
+          <w:color w:val="1E293B"/>
+          <w:sz w:val="21"/>
+          <w:szCs w:val="21"/>
+          <w:rtl/>
+        </w:rPr>
+        <w:t xml:space="preserve">المكتبة تُحمَّل بـ dynamic import عند فتح النافذة فقط، فحزمة الإعدادات بقيت ~50KB بدل 74KB.</w:t>
+      </w:r>
+    </w:p>
+    <w:p>
+      <w:pPr>
+        <w:pStyle w:val="ListParagraph"/>
+        <w:numPr>
+          <w:ilvl w:val="0"/>
+          <w:numId w:val="2"/>
+        </w:numPr>
+        <w:bidi/>
+        <w:spacing w:after="70" w:line="290"/>
+        <w:jc w:val="right"/>
+      </w:pPr>
+      <w:r>
+        <w:rPr>
+          <w:rFonts w:ascii="Arial" w:cs="Arial" w:eastAsia="Arial" w:hAnsi="Arial"/>
+          <w:color w:val="1E293B"/>
+          <w:sz w:val="21"/>
+          <w:szCs w:val="21"/>
+          <w:rtl/>
+        </w:rPr>
+        <w:t xml:space="preserve">يبقى المفتاح واحداً لكل الحسابات (ثابت في الكود)، فالربط يثبت صحّة الآلية لا أكثر — التوليد لكل مستخدم مكانه الخادم.</w:t>
       </w:r>
     </w:p>
     <w:p>
@@ -6071,7 +6184,7 @@
           <w:szCs w:val="24"/>
           <w:rtl/>
         </w:rPr>
-        <w:t xml:space="preserve">تعديل رقم 10 — شاشة التحقق بخطوتين في تسجيل الدخول</w:t>
+        <w:t xml:space="preserve">تعديل رقم 11 — رقم جوال اختياري في الملف الشخصي</w:t>
       </w:r>
     </w:p>
     <w:p>
@@ -6348,7 +6461,7 @@
                 <w:szCs w:val="19"/>
                 <w:rtl/>
               </w:rPr>
-              <w:t xml:space="preserve">تسجيل الدخول</w:t>
+              <w:t xml:space="preserve">الإعدادات ← الملف الشخصي</w:t>
             </w:r>
           </w:p>
         </w:tc>
@@ -6378,7 +6491,7 @@
                 <w:szCs w:val="19"/>
                 <w:rtl/>
               </w:rPr>
-              <w:t xml:space="preserve">/login</w:t>
+              <w:t xml:space="preserve">/settings</w:t>
             </w:r>
           </w:p>
         </w:tc>
@@ -6408,7 +6521,7 @@
                 <w:szCs w:val="19"/>
                 <w:rtl/>
               </w:rPr>
-              <w:t xml:space="preserve">src/utils/twoFactor.ts · src/components/auth/TwoFactorChallenge.tsx · src/store/useAuthStore.ts · src/pages/Login.tsx</w:t>
+              <w:t xml:space="preserve">src/pages/Settings.tsx · src/store/useAuthStore.ts</w:t>
             </w:r>
           </w:p>
         </w:tc>
@@ -6438,7 +6551,7 @@
                 <w:szCs w:val="19"/>
                 <w:rtl/>
               </w:rPr>
-              <w:t xml:space="preserve">743042c</w:t>
+              <w:t xml:space="preserve">27dc01f</w:t>
             </w:r>
           </w:p>
         </w:tc>
@@ -6499,7 +6612,7 @@
           <w:szCs w:val="21"/>
           <w:rtl/>
         </w:rPr>
-        <w:t xml:space="preserve">⚠️ هيكل واجهة لا أمان: التحقق يجري في المتصفح والمفتاح السري داخل حزمة الجافاسكربت، فيمكن تجاوزه. الغرض تجهيز الواجهة والعقد لحين وجود باكيند، وهذا مكتوب صراحةً في رأس ملف twoFactor.ts.</w:t>
+        <w:t xml:space="preserve">كان الملف الشخصي يجمع اسم العرض والبريد فقط، فلا سبيل للوصول لصاحب الحساب خارج صندوق الوارد.</w:t>
       </w:r>
     </w:p>
     <w:p>
@@ -6521,7 +6634,7 @@
           <w:szCs w:val="21"/>
           <w:rtl/>
         </w:rPr>
-        <w:t xml:space="preserve">كان الدخول يوثّق فوراً بعد كلمة المرور. صار مرحلتين: كلمة المرور تنتج حالة معلّقة في الذاكرة فقط، ولا يُكتب شيء في التخزين حتى يمرّ العامل الثاني — فإغلاق التبويب في منتصف العملية لا يترك جلسة مفتوحة.</w:t>
+        <w:t xml:space="preserve">استُخدم مكوّن PhoneField نفسه المستعمل في جهات الاتصال ودعوة الموظفين، فجاء معه منتقي الدولة ورمز الاتصال بدل حقل نصّي حرّ.</w:t>
       </w:r>
     </w:p>
     <w:p>
@@ -6543,7 +6656,7 @@
           <w:szCs w:val="21"/>
           <w:rtl/>
         </w:rPr>
-        <w:t xml:space="preserve">شاشة التحقق تظهر داخل مسار الدخول نفسه لا على عنوان مستقل، لأن عنواناً مستقلاً يفتحه أي شخص دون المرور بالمرحلة الأولى.</w:t>
+        <w:t xml:space="preserve">الحقل اختياري ويحمل وسم «(اختياري)» بنفس أسلوب باقي الحقول غير الإلزامية.</w:t>
       </w:r>
     </w:p>
     <w:p>
@@ -6565,7 +6678,7 @@
           <w:szCs w:val="21"/>
           <w:rtl/>
         </w:rPr>
-        <w:t xml:space="preserve">نُفِّذت خوارزمية TOTP (المعيار RFC 6238) بـ Web Crypto، فأكواد Google Authenticator الحقيقية تُقبل فعلاً. تحقّقت من التنفيذ بمتجهات الاختبار الخمسة الواردة في المعيار نفسه وكلها طابقت.</w:t>
+        <w:t xml:space="preserve">الرقم لا يُخزَّن إلا إذا كُتب فعلاً، حتى لا يبقى رمز دولة وحده متظاهراً بأنه رقم بعد تفريغ الحقل.</w:t>
       </w:r>
     </w:p>
     <w:p>
@@ -6587,7 +6700,7 @@
           <w:szCs w:val="21"/>
           <w:rtl/>
         </w:rPr>
-        <w:t xml:space="preserve">نافذة تسامح خطوة واحدة قبل وبعد لاستيعاب فروق ساعة الجهاز.</w:t>
+        <w:t xml:space="preserve">عند التحميل يُفصل الرقم المحفوظ إلى رمز دولة ورقم محلي بمطابقة أطول رمز — لا بتعبير نمطي جشع، لأن ذلك كان سيقرأ ‎+96891234567 على أنه ‎+9689 ويشوّه الباقي.</w:t>
       </w:r>
     </w:p>
     <w:p>
@@ -6609,205 +6722,7 @@
           <w:szCs w:val="21"/>
           <w:rtl/>
         </w:rPr>
-        <w:t xml:space="preserve">ستة مربعات بانتقال تلقائي بين الخانات ودعم اللصق وإرسال تلقائي عند اكتمال الرمز.</w:t>
-      </w:r>
-    </w:p>
-    <w:p>
-      <w:pPr>
-        <w:pStyle w:val="ListParagraph"/>
-        <w:numPr>
-          <w:ilvl w:val="0"/>
-          <w:numId w:val="2"/>
-        </w:numPr>
-        <w:bidi/>
-        <w:spacing w:after="70" w:line="290"/>
-        <w:jc w:val="right"/>
-      </w:pPr>
-      <w:r>
-        <w:rPr>
-          <w:rFonts w:ascii="Arial" w:cs="Arial" w:eastAsia="Arial" w:hAnsi="Arial"/>
-          <w:color w:val="1E293B"/>
-          <w:sz w:val="21"/>
-          <w:szCs w:val="21"/>
-          <w:rtl/>
-        </w:rPr>
-        <w:t xml:space="preserve">لا يوجد زر «إعادة إرسال» — التطبيق يولّد الرمز على الجهاز ولا شيء يُرسَل. وُضع مكانه عدّاد يبيّن الثواني المتبقية قبل تغيّر الرمز، فلا ينتظر الموظف رسالة لن تصل.</w:t>
-      </w:r>
-    </w:p>
-    <w:p>
-      <w:pPr>
-        <w:pStyle w:val="ListParagraph"/>
-        <w:numPr>
-          <w:ilvl w:val="0"/>
-          <w:numId w:val="2"/>
-        </w:numPr>
-        <w:bidi/>
-        <w:spacing w:after="70" w:line="290"/>
-        <w:jc w:val="right"/>
-      </w:pPr>
-      <w:r>
-        <w:rPr>
-          <w:rFonts w:ascii="Arial" w:cs="Arial" w:eastAsia="Arial" w:hAnsi="Arial"/>
-          <w:color w:val="1E293B"/>
-          <w:sz w:val="21"/>
-          <w:szCs w:val="21"/>
-          <w:rtl/>
-        </w:rPr>
-        <w:t xml:space="preserve">مسار الرموز الاحتياطية داخل الشاشة نفسها، لأن فاقد هاتفه بلا رمز احتياطي يُقفل خارج حسابه نهائياً.</w:t>
-      </w:r>
-    </w:p>
-    <w:p>
-      <w:pPr>
-        <w:pStyle w:val="ListParagraph"/>
-        <w:numPr>
-          <w:ilvl w:val="0"/>
-          <w:numId w:val="2"/>
-        </w:numPr>
-        <w:bidi/>
-        <w:spacing w:after="70" w:line="290"/>
-        <w:jc w:val="right"/>
-      </w:pPr>
-      <w:r>
-        <w:rPr>
-          <w:rFonts w:ascii="Arial" w:cs="Arial" w:eastAsia="Arial" w:hAnsi="Arial"/>
-          <w:color w:val="1E293B"/>
-          <w:sz w:val="21"/>
-          <w:szCs w:val="21"/>
-          <w:rtl/>
-        </w:rPr>
-        <w:t xml:space="preserve">رسالة الخطأ واحدة للرمز الخاطئ وللمنتهي عمداً، حتى لا تُعطي المهاجم معلومة يفرّق بها.</w:t>
-      </w:r>
-    </w:p>
-    <w:p>
-      <w:pPr>
-        <w:pStyle w:val="ListParagraph"/>
-        <w:numPr>
-          <w:ilvl w:val="0"/>
-          <w:numId w:val="2"/>
-        </w:numPr>
-        <w:bidi/>
-        <w:spacing w:after="70" w:line="290"/>
-        <w:jc w:val="right"/>
-      </w:pPr>
-      <w:r>
-        <w:rPr>
-          <w:rFonts w:ascii="Arial" w:cs="Arial" w:eastAsia="Arial" w:hAnsi="Arial"/>
-          <w:color w:val="1E293B"/>
-          <w:sz w:val="21"/>
-          <w:szCs w:val="21"/>
-          <w:rtl/>
-        </w:rPr>
-        <w:t xml:space="preserve">حدّ خمس محاولات ثم قفل خمس دقائق — وهذا في الواجهة للتوثيق فقط، ومكانه الصحيح الخادم.</w:t>
-      </w:r>
-    </w:p>
-    <w:p>
-      <w:pPr>
-        <w:pStyle w:val="ListParagraph"/>
-        <w:numPr>
-          <w:ilvl w:val="0"/>
-          <w:numId w:val="2"/>
-        </w:numPr>
-        <w:bidi/>
-        <w:spacing w:after="70" w:line="290"/>
-        <w:jc w:val="right"/>
-      </w:pPr>
-      <w:r>
-        <w:rPr>
-          <w:rFonts w:ascii="Arial" w:cs="Arial" w:eastAsia="Arial" w:hAnsi="Arial"/>
-          <w:color w:val="1E293B"/>
-          <w:sz w:val="21"/>
-          <w:szCs w:val="21"/>
-          <w:rtl/>
-        </w:rPr>
-        <w:t xml:space="preserve">شاشة الإعداد في الإعدادات كانت تقبل أي ستة أرقام وتفعّل 2FA بناءً عليها. صارت تتحقق فعلياً، لأن التفعيل بعد مسح خاطئ للرمز يقفل صاحب الحساب خارج حسابه.</w:t>
-      </w:r>
-    </w:p>
-    <w:p>
-      <w:pPr>
-        <w:pStyle w:val="ListParagraph"/>
-        <w:numPr>
-          <w:ilvl w:val="0"/>
-          <w:numId w:val="2"/>
-        </w:numPr>
-        <w:bidi/>
-        <w:spacing w:after="70" w:line="290"/>
-        <w:jc w:val="right"/>
-      </w:pPr>
-      <w:r>
-        <w:rPr>
-          <w:rFonts w:ascii="Arial" w:cs="Arial" w:eastAsia="Arial" w:hAnsi="Arial"/>
-          <w:color w:val="1E293B"/>
-          <w:sz w:val="21"/>
-          <w:szCs w:val="21"/>
-          <w:rtl/>
-        </w:rPr>
-        <w:t xml:space="preserve">وُحّد المفتاح والرموز الاحتياطية بين شاشة الإعداد وشاشة الدخول في ملف واحد، فما يعرضه الـQR هو ما يُتحقّق منه.</w:t>
-      </w:r>
-    </w:p>
-    <w:p>
-      <w:pPr>
-        <w:pStyle w:val="ListParagraph"/>
-        <w:numPr>
-          <w:ilvl w:val="0"/>
-          <w:numId w:val="2"/>
-        </w:numPr>
-        <w:bidi/>
-        <w:spacing w:after="70" w:line="290"/>
-        <w:jc w:val="right"/>
-      </w:pPr>
-      <w:r>
-        <w:rPr>
-          <w:rFonts w:ascii="Arial" w:cs="Arial" w:eastAsia="Arial" w:hAnsi="Arial"/>
-          <w:color w:val="1E293B"/>
-          <w:sz w:val="21"/>
-          <w:szCs w:val="21"/>
-          <w:rtl/>
-        </w:rPr>
-        <w:t xml:space="preserve">حُذف الحقل المكرّر AppSettings.twoFactorEnabled — كان يُكتب عند التهيئة ولا يُقرأ في أي مكان، بينما الحقل الحيّ هو security.twoFactor. وجود علمين لنفس المعنى كان سيُظهر الميزة مفعّلة في شاشة ومطفأة في أخرى.</w:t>
-      </w:r>
-    </w:p>
-    <w:p>
-      <w:pPr>
-        <w:pStyle w:val="ListParagraph"/>
-        <w:numPr>
-          <w:ilvl w:val="0"/>
-          <w:numId w:val="2"/>
-        </w:numPr>
-        <w:bidi/>
-        <w:spacing w:after="70" w:line="290"/>
-        <w:jc w:val="right"/>
-      </w:pPr>
-      <w:r>
-        <w:rPr>
-          <w:rFonts w:ascii="Arial" w:cs="Arial" w:eastAsia="Arial" w:hAnsi="Arial"/>
-          <w:color w:val="1E293B"/>
-          <w:sz w:val="21"/>
-          <w:szCs w:val="21"/>
-          <w:rtl/>
-        </w:rPr>
-        <w:t xml:space="preserve">أخطأتُ في شرط الإرسال التلقائي: كتبت فحصاً يتضمّن includes('') وهو دائماً صحيح في جافاسكربت، فلم يكن الإرسال التلقائي يعمل إطلاقاً. كشفه اختبار المتصفح وأُصلح.</w:t>
-      </w:r>
-    </w:p>
-    <w:p>
-      <w:pPr>
-        <w:pStyle w:val="ListParagraph"/>
-        <w:numPr>
-          <w:ilvl w:val="0"/>
-          <w:numId w:val="2"/>
-        </w:numPr>
-        <w:bidi/>
-        <w:spacing w:after="70" w:line="290"/>
-        <w:jc w:val="right"/>
-      </w:pPr>
-      <w:r>
-        <w:rPr>
-          <w:rFonts w:ascii="Arial" w:cs="Arial" w:eastAsia="Arial" w:hAnsi="Arial"/>
-          <w:color w:val="1E293B"/>
-          <w:sz w:val="21"/>
-          <w:szCs w:val="21"/>
-          <w:rtl/>
-        </w:rPr>
-        <w:t xml:space="preserve">اختُبر التدفّق كاملاً في المتصفح: الدخول المباشر عند تعطيل 2FA، ظهور الشاشة عند تفعيلها، خلوّ التخزين قبل التحقق، رفض الرمز الخاطئ، قبول رمز TOTP صحيح، وقبول رمز احتياطي.</w:t>
+        <w:t xml:space="preserve">عوينت النتيجة في المتصفح: حفظ 91234567 مع ‎+968 خزّنه ‎+96891234567، وبعد إعادة التحميل رجع مقسوماً صحيحاً.</w:t>
       </w:r>
     </w:p>
     <w:p>
@@ -6832,7 +6747,7 @@
           <w:szCs w:val="24"/>
           <w:rtl/>
         </w:rPr>
-        <w:t xml:space="preserve">تعديل رقم 9 — رقم هاتف اختياري عند دعوة الموظف</w:t>
+        <w:t xml:space="preserve">تعديل رقم 10 — شاشة التحقق بخطوتين في تسجيل الدخول</w:t>
       </w:r>
     </w:p>
     <w:p>
@@ -7109,7 +7024,7 @@
                 <w:szCs w:val="19"/>
                 <w:rtl/>
               </w:rPr>
-              <w:t xml:space="preserve">فريق العمل</w:t>
+              <w:t xml:space="preserve">تسجيل الدخول</w:t>
             </w:r>
           </w:p>
         </w:tc>
@@ -7139,7 +7054,7 @@
                 <w:szCs w:val="19"/>
                 <w:rtl/>
               </w:rPr>
-              <w:t xml:space="preserve">/team</w:t>
+              <w:t xml:space="preserve">/login</w:t>
             </w:r>
           </w:p>
         </w:tc>
@@ -7169,7 +7084,7 @@
                 <w:szCs w:val="19"/>
                 <w:rtl/>
               </w:rPr>
-              <w:t xml:space="preserve">src/pages/Team.tsx · src/types/index.ts · src/store/useDataStore.ts</w:t>
+              <w:t xml:space="preserve">src/utils/twoFactor.ts · src/components/auth/TwoFactorChallenge.tsx · src/store/useAuthStore.ts · src/pages/Login.tsx</w:t>
             </w:r>
           </w:p>
         </w:tc>
@@ -7199,7 +7114,7 @@
                 <w:szCs w:val="19"/>
                 <w:rtl/>
               </w:rPr>
-              <w:t xml:space="preserve">a4d8398</w:t>
+              <w:t xml:space="preserve">743042c</w:t>
             </w:r>
           </w:p>
         </w:tc>
@@ -7260,7 +7175,7 @@
           <w:szCs w:val="21"/>
           <w:rtl/>
         </w:rPr>
-        <w:t xml:space="preserve">أُضيف حقل رقم الهاتف إلى نموذج دعوة الموظف وتعديله — لم يكن موجوداً من قبل أصلاً.</w:t>
+        <w:t xml:space="preserve">⚠️ هيكل واجهة لا أمان: التحقق يجري في المتصفح والمفتاح السري داخل حزمة الجافاسكربت، فيمكن تجاوزه. الغرض تجهيز الواجهة والعقد لحين وجود باكيند، وهذا مكتوب صراحةً في رأس ملف twoFactor.ts.</w:t>
       </w:r>
     </w:p>
     <w:p>
@@ -7282,7 +7197,7 @@
           <w:szCs w:val="21"/>
           <w:rtl/>
         </w:rPr>
-        <w:t xml:space="preserve">الحقل اختياري: يحمل وسم «(اختياري)» بنفس أسلوب حقل الأقسام، وبلا النجمة الحمراء التي تعلّم الاسم والبريد والدور. إرسال الدعوة بدونه يمرّ دون اعتراض.</w:t>
+        <w:t xml:space="preserve">كان الدخول يوثّق فوراً بعد كلمة المرور. صار مرحلتين: كلمة المرور تنتج حالة معلّقة في الذاكرة فقط، ولا يُكتب شيء في التخزين حتى يمرّ العامل الثاني — فإغلاق التبويب في منتصف العملية لا يترك جلسة مفتوحة.</w:t>
       </w:r>
     </w:p>
     <w:p>
@@ -7304,7 +7219,7 @@
           <w:szCs w:val="21"/>
           <w:rtl/>
         </w:rPr>
-        <w:t xml:space="preserve">استُخدم مكوّن PhoneField نفسه المستعمل في جهات الاتصال والتسجيل، فيأتي معه منتقي الدولة ورمز الاتصال بدل حقل نصّي حرّ.</w:t>
+        <w:t xml:space="preserve">شاشة التحقق تظهر داخل مسار الدخول نفسه لا على عنوان مستقل، لأن عنواناً مستقلاً يفتحه أي شخص دون المرور بالمرحلة الأولى.</w:t>
       </w:r>
     </w:p>
     <w:p>
@@ -7326,7 +7241,7 @@
           <w:szCs w:val="21"/>
           <w:rtl/>
         </w:rPr>
-        <w:t xml:space="preserve">الرقم لا يُخزَّن إلا إذا كُتب فعلاً، حتى لا يبقى رمز دولة معلّقاً بلا رقم في بيانات موظف تركه فارغاً.</w:t>
+        <w:t xml:space="preserve">نُفِّذت خوارزمية TOTP (المعيار RFC 6238) بـ Web Crypto، فأكواد Google Authenticator الحقيقية تُقبل فعلاً. تحقّقت من التنفيذ بمتجهات الاختبار الخمسة الواردة في المعيار نفسه وكلها طابقت.</w:t>
       </w:r>
     </w:p>
     <w:p>
@@ -7348,7 +7263,7 @@
           <w:szCs w:val="21"/>
           <w:rtl/>
         </w:rPr>
-        <w:t xml:space="preserve">عند فتح موظف للتعديل يُفصل الرقم المحفوظ إلى رمز دولة ورقم محلي بمطابقة أطول رمز مطابق من قائمة الدول — لا بتعبير نمطي جشع، لأن ذلك كان سيقرأ ‎+96891234567 على أنه ‎+9689 ثم يشوّه الرقم.</w:t>
+        <w:t xml:space="preserve">نافذة تسامح خطوة واحدة قبل وبعد لاستيعاب فروق ساعة الجهاز.</w:t>
       </w:r>
     </w:p>
     <w:p>
@@ -7370,7 +7285,7 @@
           <w:szCs w:val="21"/>
           <w:rtl/>
         </w:rPr>
-        <w:t xml:space="preserve">الرقم يظهر في لوحة تفاصيل الموظف حين يكون موجوداً، فلا تُجمع بيانات لا تُعرض في أي مكان.</w:t>
+        <w:t xml:space="preserve">ستة مربعات بانتقال تلقائي بين الخانات ودعم اللصق وإرسال تلقائي عند اكتمال الرمز.</w:t>
       </w:r>
     </w:p>
     <w:p>
@@ -7392,7 +7307,7 @@
           <w:szCs w:val="21"/>
           <w:rtl/>
         </w:rPr>
-        <w:t xml:space="preserve">وُسّع توقيع inviteAgent ليقبل الحقل الجديد.</w:t>
+        <w:t xml:space="preserve">لا يوجد زر «إعادة إرسال» — التطبيق يولّد الرمز على الجهاز ولا شيء يُرسَل. وُضع مكانه عدّاد يبيّن الثواني المتبقية قبل تغيّر الرمز، فلا ينتظر الموظف رسالة لن تصل.</w:t>
       </w:r>
     </w:p>
     <w:p>
@@ -7414,7 +7329,161 @@
           <w:szCs w:val="21"/>
           <w:rtl/>
         </w:rPr>
-        <w:t xml:space="preserve">عوينت النتيجة في المتصفح: الحقل ووسم الاختياري ظاهران، ودعوة موظف بلا رقم هاتف نجحت.</w:t>
+        <w:t xml:space="preserve">مسار الرموز الاحتياطية داخل الشاشة نفسها، لأن فاقد هاتفه بلا رمز احتياطي يُقفل خارج حسابه نهائياً.</w:t>
+      </w:r>
+    </w:p>
+    <w:p>
+      <w:pPr>
+        <w:pStyle w:val="ListParagraph"/>
+        <w:numPr>
+          <w:ilvl w:val="0"/>
+          <w:numId w:val="2"/>
+        </w:numPr>
+        <w:bidi/>
+        <w:spacing w:after="70" w:line="290"/>
+        <w:jc w:val="right"/>
+      </w:pPr>
+      <w:r>
+        <w:rPr>
+          <w:rFonts w:ascii="Arial" w:cs="Arial" w:eastAsia="Arial" w:hAnsi="Arial"/>
+          <w:color w:val="1E293B"/>
+          <w:sz w:val="21"/>
+          <w:szCs w:val="21"/>
+          <w:rtl/>
+        </w:rPr>
+        <w:t xml:space="preserve">رسالة الخطأ واحدة للرمز الخاطئ وللمنتهي عمداً، حتى لا تُعطي المهاجم معلومة يفرّق بها.</w:t>
+      </w:r>
+    </w:p>
+    <w:p>
+      <w:pPr>
+        <w:pStyle w:val="ListParagraph"/>
+        <w:numPr>
+          <w:ilvl w:val="0"/>
+          <w:numId w:val="2"/>
+        </w:numPr>
+        <w:bidi/>
+        <w:spacing w:after="70" w:line="290"/>
+        <w:jc w:val="right"/>
+      </w:pPr>
+      <w:r>
+        <w:rPr>
+          <w:rFonts w:ascii="Arial" w:cs="Arial" w:eastAsia="Arial" w:hAnsi="Arial"/>
+          <w:color w:val="1E293B"/>
+          <w:sz w:val="21"/>
+          <w:szCs w:val="21"/>
+          <w:rtl/>
+        </w:rPr>
+        <w:t xml:space="preserve">حدّ خمس محاولات ثم قفل خمس دقائق — وهذا في الواجهة للتوثيق فقط، ومكانه الصحيح الخادم.</w:t>
+      </w:r>
+    </w:p>
+    <w:p>
+      <w:pPr>
+        <w:pStyle w:val="ListParagraph"/>
+        <w:numPr>
+          <w:ilvl w:val="0"/>
+          <w:numId w:val="2"/>
+        </w:numPr>
+        <w:bidi/>
+        <w:spacing w:after="70" w:line="290"/>
+        <w:jc w:val="right"/>
+      </w:pPr>
+      <w:r>
+        <w:rPr>
+          <w:rFonts w:ascii="Arial" w:cs="Arial" w:eastAsia="Arial" w:hAnsi="Arial"/>
+          <w:color w:val="1E293B"/>
+          <w:sz w:val="21"/>
+          <w:szCs w:val="21"/>
+          <w:rtl/>
+        </w:rPr>
+        <w:t xml:space="preserve">شاشة الإعداد في الإعدادات كانت تقبل أي ستة أرقام وتفعّل 2FA بناءً عليها. صارت تتحقق فعلياً، لأن التفعيل بعد مسح خاطئ للرمز يقفل صاحب الحساب خارج حسابه.</w:t>
+      </w:r>
+    </w:p>
+    <w:p>
+      <w:pPr>
+        <w:pStyle w:val="ListParagraph"/>
+        <w:numPr>
+          <w:ilvl w:val="0"/>
+          <w:numId w:val="2"/>
+        </w:numPr>
+        <w:bidi/>
+        <w:spacing w:after="70" w:line="290"/>
+        <w:jc w:val="right"/>
+      </w:pPr>
+      <w:r>
+        <w:rPr>
+          <w:rFonts w:ascii="Arial" w:cs="Arial" w:eastAsia="Arial" w:hAnsi="Arial"/>
+          <w:color w:val="1E293B"/>
+          <w:sz w:val="21"/>
+          <w:szCs w:val="21"/>
+          <w:rtl/>
+        </w:rPr>
+        <w:t xml:space="preserve">وُحّد المفتاح والرموز الاحتياطية بين شاشة الإعداد وشاشة الدخول في ملف واحد، فما يعرضه الـQR هو ما يُتحقّق منه.</w:t>
+      </w:r>
+    </w:p>
+    <w:p>
+      <w:pPr>
+        <w:pStyle w:val="ListParagraph"/>
+        <w:numPr>
+          <w:ilvl w:val="0"/>
+          <w:numId w:val="2"/>
+        </w:numPr>
+        <w:bidi/>
+        <w:spacing w:after="70" w:line="290"/>
+        <w:jc w:val="right"/>
+      </w:pPr>
+      <w:r>
+        <w:rPr>
+          <w:rFonts w:ascii="Arial" w:cs="Arial" w:eastAsia="Arial" w:hAnsi="Arial"/>
+          <w:color w:val="1E293B"/>
+          <w:sz w:val="21"/>
+          <w:szCs w:val="21"/>
+          <w:rtl/>
+        </w:rPr>
+        <w:t xml:space="preserve">حُذف الحقل المكرّر AppSettings.twoFactorEnabled — كان يُكتب عند التهيئة ولا يُقرأ في أي مكان، بينما الحقل الحيّ هو security.twoFactor. وجود علمين لنفس المعنى كان سيُظهر الميزة مفعّلة في شاشة ومطفأة في أخرى.</w:t>
+      </w:r>
+    </w:p>
+    <w:p>
+      <w:pPr>
+        <w:pStyle w:val="ListParagraph"/>
+        <w:numPr>
+          <w:ilvl w:val="0"/>
+          <w:numId w:val="2"/>
+        </w:numPr>
+        <w:bidi/>
+        <w:spacing w:after="70" w:line="290"/>
+        <w:jc w:val="right"/>
+      </w:pPr>
+      <w:r>
+        <w:rPr>
+          <w:rFonts w:ascii="Arial" w:cs="Arial" w:eastAsia="Arial" w:hAnsi="Arial"/>
+          <w:color w:val="1E293B"/>
+          <w:sz w:val="21"/>
+          <w:szCs w:val="21"/>
+          <w:rtl/>
+        </w:rPr>
+        <w:t xml:space="preserve">أخطأتُ في شرط الإرسال التلقائي: كتبت فحصاً يتضمّن includes('') وهو دائماً صحيح في جافاسكربت، فلم يكن الإرسال التلقائي يعمل إطلاقاً. كشفه اختبار المتصفح وأُصلح.</w:t>
+      </w:r>
+    </w:p>
+    <w:p>
+      <w:pPr>
+        <w:pStyle w:val="ListParagraph"/>
+        <w:numPr>
+          <w:ilvl w:val="0"/>
+          <w:numId w:val="2"/>
+        </w:numPr>
+        <w:bidi/>
+        <w:spacing w:after="70" w:line="290"/>
+        <w:jc w:val="right"/>
+      </w:pPr>
+      <w:r>
+        <w:rPr>
+          <w:rFonts w:ascii="Arial" w:cs="Arial" w:eastAsia="Arial" w:hAnsi="Arial"/>
+          <w:color w:val="1E293B"/>
+          <w:sz w:val="21"/>
+          <w:szCs w:val="21"/>
+          <w:rtl/>
+        </w:rPr>
+        <w:t xml:space="preserve">اختُبر التدفّق كاملاً في المتصفح: الدخول المباشر عند تعطيل 2FA، ظهور الشاشة عند تفعيلها، خلوّ التخزين قبل التحقق، رفض الرمز الخاطئ، قبول رمز TOTP صحيح، وقبول رمز احتياطي.</w:t>
       </w:r>
     </w:p>
     <w:p>
@@ -7439,7 +7508,7 @@
           <w:szCs w:val="24"/>
           <w:rtl/>
         </w:rPr>
-        <w:t xml:space="preserve">تعديل رقم 8 — فاصل مرقّم بين دورات المحادثة داخل الثريد</w:t>
+        <w:t xml:space="preserve">تعديل رقم 9 — رقم هاتف اختياري عند دعوة الموظف</w:t>
       </w:r>
     </w:p>
     <w:p>
@@ -7716,7 +7785,7 @@
                 <w:szCs w:val="19"/>
                 <w:rtl/>
               </w:rPr>
-              <w:t xml:space="preserve">صندوق الوارد</w:t>
+              <w:t xml:space="preserve">فريق العمل</w:t>
             </w:r>
           </w:p>
         </w:tc>
@@ -7746,7 +7815,7 @@
                 <w:szCs w:val="19"/>
                 <w:rtl/>
               </w:rPr>
-              <w:t xml:space="preserve">/inbox</w:t>
+              <w:t xml:space="preserve">/team</w:t>
             </w:r>
           </w:p>
         </w:tc>
@@ -7776,7 +7845,7 @@
                 <w:szCs w:val="19"/>
                 <w:rtl/>
               </w:rPr>
-              <w:t xml:space="preserve">src/pages/Inbox.tsx</w:t>
+              <w:t xml:space="preserve">src/pages/Team.tsx · src/types/index.ts · src/store/useDataStore.ts</w:t>
             </w:r>
           </w:p>
         </w:tc>
@@ -7806,7 +7875,7 @@
                 <w:szCs w:val="19"/>
                 <w:rtl/>
               </w:rPr>
-              <w:t xml:space="preserve">f9b43fd</w:t>
+              <w:t xml:space="preserve">a4d8398</w:t>
             </w:r>
           </w:p>
         </w:tc>
@@ -7867,7 +7936,7 @@
           <w:szCs w:val="21"/>
           <w:rtl/>
         </w:rPr>
-        <w:t xml:space="preserve">كل دورة جديدة صار يسبقها فاصل أفقي ظاهر داخل الثريد، فيُعرف أين انتهت دورة وبدأت التي تليها من غير رجوع إلى شريط الفهرسة.</w:t>
+        <w:t xml:space="preserve">أُضيف حقل رقم الهاتف إلى نموذج دعوة الموظف وتعديله — لم يكن موجوداً من قبل أصلاً.</w:t>
       </w:r>
     </w:p>
     <w:p>
@@ -7889,7 +7958,7 @@
           <w:szCs w:val="21"/>
           <w:rtl/>
         </w:rPr>
-        <w:t xml:space="preserve">الفاصل يحمل رقم الدورة وكلمة «إعادة فتح» والتاريخ، فيجيب عن ثلاثة أسئلة في سطر: أي دورة، وماذا جرى، ومتى.</w:t>
+        <w:t xml:space="preserve">الحقل اختياري: يحمل وسم «(اختياري)» بنفس أسلوب حقل الأقسام، وبلا النجمة الحمراء التي تعلّم الاسم والبريد والدور. إرسال الدعوة بدونه يمرّ دون اعتراض.</w:t>
       </w:r>
     </w:p>
     <w:p>
@@ -7911,7 +7980,7 @@
           <w:szCs w:val="21"/>
           <w:rtl/>
         </w:rPr>
-        <w:t xml:space="preserve">صيغته بلون العلامة التجارية بخطّين وشارة بارزة، لأن المطلوب أن يُلاحَظ لا أن يمرّ مرور الكرام.</w:t>
+        <w:t xml:space="preserve">استُخدم مكوّن PhoneField نفسه المستعمل في جهات الاتصال والتسجيل، فيأتي معه منتقي الدولة ورمز الاتصال بدل حقل نصّي حرّ.</w:t>
       </w:r>
     </w:p>
     <w:p>
@@ -7933,7 +8002,7 @@
           <w:szCs w:val="21"/>
           <w:rtl/>
         </w:rPr>
-        <w:t xml:space="preserve">الفاصل يحلّ محلّ شريحة التاريخ العادية في ذلك الموضع لأنه يحمل التاريخ أصلاً، فلا يجتمع فاصلان متتاليان.</w:t>
+        <w:t xml:space="preserve">الرقم لا يُخزَّن إلا إذا كُتب فعلاً، حتى لا يبقى رمز دولة معلّقاً بلا رقم في بيانات موظف تركه فارغاً.</w:t>
       </w:r>
     </w:p>
     <w:p>
@@ -7955,7 +8024,7 @@
           <w:szCs w:val="21"/>
           <w:rtl/>
         </w:rPr>
-        <w:t xml:space="preserve">لا يظهر قبل الدورة الأولى لأنها بداية المحادثة لا إعادة فتح لها.</w:t>
+        <w:t xml:space="preserve">عند فتح موظف للتعديل يُفصل الرقم المحفوظ إلى رمز دولة ورقم محلي بمطابقة أطول رمز مطابق من قائمة الدول — لا بتعبير نمطي جشع، لأن ذلك كان سيقرأ ‎+96891234567 على أنه ‎+9689 ثم يشوّه الرقم.</w:t>
       </w:r>
     </w:p>
     <w:p>
@@ -7977,7 +8046,7 @@
           <w:szCs w:val="21"/>
           <w:rtl/>
         </w:rPr>
-        <w:t xml:space="preserve">الدورة ذات البداية المستنتجة تُوسم «(تقديري)» في الفاصل نفسه، اتساقاً مع العلامة المتقطّعة في شريط الفهرسة.</w:t>
+        <w:t xml:space="preserve">الرقم يظهر في لوحة تفاصيل الموظف حين يكون موجوداً، فلا تُجمع بيانات لا تُعرض في أي مكان.</w:t>
       </w:r>
     </w:p>
     <w:p>
@@ -7999,7 +8068,7 @@
           <w:szCs w:val="21"/>
           <w:rtl/>
         </w:rPr>
-        <w:t xml:space="preserve">الترقيم يتبع رقم الدورة (الدورة 2، الدورة 3) لا رقم إعادة الفتح، ليطابق ما يعرضه شريط الفهرسة وحقل sessionCount ولا يتضارب معهما.</w:t>
+        <w:t xml:space="preserve">وُسّع توقيع inviteAgent ليقبل الحقل الجديد.</w:t>
       </w:r>
     </w:p>
     <w:p>
@@ -8021,7 +8090,7 @@
           <w:szCs w:val="21"/>
           <w:rtl/>
         </w:rPr>
-        <w:t xml:space="preserve">عوينت النتيجة في المتصفح: فاصلان بالرقمين الصحيحين، وشريحة التاريخ المكرّرة اختفت من موضعيهما.</w:t>
+        <w:t xml:space="preserve">عوينت النتيجة في المتصفح: الحقل ووسم الاختياري ظاهران، ودعوة موظف بلا رقم هاتف نجحت.</w:t>
       </w:r>
     </w:p>
     <w:p>
@@ -8046,7 +8115,7 @@
           <w:szCs w:val="24"/>
           <w:rtl/>
         </w:rPr>
-        <w:t xml:space="preserve">تعديل رقم 7 — انعكاس حالة «مجدولة» للتخفيض المؤجّل في بورتال العميل</w:t>
+        <w:t xml:space="preserve">تعديل رقم 8 — فاصل مرقّم بين دورات المحادثة داخل الثريد</w:t>
       </w:r>
     </w:p>
     <w:p>
@@ -8323,7 +8392,7 @@
                 <w:szCs w:val="19"/>
                 <w:rtl/>
               </w:rPr>
-              <w:t xml:space="preserve">الباقات والاشتراك</w:t>
+              <w:t xml:space="preserve">صندوق الوارد</w:t>
             </w:r>
           </w:p>
         </w:tc>
@@ -8353,7 +8422,7 @@
                 <w:szCs w:val="19"/>
                 <w:rtl/>
               </w:rPr>
-              <w:t xml:space="preserve">/billing</w:t>
+              <w:t xml:space="preserve">/inbox</w:t>
             </w:r>
           </w:p>
         </w:tc>
@@ -8383,7 +8452,7 @@
                 <w:szCs w:val="19"/>
                 <w:rtl/>
               </w:rPr>
-              <w:t xml:space="preserve">src/types/index.ts · src/pages/Billing.tsx · src/store/adminMockData.ts</w:t>
+              <w:t xml:space="preserve">src/pages/Inbox.tsx</w:t>
             </w:r>
           </w:p>
         </w:tc>
@@ -8413,7 +8482,7 @@
                 <w:szCs w:val="19"/>
                 <w:rtl/>
               </w:rPr>
-              <w:t xml:space="preserve">5202dba</w:t>
+              <w:t xml:space="preserve">f9b43fd</w:t>
             </w:r>
           </w:p>
         </w:tc>
@@ -8474,7 +8543,7 @@
           <w:szCs w:val="21"/>
           <w:rtl/>
         </w:rPr>
-        <w:t xml:space="preserve">الاشتراك الذي عليه تخفيض مؤجّل إلى تاريخ لاحق صارت حالته «مجدولة» ظاهرة للعميل، لا في بورتال الإدارة وحده.</w:t>
+        <w:t xml:space="preserve">كل دورة جديدة صار يسبقها فاصل أفقي ظاهر داخل الثريد، فيُعرف أين انتهت دورة وبدأت التي تليها من غير رجوع إلى شريط الفهرسة.</w:t>
       </w:r>
     </w:p>
     <w:p>
@@ -8496,7 +8565,7 @@
           <w:szCs w:val="21"/>
           <w:rtl/>
         </w:rPr>
-        <w:t xml:space="preserve">أُضيف الحقل scheduledChange إلى الاشتراك ويحمل الباقة المستهدفة ودورة الفوترة وتاريخ السريان، وأُضيفت «مجدولة» إلى حالات الفاتورة.</w:t>
+        <w:t xml:space="preserve">الفاصل يحمل رقم الدورة وكلمة «إعادة فتح» والتاريخ، فيجيب عن ثلاثة أسئلة في سطر: أي دورة، وماذا جرى، ومتى.</w:t>
       </w:r>
     </w:p>
     <w:p>
@@ -8518,7 +8587,7 @@
           <w:szCs w:val="21"/>
           <w:rtl/>
         </w:rPr>
-        <w:t xml:space="preserve">بطاقة الاشتراك تعرض شارة «مجدولة» وجملة صريحة تذكر اسم الباقة المستهدفة وتاريخ التحويل، وتؤكّد أن الباقة الحالية ومزاياها مستمرة حتى ذلك التاريخ — فلا يظن العميل أن باقته انخفضت الآن.</w:t>
+        <w:t xml:space="preserve">صيغته بلون العلامة التجارية بخطّين وشارة بارزة، لأن المطلوب أن يُلاحَظ لا أن يمرّ مرور الكرام.</w:t>
       </w:r>
     </w:p>
     <w:p>
@@ -8540,7 +8609,7 @@
           <w:szCs w:val="21"/>
           <w:rtl/>
         </w:rPr>
-        <w:t xml:space="preserve">جدول الفواتير وفلاترها ونافذة معاينة الفاتورة تعرض الحالة نفسها.</w:t>
+        <w:t xml:space="preserve">الفاصل يحلّ محلّ شريحة التاريخ العادية في ذلك الموضع لأنه يحمل التاريخ أصلاً، فلا يجتمع فاصلان متتاليان.</w:t>
       </w:r>
     </w:p>
     <w:p>
@@ -8562,7 +8631,7 @@
           <w:szCs w:val="21"/>
           <w:rtl/>
         </w:rPr>
-        <w:t xml:space="preserve">الحالة مشتقّة من الاشتراك لا مخزّنة على الفاتورة: إلغاء الجدولة يُزيلها من كل المواضع في آن واحد، بدل أن تبقى فاتورة تحمل حالة قديمة.</w:t>
+        <w:t xml:space="preserve">لا يظهر قبل الدورة الأولى لأنها بداية المحادثة لا إعادة فتح لها.</w:t>
       </w:r>
     </w:p>
     <w:p>
@@ -8584,7 +8653,7 @@
           <w:szCs w:val="21"/>
           <w:rtl/>
         </w:rPr>
-        <w:t xml:space="preserve">قرار مقصود: الاشتقاق يطال الفواتير غير المسدّدة فقط (معلّقة ومسودة). الفاتورة المدفوعة أو المستردة أو الملغاة أو الفاشلة تحتفظ بحالتها، وكذلك المتأخرة لأن التأخّر مشكلة سداد لا يصح حجبها خلف حالة الجدولة.</w:t>
+        <w:t xml:space="preserve">الدورة ذات البداية المستنتجة تُوسم «(تقديري)» في الفاصل نفسه، اتساقاً مع العلامة المتقطّعة في شريط الفهرسة.</w:t>
       </w:r>
     </w:p>
     <w:p>
@@ -8606,7 +8675,7 @@
           <w:szCs w:val="21"/>
           <w:rtl/>
         </w:rPr>
-        <w:t xml:space="preserve">زر «إلغاء الجدولة» إجراء إداري بحسب المواصفة، فبورتال العميل يعرض الحالة دون التحكم فيها.</w:t>
+        <w:t xml:space="preserve">الترقيم يتبع رقم الدورة (الدورة 2، الدورة 3) لا رقم إعادة الفتح، ليطابق ما يعرضه شريط الفهرسة وحقل sessionCount ولا يتضارب معهما.</w:t>
       </w:r>
     </w:p>
     <w:p>
@@ -8628,29 +8697,7 @@
           <w:szCs w:val="21"/>
           <w:rtl/>
         </w:rPr>
-        <w:t xml:space="preserve">أُضيفت جدولة تجريبية لعميل العرض (تحويل من الأعمال إلى الاحترافي بعد 15 يوماً) لتصير الحالة قابلة للمعاينة.</w:t>
-      </w:r>
-    </w:p>
-    <w:p>
-      <w:pPr>
-        <w:pStyle w:val="ListParagraph"/>
-        <w:numPr>
-          <w:ilvl w:val="0"/>
-          <w:numId w:val="2"/>
-        </w:numPr>
-        <w:bidi/>
-        <w:spacing w:after="70" w:line="290"/>
-        <w:jc w:val="right"/>
-      </w:pPr>
-      <w:r>
-        <w:rPr>
-          <w:rFonts w:ascii="Arial" w:cs="Arial" w:eastAsia="Arial" w:hAnsi="Arial"/>
-          <w:color w:val="1E293B"/>
-          <w:sz w:val="21"/>
-          <w:szCs w:val="21"/>
-          <w:rtl/>
-        </w:rPr>
-        <w:t xml:space="preserve">عوينت النتيجة في المتصفح: الشارة والجملة والفلتر وحالتا الفاتورتين غير المسدّدتين ظهرت، والفاتورتان المدفوعتان بقيتا «مدفوعة».</w:t>
+        <w:t xml:space="preserve">عوينت النتيجة في المتصفح: فاصلان بالرقمين الصحيحين، وشريحة التاريخ المكرّرة اختفت من موضعيهما.</w:t>
       </w:r>
     </w:p>
     <w:p>
@@ -8675,7 +8722,7 @@
           <w:szCs w:val="24"/>
           <w:rtl/>
         </w:rPr>
-        <w:t xml:space="preserve">تعديل رقم 6 — إعادة تصميم شريط الفهرسة على هيئة مسطرة تظهر عند الاقتراب</w:t>
+        <w:t xml:space="preserve">تعديل رقم 7 — انعكاس حالة «مجدولة» للتخفيض المؤجّل في بورتال العميل</w:t>
       </w:r>
     </w:p>
     <w:p>
@@ -8952,7 +8999,7 @@
                 <w:szCs w:val="19"/>
                 <w:rtl/>
               </w:rPr>
-              <w:t xml:space="preserve">صندوق الوارد</w:t>
+              <w:t xml:space="preserve">الباقات والاشتراك</w:t>
             </w:r>
           </w:p>
         </w:tc>
@@ -8982,7 +9029,7 @@
                 <w:szCs w:val="19"/>
                 <w:rtl/>
               </w:rPr>
-              <w:t xml:space="preserve">/inbox</w:t>
+              <w:t xml:space="preserve">/billing</w:t>
             </w:r>
           </w:p>
         </w:tc>
@@ -9012,7 +9059,7 @@
                 <w:szCs w:val="19"/>
                 <w:rtl/>
               </w:rPr>
-              <w:t xml:space="preserve">src/components/inbox/SessionRail.tsx · src/pages/Inbox.tsx</w:t>
+              <w:t xml:space="preserve">src/types/index.ts · src/pages/Billing.tsx · src/store/adminMockData.ts</w:t>
             </w:r>
           </w:p>
         </w:tc>
@@ -9042,7 +9089,7 @@
                 <w:szCs w:val="19"/>
                 <w:rtl/>
               </w:rPr>
-              <w:t xml:space="preserve">4163939</w:t>
+              <w:t xml:space="preserve">5202dba</w:t>
             </w:r>
           </w:p>
         </w:tc>
@@ -9103,7 +9150,7 @@
           <w:szCs w:val="21"/>
           <w:rtl/>
         </w:rPr>
-        <w:t xml:space="preserve">الشكل السابق كان كتلاً سميكة بينها فجوات، فكان يُقرأ كشريط تقدّم مكسور لا كأداة تنقّل. صار الآن مسطرة: خطّ شعري على حافة الثريد وعليه علامات رفيعة عند بدايات الدورات.</w:t>
+        <w:t xml:space="preserve">الاشتراك الذي عليه تخفيض مؤجّل إلى تاريخ لاحق صارت حالته «مجدولة» ظاهرة للعميل، لا في بورتال الإدارة وحده.</w:t>
       </w:r>
     </w:p>
     <w:p>
@@ -9125,7 +9172,7 @@
           <w:szCs w:val="21"/>
           <w:rtl/>
         </w:rPr>
-        <w:t xml:space="preserve">العلامات مجمّعة في منتصف ارتفاع الحافة كمجموعة واحدة مرتّبة، لا موزّعة على كامل الطول.</w:t>
+        <w:t xml:space="preserve">أُضيف الحقل scheduledChange إلى الاشتراك ويحمل الباقة المستهدفة ودورة الفوترة وتاريخ السريان، وأُضيفت «مجدولة» إلى حالات الفاتورة.</w:t>
       </w:r>
     </w:p>
     <w:p>
@@ -9147,7 +9194,7 @@
           <w:szCs w:val="21"/>
           <w:rtl/>
         </w:rPr>
-        <w:t xml:space="preserve">جُرّب توزيعها على مواضعها النسبية من ارتفاع التمرير أولاً، ثم استُبدل بالتجميع في المنتصف بقرار من الإدارة: الشكل المرتّب فُضّل على دلالة الموضع. أُزيل معه كود القياس ومراقب تغيّر الحجم لأنه لم يعد له عمل.</w:t>
+        <w:t xml:space="preserve">بطاقة الاشتراك تعرض شارة «مجدولة» وجملة صريحة تذكر اسم الباقة المستهدفة وتاريخ التحويل، وتؤكّد أن الباقة الحالية ومزاياها مستمرة حتى ذلك التاريخ — فلا يظن العميل أن باقته انخفضت الآن.</w:t>
       </w:r>
     </w:p>
     <w:p>
@@ -9169,7 +9216,7 @@
           <w:szCs w:val="21"/>
           <w:rtl/>
         </w:rPr>
-        <w:t xml:space="preserve">المسطرة باهتة في الوضع العادي وتتوضّح بالكامل عند اقتراب المؤشر من الحافة أو عند وصول لوحة المفاتيح إليها.</w:t>
+        <w:t xml:space="preserve">جدول الفواتير وفلاترها ونافذة معاينة الفاتورة تعرض الحالة نفسها.</w:t>
       </w:r>
     </w:p>
     <w:p>
@@ -9191,7 +9238,7 @@
           <w:szCs w:val="21"/>
           <w:rtl/>
         </w:rPr>
-        <w:t xml:space="preserve">أُبقي أثر خافت دائم بدل الإخفاء التام: ميزة لا يدل عليها شيء لا يعرفها أحد، والإخفاء الكامل كان سيجعلها غير قابلة للاكتشاف.</w:t>
+        <w:t xml:space="preserve">الحالة مشتقّة من الاشتراك لا مخزّنة على الفاتورة: إلغاء الجدولة يُزيلها من كل المواضع في آن واحد، بدل أن تبقى فاتورة تحمل حالة قديمة.</w:t>
       </w:r>
     </w:p>
     <w:p>
@@ -9213,7 +9260,7 @@
           <w:szCs w:val="21"/>
           <w:rtl/>
         </w:rPr>
-        <w:t xml:space="preserve">صارت طبقة عائمة (overlay) بدل عمود يحجز عرضاً ثابتاً، فرجع نحو 36 بكسل لمساحة الرسائل.</w:t>
+        <w:t xml:space="preserve">قرار مقصود: الاشتقاق يطال الفواتير غير المسدّدة فقط (معلّقة ومسودة). الفاتورة المدفوعة أو المستردة أو الملغاة أو الفاشلة تحتفظ بحالتها، وكذلك المتأخرة لأن التأخّر مشكلة سداد لا يصح حجبها خلف حالة الجدولة.</w:t>
       </w:r>
     </w:p>
     <w:p>
@@ -9235,7 +9282,7 @@
           <w:szCs w:val="21"/>
           <w:rtl/>
         </w:rPr>
-        <w:t xml:space="preserve">وُضعت بعد شريط التمرير بمقدار 8 بكسل حتى لا تحجب سحبه.</w:t>
+        <w:t xml:space="preserve">زر «إلغاء الجدولة» إجراء إداري بحسب المواصفة، فبورتال العميل يعرض الحالة دون التحكم فيها.</w:t>
       </w:r>
     </w:p>
     <w:p>
@@ -9257,7 +9304,7 @@
           <w:szCs w:val="21"/>
           <w:rtl/>
         </w:rPr>
-        <w:t xml:space="preserve">التمييز بين المؤكَّد والمقدَّر بقي قائماً بصرياً: علامة متصلة للدورة المسجّلة، ومتقطّعة للمستنتَجة، مع بقاء «بداية تقديرية» في التلميح.</w:t>
+        <w:t xml:space="preserve">أُضيفت جدولة تجريبية لعميل العرض (تحويل من الأعمال إلى الاحترافي بعد 15 يوماً) لتصير الحالة قابلة للمعاينة.</w:t>
       </w:r>
     </w:p>
     <w:p>
@@ -9279,51 +9326,7 @@
           <w:szCs w:val="21"/>
           <w:rtl/>
         </w:rPr>
-        <w:t xml:space="preserve">تنازل مقصود: الشكل السابق كان يعبّر عن حجم كل دورة بارتفاعها، والمسطرة لا تفعل. حجم الدورة انتقل إلى التلميح.</w:t>
-      </w:r>
-    </w:p>
-    <w:p>
-      <w:pPr>
-        <w:pStyle w:val="ListParagraph"/>
-        <w:numPr>
-          <w:ilvl w:val="0"/>
-          <w:numId w:val="2"/>
-        </w:numPr>
-        <w:bidi/>
-        <w:spacing w:after="70" w:line="290"/>
-        <w:jc w:val="right"/>
-      </w:pPr>
-      <w:r>
-        <w:rPr>
-          <w:rFonts w:ascii="Arial" w:cs="Arial" w:eastAsia="Arial" w:hAnsi="Arial"/>
-          <w:color w:val="1E293B"/>
-          <w:sz w:val="21"/>
-          <w:szCs w:val="21"/>
-          <w:rtl/>
-        </w:rPr>
-        <w:t xml:space="preserve">مجموعة العلامات تقبل التمرير داخلها إن كثرت الدورات حتى لا تتجاوز ارتفاع اللوحة. ولأن ذلك يقصّ التلميح، رُفع التلميح خارج المجموعة ويُحاذى رأسياً بالعلامة المؤشَّر عليها بالقياس.</w:t>
-      </w:r>
-    </w:p>
-    <w:p>
-      <w:pPr>
-        <w:pStyle w:val="ListParagraph"/>
-        <w:numPr>
-          <w:ilvl w:val="0"/>
-          <w:numId w:val="2"/>
-        </w:numPr>
-        <w:bidi/>
-        <w:spacing w:after="70" w:line="290"/>
-        <w:jc w:val="right"/>
-      </w:pPr>
-      <w:r>
-        <w:rPr>
-          <w:rFonts w:ascii="Arial" w:cs="Arial" w:eastAsia="Arial" w:hAnsi="Arial"/>
-          <w:color w:val="1E293B"/>
-          <w:sz w:val="21"/>
-          <w:szCs w:val="21"/>
-          <w:rtl/>
-        </w:rPr>
-        <w:t xml:space="preserve">عوينت النتيجة في المتصفح: العلامات الثلاث متجمّعة في المنتصف، والتوضّح بالاقتراب والتلميح والانتقال تعمل.</w:t>
+        <w:t xml:space="preserve">عوينت النتيجة في المتصفح: الشارة والجملة والفلتر وحالتا الفاتورتين غير المسدّدتين ظهرت، والفاتورتان المدفوعتان بقيتا «مدفوعة».</w:t>
       </w:r>
     </w:p>
     <w:p>
@@ -9348,7 +9351,7 @@
           <w:szCs w:val="24"/>
           <w:rtl/>
         </w:rPr>
-        <w:t xml:space="preserve">تعديل رقم 5 — شريط فهرسة دورات المحادثة داخل الثريد</w:t>
+        <w:t xml:space="preserve">تعديل رقم 6 — إعادة تصميم شريط الفهرسة على هيئة مسطرة تظهر عند الاقتراب</w:t>
       </w:r>
     </w:p>
     <w:p>
@@ -9685,7 +9688,7 @@
                 <w:szCs w:val="19"/>
                 <w:rtl/>
               </w:rPr>
-              <w:t xml:space="preserve">src/components/inbox/SessionRail.tsx · src/pages/Inbox.tsx · src/store/mockData.ts</w:t>
+              <w:t xml:space="preserve">src/components/inbox/SessionRail.tsx · src/pages/Inbox.tsx</w:t>
             </w:r>
           </w:p>
         </w:tc>
@@ -9715,7 +9718,7 @@
                 <w:szCs w:val="19"/>
                 <w:rtl/>
               </w:rPr>
-              <w:t xml:space="preserve">e05e715</w:t>
+              <w:t xml:space="preserve">4163939</w:t>
             </w:r>
           </w:p>
         </w:tc>
@@ -9776,7 +9779,7 @@
           <w:szCs w:val="21"/>
           <w:rtl/>
         </w:rPr>
-        <w:t xml:space="preserve">شريط رأسي على حافة الثريد يقسّمه إلى دورات فتح وإغلاق، ليصل الموظف إلى بداية أي دورة في المحادثات الطويلة التي تُعاد فتحها مراراً.</w:t>
+        <w:t xml:space="preserve">الشكل السابق كان كتلاً سميكة بينها فجوات، فكان يُقرأ كشريط تقدّم مكسور لا كأداة تنقّل. صار الآن مسطرة: خطّ شعري على حافة الثريد وعليه علامات رفيعة عند بدايات الدورات.</w:t>
       </w:r>
     </w:p>
     <w:p>
@@ -9798,7 +9801,7 @@
           <w:szCs w:val="21"/>
           <w:rtl/>
         </w:rPr>
-        <w:t xml:space="preserve">ارتفاع كل مقطع يتناسب مع عدد رسائله، فيعطي إحساساً بحجم كل دورة قبل الدخول إليها.</w:t>
+        <w:t xml:space="preserve">العلامات مجمّعة في منتصف ارتفاع الحافة كمجموعة واحدة مرتّبة، لا موزّعة على كامل الطول.</w:t>
       </w:r>
     </w:p>
     <w:p>
@@ -9820,7 +9823,7 @@
           <w:szCs w:val="21"/>
           <w:rtl/>
         </w:rPr>
-        <w:t xml:space="preserve">المرور على المقطع يُظهر اليوم والتاريخ وعدد الرسائل — «اليوم» و«أمس» لما قرُب، واسم اليوم لما بعُد.</w:t>
+        <w:t xml:space="preserve">جُرّب توزيعها على مواضعها النسبية من ارتفاع التمرير أولاً، ثم استُبدل بالتجميع في المنتصف بقرار من الإدارة: الشكل المرتّب فُضّل على دلالة الموضع. أُزيل معه كود القياس ومراقب تغيّر الحجم لأنه لم يعد له عمل.</w:t>
       </w:r>
     </w:p>
     <w:p>
@@ -9842,7 +9845,7 @@
           <w:szCs w:val="21"/>
           <w:rtl/>
         </w:rPr>
-        <w:t xml:space="preserve">الضغط ينقل إلى أول رسالة في الدورة، والمقطع الذي يقابل موضع القراءة الحالي يُبرَز تلقائياً أثناء التمرير.</w:t>
+        <w:t xml:space="preserve">المسطرة باهتة في الوضع العادي وتتوضّح بالكامل عند اقتراب المؤشر من الحافة أو عند وصول لوحة المفاتيح إليها.</w:t>
       </w:r>
     </w:p>
     <w:p>
@@ -9864,7 +9867,7 @@
           <w:szCs w:val="21"/>
           <w:rtl/>
         </w:rPr>
-        <w:t xml:space="preserve">المقاطع ذات البداية المستنتجة تُعرض بحدّ متقطّع ويذكر التلميح «بداية تقديرية»، فيبقى الفرق بين المؤكَّد والمقدَّر ظاهراً للموظف لا مخفياً عنه.</w:t>
+        <w:t xml:space="preserve">أُبقي أثر خافت دائم بدل الإخفاء التام: ميزة لا يدل عليها شيء لا يعرفها أحد، والإخفاء الكامل كان سيجعلها غير قابلة للاكتشاف.</w:t>
       </w:r>
     </w:p>
     <w:p>
@@ -9886,7 +9889,7 @@
           <w:szCs w:val="21"/>
           <w:rtl/>
         </w:rPr>
-        <w:t xml:space="preserve">الشريط يختفي كلياً حين تكون المحادثة دورة واحدة، فلا معنى لفهرس لا يفهرس شيئاً.</w:t>
+        <w:t xml:space="preserve">صارت طبقة عائمة (overlay) بدل عمود يحجز عرضاً ثابتاً، فرجع نحو 36 بكسل لمساحة الرسائل.</w:t>
       </w:r>
     </w:p>
     <w:p>
@@ -9908,7 +9911,7 @@
           <w:szCs w:val="21"/>
           <w:rtl/>
         </w:rPr>
-        <w:t xml:space="preserve">الدورات الخالية من الرسائل مستبعدة من الشريط بقرار مقصود — لا شيء يمكن الانتقال إليه فيها.</w:t>
+        <w:t xml:space="preserve">وُضعت بعد شريط التمرير بمقدار 8 بكسل حتى لا تحجب سحبه.</w:t>
       </w:r>
     </w:p>
     <w:p>
@@ -9930,7 +9933,7 @@
           <w:szCs w:val="21"/>
           <w:rtl/>
         </w:rPr>
-        <w:t xml:space="preserve">وُزّعت رسائل محادثة أحمد الشعيلي التجريبية على ثلاث دورات عبر ثلاثة أشهر لتصير الميزة قابلة للمعاينة، وصار sessionCount فيها مطابقاً للواقع بعد أن كان رقماً مكتوباً بلا سند. آخر دورة مسجّلة بحدث حقيقي وما قبلها مستنتج، ليظهر الشكلان معاً.</w:t>
+        <w:t xml:space="preserve">التمييز بين المؤكَّد والمقدَّر بقي قائماً بصرياً: علامة متصلة للدورة المسجّلة، ومتقطّعة للمستنتَجة، مع بقاء «بداية تقديرية» في التلميح.</w:t>
       </w:r>
     </w:p>
     <w:p>
@@ -9952,7 +9955,51 @@
           <w:szCs w:val="21"/>
           <w:rtl/>
         </w:rPr>
-        <w:t xml:space="preserve">عوينت النتيجة في المتصفح: الشريط والتلميح والانتقال والإبراز تعمل في الوضعين الفاتح والليلي، والمحادثات أحادية الدورة سليمة بلا شريط.</w:t>
+        <w:t xml:space="preserve">تنازل مقصود: الشكل السابق كان يعبّر عن حجم كل دورة بارتفاعها، والمسطرة لا تفعل. حجم الدورة انتقل إلى التلميح.</w:t>
+      </w:r>
+    </w:p>
+    <w:p>
+      <w:pPr>
+        <w:pStyle w:val="ListParagraph"/>
+        <w:numPr>
+          <w:ilvl w:val="0"/>
+          <w:numId w:val="2"/>
+        </w:numPr>
+        <w:bidi/>
+        <w:spacing w:after="70" w:line="290"/>
+        <w:jc w:val="right"/>
+      </w:pPr>
+      <w:r>
+        <w:rPr>
+          <w:rFonts w:ascii="Arial" w:cs="Arial" w:eastAsia="Arial" w:hAnsi="Arial"/>
+          <w:color w:val="1E293B"/>
+          <w:sz w:val="21"/>
+          <w:szCs w:val="21"/>
+          <w:rtl/>
+        </w:rPr>
+        <w:t xml:space="preserve">مجموعة العلامات تقبل التمرير داخلها إن كثرت الدورات حتى لا تتجاوز ارتفاع اللوحة. ولأن ذلك يقصّ التلميح، رُفع التلميح خارج المجموعة ويُحاذى رأسياً بالعلامة المؤشَّر عليها بالقياس.</w:t>
+      </w:r>
+    </w:p>
+    <w:p>
+      <w:pPr>
+        <w:pStyle w:val="ListParagraph"/>
+        <w:numPr>
+          <w:ilvl w:val="0"/>
+          <w:numId w:val="2"/>
+        </w:numPr>
+        <w:bidi/>
+        <w:spacing w:after="70" w:line="290"/>
+        <w:jc w:val="right"/>
+      </w:pPr>
+      <w:r>
+        <w:rPr>
+          <w:rFonts w:ascii="Arial" w:cs="Arial" w:eastAsia="Arial" w:hAnsi="Arial"/>
+          <w:color w:val="1E293B"/>
+          <w:sz w:val="21"/>
+          <w:szCs w:val="21"/>
+          <w:rtl/>
+        </w:rPr>
+        <w:t xml:space="preserve">عوينت النتيجة في المتصفح: العلامات الثلاث متجمّعة في المنتصف، والتوضّح بالاقتراب والتلميح والانتقال تعمل.</w:t>
       </w:r>
     </w:p>
     <w:p>
@@ -9977,7 +10024,7 @@
           <w:szCs w:val="24"/>
           <w:rtl/>
         </w:rPr>
-        <w:t xml:space="preserve">تعديل رقم 4 — تسجيل دورات المحادثة واشتقاقها — أساس شريط فهرسة الثريد</w:t>
+        <w:t xml:space="preserve">تعديل رقم 5 — شريط فهرسة دورات المحادثة داخل الثريد</w:t>
       </w:r>
     </w:p>
     <w:p>
@@ -10254,7 +10301,7 @@
                 <w:szCs w:val="19"/>
                 <w:rtl/>
               </w:rPr>
-              <w:t xml:space="preserve">صندوق الوارد (طبقة البيانات)</w:t>
+              <w:t xml:space="preserve">صندوق الوارد</w:t>
             </w:r>
           </w:p>
         </w:tc>
@@ -10314,7 +10361,7 @@
                 <w:szCs w:val="19"/>
                 <w:rtl/>
               </w:rPr>
-              <w:t xml:space="preserve">src/utils/sessions.ts · src/store/useDataStore.ts · src/types/index.ts</w:t>
+              <w:t xml:space="preserve">src/components/inbox/SessionRail.tsx · src/pages/Inbox.tsx · src/store/mockData.ts</w:t>
             </w:r>
           </w:p>
         </w:tc>
@@ -10344,7 +10391,7 @@
                 <w:szCs w:val="19"/>
                 <w:rtl/>
               </w:rPr>
-              <w:t xml:space="preserve">5cf29e1</w:t>
+              <w:t xml:space="preserve">e05e715</w:t>
             </w:r>
           </w:p>
         </w:tc>
@@ -10405,7 +10452,7 @@
           <w:szCs w:val="21"/>
           <w:rtl/>
         </w:rPr>
-        <w:t xml:space="preserve">المشكلة: المحادثة الواحدة تُعاد فتحها كلما راسل العميل بعد الإغلاق، فيصير الثريد بلا نهاية. ولرسم شريط فهرسة يقسّمه إلى دورات، لزم معرفة توقيت كل فتح وإغلاق — وهي بيانات لم تكن تُسجَّل إطلاقاً.</w:t>
+        <w:t xml:space="preserve">شريط رأسي على حافة الثريد يقسّمه إلى دورات فتح وإغلاق، ليصل الموظف إلى بداية أي دورة في المحادثات الطويلة التي تُعاد فتحها مراراً.</w:t>
       </w:r>
     </w:p>
     <w:p>
@@ -10427,7 +10474,7 @@
           <w:szCs w:val="21"/>
           <w:rtl/>
         </w:rPr>
-        <w:t xml:space="preserve">كان الحقل sessionCount يُكتب مرة واحدة عند الإنشاء ولا يزيده أي سطر في المشروع، وقيمه في البيانات التجريبية مكتوبة يدوياً. كذلك activityLog على المحادثة كان مُعرَّفاً في الأنواع لكن لا دالة تكتب فيه وقت التشغيل.</w:t>
+        <w:t xml:space="preserve">ارتفاع كل مقطع يتناسب مع عدد رسائله، فيعطي إحساساً بحجم كل دورة قبل الدخول إليها.</w:t>
       </w:r>
     </w:p>
     <w:p>
@@ -10449,7 +10496,7 @@
           <w:szCs w:val="21"/>
           <w:rtl/>
         </w:rPr>
-        <w:t xml:space="preserve">أُضيف النوع SessionEvent لتسجيل حدث فتح أو إغلاق بتوقيته وصاحبه، والنوع ConversationSession يمثّل الدورة المشتقّة.</w:t>
+        <w:t xml:space="preserve">المرور على المقطع يُظهر اليوم والتاريخ وعدد الرسائل — «اليوم» و«أمس» لما قرُب، واسم اليوم لما بعُد.</w:t>
       </w:r>
     </w:p>
     <w:p>
@@ -10471,7 +10518,7 @@
           <w:szCs w:val="21"/>
           <w:rtl/>
         </w:rPr>
-        <w:t xml:space="preserve">صارت أربعة مواضع تسجّل الحدث فعلياً: setConversationStatus عند الإغلاق أو إعادة الفتح، reopenConversation، ورسالة العميل الواردة نصية أو صوتية حين تُحيي محادثة مغلقة — وهذا آخرها كان يمرّ بلا أي أثر رغم أنه أكثرها تكراراً.</w:t>
+        <w:t xml:space="preserve">الضغط ينقل إلى أول رسالة في الدورة، والمقطع الذي يقابل موضع القراءة الحالي يُبرَز تلقائياً أثناء التمرير.</w:t>
       </w:r>
     </w:p>
     <w:p>
@@ -10493,7 +10540,7 @@
           <w:szCs w:val="21"/>
           <w:rtl/>
         </w:rPr>
-        <w:t xml:space="preserve">أُضيفت الدالة deriveSessions التي تقسّم الثريد إلى دورات: الأحداث المسجّلة مرجع قاطع، وما سبقها من تاريخ قديم تُستنتج حدوده من فجوات الصمت (24 ساعة افتراضاً) وتُعلَّم inferred حتى يظل الفرق بين المؤكَّد والمقدَّر ظاهراً.</w:t>
+        <w:t xml:space="preserve">المقاطع ذات البداية المستنتجة تُعرض بحدّ متقطّع ويذكر التلميح «بداية تقديرية»، فيبقى الفرق بين المؤكَّد والمقدَّر ظاهراً للموظف لا مخفياً عنه.</w:t>
       </w:r>
     </w:p>
     <w:p>
@@ -10515,7 +10562,7 @@
           <w:szCs w:val="21"/>
           <w:rtl/>
         </w:rPr>
-        <w:t xml:space="preserve">الدالة تتعامل مع الحالة المختلطة: ثريد فيه تاريخ قديم مُستنتج ودورات جديدة مسجّلة في آن واحد.</w:t>
+        <w:t xml:space="preserve">الشريط يختفي كلياً حين تكون المحادثة دورة واحدة، فلا معنى لفهرس لا يفهرس شيئاً.</w:t>
       </w:r>
     </w:p>
     <w:p>
@@ -10537,7 +10584,7 @@
           <w:szCs w:val="21"/>
           <w:rtl/>
         </w:rPr>
-        <w:t xml:space="preserve">اختُبر المنطق على ثماني حالات شملت الثريد الفارغ والرسالة الواحدة والفجوات المتعددة والأحداث المسجّلة والحالة المختلطة والمدخلات غير المرتّبة زمنياً — جميعها نجحت.</w:t>
+        <w:t xml:space="preserve">الدورات الخالية من الرسائل مستبعدة من الشريط بقرار مقصود — لا شيء يمكن الانتقال إليه فيها.</w:t>
       </w:r>
     </w:p>
     <w:p>
@@ -10559,7 +10606,7 @@
           <w:szCs w:val="21"/>
           <w:rtl/>
         </w:rPr>
-        <w:t xml:space="preserve">ملاحظة على البيانات الحالية: كل المحادثات التجريبية تُنتج دورة واحدة لأن رسائلها متقاربة بدقائق ولا فجوات فيها. الشريط لن يُظهر تقسيماً حقيقياً قبل توفّر بيانات متباعدة زمنياً.</w:t>
+        <w:t xml:space="preserve">وُزّعت رسائل محادثة أحمد الشعيلي التجريبية على ثلاث دورات عبر ثلاثة أشهر لتصير الميزة قابلة للمعاينة، وصار sessionCount فيها مطابقاً للواقع بعد أن كان رقماً مكتوباً بلا سند. آخر دورة مسجّلة بحدث حقيقي وما قبلها مستنتج، ليظهر الشكلان معاً.</w:t>
       </w:r>
     </w:p>
     <w:p>
@@ -10581,7 +10628,7 @@
           <w:szCs w:val="21"/>
           <w:rtl/>
         </w:rPr>
-        <w:t xml:space="preserve">لم تُبنَ واجهة الشريط بعد — هذا التعديل يغطّي طبقة البيانات وحدها.</w:t>
+        <w:t xml:space="preserve">عوينت النتيجة في المتصفح: الشريط والتلميح والانتقال والإبراز تعمل في الوضعين الفاتح والليلي، والمحادثات أحادية الدورة سليمة بلا شريط.</w:t>
       </w:r>
     </w:p>
     <w:p>
@@ -10606,7 +10653,7 @@
           <w:szCs w:val="24"/>
           <w:rtl/>
         </w:rPr>
-        <w:t xml:space="preserve">تعديل رقم 3 — إزالة كارت نسبة الاستجابة من صفحة تقييمات العملاء</w:t>
+        <w:t xml:space="preserve">تعديل رقم 4 — تسجيل دورات المحادثة واشتقاقها — أساس شريط فهرسة الثريد</w:t>
       </w:r>
     </w:p>
     <w:p>
@@ -10883,7 +10930,7 @@
                 <w:szCs w:val="19"/>
                 <w:rtl/>
               </w:rPr>
-              <w:t xml:space="preserve">تقييمات العملاء</w:t>
+              <w:t xml:space="preserve">صندوق الوارد (طبقة البيانات)</w:t>
             </w:r>
           </w:p>
         </w:tc>
@@ -10913,7 +10960,7 @@
                 <w:szCs w:val="19"/>
                 <w:rtl/>
               </w:rPr>
-              <w:t xml:space="preserve">/rating</w:t>
+              <w:t xml:space="preserve">/inbox</w:t>
             </w:r>
           </w:p>
         </w:tc>
@@ -10943,7 +10990,7 @@
                 <w:szCs w:val="19"/>
                 <w:rtl/>
               </w:rPr>
-              <w:t xml:space="preserve">src/pages/CustomerRatings.tsx</w:t>
+              <w:t xml:space="preserve">src/utils/sessions.ts · src/store/useDataStore.ts · src/types/index.ts</w:t>
             </w:r>
           </w:p>
         </w:tc>
@@ -10973,7 +11020,7 @@
                 <w:szCs w:val="19"/>
                 <w:rtl/>
               </w:rPr>
-              <w:t xml:space="preserve">cc8bd4f</w:t>
+              <w:t xml:space="preserve">5cf29e1</w:t>
             </w:r>
           </w:p>
         </w:tc>
@@ -11034,7 +11081,7 @@
           <w:szCs w:val="21"/>
           <w:rtl/>
         </w:rPr>
-        <w:t xml:space="preserve">حُذف كارت «نسبة الاستجابة» بالكامل من شريط الإحصائيات — صارت 3 كروت بدل 4.</w:t>
+        <w:t xml:space="preserve">المشكلة: المحادثة الواحدة تُعاد فتحها كلما راسل العميل بعد الإغلاق، فيصير الثريد بلا نهاية. ولرسم شريط فهرسة يقسّمه إلى دورات، لزم معرفة توقيت كل فتح وإغلاق — وهي بيانات لم تكن تُسجَّل إطلاقاً.</w:t>
       </w:r>
     </w:p>
     <w:p>
@@ -11056,7 +11103,7 @@
           <w:szCs w:val="21"/>
           <w:rtl/>
         </w:rPr>
-        <w:t xml:space="preserve">حُذف معه حساب responseRate لأنه لم يعد له مستهلك في الصفحة.</w:t>
+        <w:t xml:space="preserve">كان الحقل sessionCount يُكتب مرة واحدة عند الإنشاء ولا يزيده أي سطر في المشروع، وقيمه في البيانات التجريبية مكتوبة يدوياً. كذلك activityLog على المحادثة كان مُعرَّفاً في الأنواع لكن لا دالة تكتب فيه وقت التشغيل.</w:t>
       </w:r>
     </w:p>
     <w:p>
@@ -11078,7 +11125,7 @@
           <w:szCs w:val="21"/>
           <w:rtl/>
         </w:rPr>
-        <w:t xml:space="preserve">حُذف استيراد أيقونة TrendingUp لأنها كانت مستخدمة في هذا الكارت وحده.</w:t>
+        <w:t xml:space="preserve">أُضيف النوع SessionEvent لتسجيل حدث فتح أو إغلاق بتوقيته وصاحبه، والنوع ConversationSession يمثّل الدورة المشتقّة.</w:t>
       </w:r>
     </w:p>
     <w:p>
@@ -11100,7 +11147,7 @@
           <w:szCs w:val="21"/>
           <w:rtl/>
         </w:rPr>
-        <w:t xml:space="preserve">عُدّلت شبكة العرض من grid-cols-2 lg:grid-cols-4 إلى grid-cols-1 sm:grid-cols-3، حتى لا يبقى كارت يتيم في سطر منفصل على الشاشات الصغيرة.</w:t>
+        <w:t xml:space="preserve">صارت أربعة مواضع تسجّل الحدث فعلياً: setConversationStatus عند الإغلاق أو إعادة الفتح، reopenConversation، ورسالة العميل الواردة نصية أو صوتية حين تُحيي محادثة مغلقة — وهذا آخرها كان يمرّ بلا أي أثر رغم أنه أكثرها تكراراً.</w:t>
       </w:r>
     </w:p>
     <w:p>
@@ -11122,7 +11169,95 @@
           <w:szCs w:val="21"/>
           <w:rtl/>
         </w:rPr>
-        <w:t xml:space="preserve">الكروت الباقية: متوسط تقييم المحادثة، متوسط تقييم الموظفين، إجمالي الروابط.</w:t>
+        <w:t xml:space="preserve">أُضيفت الدالة deriveSessions التي تقسّم الثريد إلى دورات: الأحداث المسجّلة مرجع قاطع، وما سبقها من تاريخ قديم تُستنتج حدوده من فجوات الصمت (24 ساعة افتراضاً) وتُعلَّم inferred حتى يظل الفرق بين المؤكَّد والمقدَّر ظاهراً.</w:t>
+      </w:r>
+    </w:p>
+    <w:p>
+      <w:pPr>
+        <w:pStyle w:val="ListParagraph"/>
+        <w:numPr>
+          <w:ilvl w:val="0"/>
+          <w:numId w:val="2"/>
+        </w:numPr>
+        <w:bidi/>
+        <w:spacing w:after="70" w:line="290"/>
+        <w:jc w:val="right"/>
+      </w:pPr>
+      <w:r>
+        <w:rPr>
+          <w:rFonts w:ascii="Arial" w:cs="Arial" w:eastAsia="Arial" w:hAnsi="Arial"/>
+          <w:color w:val="1E293B"/>
+          <w:sz w:val="21"/>
+          <w:szCs w:val="21"/>
+          <w:rtl/>
+        </w:rPr>
+        <w:t xml:space="preserve">الدالة تتعامل مع الحالة المختلطة: ثريد فيه تاريخ قديم مُستنتج ودورات جديدة مسجّلة في آن واحد.</w:t>
+      </w:r>
+    </w:p>
+    <w:p>
+      <w:pPr>
+        <w:pStyle w:val="ListParagraph"/>
+        <w:numPr>
+          <w:ilvl w:val="0"/>
+          <w:numId w:val="2"/>
+        </w:numPr>
+        <w:bidi/>
+        <w:spacing w:after="70" w:line="290"/>
+        <w:jc w:val="right"/>
+      </w:pPr>
+      <w:r>
+        <w:rPr>
+          <w:rFonts w:ascii="Arial" w:cs="Arial" w:eastAsia="Arial" w:hAnsi="Arial"/>
+          <w:color w:val="1E293B"/>
+          <w:sz w:val="21"/>
+          <w:szCs w:val="21"/>
+          <w:rtl/>
+        </w:rPr>
+        <w:t xml:space="preserve">اختُبر المنطق على ثماني حالات شملت الثريد الفارغ والرسالة الواحدة والفجوات المتعددة والأحداث المسجّلة والحالة المختلطة والمدخلات غير المرتّبة زمنياً — جميعها نجحت.</w:t>
+      </w:r>
+    </w:p>
+    <w:p>
+      <w:pPr>
+        <w:pStyle w:val="ListParagraph"/>
+        <w:numPr>
+          <w:ilvl w:val="0"/>
+          <w:numId w:val="2"/>
+        </w:numPr>
+        <w:bidi/>
+        <w:spacing w:after="70" w:line="290"/>
+        <w:jc w:val="right"/>
+      </w:pPr>
+      <w:r>
+        <w:rPr>
+          <w:rFonts w:ascii="Arial" w:cs="Arial" w:eastAsia="Arial" w:hAnsi="Arial"/>
+          <w:color w:val="1E293B"/>
+          <w:sz w:val="21"/>
+          <w:szCs w:val="21"/>
+          <w:rtl/>
+        </w:rPr>
+        <w:t xml:space="preserve">ملاحظة على البيانات الحالية: كل المحادثات التجريبية تُنتج دورة واحدة لأن رسائلها متقاربة بدقائق ولا فجوات فيها. الشريط لن يُظهر تقسيماً حقيقياً قبل توفّر بيانات متباعدة زمنياً.</w:t>
+      </w:r>
+    </w:p>
+    <w:p>
+      <w:pPr>
+        <w:pStyle w:val="ListParagraph"/>
+        <w:numPr>
+          <w:ilvl w:val="0"/>
+          <w:numId w:val="2"/>
+        </w:numPr>
+        <w:bidi/>
+        <w:spacing w:after="70" w:line="290"/>
+        <w:jc w:val="right"/>
+      </w:pPr>
+      <w:r>
+        <w:rPr>
+          <w:rFonts w:ascii="Arial" w:cs="Arial" w:eastAsia="Arial" w:hAnsi="Arial"/>
+          <w:color w:val="1E293B"/>
+          <w:sz w:val="21"/>
+          <w:szCs w:val="21"/>
+          <w:rtl/>
+        </w:rPr>
+        <w:t xml:space="preserve">لم تُبنَ واجهة الشريط بعد — هذا التعديل يغطّي طبقة البيانات وحدها.</w:t>
       </w:r>
     </w:p>
     <w:p>
@@ -11147,7 +11282,7 @@
           <w:szCs w:val="24"/>
           <w:rtl/>
         </w:rPr>
-        <w:t xml:space="preserve">تعديل رقم 2 — تغيير تسمية زر الترقية في صفحة الفوترة</w:t>
+        <w:t xml:space="preserve">تعديل رقم 3 — إزالة كارت نسبة الاستجابة من صفحة تقييمات العملاء</w:t>
       </w:r>
     </w:p>
     <w:p>
@@ -11394,7 +11529,7 @@
                 <w:szCs w:val="19"/>
                 <w:rtl/>
               </w:rPr>
-              <w:t xml:space="preserve">9 سبتمبر 2026</w:t>
+              <w:t xml:space="preserve">10 سبتمبر 2026</w:t>
             </w:r>
           </w:p>
         </w:tc>
@@ -11424,7 +11559,7 @@
                 <w:szCs w:val="19"/>
                 <w:rtl/>
               </w:rPr>
-              <w:t xml:space="preserve">الفوترة</w:t>
+              <w:t xml:space="preserve">تقييمات العملاء</w:t>
             </w:r>
           </w:p>
         </w:tc>
@@ -11454,7 +11589,7 @@
                 <w:szCs w:val="19"/>
                 <w:rtl/>
               </w:rPr>
-              <w:t xml:space="preserve">/billing</w:t>
+              <w:t xml:space="preserve">/rating</w:t>
             </w:r>
           </w:p>
         </w:tc>
@@ -11484,7 +11619,7 @@
                 <w:szCs w:val="19"/>
                 <w:rtl/>
               </w:rPr>
-              <w:t xml:space="preserve">src/pages/Billing.tsx</w:t>
+              <w:t xml:space="preserve">src/pages/CustomerRatings.tsx</w:t>
             </w:r>
           </w:p>
         </w:tc>
@@ -11514,7 +11649,7 @@
                 <w:szCs w:val="19"/>
                 <w:rtl/>
               </w:rPr>
-              <w:t xml:space="preserve">be5b3c0</w:t>
+              <w:t xml:space="preserve">cc8bd4f</w:t>
             </w:r>
           </w:p>
         </w:tc>
@@ -11575,7 +11710,7 @@
           <w:szCs w:val="21"/>
           <w:rtl/>
         </w:rPr>
-        <w:t xml:space="preserve">زر «ترقية» أصبح «تغيير الباقة».</w:t>
+        <w:t xml:space="preserve">حُذف كارت «نسبة الاستجابة» بالكامل من شريط الإحصائيات — صارت 3 كروت بدل 4.</w:t>
       </w:r>
     </w:p>
     <w:p>
@@ -11597,7 +11732,73 @@
           <w:szCs w:val="21"/>
           <w:rtl/>
         </w:rPr>
-        <w:t xml:space="preserve">سبب التغيير: الزر يوصّل إلى مسار يشمل الترقية والتخفيض معاً، فالتسمية القديمة كانت تصف نصف وظيفته.</w:t>
+        <w:t xml:space="preserve">حُذف معه حساب responseRate لأنه لم يعد له مستهلك في الصفحة.</w:t>
+      </w:r>
+    </w:p>
+    <w:p>
+      <w:pPr>
+        <w:pStyle w:val="ListParagraph"/>
+        <w:numPr>
+          <w:ilvl w:val="0"/>
+          <w:numId w:val="2"/>
+        </w:numPr>
+        <w:bidi/>
+        <w:spacing w:after="70" w:line="290"/>
+        <w:jc w:val="right"/>
+      </w:pPr>
+      <w:r>
+        <w:rPr>
+          <w:rFonts w:ascii="Arial" w:cs="Arial" w:eastAsia="Arial" w:hAnsi="Arial"/>
+          <w:color w:val="1E293B"/>
+          <w:sz w:val="21"/>
+          <w:szCs w:val="21"/>
+          <w:rtl/>
+        </w:rPr>
+        <w:t xml:space="preserve">حُذف استيراد أيقونة TrendingUp لأنها كانت مستخدمة في هذا الكارت وحده.</w:t>
+      </w:r>
+    </w:p>
+    <w:p>
+      <w:pPr>
+        <w:pStyle w:val="ListParagraph"/>
+        <w:numPr>
+          <w:ilvl w:val="0"/>
+          <w:numId w:val="2"/>
+        </w:numPr>
+        <w:bidi/>
+        <w:spacing w:after="70" w:line="290"/>
+        <w:jc w:val="right"/>
+      </w:pPr>
+      <w:r>
+        <w:rPr>
+          <w:rFonts w:ascii="Arial" w:cs="Arial" w:eastAsia="Arial" w:hAnsi="Arial"/>
+          <w:color w:val="1E293B"/>
+          <w:sz w:val="21"/>
+          <w:szCs w:val="21"/>
+          <w:rtl/>
+        </w:rPr>
+        <w:t xml:space="preserve">عُدّلت شبكة العرض من grid-cols-2 lg:grid-cols-4 إلى grid-cols-1 sm:grid-cols-3، حتى لا يبقى كارت يتيم في سطر منفصل على الشاشات الصغيرة.</w:t>
+      </w:r>
+    </w:p>
+    <w:p>
+      <w:pPr>
+        <w:pStyle w:val="ListParagraph"/>
+        <w:numPr>
+          <w:ilvl w:val="0"/>
+          <w:numId w:val="2"/>
+        </w:numPr>
+        <w:bidi/>
+        <w:spacing w:after="70" w:line="290"/>
+        <w:jc w:val="right"/>
+      </w:pPr>
+      <w:r>
+        <w:rPr>
+          <w:rFonts w:ascii="Arial" w:cs="Arial" w:eastAsia="Arial" w:hAnsi="Arial"/>
+          <w:color w:val="1E293B"/>
+          <w:sz w:val="21"/>
+          <w:szCs w:val="21"/>
+          <w:rtl/>
+        </w:rPr>
+        <w:t xml:space="preserve">الكروت الباقية: متوسط تقييم المحادثة، متوسط تقييم الموظفين، إجمالي الروابط.</w:t>
       </w:r>
     </w:p>
     <w:p>
@@ -11622,7 +11823,7 @@
           <w:szCs w:val="24"/>
           <w:rtl/>
         </w:rPr>
-        <w:t xml:space="preserve">تعديل رقم 1 — ميزة تغيير الباقة — US-131</w:t>
+        <w:t xml:space="preserve">تعديل رقم 2 — تغيير تسمية زر الترقية في صفحة الفوترة</w:t>
       </w:r>
     </w:p>
     <w:p>
@@ -11899,7 +12100,7 @@
                 <w:szCs w:val="19"/>
                 <w:rtl/>
               </w:rPr>
-              <w:t xml:space="preserve">الاشتراك</w:t>
+              <w:t xml:space="preserve">الفوترة</w:t>
             </w:r>
           </w:p>
         </w:tc>
@@ -11929,7 +12130,7 @@
                 <w:szCs w:val="19"/>
                 <w:rtl/>
               </w:rPr>
-              <w:t xml:space="preserve">/subscribe</w:t>
+              <w:t xml:space="preserve">/billing</w:t>
             </w:r>
           </w:p>
         </w:tc>
@@ -11959,7 +12160,7 @@
                 <w:szCs w:val="19"/>
                 <w:rtl/>
               </w:rPr>
-              <w:t xml:space="preserve">src/pages/Subscribe.tsx</w:t>
+              <w:t xml:space="preserve">src/pages/Billing.tsx</w:t>
             </w:r>
           </w:p>
         </w:tc>
@@ -11989,7 +12190,7 @@
                 <w:szCs w:val="19"/>
                 <w:rtl/>
               </w:rPr>
-              <w:t xml:space="preserve">be5b3c0 · c49b797</w:t>
+              <w:t xml:space="preserve">be5b3c0</w:t>
             </w:r>
           </w:p>
         </w:tc>
@@ -12050,7 +12251,7 @@
           <w:szCs w:val="21"/>
           <w:rtl/>
         </w:rPr>
-        <w:t xml:space="preserve">إعادة بناء شبه كاملة للصفحة — 715 سطراً متغيّراً.</w:t>
+        <w:t xml:space="preserve">زر «ترقية» أصبح «تغيير الباقة».</w:t>
       </w:r>
     </w:p>
     <w:p>
@@ -12072,8 +12273,439 @@
           <w:szCs w:val="21"/>
           <w:rtl/>
         </w:rPr>
-        <w:t xml:space="preserve">اختيار الباقة صار بشريط تمرير (slider) حسب عدد المحادثات الشهرية بدل شبكة الكروت. كل باقة نقطة توقف على الشريط، وباقة المؤسسات هي النقطة الأخيرة بعنوان «غير محدود».</w:t>
-      </w:r>
+        <w:t xml:space="preserve">سبب التغيير: الزر يوصّل إلى مسار يشمل الترقية والتخفيض معاً، فالتسمية القديمة كانت تصف نصف وظيفته.</w:t>
+      </w:r>
+    </w:p>
+    <w:p>
+      <w:pPr>
+        <w:spacing w:after="160"/>
+      </w:pPr>
+    </w:p>
+    <w:p>
+      <w:pPr>
+        <w:pStyle w:val="Heading2"/>
+        <w:bidi/>
+        <w:spacing w:after="120" w:before="300"/>
+        <w:jc w:val="right"/>
+      </w:pPr>
+      <w:r>
+        <w:rPr>
+          <w:rFonts w:ascii="Arial" w:cs="Arial" w:eastAsia="Arial" w:hAnsi="Arial"/>
+          <w:b/>
+          <w:bCs/>
+          <w:color w:val="1E293B"/>
+          <w:sz w:val="24"/>
+          <w:szCs w:val="24"/>
+          <w:rtl/>
+        </w:rPr>
+        <w:t xml:space="preserve">تعديل رقم 1 — ميزة تغيير الباقة — US-131</w:t>
+      </w:r>
+    </w:p>
+    <w:p>
+      <w:pPr>
+        <w:spacing w:after="50"/>
+      </w:pPr>
+    </w:p>
+    <w:tbl>
+      <w:tblPr>
+        <w:bidiVisual/>
+        <w:tblW w:type="dxa" w:w="9000"/>
+        <w:tblBorders>
+          <w:top w:val="single" w:color="CBD5E1" w:sz="4"/>
+          <w:left w:val="single" w:color="CBD5E1" w:sz="4"/>
+          <w:bottom w:val="single" w:color="CBD5E1" w:sz="4"/>
+          <w:right w:val="single" w:color="CBD5E1" w:sz="4"/>
+          <w:insideH w:val="single" w:color="CBD5E1" w:sz="4"/>
+          <w:insideV w:val="single" w:color="CBD5E1" w:sz="4"/>
+        </w:tblBorders>
+      </w:tblPr>
+      <w:tblGrid>
+        <w:gridCol w:w="1250"/>
+        <w:gridCol w:w="1250"/>
+        <w:gridCol w:w="1150"/>
+        <w:gridCol w:w="2500"/>
+        <w:gridCol w:w="1350"/>
+        <w:gridCol w:w="1500"/>
+      </w:tblGrid>
+      <w:tr>
+        <w:trPr>
+          <w:tblHeader/>
+        </w:trPr>
+        <w:tc>
+          <w:tcPr>
+            <w:tcW w:type="dxa" w:w="1250"/>
+            <w:shd w:fill="2563EB" w:color="auto" w:val="clear"/>
+            <w:tcMar>
+              <w:top w:type="dxa" w:w="90"/>
+              <w:left w:type="dxa" w:w="110"/>
+              <w:bottom w:type="dxa" w:w="90"/>
+              <w:right w:type="dxa" w:w="110"/>
+            </w:tcMar>
+          </w:tcPr>
+          <w:p>
+            <w:pPr>
+              <w:bidi/>
+              <w:spacing w:after="0" w:line="280"/>
+              <w:jc w:val="right"/>
+            </w:pPr>
+            <w:r>
+              <w:rPr>
+                <w:rFonts w:ascii="Arial" w:cs="Arial" w:eastAsia="Arial" w:hAnsi="Arial"/>
+                <w:b/>
+                <w:bCs/>
+                <w:color w:val="FFFFFF"/>
+                <w:sz w:val="19"/>
+                <w:szCs w:val="19"/>
+                <w:rtl/>
+              </w:rPr>
+              <w:t xml:space="preserve">التاريخ</w:t>
+            </w:r>
+          </w:p>
+        </w:tc>
+        <w:tc>
+          <w:tcPr>
+            <w:tcW w:type="dxa" w:w="1250"/>
+            <w:shd w:fill="2563EB" w:color="auto" w:val="clear"/>
+            <w:tcMar>
+              <w:top w:type="dxa" w:w="90"/>
+              <w:left w:type="dxa" w:w="110"/>
+              <w:bottom w:type="dxa" w:w="90"/>
+              <w:right w:type="dxa" w:w="110"/>
+            </w:tcMar>
+          </w:tcPr>
+          <w:p>
+            <w:pPr>
+              <w:bidi/>
+              <w:spacing w:after="0" w:line="280"/>
+              <w:jc w:val="right"/>
+            </w:pPr>
+            <w:r>
+              <w:rPr>
+                <w:rFonts w:ascii="Arial" w:cs="Arial" w:eastAsia="Arial" w:hAnsi="Arial"/>
+                <w:b/>
+                <w:bCs/>
+                <w:color w:val="FFFFFF"/>
+                <w:sz w:val="19"/>
+                <w:szCs w:val="19"/>
+                <w:rtl/>
+              </w:rPr>
+              <w:t xml:space="preserve">الصفحة</w:t>
+            </w:r>
+          </w:p>
+        </w:tc>
+        <w:tc>
+          <w:tcPr>
+            <w:tcW w:type="dxa" w:w="1150"/>
+            <w:shd w:fill="2563EB" w:color="auto" w:val="clear"/>
+            <w:tcMar>
+              <w:top w:type="dxa" w:w="90"/>
+              <w:left w:type="dxa" w:w="110"/>
+              <w:bottom w:type="dxa" w:w="90"/>
+              <w:right w:type="dxa" w:w="110"/>
+            </w:tcMar>
+          </w:tcPr>
+          <w:p>
+            <w:pPr>
+              <w:bidi/>
+              <w:spacing w:after="0" w:line="280"/>
+              <w:jc w:val="right"/>
+            </w:pPr>
+            <w:r>
+              <w:rPr>
+                <w:rFonts w:ascii="Arial" w:cs="Arial" w:eastAsia="Arial" w:hAnsi="Arial"/>
+                <w:b/>
+                <w:bCs/>
+                <w:color w:val="FFFFFF"/>
+                <w:sz w:val="19"/>
+                <w:szCs w:val="19"/>
+                <w:rtl/>
+              </w:rPr>
+              <w:t xml:space="preserve">المسار</w:t>
+            </w:r>
+          </w:p>
+        </w:tc>
+        <w:tc>
+          <w:tcPr>
+            <w:tcW w:type="dxa" w:w="2500"/>
+            <w:shd w:fill="2563EB" w:color="auto" w:val="clear"/>
+            <w:tcMar>
+              <w:top w:type="dxa" w:w="90"/>
+              <w:left w:type="dxa" w:w="110"/>
+              <w:bottom w:type="dxa" w:w="90"/>
+              <w:right w:type="dxa" w:w="110"/>
+            </w:tcMar>
+          </w:tcPr>
+          <w:p>
+            <w:pPr>
+              <w:bidi/>
+              <w:spacing w:after="0" w:line="280"/>
+              <w:jc w:val="right"/>
+            </w:pPr>
+            <w:r>
+              <w:rPr>
+                <w:rFonts w:ascii="Arial" w:cs="Arial" w:eastAsia="Arial" w:hAnsi="Arial"/>
+                <w:b/>
+                <w:bCs/>
+                <w:color w:val="FFFFFF"/>
+                <w:sz w:val="19"/>
+                <w:szCs w:val="19"/>
+                <w:rtl/>
+              </w:rPr>
+              <w:t xml:space="preserve">الملف</w:t>
+            </w:r>
+          </w:p>
+        </w:tc>
+        <w:tc>
+          <w:tcPr>
+            <w:tcW w:type="dxa" w:w="1350"/>
+            <w:shd w:fill="2563EB" w:color="auto" w:val="clear"/>
+            <w:tcMar>
+              <w:top w:type="dxa" w:w="90"/>
+              <w:left w:type="dxa" w:w="110"/>
+              <w:bottom w:type="dxa" w:w="90"/>
+              <w:right w:type="dxa" w:w="110"/>
+            </w:tcMar>
+          </w:tcPr>
+          <w:p>
+            <w:pPr>
+              <w:bidi/>
+              <w:spacing w:after="0" w:line="280"/>
+              <w:jc w:val="right"/>
+            </w:pPr>
+            <w:r>
+              <w:rPr>
+                <w:rFonts w:ascii="Arial" w:cs="Arial" w:eastAsia="Arial" w:hAnsi="Arial"/>
+                <w:b/>
+                <w:bCs/>
+                <w:color w:val="FFFFFF"/>
+                <w:sz w:val="19"/>
+                <w:szCs w:val="19"/>
+                <w:rtl/>
+              </w:rPr>
+              <w:t xml:space="preserve">الكوميت</w:t>
+            </w:r>
+          </w:p>
+        </w:tc>
+        <w:tc>
+          <w:tcPr>
+            <w:tcW w:type="dxa" w:w="1500"/>
+            <w:shd w:fill="2563EB" w:color="auto" w:val="clear"/>
+            <w:tcMar>
+              <w:top w:type="dxa" w:w="90"/>
+              <w:left w:type="dxa" w:w="110"/>
+              <w:bottom w:type="dxa" w:w="90"/>
+              <w:right w:type="dxa" w:w="110"/>
+            </w:tcMar>
+          </w:tcPr>
+          <w:p>
+            <w:pPr>
+              <w:bidi/>
+              <w:spacing w:after="0" w:line="280"/>
+              <w:jc w:val="right"/>
+            </w:pPr>
+            <w:r>
+              <w:rPr>
+                <w:rFonts w:ascii="Arial" w:cs="Arial" w:eastAsia="Arial" w:hAnsi="Arial"/>
+                <w:b/>
+                <w:bCs/>
+                <w:color w:val="FFFFFF"/>
+                <w:sz w:val="19"/>
+                <w:szCs w:val="19"/>
+                <w:rtl/>
+              </w:rPr>
+              <w:t xml:space="preserve">الحالة</w:t>
+            </w:r>
+          </w:p>
+        </w:tc>
+      </w:tr>
+      <w:tr>
+        <w:tc>
+          <w:tcPr>
+            <w:tcW w:type="dxa" w:w="1250"/>
+            <w:tcMar>
+              <w:top w:type="dxa" w:w="90"/>
+              <w:left w:type="dxa" w:w="110"/>
+              <w:bottom w:type="dxa" w:w="90"/>
+              <w:right w:type="dxa" w:w="110"/>
+            </w:tcMar>
+          </w:tcPr>
+          <w:p>
+            <w:pPr>
+              <w:bidi/>
+              <w:spacing w:after="0" w:line="280"/>
+              <w:jc w:val="right"/>
+            </w:pPr>
+            <w:r>
+              <w:rPr>
+                <w:rFonts w:ascii="Arial" w:cs="Arial" w:eastAsia="Arial" w:hAnsi="Arial"/>
+                <w:b w:val="false"/>
+                <w:bCs w:val="false"/>
+                <w:color w:val="1E293B"/>
+                <w:sz w:val="19"/>
+                <w:szCs w:val="19"/>
+                <w:rtl/>
+              </w:rPr>
+              <w:t xml:space="preserve">9 سبتمبر 2026</w:t>
+            </w:r>
+          </w:p>
+        </w:tc>
+        <w:tc>
+          <w:tcPr>
+            <w:tcW w:type="dxa" w:w="1250"/>
+            <w:tcMar>
+              <w:top w:type="dxa" w:w="90"/>
+              <w:left w:type="dxa" w:w="110"/>
+              <w:bottom w:type="dxa" w:w="90"/>
+              <w:right w:type="dxa" w:w="110"/>
+            </w:tcMar>
+          </w:tcPr>
+          <w:p>
+            <w:pPr>
+              <w:bidi/>
+              <w:spacing w:after="0" w:line="280"/>
+              <w:jc w:val="right"/>
+            </w:pPr>
+            <w:r>
+              <w:rPr>
+                <w:rFonts w:ascii="Arial" w:cs="Arial" w:eastAsia="Arial" w:hAnsi="Arial"/>
+                <w:b w:val="false"/>
+                <w:bCs w:val="false"/>
+                <w:color w:val="1E293B"/>
+                <w:sz w:val="19"/>
+                <w:szCs w:val="19"/>
+                <w:rtl/>
+              </w:rPr>
+              <w:t xml:space="preserve">الاشتراك</w:t>
+            </w:r>
+          </w:p>
+        </w:tc>
+        <w:tc>
+          <w:tcPr>
+            <w:tcW w:type="dxa" w:w="1150"/>
+            <w:tcMar>
+              <w:top w:type="dxa" w:w="90"/>
+              <w:left w:type="dxa" w:w="110"/>
+              <w:bottom w:type="dxa" w:w="90"/>
+              <w:right w:type="dxa" w:w="110"/>
+            </w:tcMar>
+          </w:tcPr>
+          <w:p>
+            <w:pPr>
+              <w:bidi/>
+              <w:spacing w:after="0" w:line="280"/>
+              <w:jc w:val="right"/>
+            </w:pPr>
+            <w:r>
+              <w:rPr>
+                <w:rFonts w:ascii="Arial" w:cs="Arial" w:eastAsia="Arial" w:hAnsi="Arial"/>
+                <w:b w:val="false"/>
+                <w:bCs w:val="false"/>
+                <w:color w:val="1E293B"/>
+                <w:sz w:val="19"/>
+                <w:szCs w:val="19"/>
+                <w:rtl/>
+              </w:rPr>
+              <w:t xml:space="preserve">/subscribe</w:t>
+            </w:r>
+          </w:p>
+        </w:tc>
+        <w:tc>
+          <w:tcPr>
+            <w:tcW w:type="dxa" w:w="2500"/>
+            <w:tcMar>
+              <w:top w:type="dxa" w:w="90"/>
+              <w:left w:type="dxa" w:w="110"/>
+              <w:bottom w:type="dxa" w:w="90"/>
+              <w:right w:type="dxa" w:w="110"/>
+            </w:tcMar>
+          </w:tcPr>
+          <w:p>
+            <w:pPr>
+              <w:bidi/>
+              <w:spacing w:after="0" w:line="280"/>
+              <w:jc w:val="right"/>
+            </w:pPr>
+            <w:r>
+              <w:rPr>
+                <w:rFonts w:ascii="Arial" w:cs="Arial" w:eastAsia="Arial" w:hAnsi="Arial"/>
+                <w:b w:val="false"/>
+                <w:bCs w:val="false"/>
+                <w:color w:val="1E293B"/>
+                <w:sz w:val="19"/>
+                <w:szCs w:val="19"/>
+                <w:rtl/>
+              </w:rPr>
+              <w:t xml:space="preserve">src/pages/Subscribe.tsx</w:t>
+            </w:r>
+          </w:p>
+        </w:tc>
+        <w:tc>
+          <w:tcPr>
+            <w:tcW w:type="dxa" w:w="1350"/>
+            <w:tcMar>
+              <w:top w:type="dxa" w:w="90"/>
+              <w:left w:type="dxa" w:w="110"/>
+              <w:bottom w:type="dxa" w:w="90"/>
+              <w:right w:type="dxa" w:w="110"/>
+            </w:tcMar>
+          </w:tcPr>
+          <w:p>
+            <w:pPr>
+              <w:bidi/>
+              <w:spacing w:after="0" w:line="280"/>
+              <w:jc w:val="right"/>
+            </w:pPr>
+            <w:r>
+              <w:rPr>
+                <w:rFonts w:ascii="Arial" w:cs="Arial" w:eastAsia="Arial" w:hAnsi="Arial"/>
+                <w:b w:val="false"/>
+                <w:bCs w:val="false"/>
+                <w:color w:val="1E293B"/>
+                <w:sz w:val="19"/>
+                <w:szCs w:val="19"/>
+                <w:rtl/>
+              </w:rPr>
+              <w:t xml:space="preserve">be5b3c0 · c49b797</w:t>
+            </w:r>
+          </w:p>
+        </w:tc>
+        <w:tc>
+          <w:tcPr>
+            <w:tcW w:type="dxa" w:w="1500"/>
+            <w:shd w:fill="ECFDF5" w:color="auto" w:val="clear"/>
+            <w:tcMar>
+              <w:top w:type="dxa" w:w="90"/>
+              <w:left w:type="dxa" w:w="110"/>
+              <w:bottom w:type="dxa" w:w="90"/>
+              <w:right w:type="dxa" w:w="110"/>
+            </w:tcMar>
+          </w:tcPr>
+          <w:p>
+            <w:pPr>
+              <w:bidi/>
+              <w:spacing w:after="0" w:line="280"/>
+              <w:jc w:val="right"/>
+            </w:pPr>
+            <w:r>
+              <w:rPr>
+                <w:rFonts w:ascii="Arial" w:cs="Arial" w:eastAsia="Arial" w:hAnsi="Arial"/>
+                <w:b/>
+                <w:bCs/>
+                <w:color w:val="15803D"/>
+                <w:sz w:val="19"/>
+                <w:szCs w:val="19"/>
+                <w:rtl/>
+              </w:rPr>
+              <w:t xml:space="preserve">منشور على الإنتاج</w:t>
+            </w:r>
+          </w:p>
+        </w:tc>
+      </w:tr>
+    </w:tbl>
+    <w:p>
+      <w:pPr>
+        <w:spacing w:after="90"/>
+      </w:pPr>
     </w:p>
     <w:p>
       <w:pPr>
@@ -12094,7 +12726,7 @@
           <w:szCs w:val="21"/>
           <w:rtl/>
         </w:rPr>
-        <w:t xml:space="preserve">مسار من ست خطوات: اختيار الباقة، ثم تأكيد التخفيض، ثم الدفع، ثم المعالجة، ثم النجاح أو الفشل.</w:t>
+        <w:t xml:space="preserve">إعادة بناء شبه كاملة للصفحة — 715 سطراً متغيّراً.</w:t>
       </w:r>
     </w:p>
     <w:p>
@@ -12116,7 +12748,7 @@
           <w:szCs w:val="21"/>
           <w:rtl/>
         </w:rPr>
-        <w:t xml:space="preserve">احتساب تناسبي للترقية: يُحصَّل فرق السعر عن الأيام المتبقية من الدورة الحالية فقط، ويظهر المبلغ مفصّلاً في ملخص الدفع.</w:t>
+        <w:t xml:space="preserve">اختيار الباقة صار بشريط تمرير (slider) حسب عدد المحادثات الشهرية بدل شبكة الكروت. كل باقة نقطة توقف على الشريط، وباقة المؤسسات هي النقطة الأخيرة بعنوان «غير محدود».</w:t>
       </w:r>
     </w:p>
     <w:p>
@@ -12138,7 +12770,7 @@
           <w:szCs w:val="21"/>
           <w:rtl/>
         </w:rPr>
-        <w:t xml:space="preserve">التخفيض له شاشة تأكيد مستقلة ولا يذهب مباشرة إلى الدفع.</w:t>
+        <w:t xml:space="preserve">مسار من ست خطوات: اختيار الباقة، ثم تأكيد التخفيض، ثم الدفع، ثم المعالجة، ثم النجاح أو الفشل.</w:t>
       </w:r>
     </w:p>
     <w:p>
@@ -12160,7 +12792,7 @@
           <w:szCs w:val="21"/>
           <w:rtl/>
         </w:rPr>
-        <w:t xml:space="preserve">دورة الفوترة تُقرأ من اشتراك العميل الحالي بدل أن تبدأ بقيمة ثابتة.</w:t>
+        <w:t xml:space="preserve">احتساب تناسبي للترقية: يُحصَّل فرق السعر عن الأيام المتبقية من الدورة الحالية فقط، ويظهر المبلغ مفصّلاً في ملخص الدفع.</w:t>
       </w:r>
     </w:p>
     <w:p>
@@ -12182,6 +12814,50 @@
           <w:szCs w:val="21"/>
           <w:rtl/>
         </w:rPr>
+        <w:t xml:space="preserve">التخفيض له شاشة تأكيد مستقلة ولا يذهب مباشرة إلى الدفع.</w:t>
+      </w:r>
+    </w:p>
+    <w:p>
+      <w:pPr>
+        <w:pStyle w:val="ListParagraph"/>
+        <w:numPr>
+          <w:ilvl w:val="0"/>
+          <w:numId w:val="2"/>
+        </w:numPr>
+        <w:bidi/>
+        <w:spacing w:after="70" w:line="290"/>
+        <w:jc w:val="right"/>
+      </w:pPr>
+      <w:r>
+        <w:rPr>
+          <w:rFonts w:ascii="Arial" w:cs="Arial" w:eastAsia="Arial" w:hAnsi="Arial"/>
+          <w:color w:val="1E293B"/>
+          <w:sz w:val="21"/>
+          <w:szCs w:val="21"/>
+          <w:rtl/>
+        </w:rPr>
+        <w:t xml:space="preserve">دورة الفوترة تُقرأ من اشتراك العميل الحالي بدل أن تبدأ بقيمة ثابتة.</w:t>
+      </w:r>
+    </w:p>
+    <w:p>
+      <w:pPr>
+        <w:pStyle w:val="ListParagraph"/>
+        <w:numPr>
+          <w:ilvl w:val="0"/>
+          <w:numId w:val="2"/>
+        </w:numPr>
+        <w:bidi/>
+        <w:spacing w:after="70" w:line="290"/>
+        <w:jc w:val="right"/>
+      </w:pPr>
+      <w:r>
+        <w:rPr>
+          <w:rFonts w:ascii="Arial" w:cs="Arial" w:eastAsia="Arial" w:hAnsi="Arial"/>
+          <w:color w:val="1E293B"/>
+          <w:sz w:val="21"/>
+          <w:szCs w:val="21"/>
+          <w:rtl/>
+        </w:rPr>
         <w:t xml:space="preserve">أُصلحت علامات تعارض الدمج (merge conflict markers) التي كانت باقية في الملف — كوميت c49b797.</w:t>
       </w:r>
     </w:p>
@@ -12368,7 +13044,7 @@
           <w:szCs w:val="20"/>
           <w:rtl/>
         </w:rPr>
-        <w:t xml:space="preserve">عدد التعديلات المسجّلة: 15</w:t>
+        <w:t xml:space="preserve">عدد التعديلات المسجّلة: 16</w:t>
       </w:r>
     </w:p>
     <w:sectPr>

</xml_diff>